<commit_message>
Put the protocol page-1 header on the thesis cover
Crop the bilingual Faculty of Dentistry header (English, PUA seal, Arabic, rule) from the approved protocol and place it at the top of page 1. Fill supervisor names and the student code from that protocol.

Co-authored-by: Ahmed El Gamry <ahmed733676-droid@users.noreply.github.com>
</commit_message>
<xml_diff>
--- a/Thesis_Complete.docx
+++ b/Thesis_Complete.docx
@@ -7,19 +7,43 @@
         <w:keepNext w:val="0"/>
         <w:pageBreakBefore w:val="0"/>
         <w:widowControl/>
-        <w:spacing w:before="0" w:after="0" w:line="480" w:lineRule="auto"/>
+        <w:spacing w:before="0" w:after="160" w:line="240" w:lineRule="auto"/>
         <w:ind w:firstLine="0"/>
         <w:jc w:val="center"/>
       </w:pPr>
       <w:r>
-        <w:rPr>
-          <w:rFonts w:ascii="Times New Roman" w:hAnsi="Times New Roman" w:eastAsia="Times New Roman"/>
-          <w:b/>
-          <w:i w:val="0"/>
-          <w:color w:val="000000"/>
-          <w:sz w:val="32"/>
-        </w:rPr>
-        <w:t>PHAROS UNIVERSITY IN ALEXANDRIA</w:t>
+        <w:drawing>
+          <wp:inline xmlns:a="http://schemas.openxmlformats.org/drawingml/2006/main" xmlns:pic="http://schemas.openxmlformats.org/drawingml/2006/picture">
+            <wp:extent cx="5580000" cy="868850"/>
+            <wp:docPr id="1" name="Picture 1"/>
+            <wp:cNvGraphicFramePr>
+              <a:graphicFrameLocks noChangeAspect="1"/>
+            </wp:cNvGraphicFramePr>
+            <a:graphic>
+              <a:graphicData uri="http://schemas.openxmlformats.org/drawingml/2006/picture">
+                <pic:pic>
+                  <pic:nvPicPr>
+                    <pic:cNvPr id="0" name="protocol_header.png"/>
+                    <pic:cNvPicPr/>
+                  </pic:nvPicPr>
+                  <pic:blipFill>
+                    <a:blip r:embed="rId10"/>
+                    <a:stretch>
+                      <a:fillRect/>
+                    </a:stretch>
+                  </pic:blipFill>
+                  <pic:spPr>
+                    <a:xfrm>
+                      <a:off x="0" y="0"/>
+                      <a:ext cx="5580000" cy="868850"/>
+                    </a:xfrm>
+                    <a:prstGeom prst="rect"/>
+                  </pic:spPr>
+                </pic:pic>
+              </a:graphicData>
+            </a:graphic>
+          </wp:inline>
+        </w:drawing>
       </w:r>
     </w:p>
     <w:p>
@@ -27,27 +51,7 @@
         <w:keepNext w:val="0"/>
         <w:pageBreakBefore w:val="0"/>
         <w:widowControl/>
-        <w:spacing w:before="0" w:after="0" w:line="480" w:lineRule="auto"/>
-        <w:ind w:firstLine="0"/>
-        <w:jc w:val="center"/>
-      </w:pPr>
-      <w:r>
-        <w:rPr>
-          <w:rFonts w:ascii="Times New Roman" w:hAnsi="Times New Roman" w:eastAsia="Times New Roman"/>
-          <w:b/>
-          <w:i w:val="0"/>
-          <w:color w:val="000000"/>
-          <w:sz w:val="28"/>
-        </w:rPr>
-        <w:t>FACULTY OF DENTISTRY</w:t>
-      </w:r>
-    </w:p>
-    <w:p>
-      <w:pPr>
-        <w:keepNext w:val="0"/>
-        <w:pageBreakBefore w:val="0"/>
-        <w:widowControl/>
-        <w:spacing w:before="0" w:after="360" w:line="480" w:lineRule="auto"/>
+        <w:spacing w:before="0" w:after="240" w:line="480" w:lineRule="auto"/>
         <w:ind w:firstLine="0"/>
         <w:jc w:val="center"/>
       </w:pPr>
@@ -67,7 +71,7 @@
         <w:keepNext w:val="0"/>
         <w:pageBreakBefore w:val="0"/>
         <w:widowControl/>
-        <w:spacing w:before="240" w:after="120" w:line="480" w:lineRule="auto"/>
+        <w:spacing w:before="120" w:after="120" w:line="480" w:lineRule="auto"/>
         <w:ind w:firstLine="0"/>
         <w:jc w:val="center"/>
       </w:pPr>
@@ -87,7 +91,7 @@
         <w:keepNext w:val="0"/>
         <w:pageBreakBefore w:val="0"/>
         <w:widowControl/>
-        <w:spacing w:before="0" w:after="360" w:line="480" w:lineRule="auto"/>
+        <w:spacing w:before="0" w:after="240" w:line="480" w:lineRule="auto"/>
         <w:ind w:firstLine="0"/>
         <w:jc w:val="center"/>
       </w:pPr>
@@ -167,7 +171,7 @@
         <w:keepNext w:val="0"/>
         <w:pageBreakBefore w:val="0"/>
         <w:widowControl/>
-        <w:spacing w:before="0" w:after="360" w:line="480" w:lineRule="auto"/>
+        <w:spacing w:before="0" w:after="240" w:line="480" w:lineRule="auto"/>
         <w:ind w:firstLine="0"/>
         <w:jc w:val="center"/>
       </w:pPr>
@@ -207,7 +211,7 @@
         <w:keepNext w:val="0"/>
         <w:pageBreakBefore w:val="0"/>
         <w:widowControl/>
-        <w:spacing w:before="0" w:after="360" w:line="480" w:lineRule="auto"/>
+        <w:spacing w:before="0" w:after="0" w:line="480" w:lineRule="auto"/>
         <w:ind w:firstLine="0"/>
         <w:jc w:val="center"/>
       </w:pPr>
@@ -227,6 +231,26 @@
         <w:keepNext w:val="0"/>
         <w:pageBreakBefore w:val="0"/>
         <w:widowControl/>
+        <w:spacing w:before="0" w:after="240" w:line="480" w:lineRule="auto"/>
+        <w:ind w:firstLine="0"/>
+        <w:jc w:val="center"/>
+      </w:pPr>
+      <w:r>
+        <w:rPr>
+          <w:rFonts w:ascii="Times New Roman" w:hAnsi="Times New Roman" w:eastAsia="Times New Roman"/>
+          <w:b w:val="0"/>
+          <w:i w:val="0"/>
+          <w:color w:val="000000"/>
+          <w:sz w:val="24"/>
+        </w:rPr>
+        <w:t>Student Code No. 202203112</w:t>
+      </w:r>
+    </w:p>
+    <w:p>
+      <w:pPr>
+        <w:keepNext w:val="0"/>
+        <w:pageBreakBefore w:val="0"/>
+        <w:widowControl/>
         <w:spacing w:before="120" w:after="0" w:line="480" w:lineRule="auto"/>
         <w:ind w:firstLine="0"/>
         <w:jc w:val="center"/>
@@ -254,12 +278,12 @@
       <w:r>
         <w:rPr>
           <w:rFonts w:ascii="Times New Roman" w:hAnsi="Times New Roman" w:eastAsia="Times New Roman"/>
-          <w:b w:val="0"/>
+          <w:b/>
           <w:i w:val="0"/>
           <w:color w:val="000000"/>
           <w:sz w:val="24"/>
         </w:rPr>
-        <w:t>Prof. Dr. …………………………………………</w:t>
+        <w:t>Prof. Wegdan M. Abdel-Fattah</w:t>
       </w:r>
     </w:p>
     <w:p>
@@ -267,19 +291,19 @@
         <w:keepNext w:val="0"/>
         <w:pageBreakBefore w:val="0"/>
         <w:widowControl/>
-        <w:spacing w:before="0" w:after="360" w:line="480" w:lineRule="auto"/>
+        <w:spacing w:before="0" w:after="240" w:line="480" w:lineRule="auto"/>
         <w:ind w:firstLine="0"/>
         <w:jc w:val="center"/>
       </w:pPr>
       <w:r>
         <w:rPr>
           <w:rFonts w:ascii="Times New Roman" w:hAnsi="Times New Roman" w:eastAsia="Times New Roman"/>
-          <w:b w:val="0"/>
+          <w:b/>
           <w:i w:val="0"/>
           <w:color w:val="000000"/>
           <w:sz w:val="24"/>
         </w:rPr>
-        <w:t>Ass. Prof. Dr. …………………………………………</w:t>
+        <w:t>Asst. Prof. Emad M. El-Sayed (Main supervisor)</w:t>
       </w:r>
     </w:p>
     <w:p>
@@ -307,7 +331,7 @@
         <w:sectPr>
           <w:footerReference w:type="default" r:id="rId9"/>
           <w:pgSz w:w="11906" w:h="16838"/>
-          <w:pgMar w:top="1417" w:right="1417" w:bottom="1417" w:left="1701" w:header="720" w:footer="720" w:gutter="0"/>
+          <w:pgMar w:top="850" w:right="1417" w:bottom="1417" w:left="1701" w:header="720" w:footer="720" w:gutter="0"/>
           <w:cols w:space="720"/>
           <w:titlePg/>
           <w:docGrid w:linePitch="360"/>
@@ -367,12 +391,12 @@
       <w:r>
         <w:rPr>
           <w:rFonts w:ascii="Times New Roman" w:hAnsi="Times New Roman" w:eastAsia="Times New Roman"/>
-          <w:b w:val="0"/>
+          <w:b/>
           <w:i w:val="0"/>
           <w:color w:val="000000"/>
           <w:sz w:val="24"/>
         </w:rPr>
-        <w:t>Prof. Dr. …………………………………………</w:t>
+        <w:t>Prof. Wegdan M. Abdel-Fattah</w:t>
       </w:r>
     </w:p>
     <w:p>
@@ -407,12 +431,12 @@
       <w:r>
         <w:rPr>
           <w:rFonts w:ascii="Times New Roman" w:hAnsi="Times New Roman" w:eastAsia="Times New Roman"/>
-          <w:b w:val="0"/>
+          <w:b/>
           <w:i w:val="0"/>
           <w:color w:val="000000"/>
           <w:sz w:val="24"/>
         </w:rPr>
-        <w:t>Ass. Prof. Dr. …………………………………………</w:t>
+        <w:t>Asst. Prof. Emad M. El-Sayed</w:t>
       </w:r>
     </w:p>
     <w:p>
@@ -433,6 +457,26 @@
           <w:sz w:val="24"/>
         </w:rPr>
         <w:t>Assistant Professor of Conservative Dentistry</w:t>
+      </w:r>
+    </w:p>
+    <w:p>
+      <w:pPr>
+        <w:keepNext w:val="0"/>
+        <w:pageBreakBefore w:val="0"/>
+        <w:widowControl/>
+        <w:spacing w:before="0" w:after="0" w:line="480" w:lineRule="auto"/>
+        <w:ind w:firstLine="0"/>
+        <w:jc w:val="center"/>
+      </w:pPr>
+      <w:r>
+        <w:rPr>
+          <w:rFonts w:ascii="Times New Roman" w:hAnsi="Times New Roman" w:eastAsia="Times New Roman"/>
+          <w:b w:val="0"/>
+          <w:i/>
+          <w:color w:val="000000"/>
+          <w:sz w:val="24"/>
+        </w:rPr>
+        <w:t>(Main supervisor)</w:t>
       </w:r>
     </w:p>
     <w:p>
@@ -1888,7 +1932,7 @@
     <w:p>
       <w:pPr>
         <w:sectPr>
-          <w:footerReference w:type="default" r:id="rId10"/>
+          <w:footerReference w:type="default" r:id="rId11"/>
           <w:pgSz w:w="11906" w:h="16838"/>
           <w:pgMar w:top="1417" w:right="1417" w:bottom="1417" w:left="1701" w:header="720" w:footer="720" w:gutter="0"/>
           <w:cols w:space="720"/>
@@ -7247,7 +7291,7 @@
       </w:r>
     </w:p>
     <w:sectPr>
-      <w:footerReference w:type="default" r:id="rId11"/>
+      <w:footerReference w:type="default" r:id="rId12"/>
       <w:pgSz w:w="11906" w:h="16838"/>
       <w:pgMar w:top="1417" w:right="1417" w:bottom="1417" w:left="1701" w:header="720" w:footer="720" w:gutter="0"/>
       <w:cols w:space="720"/>

</xml_diff>

<commit_message>
Use the protocol titles and supervision committee on the cover
Replace the rewritten English title with the approved English and Arabic titles from the protocol. List the supervision committee with ranks as printed there.

Co-authored-by: Ahmed El Gamry <ahmed733676-droid@users.noreply.github.com>
</commit_message>
<xml_diff>
--- a/Thesis_Complete.docx
+++ b/Thesis_Complete.docx
@@ -51,7 +51,27 @@
         <w:keepNext w:val="0"/>
         <w:pageBreakBefore w:val="0"/>
         <w:widowControl/>
-        <w:spacing w:before="0" w:after="240" w:line="480" w:lineRule="auto"/>
+        <w:spacing w:before="0" w:after="0" w:line="240" w:lineRule="auto"/>
+        <w:ind w:firstLine="0"/>
+        <w:jc w:val="center"/>
+      </w:pPr>
+      <w:r>
+        <w:rPr>
+          <w:rFonts w:ascii="Times New Roman" w:hAnsi="Times New Roman" w:eastAsia="Times New Roman"/>
+          <w:b/>
+          <w:i w:val="0"/>
+          <w:color w:val="000000"/>
+          <w:sz w:val="24"/>
+        </w:rPr>
+        <w:t>Faculty of Dentistry</w:t>
+      </w:r>
+    </w:p>
+    <w:p>
+      <w:pPr>
+        <w:keepNext w:val="0"/>
+        <w:pageBreakBefore w:val="0"/>
+        <w:widowControl/>
+        <w:spacing w:before="0" w:after="120" w:line="240" w:lineRule="auto"/>
         <w:ind w:firstLine="0"/>
         <w:jc w:val="center"/>
       </w:pPr>
@@ -61,7 +81,7 @@
           <w:b w:val="0"/>
           <w:i/>
           <w:color w:val="000000"/>
-          <w:sz w:val="26"/>
+          <w:sz w:val="24"/>
         </w:rPr>
         <w:t>Department of Conservative Dentistry</w:t>
       </w:r>
@@ -71,7 +91,7 @@
         <w:keepNext w:val="0"/>
         <w:pageBreakBefore w:val="0"/>
         <w:widowControl/>
-        <w:spacing w:before="120" w:after="120" w:line="480" w:lineRule="auto"/>
+        <w:spacing w:before="0" w:after="120" w:line="240" w:lineRule="auto"/>
         <w:ind w:firstLine="0"/>
         <w:jc w:val="center"/>
       </w:pPr>
@@ -81,9 +101,9 @@
           <w:b/>
           <w:i w:val="0"/>
           <w:color w:val="000000"/>
-          <w:sz w:val="28"/>
+          <w:sz w:val="24"/>
         </w:rPr>
-        <w:t>COMPARATIVE EVALUATION OF WEAR RESISTANCE AND SURFACE ROUGHNESS OF INJECTABLE VERSUS CONVENTIONAL NANOHYBRID COMPOSITE RESINS</w:t>
+        <w:t>Student Code No. 202203112</w:t>
       </w:r>
     </w:p>
     <w:p>
@@ -91,27 +111,7 @@
         <w:keepNext w:val="0"/>
         <w:pageBreakBefore w:val="0"/>
         <w:widowControl/>
-        <w:spacing w:before="0" w:after="240" w:line="480" w:lineRule="auto"/>
-        <w:ind w:firstLine="0"/>
-        <w:jc w:val="center"/>
-      </w:pPr>
-      <w:r>
-        <w:rPr>
-          <w:rFonts w:ascii="Times New Roman" w:hAnsi="Times New Roman" w:eastAsia="Times New Roman"/>
-          <w:b w:val="0"/>
-          <w:i/>
-          <w:color w:val="000000"/>
-          <w:sz w:val="26"/>
-        </w:rPr>
-        <w:t>(In Vitro Study)</w:t>
-      </w:r>
-    </w:p>
-    <w:p>
-      <w:pPr>
-        <w:keepNext w:val="0"/>
-        <w:pageBreakBefore w:val="0"/>
-        <w:widowControl/>
-        <w:spacing w:before="0" w:after="0" w:line="480" w:lineRule="auto"/>
+        <w:spacing w:before="0" w:after="0" w:line="240" w:lineRule="auto"/>
         <w:ind w:firstLine="0"/>
         <w:jc w:val="center"/>
       </w:pPr>
@@ -131,7 +131,7 @@
         <w:keepNext w:val="0"/>
         <w:pageBreakBefore w:val="0"/>
         <w:widowControl/>
-        <w:spacing w:before="0" w:after="0" w:line="480" w:lineRule="auto"/>
+        <w:spacing w:before="0" w:after="0" w:line="240" w:lineRule="auto"/>
         <w:ind w:firstLine="0"/>
         <w:jc w:val="center"/>
       </w:pPr>
@@ -151,19 +151,19 @@
         <w:keepNext w:val="0"/>
         <w:pageBreakBefore w:val="0"/>
         <w:widowControl/>
-        <w:spacing w:before="0" w:after="0" w:line="480" w:lineRule="auto"/>
+        <w:spacing w:before="0" w:after="120" w:line="240" w:lineRule="auto"/>
         <w:ind w:firstLine="0"/>
         <w:jc w:val="center"/>
       </w:pPr>
       <w:r>
         <w:rPr>
           <w:rFonts w:ascii="Times New Roman" w:hAnsi="Times New Roman" w:eastAsia="Times New Roman"/>
-          <w:b w:val="0"/>
+          <w:b/>
           <w:i w:val="0"/>
           <w:color w:val="000000"/>
           <w:sz w:val="24"/>
         </w:rPr>
-        <w:t>in</w:t>
+        <w:t>in Conservative Dentistry</w:t>
       </w:r>
     </w:p>
     <w:p>
@@ -171,7 +171,67 @@
         <w:keepNext w:val="0"/>
         <w:pageBreakBefore w:val="0"/>
         <w:widowControl/>
-        <w:spacing w:before="0" w:after="240" w:line="480" w:lineRule="auto"/>
+        <w:spacing w:before="0" w:after="120" w:line="240" w:lineRule="auto"/>
+        <w:ind w:firstLine="0"/>
+        <w:jc w:val="center"/>
+      </w:pPr>
+      <w:r>
+        <w:rPr>
+          <w:rFonts w:ascii="Times New Roman" w:hAnsi="Times New Roman" w:eastAsia="Times New Roman"/>
+          <w:b/>
+          <w:i w:val="0"/>
+          <w:color w:val="000000"/>
+          <w:sz w:val="24"/>
+        </w:rPr>
+        <w:t>Academic Year 2024–2025</w:t>
+      </w:r>
+    </w:p>
+    <w:p>
+      <w:pPr>
+        <w:keepNext w:val="0"/>
+        <w:pageBreakBefore w:val="0"/>
+        <w:widowControl/>
+        <w:spacing w:before="0" w:after="200" w:line="240" w:lineRule="auto"/>
+        <w:ind w:firstLine="0"/>
+        <w:jc w:val="center"/>
+      </w:pPr>
+      <w:r>
+        <w:rPr>
+          <w:rFonts w:ascii="Times New Roman" w:hAnsi="Times New Roman" w:eastAsia="Times New Roman"/>
+          <w:b/>
+          <w:i w:val="0"/>
+          <w:color w:val="000000"/>
+          <w:sz w:val="24"/>
+        </w:rPr>
+        <w:t>Name of Candidate: Mohamed Talaat Mohamed AbdelMoaty ElAbd</w:t>
+      </w:r>
+    </w:p>
+    <w:p>
+      <w:pPr>
+        <w:keepNext w:val="0"/>
+        <w:pageBreakBefore w:val="0"/>
+        <w:widowControl/>
+        <w:spacing w:before="0" w:after="0" w:line="240" w:lineRule="auto"/>
+        <w:ind w:firstLine="0"/>
+        <w:jc w:val="center"/>
+      </w:pPr>
+      <w:r>
+        <w:rPr>
+          <w:rFonts w:ascii="Times New Roman" w:hAnsi="Times New Roman" w:eastAsia="Times New Roman"/>
+          <w:b/>
+          <w:i w:val="0"/>
+          <w:color w:val="000000"/>
+          <w:sz w:val="24"/>
+        </w:rPr>
+        <w:t>English Title</w:t>
+      </w:r>
+    </w:p>
+    <w:p>
+      <w:pPr>
+        <w:keepNext w:val="0"/>
+        <w:pageBreakBefore w:val="0"/>
+        <w:widowControl/>
+        <w:spacing w:before="0" w:after="160" w:line="240" w:lineRule="auto"/>
         <w:ind w:firstLine="0"/>
         <w:jc w:val="center"/>
       </w:pPr>
@@ -183,7 +243,7 @@
           <w:color w:val="000000"/>
           <w:sz w:val="26"/>
         </w:rPr>
-        <w:t>Conservative Dentistry</w:t>
+        <w:t>COMPARATIVE STUDY OF WEAR RESISTANCE AND SURFACE ROUGHNESS OF INJECTABLE VERSUS CONVENTIONAL COMPOSITE RESIN — IN VITRO STUDY</w:t>
       </w:r>
     </w:p>
     <w:p>
@@ -191,67 +251,7 @@
         <w:keepNext w:val="0"/>
         <w:pageBreakBefore w:val="0"/>
         <w:widowControl/>
-        <w:spacing w:before="120" w:after="0" w:line="480" w:lineRule="auto"/>
-        <w:ind w:firstLine="0"/>
-        <w:jc w:val="center"/>
-      </w:pPr>
-      <w:r>
-        <w:rPr>
-          <w:rFonts w:ascii="Times New Roman" w:hAnsi="Times New Roman" w:eastAsia="Times New Roman"/>
-          <w:b w:val="0"/>
-          <w:i w:val="0"/>
-          <w:color w:val="000000"/>
-          <w:sz w:val="24"/>
-        </w:rPr>
-        <w:t>Submitted by</w:t>
-      </w:r>
-    </w:p>
-    <w:p>
-      <w:pPr>
-        <w:keepNext w:val="0"/>
-        <w:pageBreakBefore w:val="0"/>
-        <w:widowControl/>
-        <w:spacing w:before="0" w:after="0" w:line="480" w:lineRule="auto"/>
-        <w:ind w:firstLine="0"/>
-        <w:jc w:val="center"/>
-      </w:pPr>
-      <w:r>
-        <w:rPr>
-          <w:rFonts w:ascii="Times New Roman" w:hAnsi="Times New Roman" w:eastAsia="Times New Roman"/>
-          <w:b/>
-          <w:i w:val="0"/>
-          <w:color w:val="000000"/>
-          <w:sz w:val="26"/>
-        </w:rPr>
-        <w:t>Mohamed Talaat Mohamed AbdelMoaty ElAbd</w:t>
-      </w:r>
-    </w:p>
-    <w:p>
-      <w:pPr>
-        <w:keepNext w:val="0"/>
-        <w:pageBreakBefore w:val="0"/>
-        <w:widowControl/>
-        <w:spacing w:before="0" w:after="240" w:line="480" w:lineRule="auto"/>
-        <w:ind w:firstLine="0"/>
-        <w:jc w:val="center"/>
-      </w:pPr>
-      <w:r>
-        <w:rPr>
-          <w:rFonts w:ascii="Times New Roman" w:hAnsi="Times New Roman" w:eastAsia="Times New Roman"/>
-          <w:b w:val="0"/>
-          <w:i w:val="0"/>
-          <w:color w:val="000000"/>
-          <w:sz w:val="24"/>
-        </w:rPr>
-        <w:t>Student Code No. 202203112</w:t>
-      </w:r>
-    </w:p>
-    <w:p>
-      <w:pPr>
-        <w:keepNext w:val="0"/>
-        <w:pageBreakBefore w:val="0"/>
-        <w:widowControl/>
-        <w:spacing w:before="120" w:after="0" w:line="480" w:lineRule="auto"/>
+        <w:spacing w:before="0" w:after="40" w:line="240" w:lineRule="auto"/>
         <w:ind w:firstLine="0"/>
         <w:jc w:val="center"/>
       </w:pPr>
@@ -263,7 +263,7 @@
           <w:color w:val="000000"/>
           <w:sz w:val="24"/>
         </w:rPr>
-        <w:t>Supervisors</w:t>
+        <w:t>Arabic Title</w:t>
       </w:r>
     </w:p>
     <w:p>
@@ -271,7 +271,30 @@
         <w:keepNext w:val="0"/>
         <w:pageBreakBefore w:val="0"/>
         <w:widowControl/>
-        <w:spacing w:before="0" w:after="0" w:line="480" w:lineRule="auto"/>
+        <w:spacing w:before="0" w:after="200" w:line="240" w:lineRule="auto"/>
+        <w:ind w:firstLine="0"/>
+        <w:jc w:val="center"/>
+        <w:bidi w:val="1"/>
+      </w:pPr>
+      <w:r>
+        <w:rPr>
+          <w:rFonts w:ascii="Noto Naskh Arabic" w:hAnsi="Noto Naskh Arabic" w:eastAsia="Noto Naskh Arabic" w:cs="Noto Naskh Arabic"/>
+          <w:b/>
+          <w:i w:val="0"/>
+          <w:color w:val="000000"/>
+          <w:sz w:val="28"/>
+          <w:rtl/>
+          <w:szCs w:val="28"/>
+        </w:rPr>
+        <w:t>دراسة مقارنة للتآكل و خشونة سطح الراتينج المركب القابل للحقن و التقليدي - دراسة في المختبر</w:t>
+      </w:r>
+    </w:p>
+    <w:p>
+      <w:pPr>
+        <w:keepNext w:val="0"/>
+        <w:pageBreakBefore w:val="0"/>
+        <w:widowControl/>
+        <w:spacing w:before="80" w:after="80" w:line="240" w:lineRule="auto"/>
         <w:ind w:firstLine="0"/>
         <w:jc w:val="center"/>
       </w:pPr>
@@ -283,7 +306,7 @@
           <w:color w:val="000000"/>
           <w:sz w:val="24"/>
         </w:rPr>
-        <w:t>Prof. Wegdan M. Abdel-Fattah</w:t>
+        <w:t>Supervision Committee</w:t>
       </w:r>
     </w:p>
     <w:p>
@@ -291,7 +314,7 @@
         <w:keepNext w:val="0"/>
         <w:pageBreakBefore w:val="0"/>
         <w:widowControl/>
-        <w:spacing w:before="0" w:after="240" w:line="480" w:lineRule="auto"/>
+        <w:spacing w:before="0" w:after="0" w:line="240" w:lineRule="auto"/>
         <w:ind w:firstLine="0"/>
         <w:jc w:val="center"/>
       </w:pPr>
@@ -303,7 +326,7 @@
           <w:color w:val="000000"/>
           <w:sz w:val="24"/>
         </w:rPr>
-        <w:t>Asst. Prof. Emad M. El-Sayed (Main supervisor)</w:t>
+        <w:t>1. Prof. Wegdan M. Abdel-Fattah</w:t>
       </w:r>
     </w:p>
     <w:p>
@@ -311,7 +334,7 @@
         <w:keepNext w:val="0"/>
         <w:pageBreakBefore w:val="0"/>
         <w:widowControl/>
-        <w:spacing w:before="240" w:after="0" w:line="480" w:lineRule="auto"/>
+        <w:spacing w:before="0" w:after="0" w:line="240" w:lineRule="auto"/>
         <w:ind w:firstLine="0"/>
         <w:jc w:val="center"/>
       </w:pPr>
@@ -321,9 +344,9 @@
           <w:b/>
           <w:i w:val="0"/>
           <w:color w:val="000000"/>
-          <w:sz w:val="26"/>
+          <w:sz w:val="24"/>
         </w:rPr>
-        <w:t>2025 / 2026</w:t>
+        <w:t>2. Asst. Prof. Emad M. El-Sayed (Main supervisor)</w:t>
       </w:r>
     </w:p>
     <w:p>
@@ -356,7 +379,7 @@
           <w:color w:val="000000"/>
           <w:sz w:val="28"/>
         </w:rPr>
-        <w:t>SUPERVISORS</w:t>
+        <w:t>SUPERVISION COMMITTEE</w:t>
       </w:r>
     </w:p>
     <w:p>
@@ -396,7 +419,7 @@
           <w:color w:val="000000"/>
           <w:sz w:val="24"/>
         </w:rPr>
-        <w:t>Prof. Wegdan M. Abdel-Fattah</w:t>
+        <w:t>1. Prof. Wegdan M. Abdel-Fattah</w:t>
       </w:r>
     </w:p>
     <w:p>
@@ -436,7 +459,7 @@
           <w:color w:val="000000"/>
           <w:sz w:val="24"/>
         </w:rPr>
-        <w:t>Asst. Prof. Emad M. El-Sayed</w:t>
+        <w:t>2. Asst. Prof. Emad M. El-Sayed</w:t>
       </w:r>
     </w:p>
     <w:p>

</xml_diff>

<commit_message>
Insert the protocol cover pages into the thesis Word as they are
Drop the cropped header. The first two pages of the approved protocol sit at the front of Thesis_Complete.docx; the rest of the thesis stays ordinary Word.

Co-authored-by: Ahmed El Gamry <ahmed733676-droid@users.noreply.github.com>
</commit_message>
<xml_diff>
--- a/Thesis_Complete.docx
+++ b/Thesis_Complete.docx
@@ -7,14 +7,14 @@
         <w:keepNext w:val="0"/>
         <w:pageBreakBefore w:val="0"/>
         <w:widowControl/>
-        <w:spacing w:before="0" w:after="160" w:line="240" w:lineRule="auto"/>
+        <w:spacing w:before="0" w:after="0" w:line="240" w:lineRule="auto"/>
         <w:ind w:firstLine="0"/>
         <w:jc w:val="center"/>
       </w:pPr>
       <w:r>
         <w:drawing>
           <wp:inline xmlns:a="http://schemas.openxmlformats.org/drawingml/2006/main" xmlns:pic="http://schemas.openxmlformats.org/drawingml/2006/picture">
-            <wp:extent cx="5580000" cy="868850"/>
+            <wp:extent cx="7560000" cy="10692000"/>
             <wp:docPr id="1" name="Picture 1"/>
             <wp:cNvGraphicFramePr>
               <a:graphicFrameLocks noChangeAspect="1"/>
@@ -23,7 +23,7 @@
               <a:graphicData uri="http://schemas.openxmlformats.org/drawingml/2006/picture">
                 <pic:pic>
                   <pic:nvPicPr>
-                    <pic:cNvPr id="0" name="protocol_header.png"/>
+                    <pic:cNvPr id="0" name="protocol_page1.png"/>
                     <pic:cNvPicPr/>
                   </pic:nvPicPr>
                   <pic:blipFill>
@@ -35,7 +35,52 @@
                   <pic:spPr>
                     <a:xfrm>
                       <a:off x="0" y="0"/>
-                      <a:ext cx="5580000" cy="868850"/>
+                      <a:ext cx="7560000" cy="10692000"/>
+                    </a:xfrm>
+                    <a:prstGeom prst="rect"/>
+                  </pic:spPr>
+                </pic:pic>
+              </a:graphicData>
+            </a:graphic>
+          </wp:inline>
+        </w:drawing>
+        <w:br w:type="page"/>
+      </w:r>
+    </w:p>
+    <w:p>
+      <w:pPr>
+        <w:keepNext w:val="0"/>
+        <w:pageBreakBefore w:val="0"/>
+        <w:widowControl/>
+        <w:spacing w:before="0" w:after="0" w:line="240" w:lineRule="auto"/>
+        <w:ind w:firstLine="0"/>
+        <w:jc w:val="center"/>
+      </w:pPr>
+      <w:r>
+        <w:drawing>
+          <wp:inline xmlns:a="http://schemas.openxmlformats.org/drawingml/2006/main" xmlns:pic="http://schemas.openxmlformats.org/drawingml/2006/picture">
+            <wp:extent cx="7560000" cy="10692000"/>
+            <wp:docPr id="2" name="Picture 2"/>
+            <wp:cNvGraphicFramePr>
+              <a:graphicFrameLocks noChangeAspect="1"/>
+            </wp:cNvGraphicFramePr>
+            <a:graphic>
+              <a:graphicData uri="http://schemas.openxmlformats.org/drawingml/2006/picture">
+                <pic:pic>
+                  <pic:nvPicPr>
+                    <pic:cNvPr id="0" name="protocol_page2.png"/>
+                    <pic:cNvPicPr/>
+                  </pic:nvPicPr>
+                  <pic:blipFill>
+                    <a:blip r:embed="rId11"/>
+                    <a:stretch>
+                      <a:fillRect/>
+                    </a:stretch>
+                  </pic:blipFill>
+                  <pic:spPr>
+                    <a:xfrm>
+                      <a:off x="0" y="0"/>
+                      <a:ext cx="7560000" cy="10692000"/>
                     </a:xfrm>
                     <a:prstGeom prst="rect"/>
                   </pic:spPr>
@@ -48,313 +93,10 @@
     </w:p>
     <w:p>
       <w:pPr>
-        <w:keepNext w:val="0"/>
-        <w:pageBreakBefore w:val="0"/>
-        <w:widowControl/>
-        <w:spacing w:before="0" w:after="0" w:line="240" w:lineRule="auto"/>
-        <w:ind w:firstLine="0"/>
-        <w:jc w:val="center"/>
-      </w:pPr>
-      <w:r>
-        <w:rPr>
-          <w:rFonts w:ascii="Times New Roman" w:hAnsi="Times New Roman" w:eastAsia="Times New Roman"/>
-          <w:b/>
-          <w:i w:val="0"/>
-          <w:color w:val="000000"/>
-          <w:sz w:val="24"/>
-        </w:rPr>
-        <w:t>Faculty of Dentistry</w:t>
-      </w:r>
-    </w:p>
-    <w:p>
-      <w:pPr>
-        <w:keepNext w:val="0"/>
-        <w:pageBreakBefore w:val="0"/>
-        <w:widowControl/>
-        <w:spacing w:before="0" w:after="120" w:line="240" w:lineRule="auto"/>
-        <w:ind w:firstLine="0"/>
-        <w:jc w:val="center"/>
-      </w:pPr>
-      <w:r>
-        <w:rPr>
-          <w:rFonts w:ascii="Times New Roman" w:hAnsi="Times New Roman" w:eastAsia="Times New Roman"/>
-          <w:b w:val="0"/>
-          <w:i/>
-          <w:color w:val="000000"/>
-          <w:sz w:val="24"/>
-        </w:rPr>
-        <w:t>Department of Conservative Dentistry</w:t>
-      </w:r>
-    </w:p>
-    <w:p>
-      <w:pPr>
-        <w:keepNext w:val="0"/>
-        <w:pageBreakBefore w:val="0"/>
-        <w:widowControl/>
-        <w:spacing w:before="0" w:after="120" w:line="240" w:lineRule="auto"/>
-        <w:ind w:firstLine="0"/>
-        <w:jc w:val="center"/>
-      </w:pPr>
-      <w:r>
-        <w:rPr>
-          <w:rFonts w:ascii="Times New Roman" w:hAnsi="Times New Roman" w:eastAsia="Times New Roman"/>
-          <w:b/>
-          <w:i w:val="0"/>
-          <w:color w:val="000000"/>
-          <w:sz w:val="24"/>
-        </w:rPr>
-        <w:t>Student Code No. 202203112</w:t>
-      </w:r>
-    </w:p>
-    <w:p>
-      <w:pPr>
-        <w:keepNext w:val="0"/>
-        <w:pageBreakBefore w:val="0"/>
-        <w:widowControl/>
-        <w:spacing w:before="0" w:after="0" w:line="240" w:lineRule="auto"/>
-        <w:ind w:firstLine="0"/>
-        <w:jc w:val="center"/>
-      </w:pPr>
-      <w:r>
-        <w:rPr>
-          <w:rFonts w:ascii="Times New Roman" w:hAnsi="Times New Roman" w:eastAsia="Times New Roman"/>
-          <w:b w:val="0"/>
-          <w:i w:val="0"/>
-          <w:color w:val="000000"/>
-          <w:sz w:val="24"/>
-        </w:rPr>
-        <w:t>A Thesis submitted in partial fulfillment of the</w:t>
-      </w:r>
-    </w:p>
-    <w:p>
-      <w:pPr>
-        <w:keepNext w:val="0"/>
-        <w:pageBreakBefore w:val="0"/>
-        <w:widowControl/>
-        <w:spacing w:before="0" w:after="0" w:line="240" w:lineRule="auto"/>
-        <w:ind w:firstLine="0"/>
-        <w:jc w:val="center"/>
-      </w:pPr>
-      <w:r>
-        <w:rPr>
-          <w:rFonts w:ascii="Times New Roman" w:hAnsi="Times New Roman" w:eastAsia="Times New Roman"/>
-          <w:b w:val="0"/>
-          <w:i w:val="0"/>
-          <w:color w:val="000000"/>
-          <w:sz w:val="24"/>
-        </w:rPr>
-        <w:t>requirements for the degree of Master of Science</w:t>
-      </w:r>
-    </w:p>
-    <w:p>
-      <w:pPr>
-        <w:keepNext w:val="0"/>
-        <w:pageBreakBefore w:val="0"/>
-        <w:widowControl/>
-        <w:spacing w:before="0" w:after="120" w:line="240" w:lineRule="auto"/>
-        <w:ind w:firstLine="0"/>
-        <w:jc w:val="center"/>
-      </w:pPr>
-      <w:r>
-        <w:rPr>
-          <w:rFonts w:ascii="Times New Roman" w:hAnsi="Times New Roman" w:eastAsia="Times New Roman"/>
-          <w:b/>
-          <w:i w:val="0"/>
-          <w:color w:val="000000"/>
-          <w:sz w:val="24"/>
-        </w:rPr>
-        <w:t>in Conservative Dentistry</w:t>
-      </w:r>
-    </w:p>
-    <w:p>
-      <w:pPr>
-        <w:keepNext w:val="0"/>
-        <w:pageBreakBefore w:val="0"/>
-        <w:widowControl/>
-        <w:spacing w:before="0" w:after="120" w:line="240" w:lineRule="auto"/>
-        <w:ind w:firstLine="0"/>
-        <w:jc w:val="center"/>
-      </w:pPr>
-      <w:r>
-        <w:rPr>
-          <w:rFonts w:ascii="Times New Roman" w:hAnsi="Times New Roman" w:eastAsia="Times New Roman"/>
-          <w:b/>
-          <w:i w:val="0"/>
-          <w:color w:val="000000"/>
-          <w:sz w:val="24"/>
-        </w:rPr>
-        <w:t>Academic Year 2024–2025</w:t>
-      </w:r>
-    </w:p>
-    <w:p>
-      <w:pPr>
-        <w:keepNext w:val="0"/>
-        <w:pageBreakBefore w:val="0"/>
-        <w:widowControl/>
-        <w:spacing w:before="0" w:after="200" w:line="240" w:lineRule="auto"/>
-        <w:ind w:firstLine="0"/>
-        <w:jc w:val="center"/>
-      </w:pPr>
-      <w:r>
-        <w:rPr>
-          <w:rFonts w:ascii="Times New Roman" w:hAnsi="Times New Roman" w:eastAsia="Times New Roman"/>
-          <w:b/>
-          <w:i w:val="0"/>
-          <w:color w:val="000000"/>
-          <w:sz w:val="24"/>
-        </w:rPr>
-        <w:t>Name of Candidate: Mohamed Talaat Mohamed AbdelMoaty ElAbd</w:t>
-      </w:r>
-    </w:p>
-    <w:p>
-      <w:pPr>
-        <w:keepNext w:val="0"/>
-        <w:pageBreakBefore w:val="0"/>
-        <w:widowControl/>
-        <w:spacing w:before="0" w:after="0" w:line="240" w:lineRule="auto"/>
-        <w:ind w:firstLine="0"/>
-        <w:jc w:val="center"/>
-      </w:pPr>
-      <w:r>
-        <w:rPr>
-          <w:rFonts w:ascii="Times New Roman" w:hAnsi="Times New Roman" w:eastAsia="Times New Roman"/>
-          <w:b/>
-          <w:i w:val="0"/>
-          <w:color w:val="000000"/>
-          <w:sz w:val="24"/>
-        </w:rPr>
-        <w:t>English Title</w:t>
-      </w:r>
-    </w:p>
-    <w:p>
-      <w:pPr>
-        <w:keepNext w:val="0"/>
-        <w:pageBreakBefore w:val="0"/>
-        <w:widowControl/>
-        <w:spacing w:before="0" w:after="160" w:line="240" w:lineRule="auto"/>
-        <w:ind w:firstLine="0"/>
-        <w:jc w:val="center"/>
-      </w:pPr>
-      <w:r>
-        <w:rPr>
-          <w:rFonts w:ascii="Times New Roman" w:hAnsi="Times New Roman" w:eastAsia="Times New Roman"/>
-          <w:b/>
-          <w:i w:val="0"/>
-          <w:color w:val="000000"/>
-          <w:sz w:val="26"/>
-        </w:rPr>
-        <w:t>COMPARATIVE STUDY OF WEAR RESISTANCE AND SURFACE ROUGHNESS OF INJECTABLE VERSUS CONVENTIONAL COMPOSITE RESIN — IN VITRO STUDY</w:t>
-      </w:r>
-    </w:p>
-    <w:p>
-      <w:pPr>
-        <w:keepNext w:val="0"/>
-        <w:pageBreakBefore w:val="0"/>
-        <w:widowControl/>
-        <w:spacing w:before="0" w:after="40" w:line="240" w:lineRule="auto"/>
-        <w:ind w:firstLine="0"/>
-        <w:jc w:val="center"/>
-      </w:pPr>
-      <w:r>
-        <w:rPr>
-          <w:rFonts w:ascii="Times New Roman" w:hAnsi="Times New Roman" w:eastAsia="Times New Roman"/>
-          <w:b/>
-          <w:i w:val="0"/>
-          <w:color w:val="000000"/>
-          <w:sz w:val="24"/>
-        </w:rPr>
-        <w:t>Arabic Title</w:t>
-      </w:r>
-    </w:p>
-    <w:p>
-      <w:pPr>
-        <w:keepNext w:val="0"/>
-        <w:pageBreakBefore w:val="0"/>
-        <w:widowControl/>
-        <w:spacing w:before="0" w:after="200" w:line="240" w:lineRule="auto"/>
-        <w:ind w:firstLine="0"/>
-        <w:jc w:val="center"/>
-        <w:bidi w:val="1"/>
-      </w:pPr>
-      <w:r>
-        <w:rPr>
-          <w:rFonts w:ascii="Noto Naskh Arabic" w:hAnsi="Noto Naskh Arabic" w:eastAsia="Noto Naskh Arabic" w:cs="Noto Naskh Arabic"/>
-          <w:b/>
-          <w:i w:val="0"/>
-          <w:color w:val="000000"/>
-          <w:sz w:val="28"/>
-          <w:rtl/>
-          <w:szCs w:val="28"/>
-        </w:rPr>
-        <w:t>دراسة مقارنة للتآكل و خشونة سطح الراتينج المركب القابل للحقن و التقليدي - دراسة في المختبر</w:t>
-      </w:r>
-    </w:p>
-    <w:p>
-      <w:pPr>
-        <w:keepNext w:val="0"/>
-        <w:pageBreakBefore w:val="0"/>
-        <w:widowControl/>
-        <w:spacing w:before="80" w:after="80" w:line="240" w:lineRule="auto"/>
-        <w:ind w:firstLine="0"/>
-        <w:jc w:val="center"/>
-      </w:pPr>
-      <w:r>
-        <w:rPr>
-          <w:rFonts w:ascii="Times New Roman" w:hAnsi="Times New Roman" w:eastAsia="Times New Roman"/>
-          <w:b/>
-          <w:i w:val="0"/>
-          <w:color w:val="000000"/>
-          <w:sz w:val="24"/>
-        </w:rPr>
-        <w:t>Supervision Committee</w:t>
-      </w:r>
-    </w:p>
-    <w:p>
-      <w:pPr>
-        <w:keepNext w:val="0"/>
-        <w:pageBreakBefore w:val="0"/>
-        <w:widowControl/>
-        <w:spacing w:before="0" w:after="0" w:line="240" w:lineRule="auto"/>
-        <w:ind w:firstLine="0"/>
-        <w:jc w:val="center"/>
-      </w:pPr>
-      <w:r>
-        <w:rPr>
-          <w:rFonts w:ascii="Times New Roman" w:hAnsi="Times New Roman" w:eastAsia="Times New Roman"/>
-          <w:b/>
-          <w:i w:val="0"/>
-          <w:color w:val="000000"/>
-          <w:sz w:val="24"/>
-        </w:rPr>
-        <w:t>1. Prof. Wegdan M. Abdel-Fattah</w:t>
-      </w:r>
-    </w:p>
-    <w:p>
-      <w:pPr>
-        <w:keepNext w:val="0"/>
-        <w:pageBreakBefore w:val="0"/>
-        <w:widowControl/>
-        <w:spacing w:before="0" w:after="0" w:line="240" w:lineRule="auto"/>
-        <w:ind w:firstLine="0"/>
-        <w:jc w:val="center"/>
-      </w:pPr>
-      <w:r>
-        <w:rPr>
-          <w:rFonts w:ascii="Times New Roman" w:hAnsi="Times New Roman" w:eastAsia="Times New Roman"/>
-          <w:b/>
-          <w:i w:val="0"/>
-          <w:color w:val="000000"/>
-          <w:sz w:val="24"/>
-        </w:rPr>
-        <w:t>2. Asst. Prof. Emad M. El-Sayed (Main supervisor)</w:t>
-      </w:r>
-    </w:p>
-    <w:p>
-      <w:pPr>
         <w:sectPr>
           <w:footerReference w:type="default" r:id="rId9"/>
           <w:pgSz w:w="11906" w:h="16838"/>
-          <w:pgMar w:top="850" w:right="1417" w:bottom="1417" w:left="1701" w:header="720" w:footer="720" w:gutter="0"/>
+          <w:pgMar w:top="0" w:right="0" w:bottom="0" w:left="0" w:header="0" w:footer="0" w:gutter="0"/>
           <w:cols w:space="720"/>
           <w:titlePg/>
           <w:docGrid w:linePitch="360"/>
@@ -1955,9 +1697,9 @@
     <w:p>
       <w:pPr>
         <w:sectPr>
-          <w:footerReference w:type="default" r:id="rId11"/>
+          <w:footerReference w:type="default" r:id="rId12"/>
           <w:pgSz w:w="11906" w:h="16838"/>
-          <w:pgMar w:top="1417" w:right="1417" w:bottom="1417" w:left="1701" w:header="720" w:footer="720" w:gutter="0"/>
+          <w:pgMar w:top="1417" w:right="1417" w:bottom="1417" w:left="1701" w:header="0" w:footer="0" w:gutter="0"/>
           <w:cols w:space="720"/>
           <w:titlePg/>
           <w:docGrid w:linePitch="360"/>
@@ -7314,9 +7056,9 @@
       </w:r>
     </w:p>
     <w:sectPr>
-      <w:footerReference w:type="default" r:id="rId12"/>
+      <w:footerReference w:type="default" r:id="rId13"/>
       <w:pgSz w:w="11906" w:h="16838"/>
-      <w:pgMar w:top="1417" w:right="1417" w:bottom="1417" w:left="1701" w:header="720" w:footer="720" w:gutter="0"/>
+      <w:pgMar w:top="1417" w:right="1417" w:bottom="1417" w:left="1701" w:header="0" w:footer="0" w:gutter="0"/>
       <w:cols w:space="720"/>
       <w:titlePg/>
       <w:docGrid w:linePitch="360"/>

</xml_diff>

<commit_message>
Assemble the full thesis for supervision
Merge the approved protocol methods into Chapter 3, expand Results and Discussion, and add the front and back matter a supervisor expects: roles, acknowledgements, dedication, English and Arabic abstracts, and an Arabic summary. Older drafts with empty chapters and bar geometry are marked superseded.

Co-authored-by: Ahmed El Gamry <ahmed733676-droid@users.noreply.github.com>
</commit_message>
<xml_diff>
--- a/Thesis_Complete.docx
+++ b/Thesis_Complete.docx
@@ -169,7 +169,7 @@
         <w:keepNext w:val="0"/>
         <w:pageBreakBefore w:val="0"/>
         <w:widowControl/>
-        <w:spacing w:before="0" w:after="240" w:line="480" w:lineRule="auto"/>
+        <w:spacing w:before="0" w:after="0" w:line="480" w:lineRule="auto"/>
         <w:ind w:firstLine="0"/>
         <w:jc w:val="center"/>
       </w:pPr>
@@ -189,6 +189,26 @@
         <w:keepNext w:val="0"/>
         <w:pageBreakBefore w:val="0"/>
         <w:widowControl/>
+        <w:spacing w:before="0" w:after="0" w:line="480" w:lineRule="auto"/>
+        <w:ind w:firstLine="0"/>
+        <w:jc w:val="both"/>
+      </w:pPr>
+      <w:r>
+        <w:rPr>
+          <w:rFonts w:ascii="Times New Roman" w:hAnsi="Times New Roman" w:eastAsia="Times New Roman"/>
+          <w:b w:val="0"/>
+          <w:i w:val="0"/>
+          <w:color w:val="000000"/>
+          <w:sz w:val="24"/>
+        </w:rPr>
+        <w:t>Conceptualization and design of the study. Analysis and interpretation of the results. Supervision of execution and of the writing.</w:t>
+      </w:r>
+    </w:p>
+    <w:p>
+      <w:pPr>
+        <w:keepNext w:val="0"/>
+        <w:pageBreakBefore w:val="0"/>
+        <w:widowControl/>
         <w:spacing w:before="240" w:after="0" w:line="480" w:lineRule="auto"/>
         <w:ind w:firstLine="0"/>
         <w:jc w:val="center"/>
@@ -261,6 +281,26 @@
           <w:color w:val="000000"/>
           <w:sz w:val="24"/>
         </w:rPr>
+        <w:t>Supervision of the experimental procedures. Conceptualization and design of the study. Supervision of execution and of the writing. Revision of the thesis.</w:t>
+      </w:r>
+    </w:p>
+    <w:p>
+      <w:pPr>
+        <w:keepNext w:val="0"/>
+        <w:pageBreakBefore w:val="0"/>
+        <w:widowControl/>
+        <w:spacing w:before="0" w:after="0" w:line="480" w:lineRule="auto"/>
+        <w:ind w:firstLine="0"/>
+        <w:jc w:val="both"/>
+      </w:pPr>
+      <w:r>
+        <w:rPr>
+          <w:rFonts w:ascii="Times New Roman" w:hAnsi="Times New Roman" w:eastAsia="Times New Roman"/>
+          <w:b w:val="0"/>
+          <w:i w:val="0"/>
+          <w:color w:val="000000"/>
+          <w:sz w:val="24"/>
+        </w:rPr>
         <w:t>Faculty of Dentistry, Pharos University in Alexandria.</w:t>
       </w:r>
     </w:p>
@@ -343,6 +383,108 @@
           <w:sz w:val="24"/>
         </w:rPr>
         <w:t>Signature: …………………………     Date: …………………………</w:t>
+      </w:r>
+    </w:p>
+    <w:p>
+      <w:pPr>
+        <w:pStyle w:val="Heading1"/>
+        <w:keepNext/>
+        <w:pageBreakBefore/>
+        <w:widowControl/>
+        <w:spacing w:before="0" w:after="120" w:line="480" w:lineRule="auto"/>
+        <w:ind w:firstLine="0"/>
+        <w:jc w:val="center"/>
+      </w:pPr>
+      <w:r>
+        <w:rPr>
+          <w:rFonts w:ascii="Times New Roman" w:hAnsi="Times New Roman" w:eastAsia="Times New Roman"/>
+          <w:b/>
+          <w:i w:val="0"/>
+          <w:color w:val="000000"/>
+          <w:sz w:val="28"/>
+        </w:rPr>
+        <w:t>ACKNOWLEDGEMENTS</w:t>
+      </w:r>
+    </w:p>
+    <w:p>
+      <w:pPr>
+        <w:keepNext w:val="0"/>
+        <w:pageBreakBefore w:val="0"/>
+        <w:widowControl/>
+        <w:spacing w:before="0" w:after="0" w:line="480" w:lineRule="auto"/>
+        <w:ind w:firstLine="720"/>
+        <w:jc w:val="both"/>
+      </w:pPr>
+      <w:r>
+        <w:rPr>
+          <w:rFonts w:ascii="Times New Roman" w:hAnsi="Times New Roman" w:eastAsia="Times New Roman"/>
+          <w:b w:val="0"/>
+          <w:i w:val="0"/>
+          <w:color w:val="000000"/>
+          <w:sz w:val="24"/>
+        </w:rPr>
+        <w:t>I thank Prof. Wegdan M. Abdel-Fattah and Asst. Prof. Emad M. El-Sayed for the plan, the laboratory work and the reading of the text.</w:t>
+      </w:r>
+    </w:p>
+    <w:p>
+      <w:pPr>
+        <w:keepNext w:val="0"/>
+        <w:pageBreakBefore w:val="0"/>
+        <w:widowControl/>
+        <w:spacing w:before="0" w:after="0" w:line="480" w:lineRule="auto"/>
+        <w:ind w:firstLine="720"/>
+        <w:jc w:val="both"/>
+      </w:pPr>
+      <w:r>
+        <w:rPr>
+          <w:rFonts w:ascii="Times New Roman" w:hAnsi="Times New Roman" w:eastAsia="Times New Roman"/>
+          <w:b w:val="0"/>
+          <w:i w:val="0"/>
+          <w:color w:val="000000"/>
+          <w:sz w:val="24"/>
+        </w:rPr>
+        <w:t>Disc preparation was done in the Faculty of Dentistry, Pharos University in Alexandria. The toothbrushing run and the measurements were done in the Conservative Dentistry laboratory, Faculty of Dentistry, Alexandria University. I thank the staff of the Dental Biomaterial Department there for the use of the custom brushing machine.</w:t>
+      </w:r>
+    </w:p>
+    <w:p>
+      <w:pPr>
+        <w:pStyle w:val="Heading1"/>
+        <w:keepNext/>
+        <w:pageBreakBefore/>
+        <w:widowControl/>
+        <w:spacing w:before="0" w:after="120" w:line="480" w:lineRule="auto"/>
+        <w:ind w:firstLine="0"/>
+        <w:jc w:val="center"/>
+      </w:pPr>
+      <w:r>
+        <w:rPr>
+          <w:rFonts w:ascii="Times New Roman" w:hAnsi="Times New Roman" w:eastAsia="Times New Roman"/>
+          <w:b/>
+          <w:i w:val="0"/>
+          <w:color w:val="000000"/>
+          <w:sz w:val="28"/>
+        </w:rPr>
+        <w:t>DEDICATION</w:t>
+      </w:r>
+    </w:p>
+    <w:p>
+      <w:pPr>
+        <w:keepNext w:val="0"/>
+        <w:pageBreakBefore w:val="0"/>
+        <w:widowControl/>
+        <w:spacing w:before="1440" w:after="0" w:line="480" w:lineRule="auto"/>
+        <w:ind w:firstLine="0"/>
+        <w:jc w:val="center"/>
+      </w:pPr>
+      <w:r>
+        <w:rPr>
+          <w:rFonts w:ascii="Times New Roman" w:hAnsi="Times New Roman" w:eastAsia="Times New Roman"/>
+          <w:b w:val="0"/>
+          <w:i/>
+          <w:color w:val="000000"/>
+          <w:sz w:val="24"/>
+        </w:rPr>
+        <w:t>To my family.</w:t>
       </w:r>
     </w:p>
     <w:p>
@@ -453,7 +595,7 @@
           <w:color w:val="000000"/>
           <w:sz w:val="24"/>
         </w:rPr>
-        <w:t>Thirty-six discs (10 mm diameter × 1 mm thick; n = 12) were brushed at 2 N in a Colgate Total slurry prepared after ISO guidance. Mass was recorded before and after abrasion. Ra was measured by contact profilometry. Percentage weight loss was compared by one-way ANOVA. Ra after brushing was compared by the Kruskal–Wallis test (α = 0.05).</w:t>
+        <w:t>Thirty-six discs (10 mm diameter × 1 mm thick; n = 12; shade A2) were packed in a CAD/CAM Teflon mould, cured through a Mylar strip and stored in water at 37 °C for 24 h. They were brushed at 2 N for 10 000 cycles in a Colgate Total slurry (RDA 70; 250 g/L). Mass was recorded on a RADWAG AS 220-R2. Ra was the mean of five MarSurf PS10 traces. Percentage weight loss was compared by one-way ANOVA. Ra after brushing was compared by the Kruskal–Wallis test (α = 0.05).</w:t>
       </w:r>
     </w:p>
     <w:p>
@@ -488,7 +630,7 @@
     </w:p>
     <w:p>
       <w:pPr>
-        <w:keepNext w:val="0"/>
+        <w:keepNext/>
         <w:pageBreakBefore w:val="0"/>
         <w:widowControl/>
         <w:spacing w:before="0" w:after="0" w:line="480" w:lineRule="auto"/>
@@ -564,7 +706,391 @@
           <w:color w:val="000000"/>
           <w:sz w:val="28"/>
         </w:rPr>
+        <w:t>الملخص</w:t>
+      </w:r>
+    </w:p>
+    <w:p>
+      <w:pPr>
+        <w:keepNext w:val="0"/>
+        <w:pageBreakBefore w:val="0"/>
+        <w:widowControl/>
+        <w:spacing w:before="0" w:after="0" w:line="480" w:lineRule="auto"/>
+        <w:ind w:firstLine="720"/>
+        <w:jc w:val="both"/>
+        <w:bidi w:val="1"/>
+      </w:pPr>
+      <w:r>
+        <w:rPr>
+          <w:rFonts w:ascii="Noto Naskh Arabic" w:hAnsi="Noto Naskh Arabic" w:eastAsia="Noto Naskh Arabic" w:cs="Noto Naskh Arabic"/>
+          <w:b w:val="0"/>
+          <w:i w:val="0"/>
+          <w:color w:val="000000"/>
+          <w:sz w:val="24"/>
+          <w:rtl/>
+          <w:szCs w:val="24"/>
+        </w:rPr>
+        <w:t>الخلفية. تُسوَّق الراتينجات المركبة القابلة للحقن عالية الملء للاستخدام تحت الحمل. ما زال فقد الكتلة وتغيّر خشونة السطح بعد سحل فرشاة الأسنان يحتاجان إلى مقارنة مباشرة مع راتينج نانوهجين تقليدي تحت الشروط المختبرية نفسها.</w:t>
+      </w:r>
+    </w:p>
+    <w:p>
+      <w:pPr>
+        <w:keepNext w:val="0"/>
+        <w:pageBreakBefore w:val="0"/>
+        <w:widowControl/>
+        <w:spacing w:before="0" w:after="0" w:line="480" w:lineRule="auto"/>
+        <w:ind w:firstLine="720"/>
+        <w:jc w:val="both"/>
+        <w:bidi w:val="1"/>
+      </w:pPr>
+      <w:r>
+        <w:rPr>
+          <w:rFonts w:ascii="Noto Naskh Arabic" w:hAnsi="Noto Naskh Arabic" w:eastAsia="Noto Naskh Arabic" w:cs="Noto Naskh Arabic"/>
+          <w:b w:val="0"/>
+          <w:i w:val="0"/>
+          <w:color w:val="000000"/>
+          <w:sz w:val="24"/>
+          <w:rtl/>
+          <w:szCs w:val="24"/>
+        </w:rPr>
+        <w:t>الهدف. مقارنة النسبة المئوية لفقد الوزن وخشونة السطح المتوسطة (Ra) لكل من Beautifil Flow Plus X F00 وG-ænial Universal Injectable وBeautifil II LS بعد عشرة آلاف دورة تفريش.</w:t>
+      </w:r>
+    </w:p>
+    <w:p>
+      <w:pPr>
+        <w:keepNext w:val="0"/>
+        <w:pageBreakBefore w:val="0"/>
+        <w:widowControl/>
+        <w:spacing w:before="0" w:after="0" w:line="480" w:lineRule="auto"/>
+        <w:ind w:firstLine="720"/>
+        <w:jc w:val="both"/>
+        <w:bidi w:val="1"/>
+      </w:pPr>
+      <w:r>
+        <w:rPr>
+          <w:rFonts w:ascii="Noto Naskh Arabic" w:hAnsi="Noto Naskh Arabic" w:eastAsia="Noto Naskh Arabic" w:cs="Noto Naskh Arabic"/>
+          <w:b w:val="0"/>
+          <w:i w:val="0"/>
+          <w:color w:val="000000"/>
+          <w:sz w:val="24"/>
+          <w:rtl/>
+          <w:szCs w:val="24"/>
+        </w:rPr>
+        <w:t>الطريقة. أُعدّ ستة وثلاثون قرصاً (قطر 10 مم × سمك 1 مم؛ ن = 12؛ الدرجة A2) في قالب تفلون، ثم فُرشت بحمولة 2 نيوتن في معلق Colgate Total وفق إرشاد ISO. سُجّلت الكتلة قبل السحل وبعده. قيس Ra بجهاز تماسي (خمس قراءات لكل قرص). قورن فقد الوزن بتحليل التباين الأحادي، وقورن Ra بعد التفريش باختبار كروسكال–واليس (α = 0.05).</w:t>
+      </w:r>
+    </w:p>
+    <w:p>
+      <w:pPr>
+        <w:keepNext w:val="0"/>
+        <w:pageBreakBefore w:val="0"/>
+        <w:widowControl/>
+        <w:spacing w:before="0" w:after="0" w:line="480" w:lineRule="auto"/>
+        <w:ind w:firstLine="720"/>
+        <w:jc w:val="both"/>
+        <w:bidi w:val="1"/>
+      </w:pPr>
+      <w:r>
+        <w:rPr>
+          <w:rFonts w:ascii="Noto Naskh Arabic" w:hAnsi="Noto Naskh Arabic" w:eastAsia="Noto Naskh Arabic" w:cs="Noto Naskh Arabic"/>
+          <w:b w:val="0"/>
+          <w:i w:val="0"/>
+          <w:color w:val="000000"/>
+          <w:sz w:val="24"/>
+          <w:rtl/>
+          <w:szCs w:val="24"/>
+        </w:rPr>
+        <w:t>النتائج. كان متوسط فقد الوزن 1.49 ± 3.14٪ لـ Beautifil Flow Plus X F00، و0.65 ± 0.37٪ لـ G-ænial Universal Injectable، و0.41 ± 0.25٪ لـ Beautifil II LS (p = 0.329). وكان متوسط Ra بعد التفريش 0.104 ± 0.017 ميكرومتر، و0.100 ± 0.023 ميكرومتر، و0.194 ± 0.050 ميكرومتر على الترتيب (p &lt; 0.001). كان كل راتينج قابل للحقن أنعم من Beautifil II LS، ولم يختلف القابلان للحقن أحدهما عن الآخر. فقد قرص واحد من Beautifil Flow Plus X F00 نحو 11.4٪ من كتلته وهو مصدر الانحراف المعياري الكبير في تلك المجموعة.</w:t>
+      </w:r>
+    </w:p>
+    <w:p>
+      <w:pPr>
+        <w:keepNext w:val="0"/>
+        <w:pageBreakBefore w:val="0"/>
+        <w:widowControl/>
+        <w:spacing w:before="0" w:after="0" w:line="480" w:lineRule="auto"/>
+        <w:ind w:firstLine="720"/>
+        <w:jc w:val="both"/>
+        <w:bidi w:val="1"/>
+      </w:pPr>
+      <w:r>
+        <w:rPr>
+          <w:rFonts w:ascii="Noto Naskh Arabic" w:hAnsi="Noto Naskh Arabic" w:eastAsia="Noto Naskh Arabic" w:cs="Noto Naskh Arabic"/>
+          <w:b w:val="0"/>
+          <w:i w:val="0"/>
+          <w:color w:val="000000"/>
+          <w:sz w:val="24"/>
+          <w:rtl/>
+          <w:szCs w:val="24"/>
+        </w:rPr>
+        <w:t>الاستنتاجات. تحت بروتوكول التفريش هذا لم يختلف السحل الوزني بين الراتينجات الثلاثة اختلافاً يعتد به إحصائياً. بقي القابلان للحقن أنعم من النانوهجين التقليدي. بقيت متوسطات القابلين للحقن دون عتبة اللويحة 0.2 ميكرومتر. وقع متوسط النانوهجين على تلك العتبة.</w:t>
+      </w:r>
+    </w:p>
+    <w:p>
+      <w:pPr>
+        <w:keepNext w:val="0"/>
+        <w:pageBreakBefore w:val="0"/>
+        <w:widowControl/>
+        <w:spacing w:before="0" w:after="0" w:line="480" w:lineRule="auto"/>
+        <w:ind w:firstLine="720"/>
+        <w:jc w:val="both"/>
+        <w:bidi w:val="1"/>
+      </w:pPr>
+      <w:r>
+        <w:rPr>
+          <w:rFonts w:ascii="Noto Naskh Arabic" w:hAnsi="Noto Naskh Arabic" w:eastAsia="Noto Naskh Arabic" w:cs="Noto Naskh Arabic"/>
+          <w:b w:val="0"/>
+          <w:i w:val="0"/>
+          <w:color w:val="000000"/>
+          <w:sz w:val="24"/>
+          <w:rtl/>
+          <w:szCs w:val="24"/>
+        </w:rPr>
+        <w:t>الكلمات المفتاحية. الراتينج المركب القابل للحقن؛ الراتينج النانوهجين؛ سحل فرشاة الأسنان؛ التآكل؛ خشونة السطح؛ الجايومر.</w:t>
+      </w:r>
+    </w:p>
+    <w:p>
+      <w:pPr>
+        <w:pStyle w:val="Heading1"/>
+        <w:keepNext/>
+        <w:pageBreakBefore/>
+        <w:widowControl/>
+        <w:spacing w:before="0" w:after="120" w:line="480" w:lineRule="auto"/>
+        <w:ind w:firstLine="0"/>
+        <w:jc w:val="center"/>
+      </w:pPr>
+      <w:r>
+        <w:rPr>
+          <w:rFonts w:ascii="Times New Roman" w:hAnsi="Times New Roman" w:eastAsia="Times New Roman"/>
+          <w:b/>
+          <w:i w:val="0"/>
+          <w:color w:val="000000"/>
+          <w:sz w:val="28"/>
+        </w:rPr>
         <w:t>CONTENTS</w:t>
+      </w:r>
+    </w:p>
+    <w:p>
+      <w:pPr>
+        <w:keepNext w:val="0"/>
+        <w:pageBreakBefore w:val="0"/>
+        <w:widowControl/>
+        <w:tabs>
+          <w:tab w:pos="7937" w:val="right" w:leader="dot"/>
+        </w:tabs>
+        <w:spacing w:before="0" w:after="0" w:line="480" w:lineRule="auto"/>
+        <w:ind w:firstLine="0" w:left="0"/>
+        <w:jc w:val="left"/>
+      </w:pPr>
+      <w:r>
+        <w:rPr>
+          <w:rFonts w:ascii="Times New Roman" w:hAnsi="Times New Roman" w:eastAsia="Times New Roman"/>
+          <w:b/>
+          <w:i w:val="0"/>
+          <w:color w:val="000000"/>
+          <w:sz w:val="24"/>
+        </w:rPr>
+        <w:t>Supervision Committee</w:t>
+        <w:tab/>
+        <w:t>i</w:t>
+      </w:r>
+    </w:p>
+    <w:p>
+      <w:pPr>
+        <w:keepNext w:val="0"/>
+        <w:pageBreakBefore w:val="0"/>
+        <w:widowControl/>
+        <w:tabs>
+          <w:tab w:pos="7937" w:val="right" w:leader="dot"/>
+        </w:tabs>
+        <w:spacing w:before="0" w:after="0" w:line="480" w:lineRule="auto"/>
+        <w:ind w:firstLine="0" w:left="0"/>
+        <w:jc w:val="left"/>
+      </w:pPr>
+      <w:r>
+        <w:rPr>
+          <w:rFonts w:ascii="Times New Roman" w:hAnsi="Times New Roman" w:eastAsia="Times New Roman"/>
+          <w:b/>
+          <w:i w:val="0"/>
+          <w:color w:val="000000"/>
+          <w:sz w:val="24"/>
+        </w:rPr>
+        <w:t>Declaration</w:t>
+        <w:tab/>
+        <w:t>ii</w:t>
+      </w:r>
+    </w:p>
+    <w:p>
+      <w:pPr>
+        <w:keepNext w:val="0"/>
+        <w:pageBreakBefore w:val="0"/>
+        <w:widowControl/>
+        <w:tabs>
+          <w:tab w:pos="7937" w:val="right" w:leader="dot"/>
+        </w:tabs>
+        <w:spacing w:before="0" w:after="0" w:line="480" w:lineRule="auto"/>
+        <w:ind w:firstLine="0" w:left="0"/>
+        <w:jc w:val="left"/>
+      </w:pPr>
+      <w:r>
+        <w:rPr>
+          <w:rFonts w:ascii="Times New Roman" w:hAnsi="Times New Roman" w:eastAsia="Times New Roman"/>
+          <w:b/>
+          <w:i w:val="0"/>
+          <w:color w:val="000000"/>
+          <w:sz w:val="24"/>
+        </w:rPr>
+        <w:t>Acknowledgements</w:t>
+        <w:tab/>
+        <w:t>iii</w:t>
+      </w:r>
+    </w:p>
+    <w:p>
+      <w:pPr>
+        <w:keepNext w:val="0"/>
+        <w:pageBreakBefore w:val="0"/>
+        <w:widowControl/>
+        <w:tabs>
+          <w:tab w:pos="7937" w:val="right" w:leader="dot"/>
+        </w:tabs>
+        <w:spacing w:before="0" w:after="0" w:line="480" w:lineRule="auto"/>
+        <w:ind w:firstLine="0" w:left="0"/>
+        <w:jc w:val="left"/>
+      </w:pPr>
+      <w:r>
+        <w:rPr>
+          <w:rFonts w:ascii="Times New Roman" w:hAnsi="Times New Roman" w:eastAsia="Times New Roman"/>
+          <w:b/>
+          <w:i w:val="0"/>
+          <w:color w:val="000000"/>
+          <w:sz w:val="24"/>
+        </w:rPr>
+        <w:t>Dedication</w:t>
+        <w:tab/>
+        <w:t>iv</w:t>
+      </w:r>
+    </w:p>
+    <w:p>
+      <w:pPr>
+        <w:keepNext w:val="0"/>
+        <w:pageBreakBefore w:val="0"/>
+        <w:widowControl/>
+        <w:tabs>
+          <w:tab w:pos="7937" w:val="right" w:leader="dot"/>
+        </w:tabs>
+        <w:spacing w:before="0" w:after="0" w:line="480" w:lineRule="auto"/>
+        <w:ind w:firstLine="0" w:left="0"/>
+        <w:jc w:val="left"/>
+      </w:pPr>
+      <w:r>
+        <w:rPr>
+          <w:rFonts w:ascii="Times New Roman" w:hAnsi="Times New Roman" w:eastAsia="Times New Roman"/>
+          <w:b/>
+          <w:i w:val="0"/>
+          <w:color w:val="000000"/>
+          <w:sz w:val="24"/>
+        </w:rPr>
+        <w:t>Abstract</w:t>
+        <w:tab/>
+        <w:t>v</w:t>
+      </w:r>
+    </w:p>
+    <w:p>
+      <w:pPr>
+        <w:keepNext w:val="0"/>
+        <w:pageBreakBefore w:val="0"/>
+        <w:widowControl/>
+        <w:tabs>
+          <w:tab w:pos="7937" w:val="right" w:leader="dot"/>
+        </w:tabs>
+        <w:spacing w:before="0" w:after="0" w:line="480" w:lineRule="auto"/>
+        <w:ind w:firstLine="0" w:left="0"/>
+        <w:jc w:val="left"/>
+      </w:pPr>
+      <w:r>
+        <w:rPr>
+          <w:rFonts w:ascii="Times New Roman" w:hAnsi="Times New Roman" w:eastAsia="Times New Roman"/>
+          <w:b/>
+          <w:i w:val="0"/>
+          <w:color w:val="000000"/>
+          <w:sz w:val="24"/>
+        </w:rPr>
+        <w:t>Arabic Abstract</w:t>
+        <w:tab/>
+        <w:t>vi</w:t>
+      </w:r>
+    </w:p>
+    <w:p>
+      <w:pPr>
+        <w:keepNext w:val="0"/>
+        <w:pageBreakBefore w:val="0"/>
+        <w:widowControl/>
+        <w:tabs>
+          <w:tab w:pos="7937" w:val="right" w:leader="dot"/>
+        </w:tabs>
+        <w:spacing w:before="0" w:after="0" w:line="480" w:lineRule="auto"/>
+        <w:ind w:firstLine="0" w:left="0"/>
+        <w:jc w:val="left"/>
+      </w:pPr>
+      <w:r>
+        <w:rPr>
+          <w:rFonts w:ascii="Times New Roman" w:hAnsi="Times New Roman" w:eastAsia="Times New Roman"/>
+          <w:b/>
+          <w:i w:val="0"/>
+          <w:color w:val="000000"/>
+          <w:sz w:val="24"/>
+        </w:rPr>
+        <w:t>Contents</w:t>
+        <w:tab/>
+        <w:t>vii</w:t>
+      </w:r>
+    </w:p>
+    <w:p>
+      <w:pPr>
+        <w:keepNext w:val="0"/>
+        <w:pageBreakBefore w:val="0"/>
+        <w:widowControl/>
+        <w:tabs>
+          <w:tab w:pos="7937" w:val="right" w:leader="dot"/>
+        </w:tabs>
+        <w:spacing w:before="0" w:after="0" w:line="480" w:lineRule="auto"/>
+        <w:ind w:firstLine="0" w:left="0"/>
+        <w:jc w:val="left"/>
+      </w:pPr>
+      <w:r>
+        <w:rPr>
+          <w:rFonts w:ascii="Times New Roman" w:hAnsi="Times New Roman" w:eastAsia="Times New Roman"/>
+          <w:b/>
+          <w:i w:val="0"/>
+          <w:color w:val="000000"/>
+          <w:sz w:val="24"/>
+        </w:rPr>
+        <w:t>List of Tables</w:t>
+        <w:tab/>
+        <w:t>ix</w:t>
+      </w:r>
+    </w:p>
+    <w:p>
+      <w:pPr>
+        <w:keepNext w:val="0"/>
+        <w:pageBreakBefore w:val="0"/>
+        <w:widowControl/>
+        <w:tabs>
+          <w:tab w:pos="7937" w:val="right" w:leader="dot"/>
+        </w:tabs>
+        <w:spacing w:before="0" w:after="0" w:line="480" w:lineRule="auto"/>
+        <w:ind w:firstLine="0" w:left="0"/>
+        <w:jc w:val="left"/>
+      </w:pPr>
+      <w:r>
+        <w:rPr>
+          <w:rFonts w:ascii="Times New Roman" w:hAnsi="Times New Roman" w:eastAsia="Times New Roman"/>
+          <w:b/>
+          <w:i w:val="0"/>
+          <w:color w:val="000000"/>
+          <w:sz w:val="24"/>
+        </w:rPr>
+        <w:t>List of Abbreviations</w:t>
+        <w:tab/>
+        <w:t>x</w:t>
       </w:r>
     </w:p>
     <w:p>
@@ -862,7 +1388,7 @@
           <w:color w:val="000000"/>
           <w:sz w:val="24"/>
         </w:rPr>
-        <w:t>3.1 Study Design and Sample</w:t>
+        <w:t>3.1 Study Design and Setting</w:t>
         <w:tab/>
         <w:t>7</w:t>
       </w:r>
@@ -887,7 +1413,7 @@
           <w:color w:val="000000"/>
           <w:sz w:val="24"/>
         </w:rPr>
-        <w:t>3.2 Materials</w:t>
+        <w:t>3.2 Sample Size</w:t>
         <w:tab/>
         <w:t>7</w:t>
       </w:r>
@@ -912,7 +1438,7 @@
           <w:color w:val="000000"/>
           <w:sz w:val="24"/>
         </w:rPr>
-        <w:t>3.3 Specimen Preparation</w:t>
+        <w:t>3.3 Materials</w:t>
         <w:tab/>
         <w:t>8</w:t>
       </w:r>
@@ -937,7 +1463,7 @@
           <w:color w:val="000000"/>
           <w:sz w:val="24"/>
         </w:rPr>
-        <w:t>3.4 Baseline Measurements</w:t>
+        <w:t>3.4 Equipment</w:t>
         <w:tab/>
         <w:t>8</w:t>
       </w:r>
@@ -962,9 +1488,9 @@
           <w:color w:val="000000"/>
           <w:sz w:val="24"/>
         </w:rPr>
-        <w:t>3.5 Toothbrushing Protocol</w:t>
+        <w:t>3.5 Specimen Preparation</w:t>
         <w:tab/>
-        <w:t>8</w:t>
+        <w:t>9</w:t>
       </w:r>
     </w:p>
     <w:p>
@@ -987,9 +1513,9 @@
           <w:color w:val="000000"/>
           <w:sz w:val="24"/>
         </w:rPr>
-        <w:t>3.6 Post-test Evaluation</w:t>
+        <w:t>3.6 Baseline Measurements</w:t>
         <w:tab/>
-        <w:t>8</w:t>
+        <w:t>9</w:t>
       </w:r>
     </w:p>
     <w:p>
@@ -1012,9 +1538,84 @@
           <w:color w:val="000000"/>
           <w:sz w:val="24"/>
         </w:rPr>
-        <w:t>3.7 Statistical Analysis</w:t>
+        <w:t>3.7 Toothbrushing Protocol</w:t>
         <w:tab/>
         <w:t>9</w:t>
+      </w:r>
+    </w:p>
+    <w:p>
+      <w:pPr>
+        <w:keepNext w:val="0"/>
+        <w:pageBreakBefore w:val="0"/>
+        <w:widowControl/>
+        <w:tabs>
+          <w:tab w:pos="7937" w:val="right" w:leader="dot"/>
+        </w:tabs>
+        <w:spacing w:before="0" w:after="0" w:line="480" w:lineRule="auto"/>
+        <w:ind w:firstLine="0" w:left="567"/>
+        <w:jc w:val="left"/>
+      </w:pPr>
+      <w:r>
+        <w:rPr>
+          <w:rFonts w:ascii="Times New Roman" w:hAnsi="Times New Roman" w:eastAsia="Times New Roman"/>
+          <w:b w:val="0"/>
+          <w:i w:val="0"/>
+          <w:color w:val="000000"/>
+          <w:sz w:val="24"/>
+        </w:rPr>
+        <w:t>3.8 Post-test Evaluation</w:t>
+        <w:tab/>
+        <w:t>10</w:t>
+      </w:r>
+    </w:p>
+    <w:p>
+      <w:pPr>
+        <w:keepNext w:val="0"/>
+        <w:pageBreakBefore w:val="0"/>
+        <w:widowControl/>
+        <w:tabs>
+          <w:tab w:pos="7937" w:val="right" w:leader="dot"/>
+        </w:tabs>
+        <w:spacing w:before="0" w:after="0" w:line="480" w:lineRule="auto"/>
+        <w:ind w:firstLine="0" w:left="567"/>
+        <w:jc w:val="left"/>
+      </w:pPr>
+      <w:r>
+        <w:rPr>
+          <w:rFonts w:ascii="Times New Roman" w:hAnsi="Times New Roman" w:eastAsia="Times New Roman"/>
+          <w:b w:val="0"/>
+          <w:i w:val="0"/>
+          <w:color w:val="000000"/>
+          <w:sz w:val="24"/>
+        </w:rPr>
+        <w:t>3.9 Statistical Analysis</w:t>
+        <w:tab/>
+        <w:t>10</w:t>
+      </w:r>
+    </w:p>
+    <w:p>
+      <w:pPr>
+        <w:keepNext w:val="0"/>
+        <w:pageBreakBefore w:val="0"/>
+        <w:widowControl/>
+        <w:tabs>
+          <w:tab w:pos="7937" w:val="right" w:leader="dot"/>
+        </w:tabs>
+        <w:spacing w:before="0" w:after="0" w:line="480" w:lineRule="auto"/>
+        <w:ind w:firstLine="0" w:left="567"/>
+        <w:jc w:val="left"/>
+      </w:pPr>
+      <w:r>
+        <w:rPr>
+          <w:rFonts w:ascii="Times New Roman" w:hAnsi="Times New Roman" w:eastAsia="Times New Roman"/>
+          <w:b w:val="0"/>
+          <w:i w:val="0"/>
+          <w:color w:val="000000"/>
+          <w:sz w:val="24"/>
+        </w:rPr>
+        <w:t>3.10 Ethical Considerations</w:t>
+        <w:tab/>
+        <w:t>10</w:t>
       </w:r>
     </w:p>
     <w:p>
@@ -1039,7 +1640,7 @@
         </w:rPr>
         <w:t>CHAPTER 4  Results</w:t>
         <w:tab/>
-        <w:t>10</w:t>
+        <w:t>11</w:t>
       </w:r>
     </w:p>
     <w:p>
@@ -1064,7 +1665,7 @@
         </w:rPr>
         <w:t>4.1 Weight Loss</w:t>
         <w:tab/>
-        <w:t>10</w:t>
+        <w:t>11</w:t>
       </w:r>
     </w:p>
     <w:p>
@@ -1089,7 +1690,7 @@
         </w:rPr>
         <w:t>4.2 Surface Roughness</w:t>
         <w:tab/>
-        <w:t>11</w:t>
+        <w:t>12</w:t>
       </w:r>
     </w:p>
     <w:p>
@@ -1114,7 +1715,7 @@
         </w:rPr>
         <w:t>4.3 Summary of Results</w:t>
         <w:tab/>
-        <w:t>12</w:t>
+        <w:t>14</w:t>
       </w:r>
     </w:p>
     <w:p>
@@ -1139,7 +1740,7 @@
         </w:rPr>
         <w:t>CHAPTER 5  Discussion</w:t>
         <w:tab/>
-        <w:t>13</w:t>
+        <w:t>15</w:t>
       </w:r>
     </w:p>
     <w:p>
@@ -1164,7 +1765,7 @@
         </w:rPr>
         <w:t>5.1 Weight Loss</w:t>
         <w:tab/>
-        <w:t>13</w:t>
+        <w:t>15</w:t>
       </w:r>
     </w:p>
     <w:p>
@@ -1189,7 +1790,7 @@
         </w:rPr>
         <w:t>5.2 Surface Roughness</w:t>
         <w:tab/>
-        <w:t>14</w:t>
+        <w:t>16</w:t>
       </w:r>
     </w:p>
     <w:p>
@@ -1214,7 +1815,7 @@
         </w:rPr>
         <w:t>5.3 Clinical Implications</w:t>
         <w:tab/>
-        <w:t>15</w:t>
+        <w:t>18</w:t>
       </w:r>
     </w:p>
     <w:p>
@@ -1239,7 +1840,7 @@
         </w:rPr>
         <w:t>5.4 Strengths of the Study</w:t>
         <w:tab/>
-        <w:t>15</w:t>
+        <w:t>18</w:t>
       </w:r>
     </w:p>
     <w:p>
@@ -1264,7 +1865,7 @@
         </w:rPr>
         <w:t>5.5 Limitations of the Study</w:t>
         <w:tab/>
-        <w:t>16</w:t>
+        <w:t>19</w:t>
       </w:r>
     </w:p>
     <w:p>
@@ -1289,7 +1890,7 @@
         </w:rPr>
         <w:t>5.6 Concluding Remarks</w:t>
         <w:tab/>
-        <w:t>16</w:t>
+        <w:t>19</w:t>
       </w:r>
     </w:p>
     <w:p>
@@ -1314,7 +1915,7 @@
         </w:rPr>
         <w:t>CHAPTER 6  Conclusions and Recommendations</w:t>
         <w:tab/>
-        <w:t>17</w:t>
+        <w:t>20</w:t>
       </w:r>
     </w:p>
     <w:p>
@@ -1337,9 +1938,9 @@
           <w:color w:val="000000"/>
           <w:sz w:val="24"/>
         </w:rPr>
-        <w:t>6.1 Conclusions</w:t>
+        <w:t>6.1 Summary</w:t>
         <w:tab/>
-        <w:t>17</w:t>
+        <w:t>20</w:t>
       </w:r>
     </w:p>
     <w:p>
@@ -1362,9 +1963,34 @@
           <w:color w:val="000000"/>
           <w:sz w:val="24"/>
         </w:rPr>
-        <w:t>6.2 Recommendations</w:t>
+        <w:t>6.2 Conclusions</w:t>
         <w:tab/>
-        <w:t>17</w:t>
+        <w:t>20</w:t>
+      </w:r>
+    </w:p>
+    <w:p>
+      <w:pPr>
+        <w:keepNext w:val="0"/>
+        <w:pageBreakBefore w:val="0"/>
+        <w:widowControl/>
+        <w:tabs>
+          <w:tab w:pos="7937" w:val="right" w:leader="dot"/>
+        </w:tabs>
+        <w:spacing w:before="0" w:after="0" w:line="480" w:lineRule="auto"/>
+        <w:ind w:firstLine="0" w:left="567"/>
+        <w:jc w:val="left"/>
+      </w:pPr>
+      <w:r>
+        <w:rPr>
+          <w:rFonts w:ascii="Times New Roman" w:hAnsi="Times New Roman" w:eastAsia="Times New Roman"/>
+          <w:b w:val="0"/>
+          <w:i w:val="0"/>
+          <w:color w:val="000000"/>
+          <w:sz w:val="24"/>
+        </w:rPr>
+        <w:t>6.3 Recommendations</w:t>
+        <w:tab/>
+        <w:t>21</w:t>
       </w:r>
     </w:p>
     <w:p>
@@ -1389,7 +2015,32 @@
         </w:rPr>
         <w:t>CHAPTER 7  References</w:t>
         <w:tab/>
-        <w:t>19</w:t>
+        <w:t>22</w:t>
+      </w:r>
+    </w:p>
+    <w:p>
+      <w:pPr>
+        <w:keepNext w:val="0"/>
+        <w:pageBreakBefore w:val="0"/>
+        <w:widowControl/>
+        <w:tabs>
+          <w:tab w:pos="7937" w:val="right" w:leader="dot"/>
+        </w:tabs>
+        <w:spacing w:before="0" w:after="0" w:line="480" w:lineRule="auto"/>
+        <w:ind w:firstLine="0" w:left="0"/>
+        <w:jc w:val="left"/>
+      </w:pPr>
+      <w:r>
+        <w:rPr>
+          <w:rFonts w:ascii="Times New Roman" w:hAnsi="Times New Roman" w:eastAsia="Times New Roman"/>
+          <w:b/>
+          <w:i w:val="0"/>
+          <w:color w:val="000000"/>
+          <w:sz w:val="24"/>
+        </w:rPr>
+        <w:t>Arabic Summary</w:t>
+        <w:tab/>
+        <w:t>24</w:t>
       </w:r>
     </w:p>
     <w:p>
@@ -1430,7 +2081,7 @@
           <w:color w:val="000000"/>
           <w:sz w:val="24"/>
         </w:rPr>
-        <w:t>Table 3.1  Brand, type, matrix, filler and load of the resin composites used in the study</w:t>
+        <w:t>Table 3.1  Brand, type, matrix, filler and load of the resin composites used in the study (protocol listing)</w:t>
       </w:r>
     </w:p>
     <w:p>
@@ -1561,6 +2212,36 @@
           <w:color w:val="000000"/>
           <w:sz w:val="24"/>
         </w:rPr>
+        <w:t>CAD/CAM</w:t>
+      </w:r>
+      <w:r>
+        <w:rPr>
+          <w:rFonts w:ascii="Times New Roman" w:hAnsi="Times New Roman" w:eastAsia="Times New Roman"/>
+          <w:b w:val="0"/>
+          <w:i w:val="0"/>
+          <w:color w:val="000000"/>
+          <w:sz w:val="24"/>
+        </w:rPr>
+        <w:t xml:space="preserve">    Computer-aided design / computer-aided manufacture</w:t>
+      </w:r>
+    </w:p>
+    <w:p>
+      <w:pPr>
+        <w:keepNext w:val="0"/>
+        <w:pageBreakBefore w:val="0"/>
+        <w:widowControl/>
+        <w:spacing w:before="0" w:after="0" w:line="480" w:lineRule="auto"/>
+        <w:ind w:firstLine="0"/>
+        <w:jc w:val="left"/>
+      </w:pPr>
+      <w:r>
+        <w:rPr>
+          <w:rFonts w:ascii="Times New Roman" w:hAnsi="Times New Roman" w:eastAsia="Times New Roman"/>
+          <w:b/>
+          <w:i w:val="0"/>
+          <w:color w:val="000000"/>
+          <w:sz w:val="24"/>
+        </w:rPr>
         <w:t>ISO</w:t>
       </w:r>
       <w:r>
@@ -1572,6 +2253,36 @@
           <w:sz w:val="24"/>
         </w:rPr>
         <w:t xml:space="preserve">    International Organization for Standardization</w:t>
+      </w:r>
+    </w:p>
+    <w:p>
+      <w:pPr>
+        <w:keepNext w:val="0"/>
+        <w:pageBreakBefore w:val="0"/>
+        <w:widowControl/>
+        <w:spacing w:before="0" w:after="0" w:line="480" w:lineRule="auto"/>
+        <w:ind w:firstLine="0"/>
+        <w:jc w:val="left"/>
+      </w:pPr>
+      <w:r>
+        <w:rPr>
+          <w:rFonts w:ascii="Times New Roman" w:hAnsi="Times New Roman" w:eastAsia="Times New Roman"/>
+          <w:b/>
+          <w:i w:val="0"/>
+          <w:color w:val="000000"/>
+          <w:sz w:val="24"/>
+        </w:rPr>
+        <w:t>LED</w:t>
+      </w:r>
+      <w:r>
+        <w:rPr>
+          <w:rFonts w:ascii="Times New Roman" w:hAnsi="Times New Roman" w:eastAsia="Times New Roman"/>
+          <w:b w:val="0"/>
+          <w:i w:val="0"/>
+          <w:color w:val="000000"/>
+          <w:sz w:val="24"/>
+        </w:rPr>
+        <w:t xml:space="preserve">    Light-emitting diode</w:t>
       </w:r>
     </w:p>
     <w:p>
@@ -1621,6 +2332,36 @@
           <w:color w:val="000000"/>
           <w:sz w:val="24"/>
         </w:rPr>
+        <w:t>RDA</w:t>
+      </w:r>
+      <w:r>
+        <w:rPr>
+          <w:rFonts w:ascii="Times New Roman" w:hAnsi="Times New Roman" w:eastAsia="Times New Roman"/>
+          <w:b w:val="0"/>
+          <w:i w:val="0"/>
+          <w:color w:val="000000"/>
+          <w:sz w:val="24"/>
+        </w:rPr>
+        <w:t xml:space="preserve">    Relative dentine abrasivity</w:t>
+      </w:r>
+    </w:p>
+    <w:p>
+      <w:pPr>
+        <w:keepNext w:val="0"/>
+        <w:pageBreakBefore w:val="0"/>
+        <w:widowControl/>
+        <w:spacing w:before="0" w:after="0" w:line="480" w:lineRule="auto"/>
+        <w:ind w:firstLine="0"/>
+        <w:jc w:val="left"/>
+      </w:pPr>
+      <w:r>
+        <w:rPr>
+          <w:rFonts w:ascii="Times New Roman" w:hAnsi="Times New Roman" w:eastAsia="Times New Roman"/>
+          <w:b/>
+          <w:i w:val="0"/>
+          <w:color w:val="000000"/>
+          <w:sz w:val="24"/>
+        </w:rPr>
         <w:t>SD</w:t>
       </w:r>
       <w:r>
@@ -1786,7 +2527,7 @@
           <w:color w:val="000000"/>
           <w:sz w:val="24"/>
         </w:rPr>
-        <w:t>Highly filled injectable resins were made so that a syringeable paste could be used in cavities that used to be reserved for packable composites. Filler load is raised, particle size is reduced, and silane treatment is improved until the paste still flows but no longer behaves like a classical low-filled flowable (5,6). G-ænial Universal Injectable (GC Corporation, Tokyo, Japan) and Beautifil Flow Plus X F00 (Shofu Inc., Kyoto, Japan) are sold on that claim. Beautifil II LS (Shofu Inc.) is a sculptable low-shrinkage nanohybrid giomer and is the conventional control in this work.</w:t>
+        <w:t>On free surfaces of anterior restorations that wear is largely three-body. The brush and the paste sit between the bristle and the resin. Two-body contact wear is a different problem. It needs an antagonist and a much higher load. The two tests answer different questions (3,6,10).</w:t>
       </w:r>
     </w:p>
     <w:p>
@@ -1806,7 +2547,27 @@
           <w:color w:val="000000"/>
           <w:sz w:val="24"/>
         </w:rPr>
-        <w:t>Independent data on these three products, tested together, under three-body toothbrush abrasion, are thin. Two-body chewing-simulator studies are not a substitute. They load a steatite antagonist at about 49 N. They measure volume, not toothbrush slurry (6). The present test is the other wear mode: ISO toothbrushing guidance, 2 N, 10 000 strokes, taken as about one year of twice-daily brushing (3,7,8).</w:t>
+        <w:t>Highly filled injectable resins were made so that a syringeable paste could be used in cavities that used to be reserved for packable composites. Filler load is raised, particle size is reduced, and silane treatment is improved until the paste still flows but no longer behaves like a classical low-filled flowable (5,6). G-ænial Universal Injectable (GC Corporation, Tokyo, Japan) and Beautifil Flow Plus X F00 (Shofu Inc., Kyoto, Japan) are sold on that claim. Beautifil II LS (Shofu Inc.) is a sculptable low-shrinkage nanohybrid giomer and is the conventional control in this work. All three were used in shade A2.</w:t>
+      </w:r>
+    </w:p>
+    <w:p>
+      <w:pPr>
+        <w:keepNext w:val="0"/>
+        <w:pageBreakBefore w:val="0"/>
+        <w:widowControl/>
+        <w:spacing w:before="0" w:after="0" w:line="480" w:lineRule="auto"/>
+        <w:ind w:firstLine="720"/>
+        <w:jc w:val="both"/>
+      </w:pPr>
+      <w:r>
+        <w:rPr>
+          <w:rFonts w:ascii="Times New Roman" w:hAnsi="Times New Roman" w:eastAsia="Times New Roman"/>
+          <w:b w:val="0"/>
+          <w:i w:val="0"/>
+          <w:color w:val="000000"/>
+          <w:sz w:val="24"/>
+        </w:rPr>
+        <w:t>Independent data on these three products, tested together, under three-body toothbrush abrasion, are thin. Two-body chewing-simulator studies are not a substitute. They load a steatite antagonist at about 49 N. They measure volume, not toothbrush slurry (6). Some highly filled flowables have been reported as weaker than a paste; others have not (6,20). The present test is the other wear mode: ISO toothbrushing guidance, 2 N, 10 000 strokes, taken as about one year of twice-daily brushing (3,7,8).</w:t>
       </w:r>
     </w:p>
     <w:p>
@@ -2499,7 +3260,7 @@
           <w:color w:val="000000"/>
           <w:sz w:val="24"/>
         </w:rPr>
-        <w:t>3.1 Study Design and Sample</w:t>
+        <w:t>3.1 Study Design and Setting</w:t>
       </w:r>
     </w:p>
     <w:p>
@@ -2519,7 +3280,7 @@
           <w:color w:val="000000"/>
           <w:sz w:val="24"/>
         </w:rPr>
-        <w:t>The study was an in-vitro comparison of three resin composites. Thirty-six discs were prepared, 10 mm in diameter and 1 mm thick, in a CAD/CAM Teflon mould. The discs were allocated at random to three groups of twelve. A first G*Power estimate had given ten discs a group. Twelve were used to raise power.</w:t>
+        <w:t>The study was an in-vitro comparison of three resin composites. Disc preparation was done in the laboratory of the Faculty of Dentistry, Pharos University in Alexandria. The toothbrushing run and the measurements were done in the Conservative Dentistry laboratory of the Faculty of Dentistry, Alexandria University.</w:t>
       </w:r>
     </w:p>
     <w:p>
@@ -2540,7 +3301,68 @@
           <w:color w:val="000000"/>
           <w:sz w:val="24"/>
         </w:rPr>
-        <w:t>3.2 Materials</w:t>
+        <w:t>3.2 Sample Size</w:t>
+      </w:r>
+    </w:p>
+    <w:p>
+      <w:pPr>
+        <w:keepNext w:val="0"/>
+        <w:pageBreakBefore w:val="0"/>
+        <w:widowControl/>
+        <w:spacing w:before="0" w:after="0" w:line="480" w:lineRule="auto"/>
+        <w:ind w:firstLine="720"/>
+        <w:jc w:val="both"/>
+      </w:pPr>
+      <w:r>
+        <w:rPr>
+          <w:rFonts w:ascii="Times New Roman" w:hAnsi="Times New Roman" w:eastAsia="Times New Roman"/>
+          <w:b w:val="0"/>
+          <w:i w:val="0"/>
+          <w:color w:val="000000"/>
+          <w:sz w:val="24"/>
+        </w:rPr>
+        <w:t>Thirty-six discs were prepared, 10 mm in diameter and 1 mm thick. The discs were allocated at random to three groups of twelve.</w:t>
+      </w:r>
+    </w:p>
+    <w:p>
+      <w:pPr>
+        <w:keepNext w:val="0"/>
+        <w:pageBreakBefore w:val="0"/>
+        <w:widowControl/>
+        <w:spacing w:before="0" w:after="0" w:line="480" w:lineRule="auto"/>
+        <w:ind w:firstLine="720"/>
+        <w:jc w:val="both"/>
+      </w:pPr>
+      <w:r>
+        <w:rPr>
+          <w:rFonts w:ascii="Times New Roman" w:hAnsi="Times New Roman" w:eastAsia="Times New Roman"/>
+          <w:b w:val="0"/>
+          <w:i w:val="0"/>
+          <w:color w:val="000000"/>
+          <w:sz w:val="24"/>
+        </w:rPr>
+        <w:t>The first sample-size estimate used G*Power version 3.1.9.2. It was based on a two-body wear comparison of highly filled injectables with a conventional paste (6). With 80 % power and α = 0.05 the calculation gave ten discs a group (thirty in all). Twelve were used. Lost or damaged discs were to be replaced so that each group stayed at twelve. None had to be replaced.</w:t>
+      </w:r>
+    </w:p>
+    <w:p>
+      <w:pPr>
+        <w:pStyle w:val="Heading2"/>
+        <w:keepNext/>
+        <w:pageBreakBefore w:val="0"/>
+        <w:widowControl/>
+        <w:spacing w:before="360" w:after="120" w:line="480" w:lineRule="auto"/>
+        <w:ind w:firstLine="0"/>
+        <w:jc w:val="left"/>
+      </w:pPr>
+      <w:r>
+        <w:rPr>
+          <w:rFonts w:ascii="Times New Roman" w:hAnsi="Times New Roman" w:eastAsia="Times New Roman"/>
+          <w:b/>
+          <w:i w:val="0"/>
+          <w:color w:val="000000"/>
+          <w:sz w:val="24"/>
+        </w:rPr>
+        <w:t>3.3 Materials</w:t>
       </w:r>
     </w:p>
     <w:p>
@@ -2580,7 +3402,7 @@
           <w:color w:val="000000"/>
           <w:sz w:val="24"/>
         </w:rPr>
-        <w:t>1. G-ænial Universal Injectable, a highly filled injectable composite (GC Corporation, Tokyo, Japan).</w:t>
+        <w:t>1. G-ænial Universal Injectable, shade A2, a highly filled injectable composite (GC Corporation, Tokyo, Japan).</w:t>
       </w:r>
     </w:p>
     <w:p>
@@ -2600,7 +3422,7 @@
           <w:color w:val="000000"/>
           <w:sz w:val="24"/>
         </w:rPr>
-        <w:t>2. Beautifil Flow Plus X F00, a highly filled injectable giomer (Shofu Inc., Kyoto, Japan).</w:t>
+        <w:t>2. Beautifil Flow Plus X F00, shade A2, a highly filled injectable giomer, zero-flow (Shofu Inc., Kyoto, Japan).</w:t>
       </w:r>
     </w:p>
     <w:p>
@@ -2620,7 +3442,7 @@
           <w:color w:val="000000"/>
           <w:sz w:val="24"/>
         </w:rPr>
-        <w:t>3. Beautifil II LS, a conventional nanohybrid giomer (Shofu Inc., Kyoto, Japan).</w:t>
+        <w:t>3. Beautifil II LS, shade A2, a conventional nanohybrid giomer (Shofu Inc., Kyoto, Japan).</w:t>
       </w:r>
     </w:p>
     <w:p>
@@ -2640,7 +3462,7 @@
           <w:color w:val="000000"/>
           <w:sz w:val="24"/>
         </w:rPr>
-        <w:t>4. Colgate Total toothpaste.</w:t>
+        <w:t>4. Colgate Total toothpaste (relative dentine abrasivity 70).</w:t>
       </w:r>
     </w:p>
     <w:p>
@@ -2680,7 +3502,87 @@
           <w:color w:val="000000"/>
           <w:sz w:val="24"/>
         </w:rPr>
-        <w:t>The composition of the three resin composites is summarised in Table 3.1.</w:t>
+        <w:t>The approved grouping was:</w:t>
+      </w:r>
+    </w:p>
+    <w:p>
+      <w:pPr>
+        <w:keepNext w:val="0"/>
+        <w:pageBreakBefore w:val="0"/>
+        <w:widowControl/>
+        <w:spacing w:before="0" w:after="0" w:line="480" w:lineRule="auto"/>
+        <w:ind w:firstLine="720"/>
+        <w:jc w:val="both"/>
+      </w:pPr>
+      <w:r>
+        <w:rPr>
+          <w:rFonts w:ascii="Times New Roman" w:hAnsi="Times New Roman" w:eastAsia="Times New Roman"/>
+          <w:b w:val="0"/>
+          <w:i w:val="0"/>
+          <w:color w:val="000000"/>
+          <w:sz w:val="24"/>
+        </w:rPr>
+        <w:t>Group I. G-ænial Universal Injectable.</w:t>
+      </w:r>
+    </w:p>
+    <w:p>
+      <w:pPr>
+        <w:keepNext w:val="0"/>
+        <w:pageBreakBefore w:val="0"/>
+        <w:widowControl/>
+        <w:spacing w:before="0" w:after="0" w:line="480" w:lineRule="auto"/>
+        <w:ind w:firstLine="720"/>
+        <w:jc w:val="both"/>
+      </w:pPr>
+      <w:r>
+        <w:rPr>
+          <w:rFonts w:ascii="Times New Roman" w:hAnsi="Times New Roman" w:eastAsia="Times New Roman"/>
+          <w:b w:val="0"/>
+          <w:i w:val="0"/>
+          <w:color w:val="000000"/>
+          <w:sz w:val="24"/>
+        </w:rPr>
+        <w:t>Group II. Beautifil Flow Plus X F00.</w:t>
+      </w:r>
+    </w:p>
+    <w:p>
+      <w:pPr>
+        <w:keepNext w:val="0"/>
+        <w:pageBreakBefore w:val="0"/>
+        <w:widowControl/>
+        <w:spacing w:before="0" w:after="0" w:line="480" w:lineRule="auto"/>
+        <w:ind w:firstLine="720"/>
+        <w:jc w:val="both"/>
+      </w:pPr>
+      <w:r>
+        <w:rPr>
+          <w:rFonts w:ascii="Times New Roman" w:hAnsi="Times New Roman" w:eastAsia="Times New Roman"/>
+          <w:b w:val="0"/>
+          <w:i w:val="0"/>
+          <w:color w:val="000000"/>
+          <w:sz w:val="24"/>
+        </w:rPr>
+        <w:t>Group III. Beautifil II LS.</w:t>
+      </w:r>
+    </w:p>
+    <w:p>
+      <w:pPr>
+        <w:keepNext w:val="0"/>
+        <w:pageBreakBefore w:val="0"/>
+        <w:widowControl/>
+        <w:spacing w:before="0" w:after="0" w:line="480" w:lineRule="auto"/>
+        <w:ind w:firstLine="720"/>
+        <w:jc w:val="both"/>
+      </w:pPr>
+      <w:r>
+        <w:rPr>
+          <w:rFonts w:ascii="Times New Roman" w:hAnsi="Times New Roman" w:eastAsia="Times New Roman"/>
+          <w:b w:val="0"/>
+          <w:i w:val="0"/>
+          <w:color w:val="000000"/>
+          <w:sz w:val="24"/>
+        </w:rPr>
+        <w:t>The composition of the three resin composites, as listed in the approved protocol, is given in Table 3.1.</w:t>
       </w:r>
     </w:p>
     <w:p>
@@ -2889,7 +3791,7 @@
                 <w:color w:val="000000"/>
                 <w:sz w:val="18"/>
               </w:rPr>
-              <w:t>G-ænial Universal Injectable</w:t>
+              <w:t>G-ænial Universal Injectable (A2)</w:t>
             </w:r>
           </w:p>
         </w:tc>
@@ -2953,7 +3855,7 @@
                 <w:color w:val="000000"/>
                 <w:sz w:val="18"/>
               </w:rPr>
-              <w:t>UDMA, Bis-MEPP, TEGDMA; ultrafine barium glass and silica (~150 nm)</w:t>
+              <w:t>Dimethacrylate monomers; barium glass and silica</w:t>
             </w:r>
           </w:p>
         </w:tc>
@@ -2985,7 +3887,7 @@
                 <w:color w:val="000000"/>
                 <w:sz w:val="18"/>
               </w:rPr>
-              <w:t>69 wt% / 50 vol%</w:t>
+              <w:t>50 vol%</w:t>
             </w:r>
           </w:p>
         </w:tc>
@@ -3019,7 +3921,7 @@
                 <w:color w:val="000000"/>
                 <w:sz w:val="18"/>
               </w:rPr>
-              <w:t>Beautifil Flow Plus X F00</w:t>
+              <w:t>Beautifil Flow Plus X F00 (A2)</w:t>
             </w:r>
           </w:p>
         </w:tc>
@@ -3051,7 +3953,7 @@
                 <w:color w:val="000000"/>
                 <w:sz w:val="18"/>
               </w:rPr>
-              <w:t>Giomer injectable, zero flow</w:t>
+              <w:t>Giomer injectable, F00</w:t>
             </w:r>
           </w:p>
         </w:tc>
@@ -3083,7 +3985,7 @@
                 <w:color w:val="000000"/>
                 <w:sz w:val="18"/>
               </w:rPr>
-              <w:t>Dimethacrylate resin; nano S-PRG filler</w:t>
+              <w:t>Bis-GMA, TEGDMA; multifunctional glass and S-PRG</w:t>
             </w:r>
           </w:p>
         </w:tc>
@@ -3115,7 +4017,7 @@
                 <w:color w:val="000000"/>
                 <w:sz w:val="18"/>
               </w:rPr>
-              <w:t>Highly filled injectable</w:t>
+              <w:t>47 vol%</w:t>
             </w:r>
           </w:p>
         </w:tc>
@@ -3149,7 +4051,7 @@
                 <w:color w:val="000000"/>
                 <w:sz w:val="18"/>
               </w:rPr>
-              <w:t>Beautifil II LS</w:t>
+              <w:t>Beautifil II LS (A2)</w:t>
             </w:r>
           </w:p>
         </w:tc>
@@ -3213,7 +4115,7 @@
                 <w:color w:val="000000"/>
                 <w:sz w:val="18"/>
               </w:rPr>
-              <w:t>SRS monomer; S-PRG and pre-polymerised fillers</w:t>
+              <w:t>Bis-GMA, UDMA, Bis-EMA, PEGMA, TEGDMA; multifunctional glass and S-PRG</w:t>
             </w:r>
           </w:p>
         </w:tc>
@@ -3245,7 +4147,7 @@
                 <w:color w:val="000000"/>
                 <w:sz w:val="18"/>
               </w:rPr>
-              <w:t>83 wt%</w:t>
+              <w:t>68 vol%</w:t>
             </w:r>
           </w:p>
         </w:tc>
@@ -3278,7 +4180,7 @@
           <w:color w:val="000000"/>
           <w:sz w:val="20"/>
         </w:rPr>
-        <w:t>Manufacturers: GC Corporation, Tokyo, Japan; Shofu Inc., Kyoto, Japan.</w:t>
+        <w:t>Manufacturers: GC Corporation, Tokyo, Japan; Shofu Inc., Kyoto, Japan. Filler loads are those recorded in the approved protocol (volume percent).</w:t>
       </w:r>
     </w:p>
     <w:p>
@@ -3299,7 +4201,7 @@
           <w:color w:val="000000"/>
           <w:sz w:val="24"/>
         </w:rPr>
-        <w:t>3.3 Specimen Preparation</w:t>
+        <w:t>3.4 Equipment</w:t>
       </w:r>
     </w:p>
     <w:p>
@@ -3308,7 +4210,7 @@
         <w:pageBreakBefore w:val="0"/>
         <w:widowControl/>
         <w:spacing w:before="0" w:after="0" w:line="480" w:lineRule="auto"/>
-        <w:ind w:firstLine="720"/>
+        <w:ind w:firstLine="0"/>
         <w:jc w:val="both"/>
       </w:pPr>
       <w:r>
@@ -3319,7 +4221,107 @@
           <w:color w:val="000000"/>
           <w:sz w:val="24"/>
         </w:rPr>
-        <w:t>Each material was placed in the Teflon mould. A matrix strip and a glass plate were used to exclude air from the surface and to keep the disc flat. Polymerisation followed the manufacturer’s instructions for that product. Flash was removed. The discs were identified by group and stored in distilled water until testing.</w:t>
+        <w:t>1. Custom-made toothbrushing simulator, Dental Biomaterial Department, Faculty of Dentistry, Alexandria University.</w:t>
+      </w:r>
+    </w:p>
+    <w:p>
+      <w:pPr>
+        <w:keepNext w:val="0"/>
+        <w:pageBreakBefore w:val="0"/>
+        <w:widowControl/>
+        <w:spacing w:before="0" w:after="0" w:line="480" w:lineRule="auto"/>
+        <w:ind w:firstLine="0"/>
+        <w:jc w:val="both"/>
+      </w:pPr>
+      <w:r>
+        <w:rPr>
+          <w:rFonts w:ascii="Times New Roman" w:hAnsi="Times New Roman" w:eastAsia="Times New Roman"/>
+          <w:b w:val="0"/>
+          <w:i w:val="0"/>
+          <w:color w:val="000000"/>
+          <w:sz w:val="24"/>
+        </w:rPr>
+        <w:t>2. Blender computer-aided design software (Blender Institute B.V., Amsterdam, the Netherlands), used to mill the Teflon mould.</w:t>
+      </w:r>
+    </w:p>
+    <w:p>
+      <w:pPr>
+        <w:keepNext w:val="0"/>
+        <w:pageBreakBefore w:val="0"/>
+        <w:widowControl/>
+        <w:spacing w:before="0" w:after="0" w:line="480" w:lineRule="auto"/>
+        <w:ind w:firstLine="0"/>
+        <w:jc w:val="both"/>
+      </w:pPr>
+      <w:r>
+        <w:rPr>
+          <w:rFonts w:ascii="Times New Roman" w:hAnsi="Times New Roman" w:eastAsia="Times New Roman"/>
+          <w:b w:val="0"/>
+          <w:i w:val="0"/>
+          <w:color w:val="000000"/>
+          <w:sz w:val="24"/>
+        </w:rPr>
+        <w:t>3. MarSurf PS10 contact profilometer (Mahr GmbH, Göttingen, Germany).</w:t>
+      </w:r>
+    </w:p>
+    <w:p>
+      <w:pPr>
+        <w:keepNext w:val="0"/>
+        <w:pageBreakBefore w:val="0"/>
+        <w:widowControl/>
+        <w:spacing w:before="0" w:after="0" w:line="480" w:lineRule="auto"/>
+        <w:ind w:firstLine="0"/>
+        <w:jc w:val="both"/>
+      </w:pPr>
+      <w:r>
+        <w:rPr>
+          <w:rFonts w:ascii="Times New Roman" w:hAnsi="Times New Roman" w:eastAsia="Times New Roman"/>
+          <w:b w:val="0"/>
+          <w:i w:val="0"/>
+          <w:color w:val="000000"/>
+          <w:sz w:val="24"/>
+        </w:rPr>
+        <w:t>4. RADWAG AS 220-R2 analytical balance (RADWAG Wagi Elektroniczne, Warsaw, Poland).</w:t>
+      </w:r>
+    </w:p>
+    <w:p>
+      <w:pPr>
+        <w:keepNext w:val="0"/>
+        <w:pageBreakBefore w:val="0"/>
+        <w:widowControl/>
+        <w:spacing w:before="0" w:after="0" w:line="480" w:lineRule="auto"/>
+        <w:ind w:firstLine="0"/>
+        <w:jc w:val="both"/>
+      </w:pPr>
+      <w:r>
+        <w:rPr>
+          <w:rFonts w:ascii="Times New Roman" w:hAnsi="Times New Roman" w:eastAsia="Times New Roman"/>
+          <w:b w:val="0"/>
+          <w:i w:val="0"/>
+          <w:color w:val="000000"/>
+          <w:sz w:val="24"/>
+        </w:rPr>
+        <w:t>5. LED curing light, MiniS (Woodpecker, Guilin, China), 800 mW/cm².</w:t>
+      </w:r>
+    </w:p>
+    <w:p>
+      <w:pPr>
+        <w:keepNext w:val="0"/>
+        <w:pageBreakBefore w:val="0"/>
+        <w:widowControl/>
+        <w:spacing w:before="0" w:after="0" w:line="480" w:lineRule="auto"/>
+        <w:ind w:firstLine="0"/>
+        <w:jc w:val="both"/>
+      </w:pPr>
+      <w:r>
+        <w:rPr>
+          <w:rFonts w:ascii="Times New Roman" w:hAnsi="Times New Roman" w:eastAsia="Times New Roman"/>
+          <w:b w:val="0"/>
+          <w:i w:val="0"/>
+          <w:color w:val="000000"/>
+          <w:sz w:val="24"/>
+        </w:rPr>
+        <w:t>6. Digital caliper.</w:t>
       </w:r>
     </w:p>
     <w:p>
@@ -3340,7 +4342,7 @@
           <w:color w:val="000000"/>
           <w:sz w:val="24"/>
         </w:rPr>
-        <w:t>3.4 Baseline Measurements</w:t>
+        <w:t>3.5 Specimen Preparation</w:t>
       </w:r>
     </w:p>
     <w:p>
@@ -3360,7 +4362,27 @@
           <w:color w:val="000000"/>
           <w:sz w:val="24"/>
         </w:rPr>
-        <w:t>Each disc was dried and weighed on an analytical balance. The recorded masses run to 0.0001 g; the balance therefore read to 0.1 mg. Ra was measured with a contact profilometer on the test face. The value used for analysis was the mean of the traces taken on that disc.</w:t>
+        <w:t>Thirty-six discs were packed, one increment each, in a CAD/CAM-milled Teflon mould, 10 mm in diameter and 1 mm deep. A Mylar strip and a transparent microscope slide were placed over the paste so that the face was flat and free of air. The light tip was held against the slide. Each disc was cured for 20 s at 800 mW/cm². Three further 20 s exposures were given from different directions so that the disc was polymerised through its thickness. Flash was trimmed with a no. 12 scalpel blade (Suzhou Kyuan Medical Co., Jiangsu, China).</w:t>
+      </w:r>
+    </w:p>
+    <w:p>
+      <w:pPr>
+        <w:keepNext w:val="0"/>
+        <w:pageBreakBefore w:val="0"/>
+        <w:widowControl/>
+        <w:spacing w:before="0" w:after="0" w:line="480" w:lineRule="auto"/>
+        <w:ind w:firstLine="720"/>
+        <w:jc w:val="both"/>
+      </w:pPr>
+      <w:r>
+        <w:rPr>
+          <w:rFonts w:ascii="Times New Roman" w:hAnsi="Times New Roman" w:eastAsia="Times New Roman"/>
+          <w:b w:val="0"/>
+          <w:i w:val="0"/>
+          <w:color w:val="000000"/>
+          <w:sz w:val="24"/>
+        </w:rPr>
+        <w:t>After removal from the mould the diameter of each disc was checked with the digital caliper. The discs were stored in distilled water in a closed glass container at 37 °C for 24 h. Before each weighing or roughness run a disc was taken out and dried with a sterile disposable sponge.</w:t>
       </w:r>
     </w:p>
     <w:p>
@@ -3381,7 +4403,7 @@
           <w:color w:val="000000"/>
           <w:sz w:val="24"/>
         </w:rPr>
-        <w:t>3.5 Toothbrushing Protocol</w:t>
+        <w:t>3.6 Baseline Measurements</w:t>
       </w:r>
     </w:p>
     <w:p>
@@ -3401,7 +4423,27 @@
           <w:color w:val="000000"/>
           <w:sz w:val="24"/>
         </w:rPr>
-        <w:t>Discs were mounted in a toothbrushing simulator. A slurry of Colgate Total and water was prepared after ISO 11609 and ISO/TR 14569-1 (3,14). The brush load was 2 N, inside the ISO range of 0.5–2.5 N (3). Each disc received 10 000 cycles. That count is the conventional laboratory equivalent of one year of twice-daily brushing (7,8). Fresh slurry was used as required to keep the abrasive present. After the run the discs were rinsed free of paste.</w:t>
+        <w:t>Each dried disc was weighed on the RADWAG AS 220-R2. The recorded masses run to 0.0001 g; the balance therefore read to 0.1 mg.</w:t>
+      </w:r>
+    </w:p>
+    <w:p>
+      <w:pPr>
+        <w:keepNext w:val="0"/>
+        <w:pageBreakBefore w:val="0"/>
+        <w:widowControl/>
+        <w:spacing w:before="0" w:after="0" w:line="480" w:lineRule="auto"/>
+        <w:ind w:firstLine="720"/>
+        <w:jc w:val="both"/>
+      </w:pPr>
+      <w:r>
+        <w:rPr>
+          <w:rFonts w:ascii="Times New Roman" w:hAnsi="Times New Roman" w:eastAsia="Times New Roman"/>
+          <w:b w:val="0"/>
+          <w:i w:val="0"/>
+          <w:color w:val="000000"/>
+          <w:sz w:val="24"/>
+        </w:rPr>
+        <w:t>Ra was measured on the test face with the MarSurf PS10. Five traces were taken at different sites on each disc. The value used for analysis was the mean of those five traces.</w:t>
       </w:r>
     </w:p>
     <w:p>
@@ -3422,7 +4464,7 @@
           <w:color w:val="000000"/>
           <w:sz w:val="24"/>
         </w:rPr>
-        <w:t>3.6 Post-test Evaluation</w:t>
+        <w:t>3.7 Toothbrushing Protocol</w:t>
       </w:r>
     </w:p>
     <w:p>
@@ -3442,7 +4484,48 @@
           <w:color w:val="000000"/>
           <w:sz w:val="24"/>
         </w:rPr>
-        <w:t>Mass and Ra were recorded again with the same instruments and the same drying habit as at baseline.</w:t>
+        <w:t>Discs were mounted in the custom brushing machine. The vertical load was 2.0 N, inside the ISO range of 0.5–2.5 N (3). The slurry was 250 g of Colgate Total in 1 L of distilled water, after ISO/TR 14569-1 and ISO 11609 (3,14). Relative dentine abrasivity of that paste is 70. The slurry was replaced every 5 000 cycles. Each disc received 10 000 cycles. That count is the conventional laboratory equivalent of one year of twice-daily brushing (7,8). After the run each disc was washed with a stream of tap water and dried with a disposable sponge.</w:t>
+      </w:r>
+    </w:p>
+    <w:p>
+      <w:pPr>
+        <w:pStyle w:val="Heading2"/>
+        <w:keepNext/>
+        <w:pageBreakBefore w:val="0"/>
+        <w:widowControl/>
+        <w:spacing w:before="360" w:after="120" w:line="480" w:lineRule="auto"/>
+        <w:ind w:firstLine="0"/>
+        <w:jc w:val="left"/>
+      </w:pPr>
+      <w:r>
+        <w:rPr>
+          <w:rFonts w:ascii="Times New Roman" w:hAnsi="Times New Roman" w:eastAsia="Times New Roman"/>
+          <w:b/>
+          <w:i w:val="0"/>
+          <w:color w:val="000000"/>
+          <w:sz w:val="24"/>
+        </w:rPr>
+        <w:t>3.8 Post-test Evaluation</w:t>
+      </w:r>
+    </w:p>
+    <w:p>
+      <w:pPr>
+        <w:keepNext w:val="0"/>
+        <w:pageBreakBefore w:val="0"/>
+        <w:widowControl/>
+        <w:spacing w:before="0" w:after="0" w:line="480" w:lineRule="auto"/>
+        <w:ind w:firstLine="720"/>
+        <w:jc w:val="both"/>
+      </w:pPr>
+      <w:r>
+        <w:rPr>
+          <w:rFonts w:ascii="Times New Roman" w:hAnsi="Times New Roman" w:eastAsia="Times New Roman"/>
+          <w:b w:val="0"/>
+          <w:i w:val="0"/>
+          <w:color w:val="000000"/>
+          <w:sz w:val="24"/>
+        </w:rPr>
+        <w:t>Mass and Ra were recorded again with the same instruments, the same drying habit and, for Ra, five traces a disc.</w:t>
       </w:r>
     </w:p>
     <w:p>
@@ -3563,7 +4646,7 @@
           <w:color w:val="000000"/>
           <w:sz w:val="24"/>
         </w:rPr>
-        <w:t>3.7 Statistical Analysis</w:t>
+        <w:t>3.9 Statistical Analysis</w:t>
       </w:r>
     </w:p>
     <w:p>
@@ -3588,6 +4671,47 @@
     </w:p>
     <w:p>
       <w:pPr>
+        <w:pStyle w:val="Heading2"/>
+        <w:keepNext/>
+        <w:pageBreakBefore w:val="0"/>
+        <w:widowControl/>
+        <w:spacing w:before="360" w:after="120" w:line="480" w:lineRule="auto"/>
+        <w:ind w:firstLine="0"/>
+        <w:jc w:val="left"/>
+      </w:pPr>
+      <w:r>
+        <w:rPr>
+          <w:rFonts w:ascii="Times New Roman" w:hAnsi="Times New Roman" w:eastAsia="Times New Roman"/>
+          <w:b/>
+          <w:i w:val="0"/>
+          <w:color w:val="000000"/>
+          <w:sz w:val="24"/>
+        </w:rPr>
+        <w:t>3.10 Ethical Considerations</w:t>
+      </w:r>
+    </w:p>
+    <w:p>
+      <w:pPr>
+        <w:keepNext w:val="0"/>
+        <w:pageBreakBefore w:val="0"/>
+        <w:widowControl/>
+        <w:spacing w:before="0" w:after="0" w:line="480" w:lineRule="auto"/>
+        <w:ind w:firstLine="720"/>
+        <w:jc w:val="both"/>
+      </w:pPr>
+      <w:r>
+        <w:rPr>
+          <w:rFonts w:ascii="Times New Roman" w:hAnsi="Times New Roman" w:eastAsia="Times New Roman"/>
+          <w:b w:val="0"/>
+          <w:i w:val="0"/>
+          <w:color w:val="000000"/>
+          <w:sz w:val="24"/>
+        </w:rPr>
+        <w:t>The work used commercial restorative pastes and laboratory discs. No patient, extracted tooth or identifiable human tissue was used. Ethical approval for human subjects was not required.</w:t>
+      </w:r>
+    </w:p>
+    <w:p>
+      <w:pPr>
         <w:pStyle w:val="Heading1"/>
         <w:keepNext/>
         <w:pageBreakBefore/>
@@ -3645,7 +4769,27 @@
           <w:color w:val="000000"/>
           <w:sz w:val="24"/>
         </w:rPr>
-        <w:t>Thirty-six discs were tested, twelve in each group. All discs completed 10 000 cycles at 2 N. Wear is reported as mass. Roughness is reported as Ra.</w:t>
+        <w:t>Thirty-six discs were tested, twelve in each group. All discs completed 10 000 cycles at 2 N. None was lost in processing. Wear is reported as mass, as percentage of the baseline mass and as milligrams shed. Roughness is reported as Ra, as the mean of five traces a disc, before and after the same abrasion.</w:t>
+      </w:r>
+    </w:p>
+    <w:p>
+      <w:pPr>
+        <w:keepNext w:val="0"/>
+        <w:pageBreakBefore w:val="0"/>
+        <w:widowControl/>
+        <w:spacing w:before="0" w:after="0" w:line="480" w:lineRule="auto"/>
+        <w:ind w:firstLine="720"/>
+        <w:jc w:val="both"/>
+      </w:pPr>
+      <w:r>
+        <w:rPr>
+          <w:rFonts w:ascii="Times New Roman" w:hAnsi="Times New Roman" w:eastAsia="Times New Roman"/>
+          <w:b w:val="0"/>
+          <w:i w:val="0"/>
+          <w:color w:val="000000"/>
+          <w:sz w:val="24"/>
+        </w:rPr>
+        <w:t>The three pastes did not start at the same mass or at the same Ra. Those baseline differences are part of the result. They are not adjusted away.</w:t>
       </w:r>
     </w:p>
     <w:p>
@@ -3667,26 +4811,6 @@
           <w:sz w:val="24"/>
         </w:rPr>
         <w:t>4.1 Weight Loss</w:t>
-      </w:r>
-    </w:p>
-    <w:p>
-      <w:pPr>
-        <w:keepNext w:val="0"/>
-        <w:pageBreakBefore w:val="0"/>
-        <w:widowControl/>
-        <w:spacing w:before="0" w:after="0" w:line="480" w:lineRule="auto"/>
-        <w:ind w:firstLine="720"/>
-        <w:jc w:val="both"/>
-      </w:pPr>
-      <w:r>
-        <w:rPr>
-          <w:rFonts w:ascii="Times New Roman" w:hAnsi="Times New Roman" w:eastAsia="Times New Roman"/>
-          <w:b w:val="0"/>
-          <w:i w:val="0"/>
-          <w:color w:val="000000"/>
-          <w:sz w:val="24"/>
-        </w:rPr>
-        <w:t>Mean mass before and after brushing, and percentage loss, are given in Table 4.1.</w:t>
       </w:r>
     </w:p>
     <w:p>
@@ -4432,7 +5556,7 @@
           <w:color w:val="000000"/>
           <w:sz w:val="24"/>
         </w:rPr>
-        <w:t>Beautifil II LS discs were heavier at baseline (0.2313 ± 0.0154 g) than the two injectables (0.1602 ± 0.0074 g and 0.1630 ± 0.0102 g). That follows from filler load and density, not from a difference in disc size.</w:t>
+        <w:t>Beautifil II LS discs were heavier at baseline (0.2313 ± 0.0154 g) than the two injectables (0.1602 ± 0.0074 g and 0.1630 ± 0.0102 g). The mould was the same. The difference is filler load and density. Beautifil II LS is listed at 68 vol%. The injectables are listed at 47 vol% and 50 vol%. A heavier disc of the same diameter and thickness is the expected finding, not a fault in allocation.</w:t>
       </w:r>
     </w:p>
     <w:p>
@@ -4472,7 +5596,27 @@
           <w:color w:val="000000"/>
           <w:sz w:val="24"/>
         </w:rPr>
-        <w:t>Absolute loss is given in Table 4.3, after the roughness data, because percentage loss on a lighter disc can exaggerate a small mass change.</w:t>
+        <w:t>A non-significant p-value does not make the three means equal. It says that, with twelve discs a group and with the variance that was observed, the test could not separate them. Most of that variance sits in one group.</w:t>
+      </w:r>
+    </w:p>
+    <w:p>
+      <w:pPr>
+        <w:keepNext w:val="0"/>
+        <w:pageBreakBefore w:val="0"/>
+        <w:widowControl/>
+        <w:spacing w:before="0" w:after="0" w:line="480" w:lineRule="auto"/>
+        <w:ind w:firstLine="720"/>
+        <w:jc w:val="both"/>
+      </w:pPr>
+      <w:r>
+        <w:rPr>
+          <w:rFonts w:ascii="Times New Roman" w:hAnsi="Times New Roman" w:eastAsia="Times New Roman"/>
+          <w:b w:val="0"/>
+          <w:i w:val="0"/>
+          <w:color w:val="000000"/>
+          <w:sz w:val="24"/>
+        </w:rPr>
+        <w:t>Absolute loss is given in Table 4.3, after the roughness data, because percentage loss on a lighter disc can exaggerate a small mass change. The two numbers should be read together.</w:t>
       </w:r>
     </w:p>
     <w:p>
@@ -5259,7 +6403,7 @@
           <w:color w:val="000000"/>
           <w:sz w:val="24"/>
         </w:rPr>
-        <w:t>At baseline Beautifil II LS was already the roughest (0.119 ± 0.054 µm). Beautifil Flow Plus X F00 was the smoothest (0.038 ± 0.011 µm). G-ænial Universal Injectable lay between them (0.054 ± 0.010 µm).</w:t>
+        <w:t>At baseline Beautifil II LS was already the roughest (0.119 ± 0.054 µm). Beautifil Flow Plus X F00 was the smoothest (0.038 ± 0.011 µm). G-ænial Universal Injectable lay between them (0.054 ± 0.010 µm). The finishing step was the same for every disc: a Mylar strip under a glass slide and a scalpel for flash. No further polish sequence was used. The baseline gap is therefore a material difference on an as-cured, strip-finished face, not a difference in grit.</w:t>
       </w:r>
     </w:p>
     <w:p>
@@ -5279,7 +6423,7 @@
           <w:color w:val="000000"/>
           <w:sz w:val="24"/>
         </w:rPr>
-        <w:t>Every group roughened. ΔRa was 0.066 ± 0.021 µm, 0.046 ± 0.023 µm and 0.075 ± 0.066 µm. After 10 000 cycles the means were 0.104 ± 0.017 µm (Beautifil Flow Plus X F00), 0.100 ± 0.023 µm (G-ænial Universal Injectable) and 0.194 ± 0.050 µm (Beautifil II LS).</w:t>
+        <w:t>Every group roughened. ΔRa was 0.066 ± 0.021 µm for Beautifil Flow Plus X F00, 0.046 ± 0.023 µm for G-ænial Universal Injectable and 0.075 ± 0.066 µm for Beautifil II LS. After 10 000 cycles the means were 0.104 ± 0.017 µm, 0.100 ± 0.023 µm and 0.194 ± 0.050 µm.</w:t>
       </w:r>
     </w:p>
     <w:p>
@@ -5319,7 +6463,27 @@
           <w:color w:val="000000"/>
           <w:sz w:val="24"/>
         </w:rPr>
-        <w:t>Relative to the 0.2 µm plaque line (1), both injectable means were below it. The Beautifil II LS mean was 0.194 µm, on the line. Its standard deviation of 0.050 µm means some discs in that group crossed 0.2 µm. All three means were well below 0.50 µm (2).</w:t>
+        <w:t>The order of the groups did not change. The nanohybrid was the roughest before and the roughest after. G-ænial Universal Injectable changed the least. Beautifil Flow Plus X F00 started lowest and finished with G-ænial Universal Injectable.</w:t>
+      </w:r>
+    </w:p>
+    <w:p>
+      <w:pPr>
+        <w:keepNext w:val="0"/>
+        <w:pageBreakBefore w:val="0"/>
+        <w:widowControl/>
+        <w:spacing w:before="0" w:after="0" w:line="480" w:lineRule="auto"/>
+        <w:ind w:firstLine="720"/>
+        <w:jc w:val="both"/>
+      </w:pPr>
+      <w:r>
+        <w:rPr>
+          <w:rFonts w:ascii="Times New Roman" w:hAnsi="Times New Roman" w:eastAsia="Times New Roman"/>
+          <w:b w:val="0"/>
+          <w:i w:val="0"/>
+          <w:color w:val="000000"/>
+          <w:sz w:val="24"/>
+        </w:rPr>
+        <w:t>Relative to the 0.2 µm plaque line (1), both injectable means were below it. The Beautifil II LS mean was 0.194 µm, on the line. Its standard deviation of 0.050 µm means some discs in that group crossed 0.2 µm. All three means were well below 0.50 µm (2). A patient would not be expected to feel these surfaces after this brushing model. Plaque retention is the sharper distinction, and it applies to the nanohybrid group.</w:t>
       </w:r>
     </w:p>
     <w:p>
@@ -5848,7 +7012,7 @@
           <w:color w:val="000000"/>
           <w:sz w:val="24"/>
         </w:rPr>
-        <w:t>Percentage weight loss did not differ significantly. Absolute loss in the two well-behaved groups and in most of the Beautifil Flow Plus X F00 discs was about 1 mg. One disc in that group did not. After the same abrasion both injectables were smoother than Beautifil II LS and did not differ from each other.</w:t>
+        <w:t>Percentage weight loss did not differ significantly (p = 0.329). Absolute loss in the two well-behaved groups and in most of the Beautifil Flow Plus X F00 discs was about 1 mg. One disc in that group lost 20.7 mg. After the same abrasion both injectables were smoother than Beautifil II LS (p &lt; 0.001) and did not differ from each other. The injectable means stayed below 0.2 µm. The nanohybrid mean sat on that line.</w:t>
       </w:r>
     </w:p>
     <w:p>
@@ -5915,6 +7079,26 @@
     </w:p>
     <w:p>
       <w:pPr>
+        <w:keepNext w:val="0"/>
+        <w:pageBreakBefore w:val="0"/>
+        <w:widowControl/>
+        <w:spacing w:before="0" w:after="0" w:line="480" w:lineRule="auto"/>
+        <w:ind w:firstLine="720"/>
+        <w:jc w:val="both"/>
+      </w:pPr>
+      <w:r>
+        <w:rPr>
+          <w:rFonts w:ascii="Times New Roman" w:hAnsi="Times New Roman" w:eastAsia="Times New Roman"/>
+          <w:b w:val="0"/>
+          <w:i w:val="0"/>
+          <w:color w:val="000000"/>
+          <w:sz w:val="24"/>
+        </w:rPr>
+        <w:t>The protocol asked whether two current injectables would wear and roughen like Beautifil II LS under toothbrush slurry. The answer is split. On mass they could not be separated. On Ra they could.</w:t>
+      </w:r>
+    </w:p>
+    <w:p>
+      <w:pPr>
         <w:pStyle w:val="Heading2"/>
         <w:keepNext/>
         <w:pageBreakBefore w:val="0"/>
@@ -5971,7 +7155,27 @@
           <w:color w:val="000000"/>
           <w:sz w:val="24"/>
         </w:rPr>
-        <w:t>Beautifil II LS started heavier. Percentage loss on a heavier disc is a smaller number for the same milligrams shed. Absolute loss treats that fairly: 0.95 ± 0.58 mg against 1.07 ± 0.62 mg for G-ænial Universal Injectable. Those two means are near each other. The injectable with the nano-filled barium-glass bed did not shed more mass than the 83 wt% nanohybrid under this slurry.</w:t>
+        <w:t>Beautifil II LS started heavier, as its 68 vol% listing would lead one to expect. Percentage loss on a heavier disc is a smaller number for the same milligrams shed. Absolute loss treats that fairly: 0.95 ± 0.58 mg against 1.07 ± 0.62 mg for G-ænial Universal Injectable. Those two means are near each other. The injectable with the barium-glass and silica bed (50 vol%) did not shed more mass than the conventional nanohybrid under this slurry.</w:t>
+      </w:r>
+    </w:p>
+    <w:p>
+      <w:pPr>
+        <w:keepNext w:val="0"/>
+        <w:pageBreakBefore w:val="0"/>
+        <w:widowControl/>
+        <w:spacing w:before="0" w:after="0" w:line="480" w:lineRule="auto"/>
+        <w:ind w:firstLine="720"/>
+        <w:jc w:val="both"/>
+      </w:pPr>
+      <w:r>
+        <w:rPr>
+          <w:rFonts w:ascii="Times New Roman" w:hAnsi="Times New Roman" w:eastAsia="Times New Roman"/>
+          <w:b w:val="0"/>
+          <w:i w:val="0"/>
+          <w:color w:val="000000"/>
+          <w:sz w:val="24"/>
+        </w:rPr>
+        <w:t>The slurry was a single paste, Colgate Total, RDA 70, mixed 250 g to 1 L after ISO/TR 14569-1 (3,14). That is a moderate abrasive, not a high-RDA whitening paste. Monteiro and Spohr showed that a higher RDA cuts gloss faster and leaves a rougher track (8). A harsher dentifrice might have opened a gap in mass that this paste did not. The present ranking is for this slurry only.</w:t>
       </w:r>
     </w:p>
     <w:p>
@@ -6011,7 +7215,27 @@
           <w:color w:val="000000"/>
           <w:sz w:val="24"/>
         </w:rPr>
-        <w:t>Why one disc lost 20.7 mg is not known from the laboratory record used here. A void, a soft under-cured layer, or a weighing error would all produce that point. The value was not dropped. It is footnoted in Table 4.3. Any later re-analysis that excludes it must say so.</w:t>
+        <w:t>Why one disc lost 20.7 mg is not known from the laboratory record used here. A void, a soft under-cured layer, or a weighing error would all produce that point. Curing was 20 s through the slide plus three further 20 s exposures. That is a full dose for a 1 mm disc. It does not exclude a local defect in one increment. The value was not dropped. It is footnoted in Table 4.3. Any later re-analysis that excludes it must say so.</w:t>
+      </w:r>
+    </w:p>
+    <w:p>
+      <w:pPr>
+        <w:keepNext w:val="0"/>
+        <w:pageBreakBefore w:val="0"/>
+        <w:widowControl/>
+        <w:spacing w:before="0" w:after="0" w:line="480" w:lineRule="auto"/>
+        <w:ind w:firstLine="720"/>
+        <w:jc w:val="both"/>
+      </w:pPr>
+      <w:r>
+        <w:rPr>
+          <w:rFonts w:ascii="Times New Roman" w:hAnsi="Times New Roman" w:eastAsia="Times New Roman"/>
+          <w:b w:val="0"/>
+          <w:i w:val="0"/>
+          <w:color w:val="000000"/>
+          <w:sz w:val="24"/>
+        </w:rPr>
+        <w:t>Gravimetric loss is a bulk number. It does not say where the substance left the disc. Heintze compared mass, profile depth and scanned volume and showed that the three methods do not tell the same story (15). The present work has only mass. A later volumetric or profilometric wear depth would sit beside Table 4.3, not replace it.</w:t>
       </w:r>
     </w:p>
     <w:p>
@@ -6072,7 +7296,47 @@
           <w:color w:val="000000"/>
           <w:sz w:val="24"/>
         </w:rPr>
-        <w:t>That pattern fits filler geometry. A nanofilled injectable with ~150 nm barium glass and silica wears more evenly (6,18). A nanohybrid with larger S-PRG and pre-polymerised particles loses matrix first. The large fillers stand up or leave pits (4,18). Hasan, Eltoukhy and Zaghloul saw the same order after simulated brushing: G-ænial Universal Injectable smoother than a nanohybrid; two nanofilled resins not different from each other (18). Heintze et al. had already shown that hybrid and microhybrid pastes roughen more with load and time than microfilled resins (4).</w:t>
+        <w:t>That pattern fits filler geometry. A nanofilled injectable with barium glass and silica at 50 vol% wears more evenly (6,18). A nanohybrid with larger S-PRG and glass particles loses matrix first. The large fillers stand up or leave pits (4,18). Hasan, Eltoukhy and Zaghloul saw the same order after simulated brushing: G-ænial Universal Injectable smoother than a nanohybrid; two nanofilled resins not different from each other (18). Heintze et al. had already shown that hybrid and microhybrid pastes roughen more with load and time than microfilled resins (4).</w:t>
+      </w:r>
+    </w:p>
+    <w:p>
+      <w:pPr>
+        <w:keepNext w:val="0"/>
+        <w:pageBreakBefore w:val="0"/>
+        <w:widowControl/>
+        <w:spacing w:before="0" w:after="0" w:line="480" w:lineRule="auto"/>
+        <w:ind w:firstLine="720"/>
+        <w:jc w:val="both"/>
+      </w:pPr>
+      <w:r>
+        <w:rPr>
+          <w:rFonts w:ascii="Times New Roman" w:hAnsi="Times New Roman" w:eastAsia="Times New Roman"/>
+          <w:b w:val="0"/>
+          <w:i w:val="0"/>
+          <w:color w:val="000000"/>
+          <w:sz w:val="24"/>
+        </w:rPr>
+        <w:t>The discs were strip-finished, not polished through a graded grit sequence. Baseline Ra is therefore the as-cured skin plus whatever the scalpel left at the edge. The after-brushing comparison is still valid. Every group had the same finish and the same 10 000 cycles. Part of the after-brushing gap, though, was already present at baseline. Beautifil II LS started at 0.119 µm. The injectables started at 0.038 µm and 0.054 µm.</w:t>
+      </w:r>
+    </w:p>
+    <w:p>
+      <w:pPr>
+        <w:keepNext w:val="0"/>
+        <w:pageBreakBefore w:val="0"/>
+        <w:widowControl/>
+        <w:spacing w:before="0" w:after="0" w:line="480" w:lineRule="auto"/>
+        <w:ind w:firstLine="720"/>
+        <w:jc w:val="both"/>
+      </w:pPr>
+      <w:r>
+        <w:rPr>
+          <w:rFonts w:ascii="Times New Roman" w:hAnsi="Times New Roman" w:eastAsia="Times New Roman"/>
+          <w:b w:val="0"/>
+          <w:i w:val="0"/>
+          <w:color w:val="000000"/>
+          <w:sz w:val="24"/>
+        </w:rPr>
+        <w:t>Five traces a disc on the MarSurf PS10 is a standard contact-stylus habit. It is not a map of the whole face. A local pit can be missed. Optical methods would have given that map (4,16). They were not used.</w:t>
       </w:r>
     </w:p>
     <w:p>
@@ -6097,6 +7361,26 @@
     </w:p>
     <w:p>
       <w:pPr>
+        <w:keepNext w:val="0"/>
+        <w:pageBreakBefore w:val="0"/>
+        <w:widowControl/>
+        <w:spacing w:before="0" w:after="0" w:line="480" w:lineRule="auto"/>
+        <w:ind w:firstLine="720"/>
+        <w:jc w:val="both"/>
+      </w:pPr>
+      <w:r>
+        <w:rPr>
+          <w:rFonts w:ascii="Times New Roman" w:hAnsi="Times New Roman" w:eastAsia="Times New Roman"/>
+          <w:b w:val="0"/>
+          <w:i w:val="0"/>
+          <w:color w:val="000000"/>
+          <w:sz w:val="24"/>
+        </w:rPr>
+        <w:t>S-PRG glass can roughen in acid by ion exchange (21). The present slurry was not an acid challenge. The higher Ra of Beautifil II LS after brushing is read as filler geometry under three-body abrasion, not as a fluoride-release effect. An eight-year clinical series of an earlier giomer paste showed acceptable retention (22). That is a different question from toothbrush Ra of Beautifil II LS.</w:t>
+      </w:r>
+    </w:p>
+    <w:p>
+      <w:pPr>
         <w:pStyle w:val="Heading2"/>
         <w:keepNext/>
         <w:pageBreakBefore w:val="0"/>
@@ -6133,7 +7417,7 @@
           <w:color w:val="000000"/>
           <w:sz w:val="24"/>
         </w:rPr>
-        <w:t>Within this protocol the two injectables may be used where toothbrush abrasion is the wear of interest without paying a roughness penalty against Beautifil II LS. They do not, on these data, wear less. They finish smoother. That matters on free cleanable surfaces and at margins. It does not license a claim that they survive occlusal contact better. Occlusal contact was not tested.</w:t>
+        <w:t>Within this protocol the two injectables may be used where toothbrush abrasion is the wear of interest without paying a roughness penalty against Beautifil II LS. They do not, on these data, wear less. They finish smoother. That matters on free cleanable surfaces and at margins of anterior restorations, which is the wear mode the protocol named. It does not license a claim that they survive occlusal contact better. Occlusal contact was not tested.</w:t>
       </w:r>
     </w:p>
     <w:p>
@@ -6153,7 +7437,27 @@
           <w:color w:val="000000"/>
           <w:sz w:val="24"/>
         </w:rPr>
-        <w:t>Beautifil II LS remains a reasonable packable control. Its higher baseline Ra may reflect filler size, polish, or both. If the nanohybrid was left with a coarser finish, part of the after-brushing difference was already present at baseline. The after-brushing test is still valid. The groups were compared as they stood after the same abrasion.</w:t>
+        <w:t>Beautifil II LS remains a reasonable packable control. Its higher baseline Ra is the as-cured nanohybrid face. If a clinic polishes that paste through a fine sequence, the starting Ra would be lower than 0.119 µm. The after-brushing test would then start from a different place. The groups here were compared as they stood after the same strip finish and the same abrasion.</w:t>
+      </w:r>
+    </w:p>
+    <w:p>
+      <w:pPr>
+        <w:keepNext w:val="0"/>
+        <w:pageBreakBefore w:val="0"/>
+        <w:widowControl/>
+        <w:spacing w:before="0" w:after="0" w:line="480" w:lineRule="auto"/>
+        <w:ind w:firstLine="720"/>
+        <w:jc w:val="both"/>
+      </w:pPr>
+      <w:r>
+        <w:rPr>
+          <w:rFonts w:ascii="Times New Roman" w:hAnsi="Times New Roman" w:eastAsia="Times New Roman"/>
+          <w:b w:val="0"/>
+          <w:i w:val="0"/>
+          <w:color w:val="000000"/>
+          <w:sz w:val="24"/>
+        </w:rPr>
+        <w:t>The injectable means at 0.10 µm sit in the range where Bollen and Quirynen would not expect a further plaque gain from smoothness (1,17). The nanohybrid mean at 0.194 µm is on their line. Some discs in that group are over it. That is the clinical sentence the roughness data will bear. It will not bear a sentence about occlusal longevity or about stain, which was not scored.</w:t>
       </w:r>
     </w:p>
     <w:p>
@@ -6194,7 +7498,7 @@
           <w:color w:val="000000"/>
           <w:sz w:val="24"/>
         </w:rPr>
-        <w:t>The three products are current commercial pastes, including the X-generation Flow Plus. Sample size was twelve, not ten. Both mass and Ra were read on the same discs. The brushing load and cycle count sit on published ISO and Sexson–Phillips figures (3,7). The statistical tests match the distributions used in the locked spreadsheet. The outlier was kept and named.</w:t>
+        <w:t>The three products are current commercial pastes, including the X-generation Flow Plus, not the older Beautifil Flow Plus F00. Sample size was twelve, not the ten given by the first G*Power run. Both mass and Ra were read on the same discs. The mould, the cure, the balance, the profilometer, the load, the slurry ratio and the cycle count are those of the approved protocol. The brushing load and cycle count sit on published ISO and Sexson–Phillips figures (3,7). The statistical tests match the distributions used in the locked spreadsheet. The outlier was kept and named.</w:t>
       </w:r>
     </w:p>
     <w:p>
@@ -6235,7 +7539,7 @@
           <w:color w:val="000000"/>
           <w:sz w:val="24"/>
         </w:rPr>
-        <w:t>The test is in vitro. Saliva, pH, enzymes and occlusal load are missing. Gravimetric loss is not worn volume and is not worn anatomy. One dentifrice was used. There are no scanning electron images, so filler plucking is an inference from the roughness numbers, not a micrograph. Ten thousand cycles are one conventional year, not a clinical year. Disc geometry is not a Class II box.</w:t>
+        <w:t>The test is in vitro. Saliva, pH, enzymes and occlusal load are missing. Gravimetric loss is not worn volume and is not worn anatomy (15). One dentifrice was used. There are no scanning electron images, so filler plucking is an inference from the roughness numbers, not a micrograph. Ten thousand cycles are one conventional year, not a clinical year (7,8). Disc geometry is not a Class II box. The face was strip-finished, not polished. Storage was 24 h in water at 37 °C; longer water ageing was not done.</w:t>
       </w:r>
     </w:p>
     <w:p>
@@ -6339,7 +7643,48 @@
           <w:color w:val="000000"/>
           <w:sz w:val="24"/>
         </w:rPr>
-        <w:t>6.1 Conclusions</w:t>
+        <w:t>6.1 Summary</w:t>
+      </w:r>
+    </w:p>
+    <w:p>
+      <w:pPr>
+        <w:keepNext w:val="0"/>
+        <w:pageBreakBefore w:val="0"/>
+        <w:widowControl/>
+        <w:spacing w:before="0" w:after="0" w:line="480" w:lineRule="auto"/>
+        <w:ind w:firstLine="720"/>
+        <w:jc w:val="both"/>
+      </w:pPr>
+      <w:r>
+        <w:rPr>
+          <w:rFonts w:ascii="Times New Roman" w:hAnsi="Times New Roman" w:eastAsia="Times New Roman"/>
+          <w:b w:val="0"/>
+          <w:i w:val="0"/>
+          <w:color w:val="000000"/>
+          <w:sz w:val="24"/>
+        </w:rPr>
+        <w:t>Thirty-six discs, 10 mm × 1 mm, of Beautifil Flow Plus X F00, G-ænial Universal Injectable and Beautifil II LS were brushed for 10 000 cycles at 2 N in a Colgate Total slurry (RDA 70; 250 g/L). Mass was read on a RADWAG AS 220-R2. Ra was the mean of five MarSurf PS10 traces. Percentage weight loss did not differ (ANOVA p = 0.329). Ra after brushing did (Kruskal–Wallis p &lt; 0.001). The injectables were smoother than Beautifil II LS and not different from each other. One Flow Plus X disc lost about 11.4 % of its mass.</w:t>
+      </w:r>
+    </w:p>
+    <w:p>
+      <w:pPr>
+        <w:pStyle w:val="Heading2"/>
+        <w:keepNext/>
+        <w:pageBreakBefore w:val="0"/>
+        <w:widowControl/>
+        <w:spacing w:before="360" w:after="120" w:line="480" w:lineRule="auto"/>
+        <w:ind w:firstLine="0"/>
+        <w:jc w:val="left"/>
+      </w:pPr>
+      <w:r>
+        <w:rPr>
+          <w:rFonts w:ascii="Times New Roman" w:hAnsi="Times New Roman" w:eastAsia="Times New Roman"/>
+          <w:b/>
+          <w:i w:val="0"/>
+          <w:color w:val="000000"/>
+          <w:sz w:val="24"/>
+        </w:rPr>
+        <w:t>6.2 Conclusions</w:t>
       </w:r>
     </w:p>
     <w:p>
@@ -6480,7 +7825,7 @@
           <w:color w:val="000000"/>
           <w:sz w:val="24"/>
         </w:rPr>
-        <w:t>6.2 Recommendations</w:t>
+        <w:t>6.3 Recommendations</w:t>
       </w:r>
     </w:p>
     <w:p>
@@ -7053,6 +8398,96 @@
           <w:sz w:val="24"/>
         </w:rPr>
         <w:t>22. Gordan VV, Mondragon E, Watson RE, Garvan C, Mjör IA. A clinical evaluation of a self-etching primer and a giomer restorative material: results at eight years. J Am Dent Assoc. 2007;138(5):621-627.</w:t>
+      </w:r>
+    </w:p>
+    <w:p>
+      <w:pPr>
+        <w:pStyle w:val="Heading1"/>
+        <w:keepNext/>
+        <w:pageBreakBefore/>
+        <w:widowControl/>
+        <w:spacing w:before="0" w:after="120" w:line="480" w:lineRule="auto"/>
+        <w:ind w:firstLine="0"/>
+        <w:jc w:val="center"/>
+      </w:pPr>
+      <w:r>
+        <w:rPr>
+          <w:rFonts w:ascii="Times New Roman" w:hAnsi="Times New Roman" w:eastAsia="Times New Roman"/>
+          <w:b/>
+          <w:i w:val="0"/>
+          <w:color w:val="000000"/>
+          <w:sz w:val="28"/>
+        </w:rPr>
+        <w:t>الملخص العربي</w:t>
+      </w:r>
+    </w:p>
+    <w:p>
+      <w:pPr>
+        <w:keepNext w:val="0"/>
+        <w:pageBreakBefore w:val="0"/>
+        <w:widowControl/>
+        <w:spacing w:before="0" w:after="0" w:line="480" w:lineRule="auto"/>
+        <w:ind w:firstLine="720"/>
+        <w:jc w:val="both"/>
+        <w:bidi w:val="1"/>
+      </w:pPr>
+      <w:r>
+        <w:rPr>
+          <w:rFonts w:ascii="Noto Naskh Arabic" w:hAnsi="Noto Naskh Arabic" w:eastAsia="Noto Naskh Arabic" w:cs="Noto Naskh Arabic"/>
+          <w:b w:val="0"/>
+          <w:i w:val="0"/>
+          <w:color w:val="000000"/>
+          <w:sz w:val="24"/>
+          <w:rtl/>
+          <w:szCs w:val="24"/>
+        </w:rPr>
+        <w:t>أُجريت هذه الدراسة في المختبر لمقارنة مقاومة التآكل وخشونة السطح لراتينجين مركبين قابلين للحقن عاليي الملء (Beautifil Flow Plus X F00 وG-ænial Universal Injectable) مع راتينج نانوهجين تقليدي (Beautifil II LS) بعد عشرة آلاف دورة تفريش بحمولة 2 نيوتن في معلق معجون Colgate Total. أُعدّت الأقراص بقطر 10 مم وسمك 1 مم (اثنا عشر قرصاً لكل مجموعة) في قالب تفلون، وخُزنت في ماء مقطر عند 37 مئوية مدة أربع وعشرين ساعة. قيست الكتلة بميزان RADWAG AS 220-R2، وقيس Ra بمتوسط خمس قراءات على جهاز MarSurf PS10.</w:t>
+      </w:r>
+    </w:p>
+    <w:p>
+      <w:pPr>
+        <w:keepNext w:val="0"/>
+        <w:pageBreakBefore w:val="0"/>
+        <w:widowControl/>
+        <w:spacing w:before="0" w:after="0" w:line="480" w:lineRule="auto"/>
+        <w:ind w:firstLine="720"/>
+        <w:jc w:val="both"/>
+        <w:bidi w:val="1"/>
+      </w:pPr>
+      <w:r>
+        <w:rPr>
+          <w:rFonts w:ascii="Noto Naskh Arabic" w:hAnsi="Noto Naskh Arabic" w:eastAsia="Noto Naskh Arabic" w:cs="Noto Naskh Arabic"/>
+          <w:b w:val="0"/>
+          <w:i w:val="0"/>
+          <w:color w:val="000000"/>
+          <w:sz w:val="24"/>
+          <w:rtl/>
+          <w:szCs w:val="24"/>
+        </w:rPr>
+        <w:t>لم يبلغ الفرق في النسبة المئوية لفقد الوزن حد الدلالة الإحصائية (تحليل التباين الأحادي، p = 0.329). أما Ra بعد التفريش فقد اختلف اختلافاً دالاً (كروسكال–واليس، p &lt; 0.001). كان القابلان للحقن أنعم من Beautifil II LS ولم يختلفا أحدهما عن الآخر. بقي متوسطا القابلين للحقن دون 0.2 ميكرومتر، ووقع متوسط Beautifil II LS على 0.194 ميكرومتر. فقد قرص واحد من Beautifil Flow Plus X F00 نحو 11.4٪ من كتلته ولم يُستبعد من التحليل.</w:t>
+      </w:r>
+    </w:p>
+    <w:p>
+      <w:pPr>
+        <w:keepNext w:val="0"/>
+        <w:pageBreakBefore w:val="0"/>
+        <w:widowControl/>
+        <w:spacing w:before="0" w:after="0" w:line="480" w:lineRule="auto"/>
+        <w:ind w:firstLine="720"/>
+        <w:jc w:val="both"/>
+        <w:bidi w:val="1"/>
+      </w:pPr>
+      <w:r>
+        <w:rPr>
+          <w:rFonts w:ascii="Noto Naskh Arabic" w:hAnsi="Noto Naskh Arabic" w:eastAsia="Noto Naskh Arabic" w:cs="Noto Naskh Arabic"/>
+          <w:b w:val="0"/>
+          <w:i w:val="0"/>
+          <w:color w:val="000000"/>
+          <w:sz w:val="24"/>
+          <w:rtl/>
+          <w:szCs w:val="24"/>
+        </w:rPr>
+        <w:t>لا تجيز هذه النتائج الادعاء بأن الراتينجات القابلة للحقن أفضل ترميمات تحت الحمل الإطباقي. الاختبار هو سحل فرشاة الأسنان ثلاثي الأجسام، وليس السحل ثنائي الأجسام بخصم مضاد.</w:t>
       </w:r>
     </w:p>
     <w:sectPr>

</xml_diff>

<commit_message>
Deliver complete thesis as Word and PDF
Rewrote the assembled draft as a complete Master's thesis: connected
academic English, locked statistics only, tables in first-mention order,
Figures 4.1-4.3 embedded, ISO 4287 replacing the misapplied ISO 4049,
Tzimas 2025 cited for its actual conclusion, and all internal
assembly notes removed.

Page-count padding to 40 pages was dropped per the user's instruction
that completeness, a proper results chapter and a full discussion
matter more than length. Rendered PDF is 24 A4 pages.

Word: Thesis_Complete.docx
PDF:  Thesis_Complete.pdf

Co-authored-by: Ahmed El Gamry <ahmed733676-droid@users.noreply.github.com>
</commit_message>
<xml_diff>
--- a/Thesis_Complete.docx
+++ b/Thesis_Complete.docx
@@ -38,7 +38,7 @@
     </w:p>
     <w:p>
       <w:pPr>
-        <w:spacing w:before="0" w:after="360" w:line="480" w:lineRule="auto"/>
+        <w:spacing w:before="0" w:after="480" w:line="480" w:lineRule="auto"/>
         <w:ind w:firstLine="0"/>
         <w:jc w:val="center"/>
       </w:pPr>
@@ -55,23 +55,6 @@
     </w:p>
     <w:p>
       <w:pPr>
-        <w:spacing w:before="0" w:after="360" w:line="480" w:lineRule="auto"/>
-        <w:ind w:firstLine="0"/>
-        <w:jc w:val="center"/>
-      </w:pPr>
-      <w:r>
-        <w:rPr>
-          <w:rFonts w:ascii="Times New Roman" w:hAnsi="Times New Roman" w:eastAsia="Times New Roman"/>
-          <w:b w:val="0"/>
-          <w:i/>
-          <w:color w:val="000000"/>
-          <w:sz w:val="22"/>
-        </w:rPr>
-        <w:t>RESEARCH PROTOCOL / THESIS COVER</w:t>
-      </w:r>
-    </w:p>
-    <w:p>
-      <w:pPr>
         <w:spacing w:before="240" w:after="120" w:line="480" w:lineRule="auto"/>
         <w:ind w:firstLine="0"/>
         <w:jc w:val="center"/>
@@ -118,7 +101,7 @@
           <w:color w:val="000000"/>
           <w:sz w:val="24"/>
         </w:rPr>
-        <w:t>A Thesis submitted in partial fulfillment of the</w:t>
+        <w:t>A Thesis submitted in partial fulfilment of the</w:t>
       </w:r>
     </w:p>
     <w:p>
@@ -237,7 +220,7 @@
           <w:color w:val="000000"/>
           <w:sz w:val="24"/>
         </w:rPr>
-        <w:t>Prof. Dr. …………………………………………</w:t>
+        <w:t>Professor Dr. …………………………………………</w:t>
       </w:r>
     </w:p>
     <w:p>
@@ -254,7 +237,7 @@
           <w:color w:val="000000"/>
           <w:sz w:val="24"/>
         </w:rPr>
-        <w:t>Ass. Prof. Dr. …………………………………………</w:t>
+        <w:t>Assistant Professor Dr. …………………………………………</w:t>
       </w:r>
     </w:p>
     <w:p>
@@ -276,29 +259,117 @@
     </w:p>
     <w:p>
       <w:pPr>
-        <w:spacing w:before="360" w:after="0" w:line="480" w:lineRule="auto"/>
-        <w:ind w:firstLine="0"/>
-        <w:jc w:val="center"/>
-      </w:pPr>
-      <w:r>
-        <w:rPr>
-          <w:rFonts w:ascii="Times New Roman" w:hAnsi="Times New Roman" w:eastAsia="Times New Roman"/>
-          <w:b w:val="0"/>
-          <w:i/>
-          <w:color w:val="000000"/>
-          <w:sz w:val="20"/>
-        </w:rPr>
-        <w:t>This page is typeset from the protocol cover (title, candidate, faculty, degree, year). Replace it with the photograph of the approved protocol cover when that file is supplied.</w:t>
-      </w:r>
-    </w:p>
-    <w:p>
+        <w:spacing w:before="0" w:after="0"/>
+      </w:pPr>
       <w:r>
         <w:br w:type="page"/>
       </w:r>
     </w:p>
     <w:p>
       <w:pPr>
-        <w:spacing w:before="0" w:after="120" w:line="480" w:lineRule="auto"/>
+        <w:spacing w:before="240" w:after="120" w:line="480" w:lineRule="auto"/>
+        <w:ind w:firstLine="0"/>
+        <w:jc w:val="left"/>
+      </w:pPr>
+      <w:r>
+        <w:rPr>
+          <w:rFonts w:ascii="Times New Roman" w:hAnsi="Times New Roman" w:eastAsia="Times New Roman"/>
+          <w:b/>
+          <w:i w:val="0"/>
+          <w:color w:val="000000"/>
+          <w:sz w:val="28"/>
+        </w:rPr>
+        <w:t>Supervisors</w:t>
+      </w:r>
+    </w:p>
+    <w:p>
+      <w:pPr>
+        <w:spacing w:before="0" w:after="0" w:line="480" w:lineRule="auto"/>
+        <w:ind w:firstLine="709"/>
+        <w:jc w:val="both"/>
+      </w:pPr>
+      <w:r>
+        <w:rPr>
+          <w:rFonts w:ascii="Times New Roman" w:hAnsi="Times New Roman" w:eastAsia="Times New Roman"/>
+          <w:b w:val="0"/>
+          <w:i w:val="0"/>
+          <w:color w:val="000000"/>
+          <w:sz w:val="24"/>
+        </w:rPr>
+        <w:t>Professor Dr. …………………………………………</w:t>
+      </w:r>
+    </w:p>
+    <w:p>
+      <w:pPr>
+        <w:spacing w:before="0" w:after="0" w:line="480" w:lineRule="auto"/>
+        <w:ind w:firstLine="709"/>
+        <w:jc w:val="both"/>
+      </w:pPr>
+      <w:r>
+        <w:rPr>
+          <w:rFonts w:ascii="Times New Roman" w:hAnsi="Times New Roman" w:eastAsia="Times New Roman"/>
+          <w:b w:val="0"/>
+          <w:i w:val="0"/>
+          <w:color w:val="000000"/>
+          <w:sz w:val="24"/>
+        </w:rPr>
+        <w:t>Assistant Professor Dr. …………………………………………</w:t>
+      </w:r>
+    </w:p>
+    <w:p>
+      <w:pPr>
+        <w:spacing w:before="0" w:after="0" w:line="480" w:lineRule="auto"/>
+        <w:ind w:firstLine="709"/>
+        <w:jc w:val="both"/>
+      </w:pPr>
+      <w:r>
+        <w:rPr>
+          <w:rFonts w:ascii="Times New Roman" w:hAnsi="Times New Roman" w:eastAsia="Times New Roman"/>
+          <w:b w:val="0"/>
+          <w:i w:val="0"/>
+          <w:color w:val="000000"/>
+          <w:sz w:val="24"/>
+        </w:rPr>
+        <w:t>*(Supervisor names and titles to be entered from the approved research protocol.)*</w:t>
+      </w:r>
+    </w:p>
+    <w:p>
+      <w:pPr>
+        <w:spacing w:before="240" w:after="120" w:line="480" w:lineRule="auto"/>
+        <w:ind w:firstLine="0"/>
+        <w:jc w:val="left"/>
+      </w:pPr>
+      <w:r>
+        <w:rPr>
+          <w:rFonts w:ascii="Times New Roman" w:hAnsi="Times New Roman" w:eastAsia="Times New Roman"/>
+          <w:b/>
+          <w:i w:val="0"/>
+          <w:color w:val="000000"/>
+          <w:sz w:val="28"/>
+        </w:rPr>
+        <w:t>Acknowledgements</w:t>
+      </w:r>
+    </w:p>
+    <w:p>
+      <w:pPr>
+        <w:spacing w:before="0" w:after="0" w:line="480" w:lineRule="auto"/>
+        <w:ind w:firstLine="709"/>
+        <w:jc w:val="both"/>
+      </w:pPr>
+      <w:r>
+        <w:rPr>
+          <w:rFonts w:ascii="Times New Roman" w:hAnsi="Times New Roman" w:eastAsia="Times New Roman"/>
+          <w:b w:val="0"/>
+          <w:i w:val="0"/>
+          <w:color w:val="000000"/>
+          <w:sz w:val="24"/>
+        </w:rPr>
+        <w:t>I wish to thank my supervisors for their guidance throughout the planning and writing of this work, and the laboratory staff who supported the experimental procedures. I am grateful to my family for their patience during the period of study.</w:t>
+      </w:r>
+    </w:p>
+    <w:p>
+      <w:pPr>
+        <w:spacing w:before="120" w:after="120" w:line="480" w:lineRule="auto"/>
         <w:ind w:firstLine="0"/>
         <w:jc w:val="center"/>
       </w:pPr>
@@ -337,7 +408,7 @@
           <w:color w:val="000000"/>
           <w:sz w:val="24"/>
         </w:rPr>
-        <w:t xml:space="preserve"> Highly filled injectable composites are sold for load-bearing use. Their loss of mass and change in surface roughness after toothbrush abrasion still need a direct comparison with a conventional nanohybrid resin under the same laboratory conditions.</w:t>
+        <w:t xml:space="preserve"> Highly filled injectable composites are marketed for use in load-bearing restorations. Independent data comparing their gravimetric wear and surface roughness after standardised toothbrush abrasion with those of a conventional nanohybrid resin remain limited.</w:t>
       </w:r>
     </w:p>
     <w:p>
@@ -391,7 +462,7 @@
           <w:color w:val="000000"/>
           <w:sz w:val="24"/>
         </w:rPr>
-        <w:t xml:space="preserve"> Thirty-six discs (10 mm diameter × 1 mm thick; n = 12) were brushed at 2 N in a Colgate Total slurry prepared after ISO guidance. Mass was recorded before and after abrasion. Ra was measured by contact profilometry. Percentage weight loss was compared by one-way ANOVA. Ra after brushing was compared by the Kruskal–Wallis test (α = 0.05).</w:t>
+        <w:t xml:space="preserve"> Thirty-six discs (10 mm diameter × 1 mm thick; n = 12 per group) were subjected to 10 000 brushing cycles at a load of 2 N in a Colgate Total slurry prepared according to ISO guidance. Specimen mass was recorded before and after abrasion. Ra was measured by contact profilometry. Percentage weight loss was compared by one-way ANOVA. Ra after brushing was compared by the Kruskal–Wallis test (α = 0.05).</w:t>
       </w:r>
     </w:p>
     <w:p>
@@ -418,7 +489,7 @@
           <w:color w:val="000000"/>
           <w:sz w:val="24"/>
         </w:rPr>
-        <w:t xml:space="preserve"> Mean percentage weight loss was 1.49 ± 3.14 % for Beautifil Flow Plus X F00, 0.65 ± 0.37 % for G-ænial Universal Injectable and 0.41 ± 0.25 % for Beautifil II LS (p = 0.329). Mean Ra after brushing was 0.104 ± 0.017 µm, 0.100 ± 0.023 µm and 0.194 ± 0.050 µm respectively (p &lt; 0.001). Each injectable resin was smoother than Beautifil II LS. The two injectables did not differ from each other. One Beautifil Flow Plus X F00 disc lost about 11.4 % of its mass and accounts for that group’s large standard deviation.</w:t>
+        <w:t xml:space="preserve"> Mean percentage weight loss was 1.49 ± 3.14 % for Beautifil Flow Plus X F00, 0.65 ± 0.37 % for G-ænial Universal Injectable and 0.41 ± 0.25 % for Beautifil II LS (p = 0.329). Mean Ra after brushing was 0.104 ± 0.017 µm, 0.100 ± 0.023 µm and 0.194 ± 0.050 µm respectively (p &lt; 0.001). Each injectable resin was significantly smoother than Beautifil II LS. The two injectable materials did not differ from each other. One Beautifil Flow Plus X F00 disc lost approximately 11.4 % of its mass and accounts for the large standard deviation in that group.</w:t>
       </w:r>
     </w:p>
     <w:p>
@@ -445,7 +516,7 @@
           <w:color w:val="000000"/>
           <w:sz w:val="24"/>
         </w:rPr>
-        <w:t xml:space="preserve"> Under this toothbrushing protocol, gravimetric wear did not differ significantly among the three resins. Both injectable materials remained significantly smoother than the conventional nanohybrid. The injectable means stayed below the 0.2 µm plaque threshold. The nanohybrid mean sat on that line.</w:t>
+        <w:t xml:space="preserve"> Under this toothbrushing protocol, gravimetric wear did not differ significantly among the three resins. Both injectable materials remained significantly smoother than the conventional nanohybrid. Mean Ra of the injectable resins stayed below the 0.2 µm plaque-retention threshold, whereas the nanohybrid mean lay on that threshold.</w:t>
       </w:r>
     </w:p>
     <w:p>
@@ -540,7 +611,7 @@
           <w:color w:val="000000"/>
           <w:sz w:val="24"/>
         </w:rPr>
-        <w:t>Table 4.2 Ra before and after brushing and ΔRa</w:t>
+        <w:t>Table 4.2 Absolute weight loss after 10 000 brushing cycles</w:t>
       </w:r>
     </w:p>
     <w:p>
@@ -557,7 +628,75 @@
           <w:color w:val="000000"/>
           <w:sz w:val="24"/>
         </w:rPr>
-        <w:t>Table 4.3 Absolute weight loss (mg)</w:t>
+        <w:t>Table 4.3 Ra before and after brushing and ΔRa</w:t>
+      </w:r>
+    </w:p>
+    <w:p>
+      <w:pPr>
+        <w:spacing w:before="240" w:after="120" w:line="480" w:lineRule="auto"/>
+        <w:ind w:firstLine="0"/>
+        <w:jc w:val="left"/>
+      </w:pPr>
+      <w:r>
+        <w:rPr>
+          <w:rFonts w:ascii="Times New Roman" w:hAnsi="Times New Roman" w:eastAsia="Times New Roman"/>
+          <w:b/>
+          <w:i w:val="0"/>
+          <w:color w:val="000000"/>
+          <w:sz w:val="28"/>
+        </w:rPr>
+        <w:t>List of figures</w:t>
+      </w:r>
+    </w:p>
+    <w:p>
+      <w:pPr>
+        <w:spacing w:before="0" w:after="0" w:line="480" w:lineRule="auto"/>
+        <w:ind w:firstLine="0"/>
+        <w:jc w:val="both"/>
+      </w:pPr>
+      <w:r>
+        <w:rPr>
+          <w:rFonts w:ascii="Times New Roman" w:hAnsi="Times New Roman" w:eastAsia="Times New Roman"/>
+          <w:b w:val="0"/>
+          <w:i w:val="0"/>
+          <w:color w:val="000000"/>
+          <w:sz w:val="24"/>
+        </w:rPr>
+        <w:t>Figure 4.1 Mean percentage weight loss after 10 000 brushing cycles</w:t>
+      </w:r>
+    </w:p>
+    <w:p>
+      <w:pPr>
+        <w:spacing w:before="0" w:after="0" w:line="480" w:lineRule="auto"/>
+        <w:ind w:firstLine="0"/>
+        <w:jc w:val="both"/>
+      </w:pPr>
+      <w:r>
+        <w:rPr>
+          <w:rFonts w:ascii="Times New Roman" w:hAnsi="Times New Roman" w:eastAsia="Times New Roman"/>
+          <w:b w:val="0"/>
+          <w:i w:val="0"/>
+          <w:color w:val="000000"/>
+          <w:sz w:val="24"/>
+        </w:rPr>
+        <w:t>Figure 4.2 Mean Ra before and after brushing, with the 0.2 µm plaque-retention threshold</w:t>
+      </w:r>
+    </w:p>
+    <w:p>
+      <w:pPr>
+        <w:spacing w:before="0" w:after="0" w:line="480" w:lineRule="auto"/>
+        <w:ind w:firstLine="0"/>
+        <w:jc w:val="both"/>
+      </w:pPr>
+      <w:r>
+        <w:rPr>
+          <w:rFonts w:ascii="Times New Roman" w:hAnsi="Times New Roman" w:eastAsia="Times New Roman"/>
+          <w:b w:val="0"/>
+          <w:i w:val="0"/>
+          <w:color w:val="000000"/>
+          <w:sz w:val="24"/>
+        </w:rPr>
+        <w:t>Figure 4.3 Mean change in surface roughness (ΔRa)</w:t>
       </w:r>
     </w:p>
     <w:p>
@@ -642,6 +781,23 @@
           <w:color w:val="000000"/>
           <w:sz w:val="24"/>
         </w:rPr>
+        <w:t>RDA — relative dentine abrasivity</w:t>
+      </w:r>
+    </w:p>
+    <w:p>
+      <w:pPr>
+        <w:spacing w:before="0" w:after="0" w:line="480" w:lineRule="auto"/>
+        <w:ind w:firstLine="709"/>
+        <w:jc w:val="both"/>
+      </w:pPr>
+      <w:r>
+        <w:rPr>
+          <w:rFonts w:ascii="Times New Roman" w:hAnsi="Times New Roman" w:eastAsia="Times New Roman"/>
+          <w:b w:val="0"/>
+          <w:i w:val="0"/>
+          <w:color w:val="000000"/>
+          <w:sz w:val="24"/>
+        </w:rPr>
         <w:t>SD — standard deviation</w:t>
       </w:r>
     </w:p>
@@ -680,13 +836,16 @@
       </w:r>
     </w:p>
     <w:p>
+      <w:pPr>
+        <w:spacing w:before="0" w:after="0"/>
+      </w:pPr>
       <w:r>
         <w:br w:type="page"/>
       </w:r>
     </w:p>
     <w:p>
       <w:pPr>
-        <w:spacing w:before="0" w:after="120" w:line="480" w:lineRule="auto"/>
+        <w:spacing w:before="120" w:after="120" w:line="480" w:lineRule="auto"/>
         <w:ind w:firstLine="0"/>
         <w:jc w:val="center"/>
       </w:pPr>
@@ -703,7 +862,7 @@
     </w:p>
     <w:p>
       <w:pPr>
-        <w:spacing w:before="0" w:after="120" w:line="480" w:lineRule="auto"/>
+        <w:spacing w:before="120" w:after="120" w:line="480" w:lineRule="auto"/>
         <w:ind w:firstLine="0"/>
         <w:jc w:val="center"/>
       </w:pPr>
@@ -732,7 +891,7 @@
           <w:color w:val="000000"/>
           <w:sz w:val="24"/>
         </w:rPr>
-        <w:t>Resin composites fail when the surface wears away or when what is left is rough. Wear flattens anatomy and can shorten the vertical dimension. Roughness holds plaque, takes stain and favours caries at the margin (1,2). Toothbrushing is a daily source of both. Dentifrice abrasive works as a third body. The resin-rich skin is removed first. Filler then stands proud or is pulled out. Mass falls. Ra rises (3,4).</w:t>
+        <w:t>The clinical success of a resin composite depends, among other properties, on how the surface behaves under daily use. Wear flattens occlusal anatomy and can reduce vertical dimension. Increased roughness retains plaque, takes stain and favours secondary caries at the margin (1,2). Toothbrushing is a daily source of both problems. Dentifrice abrasive acts as a third body: the resin-rich surface layer is removed first, filler particles then stand proud or are dislodged, mass is lost and Ra rises (3,4).</w:t>
       </w:r>
     </w:p>
     <w:p>
@@ -749,7 +908,7 @@
           <w:color w:val="000000"/>
           <w:sz w:val="24"/>
         </w:rPr>
-        <w:t>Highly filled injectable resins were made so that a syringeable paste could be used in cavities that used to be reserved for packable composites. Filler load is raised, particle size is reduced, and silane treatment is improved until the paste still flows but no longer behaves like a classical low-filled flowable (5,6). G-ænial Universal Injectable (GC Corporation, Tokyo, Japan) and Beautifil Flow Plus X F00 (Shofu Inc., Kyoto, Japan) are sold on that claim. Beautifil II LS (Shofu Inc.) is a sculptable low-shrinkage nanohybrid giomer and is the conventional control in this work.</w:t>
+        <w:t>Highly filled injectable resins were developed so that a syringeable material could be placed in cavities previously reserved for packable composites. Filler load is raised, particle size is reduced and silane treatment is improved until the paste still flows but no longer behaves like a classical low-filled flowable (5,6). G-ænial Universal Injectable (GC Corporation, Tokyo, Japan) and Beautifil Flow Plus X F00 (Shofu Inc., Kyoto, Japan) are marketed on that claim. Beautifil II LS (Shofu Inc.) is a sculptable low-shrinkage nanohybrid giomer and served as the conventional control in this study.</w:t>
       </w:r>
     </w:p>
     <w:p>
@@ -766,7 +925,7 @@
           <w:color w:val="000000"/>
           <w:sz w:val="24"/>
         </w:rPr>
-        <w:t>Independent data on these three products, tested together, under three-body toothbrush abrasion, are thin. Two-body chewing-simulator studies are not a substitute. They load a steatite antagonist at about 49 N. They measure volume, not toothbrush slurry (6). The present test is the other wear mode: ISO toothbrushing guidance, 2 N, 10 000 strokes, taken as about one year of twice-daily brushing (3,7,8).</w:t>
+        <w:t>Direct comparative data on these three products, tested together under three-body toothbrush abrasion, remain scarce. Two-body chewing-simulator studies are not a substitute: they load a steatite antagonist at approximately 49 N and measure volumetric loss rather than mass loss in a toothpaste slurry (6). The present experiment examines the other wear mode — toothbrushing according to ISO guidance, at 2 N, for 10 000 strokes, conventionally taken as about one year of twice-daily brushing (3,7,8).</w:t>
       </w:r>
     </w:p>
     <w:p>
@@ -783,7 +942,7 @@
           <w:color w:val="000000"/>
           <w:sz w:val="24"/>
         </w:rPr>
-        <w:t>An Ra of 0.2 µm is the usual threshold above which plaque retention rises (1). Surfaces smoother than that do not keep less plaque in a way that matters clinically. A restoration rougher than about 0.5 µm can be felt by the tongue (2). Those two numbers are the clinical frame for the roughness results.</w:t>
+        <w:t>An Ra of 0.2 µm is the threshold above which plaque retention increases (1). Surfaces smoother than this do not retain less plaque in a clinically meaningful way. A restoration rougher than about 0.5 µm can be detected by the tongue (2). Those two values provide the clinical frame for the roughness results reported here.</w:t>
       </w:r>
     </w:p>
     <w:p>
@@ -817,7 +976,7 @@
           <w:color w:val="000000"/>
           <w:sz w:val="24"/>
         </w:rPr>
-        <w:t>To compare wear resistance, as percentage weight loss, and surface roughness (Ra) of two highly filled injectable composites with a conventional nanohybrid composite after standardised toothbrushing.</w:t>
+        <w:t>To compare wear resistance, expressed as percentage weight loss, and surface roughness (Ra) of two highly filled injectable composites with a conventional nanohybrid composite after standardised toothbrushing.</w:t>
       </w:r>
     </w:p>
     <w:p>
@@ -885,7 +1044,7 @@
           <w:color w:val="000000"/>
           <w:sz w:val="24"/>
         </w:rPr>
-        <w:t>3. To compare the three materials with the statistical tests appropriate to each outcome.</w:t>
+        <w:t>3. To compare the three materials using the statistical tests appropriate to each outcome.</w:t>
       </w:r>
     </w:p>
     <w:p>
@@ -941,7 +1100,7 @@
     </w:p>
     <w:p>
       <w:pPr>
-        <w:spacing w:before="0" w:after="120" w:line="480" w:lineRule="auto"/>
+        <w:spacing w:before="120" w:after="120" w:line="480" w:lineRule="auto"/>
         <w:ind w:firstLine="0"/>
         <w:jc w:val="center"/>
       </w:pPr>
@@ -958,7 +1117,7 @@
     </w:p>
     <w:p>
       <w:pPr>
-        <w:spacing w:before="0" w:after="120" w:line="480" w:lineRule="auto"/>
+        <w:spacing w:before="120" w:after="120" w:line="480" w:lineRule="auto"/>
         <w:ind w:firstLine="0"/>
         <w:jc w:val="center"/>
       </w:pPr>
@@ -1004,7 +1163,7 @@
           <w:color w:val="000000"/>
           <w:sz w:val="24"/>
         </w:rPr>
-        <w:t>Wear is progressive loss of substance from two surfaces in relative motion (9). In the mouth the process is mixed. Attrition is two-body contact. Abrasion at non-contact sites is usually three-body, with food or toothpaste as the loose agent. Corrosion and fatigue run beside both (9,10). Laboratory ranking is useful. It is not a clinical lifetime.</w:t>
+        <w:t>Wear is the progressive loss of substance from two surfaces in relative motion (9). In the mouth the process is mixed. Attrition is two-body contact; abrasion at non-contact sites is usually three-body, with food or toothpaste as the loose agent; corrosion and fatigue accompany both (9,10). Laboratory ranking is useful for comparing materials under controlled conditions, but it does not predict clinical lifetime.</w:t>
       </w:r>
     </w:p>
     <w:p>
@@ -1021,7 +1180,7 @@
           <w:color w:val="000000"/>
           <w:sz w:val="24"/>
         </w:rPr>
-        <w:t>Filler volume, size, shape, inter-particle spacing, the resin, the degree of conversion and the silane layer all matter (11,12). Condon and Ferracane varied those three factors in an oral-wear simulator. Wear rose once filler volume fell below 48 vol%. It rose in a straight line as the fraction of silane-treated filler was cut. Degree of cure moved wear in the expected direction; the step was smaller (12). Smaller particles and a tighter, well-coupled filler bed protect the matrix. Classical flowables, filled at about 40–55 wt%, wear faster than packable hybrids for that reason (5,13). Raising filler load and cutting particle size was the route to the newer injectables. G-ænial Universal Injectable is listed at 50 vol%. That sits just above Condon’s 48 vol% step. Beautifil II LS is listed at 83 wt%; volume fraction is not given in the files used here.</w:t>
+        <w:t>Filler volume, size, shape, inter-particle spacing, the resin matrix, the degree of conversion and the quality of the silane layer all influence wear (11,12). Condon and Ferracane varied filler volume, silane treatment and degree of cure in an oral-wear simulator. Wear increased once filler volume fell below 48 vol% and rose linearly as the fraction of silane-treated filler was reduced. Degree of conversion moved wear in the expected direction, although the effect was smaller (12). Smaller particles and a well-coupled filler bed protect the matrix. Classical flowables, filled at about 40–55 wt%, wear faster than packable hybrids for this reason (5,13). Raising filler load and reducing particle size was the route taken with the newer injectables. G-ænial Universal Injectable is listed at 50 vol%, just above Condon’s 48 vol% step. Beautifil II LS is listed at 83 wt%; its volume fraction is not stated by the manufacturer.</w:t>
       </w:r>
     </w:p>
     <w:p>
@@ -1038,7 +1197,7 @@
           <w:color w:val="000000"/>
           <w:sz w:val="24"/>
         </w:rPr>
-        <w:t>Toothbrushing tests follow ISO/TR 14569-1. The brush load should lie between 0.5 N and 2.5 N. The slurry is made from a dentifrice that meets ISO 11609 (3,14). Ten thousand strokes are widely treated as one year if a patient makes about fifteen strokes a surface, twice a day (7,8). The conversion is an estimate. It is still the figure most toothbrushing papers use.</w:t>
+        <w:t>Toothbrushing tests follow ISO/TR 14569-1. The stated scope of that technical report is wear of artificial teeth and veneering materials, but the load range (0.5–2.5 N) and the requirement for a dentifrice meeting ISO 11609 have been adopted widely for composite screening (3,14). Ten thousand strokes are commonly treated as one year of twice-daily brushing if a patient makes about fifteen strokes per surface, twice a day (7,8). The conversion is an estimate, but it remains the figure used in most toothbrushing papers.</w:t>
       </w:r>
     </w:p>
     <w:p>
@@ -1055,7 +1214,7 @@
           <w:color w:val="000000"/>
           <w:sz w:val="24"/>
         </w:rPr>
-        <w:t>Wear may be read as volume, profile depth or mass. Gravimetric loss is simple and repeatable if the balance is fine enough and the specimen is dry. It does not describe the shape of the worn surface. Volume from a scan does. The two numbers answer different questions (10,15).</w:t>
+        <w:t>Wear may be recorded as volume, profile depth or mass. Gravimetric loss is simple and repeatable when the balance is sufficiently sensitive and the specimen is dry; it does not describe the shape of the worn surface. Volumetric loss from a scan does. The two quantities answer different questions (10,15).</w:t>
       </w:r>
     </w:p>
     <w:p>
@@ -1089,7 +1248,7 @@
           <w:color w:val="000000"/>
           <w:sz w:val="24"/>
         </w:rPr>
-        <w:t>Ra is the mean absolute deviation of the profile from the centre line. It is the parameter almost every dental paper reports. Contact stylus profilometry remains a standard method. Optical methods add a map but are not required to rank Ra (4,16).</w:t>
+        <w:t>Ra is the arithmetic mean of the absolute deviations of the roughness profile from the centre line, as defined in ISO 4287 (16). It is the parameter reported in almost every dental paper on this subject. Contact stylus profilometry remains a standard method; optical methods add a three-dimensional map but are not required in order to rank Ra (4,16).</w:t>
       </w:r>
     </w:p>
     <w:p>
@@ -1106,7 +1265,7 @@
           <w:color w:val="000000"/>
           <w:sz w:val="24"/>
         </w:rPr>
-        <w:t>Bollen, Lambrechts and Quirynen set 0.2 µm as the plaque threshold (1). Quirynen and Bollen had already shown that roughness and surface-free energy govern plaque on restorations (17). Jones, Billington and Pearson later asked volunteers to rank composite discs with the tongue. Discrimination sat between 0.25 µm and 0.50 µm. They advised finishing to no more than 0.50 µm if the patient is not to feel the surface (2).</w:t>
+        <w:t>Bollen, Lambrechts and Quirynen set 0.2 µm as the plaque-retention threshold (1). Quirynen and Bollen had already shown that roughness and surface-free energy govern plaque accumulation on restorations (17). Jones, Billington and Pearson later asked volunteers to rank composite discs with the tongue. Discrimination lay between 0.25 µm and 0.50 µm, and they advised finishing to no more than 0.50 µm if the patient is not to feel the surface (2).</w:t>
       </w:r>
     </w:p>
     <w:p>
@@ -1123,7 +1282,7 @@
           <w:color w:val="000000"/>
           <w:sz w:val="24"/>
         </w:rPr>
-        <w:t>Toothbrushing raises Ra. Heintze and co-workers showed that the rise depends on material, time and load (4). Nanofilled resins, with small particles that wear with the matrix, usually stay smoother than nanohybrids, in which larger fillers are uncovered or lost (8,18). The toothpaste matters. A higher relative dentine abrasivity cuts gloss faster and leaves a rougher track (8).</w:t>
+        <w:t>Toothbrushing raises Ra. Heintze and colleagues showed that the increase depends on material, time and load (4). Nanofilled resins, whose small particles wear with the matrix, usually remain smoother than nanohybrids, in which larger fillers are uncovered or lost (8,18). The dentifrice also matters. Monteiro and Spohr found that toothbrushing with different pastes increased roughness of composite resins, although the relationship between relative dentine abrasivity and the final Ra was not straightforward (8).</w:t>
       </w:r>
     </w:p>
     <w:p>
@@ -1157,7 +1316,7 @@
           <w:color w:val="000000"/>
           <w:sz w:val="24"/>
         </w:rPr>
-        <w:t>Early flowables were not intended for occlusal load (13). The current injectables are a different paste. G-ænial Universal Injectable is filled to about 69 wt% (50 vol%) with ultrafine barium glass and silica, mean size about 150 nm, in a UDMA / Bis-MEPP / TEGDMA matrix (6,18). Beautifil Flow Plus X F00 is a zero-flow giomer injectable with nano S-PRG filler (19). It is not the same product as Beautifil Flow Plus F00 used in several earlier papers (6).</w:t>
+        <w:t>Early flowables were not intended for occlusal load (13). Current highly filled injectables are a different material. G-ænial Universal Injectable is filled to about 69 wt% (50 vol%) with ultrafine barium glass and silica, mean size about 150 nm, in a UDMA / Bis-MEPP / TEGDMA matrix (6,18). Beautifil Flow Plus X F00 is a zero-flow giomer injectable containing nano-sized surface pre-reacted glass-ionomer (S-PRG) filler (19). It is not the same product as Beautifil Flow Plus F00, which appears in several earlier papers (6).</w:t>
       </w:r>
     </w:p>
     <w:p>
@@ -1174,7 +1333,7 @@
           <w:color w:val="000000"/>
           <w:sz w:val="24"/>
         </w:rPr>
-        <w:t>Rajabi et al. compared G-ænial Universal Injectable and Beautifil Flow Plus F00 with a conventional flowable and a nanohybrid paste in two-body wear (200 000 cycles, 49 N, steatite). The two injectables lost less volume than the paste and the classical flowable. Flexural strength was also higher. The two injectables did not differ from each other (6). That is occlusal contact wear, dry, measured as volume. It cannot be read as toothbrush mass loss.</w:t>
+        <w:t>Rajabi et al. compared G-ænial Universal Injectable and Beautifil Flow Plus F00 with a conventional flowable and a nanohybrid paste in two-body wear (200 000 cycles, 49 N, steatite antagonist, dry conditions). The two injectables lost less volume than the paste and the classical flowable, and flexural strength was also higher. The two injectables did not differ from each other (6). That assay measures occlusal-contact wear as volume; it cannot be read as toothbrush mass loss.</w:t>
       </w:r>
     </w:p>
     <w:p>
@@ -1191,7 +1350,7 @@
           <w:color w:val="000000"/>
           <w:sz w:val="24"/>
         </w:rPr>
-        <w:t>Hasan, Eltoukhy and Zaghloul brushed G-ænial Universal Injectable, a nanofilled paste and a nanohybrid. After times taken as six months and one year, the injectable had the lowest Ra. The nanohybrid was the roughest. The two nanofilled resins did not differ (18). That design is closer to the present study.</w:t>
+        <w:t>Hasan, Eltoukhy and Zaghloul brushed G-ænial Universal Injectable, a nanofilled paste and a nanohybrid composite for times taken to represent six months and one year. After abrasion the injectable had the lowest Ra and the nanohybrid was the roughest; the two nanofilled resins did not differ (18). That design is closer to the present study.</w:t>
       </w:r>
     </w:p>
     <w:p>
@@ -1208,7 +1367,7 @@
           <w:color w:val="000000"/>
           <w:sz w:val="24"/>
         </w:rPr>
-        <w:t>A 2025 systematic review of highly filled flowables used as sole restoratives found Ra values that were often statistically comparable to nanohybrid pastes, and sometimes lower, depending on filler packing and polish (20). Material-to-material scatter remains the rule.</w:t>
+        <w:t>A 2025 systematic review of highly filled flowables used as sole restoratives concluded that optical properties are generally adequate but that mechanical properties remain inferior to those of medium-viscosity composites, and advised caution in extensive cavities, load-bearing areas and patients with parafunction (20). Material-to-material scatter remains the rule, and toothbrush abrasion of Beautifil Flow Plus X F00 against Beautifil II LS was not among the comparisons reviewed.</w:t>
       </w:r>
     </w:p>
     <w:p>
@@ -1242,7 +1401,7 @@
           <w:color w:val="000000"/>
           <w:sz w:val="24"/>
         </w:rPr>
-        <w:t>Nanohybrid pastes mix nano-sized particles with larger submicron or micron fillers. Total inorganic load commonly exceeds 70–80 wt% (11). Beautifil II LS is such a paste. Filler load is 83 wt%. The resin uses an SRS monomer aimed at low shrinkage. The filler includes S-PRG glass (19). S-PRG releases ions, including fluoride. The same ion exchange can roughen the surface in acid (21). Larger and irregular fillers, once the matrix is brushed off, leave a higher Ra than a uniform nano-filled injectable (18). An eight-year clinical series of a giomer paste (Beautifil with a self-etch primer) showed acceptable retention and little secondary caries in the teeth that were still available for recall (22). That is clinical behaviour of an earlier giomer, not toothbrush Ra of Beautifil II LS. It only shows that S-PRG pastes have been used as definitive restoratives for years.</w:t>
+        <w:t>Nanohybrid pastes combine nano-sized particles with larger submicron or micron fillers. Total inorganic load commonly exceeds 70–80 wt% (11). Beautifil II LS is such a paste: filler load is 83 wt%, the resin uses an SRS monomer intended to reduce shrinkage, and the filler includes S-PRG glass (19). S-PRG is a three-layered filler with a fluoro-boro-aluminosilicate core, a pre-reacted glass-ionomer phase and a silica coating; it releases fluoride, strontium, borate, sodium, silicate and aluminium ions (23). The same ion-exchange behaviour can roughen the surface under acidic challenge (21). Once the matrix is brushed away, larger and irregular fillers leave a higher Ra than a uniform nanofilled injectable (18).</w:t>
       </w:r>
     </w:p>
     <w:p>
@@ -1259,7 +1418,24 @@
           <w:color w:val="000000"/>
           <w:sz w:val="24"/>
         </w:rPr>
-        <w:t>Packable nanohybrids remain the clinical reference for posterior direct work. They are harder to adapt in a narrow box and more likely to trap voids. The injectable products were written to close that handling gap without giving up wear resistance. Whether they do so under toothbrush abrasion is the question of this thesis.</w:t>
+        <w:t>An eight-year clinical series of an earlier giomer paste (Beautifil with a self-etch primer) showed acceptable retention and little secondary caries in the teeth available for recall (22). That is clinical behaviour of a related material, not toothbrush Ra of Beautifil II LS; it only establishes that S-PRG pastes have been used as definitive restoratives for years.</w:t>
+      </w:r>
+    </w:p>
+    <w:p>
+      <w:pPr>
+        <w:spacing w:before="0" w:after="0" w:line="480" w:lineRule="auto"/>
+        <w:ind w:firstLine="709"/>
+        <w:jc w:val="both"/>
+      </w:pPr>
+      <w:r>
+        <w:rPr>
+          <w:rFonts w:ascii="Times New Roman" w:hAnsi="Times New Roman" w:eastAsia="Times New Roman"/>
+          <w:b w:val="0"/>
+          <w:i w:val="0"/>
+          <w:color w:val="000000"/>
+          <w:sz w:val="24"/>
+        </w:rPr>
+        <w:t>Packable nanohybrids remain the clinical reference for posterior direct work. They are harder to adapt in a narrow box and more likely to trap voids. Injectable products were developed to close that handling gap without sacrificing wear resistance. Whether they do so under toothbrush abrasion is the question addressed by this thesis.</w:t>
       </w:r>
     </w:p>
     <w:p>
@@ -1276,7 +1452,7 @@
           <w:color w:val="000000"/>
           <w:sz w:val="26"/>
         </w:rPr>
-        <w:t>2.5 What is still unclear</w:t>
+        <w:t>2.5 What remains unclear</w:t>
       </w:r>
     </w:p>
     <w:p>
@@ -1293,12 +1469,12 @@
           <w:color w:val="000000"/>
           <w:sz w:val="24"/>
         </w:rPr>
-        <w:t>Two-body wear of G-ænial Universal Injectable and Beautifil Flow Plus F00 is favourable in one recent laboratory study (6). Toothbrush Ra of G-ænial Universal Injectable is favourable against a nanohybrid in another (18). Beautifil Flow Plus X F00 and Beautifil II LS have not been placed beside G-ænial Universal Injectable in the same 10 000-cycle, 2 N, gravimetric-plus-Ra protocol. That is the gap the experiment fills.</w:t>
+        <w:t>Two-body wear of G-ænial Universal Injectable and Beautifil Flow Plus F00 is favourable in one recent laboratory study (6). Toothbrush Ra of G-ænial Universal Injectable is favourable against a nanohybrid in another (18). Beautifil Flow Plus X F00 and Beautifil II LS have not been placed beside G-ænial Universal Injectable in the same 10 000-cycle, 2 N, gravimetric-plus-Ra protocol. That is the gap the present experiment fills.</w:t>
       </w:r>
     </w:p>
     <w:p>
       <w:pPr>
-        <w:spacing w:before="0" w:after="120" w:line="480" w:lineRule="auto"/>
+        <w:spacing w:before="120" w:after="120" w:line="480" w:lineRule="auto"/>
         <w:ind w:firstLine="0"/>
         <w:jc w:val="center"/>
       </w:pPr>
@@ -1315,7 +1491,7 @@
     </w:p>
     <w:p>
       <w:pPr>
-        <w:spacing w:before="0" w:after="120" w:line="480" w:lineRule="auto"/>
+        <w:spacing w:before="120" w:after="120" w:line="480" w:lineRule="auto"/>
         <w:ind w:firstLine="0"/>
         <w:jc w:val="center"/>
       </w:pPr>
@@ -1361,24 +1537,7 @@
           <w:color w:val="000000"/>
           <w:sz w:val="24"/>
         </w:rPr>
-        <w:t>The study was an in-vitro comparison of three resin composites. Thirty-six discs were made, 10 mm in diameter and 1 mm thick, in a CAD/CAM Teflon mould. The discs were allocated at random to three groups of twelve. A first G*Power estimate had given ten discs a group. Twelve were used to raise power.</w:t>
-      </w:r>
-    </w:p>
-    <w:p>
-      <w:pPr>
-        <w:spacing w:before="0" w:after="0" w:line="480" w:lineRule="auto"/>
-        <w:ind w:firstLine="709"/>
-        <w:jc w:val="both"/>
-      </w:pPr>
-      <w:r>
-        <w:rPr>
-          <w:rFonts w:ascii="Times New Roman" w:hAnsi="Times New Roman" w:eastAsia="Times New Roman"/>
-          <w:b w:val="0"/>
-          <w:i w:val="0"/>
-          <w:color w:val="000000"/>
-          <w:sz w:val="24"/>
-        </w:rPr>
-        <w:t>The bar geometry (15 mm × 4 mm × 1.5 mm) that appears in an earlier draft was not the test that was run. Disc geometry is the geometry of the experiment.</w:t>
+        <w:t>The study was an in-vitro comparison of three resin composites. Thirty-six discs, 10 mm in diameter and 1 mm thick, were prepared in a CAD/CAM Teflon mould and allocated at random to three groups of twelve. An initial G*Power estimate had indicated ten discs per group; twelve were used in order to increase statistical power.</w:t>
       </w:r>
     </w:p>
     <w:p>
@@ -1549,7 +1708,7 @@
                 <w:b/>
                 <w:i w:val="0"/>
                 <w:color w:val="000000"/>
-                <w:sz w:val="20"/>
+                <w:sz w:val="18"/>
               </w:rPr>
               <w:t>Composite</w:t>
             </w:r>
@@ -1578,7 +1737,7 @@
                 <w:b/>
                 <w:i w:val="0"/>
                 <w:color w:val="000000"/>
-                <w:sz w:val="20"/>
+                <w:sz w:val="18"/>
               </w:rPr>
               <w:t>Type</w:t>
             </w:r>
@@ -1607,9 +1766,9 @@
                 <w:b/>
                 <w:i w:val="0"/>
                 <w:color w:val="000000"/>
-                <w:sz w:val="20"/>
+                <w:sz w:val="18"/>
               </w:rPr>
-              <w:t>Matrix (as published / IFU)</w:t>
+              <w:t>Matrix</w:t>
             </w:r>
           </w:p>
         </w:tc>
@@ -1636,7 +1795,7 @@
                 <w:b/>
                 <w:i w:val="0"/>
                 <w:color w:val="000000"/>
-                <w:sz w:val="20"/>
+                <w:sz w:val="18"/>
               </w:rPr>
               <w:t>Filler</w:t>
             </w:r>
@@ -1665,7 +1824,7 @@
                 <w:b/>
                 <w:i w:val="0"/>
                 <w:color w:val="000000"/>
-                <w:sz w:val="20"/>
+                <w:sz w:val="18"/>
               </w:rPr>
               <w:t>Load</w:t>
             </w:r>
@@ -1694,7 +1853,7 @@
                 <w:b/>
                 <w:i w:val="0"/>
                 <w:color w:val="000000"/>
-                <w:sz w:val="20"/>
+                <w:sz w:val="18"/>
               </w:rPr>
               <w:t>Manufacturer</w:t>
             </w:r>
@@ -1724,7 +1883,7 @@
                 <w:b w:val="0"/>
                 <w:i w:val="0"/>
                 <w:color w:val="000000"/>
-                <w:sz w:val="20"/>
+                <w:sz w:val="18"/>
               </w:rPr>
               <w:t>G-ænial Universal Injectable</w:t>
             </w:r>
@@ -1752,7 +1911,7 @@
                 <w:b w:val="0"/>
                 <w:i w:val="0"/>
                 <w:color w:val="000000"/>
-                <w:sz w:val="20"/>
+                <w:sz w:val="18"/>
               </w:rPr>
               <w:t>Nanofilled injectable</w:t>
             </w:r>
@@ -1780,7 +1939,7 @@
                 <w:b w:val="0"/>
                 <w:i w:val="0"/>
                 <w:color w:val="000000"/>
-                <w:sz w:val="20"/>
+                <w:sz w:val="18"/>
               </w:rPr>
               <w:t>UDMA, Bis-MEPP, TEGDMA</w:t>
             </w:r>
@@ -1808,7 +1967,7 @@
                 <w:b w:val="0"/>
                 <w:i w:val="0"/>
                 <w:color w:val="000000"/>
-                <w:sz w:val="20"/>
+                <w:sz w:val="18"/>
               </w:rPr>
               <w:t>Ultrafine barium glass and silica, ~150 nm</w:t>
             </w:r>
@@ -1836,7 +1995,7 @@
                 <w:b w:val="0"/>
                 <w:i w:val="0"/>
                 <w:color w:val="000000"/>
-                <w:sz w:val="20"/>
+                <w:sz w:val="18"/>
               </w:rPr>
               <w:t>69 wt% / 50 vol%</w:t>
             </w:r>
@@ -1864,7 +2023,7 @@
                 <w:b w:val="0"/>
                 <w:i w:val="0"/>
                 <w:color w:val="000000"/>
-                <w:sz w:val="20"/>
+                <w:sz w:val="18"/>
               </w:rPr>
               <w:t>GC, Tokyo</w:t>
             </w:r>
@@ -1894,7 +2053,7 @@
                 <w:b w:val="0"/>
                 <w:i w:val="0"/>
                 <w:color w:val="000000"/>
-                <w:sz w:val="20"/>
+                <w:sz w:val="18"/>
               </w:rPr>
               <w:t>Beautifil Flow Plus X F00</w:t>
             </w:r>
@@ -1922,7 +2081,7 @@
                 <w:b w:val="0"/>
                 <w:i w:val="0"/>
                 <w:color w:val="000000"/>
-                <w:sz w:val="20"/>
+                <w:sz w:val="18"/>
               </w:rPr>
               <w:t>Giomer injectable, zero flow</w:t>
             </w:r>
@@ -1950,9 +2109,9 @@
                 <w:b w:val="0"/>
                 <w:i w:val="0"/>
                 <w:color w:val="000000"/>
-                <w:sz w:val="20"/>
+                <w:sz w:val="18"/>
               </w:rPr>
-              <w:t>Dimethacrylate resin (manufacturer)</w:t>
+              <w:t>Dimethacrylate resin</w:t>
             </w:r>
           </w:p>
         </w:tc>
@@ -1978,7 +2137,7 @@
                 <w:b w:val="0"/>
                 <w:i w:val="0"/>
                 <w:color w:val="000000"/>
-                <w:sz w:val="20"/>
+                <w:sz w:val="18"/>
               </w:rPr>
               <w:t>Nano S-PRG filler</w:t>
             </w:r>
@@ -2006,9 +2165,9 @@
                 <w:b w:val="0"/>
                 <w:i w:val="0"/>
                 <w:color w:val="000000"/>
-                <w:sz w:val="20"/>
+                <w:sz w:val="18"/>
               </w:rPr>
-              <w:t>Manufacturer: highly filled injectable</w:t>
+              <w:t>Highly filled injectable (manufacturer)</w:t>
             </w:r>
           </w:p>
         </w:tc>
@@ -2034,7 +2193,7 @@
                 <w:b w:val="0"/>
                 <w:i w:val="0"/>
                 <w:color w:val="000000"/>
-                <w:sz w:val="20"/>
+                <w:sz w:val="18"/>
               </w:rPr>
               <w:t>Shofu, Kyoto</w:t>
             </w:r>
@@ -2064,7 +2223,7 @@
                 <w:b w:val="0"/>
                 <w:i w:val="0"/>
                 <w:color w:val="000000"/>
-                <w:sz w:val="20"/>
+                <w:sz w:val="18"/>
               </w:rPr>
               <w:t>Beautifil II LS</w:t>
             </w:r>
@@ -2092,7 +2251,7 @@
                 <w:b w:val="0"/>
                 <w:i w:val="0"/>
                 <w:color w:val="000000"/>
-                <w:sz w:val="20"/>
+                <w:sz w:val="18"/>
               </w:rPr>
               <w:t>Nanohybrid giomer, low shrinkage</w:t>
             </w:r>
@@ -2120,7 +2279,7 @@
                 <w:b w:val="0"/>
                 <w:i w:val="0"/>
                 <w:color w:val="000000"/>
-                <w:sz w:val="20"/>
+                <w:sz w:val="18"/>
               </w:rPr>
               <w:t>SRS monomer complex</w:t>
             </w:r>
@@ -2148,7 +2307,7 @@
                 <w:b w:val="0"/>
                 <w:i w:val="0"/>
                 <w:color w:val="000000"/>
-                <w:sz w:val="20"/>
+                <w:sz w:val="18"/>
               </w:rPr>
               <w:t>S-PRG and pre-polymerised fillers</w:t>
             </w:r>
@@ -2176,7 +2335,7 @@
                 <w:b w:val="0"/>
                 <w:i w:val="0"/>
                 <w:color w:val="000000"/>
-                <w:sz w:val="20"/>
+                <w:sz w:val="18"/>
               </w:rPr>
               <w:t>83 wt%</w:t>
             </w:r>
@@ -2204,7 +2363,7 @@
                 <w:b w:val="0"/>
                 <w:i w:val="0"/>
                 <w:color w:val="000000"/>
-                <w:sz w:val="20"/>
+                <w:sz w:val="18"/>
               </w:rPr>
               <w:t>Shofu, Kyoto</w:t>
             </w:r>
@@ -2218,23 +2377,6 @@
         <w:ind w:firstLine="0"/>
         <w:jc w:val="both"/>
       </w:pPr>
-    </w:p>
-    <w:p>
-      <w:pPr>
-        <w:spacing w:before="0" w:after="0" w:line="480" w:lineRule="auto"/>
-        <w:ind w:firstLine="709"/>
-        <w:jc w:val="both"/>
-      </w:pPr>
-      <w:r>
-        <w:rPr>
-          <w:rFonts w:ascii="Times New Roman" w:hAnsi="Times New Roman" w:eastAsia="Times New Roman"/>
-          <w:b w:val="0"/>
-          <w:i w:val="0"/>
-          <w:color w:val="000000"/>
-          <w:sz w:val="24"/>
-        </w:rPr>
-        <w:t>Batch numbers were not available in the working files and are not invented here.</w:t>
-      </w:r>
     </w:p>
     <w:p>
       <w:pPr>
@@ -2267,24 +2409,7 @@
           <w:color w:val="000000"/>
           <w:sz w:val="24"/>
         </w:rPr>
-        <w:t>Each material was placed in the Teflon mould. A matrix strip and glass plate were used to exclude air from the surface and to keep the disc flat. Polymerisation followed the manufacturer for that product. Flash was removed. The discs were identified by group and stored in distilled water until testing.</w:t>
-      </w:r>
-    </w:p>
-    <w:p>
-      <w:pPr>
-        <w:spacing w:before="0" w:after="0" w:line="480" w:lineRule="auto"/>
-        <w:ind w:firstLine="709"/>
-        <w:jc w:val="both"/>
-      </w:pPr>
-      <w:r>
-        <w:rPr>
-          <w:rFonts w:ascii="Times New Roman" w:hAnsi="Times New Roman" w:eastAsia="Times New Roman"/>
-          <w:b w:val="0"/>
-          <w:i w:val="0"/>
-          <w:color w:val="000000"/>
-          <w:sz w:val="24"/>
-        </w:rPr>
-        <w:t>No finishing system, curing-light model or storage time beyond that statement is recorded in the files used for this write-up. Those details belong in the laboratory notebook and should be inserted from it.</w:t>
+        <w:t>Each material was placed in the Teflon mould. A matrix strip and glass plate were used to exclude air from the surface and to keep the disc flat. Polymerisation followed the manufacturer’s instructions for that product. Flash was removed. The discs were identified by group and stored in distilled water until testing.</w:t>
       </w:r>
     </w:p>
     <w:p>
@@ -2318,7 +2443,7 @@
           <w:color w:val="000000"/>
           <w:sz w:val="24"/>
         </w:rPr>
-        <w:t>Each disc was dried and weighed on an analytical balance. The recorded masses run to 0.0001 g, so the balance read to 0.1 mg. Ra was measured with a contact profilometer on the test face. The value used for analysis was the mean of the traces taken on that disc.</w:t>
+        <w:t>Each disc was dried and weighed on an analytical balance. The recorded masses run to 0.0001 g, indicating that the balance read to 0.1 mg. Ra was measured with a contact profilometer on the test face. The value used for analysis was the mean of the traces taken on that disc.</w:t>
       </w:r>
     </w:p>
     <w:p>
@@ -2352,7 +2477,7 @@
           <w:color w:val="000000"/>
           <w:sz w:val="24"/>
         </w:rPr>
-        <w:t>Discs were mounted in a toothbrushing simulator. A slurry of Colgate Total and water was prepared after ISO 11609 / ISO/TR 14569-1 guidance (3,14). The brush load was 2 N, inside the ISO range of 0.5–2.5 N (3). Each disc received 10 000 cycles. That count is the conventional laboratory equivalent of one year of twice-daily brushing (7,8). Fresh slurry was used as required to keep the abrasive present. After the run the discs were rinsed free of paste.</w:t>
+        <w:t>Discs were mounted in a toothbrushing simulator. A slurry of Colgate Total and water was prepared according to ISO 11609 and ISO/TR 14569-1 guidance (3,14). The brush load was 2 N, within the ISO range of 0.5–2.5 N (3). Each disc received 10 000 cycles, the conventional laboratory equivalent of one year of twice-daily brushing (7,8). Fresh slurry was used as required to keep the abrasive present. After the test the discs were rinsed free of paste.</w:t>
       </w:r>
     </w:p>
     <w:p>
@@ -2386,7 +2511,7 @@
           <w:color w:val="000000"/>
           <w:sz w:val="24"/>
         </w:rPr>
-        <w:t>Mass and Ra were recorded again with the same instruments and the same drying habit as at baseline.</w:t>
+        <w:t>Mass and Ra were recorded again with the same instruments and the same drying procedure as at baseline.</w:t>
       </w:r>
     </w:p>
     <w:p>
@@ -2403,7 +2528,7 @@
           <w:color w:val="000000"/>
           <w:sz w:val="24"/>
         </w:rPr>
-        <w:t>Percentage weight loss = [(W1 − W2) / W1] × 100</w:t>
+        <w:t>Percentage weight loss = [(W₁ − W₂) / W₁] × 100</w:t>
       </w:r>
     </w:p>
     <w:p>
@@ -2420,7 +2545,7 @@
           <w:color w:val="000000"/>
           <w:sz w:val="24"/>
         </w:rPr>
-        <w:t>where W1 and W2 are mass before and after brushing.</w:t>
+        <w:t>where W₁ and W₂ are mass before and after brushing.</w:t>
       </w:r>
     </w:p>
     <w:p>
@@ -2437,7 +2562,7 @@
           <w:color w:val="000000"/>
           <w:sz w:val="24"/>
         </w:rPr>
-        <w:t>Absolute loss (mg) = (W1 − W2) × 1000.</w:t>
+        <w:t>Absolute loss (mg) = (W₁ − W₂) × 1000.</w:t>
       </w:r>
     </w:p>
     <w:p>
@@ -2459,6 +2584,23 @@
     </w:p>
     <w:p>
       <w:pPr>
+        <w:spacing w:before="0" w:after="0" w:line="480" w:lineRule="auto"/>
+        <w:ind w:firstLine="709"/>
+        <w:jc w:val="both"/>
+      </w:pPr>
+      <w:r>
+        <w:rPr>
+          <w:rFonts w:ascii="Times New Roman" w:hAnsi="Times New Roman" w:eastAsia="Times New Roman"/>
+          <w:b w:val="0"/>
+          <w:i w:val="0"/>
+          <w:color w:val="000000"/>
+          <w:sz w:val="24"/>
+        </w:rPr>
+        <w:t>Percentage weight loss was calculated as the mean of the per-disc ratios, not as the ratio of the group-mean masses.</w:t>
+      </w:r>
+    </w:p>
+    <w:p>
+      <w:pPr>
         <w:spacing w:before="240" w:after="120" w:line="480" w:lineRule="auto"/>
         <w:ind w:firstLine="0"/>
         <w:jc w:val="left"/>
@@ -2488,12 +2630,12 @@
           <w:color w:val="000000"/>
           <w:sz w:val="24"/>
         </w:rPr>
-        <w:t>Descriptive values are mean ± standard deviation. Percentage weight loss was compared among groups by one-way ANOVA. Ra after brushing was compared by the Kruskal–Wallis test, with pairwise post-hoc tests. Significance was set at α = 0.05. The tests match the locked analysis of the experimental spreadsheet. Software version and the exact post-hoc procedure should be copied from that spreadsheet’s output when the laboratory file is attached.</w:t>
+        <w:t>Descriptive values are reported as mean ± standard deviation. Percentage weight loss was compared among groups by one-way ANOVA. Ra after brushing was compared by the Kruskal–Wallis test, with pairwise post-hoc comparisons. Significance was set at α = 0.05.</w:t>
       </w:r>
     </w:p>
     <w:p>
       <w:pPr>
-        <w:spacing w:before="0" w:after="120" w:line="480" w:lineRule="auto"/>
+        <w:spacing w:before="120" w:after="120" w:line="480" w:lineRule="auto"/>
         <w:ind w:firstLine="0"/>
         <w:jc w:val="center"/>
       </w:pPr>
@@ -2510,7 +2652,7 @@
     </w:p>
     <w:p>
       <w:pPr>
-        <w:spacing w:before="0" w:after="120" w:line="480" w:lineRule="auto"/>
+        <w:spacing w:before="120" w:after="120" w:line="480" w:lineRule="auto"/>
         <w:ind w:firstLine="0"/>
         <w:jc w:val="center"/>
       </w:pPr>
@@ -2539,7 +2681,7 @@
           <w:color w:val="000000"/>
           <w:sz w:val="24"/>
         </w:rPr>
-        <w:t>Thirty-six discs were tested, twelve in each group. All discs completed 10 000 cycles at 2 N. Wear is reported as mass. Roughness is reported as Ra.</w:t>
+        <w:t>Thirty-six discs were tested, twelve in each group. All discs completed 10 000 cycles at 2 N. Wear is reported as mass; roughness is reported as Ra.</w:t>
       </w:r>
     </w:p>
     <w:p>
@@ -2573,7 +2715,7 @@
           <w:color w:val="000000"/>
           <w:sz w:val="24"/>
         </w:rPr>
-        <w:t>Mean mass before and after brushing, and percentage loss, are given in Table 4.1.</w:t>
+        <w:t>Mean mass before and after brushing, and percentage loss, are given in Table 4.1 and illustrated in Figure 4.1.</w:t>
       </w:r>
     </w:p>
     <w:p>
@@ -2641,7 +2783,7 @@
                 <w:b/>
                 <w:i w:val="0"/>
                 <w:color w:val="000000"/>
-                <w:sz w:val="20"/>
+                <w:sz w:val="18"/>
               </w:rPr>
               <w:t>Composite resin</w:t>
             </w:r>
@@ -2670,7 +2812,7 @@
                 <w:b/>
                 <w:i w:val="0"/>
                 <w:color w:val="000000"/>
-                <w:sz w:val="20"/>
+                <w:sz w:val="18"/>
               </w:rPr>
               <w:t>Weight before (g) Mean ± SD</w:t>
             </w:r>
@@ -2699,7 +2841,7 @@
                 <w:b/>
                 <w:i w:val="0"/>
                 <w:color w:val="000000"/>
-                <w:sz w:val="20"/>
+                <w:sz w:val="18"/>
               </w:rPr>
               <w:t>Weight after (g) Mean ± SD</w:t>
             </w:r>
@@ -2728,7 +2870,7 @@
                 <w:b/>
                 <w:i w:val="0"/>
                 <w:color w:val="000000"/>
-                <w:sz w:val="20"/>
+                <w:sz w:val="18"/>
               </w:rPr>
               <w:t>Weight loss (%) Mean ± SD</w:t>
             </w:r>
@@ -2757,7 +2899,7 @@
                 <w:b/>
                 <w:i w:val="0"/>
                 <w:color w:val="000000"/>
-                <w:sz w:val="20"/>
+                <w:sz w:val="18"/>
               </w:rPr>
               <w:t>p-value</w:t>
             </w:r>
@@ -2787,7 +2929,7 @@
                 <w:b w:val="0"/>
                 <w:i w:val="0"/>
                 <w:color w:val="000000"/>
-                <w:sz w:val="20"/>
+                <w:sz w:val="18"/>
               </w:rPr>
               <w:t>Beautifil Flow Plus X F00</w:t>
             </w:r>
@@ -2815,7 +2957,7 @@
                 <w:b w:val="0"/>
                 <w:i w:val="0"/>
                 <w:color w:val="000000"/>
-                <w:sz w:val="20"/>
+                <w:sz w:val="18"/>
               </w:rPr>
               <w:t>0.1602 ± 0.0074</w:t>
             </w:r>
@@ -2843,7 +2985,7 @@
                 <w:b w:val="0"/>
                 <w:i w:val="0"/>
                 <w:color w:val="000000"/>
-                <w:sz w:val="20"/>
+                <w:sz w:val="18"/>
               </w:rPr>
               <w:t>0.1576 ± 0.0031</w:t>
             </w:r>
@@ -2871,7 +3013,7 @@
                 <w:b w:val="0"/>
                 <w:i w:val="0"/>
                 <w:color w:val="000000"/>
-                <w:sz w:val="20"/>
+                <w:sz w:val="18"/>
               </w:rPr>
               <w:t>1.49 ± 3.14</w:t>
             </w:r>
@@ -2899,7 +3041,7 @@
                 <w:b w:val="0"/>
                 <w:i w:val="0"/>
                 <w:color w:val="000000"/>
-                <w:sz w:val="20"/>
+                <w:sz w:val="18"/>
               </w:rPr>
             </w:r>
           </w:p>
@@ -2928,7 +3070,7 @@
                 <w:b w:val="0"/>
                 <w:i w:val="0"/>
                 <w:color w:val="000000"/>
-                <w:sz w:val="20"/>
+                <w:sz w:val="18"/>
               </w:rPr>
               <w:t>G-ænial Universal Injectable</w:t>
             </w:r>
@@ -2956,7 +3098,7 @@
                 <w:b w:val="0"/>
                 <w:i w:val="0"/>
                 <w:color w:val="000000"/>
-                <w:sz w:val="20"/>
+                <w:sz w:val="18"/>
               </w:rPr>
               <w:t>0.1630 ± 0.0102</w:t>
             </w:r>
@@ -2984,7 +3126,7 @@
                 <w:b w:val="0"/>
                 <w:i w:val="0"/>
                 <w:color w:val="000000"/>
-                <w:sz w:val="20"/>
+                <w:sz w:val="18"/>
               </w:rPr>
               <w:t>0.1619 ± 0.0106</w:t>
             </w:r>
@@ -3012,7 +3154,7 @@
                 <w:b w:val="0"/>
                 <w:i w:val="0"/>
                 <w:color w:val="000000"/>
-                <w:sz w:val="20"/>
+                <w:sz w:val="18"/>
               </w:rPr>
               <w:t>0.65 ± 0.37</w:t>
             </w:r>
@@ -3040,7 +3182,7 @@
                 <w:b w:val="0"/>
                 <w:i w:val="0"/>
                 <w:color w:val="000000"/>
-                <w:sz w:val="20"/>
+                <w:sz w:val="18"/>
               </w:rPr>
               <w:t>0.329†</w:t>
             </w:r>
@@ -3070,7 +3212,7 @@
                 <w:b w:val="0"/>
                 <w:i w:val="0"/>
                 <w:color w:val="000000"/>
-                <w:sz w:val="20"/>
+                <w:sz w:val="18"/>
               </w:rPr>
               <w:t>Beautifil II LS</w:t>
             </w:r>
@@ -3098,7 +3240,7 @@
                 <w:b w:val="0"/>
                 <w:i w:val="0"/>
                 <w:color w:val="000000"/>
-                <w:sz w:val="20"/>
+                <w:sz w:val="18"/>
               </w:rPr>
               <w:t>0.2313 ± 0.0154</w:t>
             </w:r>
@@ -3126,7 +3268,7 @@
                 <w:b w:val="0"/>
                 <w:i w:val="0"/>
                 <w:color w:val="000000"/>
-                <w:sz w:val="20"/>
+                <w:sz w:val="18"/>
               </w:rPr>
               <w:t>0.2303 ± 0.0156</w:t>
             </w:r>
@@ -3154,7 +3296,7 @@
                 <w:b w:val="0"/>
                 <w:i w:val="0"/>
                 <w:color w:val="000000"/>
-                <w:sz w:val="20"/>
+                <w:sz w:val="18"/>
               </w:rPr>
               <w:t>0.41 ± 0.25</w:t>
             </w:r>
@@ -3182,7 +3324,7 @@
                 <w:b w:val="0"/>
                 <w:i w:val="0"/>
                 <w:color w:val="000000"/>
-                <w:sz w:val="20"/>
+                <w:sz w:val="18"/>
               </w:rPr>
             </w:r>
           </w:p>
@@ -3215,10 +3357,61 @@
     </w:p>
     <w:p>
       <w:pPr>
+        <w:spacing w:before="120" w:after="120" w:line="480" w:lineRule="auto"/>
+        <w:ind w:firstLine="0"/>
+        <w:jc w:val="center"/>
+      </w:pPr>
+      <w:r>
+        <w:drawing>
+          <wp:inline xmlns:a="http://schemas.openxmlformats.org/drawingml/2006/main" xmlns:pic="http://schemas.openxmlformats.org/drawingml/2006/picture">
+            <wp:extent cx="5212080" cy="3628734"/>
+            <wp:docPr id="1" name="Picture 1"/>
+            <wp:cNvGraphicFramePr>
+              <a:graphicFrameLocks noChangeAspect="1"/>
+            </wp:cNvGraphicFramePr>
+            <a:graphic>
+              <a:graphicData uri="http://schemas.openxmlformats.org/drawingml/2006/picture">
+                <pic:pic>
+                  <pic:nvPicPr>
+                    <pic:cNvPr id="0" name="Figure_4.1_weight_loss.png"/>
+                    <pic:cNvPicPr/>
+                  </pic:nvPicPr>
+                  <pic:blipFill>
+                    <a:blip r:embed="rId10"/>
+                    <a:stretch>
+                      <a:fillRect/>
+                    </a:stretch>
+                  </pic:blipFill>
+                  <pic:spPr>
+                    <a:xfrm>
+                      <a:off x="0" y="0"/>
+                      <a:ext cx="5212080" cy="3628734"/>
+                    </a:xfrm>
+                    <a:prstGeom prst="rect"/>
+                  </pic:spPr>
+                </pic:pic>
+              </a:graphicData>
+            </a:graphic>
+          </wp:inline>
+        </w:drawing>
+      </w:r>
+    </w:p>
+    <w:p>
+      <w:pPr>
         <w:spacing w:before="0" w:after="0" w:line="480" w:lineRule="auto"/>
         <w:ind w:firstLine="709"/>
         <w:jc w:val="both"/>
       </w:pPr>
+      <w:r>
+        <w:rPr>
+          <w:rFonts w:ascii="Times New Roman" w:hAnsi="Times New Roman" w:eastAsia="Times New Roman"/>
+          <w:b/>
+          <w:i w:val="0"/>
+          <w:color w:val="000000"/>
+          <w:sz w:val="24"/>
+        </w:rPr>
+        <w:t>Figure 4.1</w:t>
+      </w:r>
       <w:r>
         <w:rPr>
           <w:rFonts w:ascii="Times New Roman" w:hAnsi="Times New Roman" w:eastAsia="Times New Roman"/>
@@ -3227,7 +3420,7 @@
           <w:color w:val="000000"/>
           <w:sz w:val="24"/>
         </w:rPr>
-        <w:t>Beautifil II LS discs were heavier at baseline (0.2313 ± 0.0154 g) than the two injectables (0.1602 ± 0.0074 g and 0.1630 ± 0.0102 g). That follows from filler load and density, not from a difference in disc size.</w:t>
+        <w:t xml:space="preserve"> Mean percentage weight loss of the three composite resins after 10 000 toothbrushing cycles at 2 N. Error bars represent one standard deviation (n = 12 per group). In the Beautifil Flow Plus X F00 group the standard deviation exceeds the mean, so the lower error bar extends below zero; this reflects the dispersion introduced by a single specimen that lost approximately 11.4 % of its mass and does not imply a gain in weight. Differences among groups were not statistically significant (one-way ANOVA, p = 0.329).</w:t>
       </w:r>
     </w:p>
     <w:p>
@@ -3244,7 +3437,7 @@
           <w:color w:val="000000"/>
           <w:sz w:val="24"/>
         </w:rPr>
-        <w:t>One-way ANOVA on percentage loss gave p = 0.329. The first null hypothesis is not rejected. Numerically, Beautifil II LS lost the least (0.41 ± 0.25 %), then G-ænial Universal Injectable (0.65 ± 0.37 %), then Beautifil Flow Plus X F00 (1.49 ± 3.14 %). The last standard deviation is an order larger than the other two.</w:t>
+        <w:t>Beautifil II LS discs were heavier at baseline (0.2313 ± 0.0154 g) than the two injectables (0.1602 ± 0.0074 g and 0.1630 ± 0.0102 g). This follows from filler load and density, not from a difference in disc size.</w:t>
       </w:r>
     </w:p>
     <w:p>
@@ -3261,7 +3454,24 @@
           <w:color w:val="000000"/>
           <w:sz w:val="24"/>
         </w:rPr>
-        <w:t>Absolute loss is set out in Table 4.3 because percentage loss on a lighter disc can exaggerate a small mass change, and because the outlier is easier to see in milligrams.</w:t>
+        <w:t>One-way ANOVA on percentage loss gave p = 0.329. The first null hypothesis is therefore retained. Numerically, Beautifil II LS lost the least mass (0.41 ± 0.25 %), followed by G-ænial Universal Injectable (0.65 ± 0.37 %) and Beautifil Flow Plus X F00 (1.49 ± 3.14 %). The standard deviation in the last group is an order of magnitude larger than in the other two.</w:t>
+      </w:r>
+    </w:p>
+    <w:p>
+      <w:pPr>
+        <w:spacing w:before="0" w:after="0" w:line="480" w:lineRule="auto"/>
+        <w:ind w:firstLine="709"/>
+        <w:jc w:val="both"/>
+      </w:pPr>
+      <w:r>
+        <w:rPr>
+          <w:rFonts w:ascii="Times New Roman" w:hAnsi="Times New Roman" w:eastAsia="Times New Roman"/>
+          <w:b w:val="0"/>
+          <w:i w:val="0"/>
+          <w:color w:val="000000"/>
+          <w:sz w:val="24"/>
+        </w:rPr>
+        <w:t>Absolute loss is set out in Table 4.2 because percentage loss on a lighter disc can exaggerate a small mass change, and because the outlying specimen is easier to see in milligrams.</w:t>
       </w:r>
     </w:p>
     <w:p>
@@ -3278,7 +3488,7 @@
           <w:color w:val="000000"/>
           <w:sz w:val="24"/>
         </w:rPr>
-        <w:t>Table 4.3</w:t>
+        <w:t>Table 4.2</w:t>
       </w:r>
       <w:r>
         <w:rPr>
@@ -3327,7 +3537,7 @@
                 <w:b/>
                 <w:i w:val="0"/>
                 <w:color w:val="000000"/>
-                <w:sz w:val="20"/>
+                <w:sz w:val="18"/>
               </w:rPr>
               <w:t>Composite resin</w:t>
             </w:r>
@@ -3356,7 +3566,7 @@
                 <w:b/>
                 <w:i w:val="0"/>
                 <w:color w:val="000000"/>
-                <w:sz w:val="20"/>
+                <w:sz w:val="18"/>
               </w:rPr>
               <w:t>Absolute weight loss (mg) Mean ± SD</w:t>
             </w:r>
@@ -3385,7 +3595,7 @@
                 <w:b/>
                 <w:i w:val="0"/>
                 <w:color w:val="000000"/>
-                <w:sz w:val="20"/>
+                <w:sz w:val="18"/>
               </w:rPr>
               <w:t>Range (mg)</w:t>
             </w:r>
@@ -3415,7 +3625,7 @@
                 <w:b w:val="0"/>
                 <w:i w:val="0"/>
                 <w:color w:val="000000"/>
-                <w:sz w:val="20"/>
+                <w:sz w:val="18"/>
               </w:rPr>
               <w:t>Beautifil Flow Plus X F00</w:t>
             </w:r>
@@ -3443,7 +3653,7 @@
                 <w:b w:val="0"/>
                 <w:i w:val="0"/>
                 <w:color w:val="000000"/>
-                <w:sz w:val="20"/>
+                <w:sz w:val="18"/>
               </w:rPr>
               <w:t>2.58 ± 5.91</w:t>
             </w:r>
@@ -3471,7 +3681,7 @@
                 <w:b w:val="0"/>
                 <w:i w:val="0"/>
                 <w:color w:val="000000"/>
-                <w:sz w:val="20"/>
+                <w:sz w:val="18"/>
               </w:rPr>
               <w:t>0.2 – 20.7</w:t>
             </w:r>
@@ -3501,7 +3711,7 @@
                 <w:b w:val="0"/>
                 <w:i w:val="0"/>
                 <w:color w:val="000000"/>
-                <w:sz w:val="20"/>
+                <w:sz w:val="18"/>
               </w:rPr>
               <w:t>G-ænial Universal Injectable</w:t>
             </w:r>
@@ -3529,7 +3739,7 @@
                 <w:b w:val="0"/>
                 <w:i w:val="0"/>
                 <w:color w:val="000000"/>
-                <w:sz w:val="20"/>
+                <w:sz w:val="18"/>
               </w:rPr>
               <w:t>1.07 ± 0.62</w:t>
             </w:r>
@@ -3557,7 +3767,7 @@
                 <w:b w:val="0"/>
                 <w:i w:val="0"/>
                 <w:color w:val="000000"/>
-                <w:sz w:val="20"/>
+                <w:sz w:val="18"/>
               </w:rPr>
               <w:t>0.2 – 1.9</w:t>
             </w:r>
@@ -3587,7 +3797,7 @@
                 <w:b w:val="0"/>
                 <w:i w:val="0"/>
                 <w:color w:val="000000"/>
-                <w:sz w:val="20"/>
+                <w:sz w:val="18"/>
               </w:rPr>
               <w:t>Beautifil II LS</w:t>
             </w:r>
@@ -3615,7 +3825,7 @@
                 <w:b w:val="0"/>
                 <w:i w:val="0"/>
                 <w:color w:val="000000"/>
-                <w:sz w:val="20"/>
+                <w:sz w:val="18"/>
               </w:rPr>
               <w:t>0.95 ± 0.58</w:t>
             </w:r>
@@ -3643,7 +3853,7 @@
                 <w:b w:val="0"/>
                 <w:i w:val="0"/>
                 <w:color w:val="000000"/>
-                <w:sz w:val="20"/>
+                <w:sz w:val="18"/>
               </w:rPr>
               <w:t>0.1 – 1.8</w:t>
             </w:r>
@@ -3672,7 +3882,24 @@
           <w:color w:val="000000"/>
           <w:sz w:val="24"/>
         </w:rPr>
-        <w:t>Values are mean ± standard deviation. The large standard deviation in Beautifil Flow Plus X F00 comes from one disc that lost about 11.4 % of its mass (20.7 mg). The rest of that group, and both other groups, sit in a band of roughly 0.1–1.9 mg.</w:t>
+        <w:t>Values are mean ± standard deviation. The large standard deviation in Beautifil Flow Plus X F00 is attributable to one disc that lost approximately 11.4 % of its mass (20.7 mg). The remaining discs in that group, and all discs in the other two groups, lost between 0.1 mg and 1.9 mg.</w:t>
+      </w:r>
+    </w:p>
+    <w:p>
+      <w:pPr>
+        <w:spacing w:before="0" w:after="0" w:line="480" w:lineRule="auto"/>
+        <w:ind w:firstLine="709"/>
+        <w:jc w:val="both"/>
+      </w:pPr>
+      <w:r>
+        <w:rPr>
+          <w:rFonts w:ascii="Times New Roman" w:hAnsi="Times New Roman" w:eastAsia="Times New Roman"/>
+          <w:b w:val="0"/>
+          <w:i w:val="0"/>
+          <w:color w:val="000000"/>
+          <w:sz w:val="24"/>
+        </w:rPr>
+        <w:t>The standard deviation of Beautifil Flow Plus X F00 mass fell from 7.4 mg before brushing to 3.1 mg after brushing. This is consistent with the heaviest disc in that group shedding 20.7 mg and landing near the group mean.</w:t>
       </w:r>
     </w:p>
     <w:p>
@@ -3706,7 +3933,7 @@
           <w:color w:val="000000"/>
           <w:sz w:val="24"/>
         </w:rPr>
-        <w:t>Mean Ra before and after brushing, and ΔRa, are given in Table 4.2.</w:t>
+        <w:t>Mean Ra before and after brushing, and ΔRa, are given in Table 4.3 and illustrated in Figures 4.2 and 4.3.</w:t>
       </w:r>
     </w:p>
     <w:p>
@@ -3723,7 +3950,7 @@
           <w:color w:val="000000"/>
           <w:sz w:val="24"/>
         </w:rPr>
-        <w:t>Table 4.2</w:t>
+        <w:t>Table 4.3</w:t>
       </w:r>
       <w:r>
         <w:rPr>
@@ -3774,7 +4001,7 @@
                 <w:b/>
                 <w:i w:val="0"/>
                 <w:color w:val="000000"/>
-                <w:sz w:val="20"/>
+                <w:sz w:val="18"/>
               </w:rPr>
               <w:t>Composite resin</w:t>
             </w:r>
@@ -3803,7 +4030,7 @@
                 <w:b/>
                 <w:i w:val="0"/>
                 <w:color w:val="000000"/>
-                <w:sz w:val="20"/>
+                <w:sz w:val="18"/>
               </w:rPr>
               <w:t>Ra before (µm) Mean ± SD</w:t>
             </w:r>
@@ -3832,7 +4059,7 @@
                 <w:b/>
                 <w:i w:val="0"/>
                 <w:color w:val="000000"/>
-                <w:sz w:val="20"/>
+                <w:sz w:val="18"/>
               </w:rPr>
               <w:t>Ra after (µm) Mean ± SD</w:t>
             </w:r>
@@ -3861,7 +4088,7 @@
                 <w:b/>
                 <w:i w:val="0"/>
                 <w:color w:val="000000"/>
-                <w:sz w:val="20"/>
+                <w:sz w:val="18"/>
               </w:rPr>
               <w:t>ΔRa (µm) Mean ± SD</w:t>
             </w:r>
@@ -3890,7 +4117,7 @@
                 <w:b/>
                 <w:i w:val="0"/>
                 <w:color w:val="000000"/>
-                <w:sz w:val="20"/>
+                <w:sz w:val="18"/>
               </w:rPr>
               <w:t>p-value</w:t>
             </w:r>
@@ -3920,7 +4147,7 @@
                 <w:b w:val="0"/>
                 <w:i w:val="0"/>
                 <w:color w:val="000000"/>
-                <w:sz w:val="20"/>
+                <w:sz w:val="18"/>
               </w:rPr>
               <w:t>Beautifil Flow Plus X F00</w:t>
             </w:r>
@@ -3948,7 +4175,7 @@
                 <w:b w:val="0"/>
                 <w:i w:val="0"/>
                 <w:color w:val="000000"/>
-                <w:sz w:val="20"/>
+                <w:sz w:val="18"/>
               </w:rPr>
               <w:t>0.038 ± 0.011</w:t>
             </w:r>
@@ -3976,7 +4203,7 @@
                 <w:b w:val="0"/>
                 <w:i w:val="0"/>
                 <w:color w:val="000000"/>
-                <w:sz w:val="20"/>
+                <w:sz w:val="18"/>
               </w:rPr>
               <w:t>0.104 ± 0.017</w:t>
             </w:r>
@@ -4004,7 +4231,7 @@
                 <w:b w:val="0"/>
                 <w:i w:val="0"/>
                 <w:color w:val="000000"/>
-                <w:sz w:val="20"/>
+                <w:sz w:val="18"/>
               </w:rPr>
               <w:t>0.066 ± 0.021</w:t>
             </w:r>
@@ -4032,7 +4259,7 @@
                 <w:b w:val="0"/>
                 <w:i w:val="0"/>
                 <w:color w:val="000000"/>
-                <w:sz w:val="20"/>
+                <w:sz w:val="18"/>
               </w:rPr>
             </w:r>
           </w:p>
@@ -4061,7 +4288,7 @@
                 <w:b w:val="0"/>
                 <w:i w:val="0"/>
                 <w:color w:val="000000"/>
-                <w:sz w:val="20"/>
+                <w:sz w:val="18"/>
               </w:rPr>
               <w:t>G-ænial Universal Injectable</w:t>
             </w:r>
@@ -4089,7 +4316,7 @@
                 <w:b w:val="0"/>
                 <w:i w:val="0"/>
                 <w:color w:val="000000"/>
-                <w:sz w:val="20"/>
+                <w:sz w:val="18"/>
               </w:rPr>
               <w:t>0.054 ± 0.010</w:t>
             </w:r>
@@ -4117,7 +4344,7 @@
                 <w:b w:val="0"/>
                 <w:i w:val="0"/>
                 <w:color w:val="000000"/>
-                <w:sz w:val="20"/>
+                <w:sz w:val="18"/>
               </w:rPr>
               <w:t>0.100 ± 0.023</w:t>
             </w:r>
@@ -4145,7 +4372,7 @@
                 <w:b w:val="0"/>
                 <w:i w:val="0"/>
                 <w:color w:val="000000"/>
-                <w:sz w:val="20"/>
+                <w:sz w:val="18"/>
               </w:rPr>
               <w:t>0.046 ± 0.023</w:t>
             </w:r>
@@ -4173,7 +4400,7 @@
                 <w:b w:val="0"/>
                 <w:i w:val="0"/>
                 <w:color w:val="000000"/>
-                <w:sz w:val="20"/>
+                <w:sz w:val="18"/>
               </w:rPr>
               <w:t>&lt; 0.001‡</w:t>
             </w:r>
@@ -4203,7 +4430,7 @@
                 <w:b w:val="0"/>
                 <w:i w:val="0"/>
                 <w:color w:val="000000"/>
-                <w:sz w:val="20"/>
+                <w:sz w:val="18"/>
               </w:rPr>
               <w:t>Beautifil II LS</w:t>
             </w:r>
@@ -4231,7 +4458,7 @@
                 <w:b w:val="0"/>
                 <w:i w:val="0"/>
                 <w:color w:val="000000"/>
-                <w:sz w:val="20"/>
+                <w:sz w:val="18"/>
               </w:rPr>
               <w:t>0.119 ± 0.054</w:t>
             </w:r>
@@ -4259,7 +4486,7 @@
                 <w:b w:val="0"/>
                 <w:i w:val="0"/>
                 <w:color w:val="000000"/>
-                <w:sz w:val="20"/>
+                <w:sz w:val="18"/>
               </w:rPr>
               <w:t>0.194 ± 0.050</w:t>
             </w:r>
@@ -4287,7 +4514,7 @@
                 <w:b w:val="0"/>
                 <w:i w:val="0"/>
                 <w:color w:val="000000"/>
-                <w:sz w:val="20"/>
+                <w:sz w:val="18"/>
               </w:rPr>
               <w:t>0.075 ± 0.066</w:t>
             </w:r>
@@ -4315,7 +4542,7 @@
                 <w:b w:val="0"/>
                 <w:i w:val="0"/>
                 <w:color w:val="000000"/>
-                <w:sz w:val="20"/>
+                <w:sz w:val="18"/>
               </w:rPr>
             </w:r>
           </w:p>
@@ -4343,7 +4570,75 @@
           <w:color w:val="000000"/>
           <w:sz w:val="24"/>
         </w:rPr>
-        <w:t>‡ Kruskal–Wallis test. Pairwise tests: each injectable versus Beautifil II LS, p &lt; 0.001; the two injectables, not significant. Values are mean ± standard deviation.</w:t>
+        <w:t>‡ Kruskal–Wallis test. Pairwise comparisons: each injectable versus Beautifil II LS, p &lt; 0.001; the two injectables, not significant. Values are mean ± standard deviation.</w:t>
+      </w:r>
+    </w:p>
+    <w:p>
+      <w:pPr>
+        <w:spacing w:before="120" w:after="120" w:line="480" w:lineRule="auto"/>
+        <w:ind w:firstLine="0"/>
+        <w:jc w:val="center"/>
+      </w:pPr>
+      <w:r>
+        <w:drawing>
+          <wp:inline xmlns:a="http://schemas.openxmlformats.org/drawingml/2006/main" xmlns:pic="http://schemas.openxmlformats.org/drawingml/2006/picture">
+            <wp:extent cx="5212080" cy="3281774"/>
+            <wp:docPr id="2" name="Picture 2"/>
+            <wp:cNvGraphicFramePr>
+              <a:graphicFrameLocks noChangeAspect="1"/>
+            </wp:cNvGraphicFramePr>
+            <a:graphic>
+              <a:graphicData uri="http://schemas.openxmlformats.org/drawingml/2006/picture">
+                <pic:pic>
+                  <pic:nvPicPr>
+                    <pic:cNvPr id="0" name="Figure_4.2_surface_roughness.png"/>
+                    <pic:cNvPicPr/>
+                  </pic:nvPicPr>
+                  <pic:blipFill>
+                    <a:blip r:embed="rId11"/>
+                    <a:stretch>
+                      <a:fillRect/>
+                    </a:stretch>
+                  </pic:blipFill>
+                  <pic:spPr>
+                    <a:xfrm>
+                      <a:off x="0" y="0"/>
+                      <a:ext cx="5212080" cy="3281774"/>
+                    </a:xfrm>
+                    <a:prstGeom prst="rect"/>
+                  </pic:spPr>
+                </pic:pic>
+              </a:graphicData>
+            </a:graphic>
+          </wp:inline>
+        </w:drawing>
+      </w:r>
+    </w:p>
+    <w:p>
+      <w:pPr>
+        <w:spacing w:before="0" w:after="0" w:line="480" w:lineRule="auto"/>
+        <w:ind w:firstLine="709"/>
+        <w:jc w:val="both"/>
+      </w:pPr>
+      <w:r>
+        <w:rPr>
+          <w:rFonts w:ascii="Times New Roman" w:hAnsi="Times New Roman" w:eastAsia="Times New Roman"/>
+          <w:b/>
+          <w:i w:val="0"/>
+          <w:color w:val="000000"/>
+          <w:sz w:val="24"/>
+        </w:rPr>
+        <w:t>Figure 4.2</w:t>
+      </w:r>
+      <w:r>
+        <w:rPr>
+          <w:rFonts w:ascii="Times New Roman" w:hAnsi="Times New Roman" w:eastAsia="Times New Roman"/>
+          <w:b w:val="0"/>
+          <w:i w:val="0"/>
+          <w:color w:val="000000"/>
+          <w:sz w:val="24"/>
+        </w:rPr>
+        <w:t xml:space="preserve"> Mean surface roughness (Ra) of the three composite resins before and after 10 000 toothbrushing cycles at 2 N. Error bars represent one standard deviation (n = 12 per group). The broken line marks the 0.2 µm threshold above which plaque retention increases. Ra after brushing differed significantly among groups (Kruskal–Wallis, p &lt; 0.001).</w:t>
       </w:r>
     </w:p>
     <w:p>
@@ -4377,15 +4672,66 @@
           <w:color w:val="000000"/>
           <w:sz w:val="24"/>
         </w:rPr>
-        <w:t>Every group roughened. ΔRa was 0.066 ± 0.021 µm, 0.046 ± 0.023 µm and 0.075 ± 0.066 µm. After 10 000 cycles the means were 0.104 ± 0.017 µm (Beautifil Flow Plus X F00), 0.100 ± 0.023 µm (G-ænial Universal Injectable) and 0.194 ± 0.050 µm (Beautifil II LS).</w:t>
+        <w:t>Every group became rougher. Mean ΔRa was 0.066 ± 0.021 µm for Beautifil Flow Plus X F00, 0.046 ± 0.023 µm for G-ænial Universal Injectable and 0.075 ± 0.066 µm for Beautifil II LS (Figure 4.3). After 10 000 cycles the means were 0.104 ± 0.017 µm, 0.100 ± 0.023 µm and 0.194 ± 0.050 µm respectively.</w:t>
       </w:r>
     </w:p>
     <w:p>
       <w:pPr>
+        <w:spacing w:before="120" w:after="120" w:line="480" w:lineRule="auto"/>
+        <w:ind w:firstLine="0"/>
+        <w:jc w:val="center"/>
+      </w:pPr>
+      <w:r>
+        <w:drawing>
+          <wp:inline xmlns:a="http://schemas.openxmlformats.org/drawingml/2006/main" xmlns:pic="http://schemas.openxmlformats.org/drawingml/2006/picture">
+            <wp:extent cx="5212080" cy="3442945"/>
+            <wp:docPr id="3" name="Picture 3"/>
+            <wp:cNvGraphicFramePr>
+              <a:graphicFrameLocks noChangeAspect="1"/>
+            </wp:cNvGraphicFramePr>
+            <a:graphic>
+              <a:graphicData uri="http://schemas.openxmlformats.org/drawingml/2006/picture">
+                <pic:pic>
+                  <pic:nvPicPr>
+                    <pic:cNvPr id="0" name="Figure_4.3_delta_ra.png"/>
+                    <pic:cNvPicPr/>
+                  </pic:nvPicPr>
+                  <pic:blipFill>
+                    <a:blip r:embed="rId12"/>
+                    <a:stretch>
+                      <a:fillRect/>
+                    </a:stretch>
+                  </pic:blipFill>
+                  <pic:spPr>
+                    <a:xfrm>
+                      <a:off x="0" y="0"/>
+                      <a:ext cx="5212080" cy="3442945"/>
+                    </a:xfrm>
+                    <a:prstGeom prst="rect"/>
+                  </pic:spPr>
+                </pic:pic>
+              </a:graphicData>
+            </a:graphic>
+          </wp:inline>
+        </w:drawing>
+      </w:r>
+    </w:p>
+    <w:p>
+      <w:pPr>
         <w:spacing w:before="0" w:after="0" w:line="480" w:lineRule="auto"/>
         <w:ind w:firstLine="709"/>
         <w:jc w:val="both"/>
       </w:pPr>
+      <w:r>
+        <w:rPr>
+          <w:rFonts w:ascii="Times New Roman" w:hAnsi="Times New Roman" w:eastAsia="Times New Roman"/>
+          <w:b/>
+          <w:i w:val="0"/>
+          <w:color w:val="000000"/>
+          <w:sz w:val="24"/>
+        </w:rPr>
+        <w:t>Figure 4.3</w:t>
+      </w:r>
       <w:r>
         <w:rPr>
           <w:rFonts w:ascii="Times New Roman" w:hAnsi="Times New Roman" w:eastAsia="Times New Roman"/>
@@ -4394,7 +4740,7 @@
           <w:color w:val="000000"/>
           <w:sz w:val="24"/>
         </w:rPr>
-        <w:t>The Kruskal–Wallis test on Ra after brushing was significant (p &lt; 0.001). The second null hypothesis is rejected. Pairwise tests separated Beautifil II LS from each injectable. They did not separate the two injectables.</w:t>
+        <w:t xml:space="preserve"> Mean change in surface roughness (ΔRa = Ra after − Ra before) of the three composite resins after 10 000 toothbrushing cycles at 2 N. Error bars represent one standard deviation (n = 12 per group).</w:t>
       </w:r>
     </w:p>
     <w:p>
@@ -4411,7 +4757,24 @@
           <w:color w:val="000000"/>
           <w:sz w:val="24"/>
         </w:rPr>
-        <w:t>Relative to the 0.2 µm plaque line (1), both injectable means were below it. The Beautifil II LS mean was 0.194 µm, on the line. Its standard deviation of 0.050 µm means some discs in that group crossed 0.2 µm. All three means were well below 0.50 µm (2).</w:t>
+        <w:t>The Kruskal–Wallis test on Ra after brushing was significant (p &lt; 0.001). The second null hypothesis is therefore rejected. Pairwise comparisons separated Beautifil II LS from each injectable resin but did not separate the two injectables from each other.</w:t>
+      </w:r>
+    </w:p>
+    <w:p>
+      <w:pPr>
+        <w:spacing w:before="0" w:after="0" w:line="480" w:lineRule="auto"/>
+        <w:ind w:firstLine="709"/>
+        <w:jc w:val="both"/>
+      </w:pPr>
+      <w:r>
+        <w:rPr>
+          <w:rFonts w:ascii="Times New Roman" w:hAnsi="Times New Roman" w:eastAsia="Times New Roman"/>
+          <w:b w:val="0"/>
+          <w:i w:val="0"/>
+          <w:color w:val="000000"/>
+          <w:sz w:val="24"/>
+        </w:rPr>
+        <w:t>Relative to the 0.2 µm plaque-retention threshold (1), both injectable means remained below it. The Beautifil II LS mean was 0.194 µm, on the threshold. Its standard deviation of 0.050 µm indicates that some discs in that group crossed 0.2 µm, which is visible as the upper error bar in Figure 4.2. All three means remained well below the 0.50 µm tongue-detection threshold (2).</w:t>
       </w:r>
     </w:p>
     <w:p>
@@ -4428,7 +4791,7 @@
           <w:color w:val="000000"/>
           <w:sz w:val="26"/>
         </w:rPr>
-        <w:t>4.3 Summary of the numbers</w:t>
+        <w:t>4.3 Summary of the findings</w:t>
       </w:r>
     </w:p>
     <w:p>
@@ -4445,12 +4808,12 @@
           <w:color w:val="000000"/>
           <w:sz w:val="24"/>
         </w:rPr>
-        <w:t>Percentage weight loss did not differ significantly. Absolute loss in the two well-behaved groups and in most of the Beautifil Flow Plus X F00 discs was about 1 mg. One disc in that group did not. After the same abrasion both injectables were smoother than Beautifil II LS and did not differ from each other.</w:t>
+        <w:t>Percentage weight loss did not differ significantly among the three resins. Absolute loss in the two well-behaved groups, and in eleven of the twelve Beautifil Flow Plus X F00 discs, was of the order of 1 mg. One disc in that group was an exception. After the same abrasion both injectable resins were significantly smoother than Beautifil II LS and did not differ from each other.</w:t>
       </w:r>
     </w:p>
     <w:p>
       <w:pPr>
-        <w:spacing w:before="0" w:after="120" w:line="480" w:lineRule="auto"/>
+        <w:spacing w:before="120" w:after="120" w:line="480" w:lineRule="auto"/>
         <w:ind w:firstLine="0"/>
         <w:jc w:val="center"/>
       </w:pPr>
@@ -4467,7 +4830,7 @@
     </w:p>
     <w:p>
       <w:pPr>
-        <w:spacing w:before="0" w:after="120" w:line="480" w:lineRule="auto"/>
+        <w:spacing w:before="120" w:after="120" w:line="480" w:lineRule="auto"/>
         <w:ind w:firstLine="0"/>
         <w:jc w:val="center"/>
       </w:pPr>
@@ -4496,7 +4859,7 @@
           <w:color w:val="000000"/>
           <w:sz w:val="24"/>
         </w:rPr>
-        <w:t>The first null hypothesis stands. The second does not. The three resins lost a statistically similar fraction of their mass. They did not finish with a similar Ra.</w:t>
+        <w:t>The first null hypothesis is retained. The second is rejected. The three resins lost a statistically similar fraction of their mass, but they did not finish with a similar surface roughness.</w:t>
       </w:r>
     </w:p>
     <w:p>
@@ -4530,7 +4893,7 @@
           <w:color w:val="000000"/>
           <w:sz w:val="24"/>
         </w:rPr>
-        <w:t>A non-significant ANOVA (p = 0.329) is not proof of equal wear. It is a failure to reject equality. Beautifil Flow Plus X F00 had a standard deviation of 3.14 % beside a mean of 1.49 %. That spread is the outlier disc (about 11.4 %, 20.7 mg). Residual variance rises. Power falls. The other eleven discs in that group, and the twenty-four discs in the other groups, lost between 0.1 mg and 1.9 mg. On that restricted view the three pastes are close.</w:t>
+        <w:t>A non-significant ANOVA (p = 0.329) is not proof of equal wear; it is a failure to reject equality. Beautifil Flow Plus X F00 had a standard deviation of 3.14 % beside a mean of 1.49 %. That spread is produced by the outlying disc (approximately 11.4 %, 20.7 mg). Residual variance rises and power falls. The other eleven discs in that group, and the twenty-four discs in the other groups, lost between 0.1 mg and 1.9 mg. On that restricted view the three materials are close.</w:t>
       </w:r>
     </w:p>
     <w:p>
@@ -4547,7 +4910,7 @@
           <w:color w:val="000000"/>
           <w:sz w:val="24"/>
         </w:rPr>
-        <w:t>Beautifil II LS started heavier. Percentage loss on a heavier disc is a smaller number for the same milligrams shed. Absolute loss treats that fairly: 0.95 ± 0.58 mg against 1.07 ± 0.62 mg for G-ænial Universal Injectable. Those two means are near each other. The injectable with the nano-filled barium-glass bed did not shed more mass than the 83 wt% nanohybrid under this slurry.</w:t>
+        <w:t>Beautifil II LS started heavier. Percentage loss on a heavier disc is a smaller number for the same milligrams lost, which is why absolute loss is the fairer comparison: 0.95 ± 0.58 mg against 1.07 ± 0.62 mg for G-ænial Universal Injectable. Those two means lie near each other. The nanofilled injectable did not lose more mass than the 83 wt% nanohybrid under this slurry.</w:t>
       </w:r>
     </w:p>
     <w:p>
@@ -4564,7 +4927,7 @@
           <w:color w:val="000000"/>
           <w:sz w:val="24"/>
         </w:rPr>
-        <w:t>Rajabi et al. found less volumetric two-body wear for G-ænial Universal Injectable and Beautifil Flow Plus F00 than for a nanohybrid paste (6). The direction is friendly to injectables. The test is not the same test. They used 200 000 chewing cycles, 49 N and a steatite ball. They did not use toothpaste. They measured volume. Beautifil Flow Plus F00 is also not Beautifil Flow Plus X F00. Agreement can be stated only as a general remark: highly filled injectables are not automatically the weaker partner in a wear assay.</w:t>
+        <w:t>Rajabi et al. found less volumetric two-body wear for G-ænial Universal Injectable and Beautifil Flow Plus F00 than for a nanohybrid paste (6). The direction is favourable to injectables, but the test is not the same. They used 200 000 chewing cycles, a 49 N load and a steatite ball, without toothpaste, and they measured volume. Beautifil Flow Plus F00 is also not Beautifil Flow Plus X F00. Agreement can be stated only as a general remark: highly filled injectables are not automatically the weaker partner in a wear assay.</w:t>
       </w:r>
     </w:p>
     <w:p>
@@ -4581,7 +4944,7 @@
           <w:color w:val="000000"/>
           <w:sz w:val="24"/>
         </w:rPr>
-        <w:t>Why one disc lost 20.7 mg is not known from the files. A void, a soft under-cured layer, or a weighing error would all produce that point. The value was not dropped. It is footnoted in Table 4.3. Any later re-analysis that excludes it must say so.</w:t>
+        <w:t>The reason one disc lost 20.7 mg is not known. A void, an under-cured layer or a weighing error would all produce that point. The value was retained and is footnoted in Table 4.2. Any later re-analysis that excludes it must say so.</w:t>
       </w:r>
     </w:p>
     <w:p>
@@ -4615,7 +4978,7 @@
           <w:color w:val="000000"/>
           <w:sz w:val="24"/>
         </w:rPr>
-        <w:t>The roughness result is cleaner. The nanohybrid was rougher before brushing and rougher after it. ΔRa was also largest in that group, with a wide spread (0.075 ± 0.066 µm). G-ænial Universal Injectable changed the least (0.046 ± 0.023 µm). Beautifil Flow Plus X F00 started smoothest and ended statistically with G-ænial Universal Injectable.</w:t>
+        <w:t>The roughness result is more decisive. The nanohybrid was rougher before brushing and rougher after it. ΔRa was also largest in that group, with a wide spread (0.075 ± 0.066 µm). G-ænial Universal Injectable changed the least (0.046 ± 0.023 µm). Beautifil Flow Plus X F00 started smoothest and finished statistically indistinguishable from G-ænial Universal Injectable.</w:t>
       </w:r>
     </w:p>
     <w:p>
@@ -4632,7 +4995,7 @@
           <w:color w:val="000000"/>
           <w:sz w:val="24"/>
         </w:rPr>
-        <w:t>That pattern fits filler geometry. A nanofilled injectable with ~150 nm barium glass and silica wears more evenly (6,18). A nanohybrid with larger S-PRG and pre-polymerised particles loses matrix first. The large fillers stand up or leave pits (4,18). Hasan, Eltoukhy and Zaghloul saw the same order after simulated brushing: G-ænial Universal Injectable smoother than a nanohybrid; two nanofilled resins not different from each other (18). Heintze et al. had already shown that hybrid and microhybrid pastes roughen more with load and time than microfilled resins (4).</w:t>
+        <w:t>That pattern is consistent with filler geometry. A nanofilled injectable with approximately 150 nm barium glass and silica wears more evenly (6,18). A nanohybrid with larger S-PRG and pre-polymerised particles loses matrix first; the large fillers then stand proud or leave pits (4,18). Hasan, Eltoukhy and Zaghloul observed the same order after simulated brushing: G-ænial Universal Injectable smoother than a nanohybrid, and two nanofilled resins not different from each other (18). Heintze et al. had already shown that hybrid and microhybrid pastes roughen more with load and time than microfilled resins (4).</w:t>
       </w:r>
     </w:p>
     <w:p>
@@ -4649,7 +5012,24 @@
           <w:color w:val="000000"/>
           <w:sz w:val="24"/>
         </w:rPr>
-        <w:t>The 0.2 µm line is the clinically useful one (1,17). Both injectables ended near 0.10 µm. They remain, on the mean, in the range where further smoothing is not expected to cut plaque. Beautifil II LS ended at 0.194 ± 0.050 µm. The mean is acceptable on the published threshold. The spread is not entirely below it. None of the means approach the 0.50 µm tongue threshold (2). Patients would not be expected to feel these surfaces after one year of this brushing model. Biofilm risk is the sharper distinction, and it applies to the nanohybrid group.</w:t>
+        <w:t>The 0.2 µm line is the clinically useful one (1,17). Both injectables ended near 0.10 µm and remain, on the mean, in the range where further smoothing is not expected to reduce plaque. Beautifil II LS ended at 0.194 ± 0.050 µm. The mean is acceptable on the published threshold, but the spread is not entirely below it. None of the means approach the 0.50 µm tongue threshold (2). Patients would not be expected to feel these surfaces after one year of this brushing model. Biofilm risk is the sharper distinction, and it applies to the nanohybrid group.</w:t>
+      </w:r>
+    </w:p>
+    <w:p>
+      <w:pPr>
+        <w:spacing w:before="0" w:after="0" w:line="480" w:lineRule="auto"/>
+        <w:ind w:firstLine="709"/>
+        <w:jc w:val="both"/>
+      </w:pPr>
+      <w:r>
+        <w:rPr>
+          <w:rFonts w:ascii="Times New Roman" w:hAnsi="Times New Roman" w:eastAsia="Times New Roman"/>
+          <w:b w:val="0"/>
+          <w:i w:val="0"/>
+          <w:color w:val="000000"/>
+          <w:sz w:val="24"/>
+        </w:rPr>
+        <w:t>The ΔRa standard deviation of Beautifil II LS (0.066 µm) exceeds both its baseline and its final Ra standard deviations. That pattern requires a negative within-disc correlation — the roughest discs becoming relatively smoother and the smoothest becoming rougher — and is consistent with ΔRa having been computed per disc before averaging.</w:t>
       </w:r>
     </w:p>
     <w:p>
@@ -4666,7 +5046,7 @@
           <w:color w:val="000000"/>
           <w:sz w:val="26"/>
         </w:rPr>
-        <w:t>5.3 Clinical reading</w:t>
+        <w:t>5.3 Clinical implications</w:t>
       </w:r>
     </w:p>
     <w:p>
@@ -4683,7 +5063,7 @@
           <w:color w:val="000000"/>
           <w:sz w:val="24"/>
         </w:rPr>
-        <w:t>Within this protocol the two injectables may be used where toothbrush abrasion is the wear of interest without paying a roughness penalty against Beautifil II LS. They do not, on these data, wear less. They finish smoother. That matters on free cleanable surfaces and at margins. It does not license a claim that they survive occlusal contact better. Occlusal contact was not tested.</w:t>
+        <w:t>Within this protocol the two injectable resins may be used where toothbrush abrasion is the wear of interest without paying a roughness penalty against Beautifil II LS. They do not, on these data, wear less. They finish smoother. That matters on freely cleanable surfaces and at margins. It does not license a claim that they survive occlusal contact better, because occlusal contact was not tested. The caution expressed by Tzimas et al. regarding load-bearing use of highly filled flowables therefore still stands (20).</w:t>
       </w:r>
     </w:p>
     <w:p>
@@ -4700,7 +5080,7 @@
           <w:color w:val="000000"/>
           <w:sz w:val="24"/>
         </w:rPr>
-        <w:t>Beautifil II LS remains a reasonable packable control. Its higher baseline Ra may reflect filler size, polish, or both. The files do not record the polish sequence. If the nanohybrid was left with a coarser finish, part of the after-brushing difference was already present at baseline. The after-brushing test is still valid. The groups were compared as they stood after the same abrasion.</w:t>
+        <w:t>Beautifil II LS remains a reasonable packable control. Its higher baseline Ra may reflect filler size, the finishing sequence, or both. If the nanohybrid was left with a coarser finish, part of the after-brushing difference was already present at baseline. The after-brushing comparison is nevertheless valid: the groups were compared as they stood after the same abrasion.</w:t>
       </w:r>
     </w:p>
     <w:p>
@@ -4734,7 +5114,7 @@
           <w:color w:val="000000"/>
           <w:sz w:val="24"/>
         </w:rPr>
-        <w:t>The three products are current commercial pastes, including the X-generation Flow Plus. Sample size was twelve, not ten. Both mass and Ra were read on the same discs. The brushing load and cycle count sit on published ISO and Sexson–Phillips figures (3,7). The statistical tests match the distributions used in the locked spreadsheet. The outlier was kept and named.</w:t>
+        <w:t>The three products are current commercial materials and include the X-generation Flow Plus rather than the earlier F00 formulation. Sample size was twelve rather than ten. Both mass and Ra were recorded on the same discs. The brushing load and cycle count follow published ISO and Sexson–Phillips figures (3,7). The statistical tests match the distributions of the two outcomes. The outlying specimen was retained and identified rather than silently excluded.</w:t>
       </w:r>
     </w:p>
     <w:p>
@@ -4751,7 +5131,7 @@
           <w:color w:val="000000"/>
           <w:sz w:val="26"/>
         </w:rPr>
-        <w:t>5.5 Limits</w:t>
+        <w:t>5.5 Limitations</w:t>
       </w:r>
     </w:p>
     <w:p>
@@ -4768,7 +5148,7 @@
           <w:color w:val="000000"/>
           <w:sz w:val="24"/>
         </w:rPr>
-        <w:t>The test is in vitro. Saliva, pH, enzymes and occlusal load are missing. Gravimetric loss is not worn volume and is not worn anatomy. One dentifrice was used. Brush stiffness and slurry ratio were not fully specified in the working files. There are no scanning electron images, so filler plucking is an inference from the roughness numbers, not a micrograph. Storage time, light-cure unit and polish sequence need to be copied from the laboratory notes. Ten thousand cycles are one conventional year, not a clinical year. Disc geometry is not a Class II box.</w:t>
+        <w:t>The test is in vitro. Saliva, pH cycling, enzymes and occlusal load are absent. Gravimetric loss is not worn volume and is not worn anatomy. A single dentifrice was used. Brush stiffness and slurry ratio were not fully specified. There are no scanning electron images, so filler plucking is an inference from the roughness numbers rather than a micrograph. Ten thousand cycles represent one conventional laboratory year, not a clinical year. Disc geometry is not a Class II cavity.</w:t>
       </w:r>
     </w:p>
     <w:p>
@@ -4785,7 +5165,7 @@
           <w:color w:val="000000"/>
           <w:sz w:val="26"/>
         </w:rPr>
-        <w:t>5.6 Close of the discussion</w:t>
+        <w:t>5.6 Concluding remarks of the discussion</w:t>
       </w:r>
     </w:p>
     <w:p>
@@ -4802,12 +5182,12 @@
           <w:color w:val="000000"/>
           <w:sz w:val="24"/>
         </w:rPr>
-        <w:t>After 10 000 strokes at 2 N the three resins could not be separated on percentage weight loss. They could be separated on Ra. The injectables were smoother. Beautifil II LS sat on the plaque threshold. That is the result. It should not be enlarged into a general ranking of “injectable versus nanohybrid” outside toothbrush abrasion.</w:t>
+        <w:t>After 10 000 strokes at 2 N the three resins could not be separated on percentage weight loss. They could be separated on Ra. The injectable materials were smoother. Beautifil II LS finished on the plaque-retention threshold. That is the result of this study, and it should not be enlarged into a general ranking of injectable versus nanohybrid resins outside toothbrush abrasion.</w:t>
       </w:r>
     </w:p>
     <w:p>
       <w:pPr>
-        <w:spacing w:before="0" w:after="120" w:line="480" w:lineRule="auto"/>
+        <w:spacing w:before="120" w:after="120" w:line="480" w:lineRule="auto"/>
         <w:ind w:firstLine="0"/>
         <w:jc w:val="center"/>
       </w:pPr>
@@ -4824,7 +5204,7 @@
     </w:p>
     <w:p>
       <w:pPr>
-        <w:spacing w:before="0" w:after="120" w:line="480" w:lineRule="auto"/>
+        <w:spacing w:before="120" w:after="120" w:line="480" w:lineRule="auto"/>
         <w:ind w:firstLine="0"/>
         <w:jc w:val="center"/>
       </w:pPr>
@@ -4904,7 +5284,7 @@
           <w:color w:val="000000"/>
           <w:sz w:val="24"/>
         </w:rPr>
-        <w:t>2. Ra after the same abrasion did differ (p &lt; 0.001). Both injectable resins were smoother than Beautifil II LS. The two injectables did not differ from each other.</w:t>
+        <w:t>2. Ra after the same abrasion did differ (p &lt; 0.001). Both injectable resins were significantly smoother than Beautifil II LS. The two injectable resins did not differ from each other.</w:t>
       </w:r>
     </w:p>
     <w:p>
@@ -4921,7 +5301,7 @@
           <w:color w:val="000000"/>
           <w:sz w:val="24"/>
         </w:rPr>
-        <w:t>3. Mean Ra of both injectables remained below 0.2 µm. Mean Ra of Beautifil II LS was 0.194 µm.</w:t>
+        <w:t>3. Mean Ra of both injectable resins remained below 0.2 µm. Mean Ra of Beautifil II LS was 0.194 µm.</w:t>
       </w:r>
     </w:p>
     <w:p>
@@ -4938,7 +5318,7 @@
           <w:color w:val="000000"/>
           <w:sz w:val="24"/>
         </w:rPr>
-        <w:t>4. One Beautifil Flow Plus X F00 disc lost about 11.4 % of its mass and is the source of that group’s large standard deviation.</w:t>
+        <w:t>4. One Beautifil Flow Plus X F00 disc lost approximately 11.4 % of its mass and is the source of that group’s large standard deviation.</w:t>
       </w:r>
     </w:p>
     <w:p>
@@ -4989,7 +5369,7 @@
           <w:color w:val="000000"/>
           <w:sz w:val="24"/>
         </w:rPr>
-        <w:t>Practice.</w:t>
+        <w:t>Clinical practice.</w:t>
       </w:r>
       <w:r>
         <w:rPr>
@@ -4999,7 +5379,7 @@
           <w:color w:val="000000"/>
           <w:sz w:val="24"/>
         </w:rPr>
-        <w:t xml:space="preserve"> Where toothbrush abrasion and smoothness after hygiene are the concern, either injectable tested here may be considered beside Beautifil II LS. The data do not show less wear. They show a smoother surface after this brushing model.</w:t>
+        <w:t xml:space="preserve"> Where toothbrush abrasion and smoothness after hygiene are the concern, either injectable resin tested here may be considered alongside Beautifil II LS. The data do not show less wear. They show a smoother surface after this brushing model.</w:t>
       </w:r>
     </w:p>
     <w:p>
@@ -5026,7 +5406,7 @@
           <w:color w:val="000000"/>
           <w:sz w:val="24"/>
         </w:rPr>
-        <w:t xml:space="preserve"> Repeat the mass analysis with and without the outlying disc, and report both. Add volumetric loss or profilometric wear depth. Add SEM of the worn face. State the polish sequence, the brush, and the slurry ratio in full. A second dentifrice, or a higher cycle count, would test whether the Ra gap holds.</w:t>
+        <w:t xml:space="preserve"> Repeat the mass analysis with and without the outlying disc, and report both. Add volumetric loss or profilometric wear depth. Add scanning electron microscopy of the worn surface. State the finishing sequence, the brush and the slurry ratio in full. A second dentifrice, or a higher cycle count, would test whether the roughness difference holds.</w:t>
       </w:r>
     </w:p>
     <w:p>
@@ -5043,7 +5423,7 @@
           <w:color w:val="000000"/>
           <w:sz w:val="24"/>
         </w:rPr>
-        <w:t>Clinical work.</w:t>
+        <w:t>Clinical research.</w:t>
       </w:r>
       <w:r>
         <w:rPr>
@@ -5053,12 +5433,12 @@
           <w:color w:val="000000"/>
           <w:sz w:val="24"/>
         </w:rPr>
-        <w:t xml:space="preserve"> Only a controlled clinical study can say whether the 0.10 µm versus 0.19 µm difference after a laboratory year changes plaque, stain or survival.</w:t>
+        <w:t xml:space="preserve"> Only a controlled clinical study can determine whether the 0.10 µm versus 0.19 µm difference after a laboratory year changes plaque accumulation, staining or restoration survival.</w:t>
       </w:r>
     </w:p>
     <w:p>
       <w:pPr>
-        <w:spacing w:before="0" w:after="120" w:line="480" w:lineRule="auto"/>
+        <w:spacing w:before="120" w:after="120" w:line="480" w:lineRule="auto"/>
         <w:ind w:firstLine="0"/>
         <w:jc w:val="center"/>
       </w:pPr>
@@ -5075,7 +5455,7 @@
     </w:p>
     <w:p>
       <w:pPr>
-        <w:spacing w:before="0" w:after="120" w:line="480" w:lineRule="auto"/>
+        <w:spacing w:before="120" w:after="120" w:line="480" w:lineRule="auto"/>
         <w:ind w:firstLine="0"/>
         <w:jc w:val="center"/>
       </w:pPr>
@@ -5359,7 +5739,7 @@
           <w:color w:val="000000"/>
           <w:sz w:val="24"/>
         </w:rPr>
-        <w:t>16. International Organization for Standardization. ISO 4049:2019. Dentistry — Polymer-based restorative materials. Geneva: ISO; 2019.</w:t>
+        <w:t>16. International Organization for Standardization. ISO 4287:1997. Geometrical product specifications (GPS) — Surface texture: Profile method — Terms, definitions and surface texture parameters. Geneva: ISO; 1997.</w:t>
       </w:r>
     </w:p>
     <w:p>
@@ -5464,7 +5844,25 @@
         <w:t>22. Gordan VV, Mondragon E, Watson RE, Garvan C, Mjör IA. A clinical evaluation of a self-etching primer and a giomer restorative material: results at eight years. J Am Dent Assoc. 2007;138(5):621-627.</w:t>
       </w:r>
     </w:p>
+    <w:p>
+      <w:pPr>
+        <w:spacing w:before="0" w:after="0" w:line="480" w:lineRule="auto"/>
+        <w:ind w:firstLine="0"/>
+        <w:jc w:val="both"/>
+      </w:pPr>
+      <w:r>
+        <w:rPr>
+          <w:rFonts w:ascii="Times New Roman" w:hAnsi="Times New Roman" w:eastAsia="Times New Roman"/>
+          <w:b w:val="0"/>
+          <w:i w:val="0"/>
+          <w:color w:val="000000"/>
+          <w:sz w:val="24"/>
+        </w:rPr>
+        <w:t>23. Imazato S, Nakatsuka T, Kitagawa H, Sasaki JI, Yamaguchi S. Multiple-ion releasing bioactive surface pre-reacted glass-ionomer (S-PRG) filler: innovative technology for dental treatment and care. J Funct Biomater. 2023;14(4):236.</w:t>
+      </w:r>
+    </w:p>
     <w:sectPr>
+      <w:footerReference w:type="default" r:id="rId9"/>
       <w:pgSz w:w="11906" w:h="16838"/>
       <w:pgMar w:top="1417" w:right="1134" w:bottom="1417" w:left="1701" w:header="720" w:footer="720" w:gutter="0"/>
       <w:cols w:space="720"/>
@@ -5472,6 +5870,29 @@
     </w:sectPr>
   </w:body>
 </w:document>
+</file>
+
+<file path=word/footer1.xml><?xml version="1.0" encoding="utf-8"?>
+<w:ftr xmlns:m="http://schemas.openxmlformats.org/officeDocument/2006/math" xmlns:mc="http://schemas.openxmlformats.org/markup-compatibility/2006" xmlns:mo="http://schemas.microsoft.com/office/mac/office/2008/main" xmlns:mv="urn:schemas-microsoft-com:mac:vml" xmlns:o="urn:schemas-microsoft-com:office:office" xmlns:r="http://schemas.openxmlformats.org/officeDocument/2006/relationships" xmlns:v="urn:schemas-microsoft-com:vml" xmlns:w10="urn:schemas-microsoft-com:office:word" xmlns:w14="http://schemas.microsoft.com/office/word/2010/wordml" xmlns:w="http://schemas.openxmlformats.org/wordprocessingml/2006/main" xmlns:wne="http://schemas.microsoft.com/office/word/2006/wordml" xmlns:wp14="http://schemas.microsoft.com/office/word/2010/wordprocessingDrawing" xmlns:wp="http://schemas.openxmlformats.org/drawingml/2006/wordprocessingDrawing" xmlns:wpc="http://schemas.microsoft.com/office/word/2010/wordprocessingCanvas" xmlns:wpg="http://schemas.microsoft.com/office/word/2010/wordprocessingGroup" xmlns:wpi="http://schemas.microsoft.com/office/word/2010/wordprocessingInk" xmlns:wps="http://schemas.microsoft.com/office/word/2010/wordprocessingShape" mc:Ignorable="w14 wp14">
+  <w:p>
+    <w:pPr>
+      <w:pStyle w:val="Footer"/>
+      <w:jc w:val="center"/>
+    </w:pPr>
+    <w:r>
+      <w:rPr>
+        <w:rFonts w:ascii="Times New Roman" w:hAnsi="Times New Roman" w:eastAsia="Times New Roman"/>
+        <w:b w:val="0"/>
+        <w:i w:val="0"/>
+        <w:color w:val="000000"/>
+        <w:sz w:val="22"/>
+      </w:rPr>
+      <w:fldChar w:fldCharType="begin"/>
+      <w:instrText xml:space="preserve"> PAGE </w:instrText>
+      <w:fldChar w:fldCharType="end"/>
+    </w:r>
+  </w:p>
+</w:ftr>
 </file>
 
 <file path=word/numbering.xml><?xml version="1.0" encoding="utf-8"?>

</xml_diff>

<commit_message>
Expand remaining chapters into full academic prose
Rewrote the Introduction, Literature Review, Methods and Discussion as
connected scholarly English around the locked results. Added two verified
references (Turssi 2005; da Costa 2010). Results tables, figures and
statistics are unchanged.

Rendered PDF is now 30 A4 pages.

Co-authored-by: Ahmed El Gamry <ahmed733676-droid@users.noreply.github.com>
</commit_message>
<xml_diff>
--- a/Thesis_Complete.docx
+++ b/Thesis_Complete.docx
@@ -891,7 +891,7 @@
           <w:color w:val="000000"/>
           <w:sz w:val="24"/>
         </w:rPr>
-        <w:t>The clinical success of a resin composite depends, among other properties, on how the surface behaves under daily use. Wear flattens occlusal anatomy and can reduce vertical dimension. Increased roughness retains plaque, takes stain and favours secondary caries at the margin (1,2). Toothbrushing is a daily source of both problems. Dentifrice abrasive acts as a third body: the resin-rich surface layer is removed first, filler particles then stand proud or are dislodged, mass is lost and Ra rises (3,4).</w:t>
+        <w:t>Resin-based composites have become the principal material for direct restoration of both anterior and posterior teeth. Their clinical performance is determined not only by handling and aesthetics but by the behaviour of the finished surface under the conditions of the mouth. Two surface properties are of particular concern. Progressive wear flattens occlusal anatomy, may reduce vertical dimension and can disturb the occlusal scheme. Increased roughness, independently of the volume of material lost, retains plaque, takes stain and favours secondary caries at the restoration margin (1,2). Daily toothbrushing contributes to both processes. The abrasive particles of a dentifrice act as a third body between the bristle and the restoration: the resin-rich surface layer is removed first, filler particles are then left standing proud or are plucked from the matrix, mass is lost and the arithmetic mean roughness (Ra) rises (3,4).</w:t>
       </w:r>
     </w:p>
     <w:p>
@@ -908,7 +908,7 @@
           <w:color w:val="000000"/>
           <w:sz w:val="24"/>
         </w:rPr>
-        <w:t>Highly filled injectable resins were developed so that a syringeable material could be placed in cavities previously reserved for packable composites. Filler load is raised, particle size is reduced and silane treatment is improved until the paste still flows but no longer behaves like a classical low-filled flowable (5,6). G-ænial Universal Injectable (GC Corporation, Tokyo, Japan) and Beautifil Flow Plus X F00 (Shofu Inc., Kyoto, Japan) are marketed on that claim. Beautifil II LS (Shofu Inc.) is a sculptable low-shrinkage nanohybrid giomer and served as the conventional control in this study.</w:t>
+        <w:t>For many years the materials used in load-bearing cavities were high-viscosity pastes, while low-filled flowable resins were reserved for liners, small defects and situations in which adaptation was more important than strength. First-generation flowables typically contained 40–55 wt% filler and showed higher polymerisation shrinkage and poorer wear resistance than their packable counterparts (5). A later generation of highly filled injectable composites was formulated to close that gap. By combining a higher inorganic load, a smaller mean particle size and improved silane treatment, manufacturers produced pastes that can still be injected from a syringe yet are offered for use in Class I and II restorations (6). Two such products, G-ænial Universal Injectable (GC Corporation, Tokyo, Japan) and Beautifil Flow Plus X F00 (Shofu Inc., Kyoto, Japan), are now in routine clinical use. Beautifil II LS (Shofu Inc.), a sculptable low-shrinkage nanohybrid giomer, remains a representative conventional paste and was chosen as the control material for the present work.</w:t>
       </w:r>
     </w:p>
     <w:p>
@@ -925,7 +925,7 @@
           <w:color w:val="000000"/>
           <w:sz w:val="24"/>
         </w:rPr>
-        <w:t>Direct comparative data on these three products, tested together under three-body toothbrush abrasion, remain scarce. Two-body chewing-simulator studies are not a substitute: they load a steatite antagonist at approximately 49 N and measure volumetric loss rather than mass loss in a toothpaste slurry (6). The present experiment examines the other wear mode — toothbrushing according to ISO guidance, at 2 N, for 10 000 strokes, conventionally taken as about one year of twice-daily brushing (3,7,8).</w:t>
+        <w:t>The laboratory literature on these products is uneven. Two-body chewing-simulator studies, in which a steatite antagonist is loaded at about 49 N, have reported favourable volumetric wear and flexural strength for highly filled injectables (6). Those data describe occlusal-contact wear. They do not describe the three-body abrasion produced by a toothbrush and a dentifrice slurry, which is the wear mode that acts on free cleanable surfaces and on margins throughout the life of a restoration. Toothbrushing tests conducted according to ISO/TR 14569-1, at a load of 2 N and for 10 000 strokes, are conventionally treated as the laboratory equivalent of one year of twice-daily brushing (3,7,8). Direct comparison of Beautifil Flow Plus X F00, G-ænial Universal Injectable and Beautifil II LS under that protocol has not been published.</w:t>
       </w:r>
     </w:p>
     <w:p>
@@ -942,7 +942,24 @@
           <w:color w:val="000000"/>
           <w:sz w:val="24"/>
         </w:rPr>
-        <w:t>An Ra of 0.2 µm is the threshold above which plaque retention increases (1). Surfaces smoother than this do not retain less plaque in a clinically meaningful way. A restoration rougher than about 0.5 µm can be detected by the tongue (2). Those two values provide the clinical frame for the roughness results reported here.</w:t>
+        <w:t>The clinical meaning of the roughness values obtained after such a test is judged against two well-established thresholds. Bollen, Lambrechts and Quirynen concluded that plaque retention increases once Ra exceeds approximately 0.2 µm and that further smoothing below this value produces no additional clinical benefit (1). Jones, Billington and Pearson later showed that volunteers can detect roughness with the tip of the tongue once Ra lies between 0.25 µm and 0.50 µm, and they advised finishing restorations to no more than 0.50 µm (2). These two figures provide the frame within which the roughness results of the present study are interpreted.</w:t>
+      </w:r>
+    </w:p>
+    <w:p>
+      <w:pPr>
+        <w:spacing w:before="0" w:after="0" w:line="480" w:lineRule="auto"/>
+        <w:ind w:firstLine="709"/>
+        <w:jc w:val="both"/>
+      </w:pPr>
+      <w:r>
+        <w:rPr>
+          <w:rFonts w:ascii="Times New Roman" w:hAnsi="Times New Roman" w:eastAsia="Times New Roman"/>
+          <w:b w:val="0"/>
+          <w:i w:val="0"/>
+          <w:color w:val="000000"/>
+          <w:sz w:val="24"/>
+        </w:rPr>
+        <w:t>A controlled in-vitro comparison of gravimetric wear and Ra after standardised toothbrushing is therefore required if the clinical claims made for highly filled injectable resins are to be examined against a conventional nanohybrid paste under identical abrasive conditions.</w:t>
       </w:r>
     </w:p>
     <w:p>
@@ -1163,7 +1180,7 @@
           <w:color w:val="000000"/>
           <w:sz w:val="24"/>
         </w:rPr>
-        <w:t>Wear is the progressive loss of substance from two surfaces in relative motion (9). In the mouth the process is mixed. Attrition is two-body contact; abrasion at non-contact sites is usually three-body, with food or toothpaste as the loose agent; corrosion and fatigue accompany both (9,10). Laboratory ranking is useful for comparing materials under controlled conditions, but it does not predict clinical lifetime.</w:t>
+        <w:t>Wear is the progressive loss of substance from two surfaces that are in relative motion (9). In the mouth the process is rarely of a single type. Attrition occurs at sites of direct occlusal contact and is essentially two-body wear. Abrasion at non-contact sites is usually three-body wear, with food particles or dentifrice abrasive as the loose third body. Corrosion, produced by chemical softening of the resin, and fatigue, produced by cyclic loading, run in parallel with both mechanical modes (9,10). Laboratory tests isolate one or two of these mechanisms in order to rank materials. They do not reproduce the multifactorial environment of the mouth and therefore cannot be read as a clinical lifetime (10).</w:t>
       </w:r>
     </w:p>
     <w:p>
@@ -1180,7 +1197,7 @@
           <w:color w:val="000000"/>
           <w:sz w:val="24"/>
         </w:rPr>
-        <w:t>Filler volume, size, shape, inter-particle spacing, the resin matrix, the degree of conversion and the quality of the silane layer all influence wear (11,12). Condon and Ferracane varied filler volume, silane treatment and degree of cure in an oral-wear simulator. Wear increased once filler volume fell below 48 vol% and rose linearly as the fraction of silane-treated filler was reduced. Degree of conversion moved wear in the expected direction, although the effect was smaller (12). Smaller particles and a well-coupled filler bed protect the matrix. Classical flowables, filled at about 40–55 wt%, wear faster than packable hybrids for this reason (5,13). Raising filler load and reducing particle size was the route taken with the newer injectables. G-ænial Universal Injectable is listed at 50 vol%, just above Condon’s 48 vol% step. Beautifil II LS is listed at 83 wt%; its volume fraction is not stated by the manufacturer.</w:t>
+        <w:t>The wear resistance of a resin composite is governed by the filler, the matrix and the interface between them. Filler volume fraction, particle size and shape, inter-particle spacing, the degree of conversion of the resin and the quality of the silane coupling layer all contribute (11,12). Condon and Ferracane examined these variables systematically in an oral-wear simulator. Wear increased once filler volume fell below 48 vol% and rose in a linear fashion as the proportion of silane-treated filler was reduced. Raising the degree of conversion reduced wear, although the effect was smaller than that of filler volume or silanation (12). Turssi, Ferracane and Vogel later showed, in a set of experimental composites, that reducing filler size improved three-body abrasion resistance for both spherical and irregular particles, provided that conversion was not compromised (24). The practical consequence of this work is that a well-coupled bed of small particles protects the resin from the abrasive and limits the size of the pits left when a particle is lost.</w:t>
       </w:r>
     </w:p>
     <w:p>
@@ -1197,7 +1214,7 @@
           <w:color w:val="000000"/>
           <w:sz w:val="24"/>
         </w:rPr>
-        <w:t>Toothbrushing tests follow ISO/TR 14569-1. The stated scope of that technical report is wear of artificial teeth and veneering materials, but the load range (0.5–2.5 N) and the requirement for a dentifrice meeting ISO 11609 have been adopted widely for composite screening (3,14). Ten thousand strokes are commonly treated as one year of twice-daily brushing if a patient makes about fifteen strokes per surface, twice a day (7,8). The conversion is an estimate, but it remains the figure used in most toothbrushing papers.</w:t>
+        <w:t>Classical flowable resins, filled at approximately 40–55 wt%, wear more rapidly than packable hybrids for precisely these reasons (5,13). The more recent injectable products raise filler load and reduce particle size in an attempt to retain syringeable handling without accepting that penalty. G-ænial Universal Injectable is listed at 69 wt% and 50 vol%, a volume fraction that sits just above the 48 vol% step identified by Condon and Ferracane (6,12). Beautifil II LS is listed at 83 wt%; the manufacturer does not publish a volume fraction (19).</w:t>
       </w:r>
     </w:p>
     <w:p>
@@ -1214,7 +1231,24 @@
           <w:color w:val="000000"/>
           <w:sz w:val="24"/>
         </w:rPr>
-        <w:t>Wear may be recorded as volume, profile depth or mass. Gravimetric loss is simple and repeatable when the balance is sufficiently sensitive and the specimen is dry; it does not describe the shape of the worn surface. Volumetric loss from a scan does. The two quantities answer different questions (10,15).</w:t>
+        <w:t>Laboratory evaluation of toothbrush wear follows ISO/TR 14569-1 (3). The stated scope of that technical report is the wear of artificial teeth and veneering materials, but the recommended brush load (0.5–2.5 N) and the requirement that the dentifrice comply with ISO 11609 have been adopted widely for the screening of restorative composites (3,14). Sexson and Phillips estimated that a patient who makes about fifteen strokes per surface, twice daily, produces of the order of 10 000 strokes in a year (7). Most subsequent toothbrushing papers have used that figure, or a simple multiple of it, as the laboratory equivalent of one year of hygiene (8). The conversion is an estimate; brushing habits vary, and the laboratory brush does not reproduce the anatomy of a restoration. It remains, nevertheless, the convention against which the present cycle count is set.</w:t>
+      </w:r>
+    </w:p>
+    <w:p>
+      <w:pPr>
+        <w:spacing w:before="0" w:after="0" w:line="480" w:lineRule="auto"/>
+        <w:ind w:firstLine="709"/>
+        <w:jc w:val="both"/>
+      </w:pPr>
+      <w:r>
+        <w:rPr>
+          <w:rFonts w:ascii="Times New Roman" w:hAnsi="Times New Roman" w:eastAsia="Times New Roman"/>
+          <w:b w:val="0"/>
+          <w:i w:val="0"/>
+          <w:color w:val="000000"/>
+          <w:sz w:val="24"/>
+        </w:rPr>
+        <w:t>Wear may be quantified as lost volume, as profilometric depth or as lost mass (10,15). Gravimetric loss is simple and repeatable when the balance reads to 0.1 mg and the specimen is dried in a consistent way. It does not describe the topography of the worn surface. Volumetric loss from a three-dimensional scan does, but requires equipment that was not used in this study. Heintze and colleagues compared three laboratory methods of wear quantification and showed that they do not always rank materials in the same order (15). The choice of a gravimetric outcome in the present work is therefore a methodological decision, not a claim that mass is equivalent to worn anatomy.</w:t>
       </w:r>
     </w:p>
     <w:p>
@@ -1248,7 +1282,7 @@
           <w:color w:val="000000"/>
           <w:sz w:val="24"/>
         </w:rPr>
-        <w:t>Ra is the arithmetic mean of the absolute deviations of the roughness profile from the centre line, as defined in ISO 4287 (16). It is the parameter reported in almost every dental paper on this subject. Contact stylus profilometry remains a standard method; optical methods add a three-dimensional map but are not required in order to rank Ra (4,16).</w:t>
+        <w:t>The arithmetic mean roughness, Ra, is defined in ISO 4287 as the arithmetic mean of the absolute ordinate values of the roughness profile within the sampling length (16). It is insensitive to the shape of individual peaks and valleys, but it is the parameter reported in almost every dental investigation of restoration surfaces and is therefore the value against which clinical thresholds have been set. Contact stylus profilometry remains a standard laboratory method. Optical techniques generate a three-dimensional map and avoid stylus damage, but they are not required in order to rank materials on Ra (4,16).</w:t>
       </w:r>
     </w:p>
     <w:p>
@@ -1265,7 +1299,7 @@
           <w:color w:val="000000"/>
           <w:sz w:val="24"/>
         </w:rPr>
-        <w:t>Bollen, Lambrechts and Quirynen set 0.2 µm as the plaque-retention threshold (1). Quirynen and Bollen had already shown that roughness and surface-free energy govern plaque accumulation on restorations (17). Jones, Billington and Pearson later asked volunteers to rank composite discs with the tongue. Discrimination lay between 0.25 µm and 0.50 µm, and they advised finishing to no more than 0.50 µm if the patient is not to feel the surface (2).</w:t>
+        <w:t>The clinical importance of Ra was established in two independent lines of work. Quirynen and Bollen showed that surface roughness and surface-free energy together determine the amount of plaque that accumulates on restorations (17). Bollen, Lambrechts and Quirynen then reviewed the available evidence and proposed 0.2 µm as the threshold above which bacterial adhesion increases to a clinically relevant degree; surfaces smoother than this showed no further reduction in plaque (1). Jones, Billington and Pearson asked volunteers to rank composite discs of known roughness with the tip of the tongue. Discrimination lay between 0.25 µm and 0.50 µm, and the authors recommended that restorations be finished to no more than 0.50 µm if they are not to be felt (2).</w:t>
       </w:r>
     </w:p>
     <w:p>
@@ -1282,7 +1316,24 @@
           <w:color w:val="000000"/>
           <w:sz w:val="24"/>
         </w:rPr>
-        <w:t>Toothbrushing raises Ra. Heintze and colleagues showed that the increase depends on material, time and load (4). Nanofilled resins, whose small particles wear with the matrix, usually remain smoother than nanohybrids, in which larger fillers are uncovered or lost (8,18). The dentifrice also matters. Monteiro and Spohr found that toothbrushing with different pastes increased roughness of composite resins, although the relationship between relative dentine abrasivity and the final Ra was not straightforward (8).</w:t>
+        <w:t>Toothbrushing raises Ra. Heintze, Forjanic, Ohmiti and Rousson subjected nine composites and two ceramics to simulated brushing at three loads and showed that the increase in roughness and the loss of gloss depended on the material, the load and the duration of brushing. Hybrid and microhybrid pastes deteriorated more with increasing load than did microfilled resins (4). Nanofilled materials, whose particles are small enough to wear with the matrix, generally retain a smoother surface than nanohybrids, in which larger fillers are uncovered or lost (8,18).</w:t>
+      </w:r>
+    </w:p>
+    <w:p>
+      <w:pPr>
+        <w:spacing w:before="0" w:after="0" w:line="480" w:lineRule="auto"/>
+        <w:ind w:firstLine="709"/>
+        <w:jc w:val="both"/>
+      </w:pPr>
+      <w:r>
+        <w:rPr>
+          <w:rFonts w:ascii="Times New Roman" w:hAnsi="Times New Roman" w:eastAsia="Times New Roman"/>
+          <w:b w:val="0"/>
+          <w:i w:val="0"/>
+          <w:color w:val="000000"/>
+          <w:sz w:val="24"/>
+        </w:rPr>
+        <w:t>The dentifrice is an independent variable. da Costa, Adams-Belusko, Riley and Ferracane brushed four composites with Colgate Total (relative dentine abrasivity 70) and with two more abrasive Colgate pastes (RDA 145 and 200). All pastes reduced gloss and increased Ra; the least abrasive paste produced the smallest change, and composites with smaller fillers were less affected than those with larger fillers (25). Monteiro and Spohr, using a different set of dentifrices, also recorded an increase in Ra after simulated brushing but found that the manufacturer’s RDA value did not predict the roughness result in a simple way (8). A single dentifrice was therefore used in the present study, and the results apply to that paste.</w:t>
       </w:r>
     </w:p>
     <w:p>
@@ -1299,7 +1350,7 @@
           <w:color w:val="000000"/>
           <w:sz w:val="26"/>
         </w:rPr>
-        <w:t>2.3 Injectable composites</w:t>
+        <w:t>2.3 Injectable composite resins</w:t>
       </w:r>
     </w:p>
     <w:p>
@@ -1316,7 +1367,7 @@
           <w:color w:val="000000"/>
           <w:sz w:val="24"/>
         </w:rPr>
-        <w:t>Early flowables were not intended for occlusal load (13). Current highly filled injectables are a different material. G-ænial Universal Injectable is filled to about 69 wt% (50 vol%) with ultrafine barium glass and silica, mean size about 150 nm, in a UDMA / Bis-MEPP / TEGDMA matrix (6,18). Beautifil Flow Plus X F00 is a zero-flow giomer injectable containing nano-sized surface pre-reacted glass-ionomer (S-PRG) filler (19). It is not the same product as Beautifil Flow Plus F00, which appears in several earlier papers (6).</w:t>
+        <w:t>The first generation of flowable composites was introduced to improve adaptation in narrow cavities and to serve as liners. Their filler content was deliberately kept low in order to reduce viscosity, and their mechanical properties were correspondingly inferior to those of contemporaneous hybrid pastes (5,13). Baroudi and Rodrigues, in a systematic review, concluded that conventional flowables should not be used as sole restoratives in load-bearing situations (13).</w:t>
       </w:r>
     </w:p>
     <w:p>
@@ -1333,7 +1384,7 @@
           <w:color w:val="000000"/>
           <w:sz w:val="24"/>
         </w:rPr>
-        <w:t>Rajabi et al. compared G-ænial Universal Injectable and Beautifil Flow Plus F00 with a conventional flowable and a nanohybrid paste in two-body wear (200 000 cycles, 49 N, steatite antagonist, dry conditions). The two injectables lost less volume than the paste and the classical flowable, and flexural strength was also higher. The two injectables did not differ from each other (6). That assay measures occlusal-contact wear as volume; it cannot be read as toothbrush mass loss.</w:t>
+        <w:t>Highly filled injectable resins are a later development. G-ænial Universal Injectable contains ultrafine barium glass and silica with a mean particle size of about 150 nm, giving a filler load of 69 wt% (50 vol%) in a matrix of urethane dimethacrylate, Bis-MEPP and triethylene glycol dimethacrylate (6,18). Beautifil Flow Plus X F00 is a zero-flow giomer injectable that incorporates nano-sized surface pre-reacted glass-ionomer (S-PRG) filler (19). It should not be confused with Beautifil Flow Plus F00, an earlier product that appears in several laboratory papers (6). The distinction matters when results are compared.</w:t>
       </w:r>
     </w:p>
     <w:p>
@@ -1350,7 +1401,7 @@
           <w:color w:val="000000"/>
           <w:sz w:val="24"/>
         </w:rPr>
-        <w:t>Hasan, Eltoukhy and Zaghloul brushed G-ænial Universal Injectable, a nanofilled paste and a nanohybrid composite for times taken to represent six months and one year. After abrasion the injectable had the lowest Ra and the nanohybrid was the roughest; the two nanofilled resins did not differ (18). That design is closer to the present study.</w:t>
+        <w:t>Rajabi, Denny, Karagiannopoulos and Petridis compared G-ænial Universal Injectable and Beautifil Flow Plus F00 with a conventional flowable (Tetric EvoFlow) and a nanohybrid paste (IPS Empress Direct) in two-body wear. Specimens were cycled 200 000 times against a steatite antagonist at 49 N under dry conditions, a regimen intended to represent approximately one year of occlusal contact. Both injectables lost less volume and showed higher flexural strength than the paste and the classical flowable; the two injectables did not differ from each other (6). The finding is favourable to highly filled injectables, but the wear mode is two-body contact without toothpaste. It cannot be transferred to a toothbrushing assay.</w:t>
       </w:r>
     </w:p>
     <w:p>
@@ -1367,7 +1418,24 @@
           <w:color w:val="000000"/>
           <w:sz w:val="24"/>
         </w:rPr>
-        <w:t>A 2025 systematic review of highly filled flowables used as sole restoratives concluded that optical properties are generally adequate but that mechanical properties remain inferior to those of medium-viscosity composites, and advised caution in extensive cavities, load-bearing areas and patients with parafunction (20). Material-to-material scatter remains the rule, and toothbrush abrasion of Beautifil Flow Plus X F00 against Beautifil II LS was not among the comparisons reviewed.</w:t>
+        <w:t>Hasan, Eltoukhy and Zaghloul examined surface roughness after simulated toothbrushing of G-ænial Universal Injectable, a nanofilled paste (Filtek Z350 XT) and a nanohybrid (Tetric N-Ceram). Brushing times of 30 and 60 minutes were taken to represent six months and one year of daily hygiene. Ra increased in all groups. The injectable recorded the lowest mean roughness and the nanohybrid the highest; the two nanofilled resins did not differ significantly (18). That design is closer to the present study, although the nanohybrid control and the injectable giomer were not the products tested here.</w:t>
+      </w:r>
+    </w:p>
+    <w:p>
+      <w:pPr>
+        <w:spacing w:before="0" w:after="0" w:line="480" w:lineRule="auto"/>
+        <w:ind w:firstLine="709"/>
+        <w:jc w:val="both"/>
+      </w:pPr>
+      <w:r>
+        <w:rPr>
+          <w:rFonts w:ascii="Times New Roman" w:hAnsi="Times New Roman" w:eastAsia="Times New Roman"/>
+          <w:b w:val="0"/>
+          <w:i w:val="0"/>
+          <w:color w:val="000000"/>
+          <w:sz w:val="24"/>
+        </w:rPr>
+        <w:t>Tzimas, Pappa, Fostiropoulou, Papazoglou and Rahiotis reviewed highly filled flowable resins used as sole restoratives. They concluded that optical properties are generally adequate, that mechanical properties remain inferior to those of medium-viscosity composites, and that laboratory drawbacks may contraindicate use in extensive cavities, load-bearing areas and patients with parafunction, despite a small number of randomised trials that reported acceptable early performance in Class I and II restorations (20). Material-to-material scatter is the rule, and a toothbrushing comparison of Beautifil Flow Plus X F00 with Beautifil II LS was not among the studies they included.</w:t>
       </w:r>
     </w:p>
     <w:p>
@@ -1401,7 +1469,7 @@
           <w:color w:val="000000"/>
           <w:sz w:val="24"/>
         </w:rPr>
-        <w:t>Nanohybrid pastes combine nano-sized particles with larger submicron or micron fillers. Total inorganic load commonly exceeds 70–80 wt% (11). Beautifil II LS is such a paste: filler load is 83 wt%, the resin uses an SRS monomer intended to reduce shrinkage, and the filler includes S-PRG glass (19). S-PRG is a three-layered filler with a fluoro-boro-aluminosilicate core, a pre-reacted glass-ionomer phase and a silica coating; it releases fluoride, strontium, borate, sodium, silicate and aluminium ions (23). The same ion-exchange behaviour can roughen the surface under acidic challenge (21). Once the matrix is brushed away, larger and irregular fillers leave a higher Ra than a uniform nanofilled injectable (18).</w:t>
+        <w:t>Nanohybrid composites combine nano-sized particles with larger submicron or micron fillers. The dual size distribution is intended to increase packing density, improve polishability and raise filler load, which commonly exceeds 70–80 wt% (11). Beautifil II LS belongs to this class. Its filler load is 83 wt%. The resin employs an SRS monomer formulated for low shrinkage, and the filler includes S-PRG glass together with pre-polymerised particles (19).</w:t>
       </w:r>
     </w:p>
     <w:p>
@@ -1418,7 +1486,7 @@
           <w:color w:val="000000"/>
           <w:sz w:val="24"/>
         </w:rPr>
-        <w:t>An eight-year clinical series of an earlier giomer paste (Beautifil with a self-etch primer) showed acceptable retention and little secondary caries in the teeth available for recall (22). That is clinical behaviour of a related material, not toothbrush Ra of Beautifil II LS; it only establishes that S-PRG pastes have been used as definitive restoratives for years.</w:t>
+        <w:t>S-PRG filler is a three-layered particle: a fluoro-boro-aluminosilicate glass core, a pre-reacted glass-ionomer hydrogel phase and an outer silica coating. It releases fluoride, strontium, borate, sodium, silicate and aluminium ions and can be recharged with fluoride (23). These ion-exchange properties are the basis of the giomer concept and are clinically attractive. They are not, however, a guarantee of surface stability. Yap and colleagues showed that chemical challenge can roughen composite surfaces by softening the matrix and exposing filler (21), and the same ion-exchange behaviour that buffers acid may leave a more irregular topography once the resin-rich layer has been brushed away. Larger and irregular fillers, once uncovered, produce a higher Ra than a uniform nanofilled injectable (18).</w:t>
       </w:r>
     </w:p>
     <w:p>
@@ -1435,7 +1503,24 @@
           <w:color w:val="000000"/>
           <w:sz w:val="24"/>
         </w:rPr>
-        <w:t>Packable nanohybrids remain the clinical reference for posterior direct work. They are harder to adapt in a narrow box and more likely to trap voids. Injectable products were developed to close that handling gap without sacrificing wear resistance. Whether they do so under toothbrush abrasion is the question addressed by this thesis.</w:t>
+        <w:t>Clinical evidence for giomer pastes is longer than the laboratory record for Beautifil II LS. Gordan, Mondragon, Watson, Garvan and Mjör followed an earlier Beautifil restoration placed with a self-etch primer for eight years and reported acceptable retention with little secondary caries in the teeth available for recall (22). That series establishes that S-PRG pastes have been used as definitive restoratives for many years. It does not describe the toothbrush roughness of Beautifil II LS.</w:t>
+      </w:r>
+    </w:p>
+    <w:p>
+      <w:pPr>
+        <w:spacing w:before="0" w:after="0" w:line="480" w:lineRule="auto"/>
+        <w:ind w:firstLine="709"/>
+        <w:jc w:val="both"/>
+      </w:pPr>
+      <w:r>
+        <w:rPr>
+          <w:rFonts w:ascii="Times New Roman" w:hAnsi="Times New Roman" w:eastAsia="Times New Roman"/>
+          <w:b w:val="0"/>
+          <w:i w:val="0"/>
+          <w:color w:val="000000"/>
+          <w:sz w:val="24"/>
+        </w:rPr>
+        <w:t>Packable nanohybrids remain the clinical reference for posterior direct work because of their handling familiarity and their documented wear record (11). Their viscosity makes them more difficult to adapt in a narrow box and more likely to incorporate voids. Injectable products were introduced to close that handling gap. Whether they do so without a penalty in toothbrush wear or surface roughness is the question that the present experiment was designed to answer.</w:t>
       </w:r>
     </w:p>
     <w:p>
@@ -1452,7 +1537,7 @@
           <w:color w:val="000000"/>
           <w:sz w:val="26"/>
         </w:rPr>
-        <w:t>2.5 What remains unclear</w:t>
+        <w:t>2.5 Statement of the problem</w:t>
       </w:r>
     </w:p>
     <w:p>
@@ -1469,7 +1554,7 @@
           <w:color w:val="000000"/>
           <w:sz w:val="24"/>
         </w:rPr>
-        <w:t>Two-body wear of G-ænial Universal Injectable and Beautifil Flow Plus F00 is favourable in one recent laboratory study (6). Toothbrush Ra of G-ænial Universal Injectable is favourable against a nanohybrid in another (18). Beautifil Flow Plus X F00 and Beautifil II LS have not been placed beside G-ænial Universal Injectable in the same 10 000-cycle, 2 N, gravimetric-plus-Ra protocol. That is the gap the present experiment fills.</w:t>
+        <w:t>Two-body wear of G-ænial Universal Injectable and Beautifil Flow Plus F00 is favourable in one recent laboratory study (6). Toothbrush roughness of G-ænial Universal Injectable is favourable against a different nanohybrid in another (18). Beautifil Flow Plus X F00 and Beautifil II LS have not been placed beside G-ænial Universal Injectable in a single protocol that records both gravimetric loss and Ra after 10 000 cycles at 2 N. That comparison is the subject of this thesis.</w:t>
       </w:r>
     </w:p>
     <w:p>
@@ -1537,7 +1622,7 @@
           <w:color w:val="000000"/>
           <w:sz w:val="24"/>
         </w:rPr>
-        <w:t>The study was an in-vitro comparison of three resin composites. Thirty-six discs, 10 mm in diameter and 1 mm thick, were prepared in a CAD/CAM Teflon mould and allocated at random to three groups of twelve. An initial G*Power estimate had indicated ten discs per group; twelve were used in order to increase statistical power.</w:t>
+        <w:t>The investigation was a comparative in-vitro study of three commercially available resin composites. Thirty-six disc-shaped specimens, 10 mm in diameter and 1 mm thick, were prepared in a CAD/CAM Teflon mould. The discs were allocated at random to three equal groups (n = 12) according to the restorative material. An initial sample-size calculation in G*Power had indicated ten specimens per group; twelve were prepared in order to increase the power of the subsequent comparisons.</w:t>
       </w:r>
     </w:p>
     <w:p>
@@ -1560,7 +1645,7 @@
     <w:p>
       <w:pPr>
         <w:spacing w:before="0" w:after="0" w:line="480" w:lineRule="auto"/>
-        <w:ind w:firstLine="0"/>
+        <w:ind w:firstLine="709"/>
         <w:jc w:val="both"/>
       </w:pPr>
       <w:r>
@@ -1571,7 +1656,7 @@
           <w:color w:val="000000"/>
           <w:sz w:val="24"/>
         </w:rPr>
-        <w:t>1. G-ænial Universal Injectable — highly filled injectable composite, GC Corporation, Tokyo, Japan.</w:t>
+        <w:t>The materials used were:</w:t>
       </w:r>
     </w:p>
     <w:p>
@@ -1588,7 +1673,7 @@
           <w:color w:val="000000"/>
           <w:sz w:val="24"/>
         </w:rPr>
-        <w:t>2. Beautifil Flow Plus X F00 — highly filled injectable giomer, Shofu Inc., Kyoto, Japan.</w:t>
+        <w:t>1. G-ænial Universal Injectable — highly filled nanofilled injectable composite (GC Corporation, Tokyo, Japan).</w:t>
       </w:r>
     </w:p>
     <w:p>
@@ -1605,7 +1690,24 @@
           <w:color w:val="000000"/>
           <w:sz w:val="24"/>
         </w:rPr>
-        <w:t>3. Beautifil II LS — conventional nanohybrid giomer, Shofu Inc., Kyoto, Japan.</w:t>
+        <w:t>2. Beautifil Flow Plus X F00 — highly filled injectable giomer of zero-flow consistency (Shofu Inc., Kyoto, Japan).</w:t>
+      </w:r>
+    </w:p>
+    <w:p>
+      <w:pPr>
+        <w:spacing w:before="0" w:after="0" w:line="480" w:lineRule="auto"/>
+        <w:ind w:firstLine="0"/>
+        <w:jc w:val="both"/>
+      </w:pPr>
+      <w:r>
+        <w:rPr>
+          <w:rFonts w:ascii="Times New Roman" w:hAnsi="Times New Roman" w:eastAsia="Times New Roman"/>
+          <w:b w:val="0"/>
+          <w:i w:val="0"/>
+          <w:color w:val="000000"/>
+          <w:sz w:val="24"/>
+        </w:rPr>
+        <w:t>3. Beautifil II LS — conventional low-shrinkage nanohybrid giomer (Shofu Inc., Kyoto, Japan).</w:t>
       </w:r>
     </w:p>
     <w:p>
@@ -1640,6 +1742,23 @@
           <w:sz w:val="24"/>
         </w:rPr>
         <w:t>5. Distilled water.</w:t>
+      </w:r>
+    </w:p>
+    <w:p>
+      <w:pPr>
+        <w:spacing w:before="0" w:after="0" w:line="480" w:lineRule="auto"/>
+        <w:ind w:firstLine="709"/>
+        <w:jc w:val="both"/>
+      </w:pPr>
+      <w:r>
+        <w:rPr>
+          <w:rFonts w:ascii="Times New Roman" w:hAnsi="Times New Roman" w:eastAsia="Times New Roman"/>
+          <w:b w:val="0"/>
+          <w:i w:val="0"/>
+          <w:color w:val="000000"/>
+          <w:sz w:val="24"/>
+        </w:rPr>
+        <w:t>The composition of the three resins, as stated by the manufacturers, is summarised in Table 3.1.</w:t>
       </w:r>
     </w:p>
     <w:p>
@@ -2380,6 +2499,23 @@
     </w:p>
     <w:p>
       <w:pPr>
+        <w:spacing w:before="0" w:after="0" w:line="480" w:lineRule="auto"/>
+        <w:ind w:firstLine="709"/>
+        <w:jc w:val="both"/>
+      </w:pPr>
+      <w:r>
+        <w:rPr>
+          <w:rFonts w:ascii="Times New Roman" w:hAnsi="Times New Roman" w:eastAsia="Times New Roman"/>
+          <w:b w:val="0"/>
+          <w:i w:val="0"/>
+          <w:color w:val="000000"/>
+          <w:sz w:val="24"/>
+        </w:rPr>
+        <w:t>Colgate Total was selected as the dentifrice because it is a widely used daily paste of moderate abrasivity and because it has been employed as the low-RDA reference paste in previous toothbrushing studies of resin composites (25).</w:t>
+      </w:r>
+    </w:p>
+    <w:p>
+      <w:pPr>
         <w:spacing w:before="240" w:after="120" w:line="480" w:lineRule="auto"/>
         <w:ind w:firstLine="0"/>
         <w:jc w:val="left"/>
@@ -2409,7 +2545,7 @@
           <w:color w:val="000000"/>
           <w:sz w:val="24"/>
         </w:rPr>
-        <w:t>Each material was placed in the Teflon mould. A matrix strip and glass plate were used to exclude air from the surface and to keep the disc flat. Polymerisation followed the manufacturer’s instructions for that product. Flash was removed. The discs were identified by group and stored in distilled water until testing.</w:t>
+        <w:t>Each material was placed in the Teflon mould. A transparent matrix strip and a glass plate were applied to exclude air from the test face and to produce a flat surface of uniform thickness. Polymerisation was carried out according to the manufacturer’s instructions for the product concerned. Excess flash was removed. The discs were identified by group and stored in distilled water until the baseline measurements were made.</w:t>
       </w:r>
     </w:p>
     <w:p>
@@ -2443,7 +2579,7 @@
           <w:color w:val="000000"/>
           <w:sz w:val="24"/>
         </w:rPr>
-        <w:t>Each disc was dried and weighed on an analytical balance. The recorded masses run to 0.0001 g, indicating that the balance read to 0.1 mg. Ra was measured with a contact profilometer on the test face. The value used for analysis was the mean of the traces taken on that disc.</w:t>
+        <w:t>Each disc was dried and weighed on an analytical balance. The recorded masses are given to 0.0001 g, so the balance read to 0.1 mg. Surface roughness was measured on the test face with a contact profilometer. Ra was determined according to the definition in ISO 4287 (16). The value entered for analysis was the mean of the traces taken on that disc.</w:t>
       </w:r>
     </w:p>
     <w:p>
@@ -2460,7 +2596,7 @@
           <w:color w:val="000000"/>
           <w:sz w:val="26"/>
         </w:rPr>
-        <w:t>3.5 Toothbrushing</w:t>
+        <w:t>3.5 Toothbrushing protocol</w:t>
       </w:r>
     </w:p>
     <w:p>
@@ -2477,7 +2613,7 @@
           <w:color w:val="000000"/>
           <w:sz w:val="24"/>
         </w:rPr>
-        <w:t>Discs were mounted in a toothbrushing simulator. A slurry of Colgate Total and water was prepared according to ISO 11609 and ISO/TR 14569-1 guidance (3,14). The brush load was 2 N, within the ISO range of 0.5–2.5 N (3). Each disc received 10 000 cycles, the conventional laboratory equivalent of one year of twice-daily brushing (7,8). Fresh slurry was used as required to keep the abrasive present. After the test the discs were rinsed free of paste.</w:t>
+        <w:t>The discs were mounted in a toothbrushing simulator. A slurry of Colgate Total and distilled water was prepared in accordance with the guidance of ISO 11609 and ISO/TR 14569-1 (3,14). The brush load was set at 2 N, which lies within the ISO range of 0.5–2.5 N (3). Each disc received 10 000 cycles. That count is the conventional laboratory equivalent of one year of twice-daily brushing, following the estimate of Sexson and Phillips (7,8). Fresh slurry was supplied as required so that abrasive was present throughout the test. At the end of the run the discs were rinsed free of paste and dried.</w:t>
       </w:r>
     </w:p>
     <w:p>
@@ -2494,7 +2630,7 @@
           <w:color w:val="000000"/>
           <w:sz w:val="26"/>
         </w:rPr>
-        <w:t>3.6 Post-test measurements</w:t>
+        <w:t>3.6 Post-test measurements and calculations</w:t>
       </w:r>
     </w:p>
     <w:p>
@@ -2528,7 +2664,7 @@
           <w:color w:val="000000"/>
           <w:sz w:val="24"/>
         </w:rPr>
-        <w:t>Percentage weight loss = [(W₁ − W₂) / W₁] × 100</w:t>
+        <w:t>Percentage weight loss was calculated for each disc as</w:t>
       </w:r>
     </w:p>
     <w:p>
@@ -2545,7 +2681,7 @@
           <w:color w:val="000000"/>
           <w:sz w:val="24"/>
         </w:rPr>
-        <w:t>where W₁ and W₂ are mass before and after brushing.</w:t>
+        <w:t>[(W₁ − W₂) / W₁] × 100</w:t>
       </w:r>
     </w:p>
     <w:p>
@@ -2562,7 +2698,41 @@
           <w:color w:val="000000"/>
           <w:sz w:val="24"/>
         </w:rPr>
-        <w:t>Absolute loss (mg) = (W₁ − W₂) × 1000.</w:t>
+        <w:t>where W₁ and W₂ are the masses before and after brushing. The group value reported in Table 4.1 is the mean of these per-disc ratios, not the ratio of the group-mean masses. The distinction is material in a group that contains an outlier.</w:t>
+      </w:r>
+    </w:p>
+    <w:p>
+      <w:pPr>
+        <w:spacing w:before="0" w:after="0" w:line="480" w:lineRule="auto"/>
+        <w:ind w:firstLine="709"/>
+        <w:jc w:val="both"/>
+      </w:pPr>
+      <w:r>
+        <w:rPr>
+          <w:rFonts w:ascii="Times New Roman" w:hAnsi="Times New Roman" w:eastAsia="Times New Roman"/>
+          <w:b w:val="0"/>
+          <w:i w:val="0"/>
+          <w:color w:val="000000"/>
+          <w:sz w:val="24"/>
+        </w:rPr>
+        <w:t>Absolute loss in milligrams was calculated as (W₁ − W₂) × 1000.</w:t>
+      </w:r>
+    </w:p>
+    <w:p>
+      <w:pPr>
+        <w:spacing w:before="0" w:after="0" w:line="480" w:lineRule="auto"/>
+        <w:ind w:firstLine="709"/>
+        <w:jc w:val="both"/>
+      </w:pPr>
+      <w:r>
+        <w:rPr>
+          <w:rFonts w:ascii="Times New Roman" w:hAnsi="Times New Roman" w:eastAsia="Times New Roman"/>
+          <w:b w:val="0"/>
+          <w:i w:val="0"/>
+          <w:color w:val="000000"/>
+          <w:sz w:val="24"/>
+        </w:rPr>
+        <w:t>The change in roughness was calculated for each disc as</w:t>
       </w:r>
     </w:p>
     <w:p>
@@ -2584,23 +2754,6 @@
     </w:p>
     <w:p>
       <w:pPr>
-        <w:spacing w:before="0" w:after="0" w:line="480" w:lineRule="auto"/>
-        <w:ind w:firstLine="709"/>
-        <w:jc w:val="both"/>
-      </w:pPr>
-      <w:r>
-        <w:rPr>
-          <w:rFonts w:ascii="Times New Roman" w:hAnsi="Times New Roman" w:eastAsia="Times New Roman"/>
-          <w:b w:val="0"/>
-          <w:i w:val="0"/>
-          <w:color w:val="000000"/>
-          <w:sz w:val="24"/>
-        </w:rPr>
-        <w:t>Percentage weight loss was calculated as the mean of the per-disc ratios, not as the ratio of the group-mean masses.</w:t>
-      </w:r>
-    </w:p>
-    <w:p>
-      <w:pPr>
         <w:spacing w:before="240" w:after="120" w:line="480" w:lineRule="auto"/>
         <w:ind w:firstLine="0"/>
         <w:jc w:val="left"/>
@@ -2630,7 +2783,7 @@
           <w:color w:val="000000"/>
           <w:sz w:val="24"/>
         </w:rPr>
-        <w:t>Descriptive values are reported as mean ± standard deviation. Percentage weight loss was compared among groups by one-way ANOVA. Ra after brushing was compared by the Kruskal–Wallis test, with pairwise post-hoc comparisons. Significance was set at α = 0.05.</w:t>
+        <w:t>Descriptive statistics are presented as mean ± standard deviation. Percentage weight loss was compared among the three groups by one-way analysis of variance. Ra after brushing was compared by the Kruskal–Wallis test, with pairwise post-hoc comparisons between groups. The choice of a parametric test for weight loss and a non-parametric test for roughness follows the distributions of the two outcomes in the experimental spreadsheet. The level of significance was set at α = 0.05.</w:t>
       </w:r>
     </w:p>
     <w:p>
@@ -4859,7 +5012,7 @@
           <w:color w:val="000000"/>
           <w:sz w:val="24"/>
         </w:rPr>
-        <w:t>The first null hypothesis is retained. The second is rejected. The three resins lost a statistically similar fraction of their mass, but they did not finish with a similar surface roughness.</w:t>
+        <w:t>The first null hypothesis is retained and the second is rejected. After 10 000 toothbrushing cycles at 2 N the three resins could not be distinguished on percentage weight loss, but they finished with significantly different surface roughness. The discussion that follows treats these two outcomes separately, because they describe different aspects of surface degradation and because they do not point to the same clinical conclusion.</w:t>
       </w:r>
     </w:p>
     <w:p>
@@ -4876,7 +5029,7 @@
           <w:color w:val="000000"/>
           <w:sz w:val="26"/>
         </w:rPr>
-        <w:t>5.1 Weight loss</w:t>
+        <w:t>5.1 Interpretation of the weight-loss findings</w:t>
       </w:r>
     </w:p>
     <w:p>
@@ -4893,7 +5046,7 @@
           <w:color w:val="000000"/>
           <w:sz w:val="24"/>
         </w:rPr>
-        <w:t>A non-significant ANOVA (p = 0.329) is not proof of equal wear; it is a failure to reject equality. Beautifil Flow Plus X F00 had a standard deviation of 3.14 % beside a mean of 1.49 %. That spread is produced by the outlying disc (approximately 11.4 %, 20.7 mg). Residual variance rises and power falls. The other eleven discs in that group, and the twenty-four discs in the other groups, lost between 0.1 mg and 1.9 mg. On that restricted view the three materials are close.</w:t>
+        <w:t>A non-significant analysis of variance (p = 0.329) is not evidence that the three materials wear equally. It is a failure to reject the hypothesis of equality under the conditions of this test. The mean percentage losses — 1.49 ± 3.14 % for Beautifil Flow Plus X F00, 0.65 ± 0.37 % for G-ænial Universal Injectable and 0.41 ± 0.25 % for Beautifil II LS — lie in the same numerical range once the outlying specimen is recognised. That specimen, a single Beautifil Flow Plus X F00 disc that lost approximately 11.4 % of its mass (20.7 mg), inflates both the group mean and, more importantly, the residual variance. With the variance enlarged, the power of the ANOVA to detect a genuine difference among the remaining discs is reduced. The other eleven discs in that group, and all twenty-four discs in the other two groups, lost between 0.1 mg and 1.9 mg. Viewed in that way, the three materials behaved similarly.</w:t>
       </w:r>
     </w:p>
     <w:p>
@@ -4910,7 +5063,7 @@
           <w:color w:val="000000"/>
           <w:sz w:val="24"/>
         </w:rPr>
-        <w:t>Beautifil II LS started heavier. Percentage loss on a heavier disc is a smaller number for the same milligrams lost, which is why absolute loss is the fairer comparison: 0.95 ± 0.58 mg against 1.07 ± 0.62 mg for G-ænial Universal Injectable. Those two means lie near each other. The nanofilled injectable did not lose more mass than the 83 wt% nanohybrid under this slurry.</w:t>
+        <w:t>Beautifil II LS discs were heavier at baseline (0.2313 ± 0.0154 g) than the two injectables (approximately 0.16 g). The difference is a consequence of filler load and density, not of disc dimensions. Percentage loss on a heavier disc is a smaller number for the same milligrams removed, which is why absolute loss is the fairer comparison between groups: 0.95 ± 0.58 mg for Beautifil II LS against 1.07 ± 0.62 mg for G-ænial Universal Injectable. Those two means are close. The nanofilled injectable, despite a lower filler weight fraction than the nanohybrid, did not lose more mass under this slurry.</w:t>
       </w:r>
     </w:p>
     <w:p>
@@ -4927,7 +5080,7 @@
           <w:color w:val="000000"/>
           <w:sz w:val="24"/>
         </w:rPr>
-        <w:t>Rajabi et al. found less volumetric two-body wear for G-ænial Universal Injectable and Beautifil Flow Plus F00 than for a nanohybrid paste (6). The direction is favourable to injectables, but the test is not the same. They used 200 000 chewing cycles, a 49 N load and a steatite ball, without toothpaste, and they measured volume. Beautifil Flow Plus F00 is also not Beautifil Flow Plus X F00. Agreement can be stated only as a general remark: highly filled injectables are not automatically the weaker partner in a wear assay.</w:t>
+        <w:t>The finding is consistent, in direction if not in method, with the two-body data of Rajabi et al., who reported lower volumetric wear for G-ænial Universal Injectable and Beautifil Flow Plus F00 than for a nanohybrid paste (6). Their test used 200 000 chewing cycles, a 49 N load and a steatite antagonist, without toothpaste, and they measured volume rather than mass. Beautifil Flow Plus F00 is, in addition, a different product from Beautifil Flow Plus X F00. The most that can be said is that highly filled injectables are not automatically the weaker partner when wear is measured in the laboratory. Condon and Ferracane’s observation that wear rises once filler volume falls below 48 vol% is also relevant: G-ænial Universal Injectable is listed at 50 vol%, just above that step (12).</w:t>
       </w:r>
     </w:p>
     <w:p>
@@ -4944,7 +5097,7 @@
           <w:color w:val="000000"/>
           <w:sz w:val="24"/>
         </w:rPr>
-        <w:t>The reason one disc lost 20.7 mg is not known. A void, an under-cured layer or a weighing error would all produce that point. The value was retained and is footnoted in Table 4.2. Any later re-analysis that excludes it must say so.</w:t>
+        <w:t>The origin of the 20.7 mg loss is not known. A subsurface void, an incompletely polymerised layer or an error in weighing would each produce an isolated high value. The specimen was retained and is identified in Table 4.2, because silent exclusion of an inconvenient point is not acceptable. Any subsequent analysis that omits it should present both the complete and the restricted data sets.</w:t>
       </w:r>
     </w:p>
     <w:p>
@@ -4961,7 +5114,7 @@
           <w:color w:val="000000"/>
           <w:sz w:val="26"/>
         </w:rPr>
-        <w:t>5.2 Surface roughness</w:t>
+        <w:t>5.2 Interpretation of the roughness findings</w:t>
       </w:r>
     </w:p>
     <w:p>
@@ -4978,7 +5131,7 @@
           <w:color w:val="000000"/>
           <w:sz w:val="24"/>
         </w:rPr>
-        <w:t>The roughness result is more decisive. The nanohybrid was rougher before brushing and rougher after it. ΔRa was also largest in that group, with a wide spread (0.075 ± 0.066 µm). G-ænial Universal Injectable changed the least (0.046 ± 0.023 µm). Beautifil Flow Plus X F00 started smoothest and finished statistically indistinguishable from G-ænial Universal Injectable.</w:t>
+        <w:t>The roughness result is the clearer of the two outcomes. Beautifil II LS was the roughest material before brushing (0.119 ± 0.054 µm) and remained the roughest after it (0.194 ± 0.050 µm). Its mean ΔRa was also the largest (0.075 ± 0.066 µm). G-ænial Universal Injectable changed the least (0.046 ± 0.023 µm). Beautifil Flow Plus X F00 started with the lowest baseline Ra (0.038 ± 0.011 µm) and finished statistically indistinguishable from G-ænial Universal Injectable (0.104 ± 0.017 µm versus 0.100 ± 0.023 µm). The Kruskal–Wallis test on Ra after brushing was significant (p &lt; 0.001), and the pairwise comparisons separated the nanohybrid from each injectable but not the two injectables from each other.</w:t>
       </w:r>
     </w:p>
     <w:p>
@@ -4995,7 +5148,7 @@
           <w:color w:val="000000"/>
           <w:sz w:val="24"/>
         </w:rPr>
-        <w:t>That pattern is consistent with filler geometry. A nanofilled injectable with approximately 150 nm barium glass and silica wears more evenly (6,18). A nanohybrid with larger S-PRG and pre-polymerised particles loses matrix first; the large fillers then stand proud or leave pits (4,18). Hasan, Eltoukhy and Zaghloul observed the same order after simulated brushing: G-ænial Universal Injectable smoother than a nanohybrid, and two nanofilled resins not different from each other (18). Heintze et al. had already shown that hybrid and microhybrid pastes roughen more with load and time than microfilled resins (4).</w:t>
+        <w:t>This order is the order predicted by filler geometry. A nanofilled injectable whose particles are of the order of 150 nm wears more uniformly, because the particles are small enough to be lost with the matrix rather than to stand proud of it (6,18,24). A nanohybrid that contains larger S-PRG and pre-polymerised particles loses the resin-rich surface first; the larger fillers are then uncovered or plucked, leaving a coarser profile (4,18). Hasan, Eltoukhy and Zaghloul recorded the same ranking after simulated brushing of G-ænial Universal Injectable against a nanofilled paste and a nanohybrid: the injectable was the smoothest, the nanohybrid the roughest, and the two nanofilled resins did not differ (18). Heintze et al. had already shown that hybrid and microhybrid pastes deteriorate more with load and time than microfilled resins (4), and da Costa et al. found that composites with smaller average fillers lost less gloss and gained less roughness when brushed with Colgate Total (25). The present results sit within that literature rather than against it.</w:t>
       </w:r>
     </w:p>
     <w:p>
@@ -5012,7 +5165,7 @@
           <w:color w:val="000000"/>
           <w:sz w:val="24"/>
         </w:rPr>
-        <w:t>The 0.2 µm line is the clinically useful one (1,17). Both injectables ended near 0.10 µm and remain, on the mean, in the range where further smoothing is not expected to reduce plaque. Beautifil II LS ended at 0.194 ± 0.050 µm. The mean is acceptable on the published threshold, but the spread is not entirely below it. None of the means approach the 0.50 µm tongue threshold (2). Patients would not be expected to feel these surfaces after one year of this brushing model. Biofilm risk is the sharper distinction, and it applies to the nanohybrid group.</w:t>
+        <w:t>The 0.2 µm threshold of Bollen, Lambrechts and Quirynen remains the clinically useful reference (1,17). Both injectable means finished near 0.10 µm and therefore remain, on average, in the range where further polishing is not expected to reduce plaque. The Beautifil II LS mean of 0.194 µm lies on the threshold. The standard deviation of 0.050 µm indicates that a proportion of discs in that group exceeded 0.2 µm, a point that is visible as the upper error bar in Figure 4.2. None of the group means approached the 0.50 µm tongue-detection threshold of Jones et al. (2). Patients would not be expected to feel these surfaces after one laboratory year of this brushing model. The distinction that matters is biofilm risk, and it applies to the nanohybrid group.</w:t>
       </w:r>
     </w:p>
     <w:p>
@@ -5029,7 +5182,7 @@
           <w:color w:val="000000"/>
           <w:sz w:val="24"/>
         </w:rPr>
-        <w:t>The ΔRa standard deviation of Beautifil II LS (0.066 µm) exceeds both its baseline and its final Ra standard deviations. That pattern requires a negative within-disc correlation — the roughest discs becoming relatively smoother and the smoothest becoming rougher — and is consistent with ΔRa having been computed per disc before averaging.</w:t>
+        <w:t>The ΔRa standard deviation of Beautifil II LS (0.066 µm) is larger than both its baseline and its final Ra standard deviations. That pattern is possible only if the change in roughness is negatively correlated within discs — the roughest specimens becoming relatively smoother and the smoothest becoming rougher — and it is consistent with ΔRa having been calculated per disc before the group mean was formed.</w:t>
       </w:r>
     </w:p>
     <w:p>
@@ -5063,7 +5216,7 @@
           <w:color w:val="000000"/>
           <w:sz w:val="24"/>
         </w:rPr>
-        <w:t>Within this protocol the two injectable resins may be used where toothbrush abrasion is the wear of interest without paying a roughness penalty against Beautifil II LS. They do not, on these data, wear less. They finish smoother. That matters on freely cleanable surfaces and at margins. It does not license a claim that they survive occlusal contact better, because occlusal contact was not tested. The caution expressed by Tzimas et al. regarding load-bearing use of highly filled flowables therefore still stands (20).</w:t>
+        <w:t>Within the limits of this protocol, the two injectable resins may be used on surfaces that are subject to toothbrush abrasion without a roughness penalty relative to Beautifil II LS. They do not, on these data, wear less. They finish smoother. A smoother surface after hygiene is an advantage on freely cleanable faces and at accessible margins, where plaque retention and stain are the practical concerns (1,17). The result does not support a claim that the same materials will resist occlusal contact wear as well as, or better than, a packable nanohybrid, because occlusal contact was not tested. The caution of Tzimas et al., that laboratory mechanical properties of highly filled flowables remain inferior to those of medium-viscosity composites and that use in extensive load-bearing cavities should be considered carefully, is therefore not displaced by the present findings (20).</w:t>
       </w:r>
     </w:p>
     <w:p>
@@ -5080,7 +5233,7 @@
           <w:color w:val="000000"/>
           <w:sz w:val="24"/>
         </w:rPr>
-        <w:t>Beautifil II LS remains a reasonable packable control. Its higher baseline Ra may reflect filler size, the finishing sequence, or both. If the nanohybrid was left with a coarser finish, part of the after-brushing difference was already present at baseline. The after-brushing comparison is nevertheless valid: the groups were compared as they stood after the same abrasion.</w:t>
+        <w:t>Beautifil II LS remains a reasonable packable control. Its higher baseline Ra may reflect the size and distribution of its fillers, the finishing of the disc, or both. If the nanohybrid was left with a coarser as-cured or as-finished surface, part of the after-brushing difference was already present at baseline. The comparison after abrasion is nevertheless valid: the three groups were treated identically and were compared as they stood at the end of the test.</w:t>
       </w:r>
     </w:p>
     <w:p>
@@ -5097,7 +5250,7 @@
           <w:color w:val="000000"/>
           <w:sz w:val="26"/>
         </w:rPr>
-        <w:t>5.4 Strengths</w:t>
+        <w:t>5.4 Strengths of the study</w:t>
       </w:r>
     </w:p>
     <w:p>
@@ -5114,7 +5267,7 @@
           <w:color w:val="000000"/>
           <w:sz w:val="24"/>
         </w:rPr>
-        <w:t>The three products are current commercial materials and include the X-generation Flow Plus rather than the earlier F00 formulation. Sample size was twelve rather than ten. Both mass and Ra were recorded on the same discs. The brushing load and cycle count follow published ISO and Sexson–Phillips figures (3,7). The statistical tests match the distributions of the two outcomes. The outlying specimen was retained and identified rather than silently excluded.</w:t>
+        <w:t>The three products are current commercial materials, and the Shofu injectable is the X-generation Flow Plus rather than the earlier F00 formulation used by Rajabi et al. (6). Twelve specimens were tested in each group rather than the ten indicated by the original power calculation. Mass and Ra were recorded on the same discs, so the two outcomes describe the same surfaces. The brushing load and the cycle count follow published ISO guidance and the Sexson–Phillips estimate (3,7). The statistical tests were chosen to match the distributions of the two outcomes. The outlying specimen was retained and identified rather than discarded.</w:t>
       </w:r>
     </w:p>
     <w:p>
@@ -5131,7 +5284,7 @@
           <w:color w:val="000000"/>
           <w:sz w:val="26"/>
         </w:rPr>
-        <w:t>5.5 Limitations</w:t>
+        <w:t>5.5 Limitations of the study</w:t>
       </w:r>
     </w:p>
     <w:p>
@@ -5148,7 +5301,7 @@
           <w:color w:val="000000"/>
           <w:sz w:val="24"/>
         </w:rPr>
-        <w:t>The test is in vitro. Saliva, pH cycling, enzymes and occlusal load are absent. Gravimetric loss is not worn volume and is not worn anatomy. A single dentifrice was used. Brush stiffness and slurry ratio were not fully specified. There are no scanning electron images, so filler plucking is an inference from the roughness numbers rather than a micrograph. Ten thousand cycles represent one conventional laboratory year, not a clinical year. Disc geometry is not a Class II cavity.</w:t>
+        <w:t>The investigation is an in-vitro abrasion test. Saliva, pH cycling, enzymatic activity and occlusal load are absent, and the ranking obtained here may change when those factors are added (10). Gravimetric loss is not worn volume and is not worn anatomy (15). A single dentifrice of moderate abrasivity was used; a whitening paste of higher RDA might enlarge the roughness differences (8,25). Brush stiffness and the exact slurry ratio were not fully specified. Scanning electron microscopy was not performed, so the inference that larger fillers are uncovered or plucked rests on the roughness numbers and on the published literature rather than on micrographs of these discs. Ten thousand cycles represent one conventional laboratory year, not a year of any particular patient’s hygiene. Disc geometry is not a Class II cavity, and the results should not be read as a prediction of wear at an occlusal contact or at a gingival margin.</w:t>
       </w:r>
     </w:p>
     <w:p>
@@ -5182,7 +5335,7 @@
           <w:color w:val="000000"/>
           <w:sz w:val="24"/>
         </w:rPr>
-        <w:t>After 10 000 strokes at 2 N the three resins could not be separated on percentage weight loss. They could be separated on Ra. The injectable materials were smoother. Beautifil II LS finished on the plaque-retention threshold. That is the result of this study, and it should not be enlarged into a general ranking of injectable versus nanohybrid resins outside toothbrush abrasion.</w:t>
+        <w:t>After 10 000 strokes at 2 N the three resins could not be separated on percentage weight loss. They could be separated on Ra. Both injectable materials remained significantly smoother than Beautifil II LS and finished below the plaque-retention threshold; the nanohybrid finished on that threshold. That is the result of the study. It should not be enlarged into a general ranking of injectable versus nanohybrid composites outside the specific conditions of toothbrush abrasion.</w:t>
       </w:r>
     </w:p>
     <w:p>
@@ -5379,7 +5532,7 @@
           <w:color w:val="000000"/>
           <w:sz w:val="24"/>
         </w:rPr>
-        <w:t xml:space="preserve"> Where toothbrush abrasion and smoothness after hygiene are the concern, either injectable resin tested here may be considered alongside Beautifil II LS. The data do not show less wear. They show a smoother surface after this brushing model.</w:t>
+        <w:t xml:space="preserve"> Where toothbrush abrasion and the smoothness of the surface after daily hygiene are the principal concerns, either injectable resin tested here may be considered alongside Beautifil II LS. The present data do not show that the injectables wear less; they show that they finish smoother. The result should not be used to justify the substitution of an injectable resin for a packable nanohybrid on occlusal contacts.</w:t>
       </w:r>
     </w:p>
     <w:p>
@@ -5406,7 +5559,7 @@
           <w:color w:val="000000"/>
           <w:sz w:val="24"/>
         </w:rPr>
-        <w:t xml:space="preserve"> Repeat the mass analysis with and without the outlying disc, and report both. Add volumetric loss or profilometric wear depth. Add scanning electron microscopy of the worn surface. State the finishing sequence, the brush and the slurry ratio in full. A second dentifrice, or a higher cycle count, would test whether the roughness difference holds.</w:t>
+        <w:t xml:space="preserve"> The mass analysis should be repeated with and without the outlying disc, and both calculations should be reported. Volumetric loss or profilometric wear depth would complement the gravimetric outcome. Scanning electron microscopy of the worn surface would test the inference that larger fillers are uncovered in the nanohybrid. The finishing sequence, the brush and the slurry ratio should be stated in full. A second dentifrice of higher relative dentine abrasivity, or a higher cycle count, would show whether the roughness difference persists under a more aggressive challenge.</w:t>
       </w:r>
     </w:p>
     <w:p>
@@ -5433,7 +5586,7 @@
           <w:color w:val="000000"/>
           <w:sz w:val="24"/>
         </w:rPr>
-        <w:t xml:space="preserve"> Only a controlled clinical study can determine whether the 0.10 µm versus 0.19 µm difference after a laboratory year changes plaque accumulation, staining or restoration survival.</w:t>
+        <w:t xml:space="preserve"> Only a controlled clinical study can determine whether the difference between approximately 0.10 µm and 0.19 µm after a laboratory year is associated with a difference in plaque accumulation, staining or restoration survival.</w:t>
       </w:r>
     </w:p>
     <w:p>
@@ -5859,6 +6012,40 @@
           <w:sz w:val="24"/>
         </w:rPr>
         <w:t>23. Imazato S, Nakatsuka T, Kitagawa H, Sasaki JI, Yamaguchi S. Multiple-ion releasing bioactive surface pre-reacted glass-ionomer (S-PRG) filler: innovative technology for dental treatment and care. J Funct Biomater. 2023;14(4):236.</w:t>
+      </w:r>
+    </w:p>
+    <w:p>
+      <w:pPr>
+        <w:spacing w:before="0" w:after="0" w:line="480" w:lineRule="auto"/>
+        <w:ind w:firstLine="0"/>
+        <w:jc w:val="both"/>
+      </w:pPr>
+      <w:r>
+        <w:rPr>
+          <w:rFonts w:ascii="Times New Roman" w:hAnsi="Times New Roman" w:eastAsia="Times New Roman"/>
+          <w:b w:val="0"/>
+          <w:i w:val="0"/>
+          <w:color w:val="000000"/>
+          <w:sz w:val="24"/>
+        </w:rPr>
+        <w:t>24. Turssi CP, Ferracane JL, Vogel K. Filler features and their effects on wear and degree of conversion of particulate dental resin composites. Biomaterials. 2005;26(24):4932-4937.</w:t>
+      </w:r>
+    </w:p>
+    <w:p>
+      <w:pPr>
+        <w:spacing w:before="0" w:after="0" w:line="480" w:lineRule="auto"/>
+        <w:ind w:firstLine="0"/>
+        <w:jc w:val="both"/>
+      </w:pPr>
+      <w:r>
+        <w:rPr>
+          <w:rFonts w:ascii="Times New Roman" w:hAnsi="Times New Roman" w:eastAsia="Times New Roman"/>
+          <w:b w:val="0"/>
+          <w:i w:val="0"/>
+          <w:color w:val="000000"/>
+          <w:sz w:val="24"/>
+        </w:rPr>
+        <w:t>25. da Costa J, Adams-Belusko A, Riley K, Ferracane JL. The effect of various dentifrices on surface roughness and gloss of resin composites. J Dent. 2010;38(Suppl 2):e123-e128.</w:t>
       </w:r>
     </w:p>
     <w:sectPr>

</xml_diff>

<commit_message>
Match protocol cover, header and footer on every page
Cover now follows the approved protocol: Faculty of Dentistry,
Department of Restorative Dentistry, student code 202203112,
official English and Arabic titles, and the named supervision
committee (Prof. Wegdan M. Abdel-Fattah; Asst. Prof. Emad M.
El-Sayed, main supervisor).

The Pharos University bilingual header banner and the Faculty
of Dentistry contact footer, with page numbers, appear on all
pages. Methods now use the protocol instruments (RADWAG AS
220-R2, MarSurf PS10, Woodpecker MiniS, slurry 250 g/L).

Co-authored-by: Ahmed El Gamry <ahmed733676-droid@users.noreply.github.com>
</commit_message>
<xml_diff>
--- a/Thesis_Complete.docx
+++ b/Thesis_Complete.docx
@@ -6,7 +6,7 @@
       <w:pPr>
         <w:spacing w:before="0" w:after="0" w:line="480" w:lineRule="auto"/>
         <w:ind w:firstLine="0"/>
-        <w:jc w:val="center"/>
+        <w:jc w:val="left"/>
       </w:pPr>
       <w:r>
         <w:rPr>
@@ -14,14 +14,133 @@
           <w:b/>
           <w:i w:val="0"/>
           <w:color w:val="000000"/>
-          <w:sz w:val="32"/>
+          <w:sz w:val="26"/>
         </w:rPr>
-        <w:t>PHAROS UNIVERSITY IN ALEXANDRIA</w:t>
+        <w:t>Faculty of Dentistry</w:t>
       </w:r>
     </w:p>
     <w:p>
       <w:pPr>
         <w:spacing w:before="0" w:after="0" w:line="480" w:lineRule="auto"/>
+        <w:ind w:firstLine="0"/>
+        <w:jc w:val="left"/>
+      </w:pPr>
+      <w:r>
+        <w:rPr>
+          <w:rFonts w:ascii="Times New Roman" w:hAnsi="Times New Roman" w:eastAsia="Times New Roman"/>
+          <w:b w:val="0"/>
+          <w:i w:val="0"/>
+          <w:color w:val="000000"/>
+          <w:sz w:val="26"/>
+        </w:rPr>
+        <w:t>Department of Restorative Dentistry</w:t>
+      </w:r>
+    </w:p>
+    <w:p>
+      <w:pPr>
+        <w:spacing w:before="0" w:after="240" w:line="480" w:lineRule="auto"/>
+        <w:ind w:firstLine="0"/>
+        <w:jc w:val="left"/>
+      </w:pPr>
+      <w:r>
+        <w:rPr>
+          <w:rFonts w:ascii="Times New Roman" w:hAnsi="Times New Roman" w:eastAsia="Times New Roman"/>
+          <w:b/>
+          <w:i w:val="0"/>
+          <w:color w:val="000000"/>
+          <w:sz w:val="24"/>
+        </w:rPr>
+        <w:t>Student Code No. 202203112</w:t>
+      </w:r>
+    </w:p>
+    <w:p>
+      <w:pPr>
+        <w:spacing w:before="240" w:after="0" w:line="480" w:lineRule="auto"/>
+        <w:ind w:firstLine="0"/>
+        <w:jc w:val="center"/>
+      </w:pPr>
+      <w:r>
+        <w:rPr>
+          <w:rFonts w:ascii="Times New Roman" w:hAnsi="Times New Roman" w:eastAsia="Times New Roman"/>
+          <w:b/>
+          <w:i w:val="0"/>
+          <w:color w:val="000000"/>
+          <w:sz w:val="26"/>
+        </w:rPr>
+        <w:t>A Thesis submitted in partial fulfilment of the</w:t>
+      </w:r>
+    </w:p>
+    <w:p>
+      <w:pPr>
+        <w:spacing w:before="0" w:after="0" w:line="480" w:lineRule="auto"/>
+        <w:ind w:firstLine="0"/>
+        <w:jc w:val="center"/>
+      </w:pPr>
+      <w:r>
+        <w:rPr>
+          <w:rFonts w:ascii="Times New Roman" w:hAnsi="Times New Roman" w:eastAsia="Times New Roman"/>
+          <w:b/>
+          <w:i w:val="0"/>
+          <w:color w:val="000000"/>
+          <w:sz w:val="26"/>
+        </w:rPr>
+        <w:t>requirements for the degree of Master of Science</w:t>
+      </w:r>
+    </w:p>
+    <w:p>
+      <w:pPr>
+        <w:spacing w:before="0" w:after="120" w:line="480" w:lineRule="auto"/>
+        <w:ind w:firstLine="0"/>
+        <w:jc w:val="center"/>
+      </w:pPr>
+      <w:r>
+        <w:rPr>
+          <w:rFonts w:ascii="Times New Roman" w:hAnsi="Times New Roman" w:eastAsia="Times New Roman"/>
+          <w:b/>
+          <w:i w:val="0"/>
+          <w:color w:val="000000"/>
+          <w:sz w:val="26"/>
+        </w:rPr>
+        <w:t>in Conservative Dentistry</w:t>
+      </w:r>
+    </w:p>
+    <w:p>
+      <w:pPr>
+        <w:spacing w:before="0" w:after="240" w:line="480" w:lineRule="auto"/>
+        <w:ind w:firstLine="0"/>
+        <w:jc w:val="center"/>
+      </w:pPr>
+      <w:r>
+        <w:rPr>
+          <w:rFonts w:ascii="Times New Roman" w:hAnsi="Times New Roman" w:eastAsia="Times New Roman"/>
+          <w:b/>
+          <w:i w:val="0"/>
+          <w:color w:val="000000"/>
+          <w:sz w:val="26"/>
+        </w:rPr>
+        <w:t>Academic Year 2024–2025 / 2025–2026</w:t>
+      </w:r>
+    </w:p>
+    <w:p>
+      <w:pPr>
+        <w:spacing w:before="120" w:after="0" w:line="480" w:lineRule="auto"/>
+        <w:ind w:firstLine="0"/>
+        <w:jc w:val="center"/>
+      </w:pPr>
+      <w:r>
+        <w:rPr>
+          <w:rFonts w:ascii="Times New Roman" w:hAnsi="Times New Roman" w:eastAsia="Times New Roman"/>
+          <w:b w:val="0"/>
+          <w:i w:val="0"/>
+          <w:color w:val="000000"/>
+          <w:sz w:val="24"/>
+        </w:rPr>
+        <w:t>Name of Candidate</w:t>
+      </w:r>
+    </w:p>
+    <w:p>
+      <w:pPr>
+        <w:spacing w:before="0" w:after="240" w:line="480" w:lineRule="auto"/>
         <w:ind w:firstLine="0"/>
         <w:jc w:val="center"/>
       </w:pPr>
@@ -33,29 +152,29 @@
           <w:color w:val="000000"/>
           <w:sz w:val="28"/>
         </w:rPr>
-        <w:t>FACULTY OF DENTISTRY</w:t>
+        <w:t>Mohamed Talaat Mohamed AbdelMoaty ElAbd</w:t>
       </w:r>
     </w:p>
     <w:p>
       <w:pPr>
-        <w:spacing w:before="0" w:after="480" w:line="480" w:lineRule="auto"/>
+        <w:spacing w:before="160" w:after="0" w:line="480" w:lineRule="auto"/>
         <w:ind w:firstLine="0"/>
-        <w:jc w:val="center"/>
+        <w:jc w:val="left"/>
       </w:pPr>
       <w:r>
         <w:rPr>
           <w:rFonts w:ascii="Times New Roman" w:hAnsi="Times New Roman" w:eastAsia="Times New Roman"/>
-          <w:b w:val="0"/>
+          <w:b/>
           <w:i/>
           <w:color w:val="000000"/>
-          <w:sz w:val="26"/>
+          <w:sz w:val="24"/>
         </w:rPr>
-        <w:t>Department of Conservative Dentistry</w:t>
+        <w:t>English Title:</w:t>
       </w:r>
     </w:p>
     <w:p>
       <w:pPr>
-        <w:spacing w:before="240" w:after="120" w:line="480" w:lineRule="auto"/>
+        <w:spacing w:before="80" w:after="160" w:line="480" w:lineRule="auto"/>
         <w:ind w:firstLine="0"/>
         <w:jc w:val="center"/>
       </w:pPr>
@@ -65,33 +184,50 @@
           <w:b/>
           <w:i w:val="0"/>
           <w:color w:val="000000"/>
-          <w:sz w:val="28"/>
+          <w:sz w:val="26"/>
         </w:rPr>
-        <w:t>COMPARATIVE EVALUATION OF WEAR RESISTANCE AND SURFACE ROUGHNESS OF INJECTABLE VERSUS CONVENTIONAL NANOHYBRID COMPOSITE RESINS</w:t>
+        <w:t>COMPARATIVE STUDY OF WEAR RESISTANCE AND SURFACE ROUGHNESS OF INJECTABLE VERSUS CONVENTIONAL COMPOSITE RESIN — IN VITRO STUDY</w:t>
       </w:r>
     </w:p>
     <w:p>
       <w:pPr>
-        <w:spacing w:before="0" w:after="480" w:line="480" w:lineRule="auto"/>
+        <w:spacing w:before="0" w:after="0" w:line="480" w:lineRule="auto"/>
         <w:ind w:firstLine="0"/>
-        <w:jc w:val="center"/>
+        <w:jc w:val="left"/>
       </w:pPr>
       <w:r>
         <w:rPr>
           <w:rFonts w:ascii="Times New Roman" w:hAnsi="Times New Roman" w:eastAsia="Times New Roman"/>
-          <w:b w:val="0"/>
+          <w:b/>
           <w:i/>
+          <w:color w:val="000000"/>
+          <w:sz w:val="24"/>
+        </w:rPr>
+        <w:t>Arabic Title:</w:t>
+      </w:r>
+    </w:p>
+    <w:p>
+      <w:pPr>
+        <w:spacing w:before="80" w:after="200" w:line="480" w:lineRule="auto"/>
+        <w:ind w:firstLine="0"/>
+        <w:jc w:val="center"/>
+      </w:pPr>
+      <w:r>
+        <w:rPr>
+          <w:rFonts w:ascii="Times New Roman" w:hAnsi="Times New Roman" w:eastAsia="Times New Roman"/>
+          <w:b/>
+          <w:i w:val="0"/>
           <w:color w:val="000000"/>
           <w:sz w:val="26"/>
         </w:rPr>
-        <w:t>(In Vitro Study)</w:t>
+        <w:t>دراسة مقارنة للتآكل وخشونة سطح الراتينج المركب القابل للحقن والتقليدي – دراسة في المختبر</w:t>
       </w:r>
     </w:p>
     <w:p>
       <w:pPr>
-        <w:spacing w:before="0" w:after="0" w:line="480" w:lineRule="auto"/>
+        <w:spacing w:before="0" w:after="240" w:line="480" w:lineRule="auto"/>
         <w:ind w:firstLine="0"/>
-        <w:jc w:val="center"/>
+        <w:jc w:val="left"/>
       </w:pPr>
       <w:r>
         <w:rPr>
@@ -101,7 +237,24 @@
           <w:color w:val="000000"/>
           <w:sz w:val="24"/>
         </w:rPr>
-        <w:t>A Thesis submitted in partial fulfilment of the</w:t>
+        <w:t>Keywords: Surface roughness, wear, injectable composite, conventional composite.</w:t>
+      </w:r>
+    </w:p>
+    <w:p>
+      <w:pPr>
+        <w:spacing w:before="160" w:after="120" w:line="480" w:lineRule="auto"/>
+        <w:ind w:firstLine="0"/>
+        <w:jc w:val="center"/>
+      </w:pPr>
+      <w:r>
+        <w:rPr>
+          <w:rFonts w:ascii="Times New Roman" w:hAnsi="Times New Roman" w:eastAsia="Times New Roman"/>
+          <w:b/>
+          <w:i w:val="0"/>
+          <w:color w:val="000000"/>
+          <w:sz w:val="26"/>
+        </w:rPr>
+        <w:t>Supervision Committee</w:t>
       </w:r>
     </w:p>
     <w:p>
@@ -118,12 +271,12 @@
           <w:color w:val="000000"/>
           <w:sz w:val="24"/>
         </w:rPr>
-        <w:t>requirements for the degree of Master of Science</w:t>
+        <w:t>1. Prof. Wegdan M. Abdel-Fattah</w:t>
       </w:r>
     </w:p>
     <w:p>
       <w:pPr>
-        <w:spacing w:before="0" w:after="0" w:line="480" w:lineRule="auto"/>
+        <w:spacing w:before="0" w:after="120" w:line="480" w:lineRule="auto"/>
         <w:ind w:firstLine="0"/>
         <w:jc w:val="center"/>
       </w:pPr>
@@ -135,126 +288,7 @@
           <w:color w:val="000000"/>
           <w:sz w:val="24"/>
         </w:rPr>
-        <w:t>in</w:t>
-      </w:r>
-    </w:p>
-    <w:p>
-      <w:pPr>
-        <w:spacing w:before="0" w:after="480" w:line="480" w:lineRule="auto"/>
-        <w:ind w:firstLine="0"/>
-        <w:jc w:val="center"/>
-      </w:pPr>
-      <w:r>
-        <w:rPr>
-          <w:rFonts w:ascii="Times New Roman" w:hAnsi="Times New Roman" w:eastAsia="Times New Roman"/>
-          <w:b/>
-          <w:i w:val="0"/>
-          <w:color w:val="000000"/>
-          <w:sz w:val="26"/>
-        </w:rPr>
-        <w:t>Conservative Dentistry</w:t>
-      </w:r>
-    </w:p>
-    <w:p>
-      <w:pPr>
-        <w:spacing w:before="240" w:after="0" w:line="480" w:lineRule="auto"/>
-        <w:ind w:firstLine="0"/>
-        <w:jc w:val="center"/>
-      </w:pPr>
-      <w:r>
-        <w:rPr>
-          <w:rFonts w:ascii="Times New Roman" w:hAnsi="Times New Roman" w:eastAsia="Times New Roman"/>
-          <w:b w:val="0"/>
-          <w:i w:val="0"/>
-          <w:color w:val="000000"/>
-          <w:sz w:val="24"/>
-        </w:rPr>
-        <w:t>Submitted by</w:t>
-      </w:r>
-    </w:p>
-    <w:p>
-      <w:pPr>
-        <w:spacing w:before="0" w:after="480" w:line="480" w:lineRule="auto"/>
-        <w:ind w:firstLine="0"/>
-        <w:jc w:val="center"/>
-      </w:pPr>
-      <w:r>
-        <w:rPr>
-          <w:rFonts w:ascii="Times New Roman" w:hAnsi="Times New Roman" w:eastAsia="Times New Roman"/>
-          <w:b/>
-          <w:i w:val="0"/>
-          <w:color w:val="000000"/>
-          <w:sz w:val="26"/>
-        </w:rPr>
-        <w:t>Mohamed Talaat Mohamed AbdelMoaty ElAbd</w:t>
-      </w:r>
-    </w:p>
-    <w:p>
-      <w:pPr>
-        <w:spacing w:before="240" w:after="0" w:line="480" w:lineRule="auto"/>
-        <w:ind w:firstLine="0"/>
-        <w:jc w:val="center"/>
-      </w:pPr>
-      <w:r>
-        <w:rPr>
-          <w:rFonts w:ascii="Times New Roman" w:hAnsi="Times New Roman" w:eastAsia="Times New Roman"/>
-          <w:b/>
-          <w:i w:val="0"/>
-          <w:color w:val="000000"/>
-          <w:sz w:val="24"/>
-        </w:rPr>
-        <w:t>Supervisors</w:t>
-      </w:r>
-    </w:p>
-    <w:p>
-      <w:pPr>
-        <w:spacing w:before="0" w:after="0" w:line="480" w:lineRule="auto"/>
-        <w:ind w:firstLine="0"/>
-        <w:jc w:val="center"/>
-      </w:pPr>
-      <w:r>
-        <w:rPr>
-          <w:rFonts w:ascii="Times New Roman" w:hAnsi="Times New Roman" w:eastAsia="Times New Roman"/>
-          <w:b w:val="0"/>
-          <w:i w:val="0"/>
-          <w:color w:val="000000"/>
-          <w:sz w:val="24"/>
-        </w:rPr>
-        <w:t>Professor Dr. …………………………………………</w:t>
-      </w:r>
-    </w:p>
-    <w:p>
-      <w:pPr>
-        <w:spacing w:before="0" w:after="480" w:line="480" w:lineRule="auto"/>
-        <w:ind w:firstLine="0"/>
-        <w:jc w:val="center"/>
-      </w:pPr>
-      <w:r>
-        <w:rPr>
-          <w:rFonts w:ascii="Times New Roman" w:hAnsi="Times New Roman" w:eastAsia="Times New Roman"/>
-          <w:b w:val="0"/>
-          <w:i w:val="0"/>
-          <w:color w:val="000000"/>
-          <w:sz w:val="24"/>
-        </w:rPr>
-        <w:t>Assistant Professor Dr. …………………………………………</w:t>
-      </w:r>
-    </w:p>
-    <w:p>
-      <w:pPr>
-        <w:spacing w:before="360" w:after="0" w:line="480" w:lineRule="auto"/>
-        <w:ind w:firstLine="0"/>
-        <w:jc w:val="center"/>
-      </w:pPr>
-      <w:r>
-        <w:rPr>
-          <w:rFonts w:ascii="Times New Roman" w:hAnsi="Times New Roman" w:eastAsia="Times New Roman"/>
-          <w:b/>
-          <w:i w:val="0"/>
-          <w:color w:val="000000"/>
-          <w:sz w:val="26"/>
-        </w:rPr>
-        <w:t>2025 / 2026</w:t>
+        <w:t>2. Asst. Prof. Emad M. El-Sayed  (Main supervisor)</w:t>
       </w:r>
     </w:p>
     <w:p>
@@ -291,20 +325,13 @@
       <w:r>
         <w:rPr>
           <w:rFonts w:ascii="Times New Roman" w:hAnsi="Times New Roman" w:eastAsia="Times New Roman"/>
-          <w:b w:val="0"/>
+          <w:b/>
           <w:i w:val="0"/>
           <w:color w:val="000000"/>
           <w:sz w:val="24"/>
         </w:rPr>
-        <w:t>Professor Dr. …………………………………………</w:t>
+        <w:t>Supervision Committee</w:t>
       </w:r>
-    </w:p>
-    <w:p>
-      <w:pPr>
-        <w:spacing w:before="0" w:after="0" w:line="480" w:lineRule="auto"/>
-        <w:ind w:firstLine="709"/>
-        <w:jc w:val="both"/>
-      </w:pPr>
       <w:r>
         <w:rPr>
           <w:rFonts w:ascii="Times New Roman" w:hAnsi="Times New Roman" w:eastAsia="Times New Roman"/>
@@ -313,7 +340,7 @@
           <w:color w:val="000000"/>
           <w:sz w:val="24"/>
         </w:rPr>
-        <w:t>Assistant Professor Dr. …………………………………………</w:t>
+        <w:t xml:space="preserve"> (as named on the approved research protocol)</w:t>
       </w:r>
     </w:p>
     <w:p>
@@ -330,7 +357,24 @@
           <w:color w:val="000000"/>
           <w:sz w:val="24"/>
         </w:rPr>
-        <w:t>*(Supervisor names and titles to be entered from the approved research protocol.)*</w:t>
+        <w:t>1. Prof. Wegdan M. Abdel-Fattah</w:t>
+      </w:r>
+    </w:p>
+    <w:p>
+      <w:pPr>
+        <w:spacing w:before="0" w:after="0" w:line="480" w:lineRule="auto"/>
+        <w:ind w:firstLine="709"/>
+        <w:jc w:val="both"/>
+      </w:pPr>
+      <w:r>
+        <w:rPr>
+          <w:rFonts w:ascii="Times New Roman" w:hAnsi="Times New Roman" w:eastAsia="Times New Roman"/>
+          <w:b w:val="0"/>
+          <w:i w:val="0"/>
+          <w:color w:val="000000"/>
+          <w:sz w:val="24"/>
+        </w:rPr>
+        <w:t>2. Asst. Prof. Emad M. El-Sayed (Main supervisor)</w:t>
       </w:r>
     </w:p>
     <w:p>
@@ -1214,7 +1258,7 @@
           <w:color w:val="000000"/>
           <w:sz w:val="24"/>
         </w:rPr>
-        <w:t>Classical flowable resins, filled at approximately 40–55 wt%, wear more rapidly than packable hybrids for precisely these reasons (5,13). The more recent injectable products raise filler load and reduce particle size in an attempt to retain syringeable handling without accepting that penalty. G-ænial Universal Injectable is listed at 69 wt% and 50 vol%, a volume fraction that sits just above the 48 vol% step identified by Condon and Ferracane (6,12). Beautifil II LS is listed at 83 wt%; the manufacturer does not publish a volume fraction (19).</w:t>
+        <w:t>Classical flowable resins, filled at approximately 40–55 wt%, wear more rapidly than packable hybrids for precisely these reasons (5,13). The more recent injectable products raise filler load and reduce particle size in an attempt to retain syringeable handling without accepting that penalty. G-ænial Universal Injectable is listed at 50 vol%, a volume fraction that sits just above the 48 vol% step identified by Condon and Ferracane (6,12). Beautifil II LS is listed at 68 vol% (19).</w:t>
       </w:r>
     </w:p>
     <w:p>
@@ -1384,7 +1428,7 @@
           <w:color w:val="000000"/>
           <w:sz w:val="24"/>
         </w:rPr>
-        <w:t>Highly filled injectable resins are a later development. G-ænial Universal Injectable contains ultrafine barium glass and silica with a mean particle size of about 150 nm, giving a filler load of 69 wt% (50 vol%) in a matrix of urethane dimethacrylate, Bis-MEPP and triethylene glycol dimethacrylate (6,18). Beautifil Flow Plus X F00 is a zero-flow giomer injectable that incorporates nano-sized surface pre-reacted glass-ionomer (S-PRG) filler (19). It should not be confused with Beautifil Flow Plus F00, an earlier product that appears in several laboratory papers (6). The distinction matters when results are compared.</w:t>
+        <w:t>Highly filled injectable resins are a later development. G-ænial Universal Injectable contains barium glass and silica at a filler load of 50 vol% in a dimethacrylate matrix (6,18,19). Beautifil Flow Plus X F00 is a zero-flow giomer injectable that incorporates nano-sized surface pre-reacted glass-ionomer (S-PRG) filler (19). It should not be confused with Beautifil Flow Plus F00, an earlier product that appears in several laboratory papers (6). The distinction matters when results are compared.</w:t>
       </w:r>
     </w:p>
     <w:p>
@@ -1469,7 +1513,7 @@
           <w:color w:val="000000"/>
           <w:sz w:val="24"/>
         </w:rPr>
-        <w:t>Nanohybrid composites combine nano-sized particles with larger submicron or micron fillers. The dual size distribution is intended to increase packing density, improve polishability and raise filler load, which commonly exceeds 70–80 wt% (11). Beautifil II LS belongs to this class. Its filler load is 83 wt%. The resin employs an SRS monomer formulated for low shrinkage, and the filler includes S-PRG glass together with pre-polymerised particles (19).</w:t>
+        <w:t>Nanohybrid composites combine nano-sized particles with larger submicron or micron fillers. The dual size distribution is intended to increase packing density, improve polishability and raise filler load, which commonly exceeds 70–80 wt% (11). Beautifil II LS belongs to this class. Its filler load is 68 vol%. The resin contains Bis-GMA, UDMA, Bis-EMA, PEGMA and TEGDMA, and the filler includes multifunctional glass and S-PRG particles (19).</w:t>
       </w:r>
     </w:p>
     <w:p>
@@ -1796,17 +1840,17 @@
         <w:tblLook w:firstColumn="1" w:firstRow="1" w:lastColumn="0" w:lastRow="0" w:noHBand="0" w:noVBand="1" w:val="04A0"/>
       </w:tblPr>
       <w:tblGrid>
-        <w:gridCol w:w="1512"/>
-        <w:gridCol w:w="1512"/>
-        <w:gridCol w:w="1512"/>
-        <w:gridCol w:w="1512"/>
-        <w:gridCol w:w="1512"/>
-        <w:gridCol w:w="1512"/>
+        <w:gridCol w:w="1559"/>
+        <w:gridCol w:w="1559"/>
+        <w:gridCol w:w="1559"/>
+        <w:gridCol w:w="1559"/>
+        <w:gridCol w:w="1559"/>
+        <w:gridCol w:w="1559"/>
       </w:tblGrid>
       <w:tr>
         <w:tc>
           <w:tcPr>
-            <w:tcW w:type="dxa" w:w="1512"/>
+            <w:tcW w:type="dxa" w:w="1559"/>
             <w:tcBorders>
               <w:top w:val="single" w:sz="4" w:space="0" w:color="000000"/>
               <w:left w:val="single" w:sz="4" w:space="0" w:color="000000"/>
@@ -1835,7 +1879,7 @@
         </w:tc>
         <w:tc>
           <w:tcPr>
-            <w:tcW w:type="dxa" w:w="1512"/>
+            <w:tcW w:type="dxa" w:w="1559"/>
             <w:tcBorders>
               <w:top w:val="single" w:sz="4" w:space="0" w:color="000000"/>
               <w:left w:val="single" w:sz="4" w:space="0" w:color="000000"/>
@@ -1864,7 +1908,7 @@
         </w:tc>
         <w:tc>
           <w:tcPr>
-            <w:tcW w:type="dxa" w:w="1512"/>
+            <w:tcW w:type="dxa" w:w="1559"/>
             <w:tcBorders>
               <w:top w:val="single" w:sz="4" w:space="0" w:color="000000"/>
               <w:left w:val="single" w:sz="4" w:space="0" w:color="000000"/>
@@ -1893,7 +1937,7 @@
         </w:tc>
         <w:tc>
           <w:tcPr>
-            <w:tcW w:type="dxa" w:w="1512"/>
+            <w:tcW w:type="dxa" w:w="1559"/>
             <w:tcBorders>
               <w:top w:val="single" w:sz="4" w:space="0" w:color="000000"/>
               <w:left w:val="single" w:sz="4" w:space="0" w:color="000000"/>
@@ -1922,7 +1966,7 @@
         </w:tc>
         <w:tc>
           <w:tcPr>
-            <w:tcW w:type="dxa" w:w="1512"/>
+            <w:tcW w:type="dxa" w:w="1559"/>
             <w:tcBorders>
               <w:top w:val="single" w:sz="4" w:space="0" w:color="000000"/>
               <w:left w:val="single" w:sz="4" w:space="0" w:color="000000"/>
@@ -1951,7 +1995,7 @@
         </w:tc>
         <w:tc>
           <w:tcPr>
-            <w:tcW w:type="dxa" w:w="1512"/>
+            <w:tcW w:type="dxa" w:w="1559"/>
             <w:tcBorders>
               <w:top w:val="single" w:sz="4" w:space="0" w:color="000000"/>
               <w:left w:val="single" w:sz="4" w:space="0" w:color="000000"/>
@@ -1982,7 +2026,7 @@
       <w:tr>
         <w:tc>
           <w:tcPr>
-            <w:tcW w:type="dxa" w:w="1512"/>
+            <w:tcW w:type="dxa" w:w="1559"/>
             <w:tcBorders>
               <w:top w:val="single" w:sz="4" w:space="0" w:color="000000"/>
               <w:left w:val="single" w:sz="4" w:space="0" w:color="000000"/>
@@ -2004,13 +2048,13 @@
                 <w:color w:val="000000"/>
                 <w:sz w:val="18"/>
               </w:rPr>
-              <w:t>G-ænial Universal Injectable</w:t>
+              <w:t>G-ænial Universal Injectable (A2)</w:t>
             </w:r>
           </w:p>
         </w:tc>
         <w:tc>
           <w:tcPr>
-            <w:tcW w:type="dxa" w:w="1512"/>
+            <w:tcW w:type="dxa" w:w="1559"/>
             <w:tcBorders>
               <w:top w:val="single" w:sz="4" w:space="0" w:color="000000"/>
               <w:left w:val="single" w:sz="4" w:space="0" w:color="000000"/>
@@ -2032,13 +2076,13 @@
                 <w:color w:val="000000"/>
                 <w:sz w:val="18"/>
               </w:rPr>
-              <w:t>Nanofilled injectable</w:t>
+              <w:t>Nanohybrid injectable</w:t>
             </w:r>
           </w:p>
         </w:tc>
         <w:tc>
           <w:tcPr>
-            <w:tcW w:type="dxa" w:w="1512"/>
+            <w:tcW w:type="dxa" w:w="1559"/>
             <w:tcBorders>
               <w:top w:val="single" w:sz="4" w:space="0" w:color="000000"/>
               <w:left w:val="single" w:sz="4" w:space="0" w:color="000000"/>
@@ -2060,13 +2104,13 @@
                 <w:color w:val="000000"/>
                 <w:sz w:val="18"/>
               </w:rPr>
-              <w:t>UDMA, Bis-MEPP, TEGDMA</w:t>
+              <w:t>Dimethacrylate monomers</w:t>
             </w:r>
           </w:p>
         </w:tc>
         <w:tc>
           <w:tcPr>
-            <w:tcW w:type="dxa" w:w="1512"/>
+            <w:tcW w:type="dxa" w:w="1559"/>
             <w:tcBorders>
               <w:top w:val="single" w:sz="4" w:space="0" w:color="000000"/>
               <w:left w:val="single" w:sz="4" w:space="0" w:color="000000"/>
@@ -2088,13 +2132,13 @@
                 <w:color w:val="000000"/>
                 <w:sz w:val="18"/>
               </w:rPr>
-              <w:t>Ultrafine barium glass and silica, ~150 nm</w:t>
+              <w:t>Barium glass, silica</w:t>
             </w:r>
           </w:p>
         </w:tc>
         <w:tc>
           <w:tcPr>
-            <w:tcW w:type="dxa" w:w="1512"/>
+            <w:tcW w:type="dxa" w:w="1559"/>
             <w:tcBorders>
               <w:top w:val="single" w:sz="4" w:space="0" w:color="000000"/>
               <w:left w:val="single" w:sz="4" w:space="0" w:color="000000"/>
@@ -2116,13 +2160,13 @@
                 <w:color w:val="000000"/>
                 <w:sz w:val="18"/>
               </w:rPr>
-              <w:t>69 wt% / 50 vol%</w:t>
+              <w:t>50 vol%</w:t>
             </w:r>
           </w:p>
         </w:tc>
         <w:tc>
           <w:tcPr>
-            <w:tcW w:type="dxa" w:w="1512"/>
+            <w:tcW w:type="dxa" w:w="1559"/>
             <w:tcBorders>
               <w:top w:val="single" w:sz="4" w:space="0" w:color="000000"/>
               <w:left w:val="single" w:sz="4" w:space="0" w:color="000000"/>
@@ -2152,7 +2196,7 @@
       <w:tr>
         <w:tc>
           <w:tcPr>
-            <w:tcW w:type="dxa" w:w="1512"/>
+            <w:tcW w:type="dxa" w:w="1559"/>
             <w:tcBorders>
               <w:top w:val="single" w:sz="4" w:space="0" w:color="000000"/>
               <w:left w:val="single" w:sz="4" w:space="0" w:color="000000"/>
@@ -2174,13 +2218,13 @@
                 <w:color w:val="000000"/>
                 <w:sz w:val="18"/>
               </w:rPr>
-              <w:t>Beautifil Flow Plus X F00</w:t>
+              <w:t>Beautifil Flow Plus X F00 (A2)</w:t>
             </w:r>
           </w:p>
         </w:tc>
         <w:tc>
           <w:tcPr>
-            <w:tcW w:type="dxa" w:w="1512"/>
+            <w:tcW w:type="dxa" w:w="1559"/>
             <w:tcBorders>
               <w:top w:val="single" w:sz="4" w:space="0" w:color="000000"/>
               <w:left w:val="single" w:sz="4" w:space="0" w:color="000000"/>
@@ -2202,13 +2246,13 @@
                 <w:color w:val="000000"/>
                 <w:sz w:val="18"/>
               </w:rPr>
-              <w:t>Giomer injectable, zero flow</w:t>
+              <w:t>Nanohybrid injectable giomer</w:t>
             </w:r>
           </w:p>
         </w:tc>
         <w:tc>
           <w:tcPr>
-            <w:tcW w:type="dxa" w:w="1512"/>
+            <w:tcW w:type="dxa" w:w="1559"/>
             <w:tcBorders>
               <w:top w:val="single" w:sz="4" w:space="0" w:color="000000"/>
               <w:left w:val="single" w:sz="4" w:space="0" w:color="000000"/>
@@ -2230,13 +2274,13 @@
                 <w:color w:val="000000"/>
                 <w:sz w:val="18"/>
               </w:rPr>
-              <w:t>Dimethacrylate resin</w:t>
+              <w:t>Bis-GMA, TEGDMA</w:t>
             </w:r>
           </w:p>
         </w:tc>
         <w:tc>
           <w:tcPr>
-            <w:tcW w:type="dxa" w:w="1512"/>
+            <w:tcW w:type="dxa" w:w="1559"/>
             <w:tcBorders>
               <w:top w:val="single" w:sz="4" w:space="0" w:color="000000"/>
               <w:left w:val="single" w:sz="4" w:space="0" w:color="000000"/>
@@ -2258,13 +2302,13 @@
                 <w:color w:val="000000"/>
                 <w:sz w:val="18"/>
               </w:rPr>
-              <w:t>Nano S-PRG filler</w:t>
+              <w:t>Multifunctional glass and S-PRG filler</w:t>
             </w:r>
           </w:p>
         </w:tc>
         <w:tc>
           <w:tcPr>
-            <w:tcW w:type="dxa" w:w="1512"/>
+            <w:tcW w:type="dxa" w:w="1559"/>
             <w:tcBorders>
               <w:top w:val="single" w:sz="4" w:space="0" w:color="000000"/>
               <w:left w:val="single" w:sz="4" w:space="0" w:color="000000"/>
@@ -2286,13 +2330,13 @@
                 <w:color w:val="000000"/>
                 <w:sz w:val="18"/>
               </w:rPr>
-              <w:t>Highly filled injectable (manufacturer)</w:t>
+              <w:t>47 vol%</w:t>
             </w:r>
           </w:p>
         </w:tc>
         <w:tc>
           <w:tcPr>
-            <w:tcW w:type="dxa" w:w="1512"/>
+            <w:tcW w:type="dxa" w:w="1559"/>
             <w:tcBorders>
               <w:top w:val="single" w:sz="4" w:space="0" w:color="000000"/>
               <w:left w:val="single" w:sz="4" w:space="0" w:color="000000"/>
@@ -2322,7 +2366,7 @@
       <w:tr>
         <w:tc>
           <w:tcPr>
-            <w:tcW w:type="dxa" w:w="1512"/>
+            <w:tcW w:type="dxa" w:w="1559"/>
             <w:tcBorders>
               <w:top w:val="single" w:sz="4" w:space="0" w:color="000000"/>
               <w:left w:val="single" w:sz="4" w:space="0" w:color="000000"/>
@@ -2344,13 +2388,13 @@
                 <w:color w:val="000000"/>
                 <w:sz w:val="18"/>
               </w:rPr>
-              <w:t>Beautifil II LS</w:t>
+              <w:t>Beautifil II LS (A2)</w:t>
             </w:r>
           </w:p>
         </w:tc>
         <w:tc>
           <w:tcPr>
-            <w:tcW w:type="dxa" w:w="1512"/>
+            <w:tcW w:type="dxa" w:w="1559"/>
             <w:tcBorders>
               <w:top w:val="single" w:sz="4" w:space="0" w:color="000000"/>
               <w:left w:val="single" w:sz="4" w:space="0" w:color="000000"/>
@@ -2372,13 +2416,13 @@
                 <w:color w:val="000000"/>
                 <w:sz w:val="18"/>
               </w:rPr>
-              <w:t>Nanohybrid giomer, low shrinkage</w:t>
+              <w:t>Nanohybrid conventional giomer</w:t>
             </w:r>
           </w:p>
         </w:tc>
         <w:tc>
           <w:tcPr>
-            <w:tcW w:type="dxa" w:w="1512"/>
+            <w:tcW w:type="dxa" w:w="1559"/>
             <w:tcBorders>
               <w:top w:val="single" w:sz="4" w:space="0" w:color="000000"/>
               <w:left w:val="single" w:sz="4" w:space="0" w:color="000000"/>
@@ -2400,13 +2444,13 @@
                 <w:color w:val="000000"/>
                 <w:sz w:val="18"/>
               </w:rPr>
-              <w:t>SRS monomer complex</w:t>
+              <w:t>Bis-GMA, UDMA, Bis-EMA, PEGMA, TEGDMA</w:t>
             </w:r>
           </w:p>
         </w:tc>
         <w:tc>
           <w:tcPr>
-            <w:tcW w:type="dxa" w:w="1512"/>
+            <w:tcW w:type="dxa" w:w="1559"/>
             <w:tcBorders>
               <w:top w:val="single" w:sz="4" w:space="0" w:color="000000"/>
               <w:left w:val="single" w:sz="4" w:space="0" w:color="000000"/>
@@ -2428,13 +2472,13 @@
                 <w:color w:val="000000"/>
                 <w:sz w:val="18"/>
               </w:rPr>
-              <w:t>S-PRG and pre-polymerised fillers</w:t>
+              <w:t>Multifunctional glass and S-PRG filler</w:t>
             </w:r>
           </w:p>
         </w:tc>
         <w:tc>
           <w:tcPr>
-            <w:tcW w:type="dxa" w:w="1512"/>
+            <w:tcW w:type="dxa" w:w="1559"/>
             <w:tcBorders>
               <w:top w:val="single" w:sz="4" w:space="0" w:color="000000"/>
               <w:left w:val="single" w:sz="4" w:space="0" w:color="000000"/>
@@ -2456,13 +2500,13 @@
                 <w:color w:val="000000"/>
                 <w:sz w:val="18"/>
               </w:rPr>
-              <w:t>83 wt%</w:t>
+              <w:t>68 vol%</w:t>
             </w:r>
           </w:p>
         </w:tc>
         <w:tc>
           <w:tcPr>
-            <w:tcW w:type="dxa" w:w="1512"/>
+            <w:tcW w:type="dxa" w:w="1559"/>
             <w:tcBorders>
               <w:top w:val="single" w:sz="4" w:space="0" w:color="000000"/>
               <w:left w:val="single" w:sz="4" w:space="0" w:color="000000"/>
@@ -2545,7 +2589,7 @@
           <w:color w:val="000000"/>
           <w:sz w:val="24"/>
         </w:rPr>
-        <w:t>Each material was placed in the Teflon mould. A transparent matrix strip and a glass plate were applied to exclude air from the test face and to produce a flat surface of uniform thickness. Polymerisation was carried out according to the manufacturer’s instructions for the product concerned. Excess flash was removed. The discs were identified by group and stored in distilled water until the baseline measurements were made.</w:t>
+        <w:t>Each material was placed in the Teflon mould as a single increment. A Mylar strip and a transparent glass slide were applied to exclude air from the test face and to produce a flat surface of uniform thickness. Polymerisation was carried out with an LED curing unit (MiniS, Woodpecker, Guilin, China) for 20 seconds at 800 mW/cm², with the tip in contact with the glass slide, followed by three additional 20-second exposures from different directions to ensure complete polymerisation. Flash was removed with a no. 12 scalpel blade. The discs were identified by group and stored in distilled water at 37 °C for 24 hours before the baseline measurements were made.</w:t>
       </w:r>
     </w:p>
     <w:p>
@@ -2579,7 +2623,7 @@
           <w:color w:val="000000"/>
           <w:sz w:val="24"/>
         </w:rPr>
-        <w:t>Each disc was dried and weighed on an analytical balance. The recorded masses are given to 0.0001 g, so the balance read to 0.1 mg. Surface roughness was measured on the test face with a contact profilometer. Ra was determined according to the definition in ISO 4287 (16). The value entered for analysis was the mean of the traces taken on that disc.</w:t>
+        <w:t>Each disc was dried and weighed on an electronic analytical balance (RADWAG Wagi Elektroniczne AS 220-R2), which records to 0.0001 g. Surface roughness was measured on the test face with a contact profilometer (MarSurf PS10, Mahr). Five traces were taken at random sites on each disc; the value entered for analysis was the mean of those traces. Ra was determined according to the definition in ISO 4287 (16).</w:t>
       </w:r>
     </w:p>
     <w:p>
@@ -2613,7 +2657,7 @@
           <w:color w:val="000000"/>
           <w:sz w:val="24"/>
         </w:rPr>
-        <w:t>The discs were mounted in a toothbrushing simulator. A slurry of Colgate Total and distilled water was prepared in accordance with the guidance of ISO 11609 and ISO/TR 14569-1 (3,14). The brush load was set at 2 N, which lies within the ISO range of 0.5–2.5 N (3). Each disc received 10 000 cycles. That count is the conventional laboratory equivalent of one year of twice-daily brushing, following the estimate of Sexson and Phillips (7,8). Fresh slurry was supplied as required so that abrasive was present throughout the test. At the end of the run the discs were rinsed free of paste and dried.</w:t>
+        <w:t>The discs were mounted in a custom toothbrushing simulator (Dental Biomaterials Department, Faculty of Dentistry, Alexandria University). A slurry of Colgate Total (relative dentine abrasivity 70) and distilled water was prepared at 250 g of toothpaste per litre of water, in accordance with ISO 11609 and ISO/TR 14569-1 (3,14). The brush load was set at 2 N, which lies within the ISO range of 0.5–2.5 N (3). Each disc received 10 000 cycles. That count is the conventional laboratory equivalent of one year of twice-daily brushing, following the estimate of Sexson and Phillips (7,8). The slurry was replaced every 5 000 cycles. At the end of the run the discs were rinsed with a stream of water and dried.</w:t>
       </w:r>
     </w:p>
     <w:p>
@@ -2906,16 +2950,16 @@
         <w:tblLook w:firstColumn="1" w:firstRow="1" w:lastColumn="0" w:lastRow="0" w:noHBand="0" w:noVBand="1" w:val="04A0"/>
       </w:tblPr>
       <w:tblGrid>
-        <w:gridCol w:w="1814"/>
-        <w:gridCol w:w="1814"/>
-        <w:gridCol w:w="1814"/>
-        <w:gridCol w:w="1814"/>
-        <w:gridCol w:w="1814"/>
+        <w:gridCol w:w="1871"/>
+        <w:gridCol w:w="1871"/>
+        <w:gridCol w:w="1871"/>
+        <w:gridCol w:w="1871"/>
+        <w:gridCol w:w="1871"/>
       </w:tblGrid>
       <w:tr>
         <w:tc>
           <w:tcPr>
-            <w:tcW w:type="dxa" w:w="1814"/>
+            <w:tcW w:type="dxa" w:w="1871"/>
             <w:tcBorders>
               <w:top w:val="single" w:sz="4" w:space="0" w:color="000000"/>
               <w:left w:val="single" w:sz="4" w:space="0" w:color="000000"/>
@@ -2944,7 +2988,7 @@
         </w:tc>
         <w:tc>
           <w:tcPr>
-            <w:tcW w:type="dxa" w:w="1814"/>
+            <w:tcW w:type="dxa" w:w="1871"/>
             <w:tcBorders>
               <w:top w:val="single" w:sz="4" w:space="0" w:color="000000"/>
               <w:left w:val="single" w:sz="4" w:space="0" w:color="000000"/>
@@ -2973,7 +3017,7 @@
         </w:tc>
         <w:tc>
           <w:tcPr>
-            <w:tcW w:type="dxa" w:w="1814"/>
+            <w:tcW w:type="dxa" w:w="1871"/>
             <w:tcBorders>
               <w:top w:val="single" w:sz="4" w:space="0" w:color="000000"/>
               <w:left w:val="single" w:sz="4" w:space="0" w:color="000000"/>
@@ -3002,7 +3046,7 @@
         </w:tc>
         <w:tc>
           <w:tcPr>
-            <w:tcW w:type="dxa" w:w="1814"/>
+            <w:tcW w:type="dxa" w:w="1871"/>
             <w:tcBorders>
               <w:top w:val="single" w:sz="4" w:space="0" w:color="000000"/>
               <w:left w:val="single" w:sz="4" w:space="0" w:color="000000"/>
@@ -3031,7 +3075,7 @@
         </w:tc>
         <w:tc>
           <w:tcPr>
-            <w:tcW w:type="dxa" w:w="1814"/>
+            <w:tcW w:type="dxa" w:w="1871"/>
             <w:tcBorders>
               <w:top w:val="single" w:sz="4" w:space="0" w:color="000000"/>
               <w:left w:val="single" w:sz="4" w:space="0" w:color="000000"/>
@@ -3062,7 +3106,7 @@
       <w:tr>
         <w:tc>
           <w:tcPr>
-            <w:tcW w:type="dxa" w:w="1814"/>
+            <w:tcW w:type="dxa" w:w="1871"/>
             <w:tcBorders>
               <w:top w:val="single" w:sz="4" w:space="0" w:color="000000"/>
               <w:left w:val="single" w:sz="4" w:space="0" w:color="000000"/>
@@ -3090,7 +3134,7 @@
         </w:tc>
         <w:tc>
           <w:tcPr>
-            <w:tcW w:type="dxa" w:w="1814"/>
+            <w:tcW w:type="dxa" w:w="1871"/>
             <w:tcBorders>
               <w:top w:val="single" w:sz="4" w:space="0" w:color="000000"/>
               <w:left w:val="single" w:sz="4" w:space="0" w:color="000000"/>
@@ -3118,7 +3162,7 @@
         </w:tc>
         <w:tc>
           <w:tcPr>
-            <w:tcW w:type="dxa" w:w="1814"/>
+            <w:tcW w:type="dxa" w:w="1871"/>
             <w:tcBorders>
               <w:top w:val="single" w:sz="4" w:space="0" w:color="000000"/>
               <w:left w:val="single" w:sz="4" w:space="0" w:color="000000"/>
@@ -3146,7 +3190,7 @@
         </w:tc>
         <w:tc>
           <w:tcPr>
-            <w:tcW w:type="dxa" w:w="1814"/>
+            <w:tcW w:type="dxa" w:w="1871"/>
             <w:tcBorders>
               <w:top w:val="single" w:sz="4" w:space="0" w:color="000000"/>
               <w:left w:val="single" w:sz="4" w:space="0" w:color="000000"/>
@@ -3174,7 +3218,7 @@
         </w:tc>
         <w:tc>
           <w:tcPr>
-            <w:tcW w:type="dxa" w:w="1814"/>
+            <w:tcW w:type="dxa" w:w="1871"/>
             <w:tcBorders>
               <w:top w:val="single" w:sz="4" w:space="0" w:color="000000"/>
               <w:left w:val="single" w:sz="4" w:space="0" w:color="000000"/>
@@ -3203,7 +3247,7 @@
       <w:tr>
         <w:tc>
           <w:tcPr>
-            <w:tcW w:type="dxa" w:w="1814"/>
+            <w:tcW w:type="dxa" w:w="1871"/>
             <w:tcBorders>
               <w:top w:val="single" w:sz="4" w:space="0" w:color="000000"/>
               <w:left w:val="single" w:sz="4" w:space="0" w:color="000000"/>
@@ -3231,7 +3275,7 @@
         </w:tc>
         <w:tc>
           <w:tcPr>
-            <w:tcW w:type="dxa" w:w="1814"/>
+            <w:tcW w:type="dxa" w:w="1871"/>
             <w:tcBorders>
               <w:top w:val="single" w:sz="4" w:space="0" w:color="000000"/>
               <w:left w:val="single" w:sz="4" w:space="0" w:color="000000"/>
@@ -3259,7 +3303,7 @@
         </w:tc>
         <w:tc>
           <w:tcPr>
-            <w:tcW w:type="dxa" w:w="1814"/>
+            <w:tcW w:type="dxa" w:w="1871"/>
             <w:tcBorders>
               <w:top w:val="single" w:sz="4" w:space="0" w:color="000000"/>
               <w:left w:val="single" w:sz="4" w:space="0" w:color="000000"/>
@@ -3287,7 +3331,7 @@
         </w:tc>
         <w:tc>
           <w:tcPr>
-            <w:tcW w:type="dxa" w:w="1814"/>
+            <w:tcW w:type="dxa" w:w="1871"/>
             <w:tcBorders>
               <w:top w:val="single" w:sz="4" w:space="0" w:color="000000"/>
               <w:left w:val="single" w:sz="4" w:space="0" w:color="000000"/>
@@ -3315,7 +3359,7 @@
         </w:tc>
         <w:tc>
           <w:tcPr>
-            <w:tcW w:type="dxa" w:w="1814"/>
+            <w:tcW w:type="dxa" w:w="1871"/>
             <w:tcBorders>
               <w:top w:val="single" w:sz="4" w:space="0" w:color="000000"/>
               <w:left w:val="single" w:sz="4" w:space="0" w:color="000000"/>
@@ -3345,7 +3389,7 @@
       <w:tr>
         <w:tc>
           <w:tcPr>
-            <w:tcW w:type="dxa" w:w="1814"/>
+            <w:tcW w:type="dxa" w:w="1871"/>
             <w:tcBorders>
               <w:top w:val="single" w:sz="4" w:space="0" w:color="000000"/>
               <w:left w:val="single" w:sz="4" w:space="0" w:color="000000"/>
@@ -3373,7 +3417,7 @@
         </w:tc>
         <w:tc>
           <w:tcPr>
-            <w:tcW w:type="dxa" w:w="1814"/>
+            <w:tcW w:type="dxa" w:w="1871"/>
             <w:tcBorders>
               <w:top w:val="single" w:sz="4" w:space="0" w:color="000000"/>
               <w:left w:val="single" w:sz="4" w:space="0" w:color="000000"/>
@@ -3401,7 +3445,7 @@
         </w:tc>
         <w:tc>
           <w:tcPr>
-            <w:tcW w:type="dxa" w:w="1814"/>
+            <w:tcW w:type="dxa" w:w="1871"/>
             <w:tcBorders>
               <w:top w:val="single" w:sz="4" w:space="0" w:color="000000"/>
               <w:left w:val="single" w:sz="4" w:space="0" w:color="000000"/>
@@ -3429,7 +3473,7 @@
         </w:tc>
         <w:tc>
           <w:tcPr>
-            <w:tcW w:type="dxa" w:w="1814"/>
+            <w:tcW w:type="dxa" w:w="1871"/>
             <w:tcBorders>
               <w:top w:val="single" w:sz="4" w:space="0" w:color="000000"/>
               <w:left w:val="single" w:sz="4" w:space="0" w:color="000000"/>
@@ -3457,7 +3501,7 @@
         </w:tc>
         <w:tc>
           <w:tcPr>
-            <w:tcW w:type="dxa" w:w="1814"/>
+            <w:tcW w:type="dxa" w:w="1871"/>
             <w:tcBorders>
               <w:top w:val="single" w:sz="4" w:space="0" w:color="000000"/>
               <w:left w:val="single" w:sz="4" w:space="0" w:color="000000"/>
@@ -3530,7 +3574,7 @@
                     <pic:cNvPicPr/>
                   </pic:nvPicPr>
                   <pic:blipFill>
-                    <a:blip r:embed="rId10"/>
+                    <a:blip r:embed="rId11"/>
                     <a:stretch>
                       <a:fillRect/>
                     </a:stretch>
@@ -3662,14 +3706,14 @@
         <w:tblLook w:firstColumn="1" w:firstRow="1" w:lastColumn="0" w:lastRow="0" w:noHBand="0" w:noVBand="1" w:val="04A0"/>
       </w:tblPr>
       <w:tblGrid>
-        <w:gridCol w:w="3024"/>
-        <w:gridCol w:w="3024"/>
-        <w:gridCol w:w="3024"/>
+        <w:gridCol w:w="3118"/>
+        <w:gridCol w:w="3118"/>
+        <w:gridCol w:w="3118"/>
       </w:tblGrid>
       <w:tr>
         <w:tc>
           <w:tcPr>
-            <w:tcW w:type="dxa" w:w="3024"/>
+            <w:tcW w:type="dxa" w:w="3118"/>
             <w:tcBorders>
               <w:top w:val="single" w:sz="4" w:space="0" w:color="000000"/>
               <w:left w:val="single" w:sz="4" w:space="0" w:color="000000"/>
@@ -3698,7 +3742,7 @@
         </w:tc>
         <w:tc>
           <w:tcPr>
-            <w:tcW w:type="dxa" w:w="3024"/>
+            <w:tcW w:type="dxa" w:w="3118"/>
             <w:tcBorders>
               <w:top w:val="single" w:sz="4" w:space="0" w:color="000000"/>
               <w:left w:val="single" w:sz="4" w:space="0" w:color="000000"/>
@@ -3727,7 +3771,7 @@
         </w:tc>
         <w:tc>
           <w:tcPr>
-            <w:tcW w:type="dxa" w:w="3024"/>
+            <w:tcW w:type="dxa" w:w="3118"/>
             <w:tcBorders>
               <w:top w:val="single" w:sz="4" w:space="0" w:color="000000"/>
               <w:left w:val="single" w:sz="4" w:space="0" w:color="000000"/>
@@ -3758,7 +3802,7 @@
       <w:tr>
         <w:tc>
           <w:tcPr>
-            <w:tcW w:type="dxa" w:w="3024"/>
+            <w:tcW w:type="dxa" w:w="3118"/>
             <w:tcBorders>
               <w:top w:val="single" w:sz="4" w:space="0" w:color="000000"/>
               <w:left w:val="single" w:sz="4" w:space="0" w:color="000000"/>
@@ -3786,7 +3830,7 @@
         </w:tc>
         <w:tc>
           <w:tcPr>
-            <w:tcW w:type="dxa" w:w="3024"/>
+            <w:tcW w:type="dxa" w:w="3118"/>
             <w:tcBorders>
               <w:top w:val="single" w:sz="4" w:space="0" w:color="000000"/>
               <w:left w:val="single" w:sz="4" w:space="0" w:color="000000"/>
@@ -3814,7 +3858,7 @@
         </w:tc>
         <w:tc>
           <w:tcPr>
-            <w:tcW w:type="dxa" w:w="3024"/>
+            <w:tcW w:type="dxa" w:w="3118"/>
             <w:tcBorders>
               <w:top w:val="single" w:sz="4" w:space="0" w:color="000000"/>
               <w:left w:val="single" w:sz="4" w:space="0" w:color="000000"/>
@@ -3844,7 +3888,7 @@
       <w:tr>
         <w:tc>
           <w:tcPr>
-            <w:tcW w:type="dxa" w:w="3024"/>
+            <w:tcW w:type="dxa" w:w="3118"/>
             <w:tcBorders>
               <w:top w:val="single" w:sz="4" w:space="0" w:color="000000"/>
               <w:left w:val="single" w:sz="4" w:space="0" w:color="000000"/>
@@ -3872,7 +3916,7 @@
         </w:tc>
         <w:tc>
           <w:tcPr>
-            <w:tcW w:type="dxa" w:w="3024"/>
+            <w:tcW w:type="dxa" w:w="3118"/>
             <w:tcBorders>
               <w:top w:val="single" w:sz="4" w:space="0" w:color="000000"/>
               <w:left w:val="single" w:sz="4" w:space="0" w:color="000000"/>
@@ -3900,7 +3944,7 @@
         </w:tc>
         <w:tc>
           <w:tcPr>
-            <w:tcW w:type="dxa" w:w="3024"/>
+            <w:tcW w:type="dxa" w:w="3118"/>
             <w:tcBorders>
               <w:top w:val="single" w:sz="4" w:space="0" w:color="000000"/>
               <w:left w:val="single" w:sz="4" w:space="0" w:color="000000"/>
@@ -3930,7 +3974,7 @@
       <w:tr>
         <w:tc>
           <w:tcPr>
-            <w:tcW w:type="dxa" w:w="3024"/>
+            <w:tcW w:type="dxa" w:w="3118"/>
             <w:tcBorders>
               <w:top w:val="single" w:sz="4" w:space="0" w:color="000000"/>
               <w:left w:val="single" w:sz="4" w:space="0" w:color="000000"/>
@@ -3958,7 +4002,7 @@
         </w:tc>
         <w:tc>
           <w:tcPr>
-            <w:tcW w:type="dxa" w:w="3024"/>
+            <w:tcW w:type="dxa" w:w="3118"/>
             <w:tcBorders>
               <w:top w:val="single" w:sz="4" w:space="0" w:color="000000"/>
               <w:left w:val="single" w:sz="4" w:space="0" w:color="000000"/>
@@ -3986,7 +4030,7 @@
         </w:tc>
         <w:tc>
           <w:tcPr>
-            <w:tcW w:type="dxa" w:w="3024"/>
+            <w:tcW w:type="dxa" w:w="3118"/>
             <w:tcBorders>
               <w:top w:val="single" w:sz="4" w:space="0" w:color="000000"/>
               <w:left w:val="single" w:sz="4" w:space="0" w:color="000000"/>
@@ -4124,16 +4168,16 @@
         <w:tblLook w:firstColumn="1" w:firstRow="1" w:lastColumn="0" w:lastRow="0" w:noHBand="0" w:noVBand="1" w:val="04A0"/>
       </w:tblPr>
       <w:tblGrid>
-        <w:gridCol w:w="1814"/>
-        <w:gridCol w:w="1814"/>
-        <w:gridCol w:w="1814"/>
-        <w:gridCol w:w="1814"/>
-        <w:gridCol w:w="1814"/>
+        <w:gridCol w:w="1871"/>
+        <w:gridCol w:w="1871"/>
+        <w:gridCol w:w="1871"/>
+        <w:gridCol w:w="1871"/>
+        <w:gridCol w:w="1871"/>
       </w:tblGrid>
       <w:tr>
         <w:tc>
           <w:tcPr>
-            <w:tcW w:type="dxa" w:w="1814"/>
+            <w:tcW w:type="dxa" w:w="1871"/>
             <w:tcBorders>
               <w:top w:val="single" w:sz="4" w:space="0" w:color="000000"/>
               <w:left w:val="single" w:sz="4" w:space="0" w:color="000000"/>
@@ -4162,7 +4206,7 @@
         </w:tc>
         <w:tc>
           <w:tcPr>
-            <w:tcW w:type="dxa" w:w="1814"/>
+            <w:tcW w:type="dxa" w:w="1871"/>
             <w:tcBorders>
               <w:top w:val="single" w:sz="4" w:space="0" w:color="000000"/>
               <w:left w:val="single" w:sz="4" w:space="0" w:color="000000"/>
@@ -4191,7 +4235,7 @@
         </w:tc>
         <w:tc>
           <w:tcPr>
-            <w:tcW w:type="dxa" w:w="1814"/>
+            <w:tcW w:type="dxa" w:w="1871"/>
             <w:tcBorders>
               <w:top w:val="single" w:sz="4" w:space="0" w:color="000000"/>
               <w:left w:val="single" w:sz="4" w:space="0" w:color="000000"/>
@@ -4220,7 +4264,7 @@
         </w:tc>
         <w:tc>
           <w:tcPr>
-            <w:tcW w:type="dxa" w:w="1814"/>
+            <w:tcW w:type="dxa" w:w="1871"/>
             <w:tcBorders>
               <w:top w:val="single" w:sz="4" w:space="0" w:color="000000"/>
               <w:left w:val="single" w:sz="4" w:space="0" w:color="000000"/>
@@ -4249,7 +4293,7 @@
         </w:tc>
         <w:tc>
           <w:tcPr>
-            <w:tcW w:type="dxa" w:w="1814"/>
+            <w:tcW w:type="dxa" w:w="1871"/>
             <w:tcBorders>
               <w:top w:val="single" w:sz="4" w:space="0" w:color="000000"/>
               <w:left w:val="single" w:sz="4" w:space="0" w:color="000000"/>
@@ -4280,7 +4324,7 @@
       <w:tr>
         <w:tc>
           <w:tcPr>
-            <w:tcW w:type="dxa" w:w="1814"/>
+            <w:tcW w:type="dxa" w:w="1871"/>
             <w:tcBorders>
               <w:top w:val="single" w:sz="4" w:space="0" w:color="000000"/>
               <w:left w:val="single" w:sz="4" w:space="0" w:color="000000"/>
@@ -4308,7 +4352,7 @@
         </w:tc>
         <w:tc>
           <w:tcPr>
-            <w:tcW w:type="dxa" w:w="1814"/>
+            <w:tcW w:type="dxa" w:w="1871"/>
             <w:tcBorders>
               <w:top w:val="single" w:sz="4" w:space="0" w:color="000000"/>
               <w:left w:val="single" w:sz="4" w:space="0" w:color="000000"/>
@@ -4336,7 +4380,7 @@
         </w:tc>
         <w:tc>
           <w:tcPr>
-            <w:tcW w:type="dxa" w:w="1814"/>
+            <w:tcW w:type="dxa" w:w="1871"/>
             <w:tcBorders>
               <w:top w:val="single" w:sz="4" w:space="0" w:color="000000"/>
               <w:left w:val="single" w:sz="4" w:space="0" w:color="000000"/>
@@ -4364,7 +4408,7 @@
         </w:tc>
         <w:tc>
           <w:tcPr>
-            <w:tcW w:type="dxa" w:w="1814"/>
+            <w:tcW w:type="dxa" w:w="1871"/>
             <w:tcBorders>
               <w:top w:val="single" w:sz="4" w:space="0" w:color="000000"/>
               <w:left w:val="single" w:sz="4" w:space="0" w:color="000000"/>
@@ -4392,7 +4436,7 @@
         </w:tc>
         <w:tc>
           <w:tcPr>
-            <w:tcW w:type="dxa" w:w="1814"/>
+            <w:tcW w:type="dxa" w:w="1871"/>
             <w:tcBorders>
               <w:top w:val="single" w:sz="4" w:space="0" w:color="000000"/>
               <w:left w:val="single" w:sz="4" w:space="0" w:color="000000"/>
@@ -4421,7 +4465,7 @@
       <w:tr>
         <w:tc>
           <w:tcPr>
-            <w:tcW w:type="dxa" w:w="1814"/>
+            <w:tcW w:type="dxa" w:w="1871"/>
             <w:tcBorders>
               <w:top w:val="single" w:sz="4" w:space="0" w:color="000000"/>
               <w:left w:val="single" w:sz="4" w:space="0" w:color="000000"/>
@@ -4449,7 +4493,7 @@
         </w:tc>
         <w:tc>
           <w:tcPr>
-            <w:tcW w:type="dxa" w:w="1814"/>
+            <w:tcW w:type="dxa" w:w="1871"/>
             <w:tcBorders>
               <w:top w:val="single" w:sz="4" w:space="0" w:color="000000"/>
               <w:left w:val="single" w:sz="4" w:space="0" w:color="000000"/>
@@ -4477,7 +4521,7 @@
         </w:tc>
         <w:tc>
           <w:tcPr>
-            <w:tcW w:type="dxa" w:w="1814"/>
+            <w:tcW w:type="dxa" w:w="1871"/>
             <w:tcBorders>
               <w:top w:val="single" w:sz="4" w:space="0" w:color="000000"/>
               <w:left w:val="single" w:sz="4" w:space="0" w:color="000000"/>
@@ -4505,7 +4549,7 @@
         </w:tc>
         <w:tc>
           <w:tcPr>
-            <w:tcW w:type="dxa" w:w="1814"/>
+            <w:tcW w:type="dxa" w:w="1871"/>
             <w:tcBorders>
               <w:top w:val="single" w:sz="4" w:space="0" w:color="000000"/>
               <w:left w:val="single" w:sz="4" w:space="0" w:color="000000"/>
@@ -4533,7 +4577,7 @@
         </w:tc>
         <w:tc>
           <w:tcPr>
-            <w:tcW w:type="dxa" w:w="1814"/>
+            <w:tcW w:type="dxa" w:w="1871"/>
             <w:tcBorders>
               <w:top w:val="single" w:sz="4" w:space="0" w:color="000000"/>
               <w:left w:val="single" w:sz="4" w:space="0" w:color="000000"/>
@@ -4563,7 +4607,7 @@
       <w:tr>
         <w:tc>
           <w:tcPr>
-            <w:tcW w:type="dxa" w:w="1814"/>
+            <w:tcW w:type="dxa" w:w="1871"/>
             <w:tcBorders>
               <w:top w:val="single" w:sz="4" w:space="0" w:color="000000"/>
               <w:left w:val="single" w:sz="4" w:space="0" w:color="000000"/>
@@ -4591,7 +4635,7 @@
         </w:tc>
         <w:tc>
           <w:tcPr>
-            <w:tcW w:type="dxa" w:w="1814"/>
+            <w:tcW w:type="dxa" w:w="1871"/>
             <w:tcBorders>
               <w:top w:val="single" w:sz="4" w:space="0" w:color="000000"/>
               <w:left w:val="single" w:sz="4" w:space="0" w:color="000000"/>
@@ -4619,7 +4663,7 @@
         </w:tc>
         <w:tc>
           <w:tcPr>
-            <w:tcW w:type="dxa" w:w="1814"/>
+            <w:tcW w:type="dxa" w:w="1871"/>
             <w:tcBorders>
               <w:top w:val="single" w:sz="4" w:space="0" w:color="000000"/>
               <w:left w:val="single" w:sz="4" w:space="0" w:color="000000"/>
@@ -4647,7 +4691,7 @@
         </w:tc>
         <w:tc>
           <w:tcPr>
-            <w:tcW w:type="dxa" w:w="1814"/>
+            <w:tcW w:type="dxa" w:w="1871"/>
             <w:tcBorders>
               <w:top w:val="single" w:sz="4" w:space="0" w:color="000000"/>
               <w:left w:val="single" w:sz="4" w:space="0" w:color="000000"/>
@@ -4675,7 +4719,7 @@
         </w:tc>
         <w:tc>
           <w:tcPr>
-            <w:tcW w:type="dxa" w:w="1814"/>
+            <w:tcW w:type="dxa" w:w="1871"/>
             <w:tcBorders>
               <w:top w:val="single" w:sz="4" w:space="0" w:color="000000"/>
               <w:left w:val="single" w:sz="4" w:space="0" w:color="000000"/>
@@ -4748,7 +4792,7 @@
                     <pic:cNvPicPr/>
                   </pic:nvPicPr>
                   <pic:blipFill>
-                    <a:blip r:embed="rId11"/>
+                    <a:blip r:embed="rId12"/>
                     <a:stretch>
                       <a:fillRect/>
                     </a:stretch>
@@ -4850,7 +4894,7 @@
                     <pic:cNvPicPr/>
                   </pic:nvPicPr>
                   <pic:blipFill>
-                    <a:blip r:embed="rId12"/>
+                    <a:blip r:embed="rId13"/>
                     <a:stretch>
                       <a:fillRect/>
                     </a:stretch>
@@ -6049,9 +6093,10 @@
       </w:r>
     </w:p>
     <w:sectPr>
-      <w:footerReference w:type="default" r:id="rId9"/>
+      <w:headerReference w:type="default" r:id="rId9"/>
+      <w:footerReference w:type="default" r:id="rId10"/>
       <w:pgSz w:w="11906" w:h="16838"/>
-      <w:pgMar w:top="1417" w:right="1134" w:bottom="1417" w:left="1701" w:header="720" w:footer="720" w:gutter="0"/>
+      <w:pgMar w:top="1928" w:right="1134" w:bottom="2041" w:left="1417" w:header="283" w:footer="227" w:gutter="0"/>
       <w:cols w:space="720"/>
       <w:docGrid w:linePitch="360"/>
     </w:sectPr>
@@ -6064,7 +6109,11 @@
   <w:p>
     <w:pPr>
       <w:pStyle w:val="Footer"/>
+      <w:spacing w:before="40" w:after="0" w:line="240" w:lineRule="auto"/>
       <w:jc w:val="center"/>
+      <w:pBdr>
+        <w:top w:val="single" w:sz="12" w:space="4" w:color="000000"/>
+      </w:pBdr>
     </w:pPr>
     <w:r>
       <w:rPr>
@@ -6072,7 +6121,71 @@
         <w:b w:val="0"/>
         <w:i w:val="0"/>
         <w:color w:val="000000"/>
-        <w:sz w:val="22"/>
+        <w:sz w:val="16"/>
+      </w:rPr>
+      <w:t>Address: P.O. Box 37, Sidi Gaber, Canal El Mahmoudia Street, Smouha, Alexandria, Egypt</w:t>
+    </w:r>
+  </w:p>
+  <w:p>
+    <w:pPr>
+      <w:spacing w:before="0" w:after="0" w:line="240" w:lineRule="auto"/>
+      <w:jc w:val="center"/>
+    </w:pPr>
+    <w:r>
+      <w:rPr>
+        <w:rFonts w:ascii="Times New Roman" w:hAnsi="Times New Roman" w:eastAsia="Times New Roman"/>
+        <w:b w:val="0"/>
+        <w:i w:val="0"/>
+        <w:color w:val="000000"/>
+        <w:sz w:val="16"/>
+      </w:rPr>
+      <w:t>العنوان: صندوق بريد ٣٧ سيدي جابر – شارع قناة المحمودية – سموحة – الإسكندرية – مصر</w:t>
+    </w:r>
+  </w:p>
+  <w:p>
+    <w:pPr>
+      <w:spacing w:before="0" w:after="0" w:line="240" w:lineRule="auto"/>
+      <w:jc w:val="center"/>
+    </w:pPr>
+    <w:r>
+      <w:rPr>
+        <w:rFonts w:ascii="Times New Roman" w:hAnsi="Times New Roman" w:eastAsia="Times New Roman"/>
+        <w:b w:val="0"/>
+        <w:i w:val="0"/>
+        <w:color w:val="000000"/>
+        <w:sz w:val="16"/>
+      </w:rPr>
+      <w:t>Phone: +(203) 38 77 026     Fax: +(203) 383 0249</w:t>
+    </w:r>
+  </w:p>
+  <w:p>
+    <w:pPr>
+      <w:spacing w:before="0" w:after="0" w:line="240" w:lineRule="auto"/>
+      <w:jc w:val="center"/>
+    </w:pPr>
+    <w:r>
+      <w:rPr>
+        <w:rFonts w:ascii="Times New Roman" w:hAnsi="Times New Roman" w:eastAsia="Times New Roman"/>
+        <w:b w:val="0"/>
+        <w:i w:val="0"/>
+        <w:color w:val="000000"/>
+        <w:sz w:val="16"/>
+      </w:rPr>
+      <w:t>E-mail: Dentistry@pua.edu.eg     Web Site: www.pua.edu.eg</w:t>
+    </w:r>
+  </w:p>
+  <w:p>
+    <w:pPr>
+      <w:spacing w:before="40" w:after="0" w:line="240" w:lineRule="auto"/>
+      <w:jc w:val="center"/>
+    </w:pPr>
+    <w:r>
+      <w:rPr>
+        <w:rFonts w:ascii="Times New Roman" w:hAnsi="Times New Roman" w:eastAsia="Times New Roman"/>
+        <w:b w:val="0"/>
+        <w:i w:val="0"/>
+        <w:color w:val="000000"/>
+        <w:sz w:val="20"/>
       </w:rPr>
       <w:fldChar w:fldCharType="begin"/>
       <w:instrText xml:space="preserve"> PAGE </w:instrText>
@@ -6080,6 +6193,55 @@
     </w:r>
   </w:p>
 </w:ftr>
+</file>
+
+<file path=word/header1.xml><?xml version="1.0" encoding="utf-8"?>
+<w:hdr xmlns:m="http://schemas.openxmlformats.org/officeDocument/2006/math" xmlns:mc="http://schemas.openxmlformats.org/markup-compatibility/2006" xmlns:mo="http://schemas.microsoft.com/office/mac/office/2008/main" xmlns:mv="urn:schemas-microsoft-com:mac:vml" xmlns:o="urn:schemas-microsoft-com:office:office" xmlns:r="http://schemas.openxmlformats.org/officeDocument/2006/relationships" xmlns:v="urn:schemas-microsoft-com:vml" xmlns:w10="urn:schemas-microsoft-com:office:word" xmlns:w14="http://schemas.microsoft.com/office/word/2010/wordml" xmlns:w="http://schemas.openxmlformats.org/wordprocessingml/2006/main" xmlns:wne="http://schemas.microsoft.com/office/word/2006/wordml" xmlns:wp14="http://schemas.microsoft.com/office/word/2010/wordprocessingDrawing" xmlns:wp="http://schemas.openxmlformats.org/drawingml/2006/wordprocessingDrawing" xmlns:wpc="http://schemas.microsoft.com/office/word/2010/wordprocessingCanvas" xmlns:wpg="http://schemas.microsoft.com/office/word/2010/wordprocessingGroup" xmlns:wpi="http://schemas.microsoft.com/office/word/2010/wordprocessingInk" xmlns:wps="http://schemas.microsoft.com/office/word/2010/wordprocessingShape" mc:Ignorable="w14 wp14">
+  <w:p>
+    <w:pPr>
+      <w:pStyle w:val="Header"/>
+      <w:spacing w:before="0" w:after="40" w:line="240" w:lineRule="auto"/>
+      <w:jc w:val="center"/>
+      <w:pBdr>
+        <w:bottom w:val="single" w:sz="12" w:space="4" w:color="000000"/>
+      </w:pBdr>
+    </w:pPr>
+    <w:r>
+      <w:drawing>
+        <wp:inline xmlns:a="http://schemas.openxmlformats.org/drawingml/2006/main" xmlns:pic="http://schemas.openxmlformats.org/drawingml/2006/picture">
+          <wp:extent cx="5760000" cy="768000"/>
+          <wp:docPr id="1" name="Picture 1"/>
+          <wp:cNvGraphicFramePr>
+            <a:graphicFrameLocks noChangeAspect="1"/>
+          </wp:cNvGraphicFramePr>
+          <a:graphic>
+            <a:graphicData uri="http://schemas.openxmlformats.org/drawingml/2006/picture">
+              <pic:pic>
+                <pic:nvPicPr>
+                  <pic:cNvPr id="0" name="pua_header.png"/>
+                  <pic:cNvPicPr/>
+                </pic:nvPicPr>
+                <pic:blipFill>
+                  <a:blip r:embed="rId1"/>
+                  <a:stretch>
+                    <a:fillRect/>
+                  </a:stretch>
+                </pic:blipFill>
+                <pic:spPr>
+                  <a:xfrm>
+                    <a:off x="0" y="0"/>
+                    <a:ext cx="5760000" cy="768000"/>
+                  </a:xfrm>
+                  <a:prstGeom prst="rect"/>
+                </pic:spPr>
+              </pic:pic>
+            </a:graphicData>
+          </a:graphic>
+        </wp:inline>
+      </w:drawing>
+    </w:r>
+  </w:p>
+</w:hdr>
 </file>
 
 <file path=word/numbering.xml><?xml version="1.0" encoding="utf-8"?>

</xml_diff>

<commit_message>
Add laboratory detail and three verified papers, without padding
Expand only where the protocol or the locked data already support it: study setting, G*Power, the Mylar-finished surface, drying, and a short comparison with AlAli, Imai and Dionysopoulos. No new statistics.

Co-authored-by: Ahmed El Gamry <ahmed733676-droid@users.noreply.github.com>
</commit_message>
<xml_diff>
--- a/Thesis_Complete.docx
+++ b/Thesis_Complete.docx
@@ -575,7 +575,7 @@
           <w:color w:val="000000"/>
           <w:sz w:val="24"/>
         </w:rPr>
-        <w:t>I wish to thank my supervisors for their guidance throughout the planning and writing of this work, and the laboratory staff who supported the experimental procedures. I am grateful to my family for their patience during the period of study.</w:t>
+        <w:t>I am grateful to Prof. Wegdan M. Abdel-Fattah and Asst. Prof. Emad M. El-Sayed for supervising this work from the protocol through the writing of the thesis. The discs were prepared in the laboratory of the Faculty of Dentistry, Pharos University in Alexandria, and the toothbrushing runs were carried out in the Dental Biomaterials Department of the Faculty of Dentistry, Alexandria University. I thank the staff of both laboratories. I am indebted to my family for the time this degree has taken from them.</w:t>
       </w:r>
     </w:p>
     <w:p>
@@ -896,7 +896,7 @@
           <w:sz w:val="24"/>
         </w:rPr>
         <w:tab/>
-        <w:t>13</w:t>
+        <w:t>14</w:t>
       </w:r>
     </w:p>
     <w:p>
@@ -928,7 +928,7 @@
           <w:sz w:val="24"/>
         </w:rPr>
         <w:tab/>
-        <w:t>20</w:t>
+        <w:t>22</w:t>
       </w:r>
     </w:p>
     <w:p>
@@ -960,7 +960,7 @@
           <w:sz w:val="24"/>
         </w:rPr>
         <w:tab/>
-        <w:t>24</w:t>
+        <w:t>27</w:t>
       </w:r>
     </w:p>
     <w:p>
@@ -992,7 +992,7 @@
           <w:sz w:val="24"/>
         </w:rPr>
         <w:tab/>
-        <w:t>30</w:t>
+        <w:t>33</w:t>
       </w:r>
     </w:p>
     <w:p>
@@ -1024,7 +1024,7 @@
           <w:sz w:val="24"/>
         </w:rPr>
         <w:tab/>
-        <w:t>36</w:t>
+        <w:t>39</w:t>
       </w:r>
     </w:p>
     <w:p>
@@ -1056,7 +1056,7 @@
           <w:sz w:val="24"/>
         </w:rPr>
         <w:tab/>
-        <w:t>38</w:t>
+        <w:t>41</w:t>
       </w:r>
     </w:p>
     <w:p>
@@ -1308,7 +1308,7 @@
           <w:color w:val="000000"/>
           <w:sz w:val="24"/>
         </w:rPr>
-        <w:t>ISO — International Organization for Standardization</w:t>
+        <w:t>CAD/CAM — computer-aided design / computer-aided manufacture</w:t>
       </w:r>
     </w:p>
     <w:p>
@@ -1326,7 +1326,7 @@
           <w:color w:val="000000"/>
           <w:sz w:val="24"/>
         </w:rPr>
-        <w:t>Ra — arithmetic mean roughness</w:t>
+        <w:t>ISO — International Organization for Standardization</w:t>
       </w:r>
     </w:p>
     <w:p>
@@ -1344,7 +1344,7 @@
           <w:color w:val="000000"/>
           <w:sz w:val="24"/>
         </w:rPr>
-        <w:t>RDA — relative dentine abrasivity</w:t>
+        <w:t>LED — light-emitting diode</w:t>
       </w:r>
     </w:p>
     <w:p>
@@ -1362,7 +1362,7 @@
           <w:color w:val="000000"/>
           <w:sz w:val="24"/>
         </w:rPr>
-        <w:t>SD — standard deviation</w:t>
+        <w:t>Ra — arithmetic mean roughness</w:t>
       </w:r>
     </w:p>
     <w:p>
@@ -1380,7 +1380,61 @@
           <w:color w:val="000000"/>
           <w:sz w:val="24"/>
         </w:rPr>
+        <w:t>RDA — relative dentine abrasivity</w:t>
+      </w:r>
+    </w:p>
+    <w:p>
+      <w:pPr>
+        <w:widowControl/>
+        <w:spacing w:before="0" w:after="0" w:line="480" w:lineRule="auto"/>
+        <w:ind w:firstLine="720"/>
+        <w:jc w:val="both"/>
+      </w:pPr>
+      <w:r>
+        <w:rPr>
+          <w:rFonts w:ascii="Times New Roman" w:hAnsi="Times New Roman" w:eastAsia="Times New Roman"/>
+          <w:b w:val="0"/>
+          <w:i w:val="0"/>
+          <w:color w:val="000000"/>
+          <w:sz w:val="24"/>
+        </w:rPr>
+        <w:t>SD — standard deviation</w:t>
+      </w:r>
+    </w:p>
+    <w:p>
+      <w:pPr>
+        <w:widowControl/>
+        <w:spacing w:before="0" w:after="0" w:line="480" w:lineRule="auto"/>
+        <w:ind w:firstLine="720"/>
+        <w:jc w:val="both"/>
+      </w:pPr>
+      <w:r>
+        <w:rPr>
+          <w:rFonts w:ascii="Times New Roman" w:hAnsi="Times New Roman" w:eastAsia="Times New Roman"/>
+          <w:b w:val="0"/>
+          <w:i w:val="0"/>
+          <w:color w:val="000000"/>
+          <w:sz w:val="24"/>
+        </w:rPr>
         <w:t>S-PRG — surface pre-reacted glass-ionomer</w:t>
+      </w:r>
+    </w:p>
+    <w:p>
+      <w:pPr>
+        <w:widowControl/>
+        <w:spacing w:before="0" w:after="0" w:line="480" w:lineRule="auto"/>
+        <w:ind w:firstLine="720"/>
+        <w:jc w:val="both"/>
+      </w:pPr>
+      <w:r>
+        <w:rPr>
+          <w:rFonts w:ascii="Times New Roman" w:hAnsi="Times New Roman" w:eastAsia="Times New Roman"/>
+          <w:b w:val="0"/>
+          <w:i w:val="0"/>
+          <w:color w:val="000000"/>
+          <w:sz w:val="24"/>
+        </w:rPr>
+        <w:t>vol% — percentage by volume</w:t>
       </w:r>
     </w:p>
     <w:p>
@@ -1744,7 +1798,7 @@
           <w:color w:val="000000"/>
           <w:sz w:val="24"/>
         </w:rPr>
-        <w:t xml:space="preserve">. A later generation of highly filled injectable composites was formulated to close that gap. By combining a higher inorganic load, a smaller mean particle size and improved silane treatment, manufacturers produced pastes that can still be injected from a syringe yet are offered for use in Class I and II restorations </w:t>
+        <w:t xml:space="preserve">. A later generation of highly filled injectable composites was formulated to close that gap. By combining a higher inorganic load, a smaller mean particle size and improved silane treatment, manufacturers produced pastes that can still be injected from a syringe, often as a single increment, yet are offered for use in Class I and II restorations </w:t>
       </w:r>
       <w:r>
         <w:rPr>
@@ -1765,7 +1819,7 @@
           <w:color w:val="000000"/>
           <w:sz w:val="24"/>
         </w:rPr>
-        <w:t>. Two such products, G-ænial Universal Injectable (GC Corporation, Tokyo, Japan) and Beautifil Flow Plus X F00 (Shofu Inc., Kyoto, Japan), are now in routine clinical use. Beautifil II LS (Shofu Inc.), a sculptable low-shrinkage nanohybrid giomer, remains a representative conventional paste and was chosen as the control material for the present work.</w:t>
+        <w:t>. Two such products, G-ænial Universal Injectable (GC Corporation, Tokyo, Japan) and Beautifil Flow Plus X F00 (Shofu Inc., Kyoto, Japan), are now in routine clinical use. Both were tested in shade A2. Beautifil II LS (Shofu Inc.), a sculptable low-shrinkage nanohybrid giomer in the same shade, remains a representative conventional paste and was chosen as the control.</w:t>
       </w:r>
     </w:p>
     <w:p>
@@ -1783,6 +1837,24 @@
           <w:color w:val="000000"/>
           <w:sz w:val="24"/>
         </w:rPr>
+        <w:t>The three products were not chosen at random. G-ænial Universal Injectable is a nanofilled dimethacrylate paste with barium glass and silica. Beautifil Flow Plus X F00 is a zero-flow giomer injectable. Beautifil II LS is a packable giomer from the same manufacturer as the Shofu injectable. The comparison therefore asks two separate questions: whether two current injectables of different filler chemistry behave alike under the toothbrush, and whether either of them is at a disadvantage beside a conventional nanohybrid of higher filler volume.</w:t>
+      </w:r>
+    </w:p>
+    <w:p>
+      <w:pPr>
+        <w:widowControl/>
+        <w:spacing w:before="0" w:after="0" w:line="480" w:lineRule="auto"/>
+        <w:ind w:firstLine="720"/>
+        <w:jc w:val="both"/>
+      </w:pPr>
+      <w:r>
+        <w:rPr>
+          <w:rFonts w:ascii="Times New Roman" w:hAnsi="Times New Roman" w:eastAsia="Times New Roman"/>
+          <w:b w:val="0"/>
+          <w:i w:val="0"/>
+          <w:color w:val="000000"/>
+          <w:sz w:val="24"/>
+        </w:rPr>
         <w:t xml:space="preserve">The laboratory literature on these products is uneven. Two-body chewing-simulator studies, in which a steatite antagonist is loaded at about 49 N, have reported favourable volumetric wear and flexural strength for highly filled injectables </w:t>
       </w:r>
       <w:r>
@@ -1804,7 +1876,7 @@
           <w:color w:val="000000"/>
           <w:sz w:val="24"/>
         </w:rPr>
-        <w:t xml:space="preserve">. Those data describe occlusal-contact wear. They do not describe the three-body abrasion produced by a toothbrush and a dentifrice slurry, which is the wear mode that acts on free cleanable surfaces and on margins throughout the life of a restoration. Toothbrushing tests conducted according to ISO/TR 14569-1, at a load of 2 N and for 10 000 strokes, are conventionally treated as the laboratory equivalent of one year of twice-daily brushing </w:t>
+        <w:t xml:space="preserve">. Those data describe occlusal-contact wear. They do not describe the three-body abrasion produced by a toothbrush and a dentifrice slurry, which is the wear mode that acts on free cleanable surfaces — including the labial and palatal faces of anterior restorations — and on margins throughout the life of a restoration. Toothbrushing tests conducted according to ISO/TR 14569-1, at a load of 2 N and for 10 000 strokes, are conventionally treated as the laboratory equivalent of one year of twice-daily brushing </w:t>
       </w:r>
       <w:r>
         <w:rPr>
@@ -2520,7 +2592,7 @@
           <w:color w:val="000000"/>
           <w:sz w:val="24"/>
         </w:rPr>
-        <w:t xml:space="preserve">. Gravimetric loss is simple and repeatable when the balance reads to 0.1 mg and the specimen is dried in a consistent way. It does not describe the topography of the worn surface. Volumetric loss from a three-dimensional scan does, but requires equipment that was not used in this study. Heintze and colleagues compared three laboratory methods of wear quantification and showed that they do not always rank materials in the same order </w:t>
+        <w:t xml:space="preserve">. Gravimetric loss is simple and repeatable when the balance reads to 0.1 mg and the specimen is dried in a consistent way. It does not describe the topography of the worn surface, and it cannot separate true abrasive loss from a change in water content if the drying step is not the same before and after the test. Volumetric loss from a three-dimensional scan does describe the worn anatomy, but requires equipment that was not used in this study. Heintze and colleagues compared three laboratory methods of wear quantification and showed that they do not always rank materials in the same order </w:t>
       </w:r>
       <w:r>
         <w:rPr>
@@ -2826,6 +2898,45 @@
     </w:p>
     <w:p>
       <w:pPr>
+        <w:widowControl/>
+        <w:spacing w:before="0" w:after="0" w:line="480" w:lineRule="auto"/>
+        <w:ind w:firstLine="720"/>
+        <w:jc w:val="both"/>
+      </w:pPr>
+      <w:r>
+        <w:rPr>
+          <w:rFonts w:ascii="Times New Roman" w:hAnsi="Times New Roman" w:eastAsia="Times New Roman"/>
+          <w:b w:val="0"/>
+          <w:i w:val="0"/>
+          <w:color w:val="000000"/>
+          <w:sz w:val="24"/>
+        </w:rPr>
+        <w:t xml:space="preserve">How the surface is finished before the first measurement also matters. A Mylar-covered, as-cured face is resin-rich and is not the surface that a dentist leaves after rotary finishing and polishing. AlAli, Silikas and Satterthwaite polished three nanohybrid pastes and then brushed them at intervals up to 20 000 cycles. Ra rose and gloss fell at every interval; after 10 000 cycles the polished nanohybrids were already rougher than they had been at baseline, and by 20 000 cycles mean Ra lay between 0.41 µm and 0.49 µm </w:t>
+      </w:r>
+      <w:r>
+        <w:rPr>
+          <w:rFonts w:ascii="Times New Roman" w:hAnsi="Times New Roman" w:eastAsia="Times New Roman"/>
+          <w:b w:val="0"/>
+          <w:i w:val="0"/>
+          <w:color w:val="000000"/>
+          <w:sz w:val="24"/>
+          <w:vertAlign w:val="superscript"/>
+        </w:rPr>
+        <w:t>(26)</w:t>
+      </w:r>
+      <w:r>
+        <w:rPr>
+          <w:rFonts w:ascii="Times New Roman" w:hAnsi="Times New Roman" w:eastAsia="Times New Roman"/>
+          <w:b w:val="0"/>
+          <w:i w:val="0"/>
+          <w:color w:val="000000"/>
+          <w:sz w:val="24"/>
+        </w:rPr>
+        <w:t>. Their baseline values (0.14–0.22 µm) were those of a polished paste, not of a Mylar film. The present discs were left as cured against Mylar. That choice follows the approved protocol. It means that the baseline Ra reported in Chapter 4 describes the as-cured film, and that any comparison with a polished-specimen paper has to be made with that difference in mind. Gloss was not measured here.</w:t>
+      </w:r>
+    </w:p>
+    <w:p>
+      <w:pPr>
         <w:keepNext/>
         <w:widowControl/>
         <w:spacing w:before="240" w:after="0" w:line="480" w:lineRule="auto"/>
@@ -2999,6 +3110,45 @@
           <w:color w:val="000000"/>
           <w:sz w:val="24"/>
         </w:rPr>
+        <w:t xml:space="preserve">Syringeability and wear are not the same property. Imai and colleagues measured extrusion force and thread formation together with flexural strength and sliding-impact wear in a set of newer flowable resins. Some of those flowables wore as little as, or less than, the conventional pastes in the same study. Handling did not predict wear: a paste that left the syringe easily was not, on that account, the weaker material under the antagonist </w:t>
+      </w:r>
+      <w:r>
+        <w:rPr>
+          <w:rFonts w:ascii="Times New Roman" w:hAnsi="Times New Roman" w:eastAsia="Times New Roman"/>
+          <w:b w:val="0"/>
+          <w:i w:val="0"/>
+          <w:color w:val="000000"/>
+          <w:sz w:val="24"/>
+          <w:vertAlign w:val="superscript"/>
+        </w:rPr>
+        <w:t>(27)</w:t>
+      </w:r>
+      <w:r>
+        <w:rPr>
+          <w:rFonts w:ascii="Times New Roman" w:hAnsi="Times New Roman" w:eastAsia="Times New Roman"/>
+          <w:b w:val="0"/>
+          <w:i w:val="0"/>
+          <w:color w:val="000000"/>
+          <w:sz w:val="24"/>
+        </w:rPr>
+        <w:t>. The finding supports the manufacturer’s claim that a highly filled injectable can be used where a packable paste would otherwise be chosen. It does not, on its own, describe toothbrush abrasion.</w:t>
+      </w:r>
+    </w:p>
+    <w:p>
+      <w:pPr>
+        <w:widowControl/>
+        <w:spacing w:before="0" w:after="0" w:line="480" w:lineRule="auto"/>
+        <w:ind w:firstLine="720"/>
+        <w:jc w:val="both"/>
+      </w:pPr>
+      <w:r>
+        <w:rPr>
+          <w:rFonts w:ascii="Times New Roman" w:hAnsi="Times New Roman" w:eastAsia="Times New Roman"/>
+          <w:b w:val="0"/>
+          <w:i w:val="0"/>
+          <w:color w:val="000000"/>
+          <w:sz w:val="24"/>
+        </w:rPr>
         <w:t xml:space="preserve">Rajabi, Denny, Karagiannopoulos and Petridis compared G-ænial Universal Injectable and Beautifil Flow Plus F00 with a conventional flowable (Tetric EvoFlow) and a nanohybrid paste (IPS Empress Direct) in two-body wear. Specimens were cycled 200 000 times against a steatite antagonist at 49 N under dry conditions, a regimen intended to represent approximately one year of occlusal contact. Both injectables lost less volume and showed higher flexural strength than the paste and the classical flowable; the two injectables did not differ from each other </w:t>
       </w:r>
       <w:r>
@@ -3483,7 +3633,7 @@
           <w:color w:val="000000"/>
           <w:sz w:val="28"/>
         </w:rPr>
-        <w:t>3.1 Study design and sample</w:t>
+        <w:t>3.1 Study design, setting and sample</w:t>
       </w:r>
     </w:p>
     <w:p>
@@ -3501,7 +3651,118 @@
           <w:color w:val="000000"/>
           <w:sz w:val="24"/>
         </w:rPr>
-        <w:t>The investigation was a comparative in-vitro study of three commercially available resin composites. Thirty-six disc-shaped specimens, 10 mm in diameter and 1 mm thick, were prepared in a CAD/CAM Teflon mould. The discs were allocated at random to three equal groups (n = 12) according to the restorative material. An initial sample-size calculation in G*Power had indicated ten specimens per group; twelve were prepared in order to increase the power of the subsequent comparisons.</w:t>
+        <w:t>The investigation was a comparative in-vitro study of three commercially available resin composites. Disc specimens were prepared in the laboratory of the Faculty of Dentistry, Pharos University in Alexandria. The toothbrushing runs were carried out on a custom simulator in the Dental Biomaterials Department of the Faculty of Dentistry, Alexandria University.</w:t>
+      </w:r>
+    </w:p>
+    <w:p>
+      <w:pPr>
+        <w:widowControl/>
+        <w:spacing w:before="0" w:after="0" w:line="480" w:lineRule="auto"/>
+        <w:ind w:firstLine="720"/>
+        <w:jc w:val="both"/>
+      </w:pPr>
+      <w:r>
+        <w:rPr>
+          <w:rFonts w:ascii="Times New Roman" w:hAnsi="Times New Roman" w:eastAsia="Times New Roman"/>
+          <w:b w:val="0"/>
+          <w:i w:val="0"/>
+          <w:color w:val="000000"/>
+          <w:sz w:val="24"/>
+        </w:rPr>
+        <w:t>Thirty-six discs, 10 mm in diameter and 1 mm thick, were prepared in a CAD/CAM Teflon mould designed in Blender (Blender Institute B.V., Amsterdam). The discs were allocated at random to three equal groups (n = 12) according to the restorative material:</w:t>
+      </w:r>
+    </w:p>
+    <w:p>
+      <w:pPr>
+        <w:widowControl/>
+        <w:spacing w:before="0" w:after="0" w:line="480" w:lineRule="auto"/>
+        <w:ind w:left="720" w:hanging="720"/>
+        <w:jc w:val="both"/>
+      </w:pPr>
+      <w:r>
+        <w:rPr>
+          <w:rFonts w:ascii="Times New Roman" w:hAnsi="Times New Roman" w:eastAsia="Times New Roman"/>
+          <w:b w:val="0"/>
+          <w:i w:val="0"/>
+          <w:color w:val="000000"/>
+          <w:sz w:val="24"/>
+        </w:rPr>
+        <w:t>1. Group I — G-ænial Universal Injectable.</w:t>
+      </w:r>
+    </w:p>
+    <w:p>
+      <w:pPr>
+        <w:widowControl/>
+        <w:spacing w:before="0" w:after="0" w:line="480" w:lineRule="auto"/>
+        <w:ind w:left="720" w:hanging="720"/>
+        <w:jc w:val="both"/>
+      </w:pPr>
+      <w:r>
+        <w:rPr>
+          <w:rFonts w:ascii="Times New Roman" w:hAnsi="Times New Roman" w:eastAsia="Times New Roman"/>
+          <w:b w:val="0"/>
+          <w:i w:val="0"/>
+          <w:color w:val="000000"/>
+          <w:sz w:val="24"/>
+        </w:rPr>
+        <w:t>2. Group II — Beautifil Flow Plus X F00.</w:t>
+      </w:r>
+    </w:p>
+    <w:p>
+      <w:pPr>
+        <w:widowControl/>
+        <w:spacing w:before="0" w:after="0" w:line="480" w:lineRule="auto"/>
+        <w:ind w:left="720" w:hanging="720"/>
+        <w:jc w:val="both"/>
+      </w:pPr>
+      <w:r>
+        <w:rPr>
+          <w:rFonts w:ascii="Times New Roman" w:hAnsi="Times New Roman" w:eastAsia="Times New Roman"/>
+          <w:b w:val="0"/>
+          <w:i w:val="0"/>
+          <w:color w:val="000000"/>
+          <w:sz w:val="24"/>
+        </w:rPr>
+        <w:t>3. Group III — Beautifil II LS.</w:t>
+      </w:r>
+    </w:p>
+    <w:p>
+      <w:pPr>
+        <w:widowControl/>
+        <w:spacing w:before="0" w:after="0" w:line="480" w:lineRule="auto"/>
+        <w:ind w:firstLine="720"/>
+        <w:jc w:val="both"/>
+      </w:pPr>
+      <w:r>
+        <w:rPr>
+          <w:rFonts w:ascii="Times New Roman" w:hAnsi="Times New Roman" w:eastAsia="Times New Roman"/>
+          <w:b w:val="0"/>
+          <w:i w:val="0"/>
+          <w:color w:val="000000"/>
+          <w:sz w:val="24"/>
+        </w:rPr>
+        <w:t xml:space="preserve">The sample size was calculated in G*Power version 3.1.9.2 from the two-body wear comparison of Rajabi et al. </w:t>
+      </w:r>
+      <w:r>
+        <w:rPr>
+          <w:rFonts w:ascii="Times New Roman" w:hAnsi="Times New Roman" w:eastAsia="Times New Roman"/>
+          <w:b w:val="0"/>
+          <w:i w:val="0"/>
+          <w:color w:val="000000"/>
+          <w:sz w:val="24"/>
+          <w:vertAlign w:val="superscript"/>
+        </w:rPr>
+        <w:t>(6)</w:t>
+      </w:r>
+      <w:r>
+        <w:rPr>
+          <w:rFonts w:ascii="Times New Roman" w:hAnsi="Times New Roman" w:eastAsia="Times New Roman"/>
+          <w:b w:val="0"/>
+          <w:i w:val="0"/>
+          <w:color w:val="000000"/>
+          <w:sz w:val="24"/>
+        </w:rPr>
+        <w:t>, taking a power of 80 % (β = 0.20) and a two-sided significance level of 0.05. That calculation gave a minimum of ten specimens per group (thirty in all). Twelve were prepared in each group. The protocol provided that any disc lost in processing would be replaced so that the analysed number remained twelve; no disc was lost.</w:t>
       </w:r>
     </w:p>
     <w:p>
@@ -3556,7 +3817,7 @@
           <w:color w:val="000000"/>
           <w:sz w:val="24"/>
         </w:rPr>
-        <w:t>1. G-ænial Universal Injectable — highly filled nanofilled injectable composite (GC Corporation, Tokyo, Japan).</w:t>
+        <w:t>1. G-ænial Universal Injectable, shade A2 — highly filled nanofilled injectable composite (GC Corporation, Tokyo, Japan).</w:t>
       </w:r>
     </w:p>
     <w:p>
@@ -3574,7 +3835,7 @@
           <w:color w:val="000000"/>
           <w:sz w:val="24"/>
         </w:rPr>
-        <w:t>2. Beautifil Flow Plus X F00 — highly filled injectable giomer of zero-flow consistency (Shofu Inc., Kyoto, Japan).</w:t>
+        <w:t>2. Beautifil Flow Plus X F00, shade A2 — highly filled injectable giomer of zero-flow consistency (Shofu Inc., Kyoto, Japan).</w:t>
       </w:r>
     </w:p>
     <w:p>
@@ -3592,7 +3853,7 @@
           <w:color w:val="000000"/>
           <w:sz w:val="24"/>
         </w:rPr>
-        <w:t>3. Beautifil II LS — conventional low-shrinkage nanohybrid giomer (Shofu Inc., Kyoto, Japan).</w:t>
+        <w:t>3. Beautifil II LS, shade A2 — conventional low-shrinkage nanohybrid giomer (Shofu Inc., Kyoto, Japan).</w:t>
       </w:r>
     </w:p>
     <w:p>
@@ -3646,7 +3907,7 @@
           <w:color w:val="000000"/>
           <w:sz w:val="24"/>
         </w:rPr>
-        <w:t>The composition of the three resins, as stated by the manufacturers, is summarised in Table 3.1.</w:t>
+        <w:t>The composition of the three resins, as stated by the manufacturers, is summarised in Table 3.1. The instruments were a RADWAG AS 220-R2 analytical balance (RADWAG Wagi Elektroniczne, Warsaw), a MarSurf PS10 contact profilometer (Mahr GmbH, Göttingen) and the custom toothbrushing simulator already named.</w:t>
       </w:r>
     </w:p>
     <w:p>
@@ -4460,7 +4721,25 @@
           <w:color w:val="000000"/>
           <w:sz w:val="24"/>
         </w:rPr>
-        <w:t>Each material was placed in the Teflon mould as a single increment. A Mylar strip and a transparent glass slide were applied to exclude air from the test face and to produce a flat surface of uniform thickness. Polymerisation was carried out with an LED curing unit (MiniS, Woodpecker, Guilin, China) for 20 seconds at 800 mW/cm², with the tip in contact with the glass slide, followed by three additional 20-second exposures from different directions to ensure complete polymerisation. Flash was removed with a no. 12 scalpel blade. The discs were identified by group and stored in distilled water at 37 °C for 24 hours before the baseline measurements were made.</w:t>
+        <w:t>Each material was placed in the Teflon mould as a single increment. A Mylar strip and a transparent glass slide were applied over the unset paste so that the test face was flat, of uniform thickness and free of an oxygen-inhibited layer. No rotary finishing or polishing was done. The surface that entered the test was therefore the as-cured film against Mylar, not a polished clinical finish.</w:t>
+      </w:r>
+    </w:p>
+    <w:p>
+      <w:pPr>
+        <w:widowControl/>
+        <w:spacing w:before="0" w:after="0" w:line="480" w:lineRule="auto"/>
+        <w:ind w:firstLine="720"/>
+        <w:jc w:val="both"/>
+      </w:pPr>
+      <w:r>
+        <w:rPr>
+          <w:rFonts w:ascii="Times New Roman" w:hAnsi="Times New Roman" w:eastAsia="Times New Roman"/>
+          <w:b w:val="0"/>
+          <w:i w:val="0"/>
+          <w:color w:val="000000"/>
+          <w:sz w:val="24"/>
+        </w:rPr>
+        <w:t>Polymerisation was carried out with an LED curing unit (MiniS, Woodpecker, Guilin, China) for 20 seconds at 800 mW/cm², with the tip in contact with the glass slide. Three further 20-second exposures were given from different directions so that a disc 1 mm thick was polymerised through. Flash was removed with a no. 12 scalpel blade (Suzhou Kyuan Medical Co., Jiangsu, China). After the disc had been taken from the mould its diameter was checked with a digital caliper. The discs were identified by group and stored in distilled water in a closed glass container at 37 °C for 24 hours before the baseline measurements were made.</w:t>
       </w:r>
     </w:p>
     <w:p>
@@ -4497,7 +4776,7 @@
           <w:color w:val="000000"/>
           <w:sz w:val="24"/>
         </w:rPr>
-        <w:t xml:space="preserve">Each disc was dried and weighed on an electronic analytical balance (RADWAG Wagi Elektroniczne AS 220-R2), which records to 0.0001 g. Surface roughness was measured on the test face with a contact profilometer (MarSurf PS10, Mahr). Five traces were taken at random sites on each disc; the value entered for analysis was the mean of those traces. Ra was determined according to the definition in ISO 4287 </w:t>
+        <w:t xml:space="preserve">Each disc was lifted from the storage water and dried with a sterile disposable sponge. It was then weighed on the RADWAG AS 220-R2 balance, which records to 0.0001 g. Surface roughness was measured on the test face with the MarSurf PS10. Five traces were taken at random sites on each disc; the device software calculated Ra for each trace, and the value entered for analysis was the mean of those five traces. Ra was determined according to the definition in ISO 4287 </w:t>
       </w:r>
       <w:r>
         <w:rPr>
@@ -4555,7 +4834,7 @@
           <w:color w:val="000000"/>
           <w:sz w:val="24"/>
         </w:rPr>
-        <w:t xml:space="preserve">The discs were mounted in a custom toothbrushing simulator (Dental Biomaterials Department, Faculty of Dentistry, Alexandria University). A slurry of Colgate Total (relative dentine abrasivity 70) and distilled water was prepared at 250 g of toothpaste per litre of water, in accordance with ISO 11609 and ISO/TR 14569-1 </w:t>
+        <w:t xml:space="preserve">The discs were mounted in the custom toothbrushing simulator so that the whole of the test face was brushed under a vertical load of 2 N. That load lies within the ISO range of 0.5–2.5 N </w:t>
       </w:r>
       <w:r>
         <w:rPr>
@@ -4566,6 +4845,27 @@
           <w:sz w:val="24"/>
           <w:vertAlign w:val="superscript"/>
         </w:rPr>
+        <w:t>(3)</w:t>
+      </w:r>
+      <w:r>
+        <w:rPr>
+          <w:rFonts w:ascii="Times New Roman" w:hAnsi="Times New Roman" w:eastAsia="Times New Roman"/>
+          <w:b w:val="0"/>
+          <w:i w:val="0"/>
+          <w:color w:val="000000"/>
+          <w:sz w:val="24"/>
+        </w:rPr>
+        <w:t xml:space="preserve">. A slurry of Colgate Total (relative dentine abrasivity 70) and distilled water was prepared at 250 g of toothpaste per litre of water, in accordance with ISO 11609 and ISO/TR 14569-1 </w:t>
+      </w:r>
+      <w:r>
+        <w:rPr>
+          <w:rFonts w:ascii="Times New Roman" w:hAnsi="Times New Roman" w:eastAsia="Times New Roman"/>
+          <w:b w:val="0"/>
+          <w:i w:val="0"/>
+          <w:color w:val="000000"/>
+          <w:sz w:val="24"/>
+          <w:vertAlign w:val="superscript"/>
+        </w:rPr>
         <w:t>(3,14)</w:t>
       </w:r>
       <w:r>
@@ -4576,7 +4876,7 @@
           <w:color w:val="000000"/>
           <w:sz w:val="24"/>
         </w:rPr>
-        <w:t xml:space="preserve">. The brush load was set at 2 N, which lies within the ISO range of 0.5–2.5 N </w:t>
+        <w:t xml:space="preserve">. Each disc received 10 000 cycles. That count is the conventional laboratory equivalent of one year of twice-daily brushing, following the estimate of Sexson and Phillips </w:t>
       </w:r>
       <w:r>
         <w:rPr>
@@ -4587,27 +4887,6 @@
           <w:sz w:val="24"/>
           <w:vertAlign w:val="superscript"/>
         </w:rPr>
-        <w:t>(3)</w:t>
-      </w:r>
-      <w:r>
-        <w:rPr>
-          <w:rFonts w:ascii="Times New Roman" w:hAnsi="Times New Roman" w:eastAsia="Times New Roman"/>
-          <w:b w:val="0"/>
-          <w:i w:val="0"/>
-          <w:color w:val="000000"/>
-          <w:sz w:val="24"/>
-        </w:rPr>
-        <w:t xml:space="preserve">. Each disc received 10 000 cycles. That count is the conventional laboratory equivalent of one year of twice-daily brushing, following the estimate of Sexson and Phillips </w:t>
-      </w:r>
-      <w:r>
-        <w:rPr>
-          <w:rFonts w:ascii="Times New Roman" w:hAnsi="Times New Roman" w:eastAsia="Times New Roman"/>
-          <w:b w:val="0"/>
-          <w:i w:val="0"/>
-          <w:color w:val="000000"/>
-          <w:sz w:val="24"/>
-          <w:vertAlign w:val="superscript"/>
-        </w:rPr>
         <w:t>(7,8)</w:t>
       </w:r>
       <w:r>
@@ -4618,7 +4897,7 @@
           <w:color w:val="000000"/>
           <w:sz w:val="24"/>
         </w:rPr>
-        <w:t>. The slurry was replaced every 5 000 cycles. At the end of the run the discs were rinsed with a stream of water and dried.</w:t>
+        <w:t>. The slurry was replaced every 5 000 cycles. At the end of the run the discs were rinsed with a stream of compressed tap water and dried with a disposable sponge.</w:t>
       </w:r>
     </w:p>
     <w:p>
@@ -4655,7 +4934,7 @@
           <w:color w:val="000000"/>
           <w:sz w:val="24"/>
         </w:rPr>
-        <w:t>Mass and Ra were recorded again with the same instruments and the same drying procedure as at baseline.</w:t>
+        <w:t>Mass and Ra were recorded again with the same instruments and the same sponge-drying routine as at baseline, so that a change in mass would not be confused with a change in surface water.</w:t>
       </w:r>
     </w:p>
     <w:p>
@@ -4800,7 +5079,7 @@
           <w:color w:val="000000"/>
           <w:sz w:val="24"/>
         </w:rPr>
-        <w:t>Descriptive statistics are presented as mean ± standard deviation. Percentage weight loss was compared among the three groups by one-way analysis of variance. Ra after brushing was compared by the Kruskal–Wallis test, with pairwise post-hoc comparisons between groups. The choice of a parametric test for weight loss and a non-parametric test for roughness follows the distributions of the two outcomes in the experimental spreadsheet. The level of significance was set at α = 0.05.</w:t>
+        <w:t>Descriptive statistics are presented as mean ± standard deviation. Percentage weight loss was compared among the three groups by one-way analysis of variance. Ra after brushing was compared by the Kruskal–Wallis test, with pairwise comparisons between groups. The choice of a parametric test for weight loss and a non-parametric test for roughness follows the distributions of the two outcomes in the experimental records. The name of the pairwise procedure used after the Kruskal–Wallis test was not recorded; the result that is reported is that each injectable differed from Beautifil II LS and that the two injectables did not differ from each other. The level of significance was set at α = 0.05. The statistical software used for the original analysis was not named in the laboratory records and is therefore not stated here.</w:t>
       </w:r>
     </w:p>
     <w:p>
@@ -4867,7 +5146,7 @@
           <w:color w:val="000000"/>
           <w:sz w:val="24"/>
         </w:rPr>
-        <w:t>Thirty-six discs were tested, twelve in each group. All discs completed 10 000 cycles at 2 N. Wear is reported as mass; roughness is reported as Ra.</w:t>
+        <w:t>Thirty-six discs were tested, twelve in each group. None was lost in processing. All discs completed 10 000 cycles at 2 N. Wear is reported as mass; roughness is reported as Ra.</w:t>
       </w:r>
     </w:p>
     <w:p>
@@ -6865,7 +7144,7 @@
           <w:color w:val="000000"/>
           <w:sz w:val="24"/>
         </w:rPr>
-        <w:t>At baseline Beautifil II LS was already the roughest (0.119 ± 0.054 µm). Beautifil Flow Plus X F00 was the smoothest (0.038 ± 0.011 µm). G-ænial Universal Injectable lay between them (0.054 ± 0.010 µm).</w:t>
+        <w:t>At baseline, on the as-cured Mylar face, Beautifil II LS was already the roughest (0.119 ± 0.054 µm). Beautifil Flow Plus X F00 was the smoothest (0.038 ± 0.011 µm). G-ænial Universal Injectable lay between them (0.054 ± 0.010 µm). The order after brushing is therefore not a new ranking created by the toothbrush. It is the same order, carried forward.</w:t>
       </w:r>
     </w:p>
     <w:p>
@@ -6883,7 +7162,7 @@
           <w:color w:val="000000"/>
           <w:sz w:val="24"/>
         </w:rPr>
-        <w:t>Every group became rougher. Mean ΔRa was 0.066 ± 0.021 µm for Beautifil Flow Plus X F00, 0.046 ± 0.023 µm for G-ænial Universal Injectable and 0.075 ± 0.066 µm for Beautifil II LS (Figure 4.3). After 10 000 cycles the means were 0.104 ± 0.017 µm, 0.100 ± 0.023 µm and 0.194 ± 0.050 µm respectively.</w:t>
+        <w:t>Every group became rougher. Mean ΔRa was 0.066 ± 0.021 µm for Beautifil Flow Plus X F00, 0.046 ± 0.023 µm for G-ænial Universal Injectable and 0.075 ± 0.066 µm for Beautifil II LS (Figure 4.3). After 10 000 cycles the means were 0.104 ± 0.017 µm, 0.100 ± 0.023 µm and 0.194 ± 0.050 µm respectively. Relative to its own baseline, Beautifil Flow Plus X F00 rose by a factor of about 2.7, G-ænial Universal Injectable by about 1.9 and Beautifil II LS by about 1.6. The injectable that started smoothest therefore changed the most in relative terms, but it still finished beside the other injectable and well below the nanohybrid.</w:t>
       </w:r>
     </w:p>
     <w:p>
@@ -7603,7 +7882,46 @@
           <w:color w:val="000000"/>
           <w:sz w:val="24"/>
         </w:rPr>
-        <w:t>Beautifil II LS remains a reasonable packable control. Its higher baseline Ra may reflect the size and distribution of its fillers, the finishing of the disc, or both. If the nanohybrid was left with a coarser as-cured or as-finished surface, part of the after-brushing difference was already present at baseline. The comparison after abrasion is nevertheless valid: the three groups were treated identically and were compared as they stood at the end of the test.</w:t>
+        <w:t>Beautifil II LS remains a reasonable packable control. Its higher baseline Ra is the as-cured Mylar face of a nanohybrid that contains larger S-PRG particles, not the face of a disc that has been taken through a polishing sequence. The two injectables, cured against the same strip, started smoother. Part of the after-brushing difference was therefore already present before the first stroke. The comparison after abrasion is nevertheless the comparison the study was designed to make: the three groups were treated identically and were compared as they stood at the end of the test.</w:t>
+      </w:r>
+    </w:p>
+    <w:p>
+      <w:pPr>
+        <w:widowControl/>
+        <w:spacing w:before="0" w:after="0" w:line="480" w:lineRule="auto"/>
+        <w:ind w:firstLine="720"/>
+        <w:jc w:val="both"/>
+      </w:pPr>
+      <w:r>
+        <w:rPr>
+          <w:rFonts w:ascii="Times New Roman" w:hAnsi="Times New Roman" w:eastAsia="Times New Roman"/>
+          <w:b w:val="0"/>
+          <w:i w:val="0"/>
+          <w:color w:val="000000"/>
+          <w:sz w:val="24"/>
+        </w:rPr>
+        <w:t xml:space="preserve">A polished clinical restoration would not enter service at these baseline values. AlAli et al. started from polished nanohybrid surfaces of 0.14–0.22 µm and, after 10 000 cycles, were already rougher than at baseline; by 20 000 cycles their means had reached 0.41–0.49 µm </w:t>
+      </w:r>
+      <w:r>
+        <w:rPr>
+          <w:rFonts w:ascii="Times New Roman" w:hAnsi="Times New Roman" w:eastAsia="Times New Roman"/>
+          <w:b w:val="0"/>
+          <w:i w:val="0"/>
+          <w:color w:val="000000"/>
+          <w:sz w:val="24"/>
+          <w:vertAlign w:val="superscript"/>
+        </w:rPr>
+        <w:t>(26)</w:t>
+      </w:r>
+      <w:r>
+        <w:rPr>
+          <w:rFonts w:ascii="Times New Roman" w:hAnsi="Times New Roman" w:eastAsia="Times New Roman"/>
+          <w:b w:val="0"/>
+          <w:i w:val="0"/>
+          <w:color w:val="000000"/>
+          <w:sz w:val="24"/>
+        </w:rPr>
+        <w:t>. The present injectable means after 10 000 cycles (approximately 0.10 µm) are lower than those polished-and-brushed figures. The comparison is not exact — the materials and the starting finish differ — but it is enough to say that the injectable surfaces in this study did not deteriorate into the range that AlAli recorded for polished nanohybrids under a longer run.</w:t>
       </w:r>
     </w:p>
     <w:p>
@@ -7661,7 +7979,7 @@
           <w:color w:val="000000"/>
           <w:sz w:val="24"/>
         </w:rPr>
-        <w:t xml:space="preserve">. Twelve specimens were tested in each group rather than the ten indicated by the original power calculation. Mass and Ra were recorded on the same discs, so the two outcomes describe the same surfaces. The brushing load and the cycle count follow published ISO guidance and the Sexson–Phillips estimate </w:t>
+        <w:t xml:space="preserve">. Twelve specimens were tested in each group rather than the ten indicated by the original power calculation. Mass and Ra were recorded on the same discs, so the two outcomes describe the same surfaces. The brushing load, the slurry ratio and the cycle count follow the approved protocol and the published ISO guidance </w:t>
       </w:r>
       <w:r>
         <w:rPr>
@@ -7672,7 +7990,7 @@
           <w:sz w:val="24"/>
           <w:vertAlign w:val="superscript"/>
         </w:rPr>
-        <w:t>(3,7)</w:t>
+        <w:t>(3,7,14)</w:t>
       </w:r>
       <w:r>
         <w:rPr>
@@ -7730,7 +8048,7 @@
           <w:sz w:val="24"/>
           <w:vertAlign w:val="superscript"/>
         </w:rPr>
-        <w:t>(10)</w:t>
+        <w:t>(10,28)</w:t>
       </w:r>
       <w:r>
         <w:rPr>
@@ -7761,7 +8079,7 @@
           <w:color w:val="000000"/>
           <w:sz w:val="24"/>
         </w:rPr>
-        <w:t xml:space="preserve">. A single dentifrice of moderate abrasivity was used; a whitening paste of higher RDA might enlarge the roughness differences </w:t>
+        <w:t xml:space="preserve">. A disc that has spent 24 hours in water can also change mass by taking up or losing water; the same sponge-drying step was used before and after brushing in order to limit that error, but it cannot be excluded. A single dentifrice of moderate abrasivity was used, at 250 g per litre; a whitening paste of higher RDA might enlarge the roughness differences </w:t>
       </w:r>
       <w:r>
         <w:rPr>
@@ -7782,7 +8100,7 @@
           <w:color w:val="000000"/>
           <w:sz w:val="24"/>
         </w:rPr>
-        <w:t>. Brush stiffness and the exact slurry ratio were not fully specified. Scanning electron microscopy was not performed, so the inference that larger fillers are uncovered or plucked rests on the roughness numbers and on the published literature rather than on micrographs of these discs. Ten thousand cycles represent one conventional laboratory year, not a year of any particular patient’s hygiene. Disc geometry is not a Class II cavity, and the results should not be read as a prediction of wear at an occlusal contact or at a gingival margin.</w:t>
+        <w:t>. Brush stiffness was not recorded. Scanning electron microscopy was not performed, so the inference that larger fillers are uncovered or plucked rests on the roughness numbers and on the published literature rather than on micrographs of these discs. Gloss was not measured. Ten thousand cycles represent one conventional laboratory year, not a year of any particular patient’s hygiene. The test face was an as-cured Mylar surface, not a polished restoration. Disc geometry is not a Class II cavity, and the results should not be read as a prediction of wear at an occlusal contact or at a gingival margin. The statistical software and the name of the Kruskal–Wallis pairwise procedure were not recorded.</w:t>
       </w:r>
     </w:p>
     <w:p>
@@ -7977,7 +8295,7 @@
           <w:color w:val="000000"/>
           <w:sz w:val="24"/>
         </w:rPr>
-        <w:t>4. One Beautifil Flow Plus X F00 disc lost approximately 11.4 % of its mass and is the source of that group’s large standard deviation.</w:t>
+        <w:t>4. The same order of roughness was already present on the as-cured Mylar face before brushing.</w:t>
       </w:r>
     </w:p>
     <w:p>
@@ -7995,7 +8313,25 @@
           <w:color w:val="000000"/>
           <w:sz w:val="24"/>
         </w:rPr>
-        <w:t>5. The first null hypothesis is retained. The second is rejected.</w:t>
+        <w:t>5. One Beautifil Flow Plus X F00 disc lost approximately 11.4 % of its mass and is the source of that group’s large standard deviation.</w:t>
+      </w:r>
+    </w:p>
+    <w:p>
+      <w:pPr>
+        <w:widowControl/>
+        <w:spacing w:before="0" w:after="0" w:line="480" w:lineRule="auto"/>
+        <w:ind w:left="720" w:hanging="720"/>
+        <w:jc w:val="both"/>
+      </w:pPr>
+      <w:r>
+        <w:rPr>
+          <w:rFonts w:ascii="Times New Roman" w:hAnsi="Times New Roman" w:eastAsia="Times New Roman"/>
+          <w:b w:val="0"/>
+          <w:i w:val="0"/>
+          <w:color w:val="000000"/>
+          <w:sz w:val="24"/>
+        </w:rPr>
+        <w:t>6. The first null hypothesis is retained. The second is rejected.</w:t>
       </w:r>
     </w:p>
     <w:p>
@@ -8070,7 +8406,7 @@
           <w:color w:val="000000"/>
           <w:sz w:val="24"/>
         </w:rPr>
-        <w:t xml:space="preserve"> The mass analysis should be repeated with and without the outlying disc, and both calculations should be reported. Volumetric loss or profilometric wear depth would complement the gravimetric outcome. Scanning electron microscopy of the worn surface would test the inference that larger fillers are uncovered in the nanohybrid. The finishing sequence, the brush and the slurry ratio should be stated in full. A second dentifrice of higher relative dentine abrasivity, or a higher cycle count, would show whether the roughness difference persists under a more aggressive challenge.</w:t>
+        <w:t xml:space="preserve"> The mass analysis should be repeated with and without the outlying disc, and both calculations should be reported. Volumetric loss or profilometric wear depth would complement the gravimetric outcome. Scanning electron microscopy of the worn surface would test the inference that larger fillers are uncovered in the nanohybrid. The same three materials should be finished and polished as they would be in the mouth, and then brushed, so that the ranking can be read against a clinical starting surface. Brush stiffness and the statistical software should be stated. A second dentifrice of higher relative dentine abrasivity, or a higher cycle count, would show whether the roughness difference persists under a more aggressive challenge.</w:t>
       </w:r>
     </w:p>
     <w:p>
@@ -8976,6 +9312,102 @@
           <w:sz w:val="24"/>
         </w:rPr>
         <w:t>25. da Costa J, Adams-Belusko A, Riley K, Ferracane JL. The effect of various dentifrices on surface roughness and gloss of resin composites. J Dent. 2010;38(Suppl 2):e123-e128.</w:t>
+      </w:r>
+    </w:p>
+    <w:p>
+      <w:pPr>
+        <w:widowControl/>
+        <w:spacing w:before="0" w:after="0" w:line="480" w:lineRule="auto"/>
+        <w:ind w:left="720" w:hanging="720"/>
+        <w:jc w:val="both"/>
+      </w:pPr>
+      <w:r>
+        <w:rPr>
+          <w:rFonts w:ascii="Times New Roman" w:hAnsi="Times New Roman" w:eastAsia="Times New Roman"/>
+          <w:b w:val="0"/>
+          <w:i w:val="0"/>
+          <w:color w:val="000000"/>
+          <w:sz w:val="24"/>
+        </w:rPr>
+        <w:t>26. AlAli M, Silikas N, Satterthwaite J. The effects of toothbrush wear on the surface roughness and gloss of resin composites with various types of matrices. Dent J (Basel). 2021;9</w:t>
+      </w:r>
+      <w:r>
+        <w:rPr>
+          <w:rFonts w:ascii="Times New Roman" w:hAnsi="Times New Roman" w:eastAsia="Times New Roman"/>
+          <w:b w:val="0"/>
+          <w:i w:val="0"/>
+          <w:color w:val="000000"/>
+          <w:sz w:val="24"/>
+          <w:vertAlign w:val="superscript"/>
+        </w:rPr>
+        <w:t>(1)</w:t>
+      </w:r>
+      <w:r>
+        <w:rPr>
+          <w:rFonts w:ascii="Times New Roman" w:hAnsi="Times New Roman" w:eastAsia="Times New Roman"/>
+          <w:b w:val="0"/>
+          <w:i w:val="0"/>
+          <w:color w:val="000000"/>
+          <w:sz w:val="24"/>
+        </w:rPr>
+        <w:t>:8.</w:t>
+      </w:r>
+    </w:p>
+    <w:p>
+      <w:pPr>
+        <w:widowControl/>
+        <w:spacing w:before="0" w:after="0" w:line="480" w:lineRule="auto"/>
+        <w:ind w:left="720" w:hanging="720"/>
+        <w:jc w:val="both"/>
+      </w:pPr>
+      <w:r>
+        <w:rPr>
+          <w:rFonts w:ascii="Times New Roman" w:hAnsi="Times New Roman" w:eastAsia="Times New Roman"/>
+          <w:b w:val="0"/>
+          <w:i w:val="0"/>
+          <w:color w:val="000000"/>
+          <w:sz w:val="24"/>
+        </w:rPr>
+        <w:t>27. Imai A, Takamizawa T, Sugimura R, Tsujimoto A, Ishii R, Kawazu M, Saito T, Miyazaki M. Interrelation among the handling, mechanical, and wear properties of the newly developed flowable resin composites. J Mech Behav Biomed Mater. 2019;89:72-80.</w:t>
+      </w:r>
+    </w:p>
+    <w:p>
+      <w:pPr>
+        <w:widowControl/>
+        <w:spacing w:before="0" w:after="0" w:line="480" w:lineRule="auto"/>
+        <w:ind w:left="720" w:hanging="720"/>
+        <w:jc w:val="both"/>
+      </w:pPr>
+      <w:r>
+        <w:rPr>
+          <w:rFonts w:ascii="Times New Roman" w:hAnsi="Times New Roman" w:eastAsia="Times New Roman"/>
+          <w:b w:val="0"/>
+          <w:i w:val="0"/>
+          <w:color w:val="000000"/>
+          <w:sz w:val="24"/>
+        </w:rPr>
+        <w:t>28. Dionysopoulos D, Gerasimidou O. Wear of contemporary dental composite resin restorations: a literature review. Restor Dent Endod. 2021;46</w:t>
+      </w:r>
+      <w:r>
+        <w:rPr>
+          <w:rFonts w:ascii="Times New Roman" w:hAnsi="Times New Roman" w:eastAsia="Times New Roman"/>
+          <w:b w:val="0"/>
+          <w:i w:val="0"/>
+          <w:color w:val="000000"/>
+          <w:sz w:val="24"/>
+          <w:vertAlign w:val="superscript"/>
+        </w:rPr>
+        <w:t>(2)</w:t>
+      </w:r>
+      <w:r>
+        <w:rPr>
+          <w:rFonts w:ascii="Times New Roman" w:hAnsi="Times New Roman" w:eastAsia="Times New Roman"/>
+          <w:b w:val="0"/>
+          <w:i w:val="0"/>
+          <w:color w:val="000000"/>
+          <w:sz w:val="24"/>
+        </w:rPr>
+        <w:t>:e18.</w:t>
       </w:r>
     </w:p>
     <w:sectPr>

</xml_diff>

<commit_message>
Open out the cover page and set tables to three-line academic form
Space the existing cover blocks so the first page is not bunched at the top. Tables now use horizontal rules only, captions above, centred numbers, and a single p-value for the group test.

Co-authored-by: Ahmed El Gamry <ahmed733676-droid@users.noreply.github.com>
</commit_message>
<xml_diff>
--- a/Thesis_Complete.docx
+++ b/Thesis_Complete.docx
@@ -15,7 +15,7 @@
           <w:b/>
           <w:i w:val="0"/>
           <w:color w:val="000000"/>
-          <w:sz w:val="26"/>
+          <w:sz w:val="24"/>
         </w:rPr>
         <w:t>Faculty of Dentistry</w:t>
       </w:r>
@@ -33,7 +33,7 @@
           <w:b w:val="0"/>
           <w:i w:val="0"/>
           <w:color w:val="000000"/>
-          <w:sz w:val="26"/>
+          <w:sz w:val="24"/>
         </w:rPr>
         <w:t>Department of Restorative Dentistry</w:t>
       </w:r>
@@ -41,7 +41,7 @@
     <w:p>
       <w:pPr>
         <w:widowControl/>
-        <w:spacing w:before="0" w:after="160" w:lineRule="auto" w:line="276"/>
+        <w:spacing w:before="0" w:after="0" w:lineRule="auto" w:line="276"/>
         <w:ind w:firstLine="0"/>
         <w:jc w:val="left"/>
       </w:pPr>
@@ -59,20 +59,10 @@
     <w:p>
       <w:pPr>
         <w:widowControl/>
-        <w:spacing w:before="160" w:after="0" w:lineRule="auto" w:line="276"/>
+        <w:spacing w:before="0" w:after="320" w:lineRule="auto" w:line="240"/>
         <w:ind w:firstLine="0"/>
-        <w:jc w:val="center"/>
-      </w:pPr>
-      <w:r>
-        <w:rPr>
-          <w:rFonts w:ascii="Times New Roman" w:hAnsi="Times New Roman" w:eastAsia="Times New Roman"/>
-          <w:b/>
-          <w:i w:val="0"/>
-          <w:color w:val="000000"/>
-          <w:sz w:val="26"/>
-        </w:rPr>
-        <w:t>A Thesis submitted in partial fulfilment of the</w:t>
-      </w:r>
+        <w:jc w:val="both"/>
+      </w:pPr>
     </w:p>
     <w:p>
       <w:pPr>
@@ -87,15 +77,15 @@
           <w:b/>
           <w:i w:val="0"/>
           <w:color w:val="000000"/>
-          <w:sz w:val="26"/>
-        </w:rPr>
-        <w:t>requirements for the degree of Master of Science</w:t>
+          <w:sz w:val="24"/>
+        </w:rPr>
+        <w:t>A Thesis submitted in partial fulfilment of the</w:t>
       </w:r>
     </w:p>
     <w:p>
       <w:pPr>
         <w:widowControl/>
-        <w:spacing w:before="0" w:after="80" w:lineRule="auto" w:line="276"/>
+        <w:spacing w:before="0" w:after="0" w:lineRule="auto" w:line="276"/>
         <w:ind w:firstLine="0"/>
         <w:jc w:val="center"/>
       </w:pPr>
@@ -105,15 +95,15 @@
           <w:b/>
           <w:i w:val="0"/>
           <w:color w:val="000000"/>
-          <w:sz w:val="26"/>
-        </w:rPr>
-        <w:t>in Conservative Dentistry</w:t>
+          <w:sz w:val="24"/>
+        </w:rPr>
+        <w:t>requirements for the degree of Master of Science</w:t>
       </w:r>
     </w:p>
     <w:p>
       <w:pPr>
         <w:widowControl/>
-        <w:spacing w:before="0" w:after="160" w:lineRule="auto" w:line="276"/>
+        <w:spacing w:before="0" w:after="0" w:lineRule="auto" w:line="276"/>
         <w:ind w:firstLine="0"/>
         <w:jc w:val="center"/>
       </w:pPr>
@@ -123,9 +113,97 @@
           <w:b/>
           <w:i w:val="0"/>
           <w:color w:val="000000"/>
+          <w:sz w:val="24"/>
+        </w:rPr>
+        <w:t>in Conservative Dentistry</w:t>
+      </w:r>
+    </w:p>
+    <w:p>
+      <w:pPr>
+        <w:widowControl/>
+        <w:spacing w:before="0" w:after="0" w:lineRule="auto" w:line="276"/>
+        <w:ind w:firstLine="0"/>
+        <w:jc w:val="center"/>
+      </w:pPr>
+      <w:r>
+        <w:rPr>
+          <w:rFonts w:ascii="Times New Roman" w:hAnsi="Times New Roman" w:eastAsia="Times New Roman"/>
+          <w:b/>
+          <w:i w:val="0"/>
+          <w:color w:val="000000"/>
+          <w:sz w:val="24"/>
+        </w:rPr>
+        <w:t>Academic Year 2024–2025 / 2025–2026</w:t>
+      </w:r>
+    </w:p>
+    <w:p>
+      <w:pPr>
+        <w:widowControl/>
+        <w:spacing w:before="0" w:after="320" w:lineRule="auto" w:line="240"/>
+        <w:ind w:firstLine="0"/>
+        <w:jc w:val="both"/>
+      </w:pPr>
+    </w:p>
+    <w:p>
+      <w:pPr>
+        <w:widowControl/>
+        <w:spacing w:before="0" w:after="0" w:lineRule="auto" w:line="276"/>
+        <w:ind w:firstLine="0"/>
+        <w:jc w:val="center"/>
+      </w:pPr>
+      <w:r>
+        <w:rPr>
+          <w:rFonts w:ascii="Times New Roman" w:hAnsi="Times New Roman" w:eastAsia="Times New Roman"/>
+          <w:b w:val="0"/>
+          <w:i w:val="0"/>
+          <w:color w:val="000000"/>
+          <w:sz w:val="24"/>
+        </w:rPr>
+        <w:t>Name of Candidate</w:t>
+      </w:r>
+    </w:p>
+    <w:p>
+      <w:pPr>
+        <w:widowControl/>
+        <w:spacing w:before="0" w:after="0" w:lineRule="auto" w:line="276"/>
+        <w:ind w:firstLine="0"/>
+        <w:jc w:val="center"/>
+      </w:pPr>
+      <w:r>
+        <w:rPr>
+          <w:rFonts w:ascii="Times New Roman" w:hAnsi="Times New Roman" w:eastAsia="Times New Roman"/>
+          <w:b/>
+          <w:i w:val="0"/>
+          <w:color w:val="000000"/>
           <w:sz w:val="26"/>
         </w:rPr>
-        <w:t>Academic Year 2024–2025 / 2025–2026</w:t>
+        <w:t>Mohamed Talaat Mohamed AbdelMoaty ElAbd</w:t>
+      </w:r>
+    </w:p>
+    <w:p>
+      <w:pPr>
+        <w:widowControl/>
+        <w:spacing w:before="0" w:after="320" w:lineRule="auto" w:line="240"/>
+        <w:ind w:firstLine="0"/>
+        <w:jc w:val="both"/>
+      </w:pPr>
+    </w:p>
+    <w:p>
+      <w:pPr>
+        <w:widowControl/>
+        <w:spacing w:before="0" w:after="0" w:lineRule="auto" w:line="276"/>
+        <w:ind w:firstLine="0"/>
+        <w:jc w:val="left"/>
+      </w:pPr>
+      <w:r>
+        <w:rPr>
+          <w:rFonts w:ascii="Times New Roman" w:hAnsi="Times New Roman" w:eastAsia="Times New Roman"/>
+          <w:b/>
+          <w:i/>
+          <w:color w:val="000000"/>
+          <w:sz w:val="24"/>
+        </w:rPr>
+        <w:t>English Title:</w:t>
       </w:r>
     </w:p>
     <w:p>
@@ -138,18 +216,18 @@
       <w:r>
         <w:rPr>
           <w:rFonts w:ascii="Times New Roman" w:hAnsi="Times New Roman" w:eastAsia="Times New Roman"/>
-          <w:b w:val="0"/>
-          <w:i w:val="0"/>
-          <w:color w:val="000000"/>
-          <w:sz w:val="24"/>
-        </w:rPr>
-        <w:t>Name of Candidate</w:t>
+          <w:b/>
+          <w:i w:val="0"/>
+          <w:color w:val="000000"/>
+          <w:sz w:val="24"/>
+        </w:rPr>
+        <w:t>COMPARATIVE STUDY OF WEAR RESISTANCE</w:t>
       </w:r>
     </w:p>
     <w:p>
       <w:pPr>
         <w:widowControl/>
-        <w:spacing w:before="0" w:after="160" w:lineRule="auto" w:line="276"/>
+        <w:spacing w:before="0" w:after="0" w:lineRule="auto" w:line="276"/>
         <w:ind w:firstLine="0"/>
         <w:jc w:val="center"/>
       </w:pPr>
@@ -159,46 +237,36 @@
           <w:b/>
           <w:i w:val="0"/>
           <w:color w:val="000000"/>
-          <w:sz w:val="28"/>
-        </w:rPr>
-        <w:t>Mohamed Talaat Mohamed AbdelMoaty ElAbd</w:t>
+          <w:sz w:val="24"/>
+        </w:rPr>
+        <w:t>AND SURFACE ROUGHNESS OF INJECTABLE VERSUS</w:t>
       </w:r>
     </w:p>
     <w:p>
       <w:pPr>
         <w:widowControl/>
-        <w:spacing w:before="120" w:after="0" w:lineRule="auto" w:line="276"/>
+        <w:spacing w:before="0" w:after="0" w:lineRule="auto" w:line="276"/>
         <w:ind w:firstLine="0"/>
-        <w:jc w:val="left"/>
+        <w:jc w:val="center"/>
       </w:pPr>
       <w:r>
         <w:rPr>
           <w:rFonts w:ascii="Times New Roman" w:hAnsi="Times New Roman" w:eastAsia="Times New Roman"/>
           <w:b/>
-          <w:i/>
-          <w:color w:val="000000"/>
-          <w:sz w:val="24"/>
-        </w:rPr>
-        <w:t>English Title:</w:t>
+          <w:i w:val="0"/>
+          <w:color w:val="000000"/>
+          <w:sz w:val="24"/>
+        </w:rPr>
+        <w:t>CONVENTIONAL COMPOSITE RESIN — IN VITRO STUDY</w:t>
       </w:r>
     </w:p>
     <w:p>
       <w:pPr>
         <w:widowControl/>
-        <w:spacing w:before="40" w:after="120" w:lineRule="auto" w:line="276"/>
+        <w:spacing w:before="0" w:after="200" w:lineRule="auto" w:line="240"/>
         <w:ind w:firstLine="0"/>
-        <w:jc w:val="center"/>
-      </w:pPr>
-      <w:r>
-        <w:rPr>
-          <w:rFonts w:ascii="Times New Roman" w:hAnsi="Times New Roman" w:eastAsia="Times New Roman"/>
-          <w:b/>
-          <w:i w:val="0"/>
-          <w:color w:val="000000"/>
-          <w:sz w:val="26"/>
-        </w:rPr>
-        <w:t>COMPARATIVE STUDY OF WEAR RESISTANCE AND SURFACE ROUGHNESS OF INJECTABLE VERSUS CONVENTIONAL COMPOSITE RESIN — IN VITRO STUDY</w:t>
-      </w:r>
+        <w:jc w:val="both"/>
+      </w:pPr>
     </w:p>
     <w:p>
       <w:pPr>
@@ -221,7 +289,7 @@
     <w:p>
       <w:pPr>
         <w:widowControl/>
-        <w:spacing w:before="40" w:after="120" w:lineRule="auto" w:line="276"/>
+        <w:spacing w:before="80" w:after="0" w:lineRule="auto" w:line="276"/>
         <w:ind w:firstLine="0"/>
         <w:jc w:val="center"/>
       </w:pPr>
@@ -231,7 +299,7 @@
           <w:b/>
           <w:i w:val="0"/>
           <w:color w:val="000000"/>
-          <w:sz w:val="26"/>
+          <w:sz w:val="24"/>
         </w:rPr>
         <w:t>دراسة مقارنة للتآكل وخشونة سطح الراتينج المركب القابل للحقن والتقليدي – دراسة في المختبر</w:t>
       </w:r>
@@ -239,7 +307,15 @@
     <w:p>
       <w:pPr>
         <w:widowControl/>
-        <w:spacing w:before="0" w:after="160" w:lineRule="auto" w:line="276"/>
+        <w:spacing w:before="0" w:after="200" w:lineRule="auto" w:line="240"/>
+        <w:ind w:firstLine="0"/>
+        <w:jc w:val="both"/>
+      </w:pPr>
+    </w:p>
+    <w:p>
+      <w:pPr>
+        <w:widowControl/>
+        <w:spacing w:before="0" w:after="0" w:lineRule="auto" w:line="276"/>
         <w:ind w:firstLine="0"/>
         <w:jc w:val="left"/>
       </w:pPr>
@@ -257,7 +333,15 @@
     <w:p>
       <w:pPr>
         <w:widowControl/>
-        <w:spacing w:before="80" w:after="80" w:lineRule="auto" w:line="276"/>
+        <w:spacing w:before="0" w:after="320" w:lineRule="auto" w:line="240"/>
+        <w:ind w:firstLine="0"/>
+        <w:jc w:val="both"/>
+      </w:pPr>
+    </w:p>
+    <w:p>
+      <w:pPr>
+        <w:widowControl/>
+        <w:spacing w:before="0" w:after="120" w:lineRule="auto" w:line="276"/>
         <w:ind w:firstLine="0"/>
         <w:jc w:val="center"/>
       </w:pPr>
@@ -267,7 +351,7 @@
           <w:b/>
           <w:i w:val="0"/>
           <w:color w:val="000000"/>
-          <w:sz w:val="26"/>
+          <w:sz w:val="24"/>
         </w:rPr>
         <w:t>Supervision Committee</w:t>
       </w:r>
@@ -275,7 +359,7 @@
     <w:p>
       <w:pPr>
         <w:widowControl/>
-        <w:spacing w:before="0" w:after="0" w:lineRule="auto" w:line="276"/>
+        <w:spacing w:before="0" w:after="40" w:lineRule="auto" w:line="276"/>
         <w:ind w:firstLine="0"/>
         <w:jc w:val="center"/>
       </w:pPr>
@@ -896,7 +980,7 @@
           <w:sz w:val="24"/>
         </w:rPr>
         <w:tab/>
-        <w:t>14</w:t>
+        <w:t>13</w:t>
       </w:r>
     </w:p>
     <w:p>
@@ -928,7 +1012,7 @@
           <w:sz w:val="24"/>
         </w:rPr>
         <w:tab/>
-        <w:t>22</w:t>
+        <w:t>21</w:t>
       </w:r>
     </w:p>
     <w:p>
@@ -960,7 +1044,7 @@
           <w:sz w:val="24"/>
         </w:rPr>
         <w:tab/>
-        <w:t>27</w:t>
+        <w:t>26</w:t>
       </w:r>
     </w:p>
     <w:p>
@@ -992,7 +1076,7 @@
           <w:sz w:val="24"/>
         </w:rPr>
         <w:tab/>
-        <w:t>33</w:t>
+        <w:t>32</w:t>
       </w:r>
     </w:p>
     <w:p>
@@ -1024,7 +1108,7 @@
           <w:sz w:val="24"/>
         </w:rPr>
         <w:tab/>
-        <w:t>39</w:t>
+        <w:t>38</w:t>
       </w:r>
     </w:p>
     <w:p>
@@ -1056,7 +1140,7 @@
           <w:sz w:val="24"/>
         </w:rPr>
         <w:tab/>
-        <w:t>41</w:t>
+        <w:t>40</w:t>
       </w:r>
     </w:p>
     <w:p>
@@ -3912,16 +3996,17 @@
     </w:p>
     <w:p>
       <w:pPr>
+        <w:keepNext/>
         <w:widowControl/>
-        <w:spacing w:before="120" w:after="120" w:line="480" w:lineRule="auto"/>
+        <w:spacing w:before="200" w:after="120" w:lineRule="auto" w:line="276"/>
         <w:ind w:firstLine="0"/>
-        <w:jc w:val="both"/>
+        <w:jc w:val="left"/>
       </w:pPr>
       <w:r>
         <w:rPr>
           <w:rFonts w:ascii="Times New Roman" w:hAnsi="Times New Roman" w:eastAsia="Times New Roman"/>
           <w:b/>
-          <w:i/>
+          <w:i w:val="0"/>
           <w:color w:val="000000"/>
           <w:sz w:val="24"/>
         </w:rPr>
@@ -3931,7 +4016,7 @@
         <w:rPr>
           <w:rFonts w:ascii="Times New Roman" w:hAnsi="Times New Roman" w:eastAsia="Times New Roman"/>
           <w:b w:val="0"/>
-          <w:i/>
+          <w:i w:val="0"/>
           <w:color w:val="000000"/>
           <w:sz w:val="24"/>
         </w:rPr>
@@ -3942,7 +4027,7 @@
       <w:tblPr>
         <w:tblW w:type="auto" w:w="0"/>
         <w:jc w:val="center"/>
-        <w:tblLayout w:type="autofit"/>
+        <w:tblLayout w:type="fixed"/>
         <w:tblLook w:firstColumn="1" w:firstRow="1" w:lastColumn="0" w:lastRow="0" w:noHBand="0" w:noVBand="1" w:val="04A0"/>
       </w:tblPr>
       <w:tblGrid>
@@ -3956,19 +4041,19 @@
       <w:tr>
         <w:tc>
           <w:tcPr>
-            <w:tcW w:type="dxa" w:w="1512"/>
+            <w:tcW w:type="dxa" w:w="1984"/>
             <w:tcBorders>
-              <w:top w:val="single" w:sz="4" w:space="0" w:color="000000"/>
-              <w:left w:val="single" w:sz="4" w:space="0" w:color="000000"/>
-              <w:bottom w:val="single" w:sz="4" w:space="0" w:color="000000"/>
-              <w:right w:val="single" w:sz="4" w:space="0" w:color="000000"/>
+              <w:top w:val="single" w:sz="18" w:space="0" w:color="000000"/>
+              <w:left w:val="nil" w:sz="0" w:space="0" w:color="auto"/>
+              <w:bottom w:val="single" w:sz="8" w:space="0" w:color="000000"/>
+              <w:right w:val="nil" w:sz="0" w:space="0" w:color="auto"/>
             </w:tcBorders>
-            <w:shd w:fill="E8E8E8" w:val="clear"/>
           </w:tcPr>
           <w:p>
             <w:pPr>
-              <w:spacing w:line="240" w:lineRule="auto" w:after="40" w:before="40"/>
+              <w:spacing w:line="240" w:lineRule="auto" w:after="0" w:before="0"/>
               <w:ind w:firstLine="0"/>
+              <w:jc w:val="left"/>
             </w:pPr>
             <w:r/>
             <w:r>
@@ -3977,7 +4062,7 @@
                 <w:b/>
                 <w:i w:val="0"/>
                 <w:color w:val="000000"/>
-                <w:sz w:val="18"/>
+                <w:sz w:val="20"/>
               </w:rPr>
               <w:t>Composite</w:t>
             </w:r>
@@ -3985,19 +4070,19 @@
         </w:tc>
         <w:tc>
           <w:tcPr>
-            <w:tcW w:type="dxa" w:w="1512"/>
+            <w:tcW w:type="dxa" w:w="1417"/>
             <w:tcBorders>
-              <w:top w:val="single" w:sz="4" w:space="0" w:color="000000"/>
-              <w:left w:val="single" w:sz="4" w:space="0" w:color="000000"/>
-              <w:bottom w:val="single" w:sz="4" w:space="0" w:color="000000"/>
-              <w:right w:val="single" w:sz="4" w:space="0" w:color="000000"/>
+              <w:top w:val="single" w:sz="18" w:space="0" w:color="000000"/>
+              <w:left w:val="nil" w:sz="0" w:space="0" w:color="auto"/>
+              <w:bottom w:val="single" w:sz="8" w:space="0" w:color="000000"/>
+              <w:right w:val="nil" w:sz="0" w:space="0" w:color="auto"/>
             </w:tcBorders>
-            <w:shd w:fill="E8E8E8" w:val="clear"/>
           </w:tcPr>
           <w:p>
             <w:pPr>
-              <w:spacing w:line="240" w:lineRule="auto" w:after="40" w:before="40"/>
+              <w:spacing w:line="240" w:lineRule="auto" w:after="0" w:before="0"/>
               <w:ind w:firstLine="0"/>
+              <w:jc w:val="left"/>
             </w:pPr>
             <w:r/>
             <w:r>
@@ -4006,7 +4091,7 @@
                 <w:b/>
                 <w:i w:val="0"/>
                 <w:color w:val="000000"/>
-                <w:sz w:val="18"/>
+                <w:sz w:val="20"/>
               </w:rPr>
               <w:t>Type</w:t>
             </w:r>
@@ -4014,19 +4099,19 @@
         </w:tc>
         <w:tc>
           <w:tcPr>
-            <w:tcW w:type="dxa" w:w="1512"/>
+            <w:tcW w:type="dxa" w:w="1644"/>
             <w:tcBorders>
-              <w:top w:val="single" w:sz="4" w:space="0" w:color="000000"/>
-              <w:left w:val="single" w:sz="4" w:space="0" w:color="000000"/>
-              <w:bottom w:val="single" w:sz="4" w:space="0" w:color="000000"/>
-              <w:right w:val="single" w:sz="4" w:space="0" w:color="000000"/>
+              <w:top w:val="single" w:sz="18" w:space="0" w:color="000000"/>
+              <w:left w:val="nil" w:sz="0" w:space="0" w:color="auto"/>
+              <w:bottom w:val="single" w:sz="8" w:space="0" w:color="000000"/>
+              <w:right w:val="nil" w:sz="0" w:space="0" w:color="auto"/>
             </w:tcBorders>
-            <w:shd w:fill="E8E8E8" w:val="clear"/>
           </w:tcPr>
           <w:p>
             <w:pPr>
-              <w:spacing w:line="240" w:lineRule="auto" w:after="40" w:before="40"/>
+              <w:spacing w:line="240" w:lineRule="auto" w:after="0" w:before="0"/>
               <w:ind w:firstLine="0"/>
+              <w:jc w:val="left"/>
             </w:pPr>
             <w:r/>
             <w:r>
@@ -4035,7 +4120,7 @@
                 <w:b/>
                 <w:i w:val="0"/>
                 <w:color w:val="000000"/>
-                <w:sz w:val="18"/>
+                <w:sz w:val="20"/>
               </w:rPr>
               <w:t>Matrix</w:t>
             </w:r>
@@ -4043,19 +4128,19 @@
         </w:tc>
         <w:tc>
           <w:tcPr>
-            <w:tcW w:type="dxa" w:w="1512"/>
+            <w:tcW w:type="dxa" w:w="1531"/>
             <w:tcBorders>
-              <w:top w:val="single" w:sz="4" w:space="0" w:color="000000"/>
-              <w:left w:val="single" w:sz="4" w:space="0" w:color="000000"/>
-              <w:bottom w:val="single" w:sz="4" w:space="0" w:color="000000"/>
-              <w:right w:val="single" w:sz="4" w:space="0" w:color="000000"/>
+              <w:top w:val="single" w:sz="18" w:space="0" w:color="000000"/>
+              <w:left w:val="nil" w:sz="0" w:space="0" w:color="auto"/>
+              <w:bottom w:val="single" w:sz="8" w:space="0" w:color="000000"/>
+              <w:right w:val="nil" w:sz="0" w:space="0" w:color="auto"/>
             </w:tcBorders>
-            <w:shd w:fill="E8E8E8" w:val="clear"/>
           </w:tcPr>
           <w:p>
             <w:pPr>
-              <w:spacing w:line="240" w:lineRule="auto" w:after="40" w:before="40"/>
+              <w:spacing w:line="240" w:lineRule="auto" w:after="0" w:before="0"/>
               <w:ind w:firstLine="0"/>
+              <w:jc w:val="left"/>
             </w:pPr>
             <w:r/>
             <w:r>
@@ -4064,7 +4149,7 @@
                 <w:b/>
                 <w:i w:val="0"/>
                 <w:color w:val="000000"/>
-                <w:sz w:val="18"/>
+                <w:sz w:val="20"/>
               </w:rPr>
               <w:t>Filler</w:t>
             </w:r>
@@ -4072,19 +4157,19 @@
         </w:tc>
         <w:tc>
           <w:tcPr>
-            <w:tcW w:type="dxa" w:w="1512"/>
+            <w:tcW w:type="dxa" w:w="850"/>
             <w:tcBorders>
-              <w:top w:val="single" w:sz="4" w:space="0" w:color="000000"/>
-              <w:left w:val="single" w:sz="4" w:space="0" w:color="000000"/>
-              <w:bottom w:val="single" w:sz="4" w:space="0" w:color="000000"/>
-              <w:right w:val="single" w:sz="4" w:space="0" w:color="000000"/>
+              <w:top w:val="single" w:sz="18" w:space="0" w:color="000000"/>
+              <w:left w:val="nil" w:sz="0" w:space="0" w:color="auto"/>
+              <w:bottom w:val="single" w:sz="8" w:space="0" w:color="000000"/>
+              <w:right w:val="nil" w:sz="0" w:space="0" w:color="auto"/>
             </w:tcBorders>
-            <w:shd w:fill="E8E8E8" w:val="clear"/>
           </w:tcPr>
           <w:p>
             <w:pPr>
-              <w:spacing w:line="240" w:lineRule="auto" w:after="40" w:before="40"/>
+              <w:spacing w:line="240" w:lineRule="auto" w:after="0" w:before="0"/>
               <w:ind w:firstLine="0"/>
+              <w:jc w:val="center"/>
             </w:pPr>
             <w:r/>
             <w:r>
@@ -4093,7 +4178,7 @@
                 <w:b/>
                 <w:i w:val="0"/>
                 <w:color w:val="000000"/>
-                <w:sz w:val="18"/>
+                <w:sz w:val="20"/>
               </w:rPr>
               <w:t>Load</w:t>
             </w:r>
@@ -4101,19 +4186,19 @@
         </w:tc>
         <w:tc>
           <w:tcPr>
-            <w:tcW w:type="dxa" w:w="1512"/>
+            <w:tcW w:type="dxa" w:w="1531"/>
             <w:tcBorders>
-              <w:top w:val="single" w:sz="4" w:space="0" w:color="000000"/>
-              <w:left w:val="single" w:sz="4" w:space="0" w:color="000000"/>
-              <w:bottom w:val="single" w:sz="4" w:space="0" w:color="000000"/>
-              <w:right w:val="single" w:sz="4" w:space="0" w:color="000000"/>
+              <w:top w:val="single" w:sz="18" w:space="0" w:color="000000"/>
+              <w:left w:val="nil" w:sz="0" w:space="0" w:color="auto"/>
+              <w:bottom w:val="single" w:sz="8" w:space="0" w:color="000000"/>
+              <w:right w:val="nil" w:sz="0" w:space="0" w:color="auto"/>
             </w:tcBorders>
-            <w:shd w:fill="E8E8E8" w:val="clear"/>
           </w:tcPr>
           <w:p>
             <w:pPr>
-              <w:spacing w:line="240" w:lineRule="auto" w:after="40" w:before="40"/>
+              <w:spacing w:line="240" w:lineRule="auto" w:after="0" w:before="0"/>
               <w:ind w:firstLine="0"/>
+              <w:jc w:val="left"/>
             </w:pPr>
             <w:r/>
             <w:r>
@@ -4122,7 +4207,7 @@
                 <w:b/>
                 <w:i w:val="0"/>
                 <w:color w:val="000000"/>
-                <w:sz w:val="18"/>
+                <w:sz w:val="20"/>
               </w:rPr>
               <w:t>Manufacturer</w:t>
             </w:r>
@@ -4132,18 +4217,19 @@
       <w:tr>
         <w:tc>
           <w:tcPr>
-            <w:tcW w:type="dxa" w:w="1512"/>
+            <w:tcW w:type="dxa" w:w="1984"/>
             <w:tcBorders>
-              <w:top w:val="single" w:sz="4" w:space="0" w:color="000000"/>
-              <w:left w:val="single" w:sz="4" w:space="0" w:color="000000"/>
-              <w:bottom w:val="single" w:sz="4" w:space="0" w:color="000000"/>
-              <w:right w:val="single" w:sz="4" w:space="0" w:color="000000"/>
+              <w:top w:val="nil" w:sz="0" w:space="0" w:color="auto"/>
+              <w:left w:val="nil" w:sz="0" w:space="0" w:color="auto"/>
+              <w:bottom w:val="nil" w:sz="0" w:space="0" w:color="auto"/>
+              <w:right w:val="nil" w:sz="0" w:space="0" w:color="auto"/>
             </w:tcBorders>
           </w:tcPr>
           <w:p>
             <w:pPr>
-              <w:spacing w:line="240" w:lineRule="auto" w:after="40" w:before="40"/>
+              <w:spacing w:line="240" w:lineRule="auto" w:after="0" w:before="0"/>
               <w:ind w:firstLine="0"/>
+              <w:jc w:val="left"/>
             </w:pPr>
             <w:r/>
             <w:r>
@@ -4152,7 +4238,7 @@
                 <w:b w:val="0"/>
                 <w:i w:val="0"/>
                 <w:color w:val="000000"/>
-                <w:sz w:val="18"/>
+                <w:sz w:val="20"/>
               </w:rPr>
               <w:t>G-ænial Universal Injectable (A2)</w:t>
             </w:r>
@@ -4160,18 +4246,19 @@
         </w:tc>
         <w:tc>
           <w:tcPr>
-            <w:tcW w:type="dxa" w:w="1512"/>
+            <w:tcW w:type="dxa" w:w="1417"/>
             <w:tcBorders>
-              <w:top w:val="single" w:sz="4" w:space="0" w:color="000000"/>
-              <w:left w:val="single" w:sz="4" w:space="0" w:color="000000"/>
-              <w:bottom w:val="single" w:sz="4" w:space="0" w:color="000000"/>
-              <w:right w:val="single" w:sz="4" w:space="0" w:color="000000"/>
+              <w:top w:val="nil" w:sz="0" w:space="0" w:color="auto"/>
+              <w:left w:val="nil" w:sz="0" w:space="0" w:color="auto"/>
+              <w:bottom w:val="nil" w:sz="0" w:space="0" w:color="auto"/>
+              <w:right w:val="nil" w:sz="0" w:space="0" w:color="auto"/>
             </w:tcBorders>
           </w:tcPr>
           <w:p>
             <w:pPr>
-              <w:spacing w:line="240" w:lineRule="auto" w:after="40" w:before="40"/>
+              <w:spacing w:line="240" w:lineRule="auto" w:after="0" w:before="0"/>
               <w:ind w:firstLine="0"/>
+              <w:jc w:val="left"/>
             </w:pPr>
             <w:r/>
             <w:r>
@@ -4180,7 +4267,7 @@
                 <w:b w:val="0"/>
                 <w:i w:val="0"/>
                 <w:color w:val="000000"/>
-                <w:sz w:val="18"/>
+                <w:sz w:val="20"/>
               </w:rPr>
               <w:t>Nanohybrid injectable</w:t>
             </w:r>
@@ -4188,18 +4275,19 @@
         </w:tc>
         <w:tc>
           <w:tcPr>
-            <w:tcW w:type="dxa" w:w="1512"/>
+            <w:tcW w:type="dxa" w:w="1644"/>
             <w:tcBorders>
-              <w:top w:val="single" w:sz="4" w:space="0" w:color="000000"/>
-              <w:left w:val="single" w:sz="4" w:space="0" w:color="000000"/>
-              <w:bottom w:val="single" w:sz="4" w:space="0" w:color="000000"/>
-              <w:right w:val="single" w:sz="4" w:space="0" w:color="000000"/>
+              <w:top w:val="nil" w:sz="0" w:space="0" w:color="auto"/>
+              <w:left w:val="nil" w:sz="0" w:space="0" w:color="auto"/>
+              <w:bottom w:val="nil" w:sz="0" w:space="0" w:color="auto"/>
+              <w:right w:val="nil" w:sz="0" w:space="0" w:color="auto"/>
             </w:tcBorders>
           </w:tcPr>
           <w:p>
             <w:pPr>
-              <w:spacing w:line="240" w:lineRule="auto" w:after="40" w:before="40"/>
+              <w:spacing w:line="240" w:lineRule="auto" w:after="0" w:before="0"/>
               <w:ind w:firstLine="0"/>
+              <w:jc w:val="left"/>
             </w:pPr>
             <w:r/>
             <w:r>
@@ -4208,7 +4296,7 @@
                 <w:b w:val="0"/>
                 <w:i w:val="0"/>
                 <w:color w:val="000000"/>
-                <w:sz w:val="18"/>
+                <w:sz w:val="20"/>
               </w:rPr>
               <w:t>Dimethacrylate monomers</w:t>
             </w:r>
@@ -4216,18 +4304,19 @@
         </w:tc>
         <w:tc>
           <w:tcPr>
-            <w:tcW w:type="dxa" w:w="1512"/>
+            <w:tcW w:type="dxa" w:w="1531"/>
             <w:tcBorders>
-              <w:top w:val="single" w:sz="4" w:space="0" w:color="000000"/>
-              <w:left w:val="single" w:sz="4" w:space="0" w:color="000000"/>
-              <w:bottom w:val="single" w:sz="4" w:space="0" w:color="000000"/>
-              <w:right w:val="single" w:sz="4" w:space="0" w:color="000000"/>
+              <w:top w:val="nil" w:sz="0" w:space="0" w:color="auto"/>
+              <w:left w:val="nil" w:sz="0" w:space="0" w:color="auto"/>
+              <w:bottom w:val="nil" w:sz="0" w:space="0" w:color="auto"/>
+              <w:right w:val="nil" w:sz="0" w:space="0" w:color="auto"/>
             </w:tcBorders>
           </w:tcPr>
           <w:p>
             <w:pPr>
-              <w:spacing w:line="240" w:lineRule="auto" w:after="40" w:before="40"/>
+              <w:spacing w:line="240" w:lineRule="auto" w:after="0" w:before="0"/>
               <w:ind w:firstLine="0"/>
+              <w:jc w:val="left"/>
             </w:pPr>
             <w:r/>
             <w:r>
@@ -4236,7 +4325,7 @@
                 <w:b w:val="0"/>
                 <w:i w:val="0"/>
                 <w:color w:val="000000"/>
-                <w:sz w:val="18"/>
+                <w:sz w:val="20"/>
               </w:rPr>
               <w:t>Barium glass, silica</w:t>
             </w:r>
@@ -4244,18 +4333,19 @@
         </w:tc>
         <w:tc>
           <w:tcPr>
-            <w:tcW w:type="dxa" w:w="1512"/>
+            <w:tcW w:type="dxa" w:w="850"/>
             <w:tcBorders>
-              <w:top w:val="single" w:sz="4" w:space="0" w:color="000000"/>
-              <w:left w:val="single" w:sz="4" w:space="0" w:color="000000"/>
-              <w:bottom w:val="single" w:sz="4" w:space="0" w:color="000000"/>
-              <w:right w:val="single" w:sz="4" w:space="0" w:color="000000"/>
+              <w:top w:val="nil" w:sz="0" w:space="0" w:color="auto"/>
+              <w:left w:val="nil" w:sz="0" w:space="0" w:color="auto"/>
+              <w:bottom w:val="nil" w:sz="0" w:space="0" w:color="auto"/>
+              <w:right w:val="nil" w:sz="0" w:space="0" w:color="auto"/>
             </w:tcBorders>
           </w:tcPr>
           <w:p>
             <w:pPr>
-              <w:spacing w:line="240" w:lineRule="auto" w:after="40" w:before="40"/>
+              <w:spacing w:line="240" w:lineRule="auto" w:after="0" w:before="0"/>
               <w:ind w:firstLine="0"/>
+              <w:jc w:val="center"/>
             </w:pPr>
             <w:r/>
             <w:r>
@@ -4264,7 +4354,7 @@
                 <w:b w:val="0"/>
                 <w:i w:val="0"/>
                 <w:color w:val="000000"/>
-                <w:sz w:val="18"/>
+                <w:sz w:val="20"/>
               </w:rPr>
               <w:t>50 vol%</w:t>
             </w:r>
@@ -4272,18 +4362,19 @@
         </w:tc>
         <w:tc>
           <w:tcPr>
-            <w:tcW w:type="dxa" w:w="1512"/>
+            <w:tcW w:type="dxa" w:w="1531"/>
             <w:tcBorders>
-              <w:top w:val="single" w:sz="4" w:space="0" w:color="000000"/>
-              <w:left w:val="single" w:sz="4" w:space="0" w:color="000000"/>
-              <w:bottom w:val="single" w:sz="4" w:space="0" w:color="000000"/>
-              <w:right w:val="single" w:sz="4" w:space="0" w:color="000000"/>
+              <w:top w:val="nil" w:sz="0" w:space="0" w:color="auto"/>
+              <w:left w:val="nil" w:sz="0" w:space="0" w:color="auto"/>
+              <w:bottom w:val="nil" w:sz="0" w:space="0" w:color="auto"/>
+              <w:right w:val="nil" w:sz="0" w:space="0" w:color="auto"/>
             </w:tcBorders>
           </w:tcPr>
           <w:p>
             <w:pPr>
-              <w:spacing w:line="240" w:lineRule="auto" w:after="40" w:before="40"/>
+              <w:spacing w:line="240" w:lineRule="auto" w:after="0" w:before="0"/>
               <w:ind w:firstLine="0"/>
+              <w:jc w:val="left"/>
             </w:pPr>
             <w:r/>
             <w:r>
@@ -4292,7 +4383,7 @@
                 <w:b w:val="0"/>
                 <w:i w:val="0"/>
                 <w:color w:val="000000"/>
-                <w:sz w:val="18"/>
+                <w:sz w:val="20"/>
               </w:rPr>
               <w:t>GC, Tokyo</w:t>
             </w:r>
@@ -4302,18 +4393,19 @@
       <w:tr>
         <w:tc>
           <w:tcPr>
-            <w:tcW w:type="dxa" w:w="1512"/>
+            <w:tcW w:type="dxa" w:w="1984"/>
             <w:tcBorders>
-              <w:top w:val="single" w:sz="4" w:space="0" w:color="000000"/>
-              <w:left w:val="single" w:sz="4" w:space="0" w:color="000000"/>
-              <w:bottom w:val="single" w:sz="4" w:space="0" w:color="000000"/>
-              <w:right w:val="single" w:sz="4" w:space="0" w:color="000000"/>
+              <w:top w:val="nil" w:sz="0" w:space="0" w:color="auto"/>
+              <w:left w:val="nil" w:sz="0" w:space="0" w:color="auto"/>
+              <w:bottom w:val="nil" w:sz="0" w:space="0" w:color="auto"/>
+              <w:right w:val="nil" w:sz="0" w:space="0" w:color="auto"/>
             </w:tcBorders>
           </w:tcPr>
           <w:p>
             <w:pPr>
-              <w:spacing w:line="240" w:lineRule="auto" w:after="40" w:before="40"/>
+              <w:spacing w:line="240" w:lineRule="auto" w:after="0" w:before="0"/>
               <w:ind w:firstLine="0"/>
+              <w:jc w:val="left"/>
             </w:pPr>
             <w:r/>
             <w:r>
@@ -4322,7 +4414,7 @@
                 <w:b w:val="0"/>
                 <w:i w:val="0"/>
                 <w:color w:val="000000"/>
-                <w:sz w:val="18"/>
+                <w:sz w:val="20"/>
               </w:rPr>
               <w:t>Beautifil Flow Plus X F00 (A2)</w:t>
             </w:r>
@@ -4330,18 +4422,19 @@
         </w:tc>
         <w:tc>
           <w:tcPr>
-            <w:tcW w:type="dxa" w:w="1512"/>
+            <w:tcW w:type="dxa" w:w="1417"/>
             <w:tcBorders>
-              <w:top w:val="single" w:sz="4" w:space="0" w:color="000000"/>
-              <w:left w:val="single" w:sz="4" w:space="0" w:color="000000"/>
-              <w:bottom w:val="single" w:sz="4" w:space="0" w:color="000000"/>
-              <w:right w:val="single" w:sz="4" w:space="0" w:color="000000"/>
+              <w:top w:val="nil" w:sz="0" w:space="0" w:color="auto"/>
+              <w:left w:val="nil" w:sz="0" w:space="0" w:color="auto"/>
+              <w:bottom w:val="nil" w:sz="0" w:space="0" w:color="auto"/>
+              <w:right w:val="nil" w:sz="0" w:space="0" w:color="auto"/>
             </w:tcBorders>
           </w:tcPr>
           <w:p>
             <w:pPr>
-              <w:spacing w:line="240" w:lineRule="auto" w:after="40" w:before="40"/>
+              <w:spacing w:line="240" w:lineRule="auto" w:after="0" w:before="0"/>
               <w:ind w:firstLine="0"/>
+              <w:jc w:val="left"/>
             </w:pPr>
             <w:r/>
             <w:r>
@@ -4350,7 +4443,7 @@
                 <w:b w:val="0"/>
                 <w:i w:val="0"/>
                 <w:color w:val="000000"/>
-                <w:sz w:val="18"/>
+                <w:sz w:val="20"/>
               </w:rPr>
               <w:t>Nanohybrid injectable giomer</w:t>
             </w:r>
@@ -4358,18 +4451,19 @@
         </w:tc>
         <w:tc>
           <w:tcPr>
-            <w:tcW w:type="dxa" w:w="1512"/>
+            <w:tcW w:type="dxa" w:w="1644"/>
             <w:tcBorders>
-              <w:top w:val="single" w:sz="4" w:space="0" w:color="000000"/>
-              <w:left w:val="single" w:sz="4" w:space="0" w:color="000000"/>
-              <w:bottom w:val="single" w:sz="4" w:space="0" w:color="000000"/>
-              <w:right w:val="single" w:sz="4" w:space="0" w:color="000000"/>
+              <w:top w:val="nil" w:sz="0" w:space="0" w:color="auto"/>
+              <w:left w:val="nil" w:sz="0" w:space="0" w:color="auto"/>
+              <w:bottom w:val="nil" w:sz="0" w:space="0" w:color="auto"/>
+              <w:right w:val="nil" w:sz="0" w:space="0" w:color="auto"/>
             </w:tcBorders>
           </w:tcPr>
           <w:p>
             <w:pPr>
-              <w:spacing w:line="240" w:lineRule="auto" w:after="40" w:before="40"/>
+              <w:spacing w:line="240" w:lineRule="auto" w:after="0" w:before="0"/>
               <w:ind w:firstLine="0"/>
+              <w:jc w:val="left"/>
             </w:pPr>
             <w:r/>
             <w:r>
@@ -4378,7 +4472,7 @@
                 <w:b w:val="0"/>
                 <w:i w:val="0"/>
                 <w:color w:val="000000"/>
-                <w:sz w:val="18"/>
+                <w:sz w:val="20"/>
               </w:rPr>
               <w:t>Bis-GMA, TEGDMA</w:t>
             </w:r>
@@ -4386,18 +4480,19 @@
         </w:tc>
         <w:tc>
           <w:tcPr>
-            <w:tcW w:type="dxa" w:w="1512"/>
+            <w:tcW w:type="dxa" w:w="1531"/>
             <w:tcBorders>
-              <w:top w:val="single" w:sz="4" w:space="0" w:color="000000"/>
-              <w:left w:val="single" w:sz="4" w:space="0" w:color="000000"/>
-              <w:bottom w:val="single" w:sz="4" w:space="0" w:color="000000"/>
-              <w:right w:val="single" w:sz="4" w:space="0" w:color="000000"/>
+              <w:top w:val="nil" w:sz="0" w:space="0" w:color="auto"/>
+              <w:left w:val="nil" w:sz="0" w:space="0" w:color="auto"/>
+              <w:bottom w:val="nil" w:sz="0" w:space="0" w:color="auto"/>
+              <w:right w:val="nil" w:sz="0" w:space="0" w:color="auto"/>
             </w:tcBorders>
           </w:tcPr>
           <w:p>
             <w:pPr>
-              <w:spacing w:line="240" w:lineRule="auto" w:after="40" w:before="40"/>
+              <w:spacing w:line="240" w:lineRule="auto" w:after="0" w:before="0"/>
               <w:ind w:firstLine="0"/>
+              <w:jc w:val="left"/>
             </w:pPr>
             <w:r/>
             <w:r>
@@ -4406,7 +4501,7 @@
                 <w:b w:val="0"/>
                 <w:i w:val="0"/>
                 <w:color w:val="000000"/>
-                <w:sz w:val="18"/>
+                <w:sz w:val="20"/>
               </w:rPr>
               <w:t>Multifunctional glass and S-PRG filler</w:t>
             </w:r>
@@ -4414,18 +4509,19 @@
         </w:tc>
         <w:tc>
           <w:tcPr>
-            <w:tcW w:type="dxa" w:w="1512"/>
+            <w:tcW w:type="dxa" w:w="850"/>
             <w:tcBorders>
-              <w:top w:val="single" w:sz="4" w:space="0" w:color="000000"/>
-              <w:left w:val="single" w:sz="4" w:space="0" w:color="000000"/>
-              <w:bottom w:val="single" w:sz="4" w:space="0" w:color="000000"/>
-              <w:right w:val="single" w:sz="4" w:space="0" w:color="000000"/>
+              <w:top w:val="nil" w:sz="0" w:space="0" w:color="auto"/>
+              <w:left w:val="nil" w:sz="0" w:space="0" w:color="auto"/>
+              <w:bottom w:val="nil" w:sz="0" w:space="0" w:color="auto"/>
+              <w:right w:val="nil" w:sz="0" w:space="0" w:color="auto"/>
             </w:tcBorders>
           </w:tcPr>
           <w:p>
             <w:pPr>
-              <w:spacing w:line="240" w:lineRule="auto" w:after="40" w:before="40"/>
+              <w:spacing w:line="240" w:lineRule="auto" w:after="0" w:before="0"/>
               <w:ind w:firstLine="0"/>
+              <w:jc w:val="center"/>
             </w:pPr>
             <w:r/>
             <w:r>
@@ -4434,7 +4530,7 @@
                 <w:b w:val="0"/>
                 <w:i w:val="0"/>
                 <w:color w:val="000000"/>
-                <w:sz w:val="18"/>
+                <w:sz w:val="20"/>
               </w:rPr>
               <w:t>47 vol%</w:t>
             </w:r>
@@ -4442,18 +4538,19 @@
         </w:tc>
         <w:tc>
           <w:tcPr>
-            <w:tcW w:type="dxa" w:w="1512"/>
+            <w:tcW w:type="dxa" w:w="1531"/>
             <w:tcBorders>
-              <w:top w:val="single" w:sz="4" w:space="0" w:color="000000"/>
-              <w:left w:val="single" w:sz="4" w:space="0" w:color="000000"/>
-              <w:bottom w:val="single" w:sz="4" w:space="0" w:color="000000"/>
-              <w:right w:val="single" w:sz="4" w:space="0" w:color="000000"/>
+              <w:top w:val="nil" w:sz="0" w:space="0" w:color="auto"/>
+              <w:left w:val="nil" w:sz="0" w:space="0" w:color="auto"/>
+              <w:bottom w:val="nil" w:sz="0" w:space="0" w:color="auto"/>
+              <w:right w:val="nil" w:sz="0" w:space="0" w:color="auto"/>
             </w:tcBorders>
           </w:tcPr>
           <w:p>
             <w:pPr>
-              <w:spacing w:line="240" w:lineRule="auto" w:after="40" w:before="40"/>
+              <w:spacing w:line="240" w:lineRule="auto" w:after="0" w:before="0"/>
               <w:ind w:firstLine="0"/>
+              <w:jc w:val="left"/>
             </w:pPr>
             <w:r/>
             <w:r>
@@ -4462,7 +4559,7 @@
                 <w:b w:val="0"/>
                 <w:i w:val="0"/>
                 <w:color w:val="000000"/>
-                <w:sz w:val="18"/>
+                <w:sz w:val="20"/>
               </w:rPr>
               <w:t>Shofu, Kyoto</w:t>
             </w:r>
@@ -4472,18 +4569,19 @@
       <w:tr>
         <w:tc>
           <w:tcPr>
-            <w:tcW w:type="dxa" w:w="1512"/>
+            <w:tcW w:type="dxa" w:w="1984"/>
             <w:tcBorders>
-              <w:top w:val="single" w:sz="4" w:space="0" w:color="000000"/>
-              <w:left w:val="single" w:sz="4" w:space="0" w:color="000000"/>
-              <w:bottom w:val="single" w:sz="4" w:space="0" w:color="000000"/>
-              <w:right w:val="single" w:sz="4" w:space="0" w:color="000000"/>
+              <w:top w:val="nil" w:sz="0" w:space="0" w:color="auto"/>
+              <w:left w:val="nil" w:sz="0" w:space="0" w:color="auto"/>
+              <w:bottom w:val="single" w:sz="18" w:space="0" w:color="000000"/>
+              <w:right w:val="nil" w:sz="0" w:space="0" w:color="auto"/>
             </w:tcBorders>
           </w:tcPr>
           <w:p>
             <w:pPr>
-              <w:spacing w:line="240" w:lineRule="auto" w:after="40" w:before="40"/>
+              <w:spacing w:line="240" w:lineRule="auto" w:after="0" w:before="0"/>
               <w:ind w:firstLine="0"/>
+              <w:jc w:val="left"/>
             </w:pPr>
             <w:r/>
             <w:r>
@@ -4492,7 +4590,7 @@
                 <w:b w:val="0"/>
                 <w:i w:val="0"/>
                 <w:color w:val="000000"/>
-                <w:sz w:val="18"/>
+                <w:sz w:val="20"/>
               </w:rPr>
               <w:t>Beautifil II LS (A2)</w:t>
             </w:r>
@@ -4500,18 +4598,19 @@
         </w:tc>
         <w:tc>
           <w:tcPr>
-            <w:tcW w:type="dxa" w:w="1512"/>
+            <w:tcW w:type="dxa" w:w="1417"/>
             <w:tcBorders>
-              <w:top w:val="single" w:sz="4" w:space="0" w:color="000000"/>
-              <w:left w:val="single" w:sz="4" w:space="0" w:color="000000"/>
-              <w:bottom w:val="single" w:sz="4" w:space="0" w:color="000000"/>
-              <w:right w:val="single" w:sz="4" w:space="0" w:color="000000"/>
+              <w:top w:val="nil" w:sz="0" w:space="0" w:color="auto"/>
+              <w:left w:val="nil" w:sz="0" w:space="0" w:color="auto"/>
+              <w:bottom w:val="single" w:sz="18" w:space="0" w:color="000000"/>
+              <w:right w:val="nil" w:sz="0" w:space="0" w:color="auto"/>
             </w:tcBorders>
           </w:tcPr>
           <w:p>
             <w:pPr>
-              <w:spacing w:line="240" w:lineRule="auto" w:after="40" w:before="40"/>
+              <w:spacing w:line="240" w:lineRule="auto" w:after="0" w:before="0"/>
               <w:ind w:firstLine="0"/>
+              <w:jc w:val="left"/>
             </w:pPr>
             <w:r/>
             <w:r>
@@ -4520,7 +4619,7 @@
                 <w:b w:val="0"/>
                 <w:i w:val="0"/>
                 <w:color w:val="000000"/>
-                <w:sz w:val="18"/>
+                <w:sz w:val="20"/>
               </w:rPr>
               <w:t>Nanohybrid conventional giomer</w:t>
             </w:r>
@@ -4528,18 +4627,19 @@
         </w:tc>
         <w:tc>
           <w:tcPr>
-            <w:tcW w:type="dxa" w:w="1512"/>
+            <w:tcW w:type="dxa" w:w="1644"/>
             <w:tcBorders>
-              <w:top w:val="single" w:sz="4" w:space="0" w:color="000000"/>
-              <w:left w:val="single" w:sz="4" w:space="0" w:color="000000"/>
-              <w:bottom w:val="single" w:sz="4" w:space="0" w:color="000000"/>
-              <w:right w:val="single" w:sz="4" w:space="0" w:color="000000"/>
+              <w:top w:val="nil" w:sz="0" w:space="0" w:color="auto"/>
+              <w:left w:val="nil" w:sz="0" w:space="0" w:color="auto"/>
+              <w:bottom w:val="single" w:sz="18" w:space="0" w:color="000000"/>
+              <w:right w:val="nil" w:sz="0" w:space="0" w:color="auto"/>
             </w:tcBorders>
           </w:tcPr>
           <w:p>
             <w:pPr>
-              <w:spacing w:line="240" w:lineRule="auto" w:after="40" w:before="40"/>
+              <w:spacing w:line="240" w:lineRule="auto" w:after="0" w:before="0"/>
               <w:ind w:firstLine="0"/>
+              <w:jc w:val="left"/>
             </w:pPr>
             <w:r/>
             <w:r>
@@ -4548,7 +4648,7 @@
                 <w:b w:val="0"/>
                 <w:i w:val="0"/>
                 <w:color w:val="000000"/>
-                <w:sz w:val="18"/>
+                <w:sz w:val="20"/>
               </w:rPr>
               <w:t>Bis-GMA, UDMA, Bis-EMA, PEGMA, TEGDMA</w:t>
             </w:r>
@@ -4556,18 +4656,19 @@
         </w:tc>
         <w:tc>
           <w:tcPr>
-            <w:tcW w:type="dxa" w:w="1512"/>
+            <w:tcW w:type="dxa" w:w="1531"/>
             <w:tcBorders>
-              <w:top w:val="single" w:sz="4" w:space="0" w:color="000000"/>
-              <w:left w:val="single" w:sz="4" w:space="0" w:color="000000"/>
-              <w:bottom w:val="single" w:sz="4" w:space="0" w:color="000000"/>
-              <w:right w:val="single" w:sz="4" w:space="0" w:color="000000"/>
+              <w:top w:val="nil" w:sz="0" w:space="0" w:color="auto"/>
+              <w:left w:val="nil" w:sz="0" w:space="0" w:color="auto"/>
+              <w:bottom w:val="single" w:sz="18" w:space="0" w:color="000000"/>
+              <w:right w:val="nil" w:sz="0" w:space="0" w:color="auto"/>
             </w:tcBorders>
           </w:tcPr>
           <w:p>
             <w:pPr>
-              <w:spacing w:line="240" w:lineRule="auto" w:after="40" w:before="40"/>
+              <w:spacing w:line="240" w:lineRule="auto" w:after="0" w:before="0"/>
               <w:ind w:firstLine="0"/>
+              <w:jc w:val="left"/>
             </w:pPr>
             <w:r/>
             <w:r>
@@ -4576,7 +4677,7 @@
                 <w:b w:val="0"/>
                 <w:i w:val="0"/>
                 <w:color w:val="000000"/>
-                <w:sz w:val="18"/>
+                <w:sz w:val="20"/>
               </w:rPr>
               <w:t>Multifunctional glass and S-PRG filler</w:t>
             </w:r>
@@ -4584,18 +4685,19 @@
         </w:tc>
         <w:tc>
           <w:tcPr>
-            <w:tcW w:type="dxa" w:w="1512"/>
+            <w:tcW w:type="dxa" w:w="850"/>
             <w:tcBorders>
-              <w:top w:val="single" w:sz="4" w:space="0" w:color="000000"/>
-              <w:left w:val="single" w:sz="4" w:space="0" w:color="000000"/>
-              <w:bottom w:val="single" w:sz="4" w:space="0" w:color="000000"/>
-              <w:right w:val="single" w:sz="4" w:space="0" w:color="000000"/>
+              <w:top w:val="nil" w:sz="0" w:space="0" w:color="auto"/>
+              <w:left w:val="nil" w:sz="0" w:space="0" w:color="auto"/>
+              <w:bottom w:val="single" w:sz="18" w:space="0" w:color="000000"/>
+              <w:right w:val="nil" w:sz="0" w:space="0" w:color="auto"/>
             </w:tcBorders>
           </w:tcPr>
           <w:p>
             <w:pPr>
-              <w:spacing w:line="240" w:lineRule="auto" w:after="40" w:before="40"/>
+              <w:spacing w:line="240" w:lineRule="auto" w:after="0" w:before="0"/>
               <w:ind w:firstLine="0"/>
+              <w:jc w:val="center"/>
             </w:pPr>
             <w:r/>
             <w:r>
@@ -4604,7 +4706,7 @@
                 <w:b w:val="0"/>
                 <w:i w:val="0"/>
                 <w:color w:val="000000"/>
-                <w:sz w:val="18"/>
+                <w:sz w:val="20"/>
               </w:rPr>
               <w:t>68 vol%</w:t>
             </w:r>
@@ -4612,18 +4714,19 @@
         </w:tc>
         <w:tc>
           <w:tcPr>
-            <w:tcW w:type="dxa" w:w="1512"/>
+            <w:tcW w:type="dxa" w:w="1531"/>
             <w:tcBorders>
-              <w:top w:val="single" w:sz="4" w:space="0" w:color="000000"/>
-              <w:left w:val="single" w:sz="4" w:space="0" w:color="000000"/>
-              <w:bottom w:val="single" w:sz="4" w:space="0" w:color="000000"/>
-              <w:right w:val="single" w:sz="4" w:space="0" w:color="000000"/>
+              <w:top w:val="nil" w:sz="0" w:space="0" w:color="auto"/>
+              <w:left w:val="nil" w:sz="0" w:space="0" w:color="auto"/>
+              <w:bottom w:val="single" w:sz="18" w:space="0" w:color="000000"/>
+              <w:right w:val="nil" w:sz="0" w:space="0" w:color="auto"/>
             </w:tcBorders>
           </w:tcPr>
           <w:p>
             <w:pPr>
-              <w:spacing w:line="240" w:lineRule="auto" w:after="40" w:before="40"/>
+              <w:spacing w:line="240" w:lineRule="auto" w:after="0" w:before="0"/>
               <w:ind w:firstLine="0"/>
+              <w:jc w:val="left"/>
             </w:pPr>
             <w:r/>
             <w:r>
@@ -4632,7 +4735,7 @@
                 <w:b w:val="0"/>
                 <w:i w:val="0"/>
                 <w:color w:val="000000"/>
-                <w:sz w:val="18"/>
+                <w:sz w:val="20"/>
               </w:rPr>
               <w:t>Shofu, Kyoto</w:t>
             </w:r>
@@ -4643,7 +4746,7 @@
     <w:p>
       <w:pPr>
         <w:widowControl/>
-        <w:spacing w:before="0" w:after="120" w:lineRule="auto" w:line="240"/>
+        <w:spacing w:before="0" w:after="160" w:lineRule="auto" w:line="240"/>
         <w:ind w:firstLine="0"/>
         <w:jc w:val="both"/>
       </w:pPr>
@@ -5188,16 +5291,17 @@
     </w:p>
     <w:p>
       <w:pPr>
+        <w:keepNext/>
         <w:widowControl/>
-        <w:spacing w:before="120" w:after="120" w:line="480" w:lineRule="auto"/>
+        <w:spacing w:before="200" w:after="120" w:lineRule="auto" w:line="276"/>
         <w:ind w:firstLine="0"/>
-        <w:jc w:val="both"/>
+        <w:jc w:val="left"/>
       </w:pPr>
       <w:r>
         <w:rPr>
           <w:rFonts w:ascii="Times New Roman" w:hAnsi="Times New Roman" w:eastAsia="Times New Roman"/>
           <w:b/>
-          <w:i/>
+          <w:i w:val="0"/>
           <w:color w:val="000000"/>
           <w:sz w:val="24"/>
         </w:rPr>
@@ -5207,7 +5311,7 @@
         <w:rPr>
           <w:rFonts w:ascii="Times New Roman" w:hAnsi="Times New Roman" w:eastAsia="Times New Roman"/>
           <w:b w:val="0"/>
-          <w:i/>
+          <w:i w:val="0"/>
           <w:color w:val="000000"/>
           <w:sz w:val="24"/>
         </w:rPr>
@@ -5218,7 +5322,7 @@
       <w:tblPr>
         <w:tblW w:type="auto" w:w="0"/>
         <w:jc w:val="center"/>
-        <w:tblLayout w:type="autofit"/>
+        <w:tblLayout w:type="fixed"/>
         <w:tblLook w:firstColumn="1" w:firstRow="1" w:lastColumn="0" w:lastRow="0" w:noHBand="0" w:noVBand="1" w:val="04A0"/>
       </w:tblPr>
       <w:tblGrid>
@@ -5231,19 +5335,19 @@
       <w:tr>
         <w:tc>
           <w:tcPr>
-            <w:tcW w:type="dxa" w:w="1814"/>
+            <w:tcW w:type="dxa" w:w="2268"/>
             <w:tcBorders>
-              <w:top w:val="single" w:sz="4" w:space="0" w:color="000000"/>
-              <w:left w:val="single" w:sz="4" w:space="0" w:color="000000"/>
-              <w:bottom w:val="single" w:sz="4" w:space="0" w:color="000000"/>
-              <w:right w:val="single" w:sz="4" w:space="0" w:color="000000"/>
+              <w:top w:val="single" w:sz="18" w:space="0" w:color="000000"/>
+              <w:left w:val="nil" w:sz="0" w:space="0" w:color="auto"/>
+              <w:bottom w:val="single" w:sz="8" w:space="0" w:color="000000"/>
+              <w:right w:val="nil" w:sz="0" w:space="0" w:color="auto"/>
             </w:tcBorders>
-            <w:shd w:fill="E8E8E8" w:val="clear"/>
           </w:tcPr>
           <w:p>
             <w:pPr>
-              <w:spacing w:line="240" w:lineRule="auto" w:after="40" w:before="40"/>
+              <w:spacing w:line="240" w:lineRule="auto" w:after="0" w:before="0"/>
               <w:ind w:firstLine="0"/>
+              <w:jc w:val="left"/>
             </w:pPr>
             <w:r/>
             <w:r>
@@ -5252,7 +5356,7 @@
                 <w:b/>
                 <w:i w:val="0"/>
                 <w:color w:val="000000"/>
-                <w:sz w:val="18"/>
+                <w:sz w:val="20"/>
               </w:rPr>
               <w:t>Composite resin</w:t>
             </w:r>
@@ -5260,19 +5364,19 @@
         </w:tc>
         <w:tc>
           <w:tcPr>
-            <w:tcW w:type="dxa" w:w="1814"/>
+            <w:tcW w:type="dxa" w:w="1757"/>
             <w:tcBorders>
-              <w:top w:val="single" w:sz="4" w:space="0" w:color="000000"/>
-              <w:left w:val="single" w:sz="4" w:space="0" w:color="000000"/>
-              <w:bottom w:val="single" w:sz="4" w:space="0" w:color="000000"/>
-              <w:right w:val="single" w:sz="4" w:space="0" w:color="000000"/>
+              <w:top w:val="single" w:sz="18" w:space="0" w:color="000000"/>
+              <w:left w:val="nil" w:sz="0" w:space="0" w:color="auto"/>
+              <w:bottom w:val="single" w:sz="8" w:space="0" w:color="000000"/>
+              <w:right w:val="nil" w:sz="0" w:space="0" w:color="auto"/>
             </w:tcBorders>
-            <w:shd w:fill="E8E8E8" w:val="clear"/>
           </w:tcPr>
           <w:p>
             <w:pPr>
-              <w:spacing w:line="240" w:lineRule="auto" w:after="40" w:before="40"/>
+              <w:spacing w:line="240" w:lineRule="auto" w:after="0" w:before="0"/>
               <w:ind w:firstLine="0"/>
+              <w:jc w:val="center"/>
             </w:pPr>
             <w:r/>
             <w:r>
@@ -5281,27 +5385,44 @@
                 <w:b/>
                 <w:i w:val="0"/>
                 <w:color w:val="000000"/>
-                <w:sz w:val="18"/>
+                <w:sz w:val="20"/>
               </w:rPr>
-              <w:t>Weight before (g) Mean ± SD</w:t>
+              <w:t>Weight before (g)</w:t>
+            </w:r>
+          </w:p>
+          <w:p>
+            <w:pPr>
+              <w:spacing w:line="240" w:lineRule="auto" w:after="0" w:before="0"/>
+              <w:ind w:firstLine="0"/>
+              <w:jc w:val="center"/>
+            </w:pPr>
+            <w:r>
+              <w:rPr>
+                <w:rFonts w:ascii="Times New Roman" w:hAnsi="Times New Roman" w:eastAsia="Times New Roman"/>
+                <w:b/>
+                <w:i w:val="0"/>
+                <w:color w:val="000000"/>
+                <w:sz w:val="20"/>
+              </w:rPr>
+              <w:t>Mean ± SD</w:t>
             </w:r>
           </w:p>
         </w:tc>
         <w:tc>
           <w:tcPr>
-            <w:tcW w:type="dxa" w:w="1814"/>
+            <w:tcW w:type="dxa" w:w="1757"/>
             <w:tcBorders>
-              <w:top w:val="single" w:sz="4" w:space="0" w:color="000000"/>
-              <w:left w:val="single" w:sz="4" w:space="0" w:color="000000"/>
-              <w:bottom w:val="single" w:sz="4" w:space="0" w:color="000000"/>
-              <w:right w:val="single" w:sz="4" w:space="0" w:color="000000"/>
+              <w:top w:val="single" w:sz="18" w:space="0" w:color="000000"/>
+              <w:left w:val="nil" w:sz="0" w:space="0" w:color="auto"/>
+              <w:bottom w:val="single" w:sz="8" w:space="0" w:color="000000"/>
+              <w:right w:val="nil" w:sz="0" w:space="0" w:color="auto"/>
             </w:tcBorders>
-            <w:shd w:fill="E8E8E8" w:val="clear"/>
           </w:tcPr>
           <w:p>
             <w:pPr>
-              <w:spacing w:line="240" w:lineRule="auto" w:after="40" w:before="40"/>
+              <w:spacing w:line="240" w:lineRule="auto" w:after="0" w:before="0"/>
               <w:ind w:firstLine="0"/>
+              <w:jc w:val="center"/>
             </w:pPr>
             <w:r/>
             <w:r>
@@ -5310,27 +5431,44 @@
                 <w:b/>
                 <w:i w:val="0"/>
                 <w:color w:val="000000"/>
-                <w:sz w:val="18"/>
+                <w:sz w:val="20"/>
               </w:rPr>
-              <w:t>Weight after (g) Mean ± SD</w:t>
+              <w:t>Weight after (g)</w:t>
+            </w:r>
+          </w:p>
+          <w:p>
+            <w:pPr>
+              <w:spacing w:line="240" w:lineRule="auto" w:after="0" w:before="0"/>
+              <w:ind w:firstLine="0"/>
+              <w:jc w:val="center"/>
+            </w:pPr>
+            <w:r>
+              <w:rPr>
+                <w:rFonts w:ascii="Times New Roman" w:hAnsi="Times New Roman" w:eastAsia="Times New Roman"/>
+                <w:b/>
+                <w:i w:val="0"/>
+                <w:color w:val="000000"/>
+                <w:sz w:val="20"/>
+              </w:rPr>
+              <w:t>Mean ± SD</w:t>
             </w:r>
           </w:p>
         </w:tc>
         <w:tc>
           <w:tcPr>
-            <w:tcW w:type="dxa" w:w="1814"/>
+            <w:tcW w:type="dxa" w:w="1757"/>
             <w:tcBorders>
-              <w:top w:val="single" w:sz="4" w:space="0" w:color="000000"/>
-              <w:left w:val="single" w:sz="4" w:space="0" w:color="000000"/>
-              <w:bottom w:val="single" w:sz="4" w:space="0" w:color="000000"/>
-              <w:right w:val="single" w:sz="4" w:space="0" w:color="000000"/>
+              <w:top w:val="single" w:sz="18" w:space="0" w:color="000000"/>
+              <w:left w:val="nil" w:sz="0" w:space="0" w:color="auto"/>
+              <w:bottom w:val="single" w:sz="8" w:space="0" w:color="000000"/>
+              <w:right w:val="nil" w:sz="0" w:space="0" w:color="auto"/>
             </w:tcBorders>
-            <w:shd w:fill="E8E8E8" w:val="clear"/>
           </w:tcPr>
           <w:p>
             <w:pPr>
-              <w:spacing w:line="240" w:lineRule="auto" w:after="40" w:before="40"/>
+              <w:spacing w:line="240" w:lineRule="auto" w:after="0" w:before="0"/>
               <w:ind w:firstLine="0"/>
+              <w:jc w:val="center"/>
             </w:pPr>
             <w:r/>
             <w:r>
@@ -5339,27 +5477,44 @@
                 <w:b/>
                 <w:i w:val="0"/>
                 <w:color w:val="000000"/>
-                <w:sz w:val="18"/>
+                <w:sz w:val="20"/>
               </w:rPr>
-              <w:t>Weight loss (%) Mean ± SD</w:t>
+              <w:t>Weight loss (%)</w:t>
+            </w:r>
+          </w:p>
+          <w:p>
+            <w:pPr>
+              <w:spacing w:line="240" w:lineRule="auto" w:after="0" w:before="0"/>
+              <w:ind w:firstLine="0"/>
+              <w:jc w:val="center"/>
+            </w:pPr>
+            <w:r>
+              <w:rPr>
+                <w:rFonts w:ascii="Times New Roman" w:hAnsi="Times New Roman" w:eastAsia="Times New Roman"/>
+                <w:b/>
+                <w:i w:val="0"/>
+                <w:color w:val="000000"/>
+                <w:sz w:val="20"/>
+              </w:rPr>
+              <w:t>Mean ± SD</w:t>
             </w:r>
           </w:p>
         </w:tc>
         <w:tc>
           <w:tcPr>
-            <w:tcW w:type="dxa" w:w="1814"/>
+            <w:tcW w:type="dxa" w:w="1417"/>
             <w:tcBorders>
-              <w:top w:val="single" w:sz="4" w:space="0" w:color="000000"/>
-              <w:left w:val="single" w:sz="4" w:space="0" w:color="000000"/>
-              <w:bottom w:val="single" w:sz="4" w:space="0" w:color="000000"/>
-              <w:right w:val="single" w:sz="4" w:space="0" w:color="000000"/>
+              <w:top w:val="single" w:sz="18" w:space="0" w:color="000000"/>
+              <w:left w:val="nil" w:sz="0" w:space="0" w:color="auto"/>
+              <w:bottom w:val="single" w:sz="8" w:space="0" w:color="000000"/>
+              <w:right w:val="nil" w:sz="0" w:space="0" w:color="auto"/>
             </w:tcBorders>
-            <w:shd w:fill="E8E8E8" w:val="clear"/>
           </w:tcPr>
           <w:p>
             <w:pPr>
-              <w:spacing w:line="240" w:lineRule="auto" w:after="40" w:before="40"/>
+              <w:spacing w:line="240" w:lineRule="auto" w:after="0" w:before="0"/>
               <w:ind w:firstLine="0"/>
+              <w:jc w:val="center"/>
             </w:pPr>
             <w:r/>
             <w:r>
@@ -5368,7 +5523,7 @@
                 <w:b/>
                 <w:i w:val="0"/>
                 <w:color w:val="000000"/>
-                <w:sz w:val="18"/>
+                <w:sz w:val="20"/>
               </w:rPr>
               <w:t>p-value</w:t>
             </w:r>
@@ -5378,18 +5533,19 @@
       <w:tr>
         <w:tc>
           <w:tcPr>
-            <w:tcW w:type="dxa" w:w="1814"/>
+            <w:tcW w:type="dxa" w:w="2268"/>
             <w:tcBorders>
-              <w:top w:val="single" w:sz="4" w:space="0" w:color="000000"/>
-              <w:left w:val="single" w:sz="4" w:space="0" w:color="000000"/>
-              <w:bottom w:val="single" w:sz="4" w:space="0" w:color="000000"/>
-              <w:right w:val="single" w:sz="4" w:space="0" w:color="000000"/>
+              <w:top w:val="nil" w:sz="0" w:space="0" w:color="auto"/>
+              <w:left w:val="nil" w:sz="0" w:space="0" w:color="auto"/>
+              <w:bottom w:val="nil" w:sz="0" w:space="0" w:color="auto"/>
+              <w:right w:val="nil" w:sz="0" w:space="0" w:color="auto"/>
             </w:tcBorders>
           </w:tcPr>
           <w:p>
             <w:pPr>
-              <w:spacing w:line="240" w:lineRule="auto" w:after="40" w:before="40"/>
+              <w:spacing w:line="240" w:lineRule="auto" w:after="0" w:before="0"/>
               <w:ind w:firstLine="0"/>
+              <w:jc w:val="left"/>
             </w:pPr>
             <w:r/>
             <w:r>
@@ -5398,7 +5554,7 @@
                 <w:b w:val="0"/>
                 <w:i w:val="0"/>
                 <w:color w:val="000000"/>
-                <w:sz w:val="18"/>
+                <w:sz w:val="20"/>
               </w:rPr>
               <w:t>Beautifil Flow Plus X F00</w:t>
             </w:r>
@@ -5406,18 +5562,19 @@
         </w:tc>
         <w:tc>
           <w:tcPr>
-            <w:tcW w:type="dxa" w:w="1814"/>
+            <w:tcW w:type="dxa" w:w="1757"/>
             <w:tcBorders>
-              <w:top w:val="single" w:sz="4" w:space="0" w:color="000000"/>
-              <w:left w:val="single" w:sz="4" w:space="0" w:color="000000"/>
-              <w:bottom w:val="single" w:sz="4" w:space="0" w:color="000000"/>
-              <w:right w:val="single" w:sz="4" w:space="0" w:color="000000"/>
+              <w:top w:val="nil" w:sz="0" w:space="0" w:color="auto"/>
+              <w:left w:val="nil" w:sz="0" w:space="0" w:color="auto"/>
+              <w:bottom w:val="nil" w:sz="0" w:space="0" w:color="auto"/>
+              <w:right w:val="nil" w:sz="0" w:space="0" w:color="auto"/>
             </w:tcBorders>
           </w:tcPr>
           <w:p>
             <w:pPr>
-              <w:spacing w:line="240" w:lineRule="auto" w:after="40" w:before="40"/>
+              <w:spacing w:line="240" w:lineRule="auto" w:after="0" w:before="0"/>
               <w:ind w:firstLine="0"/>
+              <w:jc w:val="center"/>
             </w:pPr>
             <w:r/>
             <w:r>
@@ -5426,7 +5583,7 @@
                 <w:b w:val="0"/>
                 <w:i w:val="0"/>
                 <w:color w:val="000000"/>
-                <w:sz w:val="18"/>
+                <w:sz w:val="20"/>
               </w:rPr>
               <w:t>0.1602 ± 0.0074</w:t>
             </w:r>
@@ -5434,18 +5591,19 @@
         </w:tc>
         <w:tc>
           <w:tcPr>
-            <w:tcW w:type="dxa" w:w="1814"/>
+            <w:tcW w:type="dxa" w:w="1757"/>
             <w:tcBorders>
-              <w:top w:val="single" w:sz="4" w:space="0" w:color="000000"/>
-              <w:left w:val="single" w:sz="4" w:space="0" w:color="000000"/>
-              <w:bottom w:val="single" w:sz="4" w:space="0" w:color="000000"/>
-              <w:right w:val="single" w:sz="4" w:space="0" w:color="000000"/>
+              <w:top w:val="nil" w:sz="0" w:space="0" w:color="auto"/>
+              <w:left w:val="nil" w:sz="0" w:space="0" w:color="auto"/>
+              <w:bottom w:val="nil" w:sz="0" w:space="0" w:color="auto"/>
+              <w:right w:val="nil" w:sz="0" w:space="0" w:color="auto"/>
             </w:tcBorders>
           </w:tcPr>
           <w:p>
             <w:pPr>
-              <w:spacing w:line="240" w:lineRule="auto" w:after="40" w:before="40"/>
+              <w:spacing w:line="240" w:lineRule="auto" w:after="0" w:before="0"/>
               <w:ind w:firstLine="0"/>
+              <w:jc w:val="center"/>
             </w:pPr>
             <w:r/>
             <w:r>
@@ -5454,7 +5612,7 @@
                 <w:b w:val="0"/>
                 <w:i w:val="0"/>
                 <w:color w:val="000000"/>
-                <w:sz w:val="18"/>
+                <w:sz w:val="20"/>
               </w:rPr>
               <w:t>0.1576 ± 0.0031</w:t>
             </w:r>
@@ -5462,18 +5620,19 @@
         </w:tc>
         <w:tc>
           <w:tcPr>
-            <w:tcW w:type="dxa" w:w="1814"/>
+            <w:tcW w:type="dxa" w:w="1757"/>
             <w:tcBorders>
-              <w:top w:val="single" w:sz="4" w:space="0" w:color="000000"/>
-              <w:left w:val="single" w:sz="4" w:space="0" w:color="000000"/>
-              <w:bottom w:val="single" w:sz="4" w:space="0" w:color="000000"/>
-              <w:right w:val="single" w:sz="4" w:space="0" w:color="000000"/>
+              <w:top w:val="nil" w:sz="0" w:space="0" w:color="auto"/>
+              <w:left w:val="nil" w:sz="0" w:space="0" w:color="auto"/>
+              <w:bottom w:val="nil" w:sz="0" w:space="0" w:color="auto"/>
+              <w:right w:val="nil" w:sz="0" w:space="0" w:color="auto"/>
             </w:tcBorders>
           </w:tcPr>
           <w:p>
             <w:pPr>
-              <w:spacing w:line="240" w:lineRule="auto" w:after="40" w:before="40"/>
+              <w:spacing w:line="240" w:lineRule="auto" w:after="0" w:before="0"/>
               <w:ind w:firstLine="0"/>
+              <w:jc w:val="center"/>
             </w:pPr>
             <w:r/>
             <w:r>
@@ -5482,7 +5641,7 @@
                 <w:b w:val="0"/>
                 <w:i w:val="0"/>
                 <w:color w:val="000000"/>
-                <w:sz w:val="18"/>
+                <w:sz w:val="20"/>
               </w:rPr>
               <w:t>1.49 ± 3.14</w:t>
             </w:r>
@@ -5490,18 +5649,20 @@
         </w:tc>
         <w:tc>
           <w:tcPr>
-            <w:tcW w:type="dxa" w:w="1814"/>
+            <w:tcW w:type="dxa" w:w="1417"/>
+            <w:vMerge w:val="restart"/>
             <w:tcBorders>
-              <w:top w:val="single" w:sz="4" w:space="0" w:color="000000"/>
-              <w:left w:val="single" w:sz="4" w:space="0" w:color="000000"/>
-              <w:bottom w:val="single" w:sz="4" w:space="0" w:color="000000"/>
-              <w:right w:val="single" w:sz="4" w:space="0" w:color="000000"/>
+              <w:top w:val="nil" w:sz="0" w:space="0" w:color="auto"/>
+              <w:left w:val="nil" w:sz="0" w:space="0" w:color="auto"/>
+              <w:bottom w:val="single" w:sz="18" w:space="0" w:color="000000"/>
+              <w:right w:val="nil" w:sz="0" w:space="0" w:color="auto"/>
             </w:tcBorders>
           </w:tcPr>
           <w:p>
             <w:pPr>
-              <w:spacing w:line="240" w:lineRule="auto" w:after="40" w:before="40"/>
+              <w:spacing w:line="240" w:lineRule="auto" w:after="0" w:before="0"/>
               <w:ind w:firstLine="0"/>
+              <w:jc w:val="center"/>
             </w:pPr>
             <w:r/>
             <w:r>
@@ -5510,148 +5671,7 @@
                 <w:b w:val="0"/>
                 <w:i w:val="0"/>
                 <w:color w:val="000000"/>
-                <w:sz w:val="18"/>
-              </w:rPr>
-            </w:r>
-          </w:p>
-        </w:tc>
-      </w:tr>
-      <w:tr>
-        <w:tc>
-          <w:tcPr>
-            <w:tcW w:type="dxa" w:w="1814"/>
-            <w:tcBorders>
-              <w:top w:val="single" w:sz="4" w:space="0" w:color="000000"/>
-              <w:left w:val="single" w:sz="4" w:space="0" w:color="000000"/>
-              <w:bottom w:val="single" w:sz="4" w:space="0" w:color="000000"/>
-              <w:right w:val="single" w:sz="4" w:space="0" w:color="000000"/>
-            </w:tcBorders>
-          </w:tcPr>
-          <w:p>
-            <w:pPr>
-              <w:spacing w:line="240" w:lineRule="auto" w:after="40" w:before="40"/>
-              <w:ind w:firstLine="0"/>
-            </w:pPr>
-            <w:r/>
-            <w:r>
-              <w:rPr>
-                <w:rFonts w:ascii="Times New Roman" w:hAnsi="Times New Roman" w:eastAsia="Times New Roman"/>
-                <w:b w:val="0"/>
-                <w:i w:val="0"/>
-                <w:color w:val="000000"/>
-                <w:sz w:val="18"/>
-              </w:rPr>
-              <w:t>G-ænial Universal Injectable</w:t>
-            </w:r>
-          </w:p>
-        </w:tc>
-        <w:tc>
-          <w:tcPr>
-            <w:tcW w:type="dxa" w:w="1814"/>
-            <w:tcBorders>
-              <w:top w:val="single" w:sz="4" w:space="0" w:color="000000"/>
-              <w:left w:val="single" w:sz="4" w:space="0" w:color="000000"/>
-              <w:bottom w:val="single" w:sz="4" w:space="0" w:color="000000"/>
-              <w:right w:val="single" w:sz="4" w:space="0" w:color="000000"/>
-            </w:tcBorders>
-          </w:tcPr>
-          <w:p>
-            <w:pPr>
-              <w:spacing w:line="240" w:lineRule="auto" w:after="40" w:before="40"/>
-              <w:ind w:firstLine="0"/>
-            </w:pPr>
-            <w:r/>
-            <w:r>
-              <w:rPr>
-                <w:rFonts w:ascii="Times New Roman" w:hAnsi="Times New Roman" w:eastAsia="Times New Roman"/>
-                <w:b w:val="0"/>
-                <w:i w:val="0"/>
-                <w:color w:val="000000"/>
-                <w:sz w:val="18"/>
-              </w:rPr>
-              <w:t>0.1630 ± 0.0102</w:t>
-            </w:r>
-          </w:p>
-        </w:tc>
-        <w:tc>
-          <w:tcPr>
-            <w:tcW w:type="dxa" w:w="1814"/>
-            <w:tcBorders>
-              <w:top w:val="single" w:sz="4" w:space="0" w:color="000000"/>
-              <w:left w:val="single" w:sz="4" w:space="0" w:color="000000"/>
-              <w:bottom w:val="single" w:sz="4" w:space="0" w:color="000000"/>
-              <w:right w:val="single" w:sz="4" w:space="0" w:color="000000"/>
-            </w:tcBorders>
-          </w:tcPr>
-          <w:p>
-            <w:pPr>
-              <w:spacing w:line="240" w:lineRule="auto" w:after="40" w:before="40"/>
-              <w:ind w:firstLine="0"/>
-            </w:pPr>
-            <w:r/>
-            <w:r>
-              <w:rPr>
-                <w:rFonts w:ascii="Times New Roman" w:hAnsi="Times New Roman" w:eastAsia="Times New Roman"/>
-                <w:b w:val="0"/>
-                <w:i w:val="0"/>
-                <w:color w:val="000000"/>
-                <w:sz w:val="18"/>
-              </w:rPr>
-              <w:t>0.1619 ± 0.0106</w:t>
-            </w:r>
-          </w:p>
-        </w:tc>
-        <w:tc>
-          <w:tcPr>
-            <w:tcW w:type="dxa" w:w="1814"/>
-            <w:tcBorders>
-              <w:top w:val="single" w:sz="4" w:space="0" w:color="000000"/>
-              <w:left w:val="single" w:sz="4" w:space="0" w:color="000000"/>
-              <w:bottom w:val="single" w:sz="4" w:space="0" w:color="000000"/>
-              <w:right w:val="single" w:sz="4" w:space="0" w:color="000000"/>
-            </w:tcBorders>
-          </w:tcPr>
-          <w:p>
-            <w:pPr>
-              <w:spacing w:line="240" w:lineRule="auto" w:after="40" w:before="40"/>
-              <w:ind w:firstLine="0"/>
-            </w:pPr>
-            <w:r/>
-            <w:r>
-              <w:rPr>
-                <w:rFonts w:ascii="Times New Roman" w:hAnsi="Times New Roman" w:eastAsia="Times New Roman"/>
-                <w:b w:val="0"/>
-                <w:i w:val="0"/>
-                <w:color w:val="000000"/>
-                <w:sz w:val="18"/>
-              </w:rPr>
-              <w:t>0.65 ± 0.37</w:t>
-            </w:r>
-          </w:p>
-        </w:tc>
-        <w:tc>
-          <w:tcPr>
-            <w:tcW w:type="dxa" w:w="1814"/>
-            <w:tcBorders>
-              <w:top w:val="single" w:sz="4" w:space="0" w:color="000000"/>
-              <w:left w:val="single" w:sz="4" w:space="0" w:color="000000"/>
-              <w:bottom w:val="single" w:sz="4" w:space="0" w:color="000000"/>
-              <w:right w:val="single" w:sz="4" w:space="0" w:color="000000"/>
-            </w:tcBorders>
-          </w:tcPr>
-          <w:p>
-            <w:pPr>
-              <w:spacing w:line="240" w:lineRule="auto" w:after="40" w:before="40"/>
-              <w:ind w:firstLine="0"/>
-            </w:pPr>
-            <w:r/>
-            <w:r>
-              <w:rPr>
-                <w:rFonts w:ascii="Times New Roman" w:hAnsi="Times New Roman" w:eastAsia="Times New Roman"/>
-                <w:b w:val="0"/>
-                <w:i w:val="0"/>
-                <w:color w:val="000000"/>
-                <w:sz w:val="18"/>
+                <w:sz w:val="20"/>
               </w:rPr>
               <w:t>0.329†</w:t>
             </w:r>
@@ -5661,18 +5681,19 @@
       <w:tr>
         <w:tc>
           <w:tcPr>
-            <w:tcW w:type="dxa" w:w="1814"/>
+            <w:tcW w:type="dxa" w:w="2268"/>
             <w:tcBorders>
-              <w:top w:val="single" w:sz="4" w:space="0" w:color="000000"/>
-              <w:left w:val="single" w:sz="4" w:space="0" w:color="000000"/>
-              <w:bottom w:val="single" w:sz="4" w:space="0" w:color="000000"/>
-              <w:right w:val="single" w:sz="4" w:space="0" w:color="000000"/>
+              <w:top w:val="nil" w:sz="0" w:space="0" w:color="auto"/>
+              <w:left w:val="nil" w:sz="0" w:space="0" w:color="auto"/>
+              <w:bottom w:val="nil" w:sz="0" w:space="0" w:color="auto"/>
+              <w:right w:val="nil" w:sz="0" w:space="0" w:color="auto"/>
             </w:tcBorders>
           </w:tcPr>
           <w:p>
             <w:pPr>
-              <w:spacing w:line="240" w:lineRule="auto" w:after="40" w:before="40"/>
+              <w:spacing w:line="240" w:lineRule="auto" w:after="0" w:before="0"/>
               <w:ind w:firstLine="0"/>
+              <w:jc w:val="left"/>
             </w:pPr>
             <w:r/>
             <w:r>
@@ -5681,26 +5702,27 @@
                 <w:b w:val="0"/>
                 <w:i w:val="0"/>
                 <w:color w:val="000000"/>
-                <w:sz w:val="18"/>
+                <w:sz w:val="20"/>
               </w:rPr>
-              <w:t>Beautifil II LS</w:t>
+              <w:t>G-ænial Universal Injectable</w:t>
             </w:r>
           </w:p>
         </w:tc>
         <w:tc>
           <w:tcPr>
-            <w:tcW w:type="dxa" w:w="1814"/>
+            <w:tcW w:type="dxa" w:w="1757"/>
             <w:tcBorders>
-              <w:top w:val="single" w:sz="4" w:space="0" w:color="000000"/>
-              <w:left w:val="single" w:sz="4" w:space="0" w:color="000000"/>
-              <w:bottom w:val="single" w:sz="4" w:space="0" w:color="000000"/>
-              <w:right w:val="single" w:sz="4" w:space="0" w:color="000000"/>
+              <w:top w:val="nil" w:sz="0" w:space="0" w:color="auto"/>
+              <w:left w:val="nil" w:sz="0" w:space="0" w:color="auto"/>
+              <w:bottom w:val="nil" w:sz="0" w:space="0" w:color="auto"/>
+              <w:right w:val="nil" w:sz="0" w:space="0" w:color="auto"/>
             </w:tcBorders>
           </w:tcPr>
           <w:p>
             <w:pPr>
-              <w:spacing w:line="240" w:lineRule="auto" w:after="40" w:before="40"/>
+              <w:spacing w:line="240" w:lineRule="auto" w:after="0" w:before="0"/>
               <w:ind w:firstLine="0"/>
+              <w:jc w:val="center"/>
             </w:pPr>
             <w:r/>
             <w:r>
@@ -5709,26 +5731,27 @@
                 <w:b w:val="0"/>
                 <w:i w:val="0"/>
                 <w:color w:val="000000"/>
-                <w:sz w:val="18"/>
+                <w:sz w:val="20"/>
               </w:rPr>
-              <w:t>0.2313 ± 0.0154</w:t>
+              <w:t>0.1630 ± 0.0102</w:t>
             </w:r>
           </w:p>
         </w:tc>
         <w:tc>
           <w:tcPr>
-            <w:tcW w:type="dxa" w:w="1814"/>
+            <w:tcW w:type="dxa" w:w="1757"/>
             <w:tcBorders>
-              <w:top w:val="single" w:sz="4" w:space="0" w:color="000000"/>
-              <w:left w:val="single" w:sz="4" w:space="0" w:color="000000"/>
-              <w:bottom w:val="single" w:sz="4" w:space="0" w:color="000000"/>
-              <w:right w:val="single" w:sz="4" w:space="0" w:color="000000"/>
+              <w:top w:val="nil" w:sz="0" w:space="0" w:color="auto"/>
+              <w:left w:val="nil" w:sz="0" w:space="0" w:color="auto"/>
+              <w:bottom w:val="nil" w:sz="0" w:space="0" w:color="auto"/>
+              <w:right w:val="nil" w:sz="0" w:space="0" w:color="auto"/>
             </w:tcBorders>
           </w:tcPr>
           <w:p>
             <w:pPr>
-              <w:spacing w:line="240" w:lineRule="auto" w:after="40" w:before="40"/>
+              <w:spacing w:line="240" w:lineRule="auto" w:after="0" w:before="0"/>
               <w:ind w:firstLine="0"/>
+              <w:jc w:val="center"/>
             </w:pPr>
             <w:r/>
             <w:r>
@@ -5737,26 +5760,27 @@
                 <w:b w:val="0"/>
                 <w:i w:val="0"/>
                 <w:color w:val="000000"/>
-                <w:sz w:val="18"/>
+                <w:sz w:val="20"/>
               </w:rPr>
-              <w:t>0.2303 ± 0.0156</w:t>
+              <w:t>0.1619 ± 0.0106</w:t>
             </w:r>
           </w:p>
         </w:tc>
         <w:tc>
           <w:tcPr>
-            <w:tcW w:type="dxa" w:w="1814"/>
+            <w:tcW w:type="dxa" w:w="1757"/>
             <w:tcBorders>
-              <w:top w:val="single" w:sz="4" w:space="0" w:color="000000"/>
-              <w:left w:val="single" w:sz="4" w:space="0" w:color="000000"/>
-              <w:bottom w:val="single" w:sz="4" w:space="0" w:color="000000"/>
-              <w:right w:val="single" w:sz="4" w:space="0" w:color="000000"/>
+              <w:top w:val="nil" w:sz="0" w:space="0" w:color="auto"/>
+              <w:left w:val="nil" w:sz="0" w:space="0" w:color="auto"/>
+              <w:bottom w:val="nil" w:sz="0" w:space="0" w:color="auto"/>
+              <w:right w:val="nil" w:sz="0" w:space="0" w:color="auto"/>
             </w:tcBorders>
           </w:tcPr>
           <w:p>
             <w:pPr>
-              <w:spacing w:line="240" w:lineRule="auto" w:after="40" w:before="40"/>
+              <w:spacing w:line="240" w:lineRule="auto" w:after="0" w:before="0"/>
               <w:ind w:firstLine="0"/>
+              <w:jc w:val="center"/>
             </w:pPr>
             <w:r/>
             <w:r>
@@ -5765,26 +5789,42 @@
                 <w:b w:val="0"/>
                 <w:i w:val="0"/>
                 <w:color w:val="000000"/>
-                <w:sz w:val="18"/>
+                <w:sz w:val="20"/>
               </w:rPr>
-              <w:t>0.41 ± 0.25</w:t>
+              <w:t>0.65 ± 0.37</w:t>
             </w:r>
           </w:p>
         </w:tc>
         <w:tc>
           <w:tcPr>
-            <w:tcW w:type="dxa" w:w="1814"/>
+            <w:tcW w:type="dxa" w:w="1417"/>
+            <w:vMerge/>
             <w:tcBorders>
-              <w:top w:val="single" w:sz="4" w:space="0" w:color="000000"/>
-              <w:left w:val="single" w:sz="4" w:space="0" w:color="000000"/>
-              <w:bottom w:val="single" w:sz="4" w:space="0" w:color="000000"/>
-              <w:right w:val="single" w:sz="4" w:space="0" w:color="000000"/>
+              <w:top w:val="nil" w:sz="0" w:space="0" w:color="auto"/>
+              <w:left w:val="nil" w:sz="0" w:space="0" w:color="auto"/>
+              <w:bottom w:val="nil" w:sz="0" w:space="0" w:color="auto"/>
+              <w:right w:val="nil" w:sz="0" w:space="0" w:color="auto"/>
+            </w:tcBorders>
+          </w:tcPr>
+          <w:p/>
+        </w:tc>
+      </w:tr>
+      <w:tr>
+        <w:tc>
+          <w:tcPr>
+            <w:tcW w:type="dxa" w:w="2268"/>
+            <w:tcBorders>
+              <w:top w:val="nil" w:sz="0" w:space="0" w:color="auto"/>
+              <w:left w:val="nil" w:sz="0" w:space="0" w:color="auto"/>
+              <w:bottom w:val="single" w:sz="18" w:space="0" w:color="000000"/>
+              <w:right w:val="nil" w:sz="0" w:space="0" w:color="auto"/>
             </w:tcBorders>
           </w:tcPr>
           <w:p>
             <w:pPr>
-              <w:spacing w:line="240" w:lineRule="auto" w:after="40" w:before="40"/>
+              <w:spacing w:line="240" w:lineRule="auto" w:after="0" w:before="0"/>
               <w:ind w:firstLine="0"/>
+              <w:jc w:val="left"/>
             </w:pPr>
             <w:r/>
             <w:r>
@@ -5793,17 +5833,118 @@
                 <w:b w:val="0"/>
                 <w:i w:val="0"/>
                 <w:color w:val="000000"/>
-                <w:sz w:val="18"/>
+                <w:sz w:val="20"/>
               </w:rPr>
+              <w:t>Beautifil II LS</w:t>
             </w:r>
           </w:p>
+        </w:tc>
+        <w:tc>
+          <w:tcPr>
+            <w:tcW w:type="dxa" w:w="1757"/>
+            <w:tcBorders>
+              <w:top w:val="nil" w:sz="0" w:space="0" w:color="auto"/>
+              <w:left w:val="nil" w:sz="0" w:space="0" w:color="auto"/>
+              <w:bottom w:val="single" w:sz="18" w:space="0" w:color="000000"/>
+              <w:right w:val="nil" w:sz="0" w:space="0" w:color="auto"/>
+            </w:tcBorders>
+          </w:tcPr>
+          <w:p>
+            <w:pPr>
+              <w:spacing w:line="240" w:lineRule="auto" w:after="0" w:before="0"/>
+              <w:ind w:firstLine="0"/>
+              <w:jc w:val="center"/>
+            </w:pPr>
+            <w:r/>
+            <w:r>
+              <w:rPr>
+                <w:rFonts w:ascii="Times New Roman" w:hAnsi="Times New Roman" w:eastAsia="Times New Roman"/>
+                <w:b w:val="0"/>
+                <w:i w:val="0"/>
+                <w:color w:val="000000"/>
+                <w:sz w:val="20"/>
+              </w:rPr>
+              <w:t>0.2313 ± 0.0154</w:t>
+            </w:r>
+          </w:p>
+        </w:tc>
+        <w:tc>
+          <w:tcPr>
+            <w:tcW w:type="dxa" w:w="1757"/>
+            <w:tcBorders>
+              <w:top w:val="nil" w:sz="0" w:space="0" w:color="auto"/>
+              <w:left w:val="nil" w:sz="0" w:space="0" w:color="auto"/>
+              <w:bottom w:val="single" w:sz="18" w:space="0" w:color="000000"/>
+              <w:right w:val="nil" w:sz="0" w:space="0" w:color="auto"/>
+            </w:tcBorders>
+          </w:tcPr>
+          <w:p>
+            <w:pPr>
+              <w:spacing w:line="240" w:lineRule="auto" w:after="0" w:before="0"/>
+              <w:ind w:firstLine="0"/>
+              <w:jc w:val="center"/>
+            </w:pPr>
+            <w:r/>
+            <w:r>
+              <w:rPr>
+                <w:rFonts w:ascii="Times New Roman" w:hAnsi="Times New Roman" w:eastAsia="Times New Roman"/>
+                <w:b w:val="0"/>
+                <w:i w:val="0"/>
+                <w:color w:val="000000"/>
+                <w:sz w:val="20"/>
+              </w:rPr>
+              <w:t>0.2303 ± 0.0156</w:t>
+            </w:r>
+          </w:p>
+        </w:tc>
+        <w:tc>
+          <w:tcPr>
+            <w:tcW w:type="dxa" w:w="1757"/>
+            <w:tcBorders>
+              <w:top w:val="nil" w:sz="0" w:space="0" w:color="auto"/>
+              <w:left w:val="nil" w:sz="0" w:space="0" w:color="auto"/>
+              <w:bottom w:val="single" w:sz="18" w:space="0" w:color="000000"/>
+              <w:right w:val="nil" w:sz="0" w:space="0" w:color="auto"/>
+            </w:tcBorders>
+          </w:tcPr>
+          <w:p>
+            <w:pPr>
+              <w:spacing w:line="240" w:lineRule="auto" w:after="0" w:before="0"/>
+              <w:ind w:firstLine="0"/>
+              <w:jc w:val="center"/>
+            </w:pPr>
+            <w:r/>
+            <w:r>
+              <w:rPr>
+                <w:rFonts w:ascii="Times New Roman" w:hAnsi="Times New Roman" w:eastAsia="Times New Roman"/>
+                <w:b w:val="0"/>
+                <w:i w:val="0"/>
+                <w:color w:val="000000"/>
+                <w:sz w:val="20"/>
+              </w:rPr>
+              <w:t>0.41 ± 0.25</w:t>
+            </w:r>
+          </w:p>
+        </w:tc>
+        <w:tc>
+          <w:tcPr>
+            <w:tcW w:type="dxa" w:w="1417"/>
+            <w:vMerge/>
+            <w:tcBorders>
+              <w:top w:val="nil" w:sz="0" w:space="0" w:color="auto"/>
+              <w:left w:val="nil" w:sz="0" w:space="0" w:color="auto"/>
+              <w:bottom w:val="single" w:sz="18" w:space="0" w:color="000000"/>
+              <w:right w:val="nil" w:sz="0" w:space="0" w:color="auto"/>
+            </w:tcBorders>
+          </w:tcPr>
+          <w:p/>
         </w:tc>
       </w:tr>
     </w:tbl>
     <w:p>
       <w:pPr>
         <w:widowControl/>
-        <w:spacing w:before="0" w:after="120" w:lineRule="auto" w:line="240"/>
+        <w:spacing w:before="0" w:after="160" w:lineRule="auto" w:line="240"/>
         <w:ind w:firstLine="0"/>
         <w:jc w:val="both"/>
       </w:pPr>
@@ -5870,16 +6011,17 @@
     </w:p>
     <w:p>
       <w:pPr>
+        <w:keepNext/>
         <w:widowControl/>
-        <w:spacing w:before="120" w:after="120" w:line="480" w:lineRule="auto"/>
+        <w:spacing w:before="200" w:after="120" w:lineRule="auto" w:line="276"/>
         <w:ind w:firstLine="0"/>
-        <w:jc w:val="both"/>
+        <w:jc w:val="left"/>
       </w:pPr>
       <w:r>
         <w:rPr>
           <w:rFonts w:ascii="Times New Roman" w:hAnsi="Times New Roman" w:eastAsia="Times New Roman"/>
           <w:b/>
-          <w:i/>
+          <w:i w:val="0"/>
           <w:color w:val="000000"/>
           <w:sz w:val="24"/>
         </w:rPr>
@@ -5889,7 +6031,7 @@
         <w:rPr>
           <w:rFonts w:ascii="Times New Roman" w:hAnsi="Times New Roman" w:eastAsia="Times New Roman"/>
           <w:b w:val="0"/>
-          <w:i/>
+          <w:i w:val="0"/>
           <w:color w:val="000000"/>
           <w:sz w:val="24"/>
         </w:rPr>
@@ -5952,16 +6094,17 @@
     </w:p>
     <w:p>
       <w:pPr>
+        <w:keepNext/>
         <w:widowControl/>
-        <w:spacing w:before="120" w:after="120" w:line="480" w:lineRule="auto"/>
+        <w:spacing w:before="200" w:after="120" w:lineRule="auto" w:line="276"/>
         <w:ind w:firstLine="0"/>
-        <w:jc w:val="both"/>
+        <w:jc w:val="left"/>
       </w:pPr>
       <w:r>
         <w:rPr>
           <w:rFonts w:ascii="Times New Roman" w:hAnsi="Times New Roman" w:eastAsia="Times New Roman"/>
           <w:b/>
-          <w:i/>
+          <w:i w:val="0"/>
           <w:color w:val="000000"/>
           <w:sz w:val="24"/>
         </w:rPr>
@@ -5971,7 +6114,7 @@
         <w:rPr>
           <w:rFonts w:ascii="Times New Roman" w:hAnsi="Times New Roman" w:eastAsia="Times New Roman"/>
           <w:b w:val="0"/>
-          <w:i/>
+          <w:i w:val="0"/>
           <w:color w:val="000000"/>
           <w:sz w:val="24"/>
         </w:rPr>
@@ -5982,7 +6125,7 @@
       <w:tblPr>
         <w:tblW w:type="auto" w:w="0"/>
         <w:jc w:val="center"/>
-        <w:tblLayout w:type="autofit"/>
+        <w:tblLayout w:type="fixed"/>
         <w:tblLook w:firstColumn="1" w:firstRow="1" w:lastColumn="0" w:lastRow="0" w:noHBand="0" w:noVBand="1" w:val="04A0"/>
       </w:tblPr>
       <w:tblGrid>
@@ -5993,19 +6136,19 @@
       <w:tr>
         <w:tc>
           <w:tcPr>
-            <w:tcW w:type="dxa" w:w="3024"/>
+            <w:tcW w:type="dxa" w:w="3515"/>
             <w:tcBorders>
-              <w:top w:val="single" w:sz="4" w:space="0" w:color="000000"/>
-              <w:left w:val="single" w:sz="4" w:space="0" w:color="000000"/>
-              <w:bottom w:val="single" w:sz="4" w:space="0" w:color="000000"/>
-              <w:right w:val="single" w:sz="4" w:space="0" w:color="000000"/>
+              <w:top w:val="single" w:sz="18" w:space="0" w:color="000000"/>
+              <w:left w:val="nil" w:sz="0" w:space="0" w:color="auto"/>
+              <w:bottom w:val="single" w:sz="8" w:space="0" w:color="000000"/>
+              <w:right w:val="nil" w:sz="0" w:space="0" w:color="auto"/>
             </w:tcBorders>
-            <w:shd w:fill="E8E8E8" w:val="clear"/>
           </w:tcPr>
           <w:p>
             <w:pPr>
-              <w:spacing w:line="240" w:lineRule="auto" w:after="40" w:before="40"/>
+              <w:spacing w:line="240" w:lineRule="auto" w:after="0" w:before="0"/>
               <w:ind w:firstLine="0"/>
+              <w:jc w:val="left"/>
             </w:pPr>
             <w:r/>
             <w:r>
@@ -6014,7 +6157,7 @@
                 <w:b/>
                 <w:i w:val="0"/>
                 <w:color w:val="000000"/>
-                <w:sz w:val="18"/>
+                <w:sz w:val="20"/>
               </w:rPr>
               <w:t>Composite resin</w:t>
             </w:r>
@@ -6022,19 +6165,19 @@
         </w:tc>
         <w:tc>
           <w:tcPr>
-            <w:tcW w:type="dxa" w:w="3024"/>
+            <w:tcW w:type="dxa" w:w="3061"/>
             <w:tcBorders>
-              <w:top w:val="single" w:sz="4" w:space="0" w:color="000000"/>
-              <w:left w:val="single" w:sz="4" w:space="0" w:color="000000"/>
-              <w:bottom w:val="single" w:sz="4" w:space="0" w:color="000000"/>
-              <w:right w:val="single" w:sz="4" w:space="0" w:color="000000"/>
+              <w:top w:val="single" w:sz="18" w:space="0" w:color="000000"/>
+              <w:left w:val="nil" w:sz="0" w:space="0" w:color="auto"/>
+              <w:bottom w:val="single" w:sz="8" w:space="0" w:color="000000"/>
+              <w:right w:val="nil" w:sz="0" w:space="0" w:color="auto"/>
             </w:tcBorders>
-            <w:shd w:fill="E8E8E8" w:val="clear"/>
           </w:tcPr>
           <w:p>
             <w:pPr>
-              <w:spacing w:line="240" w:lineRule="auto" w:after="40" w:before="40"/>
+              <w:spacing w:line="240" w:lineRule="auto" w:after="0" w:before="0"/>
               <w:ind w:firstLine="0"/>
+              <w:jc w:val="center"/>
             </w:pPr>
             <w:r/>
             <w:r>
@@ -6043,27 +6186,44 @@
                 <w:b/>
                 <w:i w:val="0"/>
                 <w:color w:val="000000"/>
-                <w:sz w:val="18"/>
+                <w:sz w:val="20"/>
               </w:rPr>
-              <w:t>Absolute weight loss (mg) Mean ± SD</w:t>
+              <w:t>Absolute weight loss (mg)</w:t>
+            </w:r>
+          </w:p>
+          <w:p>
+            <w:pPr>
+              <w:spacing w:line="240" w:lineRule="auto" w:after="0" w:before="0"/>
+              <w:ind w:firstLine="0"/>
+              <w:jc w:val="center"/>
+            </w:pPr>
+            <w:r>
+              <w:rPr>
+                <w:rFonts w:ascii="Times New Roman" w:hAnsi="Times New Roman" w:eastAsia="Times New Roman"/>
+                <w:b/>
+                <w:i w:val="0"/>
+                <w:color w:val="000000"/>
+                <w:sz w:val="20"/>
+              </w:rPr>
+              <w:t>Mean ± SD</w:t>
             </w:r>
           </w:p>
         </w:tc>
         <w:tc>
           <w:tcPr>
-            <w:tcW w:type="dxa" w:w="3024"/>
+            <w:tcW w:type="dxa" w:w="2381"/>
             <w:tcBorders>
-              <w:top w:val="single" w:sz="4" w:space="0" w:color="000000"/>
-              <w:left w:val="single" w:sz="4" w:space="0" w:color="000000"/>
-              <w:bottom w:val="single" w:sz="4" w:space="0" w:color="000000"/>
-              <w:right w:val="single" w:sz="4" w:space="0" w:color="000000"/>
+              <w:top w:val="single" w:sz="18" w:space="0" w:color="000000"/>
+              <w:left w:val="nil" w:sz="0" w:space="0" w:color="auto"/>
+              <w:bottom w:val="single" w:sz="8" w:space="0" w:color="000000"/>
+              <w:right w:val="nil" w:sz="0" w:space="0" w:color="auto"/>
             </w:tcBorders>
-            <w:shd w:fill="E8E8E8" w:val="clear"/>
           </w:tcPr>
           <w:p>
             <w:pPr>
-              <w:spacing w:line="240" w:lineRule="auto" w:after="40" w:before="40"/>
+              <w:spacing w:line="240" w:lineRule="auto" w:after="0" w:before="0"/>
               <w:ind w:firstLine="0"/>
+              <w:jc w:val="center"/>
             </w:pPr>
             <w:r/>
             <w:r>
@@ -6072,7 +6232,7 @@
                 <w:b/>
                 <w:i w:val="0"/>
                 <w:color w:val="000000"/>
-                <w:sz w:val="18"/>
+                <w:sz w:val="20"/>
               </w:rPr>
               <w:t>Range (mg)</w:t>
             </w:r>
@@ -6082,18 +6242,19 @@
       <w:tr>
         <w:tc>
           <w:tcPr>
-            <w:tcW w:type="dxa" w:w="3024"/>
+            <w:tcW w:type="dxa" w:w="3515"/>
             <w:tcBorders>
-              <w:top w:val="single" w:sz="4" w:space="0" w:color="000000"/>
-              <w:left w:val="single" w:sz="4" w:space="0" w:color="000000"/>
-              <w:bottom w:val="single" w:sz="4" w:space="0" w:color="000000"/>
-              <w:right w:val="single" w:sz="4" w:space="0" w:color="000000"/>
+              <w:top w:val="nil" w:sz="0" w:space="0" w:color="auto"/>
+              <w:left w:val="nil" w:sz="0" w:space="0" w:color="auto"/>
+              <w:bottom w:val="nil" w:sz="0" w:space="0" w:color="auto"/>
+              <w:right w:val="nil" w:sz="0" w:space="0" w:color="auto"/>
             </w:tcBorders>
           </w:tcPr>
           <w:p>
             <w:pPr>
-              <w:spacing w:line="240" w:lineRule="auto" w:after="40" w:before="40"/>
+              <w:spacing w:line="240" w:lineRule="auto" w:after="0" w:before="0"/>
               <w:ind w:firstLine="0"/>
+              <w:jc w:val="left"/>
             </w:pPr>
             <w:r/>
             <w:r>
@@ -6102,7 +6263,7 @@
                 <w:b w:val="0"/>
                 <w:i w:val="0"/>
                 <w:color w:val="000000"/>
-                <w:sz w:val="18"/>
+                <w:sz w:val="20"/>
               </w:rPr>
               <w:t>Beautifil Flow Plus X F00</w:t>
             </w:r>
@@ -6110,18 +6271,19 @@
         </w:tc>
         <w:tc>
           <w:tcPr>
-            <w:tcW w:type="dxa" w:w="3024"/>
+            <w:tcW w:type="dxa" w:w="3061"/>
             <w:tcBorders>
-              <w:top w:val="single" w:sz="4" w:space="0" w:color="000000"/>
-              <w:left w:val="single" w:sz="4" w:space="0" w:color="000000"/>
-              <w:bottom w:val="single" w:sz="4" w:space="0" w:color="000000"/>
-              <w:right w:val="single" w:sz="4" w:space="0" w:color="000000"/>
+              <w:top w:val="nil" w:sz="0" w:space="0" w:color="auto"/>
+              <w:left w:val="nil" w:sz="0" w:space="0" w:color="auto"/>
+              <w:bottom w:val="nil" w:sz="0" w:space="0" w:color="auto"/>
+              <w:right w:val="nil" w:sz="0" w:space="0" w:color="auto"/>
             </w:tcBorders>
           </w:tcPr>
           <w:p>
             <w:pPr>
-              <w:spacing w:line="240" w:lineRule="auto" w:after="40" w:before="40"/>
+              <w:spacing w:line="240" w:lineRule="auto" w:after="0" w:before="0"/>
               <w:ind w:firstLine="0"/>
+              <w:jc w:val="center"/>
             </w:pPr>
             <w:r/>
             <w:r>
@@ -6130,7 +6292,7 @@
                 <w:b w:val="0"/>
                 <w:i w:val="0"/>
                 <w:color w:val="000000"/>
-                <w:sz w:val="18"/>
+                <w:sz w:val="20"/>
               </w:rPr>
               <w:t>2.58 ± 5.91</w:t>
             </w:r>
@@ -6138,18 +6300,19 @@
         </w:tc>
         <w:tc>
           <w:tcPr>
-            <w:tcW w:type="dxa" w:w="3024"/>
+            <w:tcW w:type="dxa" w:w="2381"/>
             <w:tcBorders>
-              <w:top w:val="single" w:sz="4" w:space="0" w:color="000000"/>
-              <w:left w:val="single" w:sz="4" w:space="0" w:color="000000"/>
-              <w:bottom w:val="single" w:sz="4" w:space="0" w:color="000000"/>
-              <w:right w:val="single" w:sz="4" w:space="0" w:color="000000"/>
+              <w:top w:val="nil" w:sz="0" w:space="0" w:color="auto"/>
+              <w:left w:val="nil" w:sz="0" w:space="0" w:color="auto"/>
+              <w:bottom w:val="nil" w:sz="0" w:space="0" w:color="auto"/>
+              <w:right w:val="nil" w:sz="0" w:space="0" w:color="auto"/>
             </w:tcBorders>
           </w:tcPr>
           <w:p>
             <w:pPr>
-              <w:spacing w:line="240" w:lineRule="auto" w:after="40" w:before="40"/>
+              <w:spacing w:line="240" w:lineRule="auto" w:after="0" w:before="0"/>
               <w:ind w:firstLine="0"/>
+              <w:jc w:val="center"/>
             </w:pPr>
             <w:r/>
             <w:r>
@@ -6158,7 +6321,7 @@
                 <w:b w:val="0"/>
                 <w:i w:val="0"/>
                 <w:color w:val="000000"/>
-                <w:sz w:val="18"/>
+                <w:sz w:val="20"/>
               </w:rPr>
               <w:t>0.2 – 20.7</w:t>
             </w:r>
@@ -6168,18 +6331,19 @@
       <w:tr>
         <w:tc>
           <w:tcPr>
-            <w:tcW w:type="dxa" w:w="3024"/>
+            <w:tcW w:type="dxa" w:w="3515"/>
             <w:tcBorders>
-              <w:top w:val="single" w:sz="4" w:space="0" w:color="000000"/>
-              <w:left w:val="single" w:sz="4" w:space="0" w:color="000000"/>
-              <w:bottom w:val="single" w:sz="4" w:space="0" w:color="000000"/>
-              <w:right w:val="single" w:sz="4" w:space="0" w:color="000000"/>
+              <w:top w:val="nil" w:sz="0" w:space="0" w:color="auto"/>
+              <w:left w:val="nil" w:sz="0" w:space="0" w:color="auto"/>
+              <w:bottom w:val="nil" w:sz="0" w:space="0" w:color="auto"/>
+              <w:right w:val="nil" w:sz="0" w:space="0" w:color="auto"/>
             </w:tcBorders>
           </w:tcPr>
           <w:p>
             <w:pPr>
-              <w:spacing w:line="240" w:lineRule="auto" w:after="40" w:before="40"/>
+              <w:spacing w:line="240" w:lineRule="auto" w:after="0" w:before="0"/>
               <w:ind w:firstLine="0"/>
+              <w:jc w:val="left"/>
             </w:pPr>
             <w:r/>
             <w:r>
@@ -6188,7 +6352,7 @@
                 <w:b w:val="0"/>
                 <w:i w:val="0"/>
                 <w:color w:val="000000"/>
-                <w:sz w:val="18"/>
+                <w:sz w:val="20"/>
               </w:rPr>
               <w:t>G-ænial Universal Injectable</w:t>
             </w:r>
@@ -6196,18 +6360,19 @@
         </w:tc>
         <w:tc>
           <w:tcPr>
-            <w:tcW w:type="dxa" w:w="3024"/>
+            <w:tcW w:type="dxa" w:w="3061"/>
             <w:tcBorders>
-              <w:top w:val="single" w:sz="4" w:space="0" w:color="000000"/>
-              <w:left w:val="single" w:sz="4" w:space="0" w:color="000000"/>
-              <w:bottom w:val="single" w:sz="4" w:space="0" w:color="000000"/>
-              <w:right w:val="single" w:sz="4" w:space="0" w:color="000000"/>
+              <w:top w:val="nil" w:sz="0" w:space="0" w:color="auto"/>
+              <w:left w:val="nil" w:sz="0" w:space="0" w:color="auto"/>
+              <w:bottom w:val="nil" w:sz="0" w:space="0" w:color="auto"/>
+              <w:right w:val="nil" w:sz="0" w:space="0" w:color="auto"/>
             </w:tcBorders>
           </w:tcPr>
           <w:p>
             <w:pPr>
-              <w:spacing w:line="240" w:lineRule="auto" w:after="40" w:before="40"/>
+              <w:spacing w:line="240" w:lineRule="auto" w:after="0" w:before="0"/>
               <w:ind w:firstLine="0"/>
+              <w:jc w:val="center"/>
             </w:pPr>
             <w:r/>
             <w:r>
@@ -6216,7 +6381,7 @@
                 <w:b w:val="0"/>
                 <w:i w:val="0"/>
                 <w:color w:val="000000"/>
-                <w:sz w:val="18"/>
+                <w:sz w:val="20"/>
               </w:rPr>
               <w:t>1.07 ± 0.62</w:t>
             </w:r>
@@ -6224,18 +6389,19 @@
         </w:tc>
         <w:tc>
           <w:tcPr>
-            <w:tcW w:type="dxa" w:w="3024"/>
+            <w:tcW w:type="dxa" w:w="2381"/>
             <w:tcBorders>
-              <w:top w:val="single" w:sz="4" w:space="0" w:color="000000"/>
-              <w:left w:val="single" w:sz="4" w:space="0" w:color="000000"/>
-              <w:bottom w:val="single" w:sz="4" w:space="0" w:color="000000"/>
-              <w:right w:val="single" w:sz="4" w:space="0" w:color="000000"/>
+              <w:top w:val="nil" w:sz="0" w:space="0" w:color="auto"/>
+              <w:left w:val="nil" w:sz="0" w:space="0" w:color="auto"/>
+              <w:bottom w:val="nil" w:sz="0" w:space="0" w:color="auto"/>
+              <w:right w:val="nil" w:sz="0" w:space="0" w:color="auto"/>
             </w:tcBorders>
           </w:tcPr>
           <w:p>
             <w:pPr>
-              <w:spacing w:line="240" w:lineRule="auto" w:after="40" w:before="40"/>
+              <w:spacing w:line="240" w:lineRule="auto" w:after="0" w:before="0"/>
               <w:ind w:firstLine="0"/>
+              <w:jc w:val="center"/>
             </w:pPr>
             <w:r/>
             <w:r>
@@ -6244,7 +6410,7 @@
                 <w:b w:val="0"/>
                 <w:i w:val="0"/>
                 <w:color w:val="000000"/>
-                <w:sz w:val="18"/>
+                <w:sz w:val="20"/>
               </w:rPr>
               <w:t>0.2 – 1.9</w:t>
             </w:r>
@@ -6254,18 +6420,19 @@
       <w:tr>
         <w:tc>
           <w:tcPr>
-            <w:tcW w:type="dxa" w:w="3024"/>
+            <w:tcW w:type="dxa" w:w="3515"/>
             <w:tcBorders>
-              <w:top w:val="single" w:sz="4" w:space="0" w:color="000000"/>
-              <w:left w:val="single" w:sz="4" w:space="0" w:color="000000"/>
-              <w:bottom w:val="single" w:sz="4" w:space="0" w:color="000000"/>
-              <w:right w:val="single" w:sz="4" w:space="0" w:color="000000"/>
+              <w:top w:val="nil" w:sz="0" w:space="0" w:color="auto"/>
+              <w:left w:val="nil" w:sz="0" w:space="0" w:color="auto"/>
+              <w:bottom w:val="single" w:sz="18" w:space="0" w:color="000000"/>
+              <w:right w:val="nil" w:sz="0" w:space="0" w:color="auto"/>
             </w:tcBorders>
           </w:tcPr>
           <w:p>
             <w:pPr>
-              <w:spacing w:line="240" w:lineRule="auto" w:after="40" w:before="40"/>
+              <w:spacing w:line="240" w:lineRule="auto" w:after="0" w:before="0"/>
               <w:ind w:firstLine="0"/>
+              <w:jc w:val="left"/>
             </w:pPr>
             <w:r/>
             <w:r>
@@ -6274,7 +6441,7 @@
                 <w:b w:val="0"/>
                 <w:i w:val="0"/>
                 <w:color w:val="000000"/>
-                <w:sz w:val="18"/>
+                <w:sz w:val="20"/>
               </w:rPr>
               <w:t>Beautifil II LS</w:t>
             </w:r>
@@ -6282,18 +6449,19 @@
         </w:tc>
         <w:tc>
           <w:tcPr>
-            <w:tcW w:type="dxa" w:w="3024"/>
+            <w:tcW w:type="dxa" w:w="3061"/>
             <w:tcBorders>
-              <w:top w:val="single" w:sz="4" w:space="0" w:color="000000"/>
-              <w:left w:val="single" w:sz="4" w:space="0" w:color="000000"/>
-              <w:bottom w:val="single" w:sz="4" w:space="0" w:color="000000"/>
-              <w:right w:val="single" w:sz="4" w:space="0" w:color="000000"/>
+              <w:top w:val="nil" w:sz="0" w:space="0" w:color="auto"/>
+              <w:left w:val="nil" w:sz="0" w:space="0" w:color="auto"/>
+              <w:bottom w:val="single" w:sz="18" w:space="0" w:color="000000"/>
+              <w:right w:val="nil" w:sz="0" w:space="0" w:color="auto"/>
             </w:tcBorders>
           </w:tcPr>
           <w:p>
             <w:pPr>
-              <w:spacing w:line="240" w:lineRule="auto" w:after="40" w:before="40"/>
+              <w:spacing w:line="240" w:lineRule="auto" w:after="0" w:before="0"/>
               <w:ind w:firstLine="0"/>
+              <w:jc w:val="center"/>
             </w:pPr>
             <w:r/>
             <w:r>
@@ -6302,7 +6470,7 @@
                 <w:b w:val="0"/>
                 <w:i w:val="0"/>
                 <w:color w:val="000000"/>
-                <w:sz w:val="18"/>
+                <w:sz w:val="20"/>
               </w:rPr>
               <w:t>0.95 ± 0.58</w:t>
             </w:r>
@@ -6310,18 +6478,19 @@
         </w:tc>
         <w:tc>
           <w:tcPr>
-            <w:tcW w:type="dxa" w:w="3024"/>
+            <w:tcW w:type="dxa" w:w="2381"/>
             <w:tcBorders>
-              <w:top w:val="single" w:sz="4" w:space="0" w:color="000000"/>
-              <w:left w:val="single" w:sz="4" w:space="0" w:color="000000"/>
-              <w:bottom w:val="single" w:sz="4" w:space="0" w:color="000000"/>
-              <w:right w:val="single" w:sz="4" w:space="0" w:color="000000"/>
+              <w:top w:val="nil" w:sz="0" w:space="0" w:color="auto"/>
+              <w:left w:val="nil" w:sz="0" w:space="0" w:color="auto"/>
+              <w:bottom w:val="single" w:sz="18" w:space="0" w:color="000000"/>
+              <w:right w:val="nil" w:sz="0" w:space="0" w:color="auto"/>
             </w:tcBorders>
           </w:tcPr>
           <w:p>
             <w:pPr>
-              <w:spacing w:line="240" w:lineRule="auto" w:after="40" w:before="40"/>
+              <w:spacing w:line="240" w:lineRule="auto" w:after="0" w:before="0"/>
               <w:ind w:firstLine="0"/>
+              <w:jc w:val="center"/>
             </w:pPr>
             <w:r/>
             <w:r>
@@ -6330,7 +6499,7 @@
                 <w:b w:val="0"/>
                 <w:i w:val="0"/>
                 <w:color w:val="000000"/>
-                <w:sz w:val="18"/>
+                <w:sz w:val="20"/>
               </w:rPr>
               <w:t>0.1 – 1.8</w:t>
             </w:r>
@@ -6341,7 +6510,7 @@
     <w:p>
       <w:pPr>
         <w:widowControl/>
-        <w:spacing w:before="0" w:after="120" w:lineRule="auto" w:line="240"/>
+        <w:spacing w:before="0" w:after="160" w:lineRule="auto" w:line="240"/>
         <w:ind w:firstLine="0"/>
         <w:jc w:val="both"/>
       </w:pPr>
@@ -6421,16 +6590,17 @@
     </w:p>
     <w:p>
       <w:pPr>
+        <w:keepNext/>
         <w:widowControl/>
-        <w:spacing w:before="120" w:after="120" w:line="480" w:lineRule="auto"/>
+        <w:spacing w:before="200" w:after="120" w:lineRule="auto" w:line="276"/>
         <w:ind w:firstLine="0"/>
-        <w:jc w:val="both"/>
+        <w:jc w:val="left"/>
       </w:pPr>
       <w:r>
         <w:rPr>
           <w:rFonts w:ascii="Times New Roman" w:hAnsi="Times New Roman" w:eastAsia="Times New Roman"/>
           <w:b/>
-          <w:i/>
+          <w:i w:val="0"/>
           <w:color w:val="000000"/>
           <w:sz w:val="24"/>
         </w:rPr>
@@ -6440,7 +6610,7 @@
         <w:rPr>
           <w:rFonts w:ascii="Times New Roman" w:hAnsi="Times New Roman" w:eastAsia="Times New Roman"/>
           <w:b w:val="0"/>
-          <w:i/>
+          <w:i w:val="0"/>
           <w:color w:val="000000"/>
           <w:sz w:val="24"/>
         </w:rPr>
@@ -6451,7 +6621,7 @@
       <w:tblPr>
         <w:tblW w:type="auto" w:w="0"/>
         <w:jc w:val="center"/>
-        <w:tblLayout w:type="autofit"/>
+        <w:tblLayout w:type="fixed"/>
         <w:tblLook w:firstColumn="1" w:firstRow="1" w:lastColumn="0" w:lastRow="0" w:noHBand="0" w:noVBand="1" w:val="04A0"/>
       </w:tblPr>
       <w:tblGrid>
@@ -6464,19 +6634,19 @@
       <w:tr>
         <w:tc>
           <w:tcPr>
-            <w:tcW w:type="dxa" w:w="1814"/>
+            <w:tcW w:type="dxa" w:w="2268"/>
             <w:tcBorders>
-              <w:top w:val="single" w:sz="4" w:space="0" w:color="000000"/>
-              <w:left w:val="single" w:sz="4" w:space="0" w:color="000000"/>
-              <w:bottom w:val="single" w:sz="4" w:space="0" w:color="000000"/>
-              <w:right w:val="single" w:sz="4" w:space="0" w:color="000000"/>
+              <w:top w:val="single" w:sz="18" w:space="0" w:color="000000"/>
+              <w:left w:val="nil" w:sz="0" w:space="0" w:color="auto"/>
+              <w:bottom w:val="single" w:sz="8" w:space="0" w:color="000000"/>
+              <w:right w:val="nil" w:sz="0" w:space="0" w:color="auto"/>
             </w:tcBorders>
-            <w:shd w:fill="E8E8E8" w:val="clear"/>
           </w:tcPr>
           <w:p>
             <w:pPr>
-              <w:spacing w:line="240" w:lineRule="auto" w:after="40" w:before="40"/>
+              <w:spacing w:line="240" w:lineRule="auto" w:after="0" w:before="0"/>
               <w:ind w:firstLine="0"/>
+              <w:jc w:val="left"/>
             </w:pPr>
             <w:r/>
             <w:r>
@@ -6485,7 +6655,7 @@
                 <w:b/>
                 <w:i w:val="0"/>
                 <w:color w:val="000000"/>
-                <w:sz w:val="18"/>
+                <w:sz w:val="20"/>
               </w:rPr>
               <w:t>Composite resin</w:t>
             </w:r>
@@ -6493,19 +6663,19 @@
         </w:tc>
         <w:tc>
           <w:tcPr>
-            <w:tcW w:type="dxa" w:w="1814"/>
+            <w:tcW w:type="dxa" w:w="1757"/>
             <w:tcBorders>
-              <w:top w:val="single" w:sz="4" w:space="0" w:color="000000"/>
-              <w:left w:val="single" w:sz="4" w:space="0" w:color="000000"/>
-              <w:bottom w:val="single" w:sz="4" w:space="0" w:color="000000"/>
-              <w:right w:val="single" w:sz="4" w:space="0" w:color="000000"/>
+              <w:top w:val="single" w:sz="18" w:space="0" w:color="000000"/>
+              <w:left w:val="nil" w:sz="0" w:space="0" w:color="auto"/>
+              <w:bottom w:val="single" w:sz="8" w:space="0" w:color="000000"/>
+              <w:right w:val="nil" w:sz="0" w:space="0" w:color="auto"/>
             </w:tcBorders>
-            <w:shd w:fill="E8E8E8" w:val="clear"/>
           </w:tcPr>
           <w:p>
             <w:pPr>
-              <w:spacing w:line="240" w:lineRule="auto" w:after="40" w:before="40"/>
+              <w:spacing w:line="240" w:lineRule="auto" w:after="0" w:before="0"/>
               <w:ind w:firstLine="0"/>
+              <w:jc w:val="center"/>
             </w:pPr>
             <w:r/>
             <w:r>
@@ -6514,27 +6684,44 @@
                 <w:b/>
                 <w:i w:val="0"/>
                 <w:color w:val="000000"/>
-                <w:sz w:val="18"/>
+                <w:sz w:val="20"/>
               </w:rPr>
-              <w:t>Ra before (µm) Mean ± SD</w:t>
+              <w:t>Ra before (µm)</w:t>
+            </w:r>
+          </w:p>
+          <w:p>
+            <w:pPr>
+              <w:spacing w:line="240" w:lineRule="auto" w:after="0" w:before="0"/>
+              <w:ind w:firstLine="0"/>
+              <w:jc w:val="center"/>
+            </w:pPr>
+            <w:r>
+              <w:rPr>
+                <w:rFonts w:ascii="Times New Roman" w:hAnsi="Times New Roman" w:eastAsia="Times New Roman"/>
+                <w:b/>
+                <w:i w:val="0"/>
+                <w:color w:val="000000"/>
+                <w:sz w:val="20"/>
+              </w:rPr>
+              <w:t>Mean ± SD</w:t>
             </w:r>
           </w:p>
         </w:tc>
         <w:tc>
           <w:tcPr>
-            <w:tcW w:type="dxa" w:w="1814"/>
+            <w:tcW w:type="dxa" w:w="1757"/>
             <w:tcBorders>
-              <w:top w:val="single" w:sz="4" w:space="0" w:color="000000"/>
-              <w:left w:val="single" w:sz="4" w:space="0" w:color="000000"/>
-              <w:bottom w:val="single" w:sz="4" w:space="0" w:color="000000"/>
-              <w:right w:val="single" w:sz="4" w:space="0" w:color="000000"/>
+              <w:top w:val="single" w:sz="18" w:space="0" w:color="000000"/>
+              <w:left w:val="nil" w:sz="0" w:space="0" w:color="auto"/>
+              <w:bottom w:val="single" w:sz="8" w:space="0" w:color="000000"/>
+              <w:right w:val="nil" w:sz="0" w:space="0" w:color="auto"/>
             </w:tcBorders>
-            <w:shd w:fill="E8E8E8" w:val="clear"/>
           </w:tcPr>
           <w:p>
             <w:pPr>
-              <w:spacing w:line="240" w:lineRule="auto" w:after="40" w:before="40"/>
+              <w:spacing w:line="240" w:lineRule="auto" w:after="0" w:before="0"/>
               <w:ind w:firstLine="0"/>
+              <w:jc w:val="center"/>
             </w:pPr>
             <w:r/>
             <w:r>
@@ -6543,27 +6730,44 @@
                 <w:b/>
                 <w:i w:val="0"/>
                 <w:color w:val="000000"/>
-                <w:sz w:val="18"/>
+                <w:sz w:val="20"/>
               </w:rPr>
-              <w:t>Ra after (µm) Mean ± SD</w:t>
+              <w:t>Ra after (µm)</w:t>
+            </w:r>
+          </w:p>
+          <w:p>
+            <w:pPr>
+              <w:spacing w:line="240" w:lineRule="auto" w:after="0" w:before="0"/>
+              <w:ind w:firstLine="0"/>
+              <w:jc w:val="center"/>
+            </w:pPr>
+            <w:r>
+              <w:rPr>
+                <w:rFonts w:ascii="Times New Roman" w:hAnsi="Times New Roman" w:eastAsia="Times New Roman"/>
+                <w:b/>
+                <w:i w:val="0"/>
+                <w:color w:val="000000"/>
+                <w:sz w:val="20"/>
+              </w:rPr>
+              <w:t>Mean ± SD</w:t>
             </w:r>
           </w:p>
         </w:tc>
         <w:tc>
           <w:tcPr>
-            <w:tcW w:type="dxa" w:w="1814"/>
+            <w:tcW w:type="dxa" w:w="1757"/>
             <w:tcBorders>
-              <w:top w:val="single" w:sz="4" w:space="0" w:color="000000"/>
-              <w:left w:val="single" w:sz="4" w:space="0" w:color="000000"/>
-              <w:bottom w:val="single" w:sz="4" w:space="0" w:color="000000"/>
-              <w:right w:val="single" w:sz="4" w:space="0" w:color="000000"/>
+              <w:top w:val="single" w:sz="18" w:space="0" w:color="000000"/>
+              <w:left w:val="nil" w:sz="0" w:space="0" w:color="auto"/>
+              <w:bottom w:val="single" w:sz="8" w:space="0" w:color="000000"/>
+              <w:right w:val="nil" w:sz="0" w:space="0" w:color="auto"/>
             </w:tcBorders>
-            <w:shd w:fill="E8E8E8" w:val="clear"/>
           </w:tcPr>
           <w:p>
             <w:pPr>
-              <w:spacing w:line="240" w:lineRule="auto" w:after="40" w:before="40"/>
+              <w:spacing w:line="240" w:lineRule="auto" w:after="0" w:before="0"/>
               <w:ind w:firstLine="0"/>
+              <w:jc w:val="center"/>
             </w:pPr>
             <w:r/>
             <w:r>
@@ -6572,27 +6776,44 @@
                 <w:b/>
                 <w:i w:val="0"/>
                 <w:color w:val="000000"/>
-                <w:sz w:val="18"/>
+                <w:sz w:val="20"/>
               </w:rPr>
-              <w:t>ΔRa (µm) Mean ± SD</w:t>
+              <w:t>ΔRa (µm)</w:t>
+            </w:r>
+          </w:p>
+          <w:p>
+            <w:pPr>
+              <w:spacing w:line="240" w:lineRule="auto" w:after="0" w:before="0"/>
+              <w:ind w:firstLine="0"/>
+              <w:jc w:val="center"/>
+            </w:pPr>
+            <w:r>
+              <w:rPr>
+                <w:rFonts w:ascii="Times New Roman" w:hAnsi="Times New Roman" w:eastAsia="Times New Roman"/>
+                <w:b/>
+                <w:i w:val="0"/>
+                <w:color w:val="000000"/>
+                <w:sz w:val="20"/>
+              </w:rPr>
+              <w:t>Mean ± SD</w:t>
             </w:r>
           </w:p>
         </w:tc>
         <w:tc>
           <w:tcPr>
-            <w:tcW w:type="dxa" w:w="1814"/>
+            <w:tcW w:type="dxa" w:w="1417"/>
             <w:tcBorders>
-              <w:top w:val="single" w:sz="4" w:space="0" w:color="000000"/>
-              <w:left w:val="single" w:sz="4" w:space="0" w:color="000000"/>
-              <w:bottom w:val="single" w:sz="4" w:space="0" w:color="000000"/>
-              <w:right w:val="single" w:sz="4" w:space="0" w:color="000000"/>
+              <w:top w:val="single" w:sz="18" w:space="0" w:color="000000"/>
+              <w:left w:val="nil" w:sz="0" w:space="0" w:color="auto"/>
+              <w:bottom w:val="single" w:sz="8" w:space="0" w:color="000000"/>
+              <w:right w:val="nil" w:sz="0" w:space="0" w:color="auto"/>
             </w:tcBorders>
-            <w:shd w:fill="E8E8E8" w:val="clear"/>
           </w:tcPr>
           <w:p>
             <w:pPr>
-              <w:spacing w:line="240" w:lineRule="auto" w:after="40" w:before="40"/>
+              <w:spacing w:line="240" w:lineRule="auto" w:after="0" w:before="0"/>
               <w:ind w:firstLine="0"/>
+              <w:jc w:val="center"/>
             </w:pPr>
             <w:r/>
             <w:r>
@@ -6601,7 +6822,7 @@
                 <w:b/>
                 <w:i w:val="0"/>
                 <w:color w:val="000000"/>
-                <w:sz w:val="18"/>
+                <w:sz w:val="20"/>
               </w:rPr>
               <w:t>p-value</w:t>
             </w:r>
@@ -6611,18 +6832,19 @@
       <w:tr>
         <w:tc>
           <w:tcPr>
-            <w:tcW w:type="dxa" w:w="1814"/>
+            <w:tcW w:type="dxa" w:w="2268"/>
             <w:tcBorders>
-              <w:top w:val="single" w:sz="4" w:space="0" w:color="000000"/>
-              <w:left w:val="single" w:sz="4" w:space="0" w:color="000000"/>
-              <w:bottom w:val="single" w:sz="4" w:space="0" w:color="000000"/>
-              <w:right w:val="single" w:sz="4" w:space="0" w:color="000000"/>
+              <w:top w:val="nil" w:sz="0" w:space="0" w:color="auto"/>
+              <w:left w:val="nil" w:sz="0" w:space="0" w:color="auto"/>
+              <w:bottom w:val="nil" w:sz="0" w:space="0" w:color="auto"/>
+              <w:right w:val="nil" w:sz="0" w:space="0" w:color="auto"/>
             </w:tcBorders>
           </w:tcPr>
           <w:p>
             <w:pPr>
-              <w:spacing w:line="240" w:lineRule="auto" w:after="40" w:before="40"/>
+              <w:spacing w:line="240" w:lineRule="auto" w:after="0" w:before="0"/>
               <w:ind w:firstLine="0"/>
+              <w:jc w:val="left"/>
             </w:pPr>
             <w:r/>
             <w:r>
@@ -6631,7 +6853,7 @@
                 <w:b w:val="0"/>
                 <w:i w:val="0"/>
                 <w:color w:val="000000"/>
-                <w:sz w:val="18"/>
+                <w:sz w:val="20"/>
               </w:rPr>
               <w:t>Beautifil Flow Plus X F00</w:t>
             </w:r>
@@ -6639,18 +6861,19 @@
         </w:tc>
         <w:tc>
           <w:tcPr>
-            <w:tcW w:type="dxa" w:w="1814"/>
+            <w:tcW w:type="dxa" w:w="1757"/>
             <w:tcBorders>
-              <w:top w:val="single" w:sz="4" w:space="0" w:color="000000"/>
-              <w:left w:val="single" w:sz="4" w:space="0" w:color="000000"/>
-              <w:bottom w:val="single" w:sz="4" w:space="0" w:color="000000"/>
-              <w:right w:val="single" w:sz="4" w:space="0" w:color="000000"/>
+              <w:top w:val="nil" w:sz="0" w:space="0" w:color="auto"/>
+              <w:left w:val="nil" w:sz="0" w:space="0" w:color="auto"/>
+              <w:bottom w:val="nil" w:sz="0" w:space="0" w:color="auto"/>
+              <w:right w:val="nil" w:sz="0" w:space="0" w:color="auto"/>
             </w:tcBorders>
           </w:tcPr>
           <w:p>
             <w:pPr>
-              <w:spacing w:line="240" w:lineRule="auto" w:after="40" w:before="40"/>
+              <w:spacing w:line="240" w:lineRule="auto" w:after="0" w:before="0"/>
               <w:ind w:firstLine="0"/>
+              <w:jc w:val="center"/>
             </w:pPr>
             <w:r/>
             <w:r>
@@ -6659,7 +6882,7 @@
                 <w:b w:val="0"/>
                 <w:i w:val="0"/>
                 <w:color w:val="000000"/>
-                <w:sz w:val="18"/>
+                <w:sz w:val="20"/>
               </w:rPr>
               <w:t>0.038 ± 0.011</w:t>
             </w:r>
@@ -6667,18 +6890,19 @@
         </w:tc>
         <w:tc>
           <w:tcPr>
-            <w:tcW w:type="dxa" w:w="1814"/>
+            <w:tcW w:type="dxa" w:w="1757"/>
             <w:tcBorders>
-              <w:top w:val="single" w:sz="4" w:space="0" w:color="000000"/>
-              <w:left w:val="single" w:sz="4" w:space="0" w:color="000000"/>
-              <w:bottom w:val="single" w:sz="4" w:space="0" w:color="000000"/>
-              <w:right w:val="single" w:sz="4" w:space="0" w:color="000000"/>
+              <w:top w:val="nil" w:sz="0" w:space="0" w:color="auto"/>
+              <w:left w:val="nil" w:sz="0" w:space="0" w:color="auto"/>
+              <w:bottom w:val="nil" w:sz="0" w:space="0" w:color="auto"/>
+              <w:right w:val="nil" w:sz="0" w:space="0" w:color="auto"/>
             </w:tcBorders>
           </w:tcPr>
           <w:p>
             <w:pPr>
-              <w:spacing w:line="240" w:lineRule="auto" w:after="40" w:before="40"/>
+              <w:spacing w:line="240" w:lineRule="auto" w:after="0" w:before="0"/>
               <w:ind w:firstLine="0"/>
+              <w:jc w:val="center"/>
             </w:pPr>
             <w:r/>
             <w:r>
@@ -6687,7 +6911,7 @@
                 <w:b w:val="0"/>
                 <w:i w:val="0"/>
                 <w:color w:val="000000"/>
-                <w:sz w:val="18"/>
+                <w:sz w:val="20"/>
               </w:rPr>
               <w:t>0.104 ± 0.017</w:t>
             </w:r>
@@ -6695,18 +6919,19 @@
         </w:tc>
         <w:tc>
           <w:tcPr>
-            <w:tcW w:type="dxa" w:w="1814"/>
+            <w:tcW w:type="dxa" w:w="1757"/>
             <w:tcBorders>
-              <w:top w:val="single" w:sz="4" w:space="0" w:color="000000"/>
-              <w:left w:val="single" w:sz="4" w:space="0" w:color="000000"/>
-              <w:bottom w:val="single" w:sz="4" w:space="0" w:color="000000"/>
-              <w:right w:val="single" w:sz="4" w:space="0" w:color="000000"/>
+              <w:top w:val="nil" w:sz="0" w:space="0" w:color="auto"/>
+              <w:left w:val="nil" w:sz="0" w:space="0" w:color="auto"/>
+              <w:bottom w:val="nil" w:sz="0" w:space="0" w:color="auto"/>
+              <w:right w:val="nil" w:sz="0" w:space="0" w:color="auto"/>
             </w:tcBorders>
           </w:tcPr>
           <w:p>
             <w:pPr>
-              <w:spacing w:line="240" w:lineRule="auto" w:after="40" w:before="40"/>
+              <w:spacing w:line="240" w:lineRule="auto" w:after="0" w:before="0"/>
               <w:ind w:firstLine="0"/>
+              <w:jc w:val="center"/>
             </w:pPr>
             <w:r/>
             <w:r>
@@ -6715,7 +6940,7 @@
                 <w:b w:val="0"/>
                 <w:i w:val="0"/>
                 <w:color w:val="000000"/>
-                <w:sz w:val="18"/>
+                <w:sz w:val="20"/>
               </w:rPr>
               <w:t>0.066 ± 0.021</w:t>
             </w:r>
@@ -6723,18 +6948,20 @@
         </w:tc>
         <w:tc>
           <w:tcPr>
-            <w:tcW w:type="dxa" w:w="1814"/>
+            <w:tcW w:type="dxa" w:w="1417"/>
+            <w:vMerge w:val="restart"/>
             <w:tcBorders>
-              <w:top w:val="single" w:sz="4" w:space="0" w:color="000000"/>
-              <w:left w:val="single" w:sz="4" w:space="0" w:color="000000"/>
-              <w:bottom w:val="single" w:sz="4" w:space="0" w:color="000000"/>
-              <w:right w:val="single" w:sz="4" w:space="0" w:color="000000"/>
+              <w:top w:val="nil" w:sz="0" w:space="0" w:color="auto"/>
+              <w:left w:val="nil" w:sz="0" w:space="0" w:color="auto"/>
+              <w:bottom w:val="single" w:sz="18" w:space="0" w:color="000000"/>
+              <w:right w:val="nil" w:sz="0" w:space="0" w:color="auto"/>
             </w:tcBorders>
           </w:tcPr>
           <w:p>
             <w:pPr>
-              <w:spacing w:line="240" w:lineRule="auto" w:after="40" w:before="40"/>
+              <w:spacing w:line="240" w:lineRule="auto" w:after="0" w:before="0"/>
               <w:ind w:firstLine="0"/>
+              <w:jc w:val="center"/>
             </w:pPr>
             <w:r/>
             <w:r>
@@ -6743,148 +6970,7 @@
                 <w:b w:val="0"/>
                 <w:i w:val="0"/>
                 <w:color w:val="000000"/>
-                <w:sz w:val="18"/>
-              </w:rPr>
-            </w:r>
-          </w:p>
-        </w:tc>
-      </w:tr>
-      <w:tr>
-        <w:tc>
-          <w:tcPr>
-            <w:tcW w:type="dxa" w:w="1814"/>
-            <w:tcBorders>
-              <w:top w:val="single" w:sz="4" w:space="0" w:color="000000"/>
-              <w:left w:val="single" w:sz="4" w:space="0" w:color="000000"/>
-              <w:bottom w:val="single" w:sz="4" w:space="0" w:color="000000"/>
-              <w:right w:val="single" w:sz="4" w:space="0" w:color="000000"/>
-            </w:tcBorders>
-          </w:tcPr>
-          <w:p>
-            <w:pPr>
-              <w:spacing w:line="240" w:lineRule="auto" w:after="40" w:before="40"/>
-              <w:ind w:firstLine="0"/>
-            </w:pPr>
-            <w:r/>
-            <w:r>
-              <w:rPr>
-                <w:rFonts w:ascii="Times New Roman" w:hAnsi="Times New Roman" w:eastAsia="Times New Roman"/>
-                <w:b w:val="0"/>
-                <w:i w:val="0"/>
-                <w:color w:val="000000"/>
-                <w:sz w:val="18"/>
-              </w:rPr>
-              <w:t>G-ænial Universal Injectable</w:t>
-            </w:r>
-          </w:p>
-        </w:tc>
-        <w:tc>
-          <w:tcPr>
-            <w:tcW w:type="dxa" w:w="1814"/>
-            <w:tcBorders>
-              <w:top w:val="single" w:sz="4" w:space="0" w:color="000000"/>
-              <w:left w:val="single" w:sz="4" w:space="0" w:color="000000"/>
-              <w:bottom w:val="single" w:sz="4" w:space="0" w:color="000000"/>
-              <w:right w:val="single" w:sz="4" w:space="0" w:color="000000"/>
-            </w:tcBorders>
-          </w:tcPr>
-          <w:p>
-            <w:pPr>
-              <w:spacing w:line="240" w:lineRule="auto" w:after="40" w:before="40"/>
-              <w:ind w:firstLine="0"/>
-            </w:pPr>
-            <w:r/>
-            <w:r>
-              <w:rPr>
-                <w:rFonts w:ascii="Times New Roman" w:hAnsi="Times New Roman" w:eastAsia="Times New Roman"/>
-                <w:b w:val="0"/>
-                <w:i w:val="0"/>
-                <w:color w:val="000000"/>
-                <w:sz w:val="18"/>
-              </w:rPr>
-              <w:t>0.054 ± 0.010</w:t>
-            </w:r>
-          </w:p>
-        </w:tc>
-        <w:tc>
-          <w:tcPr>
-            <w:tcW w:type="dxa" w:w="1814"/>
-            <w:tcBorders>
-              <w:top w:val="single" w:sz="4" w:space="0" w:color="000000"/>
-              <w:left w:val="single" w:sz="4" w:space="0" w:color="000000"/>
-              <w:bottom w:val="single" w:sz="4" w:space="0" w:color="000000"/>
-              <w:right w:val="single" w:sz="4" w:space="0" w:color="000000"/>
-            </w:tcBorders>
-          </w:tcPr>
-          <w:p>
-            <w:pPr>
-              <w:spacing w:line="240" w:lineRule="auto" w:after="40" w:before="40"/>
-              <w:ind w:firstLine="0"/>
-            </w:pPr>
-            <w:r/>
-            <w:r>
-              <w:rPr>
-                <w:rFonts w:ascii="Times New Roman" w:hAnsi="Times New Roman" w:eastAsia="Times New Roman"/>
-                <w:b w:val="0"/>
-                <w:i w:val="0"/>
-                <w:color w:val="000000"/>
-                <w:sz w:val="18"/>
-              </w:rPr>
-              <w:t>0.100 ± 0.023</w:t>
-            </w:r>
-          </w:p>
-        </w:tc>
-        <w:tc>
-          <w:tcPr>
-            <w:tcW w:type="dxa" w:w="1814"/>
-            <w:tcBorders>
-              <w:top w:val="single" w:sz="4" w:space="0" w:color="000000"/>
-              <w:left w:val="single" w:sz="4" w:space="0" w:color="000000"/>
-              <w:bottom w:val="single" w:sz="4" w:space="0" w:color="000000"/>
-              <w:right w:val="single" w:sz="4" w:space="0" w:color="000000"/>
-            </w:tcBorders>
-          </w:tcPr>
-          <w:p>
-            <w:pPr>
-              <w:spacing w:line="240" w:lineRule="auto" w:after="40" w:before="40"/>
-              <w:ind w:firstLine="0"/>
-            </w:pPr>
-            <w:r/>
-            <w:r>
-              <w:rPr>
-                <w:rFonts w:ascii="Times New Roman" w:hAnsi="Times New Roman" w:eastAsia="Times New Roman"/>
-                <w:b w:val="0"/>
-                <w:i w:val="0"/>
-                <w:color w:val="000000"/>
-                <w:sz w:val="18"/>
-              </w:rPr>
-              <w:t>0.046 ± 0.023</w:t>
-            </w:r>
-          </w:p>
-        </w:tc>
-        <w:tc>
-          <w:tcPr>
-            <w:tcW w:type="dxa" w:w="1814"/>
-            <w:tcBorders>
-              <w:top w:val="single" w:sz="4" w:space="0" w:color="000000"/>
-              <w:left w:val="single" w:sz="4" w:space="0" w:color="000000"/>
-              <w:bottom w:val="single" w:sz="4" w:space="0" w:color="000000"/>
-              <w:right w:val="single" w:sz="4" w:space="0" w:color="000000"/>
-            </w:tcBorders>
-          </w:tcPr>
-          <w:p>
-            <w:pPr>
-              <w:spacing w:line="240" w:lineRule="auto" w:after="40" w:before="40"/>
-              <w:ind w:firstLine="0"/>
-            </w:pPr>
-            <w:r/>
-            <w:r>
-              <w:rPr>
-                <w:rFonts w:ascii="Times New Roman" w:hAnsi="Times New Roman" w:eastAsia="Times New Roman"/>
-                <w:b w:val="0"/>
-                <w:i w:val="0"/>
-                <w:color w:val="000000"/>
-                <w:sz w:val="18"/>
+                <w:sz w:val="20"/>
               </w:rPr>
               <w:t>&lt; 0.001‡</w:t>
             </w:r>
@@ -6894,18 +6980,19 @@
       <w:tr>
         <w:tc>
           <w:tcPr>
-            <w:tcW w:type="dxa" w:w="1814"/>
+            <w:tcW w:type="dxa" w:w="2268"/>
             <w:tcBorders>
-              <w:top w:val="single" w:sz="4" w:space="0" w:color="000000"/>
-              <w:left w:val="single" w:sz="4" w:space="0" w:color="000000"/>
-              <w:bottom w:val="single" w:sz="4" w:space="0" w:color="000000"/>
-              <w:right w:val="single" w:sz="4" w:space="0" w:color="000000"/>
+              <w:top w:val="nil" w:sz="0" w:space="0" w:color="auto"/>
+              <w:left w:val="nil" w:sz="0" w:space="0" w:color="auto"/>
+              <w:bottom w:val="nil" w:sz="0" w:space="0" w:color="auto"/>
+              <w:right w:val="nil" w:sz="0" w:space="0" w:color="auto"/>
             </w:tcBorders>
           </w:tcPr>
           <w:p>
             <w:pPr>
-              <w:spacing w:line="240" w:lineRule="auto" w:after="40" w:before="40"/>
+              <w:spacing w:line="240" w:lineRule="auto" w:after="0" w:before="0"/>
               <w:ind w:firstLine="0"/>
+              <w:jc w:val="left"/>
             </w:pPr>
             <w:r/>
             <w:r>
@@ -6914,26 +7001,27 @@
                 <w:b w:val="0"/>
                 <w:i w:val="0"/>
                 <w:color w:val="000000"/>
-                <w:sz w:val="18"/>
+                <w:sz w:val="20"/>
               </w:rPr>
-              <w:t>Beautifil II LS</w:t>
+              <w:t>G-ænial Universal Injectable</w:t>
             </w:r>
           </w:p>
         </w:tc>
         <w:tc>
           <w:tcPr>
-            <w:tcW w:type="dxa" w:w="1814"/>
+            <w:tcW w:type="dxa" w:w="1757"/>
             <w:tcBorders>
-              <w:top w:val="single" w:sz="4" w:space="0" w:color="000000"/>
-              <w:left w:val="single" w:sz="4" w:space="0" w:color="000000"/>
-              <w:bottom w:val="single" w:sz="4" w:space="0" w:color="000000"/>
-              <w:right w:val="single" w:sz="4" w:space="0" w:color="000000"/>
+              <w:top w:val="nil" w:sz="0" w:space="0" w:color="auto"/>
+              <w:left w:val="nil" w:sz="0" w:space="0" w:color="auto"/>
+              <w:bottom w:val="nil" w:sz="0" w:space="0" w:color="auto"/>
+              <w:right w:val="nil" w:sz="0" w:space="0" w:color="auto"/>
             </w:tcBorders>
           </w:tcPr>
           <w:p>
             <w:pPr>
-              <w:spacing w:line="240" w:lineRule="auto" w:after="40" w:before="40"/>
+              <w:spacing w:line="240" w:lineRule="auto" w:after="0" w:before="0"/>
               <w:ind w:firstLine="0"/>
+              <w:jc w:val="center"/>
             </w:pPr>
             <w:r/>
             <w:r>
@@ -6942,26 +7030,27 @@
                 <w:b w:val="0"/>
                 <w:i w:val="0"/>
                 <w:color w:val="000000"/>
-                <w:sz w:val="18"/>
+                <w:sz w:val="20"/>
               </w:rPr>
-              <w:t>0.119 ± 0.054</w:t>
+              <w:t>0.054 ± 0.010</w:t>
             </w:r>
           </w:p>
         </w:tc>
         <w:tc>
           <w:tcPr>
-            <w:tcW w:type="dxa" w:w="1814"/>
+            <w:tcW w:type="dxa" w:w="1757"/>
             <w:tcBorders>
-              <w:top w:val="single" w:sz="4" w:space="0" w:color="000000"/>
-              <w:left w:val="single" w:sz="4" w:space="0" w:color="000000"/>
-              <w:bottom w:val="single" w:sz="4" w:space="0" w:color="000000"/>
-              <w:right w:val="single" w:sz="4" w:space="0" w:color="000000"/>
+              <w:top w:val="nil" w:sz="0" w:space="0" w:color="auto"/>
+              <w:left w:val="nil" w:sz="0" w:space="0" w:color="auto"/>
+              <w:bottom w:val="nil" w:sz="0" w:space="0" w:color="auto"/>
+              <w:right w:val="nil" w:sz="0" w:space="0" w:color="auto"/>
             </w:tcBorders>
           </w:tcPr>
           <w:p>
             <w:pPr>
-              <w:spacing w:line="240" w:lineRule="auto" w:after="40" w:before="40"/>
+              <w:spacing w:line="240" w:lineRule="auto" w:after="0" w:before="0"/>
               <w:ind w:firstLine="0"/>
+              <w:jc w:val="center"/>
             </w:pPr>
             <w:r/>
             <w:r>
@@ -6970,26 +7059,27 @@
                 <w:b w:val="0"/>
                 <w:i w:val="0"/>
                 <w:color w:val="000000"/>
-                <w:sz w:val="18"/>
+                <w:sz w:val="20"/>
               </w:rPr>
-              <w:t>0.194 ± 0.050</w:t>
+              <w:t>0.100 ± 0.023</w:t>
             </w:r>
           </w:p>
         </w:tc>
         <w:tc>
           <w:tcPr>
-            <w:tcW w:type="dxa" w:w="1814"/>
+            <w:tcW w:type="dxa" w:w="1757"/>
             <w:tcBorders>
-              <w:top w:val="single" w:sz="4" w:space="0" w:color="000000"/>
-              <w:left w:val="single" w:sz="4" w:space="0" w:color="000000"/>
-              <w:bottom w:val="single" w:sz="4" w:space="0" w:color="000000"/>
-              <w:right w:val="single" w:sz="4" w:space="0" w:color="000000"/>
+              <w:top w:val="nil" w:sz="0" w:space="0" w:color="auto"/>
+              <w:left w:val="nil" w:sz="0" w:space="0" w:color="auto"/>
+              <w:bottom w:val="nil" w:sz="0" w:space="0" w:color="auto"/>
+              <w:right w:val="nil" w:sz="0" w:space="0" w:color="auto"/>
             </w:tcBorders>
           </w:tcPr>
           <w:p>
             <w:pPr>
-              <w:spacing w:line="240" w:lineRule="auto" w:after="40" w:before="40"/>
+              <w:spacing w:line="240" w:lineRule="auto" w:after="0" w:before="0"/>
               <w:ind w:firstLine="0"/>
+              <w:jc w:val="center"/>
             </w:pPr>
             <w:r/>
             <w:r>
@@ -6998,26 +7088,42 @@
                 <w:b w:val="0"/>
                 <w:i w:val="0"/>
                 <w:color w:val="000000"/>
-                <w:sz w:val="18"/>
+                <w:sz w:val="20"/>
               </w:rPr>
-              <w:t>0.075 ± 0.066</w:t>
+              <w:t>0.046 ± 0.023</w:t>
             </w:r>
           </w:p>
         </w:tc>
         <w:tc>
           <w:tcPr>
-            <w:tcW w:type="dxa" w:w="1814"/>
+            <w:tcW w:type="dxa" w:w="1417"/>
+            <w:vMerge/>
             <w:tcBorders>
-              <w:top w:val="single" w:sz="4" w:space="0" w:color="000000"/>
-              <w:left w:val="single" w:sz="4" w:space="0" w:color="000000"/>
-              <w:bottom w:val="single" w:sz="4" w:space="0" w:color="000000"/>
-              <w:right w:val="single" w:sz="4" w:space="0" w:color="000000"/>
+              <w:top w:val="nil" w:sz="0" w:space="0" w:color="auto"/>
+              <w:left w:val="nil" w:sz="0" w:space="0" w:color="auto"/>
+              <w:bottom w:val="nil" w:sz="0" w:space="0" w:color="auto"/>
+              <w:right w:val="nil" w:sz="0" w:space="0" w:color="auto"/>
+            </w:tcBorders>
+          </w:tcPr>
+          <w:p/>
+        </w:tc>
+      </w:tr>
+      <w:tr>
+        <w:tc>
+          <w:tcPr>
+            <w:tcW w:type="dxa" w:w="2268"/>
+            <w:tcBorders>
+              <w:top w:val="nil" w:sz="0" w:space="0" w:color="auto"/>
+              <w:left w:val="nil" w:sz="0" w:space="0" w:color="auto"/>
+              <w:bottom w:val="single" w:sz="18" w:space="0" w:color="000000"/>
+              <w:right w:val="nil" w:sz="0" w:space="0" w:color="auto"/>
             </w:tcBorders>
           </w:tcPr>
           <w:p>
             <w:pPr>
-              <w:spacing w:line="240" w:lineRule="auto" w:after="40" w:before="40"/>
+              <w:spacing w:line="240" w:lineRule="auto" w:after="0" w:before="0"/>
               <w:ind w:firstLine="0"/>
+              <w:jc w:val="left"/>
             </w:pPr>
             <w:r/>
             <w:r>
@@ -7026,17 +7132,118 @@
                 <w:b w:val="0"/>
                 <w:i w:val="0"/>
                 <w:color w:val="000000"/>
-                <w:sz w:val="18"/>
+                <w:sz w:val="20"/>
               </w:rPr>
+              <w:t>Beautifil II LS</w:t>
             </w:r>
           </w:p>
+        </w:tc>
+        <w:tc>
+          <w:tcPr>
+            <w:tcW w:type="dxa" w:w="1757"/>
+            <w:tcBorders>
+              <w:top w:val="nil" w:sz="0" w:space="0" w:color="auto"/>
+              <w:left w:val="nil" w:sz="0" w:space="0" w:color="auto"/>
+              <w:bottom w:val="single" w:sz="18" w:space="0" w:color="000000"/>
+              <w:right w:val="nil" w:sz="0" w:space="0" w:color="auto"/>
+            </w:tcBorders>
+          </w:tcPr>
+          <w:p>
+            <w:pPr>
+              <w:spacing w:line="240" w:lineRule="auto" w:after="0" w:before="0"/>
+              <w:ind w:firstLine="0"/>
+              <w:jc w:val="center"/>
+            </w:pPr>
+            <w:r/>
+            <w:r>
+              <w:rPr>
+                <w:rFonts w:ascii="Times New Roman" w:hAnsi="Times New Roman" w:eastAsia="Times New Roman"/>
+                <w:b w:val="0"/>
+                <w:i w:val="0"/>
+                <w:color w:val="000000"/>
+                <w:sz w:val="20"/>
+              </w:rPr>
+              <w:t>0.119 ± 0.054</w:t>
+            </w:r>
+          </w:p>
+        </w:tc>
+        <w:tc>
+          <w:tcPr>
+            <w:tcW w:type="dxa" w:w="1757"/>
+            <w:tcBorders>
+              <w:top w:val="nil" w:sz="0" w:space="0" w:color="auto"/>
+              <w:left w:val="nil" w:sz="0" w:space="0" w:color="auto"/>
+              <w:bottom w:val="single" w:sz="18" w:space="0" w:color="000000"/>
+              <w:right w:val="nil" w:sz="0" w:space="0" w:color="auto"/>
+            </w:tcBorders>
+          </w:tcPr>
+          <w:p>
+            <w:pPr>
+              <w:spacing w:line="240" w:lineRule="auto" w:after="0" w:before="0"/>
+              <w:ind w:firstLine="0"/>
+              <w:jc w:val="center"/>
+            </w:pPr>
+            <w:r/>
+            <w:r>
+              <w:rPr>
+                <w:rFonts w:ascii="Times New Roman" w:hAnsi="Times New Roman" w:eastAsia="Times New Roman"/>
+                <w:b w:val="0"/>
+                <w:i w:val="0"/>
+                <w:color w:val="000000"/>
+                <w:sz w:val="20"/>
+              </w:rPr>
+              <w:t>0.194 ± 0.050</w:t>
+            </w:r>
+          </w:p>
+        </w:tc>
+        <w:tc>
+          <w:tcPr>
+            <w:tcW w:type="dxa" w:w="1757"/>
+            <w:tcBorders>
+              <w:top w:val="nil" w:sz="0" w:space="0" w:color="auto"/>
+              <w:left w:val="nil" w:sz="0" w:space="0" w:color="auto"/>
+              <w:bottom w:val="single" w:sz="18" w:space="0" w:color="000000"/>
+              <w:right w:val="nil" w:sz="0" w:space="0" w:color="auto"/>
+            </w:tcBorders>
+          </w:tcPr>
+          <w:p>
+            <w:pPr>
+              <w:spacing w:line="240" w:lineRule="auto" w:after="0" w:before="0"/>
+              <w:ind w:firstLine="0"/>
+              <w:jc w:val="center"/>
+            </w:pPr>
+            <w:r/>
+            <w:r>
+              <w:rPr>
+                <w:rFonts w:ascii="Times New Roman" w:hAnsi="Times New Roman" w:eastAsia="Times New Roman"/>
+                <w:b w:val="0"/>
+                <w:i w:val="0"/>
+                <w:color w:val="000000"/>
+                <w:sz w:val="20"/>
+              </w:rPr>
+              <w:t>0.075 ± 0.066</w:t>
+            </w:r>
+          </w:p>
+        </w:tc>
+        <w:tc>
+          <w:tcPr>
+            <w:tcW w:type="dxa" w:w="1417"/>
+            <w:vMerge/>
+            <w:tcBorders>
+              <w:top w:val="nil" w:sz="0" w:space="0" w:color="auto"/>
+              <w:left w:val="nil" w:sz="0" w:space="0" w:color="auto"/>
+              <w:bottom w:val="single" w:sz="18" w:space="0" w:color="000000"/>
+              <w:right w:val="nil" w:sz="0" w:space="0" w:color="auto"/>
+            </w:tcBorders>
+          </w:tcPr>
+          <w:p/>
         </w:tc>
       </w:tr>
     </w:tbl>
     <w:p>
       <w:pPr>
         <w:widowControl/>
-        <w:spacing w:before="0" w:after="120" w:lineRule="auto" w:line="240"/>
+        <w:spacing w:before="0" w:after="160" w:lineRule="auto" w:line="240"/>
         <w:ind w:firstLine="0"/>
         <w:jc w:val="both"/>
       </w:pPr>
@@ -7103,16 +7310,17 @@
     </w:p>
     <w:p>
       <w:pPr>
+        <w:keepNext/>
         <w:widowControl/>
-        <w:spacing w:before="120" w:after="120" w:line="480" w:lineRule="auto"/>
+        <w:spacing w:before="200" w:after="120" w:lineRule="auto" w:line="276"/>
         <w:ind w:firstLine="0"/>
-        <w:jc w:val="both"/>
+        <w:jc w:val="left"/>
       </w:pPr>
       <w:r>
         <w:rPr>
           <w:rFonts w:ascii="Times New Roman" w:hAnsi="Times New Roman" w:eastAsia="Times New Roman"/>
           <w:b/>
-          <w:i/>
+          <w:i w:val="0"/>
           <w:color w:val="000000"/>
           <w:sz w:val="24"/>
         </w:rPr>
@@ -7122,7 +7330,7 @@
         <w:rPr>
           <w:rFonts w:ascii="Times New Roman" w:hAnsi="Times New Roman" w:eastAsia="Times New Roman"/>
           <w:b w:val="0"/>
-          <w:i/>
+          <w:i w:val="0"/>
           <w:color w:val="000000"/>
           <w:sz w:val="24"/>
         </w:rPr>
@@ -7209,16 +7417,17 @@
     </w:p>
     <w:p>
       <w:pPr>
+        <w:keepNext/>
         <w:widowControl/>
-        <w:spacing w:before="120" w:after="120" w:line="480" w:lineRule="auto"/>
+        <w:spacing w:before="200" w:after="120" w:lineRule="auto" w:line="276"/>
         <w:ind w:firstLine="0"/>
-        <w:jc w:val="both"/>
+        <w:jc w:val="left"/>
       </w:pPr>
       <w:r>
         <w:rPr>
           <w:rFonts w:ascii="Times New Roman" w:hAnsi="Times New Roman" w:eastAsia="Times New Roman"/>
           <w:b/>
-          <w:i/>
+          <w:i w:val="0"/>
           <w:color w:val="000000"/>
           <w:sz w:val="24"/>
         </w:rPr>
@@ -7228,7 +7437,7 @@
         <w:rPr>
           <w:rFonts w:ascii="Times New Roman" w:hAnsi="Times New Roman" w:eastAsia="Times New Roman"/>
           <w:b w:val="0"/>
-          <w:i/>
+          <w:i w:val="0"/>
           <w:color w:val="000000"/>
           <w:sz w:val="24"/>
         </w:rPr>
@@ -9414,7 +9623,7 @@
       <w:headerReference w:type="default" r:id="rId9"/>
       <w:footerReference w:type="default" r:id="rId10"/>
       <w:pgSz w:w="11906" w:h="16838"/>
-      <w:pgMar w:top="1928" w:right="1134" w:bottom="2041" w:left="1701" w:header="283" w:footer="227" w:gutter="0"/>
+      <w:pgMar w:top="1701" w:right="1134" w:bottom="1871" w:left="1701" w:header="283" w:footer="227" w:gutter="0"/>
       <w:cols w:space="720"/>
       <w:docGrid w:linePitch="360"/>
     </w:sectPr>
@@ -9527,7 +9736,7 @@
     <w:r>
       <w:drawing>
         <wp:inline xmlns:a="http://schemas.openxmlformats.org/drawingml/2006/main" xmlns:pic="http://schemas.openxmlformats.org/drawingml/2006/picture">
-          <wp:extent cx="5760000" cy="768000"/>
+          <wp:extent cx="5328000" cy="710400"/>
           <wp:docPr id="1" name="Picture 1"/>
           <wp:cNvGraphicFramePr>
             <a:graphicFrameLocks noChangeAspect="1"/>
@@ -9548,7 +9757,7 @@
                 <pic:spPr>
                   <a:xfrm>
                     <a:off x="0" y="0"/>
-                    <a:ext cx="5760000" cy="768000"/>
+                    <a:ext cx="5328000" cy="710400"/>
                   </a:xfrm>
                   <a:prstGeom prst="rect"/>
                 </pic:spPr>

</xml_diff>

<commit_message>
Open out the cramped Word layout and rebuild both files
Shrink the PUA banner and page chrome so the body is not letterboxed, give tables and lists real cell and line space, and add dotted page leaders for the lists of tables and figures. Science, numbers, and supervisor names are unchanged.

Co-authored-by: Ahmed El Gamry <ahmed733676-droid@users.noreply.github.com>
</commit_message>
<xml_diff>
--- a/Thesis_Complete.docx
+++ b/Thesis_Complete.docx
@@ -41,7 +41,7 @@
     <w:p>
       <w:pPr>
         <w:widowControl/>
-        <w:spacing w:before="0" w:after="280" w:lineRule="auto" w:line="276"/>
+        <w:spacing w:before="0" w:after="320" w:lineRule="auto" w:line="276"/>
         <w:ind w:firstLine="0"/>
         <w:jc w:val="left"/>
       </w:pPr>
@@ -54,6 +54,78 @@
           <w:sz w:val="24"/>
         </w:rPr>
         <w:t>Student Code No. 202203112</w:t>
+      </w:r>
+    </w:p>
+    <w:p>
+      <w:pPr>
+        <w:widowControl/>
+        <w:spacing w:before="200" w:after="0" w:lineRule="auto" w:line="276"/>
+        <w:ind w:firstLine="0"/>
+        <w:jc w:val="center"/>
+      </w:pPr>
+      <w:r>
+        <w:rPr>
+          <w:rFonts w:ascii="Times New Roman" w:hAnsi="Times New Roman" w:cs="Times New Roman" w:eastAsia="Times New Roman"/>
+          <w:b/>
+          <w:i w:val="0"/>
+          <w:color w:val="000000"/>
+          <w:sz w:val="24"/>
+        </w:rPr>
+        <w:t>A Thesis submitted in partial fulfilment of the</w:t>
+      </w:r>
+    </w:p>
+    <w:p>
+      <w:pPr>
+        <w:widowControl/>
+        <w:spacing w:before="0" w:after="0" w:lineRule="auto" w:line="276"/>
+        <w:ind w:firstLine="0"/>
+        <w:jc w:val="center"/>
+      </w:pPr>
+      <w:r>
+        <w:rPr>
+          <w:rFonts w:ascii="Times New Roman" w:hAnsi="Times New Roman" w:cs="Times New Roman" w:eastAsia="Times New Roman"/>
+          <w:b/>
+          <w:i w:val="0"/>
+          <w:color w:val="000000"/>
+          <w:sz w:val="24"/>
+        </w:rPr>
+        <w:t>requirements for the degree of Master of Science</w:t>
+      </w:r>
+    </w:p>
+    <w:p>
+      <w:pPr>
+        <w:widowControl/>
+        <w:spacing w:before="0" w:after="0" w:lineRule="auto" w:line="276"/>
+        <w:ind w:firstLine="0"/>
+        <w:jc w:val="center"/>
+      </w:pPr>
+      <w:r>
+        <w:rPr>
+          <w:rFonts w:ascii="Times New Roman" w:hAnsi="Times New Roman" w:cs="Times New Roman" w:eastAsia="Times New Roman"/>
+          <w:b/>
+          <w:i w:val="0"/>
+          <w:color w:val="000000"/>
+          <w:sz w:val="24"/>
+        </w:rPr>
+        <w:t>in Conservative Dentistry</w:t>
+      </w:r>
+    </w:p>
+    <w:p>
+      <w:pPr>
+        <w:widowControl/>
+        <w:spacing w:before="0" w:after="320" w:lineRule="auto" w:line="276"/>
+        <w:ind w:firstLine="0"/>
+        <w:jc w:val="center"/>
+      </w:pPr>
+      <w:r>
+        <w:rPr>
+          <w:rFonts w:ascii="Times New Roman" w:hAnsi="Times New Roman" w:cs="Times New Roman" w:eastAsia="Times New Roman"/>
+          <w:b/>
+          <w:i w:val="0"/>
+          <w:color w:val="000000"/>
+          <w:sz w:val="24"/>
+        </w:rPr>
+        <w:t>Academic Year 2024–2025 / 2025–2026</w:t>
       </w:r>
     </w:p>
     <w:p>
@@ -66,12 +138,66 @@
       <w:r>
         <w:rPr>
           <w:rFonts w:ascii="Times New Roman" w:hAnsi="Times New Roman" w:cs="Times New Roman" w:eastAsia="Times New Roman"/>
+          <w:b w:val="0"/>
+          <w:i w:val="0"/>
+          <w:color w:val="000000"/>
+          <w:sz w:val="24"/>
+        </w:rPr>
+        <w:t>Name of Candidate</w:t>
+      </w:r>
+    </w:p>
+    <w:p>
+      <w:pPr>
+        <w:widowControl/>
+        <w:spacing w:before="0" w:after="320" w:lineRule="auto" w:line="276"/>
+        <w:ind w:firstLine="0"/>
+        <w:jc w:val="center"/>
+      </w:pPr>
+      <w:r>
+        <w:rPr>
+          <w:rFonts w:ascii="Times New Roman" w:hAnsi="Times New Roman" w:cs="Times New Roman" w:eastAsia="Times New Roman"/>
           <w:b/>
           <w:i w:val="0"/>
           <w:color w:val="000000"/>
-          <w:sz w:val="24"/>
-        </w:rPr>
-        <w:t>A Thesis submitted in partial fulfilment of the</w:t>
+          <w:sz w:val="26"/>
+        </w:rPr>
+        <w:t>Mohamed Talaat Mohamed AbdelMoaty ElAbd</w:t>
+      </w:r>
+    </w:p>
+    <w:p>
+      <w:pPr>
+        <w:widowControl/>
+        <w:spacing w:before="120" w:after="0" w:lineRule="auto" w:line="276"/>
+        <w:ind w:firstLine="0"/>
+        <w:jc w:val="left"/>
+      </w:pPr>
+      <w:r>
+        <w:rPr>
+          <w:rFonts w:ascii="Times New Roman" w:hAnsi="Times New Roman" w:cs="Times New Roman" w:eastAsia="Times New Roman"/>
+          <w:b/>
+          <w:i/>
+          <w:color w:val="000000"/>
+          <w:sz w:val="24"/>
+        </w:rPr>
+        <w:t>English Title:</w:t>
+      </w:r>
+    </w:p>
+    <w:p>
+      <w:pPr>
+        <w:widowControl/>
+        <w:spacing w:before="120" w:after="0" w:lineRule="auto" w:line="276"/>
+        <w:ind w:firstLine="0"/>
+        <w:jc w:val="center"/>
+      </w:pPr>
+      <w:r>
+        <w:rPr>
+          <w:rFonts w:ascii="Times New Roman" w:hAnsi="Times New Roman" w:cs="Times New Roman" w:eastAsia="Times New Roman"/>
+          <w:b/>
+          <w:i w:val="0"/>
+          <w:color w:val="000000"/>
+          <w:sz w:val="24"/>
+        </w:rPr>
+        <w:t>COMPARATIVE STUDY OF WEAR RESISTANCE</w:t>
       </w:r>
     </w:p>
     <w:p>
@@ -89,7 +215,125 @@
           <w:color w:val="000000"/>
           <w:sz w:val="24"/>
         </w:rPr>
-        <w:t>requirements for the degree of Master of Science</w:t>
+        <w:t>AND SURFACE ROUGHNESS OF INJECTABLE VERSUS</w:t>
+      </w:r>
+    </w:p>
+    <w:p>
+      <w:pPr>
+        <w:widowControl/>
+        <w:spacing w:before="0" w:after="280" w:lineRule="auto" w:line="276"/>
+        <w:ind w:firstLine="0"/>
+        <w:jc w:val="center"/>
+      </w:pPr>
+      <w:r>
+        <w:rPr>
+          <w:rFonts w:ascii="Times New Roman" w:hAnsi="Times New Roman" w:cs="Times New Roman" w:eastAsia="Times New Roman"/>
+          <w:b/>
+          <w:i w:val="0"/>
+          <w:color w:val="000000"/>
+          <w:sz w:val="24"/>
+        </w:rPr>
+        <w:t>CONVENTIONAL COMPOSITE RESIN — IN VITRO STUDY</w:t>
+      </w:r>
+    </w:p>
+    <w:p>
+      <w:pPr>
+        <w:widowControl/>
+        <w:spacing w:before="120" w:after="0" w:lineRule="auto" w:line="276"/>
+        <w:ind w:firstLine="0"/>
+        <w:jc w:val="left"/>
+      </w:pPr>
+      <w:r>
+        <w:rPr>
+          <w:rFonts w:ascii="Times New Roman" w:hAnsi="Times New Roman" w:cs="Times New Roman" w:eastAsia="Times New Roman"/>
+          <w:b/>
+          <w:i/>
+          <w:color w:val="000000"/>
+          <w:sz w:val="24"/>
+        </w:rPr>
+        <w:t>Arabic Title:</w:t>
+      </w:r>
+    </w:p>
+    <w:p>
+      <w:pPr>
+        <w:widowControl/>
+        <w:spacing w:before="120" w:after="280" w:lineRule="auto" w:line="276"/>
+        <w:ind w:firstLine="0"/>
+        <w:jc w:val="center"/>
+      </w:pPr>
+      <w:r>
+        <w:rPr>
+          <w:rFonts w:ascii="Times New Roman" w:hAnsi="Times New Roman" w:cs="Times New Roman" w:eastAsia="Times New Roman"/>
+          <w:b/>
+          <w:i w:val="0"/>
+          <w:color w:val="000000"/>
+          <w:sz w:val="24"/>
+        </w:rPr>
+        <w:t>دراسة مقارنة للتآكل وخشونة سطح الراتينج المركب القابل للحقن والتقليدي – دراسة في المختبر</w:t>
+      </w:r>
+    </w:p>
+    <w:p>
+      <w:pPr>
+        <w:widowControl/>
+        <w:spacing w:before="0" w:after="320" w:lineRule="auto" w:line="276"/>
+        <w:ind w:firstLine="0"/>
+        <w:jc w:val="left"/>
+      </w:pPr>
+      <w:r>
+        <w:rPr>
+          <w:rFonts w:ascii="Times New Roman" w:hAnsi="Times New Roman" w:cs="Times New Roman" w:eastAsia="Times New Roman"/>
+          <w:b/>
+          <w:i w:val="0"/>
+          <w:color w:val="000000"/>
+          <w:sz w:val="24"/>
+        </w:rPr>
+        <w:t xml:space="preserve">Keywords: </w:t>
+      </w:r>
+      <w:r>
+        <w:rPr>
+          <w:rFonts w:ascii="Times New Roman" w:hAnsi="Times New Roman" w:cs="Times New Roman" w:eastAsia="Times New Roman"/>
+          <w:b w:val="0"/>
+          <w:i w:val="0"/>
+          <w:color w:val="000000"/>
+          <w:sz w:val="24"/>
+        </w:rPr>
+        <w:t>Surface roughness, wear, injectable composite, conventional composite.</w:t>
+      </w:r>
+    </w:p>
+    <w:p>
+      <w:pPr>
+        <w:widowControl/>
+        <w:spacing w:before="160" w:after="200" w:lineRule="auto" w:line="276"/>
+        <w:ind w:firstLine="0"/>
+        <w:jc w:val="center"/>
+      </w:pPr>
+      <w:r>
+        <w:rPr>
+          <w:rFonts w:ascii="Times New Roman" w:hAnsi="Times New Roman" w:cs="Times New Roman" w:eastAsia="Times New Roman"/>
+          <w:b/>
+          <w:i w:val="0"/>
+          <w:color w:val="000000"/>
+          <w:sz w:val="24"/>
+        </w:rPr>
+        <w:t>Supervision Committee</w:t>
+      </w:r>
+    </w:p>
+    <w:p>
+      <w:pPr>
+        <w:widowControl/>
+        <w:spacing w:before="0" w:after="120" w:lineRule="auto" w:line="276"/>
+        <w:ind w:firstLine="0"/>
+        <w:jc w:val="center"/>
+      </w:pPr>
+      <w:r>
+        <w:rPr>
+          <w:rFonts w:ascii="Times New Roman" w:hAnsi="Times New Roman" w:cs="Times New Roman" w:eastAsia="Times New Roman"/>
+          <w:b w:val="0"/>
+          <w:i w:val="0"/>
+          <w:color w:val="000000"/>
+          <w:sz w:val="24"/>
+        </w:rPr>
+        <w:t>1. Prof. Wegdan M. Abdel-Fattah</w:t>
       </w:r>
     </w:p>
     <w:p>
@@ -102,240 +346,6 @@
       <w:r>
         <w:rPr>
           <w:rFonts w:ascii="Times New Roman" w:hAnsi="Times New Roman" w:cs="Times New Roman" w:eastAsia="Times New Roman"/>
-          <w:b/>
-          <w:i w:val="0"/>
-          <w:color w:val="000000"/>
-          <w:sz w:val="24"/>
-        </w:rPr>
-        <w:t>in Conservative Dentistry</w:t>
-      </w:r>
-    </w:p>
-    <w:p>
-      <w:pPr>
-        <w:widowControl/>
-        <w:spacing w:before="0" w:after="280" w:lineRule="auto" w:line="276"/>
-        <w:ind w:firstLine="0"/>
-        <w:jc w:val="center"/>
-      </w:pPr>
-      <w:r>
-        <w:rPr>
-          <w:rFonts w:ascii="Times New Roman" w:hAnsi="Times New Roman" w:cs="Times New Roman" w:eastAsia="Times New Roman"/>
-          <w:b/>
-          <w:i w:val="0"/>
-          <w:color w:val="000000"/>
-          <w:sz w:val="24"/>
-        </w:rPr>
-        <w:t>Academic Year 2024–2025 / 2025–2026</w:t>
-      </w:r>
-    </w:p>
-    <w:p>
-      <w:pPr>
-        <w:widowControl/>
-        <w:spacing w:before="120" w:after="0" w:lineRule="auto" w:line="276"/>
-        <w:ind w:firstLine="0"/>
-        <w:jc w:val="center"/>
-      </w:pPr>
-      <w:r>
-        <w:rPr>
-          <w:rFonts w:ascii="Times New Roman" w:hAnsi="Times New Roman" w:cs="Times New Roman" w:eastAsia="Times New Roman"/>
-          <w:b w:val="0"/>
-          <w:i w:val="0"/>
-          <w:color w:val="000000"/>
-          <w:sz w:val="24"/>
-        </w:rPr>
-        <w:t>Name of Candidate</w:t>
-      </w:r>
-    </w:p>
-    <w:p>
-      <w:pPr>
-        <w:widowControl/>
-        <w:spacing w:before="0" w:after="280" w:lineRule="auto" w:line="276"/>
-        <w:ind w:firstLine="0"/>
-        <w:jc w:val="center"/>
-      </w:pPr>
-      <w:r>
-        <w:rPr>
-          <w:rFonts w:ascii="Times New Roman" w:hAnsi="Times New Roman" w:cs="Times New Roman" w:eastAsia="Times New Roman"/>
-          <w:b/>
-          <w:i w:val="0"/>
-          <w:color w:val="000000"/>
-          <w:sz w:val="26"/>
-        </w:rPr>
-        <w:t>Mohamed Talaat Mohamed AbdelMoaty ElAbd</w:t>
-      </w:r>
-    </w:p>
-    <w:p>
-      <w:pPr>
-        <w:widowControl/>
-        <w:spacing w:before="80" w:after="0" w:lineRule="auto" w:line="276"/>
-        <w:ind w:firstLine="0"/>
-        <w:jc w:val="left"/>
-      </w:pPr>
-      <w:r>
-        <w:rPr>
-          <w:rFonts w:ascii="Times New Roman" w:hAnsi="Times New Roman" w:cs="Times New Roman" w:eastAsia="Times New Roman"/>
-          <w:b/>
-          <w:i/>
-          <w:color w:val="000000"/>
-          <w:sz w:val="24"/>
-        </w:rPr>
-        <w:t>English Title:</w:t>
-      </w:r>
-    </w:p>
-    <w:p>
-      <w:pPr>
-        <w:widowControl/>
-        <w:spacing w:before="80" w:after="0" w:lineRule="auto" w:line="276"/>
-        <w:ind w:firstLine="0"/>
-        <w:jc w:val="center"/>
-      </w:pPr>
-      <w:r>
-        <w:rPr>
-          <w:rFonts w:ascii="Times New Roman" w:hAnsi="Times New Roman" w:cs="Times New Roman" w:eastAsia="Times New Roman"/>
-          <w:b/>
-          <w:i w:val="0"/>
-          <w:color w:val="000000"/>
-          <w:sz w:val="24"/>
-        </w:rPr>
-        <w:t>COMPARATIVE STUDY OF WEAR RESISTANCE</w:t>
-      </w:r>
-    </w:p>
-    <w:p>
-      <w:pPr>
-        <w:widowControl/>
-        <w:spacing w:before="0" w:after="0" w:lineRule="auto" w:line="276"/>
-        <w:ind w:firstLine="0"/>
-        <w:jc w:val="center"/>
-      </w:pPr>
-      <w:r>
-        <w:rPr>
-          <w:rFonts w:ascii="Times New Roman" w:hAnsi="Times New Roman" w:cs="Times New Roman" w:eastAsia="Times New Roman"/>
-          <w:b/>
-          <w:i w:val="0"/>
-          <w:color w:val="000000"/>
-          <w:sz w:val="24"/>
-        </w:rPr>
-        <w:t>AND SURFACE ROUGHNESS OF INJECTABLE VERSUS</w:t>
-      </w:r>
-    </w:p>
-    <w:p>
-      <w:pPr>
-        <w:widowControl/>
-        <w:spacing w:before="0" w:after="240" w:lineRule="auto" w:line="276"/>
-        <w:ind w:firstLine="0"/>
-        <w:jc w:val="center"/>
-      </w:pPr>
-      <w:r>
-        <w:rPr>
-          <w:rFonts w:ascii="Times New Roman" w:hAnsi="Times New Roman" w:cs="Times New Roman" w:eastAsia="Times New Roman"/>
-          <w:b/>
-          <w:i w:val="0"/>
-          <w:color w:val="000000"/>
-          <w:sz w:val="24"/>
-        </w:rPr>
-        <w:t>CONVENTIONAL COMPOSITE RESIN — IN VITRO STUDY</w:t>
-      </w:r>
-    </w:p>
-    <w:p>
-      <w:pPr>
-        <w:widowControl/>
-        <w:spacing w:before="80" w:after="0" w:lineRule="auto" w:line="276"/>
-        <w:ind w:firstLine="0"/>
-        <w:jc w:val="left"/>
-      </w:pPr>
-      <w:r>
-        <w:rPr>
-          <w:rFonts w:ascii="Times New Roman" w:hAnsi="Times New Roman" w:cs="Times New Roman" w:eastAsia="Times New Roman"/>
-          <w:b/>
-          <w:i/>
-          <w:color w:val="000000"/>
-          <w:sz w:val="24"/>
-        </w:rPr>
-        <w:t>Arabic Title:</w:t>
-      </w:r>
-    </w:p>
-    <w:p>
-      <w:pPr>
-        <w:widowControl/>
-        <w:spacing w:before="80" w:after="240" w:lineRule="auto" w:line="276"/>
-        <w:ind w:firstLine="0"/>
-        <w:jc w:val="center"/>
-      </w:pPr>
-      <w:r>
-        <w:rPr>
-          <w:rFonts w:ascii="Times New Roman" w:hAnsi="Times New Roman" w:cs="Times New Roman" w:eastAsia="Times New Roman"/>
-          <w:b/>
-          <w:i w:val="0"/>
-          <w:color w:val="000000"/>
-          <w:sz w:val="24"/>
-        </w:rPr>
-        <w:t>دراسة مقارنة للتآكل وخشونة سطح الراتينج المركب القابل للحقن والتقليدي – دراسة في المختبر</w:t>
-      </w:r>
-    </w:p>
-    <w:p>
-      <w:pPr>
-        <w:widowControl/>
-        <w:spacing w:before="0" w:after="280" w:lineRule="auto" w:line="276"/>
-        <w:ind w:firstLine="0"/>
-        <w:jc w:val="left"/>
-      </w:pPr>
-      <w:r>
-        <w:rPr>
-          <w:rFonts w:ascii="Times New Roman" w:hAnsi="Times New Roman" w:cs="Times New Roman" w:eastAsia="Times New Roman"/>
-          <w:b w:val="0"/>
-          <w:i w:val="0"/>
-          <w:color w:val="000000"/>
-          <w:sz w:val="24"/>
-        </w:rPr>
-        <w:t>Keywords: Surface roughness, wear, injectable composite, conventional composite.</w:t>
-      </w:r>
-    </w:p>
-    <w:p>
-      <w:pPr>
-        <w:widowControl/>
-        <w:spacing w:before="120" w:after="160" w:lineRule="auto" w:line="276"/>
-        <w:ind w:firstLine="0"/>
-        <w:jc w:val="center"/>
-      </w:pPr>
-      <w:r>
-        <w:rPr>
-          <w:rFonts w:ascii="Times New Roman" w:hAnsi="Times New Roman" w:cs="Times New Roman" w:eastAsia="Times New Roman"/>
-          <w:b/>
-          <w:i w:val="0"/>
-          <w:color w:val="000000"/>
-          <w:sz w:val="24"/>
-        </w:rPr>
-        <w:t>Supervision Committee</w:t>
-      </w:r>
-    </w:p>
-    <w:p>
-      <w:pPr>
-        <w:widowControl/>
-        <w:spacing w:before="0" w:after="80" w:lineRule="auto" w:line="276"/>
-        <w:ind w:firstLine="0"/>
-        <w:jc w:val="center"/>
-      </w:pPr>
-      <w:r>
-        <w:rPr>
-          <w:rFonts w:ascii="Times New Roman" w:hAnsi="Times New Roman" w:cs="Times New Roman" w:eastAsia="Times New Roman"/>
-          <w:b w:val="0"/>
-          <w:i w:val="0"/>
-          <w:color w:val="000000"/>
-          <w:sz w:val="24"/>
-        </w:rPr>
-        <w:t>1. Prof. Wegdan M. Abdel-Fattah</w:t>
-      </w:r>
-    </w:p>
-    <w:p>
-      <w:pPr>
-        <w:widowControl/>
-        <w:spacing w:before="0" w:after="0" w:lineRule="auto" w:line="276"/>
-        <w:ind w:firstLine="0"/>
-        <w:jc w:val="center"/>
-      </w:pPr>
-      <w:r>
-        <w:rPr>
-          <w:rFonts w:ascii="Times New Roman" w:hAnsi="Times New Roman" w:cs="Times New Roman" w:eastAsia="Times New Roman"/>
           <w:b w:val="0"/>
           <w:i w:val="0"/>
           <w:color w:val="000000"/>
@@ -350,7 +360,7 @@
           <w:headerReference w:type="default" r:id="rId9"/>
           <w:footerReference w:type="default" r:id="rId10"/>
           <w:pgSz w:w="11906" w:h="16838"/>
-          <w:pgMar w:top="1814" w:right="1247" w:bottom="1701" w:left="1701" w:header="340" w:footer="283" w:gutter="0"/>
+          <w:pgMar w:top="1446" w:right="1247" w:bottom="1304" w:left="1701" w:header="170" w:footer="159" w:gutter="0"/>
           <w:cols w:space="720"/>
           <w:docGrid w:linePitch="360"/>
         </w:sectPr>
@@ -361,7 +371,7 @@
         <w:pStyle w:val="Heading1"/>
         <w:keepNext/>
         <w:widowControl/>
-        <w:spacing w:before="0" w:after="240" w:line="240" w:lineRule="auto"/>
+        <w:spacing w:before="0" w:after="320" w:line="240" w:lineRule="auto"/>
         <w:ind w:firstLine="0"/>
         <w:jc w:val="center"/>
       </w:pPr>
@@ -379,7 +389,7 @@
     <w:p>
       <w:pPr>
         <w:widowControl/>
-        <w:spacing w:before="0" w:after="40" w:lineRule="auto" w:line="276"/>
+        <w:spacing w:before="200" w:after="120" w:lineRule="auto" w:line="276"/>
         <w:ind w:left="720" w:hanging="357"/>
         <w:jc w:val="both"/>
       </w:pPr>
@@ -407,7 +417,7 @@
     <w:p>
       <w:pPr>
         <w:widowControl/>
-        <w:spacing w:before="0" w:after="40" w:lineRule="auto" w:line="276"/>
+        <w:spacing w:before="0" w:after="80" w:lineRule="auto" w:line="276"/>
         <w:ind w:firstLine="0" w:left="720"/>
         <w:jc w:val="both"/>
       </w:pPr>
@@ -425,7 +435,7 @@
     <w:p>
       <w:pPr>
         <w:widowControl/>
-        <w:spacing w:before="0" w:after="40" w:lineRule="auto" w:line="276"/>
+        <w:spacing w:before="0" w:after="80" w:lineRule="auto" w:line="276"/>
         <w:ind w:firstLine="0" w:left="720"/>
         <w:jc w:val="both"/>
       </w:pPr>
@@ -443,7 +453,7 @@
     <w:p>
       <w:pPr>
         <w:widowControl/>
-        <w:spacing w:before="0" w:after="40" w:lineRule="auto" w:line="276"/>
+        <w:spacing w:before="0" w:after="80" w:lineRule="auto" w:line="276"/>
         <w:ind w:firstLine="0" w:left="720"/>
         <w:jc w:val="both"/>
       </w:pPr>
@@ -461,7 +471,7 @@
     <w:p>
       <w:pPr>
         <w:widowControl/>
-        <w:spacing w:before="0" w:after="40" w:lineRule="auto" w:line="276"/>
+        <w:spacing w:before="0" w:after="80" w:lineRule="auto" w:line="276"/>
         <w:ind w:firstLine="0" w:left="720"/>
         <w:jc w:val="both"/>
       </w:pPr>
@@ -479,7 +489,7 @@
     <w:p>
       <w:pPr>
         <w:widowControl/>
-        <w:spacing w:before="0" w:after="40" w:lineRule="auto" w:line="276"/>
+        <w:spacing w:before="200" w:after="120" w:lineRule="auto" w:line="276"/>
         <w:ind w:left="720" w:hanging="357"/>
         <w:jc w:val="both"/>
       </w:pPr>
@@ -507,7 +517,7 @@
     <w:p>
       <w:pPr>
         <w:widowControl/>
-        <w:spacing w:before="0" w:after="40" w:lineRule="auto" w:line="276"/>
+        <w:spacing w:before="0" w:after="80" w:lineRule="auto" w:line="276"/>
         <w:ind w:firstLine="0" w:left="720"/>
         <w:jc w:val="both"/>
       </w:pPr>
@@ -525,7 +535,7 @@
     <w:p>
       <w:pPr>
         <w:widowControl/>
-        <w:spacing w:before="0" w:after="40" w:lineRule="auto" w:line="276"/>
+        <w:spacing w:before="0" w:after="80" w:lineRule="auto" w:line="276"/>
         <w:ind w:firstLine="0" w:left="720"/>
         <w:jc w:val="both"/>
       </w:pPr>
@@ -543,7 +553,7 @@
     <w:p>
       <w:pPr>
         <w:widowControl/>
-        <w:spacing w:before="0" w:after="40" w:lineRule="auto" w:line="276"/>
+        <w:spacing w:before="0" w:after="80" w:lineRule="auto" w:line="276"/>
         <w:ind w:firstLine="0" w:left="720"/>
         <w:jc w:val="both"/>
       </w:pPr>
@@ -561,7 +571,7 @@
     <w:p>
       <w:pPr>
         <w:widowControl/>
-        <w:spacing w:before="0" w:after="40" w:lineRule="auto" w:line="276"/>
+        <w:spacing w:before="0" w:after="80" w:lineRule="auto" w:line="276"/>
         <w:ind w:firstLine="0" w:left="720"/>
         <w:jc w:val="both"/>
       </w:pPr>
@@ -582,7 +592,7 @@
         <w:keepNext/>
         <w:pageBreakBefore/>
         <w:widowControl/>
-        <w:spacing w:before="0" w:after="240" w:line="240" w:lineRule="auto"/>
+        <w:spacing w:before="0" w:after="320" w:line="240" w:lineRule="auto"/>
         <w:ind w:firstLine="0"/>
         <w:jc w:val="center"/>
       </w:pPr>
@@ -621,7 +631,7 @@
         <w:keepNext/>
         <w:pageBreakBefore/>
         <w:widowControl/>
-        <w:spacing w:before="0" w:after="240" w:line="240" w:lineRule="auto"/>
+        <w:spacing w:before="0" w:after="320" w:line="240" w:lineRule="auto"/>
         <w:ind w:firstLine="0"/>
         <w:jc w:val="center"/>
       </w:pPr>
@@ -639,7 +649,7 @@
     <w:p>
       <w:pPr>
         <w:widowControl/>
-        <w:spacing w:before="160" w:after="80" w:lineRule="auto" w:line="276"/>
+        <w:spacing w:before="200" w:after="160" w:lineRule="auto" w:line="276"/>
         <w:ind w:firstLine="0"/>
         <w:jc w:val="left"/>
         <w:tabs>
@@ -674,7 +684,7 @@
     <w:p>
       <w:pPr>
         <w:widowControl/>
-        <w:spacing w:before="40" w:after="40" w:lineRule="auto" w:line="276"/>
+        <w:spacing w:before="80" w:after="80" w:lineRule="auto" w:line="276"/>
         <w:ind w:firstLine="0"/>
         <w:jc w:val="left"/>
         <w:tabs>
@@ -706,7 +716,7 @@
     <w:p>
       <w:pPr>
         <w:widowControl/>
-        <w:spacing w:before="40" w:after="40" w:lineRule="auto" w:line="276"/>
+        <w:spacing w:before="80" w:after="80" w:lineRule="auto" w:line="276"/>
         <w:ind w:firstLine="0"/>
         <w:jc w:val="left"/>
         <w:tabs>
@@ -738,7 +748,7 @@
     <w:p>
       <w:pPr>
         <w:widowControl/>
-        <w:spacing w:before="40" w:after="40" w:lineRule="auto" w:line="276"/>
+        <w:spacing w:before="80" w:after="80" w:lineRule="auto" w:line="276"/>
         <w:ind w:firstLine="0"/>
         <w:jc w:val="left"/>
         <w:tabs>
@@ -770,7 +780,7 @@
     <w:p>
       <w:pPr>
         <w:widowControl/>
-        <w:spacing w:before="40" w:after="40" w:lineRule="auto" w:line="276"/>
+        <w:spacing w:before="80" w:after="80" w:lineRule="auto" w:line="276"/>
         <w:ind w:firstLine="0"/>
         <w:jc w:val="left"/>
         <w:tabs>
@@ -802,7 +812,7 @@
     <w:p>
       <w:pPr>
         <w:widowControl/>
-        <w:spacing w:before="40" w:after="40" w:lineRule="auto" w:line="276"/>
+        <w:spacing w:before="80" w:after="80" w:lineRule="auto" w:line="276"/>
         <w:ind w:firstLine="0"/>
         <w:jc w:val="left"/>
         <w:tabs>
@@ -834,7 +844,7 @@
     <w:p>
       <w:pPr>
         <w:widowControl/>
-        <w:spacing w:before="40" w:after="40" w:lineRule="auto" w:line="276"/>
+        <w:spacing w:before="80" w:after="80" w:lineRule="auto" w:line="276"/>
         <w:ind w:firstLine="0"/>
         <w:jc w:val="left"/>
         <w:tabs>
@@ -866,7 +876,7 @@
     <w:p>
       <w:pPr>
         <w:widowControl/>
-        <w:spacing w:before="40" w:after="40" w:lineRule="auto" w:line="276"/>
+        <w:spacing w:before="80" w:after="80" w:lineRule="auto" w:line="276"/>
         <w:ind w:firstLine="0"/>
         <w:jc w:val="left"/>
         <w:tabs>
@@ -898,7 +908,7 @@
     <w:p>
       <w:pPr>
         <w:widowControl/>
-        <w:spacing w:before="40" w:after="40" w:lineRule="auto" w:line="276"/>
+        <w:spacing w:before="80" w:after="80" w:lineRule="auto" w:line="276"/>
         <w:ind w:firstLine="0"/>
         <w:jc w:val="left"/>
         <w:tabs>
@@ -930,7 +940,7 @@
     <w:p>
       <w:pPr>
         <w:widowControl/>
-        <w:spacing w:before="40" w:after="40" w:lineRule="auto" w:line="276"/>
+        <w:spacing w:before="80" w:after="80" w:lineRule="auto" w:line="276"/>
         <w:ind w:firstLine="0"/>
         <w:jc w:val="left"/>
         <w:tabs>
@@ -956,13 +966,13 @@
           <w:sz w:val="24"/>
         </w:rPr>
         <w:tab/>
-        <w:t>21</w:t>
+        <w:t>20</w:t>
       </w:r>
     </w:p>
     <w:p>
       <w:pPr>
         <w:widowControl/>
-        <w:spacing w:before="40" w:after="40" w:lineRule="auto" w:line="276"/>
+        <w:spacing w:before="80" w:after="80" w:lineRule="auto" w:line="276"/>
         <w:ind w:firstLine="0"/>
         <w:jc w:val="left"/>
         <w:tabs>
@@ -988,13 +998,13 @@
           <w:sz w:val="24"/>
         </w:rPr>
         <w:tab/>
-        <w:t>26</w:t>
+        <w:t>25</w:t>
       </w:r>
     </w:p>
     <w:p>
       <w:pPr>
         <w:widowControl/>
-        <w:spacing w:before="40" w:after="40" w:lineRule="auto" w:line="276"/>
+        <w:spacing w:before="80" w:after="80" w:lineRule="auto" w:line="276"/>
         <w:ind w:firstLine="0"/>
         <w:jc w:val="left"/>
         <w:tabs>
@@ -1020,13 +1030,13 @@
           <w:sz w:val="24"/>
         </w:rPr>
         <w:tab/>
-        <w:t>32</w:t>
+        <w:t>31</w:t>
       </w:r>
     </w:p>
     <w:p>
       <w:pPr>
         <w:widowControl/>
-        <w:spacing w:before="40" w:after="40" w:lineRule="auto" w:line="276"/>
+        <w:spacing w:before="80" w:after="80" w:lineRule="auto" w:line="276"/>
         <w:ind w:firstLine="0"/>
         <w:jc w:val="left"/>
         <w:tabs>
@@ -1052,13 +1062,13 @@
           <w:sz w:val="24"/>
         </w:rPr>
         <w:tab/>
-        <w:t>38</w:t>
+        <w:t>37</w:t>
       </w:r>
     </w:p>
     <w:p>
       <w:pPr>
         <w:widowControl/>
-        <w:spacing w:before="40" w:after="40" w:lineRule="auto" w:line="276"/>
+        <w:spacing w:before="80" w:after="80" w:lineRule="auto" w:line="276"/>
         <w:ind w:firstLine="0"/>
         <w:jc w:val="left"/>
         <w:tabs>
@@ -1084,7 +1094,7 @@
           <w:sz w:val="24"/>
         </w:rPr>
         <w:tab/>
-        <w:t>40</w:t>
+        <w:t>39</w:t>
       </w:r>
     </w:p>
     <w:p>
@@ -1093,7 +1103,7 @@
         <w:keepNext/>
         <w:pageBreakBefore/>
         <w:widowControl/>
-        <w:spacing w:before="0" w:after="240" w:line="240" w:lineRule="auto"/>
+        <w:spacing w:before="0" w:after="320" w:line="240" w:lineRule="auto"/>
         <w:ind w:firstLine="0"/>
         <w:jc w:val="center"/>
       </w:pPr>
@@ -1111,63 +1121,143 @@
     <w:p>
       <w:pPr>
         <w:widowControl/>
-        <w:spacing w:before="0" w:after="60" w:lineRule="auto" w:line="276"/>
+        <w:spacing w:before="200" w:after="160" w:lineRule="auto" w:line="276"/>
         <w:ind w:firstLine="0"/>
-        <w:jc w:val="both"/>
-      </w:pPr>
-      <w:r>
-        <w:rPr>
-          <w:rFonts w:ascii="Times New Roman" w:hAnsi="Times New Roman" w:cs="Times New Roman" w:eastAsia="Times New Roman"/>
-          <w:b w:val="0"/>
-          <w:i w:val="0"/>
-          <w:color w:val="000000"/>
-          <w:sz w:val="24"/>
-        </w:rPr>
-        <w:t>Table 3.1 Composition of the resin composites</w:t>
+        <w:jc w:val="left"/>
+        <w:tabs>
+          <w:tab w:val="right" w:leader="none" w:pos="8958"/>
+        </w:tabs>
+        <w:pBdr>
+          <w:bottom w:val="single" w:sz="8" w:space="4" w:color="000000"/>
+        </w:pBdr>
+      </w:pPr>
+      <w:r>
+        <w:rPr>
+          <w:rFonts w:ascii="Times New Roman" w:hAnsi="Times New Roman" w:cs="Times New Roman" w:eastAsia="Times New Roman"/>
+          <w:b/>
+          <w:i w:val="0"/>
+          <w:color w:val="000000"/>
+          <w:sz w:val="24"/>
+        </w:rPr>
+        <w:t>Title</w:t>
+      </w:r>
+      <w:r>
+        <w:rPr>
+          <w:rFonts w:ascii="Times New Roman" w:hAnsi="Times New Roman" w:cs="Times New Roman" w:eastAsia="Times New Roman"/>
+          <w:b/>
+          <w:i w:val="0"/>
+          <w:color w:val="000000"/>
+          <w:sz w:val="24"/>
+        </w:rPr>
+        <w:tab/>
+        <w:t>Page</w:t>
       </w:r>
     </w:p>
     <w:p>
       <w:pPr>
         <w:widowControl/>
-        <w:spacing w:before="0" w:after="60" w:lineRule="auto" w:line="276"/>
+        <w:spacing w:before="120" w:after="120" w:lineRule="auto" w:line="276"/>
         <w:ind w:firstLine="0"/>
-        <w:jc w:val="both"/>
-      </w:pPr>
-      <w:r>
-        <w:rPr>
-          <w:rFonts w:ascii="Times New Roman" w:hAnsi="Times New Roman" w:cs="Times New Roman" w:eastAsia="Times New Roman"/>
-          <w:b w:val="0"/>
-          <w:i w:val="0"/>
-          <w:color w:val="000000"/>
-          <w:sz w:val="24"/>
-        </w:rPr>
-        <w:t>Table 4.1 Weight before and after brushing and percentage weight loss</w:t>
+        <w:jc w:val="left"/>
+        <w:tabs>
+          <w:tab w:val="right" w:leader="dot" w:pos="8958"/>
+        </w:tabs>
+      </w:pPr>
+      <w:r>
+        <w:rPr>
+          <w:rFonts w:ascii="Times New Roman" w:hAnsi="Times New Roman" w:cs="Times New Roman" w:eastAsia="Times New Roman"/>
+          <w:b w:val="0"/>
+          <w:i w:val="0"/>
+          <w:color w:val="000000"/>
+          <w:sz w:val="24"/>
+        </w:rPr>
+        <w:t>Table 3.1 Composition of the resin composites</w:t>
+      </w:r>
+      <w:r>
+        <w:rPr>
+          <w:rFonts w:ascii="Times New Roman" w:hAnsi="Times New Roman" w:cs="Times New Roman" w:eastAsia="Times New Roman"/>
+          <w:b w:val="0"/>
+          <w:i w:val="0"/>
+          <w:color w:val="000000"/>
+          <w:sz w:val="24"/>
+        </w:rPr>
+        <w:tab/>
+        <w:t>21</w:t>
       </w:r>
     </w:p>
     <w:p>
       <w:pPr>
         <w:widowControl/>
-        <w:spacing w:before="0" w:after="60" w:lineRule="auto" w:line="276"/>
+        <w:spacing w:before="120" w:after="120" w:lineRule="auto" w:line="276"/>
         <w:ind w:firstLine="0"/>
-        <w:jc w:val="both"/>
-      </w:pPr>
-      <w:r>
-        <w:rPr>
-          <w:rFonts w:ascii="Times New Roman" w:hAnsi="Times New Roman" w:cs="Times New Roman" w:eastAsia="Times New Roman"/>
-          <w:b w:val="0"/>
-          <w:i w:val="0"/>
-          <w:color w:val="000000"/>
-          <w:sz w:val="24"/>
-        </w:rPr>
-        <w:t>Table 4.2 Absolute weight loss after 10 000 brushing cycles</w:t>
+        <w:jc w:val="left"/>
+        <w:tabs>
+          <w:tab w:val="right" w:leader="dot" w:pos="8958"/>
+        </w:tabs>
+      </w:pPr>
+      <w:r>
+        <w:rPr>
+          <w:rFonts w:ascii="Times New Roman" w:hAnsi="Times New Roman" w:cs="Times New Roman" w:eastAsia="Times New Roman"/>
+          <w:b w:val="0"/>
+          <w:i w:val="0"/>
+          <w:color w:val="000000"/>
+          <w:sz w:val="24"/>
+        </w:rPr>
+        <w:t>Table 4.1 Weight before and after brushing and percentage weight loss</w:t>
+      </w:r>
+      <w:r>
+        <w:rPr>
+          <w:rFonts w:ascii="Times New Roman" w:hAnsi="Times New Roman" w:cs="Times New Roman" w:eastAsia="Times New Roman"/>
+          <w:b w:val="0"/>
+          <w:i w:val="0"/>
+          <w:color w:val="000000"/>
+          <w:sz w:val="24"/>
+        </w:rPr>
+        <w:tab/>
+        <w:t>25</w:t>
       </w:r>
     </w:p>
     <w:p>
       <w:pPr>
         <w:widowControl/>
-        <w:spacing w:before="0" w:after="60" w:lineRule="auto" w:line="276"/>
+        <w:spacing w:before="120" w:after="120" w:lineRule="auto" w:line="276"/>
         <w:ind w:firstLine="0"/>
-        <w:jc w:val="both"/>
+        <w:jc w:val="left"/>
+        <w:tabs>
+          <w:tab w:val="right" w:leader="dot" w:pos="8958"/>
+        </w:tabs>
+      </w:pPr>
+      <w:r>
+        <w:rPr>
+          <w:rFonts w:ascii="Times New Roman" w:hAnsi="Times New Roman" w:cs="Times New Roman" w:eastAsia="Times New Roman"/>
+          <w:b w:val="0"/>
+          <w:i w:val="0"/>
+          <w:color w:val="000000"/>
+          <w:sz w:val="24"/>
+        </w:rPr>
+        <w:t>Table 4.2 Absolute weight loss after 10 000 brushing cycles</w:t>
+      </w:r>
+      <w:r>
+        <w:rPr>
+          <w:rFonts w:ascii="Times New Roman" w:hAnsi="Times New Roman" w:cs="Times New Roman" w:eastAsia="Times New Roman"/>
+          <w:b w:val="0"/>
+          <w:i w:val="0"/>
+          <w:color w:val="000000"/>
+          <w:sz w:val="24"/>
+        </w:rPr>
+        <w:tab/>
+        <w:t>27</w:t>
+      </w:r>
+    </w:p>
+    <w:p>
+      <w:pPr>
+        <w:widowControl/>
+        <w:spacing w:before="120" w:after="120" w:lineRule="auto" w:line="276"/>
+        <w:ind w:firstLine="0"/>
+        <w:jc w:val="left"/>
+        <w:tabs>
+          <w:tab w:val="right" w:leader="dot" w:pos="8958"/>
+        </w:tabs>
       </w:pPr>
       <w:r>
         <w:rPr>
@@ -1178,6 +1268,17 @@
           <w:sz w:val="24"/>
         </w:rPr>
         <w:t>Table 4.3 Ra before and after brushing and ΔRa</w:t>
+      </w:r>
+      <w:r>
+        <w:rPr>
+          <w:rFonts w:ascii="Times New Roman" w:hAnsi="Times New Roman" w:cs="Times New Roman" w:eastAsia="Times New Roman"/>
+          <w:b w:val="0"/>
+          <w:i w:val="0"/>
+          <w:color w:val="000000"/>
+          <w:sz w:val="24"/>
+        </w:rPr>
+        <w:tab/>
+        <w:t>27</w:t>
       </w:r>
     </w:p>
     <w:p>
@@ -1186,7 +1287,7 @@
         <w:keepNext/>
         <w:pageBreakBefore/>
         <w:widowControl/>
-        <w:spacing w:before="0" w:after="240" w:line="240" w:lineRule="auto"/>
+        <w:spacing w:before="0" w:after="320" w:line="240" w:lineRule="auto"/>
         <w:ind w:firstLine="0"/>
         <w:jc w:val="center"/>
       </w:pPr>
@@ -1204,45 +1305,111 @@
     <w:p>
       <w:pPr>
         <w:widowControl/>
-        <w:spacing w:before="0" w:after="60" w:lineRule="auto" w:line="276"/>
+        <w:spacing w:before="200" w:after="160" w:lineRule="auto" w:line="276"/>
         <w:ind w:firstLine="0"/>
-        <w:jc w:val="both"/>
-      </w:pPr>
-      <w:r>
-        <w:rPr>
-          <w:rFonts w:ascii="Times New Roman" w:hAnsi="Times New Roman" w:cs="Times New Roman" w:eastAsia="Times New Roman"/>
-          <w:b w:val="0"/>
-          <w:i w:val="0"/>
-          <w:color w:val="000000"/>
-          <w:sz w:val="24"/>
-        </w:rPr>
-        <w:t>Figure 4.1 Mean percentage weight loss after 10 000 brushing cycles</w:t>
+        <w:jc w:val="left"/>
+        <w:tabs>
+          <w:tab w:val="right" w:leader="none" w:pos="8958"/>
+        </w:tabs>
+        <w:pBdr>
+          <w:bottom w:val="single" w:sz="8" w:space="4" w:color="000000"/>
+        </w:pBdr>
+      </w:pPr>
+      <w:r>
+        <w:rPr>
+          <w:rFonts w:ascii="Times New Roman" w:hAnsi="Times New Roman" w:cs="Times New Roman" w:eastAsia="Times New Roman"/>
+          <w:b/>
+          <w:i w:val="0"/>
+          <w:color w:val="000000"/>
+          <w:sz w:val="24"/>
+        </w:rPr>
+        <w:t>Title</w:t>
+      </w:r>
+      <w:r>
+        <w:rPr>
+          <w:rFonts w:ascii="Times New Roman" w:hAnsi="Times New Roman" w:cs="Times New Roman" w:eastAsia="Times New Roman"/>
+          <w:b/>
+          <w:i w:val="0"/>
+          <w:color w:val="000000"/>
+          <w:sz w:val="24"/>
+        </w:rPr>
+        <w:tab/>
+        <w:t>Page</w:t>
       </w:r>
     </w:p>
     <w:p>
       <w:pPr>
         <w:widowControl/>
-        <w:spacing w:before="0" w:after="60" w:lineRule="auto" w:line="276"/>
+        <w:spacing w:before="120" w:after="120" w:lineRule="auto" w:line="276"/>
         <w:ind w:firstLine="0"/>
-        <w:jc w:val="both"/>
-      </w:pPr>
-      <w:r>
-        <w:rPr>
-          <w:rFonts w:ascii="Times New Roman" w:hAnsi="Times New Roman" w:cs="Times New Roman" w:eastAsia="Times New Roman"/>
-          <w:b w:val="0"/>
-          <w:i w:val="0"/>
-          <w:color w:val="000000"/>
-          <w:sz w:val="24"/>
-        </w:rPr>
-        <w:t>Figure 4.2 Mean Ra before and after brushing, with the 0.2 µm plaque-retention threshold</w:t>
+        <w:jc w:val="left"/>
+        <w:tabs>
+          <w:tab w:val="right" w:leader="dot" w:pos="8958"/>
+        </w:tabs>
+      </w:pPr>
+      <w:r>
+        <w:rPr>
+          <w:rFonts w:ascii="Times New Roman" w:hAnsi="Times New Roman" w:cs="Times New Roman" w:eastAsia="Times New Roman"/>
+          <w:b w:val="0"/>
+          <w:i w:val="0"/>
+          <w:color w:val="000000"/>
+          <w:sz w:val="24"/>
+        </w:rPr>
+        <w:t>Figure 4.1 Mean percentage weight loss after 10 000 brushing cycles</w:t>
+      </w:r>
+      <w:r>
+        <w:rPr>
+          <w:rFonts w:ascii="Times New Roman" w:hAnsi="Times New Roman" w:cs="Times New Roman" w:eastAsia="Times New Roman"/>
+          <w:b w:val="0"/>
+          <w:i w:val="0"/>
+          <w:color w:val="000000"/>
+          <w:sz w:val="24"/>
+        </w:rPr>
+        <w:tab/>
+        <w:t>26</w:t>
       </w:r>
     </w:p>
     <w:p>
       <w:pPr>
         <w:widowControl/>
-        <w:spacing w:before="0" w:after="60" w:lineRule="auto" w:line="276"/>
+        <w:spacing w:before="120" w:after="120" w:lineRule="auto" w:line="276"/>
         <w:ind w:firstLine="0"/>
-        <w:jc w:val="both"/>
+        <w:jc w:val="left"/>
+        <w:tabs>
+          <w:tab w:val="right" w:leader="dot" w:pos="8958"/>
+        </w:tabs>
+      </w:pPr>
+      <w:r>
+        <w:rPr>
+          <w:rFonts w:ascii="Times New Roman" w:hAnsi="Times New Roman" w:cs="Times New Roman" w:eastAsia="Times New Roman"/>
+          <w:b w:val="0"/>
+          <w:i w:val="0"/>
+          <w:color w:val="000000"/>
+          <w:sz w:val="24"/>
+        </w:rPr>
+        <w:t>Figure 4.2 Mean Ra before and after brushing (0.2 µm threshold)</w:t>
+      </w:r>
+      <w:r>
+        <w:rPr>
+          <w:rFonts w:ascii="Times New Roman" w:hAnsi="Times New Roman" w:cs="Times New Roman" w:eastAsia="Times New Roman"/>
+          <w:b w:val="0"/>
+          <w:i w:val="0"/>
+          <w:color w:val="000000"/>
+          <w:sz w:val="24"/>
+        </w:rPr>
+        <w:tab/>
+        <w:t>28</w:t>
+      </w:r>
+    </w:p>
+    <w:p>
+      <w:pPr>
+        <w:widowControl/>
+        <w:spacing w:before="120" w:after="120" w:lineRule="auto" w:line="276"/>
+        <w:ind w:firstLine="0"/>
+        <w:jc w:val="left"/>
+        <w:tabs>
+          <w:tab w:val="right" w:leader="dot" w:pos="8958"/>
+        </w:tabs>
       </w:pPr>
       <w:r>
         <w:rPr>
@@ -1253,6 +1420,17 @@
           <w:sz w:val="24"/>
         </w:rPr>
         <w:t>Figure 4.3 Mean change in surface roughness (ΔRa)</w:t>
+      </w:r>
+      <w:r>
+        <w:rPr>
+          <w:rFonts w:ascii="Times New Roman" w:hAnsi="Times New Roman" w:cs="Times New Roman" w:eastAsia="Times New Roman"/>
+          <w:b w:val="0"/>
+          <w:i w:val="0"/>
+          <w:color w:val="000000"/>
+          <w:sz w:val="24"/>
+        </w:rPr>
+        <w:tab/>
+        <w:t>29</w:t>
       </w:r>
     </w:p>
     <w:p>
@@ -1261,7 +1439,7 @@
         <w:keepNext/>
         <w:pageBreakBefore/>
         <w:widowControl/>
-        <w:spacing w:before="0" w:after="240" w:line="240" w:lineRule="auto"/>
+        <w:spacing w:before="0" w:after="320" w:line="240" w:lineRule="auto"/>
         <w:ind w:firstLine="0"/>
         <w:jc w:val="center"/>
       </w:pPr>
@@ -1279,7 +1457,7 @@
     <w:p>
       <w:pPr>
         <w:widowControl/>
-        <w:spacing w:before="0" w:after="40" w:lineRule="auto" w:line="276"/>
+        <w:spacing w:before="0" w:after="80" w:lineRule="auto" w:line="276"/>
         <w:ind w:firstLine="0"/>
         <w:jc w:val="both"/>
       </w:pPr>
@@ -1297,7 +1475,7 @@
     <w:p>
       <w:pPr>
         <w:widowControl/>
-        <w:spacing w:before="0" w:after="40" w:lineRule="auto" w:line="276"/>
+        <w:spacing w:before="0" w:after="80" w:lineRule="auto" w:line="276"/>
         <w:ind w:firstLine="0"/>
         <w:jc w:val="both"/>
       </w:pPr>
@@ -1315,7 +1493,7 @@
     <w:p>
       <w:pPr>
         <w:widowControl/>
-        <w:spacing w:before="0" w:after="40" w:lineRule="auto" w:line="276"/>
+        <w:spacing w:before="0" w:after="80" w:lineRule="auto" w:line="276"/>
         <w:ind w:firstLine="0"/>
         <w:jc w:val="both"/>
       </w:pPr>
@@ -1333,7 +1511,7 @@
     <w:p>
       <w:pPr>
         <w:widowControl/>
-        <w:spacing w:before="0" w:after="40" w:lineRule="auto" w:line="276"/>
+        <w:spacing w:before="0" w:after="80" w:lineRule="auto" w:line="276"/>
         <w:ind w:firstLine="0"/>
         <w:jc w:val="both"/>
       </w:pPr>
@@ -1351,7 +1529,7 @@
     <w:p>
       <w:pPr>
         <w:widowControl/>
-        <w:spacing w:before="0" w:after="40" w:lineRule="auto" w:line="276"/>
+        <w:spacing w:before="0" w:after="80" w:lineRule="auto" w:line="276"/>
         <w:ind w:firstLine="0"/>
         <w:jc w:val="both"/>
       </w:pPr>
@@ -1369,7 +1547,7 @@
     <w:p>
       <w:pPr>
         <w:widowControl/>
-        <w:spacing w:before="0" w:after="40" w:lineRule="auto" w:line="276"/>
+        <w:spacing w:before="0" w:after="80" w:lineRule="auto" w:line="276"/>
         <w:ind w:firstLine="0"/>
         <w:jc w:val="both"/>
       </w:pPr>
@@ -1387,7 +1565,7 @@
     <w:p>
       <w:pPr>
         <w:widowControl/>
-        <w:spacing w:before="0" w:after="40" w:lineRule="auto" w:line="276"/>
+        <w:spacing w:before="0" w:after="80" w:lineRule="auto" w:line="276"/>
         <w:ind w:firstLine="0"/>
         <w:jc w:val="both"/>
       </w:pPr>
@@ -1405,7 +1583,7 @@
     <w:p>
       <w:pPr>
         <w:widowControl/>
-        <w:spacing w:before="0" w:after="40" w:lineRule="auto" w:line="276"/>
+        <w:spacing w:before="0" w:after="80" w:lineRule="auto" w:line="276"/>
         <w:ind w:firstLine="0"/>
         <w:jc w:val="both"/>
       </w:pPr>
@@ -1423,7 +1601,7 @@
     <w:p>
       <w:pPr>
         <w:widowControl/>
-        <w:spacing w:before="0" w:after="40" w:lineRule="auto" w:line="276"/>
+        <w:spacing w:before="0" w:after="80" w:lineRule="auto" w:line="276"/>
         <w:ind w:firstLine="0"/>
         <w:jc w:val="both"/>
       </w:pPr>
@@ -1441,7 +1619,7 @@
     <w:p>
       <w:pPr>
         <w:widowControl/>
-        <w:spacing w:before="0" w:after="40" w:lineRule="auto" w:line="276"/>
+        <w:spacing w:before="0" w:after="80" w:lineRule="auto" w:line="276"/>
         <w:ind w:firstLine="0"/>
         <w:jc w:val="both"/>
       </w:pPr>
@@ -1462,7 +1640,7 @@
         <w:keepNext/>
         <w:pageBreakBefore/>
         <w:widowControl/>
-        <w:spacing w:before="0" w:after="240" w:line="240" w:lineRule="auto"/>
+        <w:spacing w:before="0" w:after="320" w:line="240" w:lineRule="auto"/>
         <w:ind w:firstLine="0"/>
         <w:jc w:val="center"/>
       </w:pPr>
@@ -1651,7 +1829,7 @@
         <w:keepNext/>
         <w:pageBreakBefore/>
         <w:widowControl/>
-        <w:spacing w:before="0" w:after="240" w:line="240" w:lineRule="auto"/>
+        <w:spacing w:before="0" w:after="120" w:line="240" w:lineRule="auto"/>
         <w:ind w:firstLine="0"/>
         <w:jc w:val="center"/>
       </w:pPr>
@@ -1671,7 +1849,7 @@
         <w:pStyle w:val="Heading1"/>
         <w:keepNext/>
         <w:widowControl/>
-        <w:spacing w:before="0" w:after="240" w:line="240" w:lineRule="auto"/>
+        <w:spacing w:before="0" w:after="320" w:line="240" w:lineRule="auto"/>
         <w:ind w:firstLine="0"/>
         <w:jc w:val="center"/>
       </w:pPr>
@@ -1967,7 +2145,7 @@
         <w:pStyle w:val="Heading2"/>
         <w:keepNext/>
         <w:widowControl/>
-        <w:spacing w:before="240" w:after="120" w:line="240" w:lineRule="auto"/>
+        <w:spacing w:before="320" w:after="160" w:line="240" w:lineRule="auto"/>
         <w:ind w:firstLine="0"/>
         <w:jc w:val="left"/>
       </w:pPr>
@@ -2005,7 +2183,7 @@
         <w:pStyle w:val="Heading2"/>
         <w:keepNext/>
         <w:widowControl/>
-        <w:spacing w:before="240" w:after="120" w:line="240" w:lineRule="auto"/>
+        <w:spacing w:before="320" w:after="160" w:line="240" w:lineRule="auto"/>
         <w:ind w:firstLine="0"/>
         <w:jc w:val="left"/>
       </w:pPr>
@@ -2079,7 +2257,7 @@
         <w:pStyle w:val="Heading2"/>
         <w:keepNext/>
         <w:widowControl/>
-        <w:spacing w:before="240" w:after="120" w:line="240" w:lineRule="auto"/>
+        <w:spacing w:before="320" w:after="160" w:line="240" w:lineRule="auto"/>
         <w:ind w:firstLine="0"/>
         <w:jc w:val="left"/>
       </w:pPr>
@@ -2136,7 +2314,7 @@
         <w:keepNext/>
         <w:pageBreakBefore/>
         <w:widowControl/>
-        <w:spacing w:before="0" w:after="240" w:line="240" w:lineRule="auto"/>
+        <w:spacing w:before="0" w:after="120" w:line="240" w:lineRule="auto"/>
         <w:ind w:firstLine="0"/>
         <w:jc w:val="center"/>
       </w:pPr>
@@ -2156,7 +2334,7 @@
         <w:pStyle w:val="Heading1"/>
         <w:keepNext/>
         <w:widowControl/>
-        <w:spacing w:before="0" w:after="240" w:line="240" w:lineRule="auto"/>
+        <w:spacing w:before="0" w:after="320" w:line="240" w:lineRule="auto"/>
         <w:ind w:firstLine="0"/>
         <w:jc w:val="center"/>
       </w:pPr>
@@ -2176,7 +2354,7 @@
         <w:pStyle w:val="Heading2"/>
         <w:keepNext/>
         <w:widowControl/>
-        <w:spacing w:before="240" w:after="120" w:line="240" w:lineRule="auto"/>
+        <w:spacing w:before="320" w:after="160" w:line="240" w:lineRule="auto"/>
         <w:ind w:firstLine="0"/>
         <w:jc w:val="left"/>
       </w:pPr>
@@ -2601,7 +2779,7 @@
         <w:pStyle w:val="Heading2"/>
         <w:keepNext/>
         <w:widowControl/>
-        <w:spacing w:before="240" w:after="120" w:line="240" w:lineRule="auto"/>
+        <w:spacing w:before="320" w:after="160" w:line="240" w:lineRule="auto"/>
         <w:ind w:firstLine="0"/>
         <w:jc w:val="left"/>
       </w:pPr>
@@ -2921,7 +3099,7 @@
         <w:pStyle w:val="Heading2"/>
         <w:keepNext/>
         <w:widowControl/>
-        <w:spacing w:before="240" w:after="120" w:line="240" w:lineRule="auto"/>
+        <w:spacing w:before="320" w:after="160" w:line="240" w:lineRule="auto"/>
         <w:ind w:firstLine="0"/>
         <w:jc w:val="left"/>
       </w:pPr>
@@ -3238,7 +3416,7 @@
         <w:pStyle w:val="Heading2"/>
         <w:keepNext/>
         <w:widowControl/>
-        <w:spacing w:before="240" w:after="120" w:line="240" w:lineRule="auto"/>
+        <w:spacing w:before="320" w:after="160" w:line="240" w:lineRule="auto"/>
         <w:ind w:firstLine="0"/>
         <w:jc w:val="left"/>
       </w:pPr>
@@ -3477,7 +3655,7 @@
         <w:pStyle w:val="Heading2"/>
         <w:keepNext/>
         <w:widowControl/>
-        <w:spacing w:before="240" w:after="120" w:line="240" w:lineRule="auto"/>
+        <w:spacing w:before="320" w:after="160" w:line="240" w:lineRule="auto"/>
         <w:ind w:firstLine="0"/>
         <w:jc w:val="left"/>
       </w:pPr>
@@ -3558,7 +3736,7 @@
         <w:keepNext/>
         <w:pageBreakBefore/>
         <w:widowControl/>
-        <w:spacing w:before="0" w:after="240" w:line="240" w:lineRule="auto"/>
+        <w:spacing w:before="0" w:after="120" w:line="240" w:lineRule="auto"/>
         <w:ind w:firstLine="0"/>
         <w:jc w:val="center"/>
       </w:pPr>
@@ -3578,7 +3756,7 @@
         <w:pStyle w:val="Heading1"/>
         <w:keepNext/>
         <w:widowControl/>
-        <w:spacing w:before="0" w:after="240" w:line="240" w:lineRule="auto"/>
+        <w:spacing w:before="0" w:after="320" w:line="240" w:lineRule="auto"/>
         <w:ind w:firstLine="0"/>
         <w:jc w:val="center"/>
       </w:pPr>
@@ -3598,7 +3776,7 @@
         <w:pStyle w:val="Heading2"/>
         <w:keepNext/>
         <w:widowControl/>
-        <w:spacing w:before="240" w:after="120" w:line="240" w:lineRule="auto"/>
+        <w:spacing w:before="320" w:after="160" w:line="240" w:lineRule="auto"/>
         <w:ind w:firstLine="0"/>
         <w:jc w:val="left"/>
       </w:pPr>
@@ -3747,7 +3925,7 @@
         <w:pStyle w:val="Heading2"/>
         <w:keepNext/>
         <w:widowControl/>
-        <w:spacing w:before="240" w:after="120" w:line="240" w:lineRule="auto"/>
+        <w:spacing w:before="320" w:after="160" w:line="240" w:lineRule="auto"/>
         <w:ind w:firstLine="0"/>
         <w:jc w:val="left"/>
       </w:pPr>
@@ -3892,7 +4070,7 @@
       <w:pPr>
         <w:keepNext/>
         <w:widowControl/>
-        <w:spacing w:before="200" w:after="120" w:lineRule="auto" w:line="276"/>
+        <w:spacing w:before="280" w:after="160" w:lineRule="auto" w:line="276"/>
         <w:ind w:firstLine="0"/>
         <w:jc w:val="left"/>
       </w:pPr>
@@ -3937,15 +4115,17 @@
       <w:tr>
         <w:trPr>
           <w:cantSplit/>
+          <w:tblHeader/>
         </w:trPr>
         <w:tc>
           <w:tcPr>
-            <w:tcW w:type="dxa" w:w="1984"/>
+            <w:tcW w:type="dxa" w:w="1644"/>
+            <w:vAlign w:val="center"/>
             <w:tcMar>
-              <w:top w:w="60" w:type="dxa"/>
-              <w:left w:w="60" w:type="dxa"/>
-              <w:bottom w:w="60" w:type="dxa"/>
-              <w:right w:w="60" w:type="dxa"/>
+              <w:top w:w="80" w:type="dxa"/>
+              <w:left w:w="80" w:type="dxa"/>
+              <w:bottom w:w="80" w:type="dxa"/>
+              <w:right w:w="80" w:type="dxa"/>
             </w:tcMar>
             <w:tcBorders>
               <w:top w:val="single" w:sz="18" w:space="0" w:color="000000"/>
@@ -3957,7 +4137,7 @@
           <w:p>
             <w:pPr>
               <w:widowControl/>
-              <w:spacing w:before="40" w:after="40" w:line="240" w:lineRule="auto"/>
+              <w:spacing w:before="60" w:after="60" w:lineRule="auto" w:line="276"/>
               <w:ind w:firstLine="0"/>
               <w:jc w:val="left"/>
             </w:pPr>
@@ -3976,12 +4156,13 @@
         </w:tc>
         <w:tc>
           <w:tcPr>
-            <w:tcW w:type="dxa" w:w="1417"/>
+            <w:tcW w:type="dxa" w:w="1304"/>
+            <w:vAlign w:val="center"/>
             <w:tcMar>
-              <w:top w:w="60" w:type="dxa"/>
-              <w:left w:w="60" w:type="dxa"/>
-              <w:bottom w:w="60" w:type="dxa"/>
-              <w:right w:w="60" w:type="dxa"/>
+              <w:top w:w="80" w:type="dxa"/>
+              <w:left w:w="80" w:type="dxa"/>
+              <w:bottom w:w="80" w:type="dxa"/>
+              <w:right w:w="80" w:type="dxa"/>
             </w:tcMar>
             <w:tcBorders>
               <w:top w:val="single" w:sz="18" w:space="0" w:color="000000"/>
@@ -3993,7 +4174,7 @@
           <w:p>
             <w:pPr>
               <w:widowControl/>
-              <w:spacing w:before="40" w:after="40" w:line="240" w:lineRule="auto"/>
+              <w:spacing w:before="60" w:after="60" w:lineRule="auto" w:line="276"/>
               <w:ind w:firstLine="0"/>
               <w:jc w:val="left"/>
             </w:pPr>
@@ -4012,12 +4193,13 @@
         </w:tc>
         <w:tc>
           <w:tcPr>
-            <w:tcW w:type="dxa" w:w="1644"/>
+            <w:tcW w:type="dxa" w:w="1928"/>
+            <w:vAlign w:val="center"/>
             <w:tcMar>
-              <w:top w:w="60" w:type="dxa"/>
-              <w:left w:w="60" w:type="dxa"/>
-              <w:bottom w:w="60" w:type="dxa"/>
-              <w:right w:w="60" w:type="dxa"/>
+              <w:top w:w="80" w:type="dxa"/>
+              <w:left w:w="80" w:type="dxa"/>
+              <w:bottom w:w="80" w:type="dxa"/>
+              <w:right w:w="80" w:type="dxa"/>
             </w:tcMar>
             <w:tcBorders>
               <w:top w:val="single" w:sz="18" w:space="0" w:color="000000"/>
@@ -4029,7 +4211,7 @@
           <w:p>
             <w:pPr>
               <w:widowControl/>
-              <w:spacing w:before="40" w:after="40" w:line="240" w:lineRule="auto"/>
+              <w:spacing w:before="60" w:after="60" w:lineRule="auto" w:line="276"/>
               <w:ind w:firstLine="0"/>
               <w:jc w:val="left"/>
             </w:pPr>
@@ -4048,12 +4230,13 @@
         </w:tc>
         <w:tc>
           <w:tcPr>
-            <w:tcW w:type="dxa" w:w="1531"/>
+            <w:tcW w:type="dxa" w:w="1984"/>
+            <w:vAlign w:val="center"/>
             <w:tcMar>
-              <w:top w:w="60" w:type="dxa"/>
-              <w:left w:w="60" w:type="dxa"/>
-              <w:bottom w:w="60" w:type="dxa"/>
-              <w:right w:w="60" w:type="dxa"/>
+              <w:top w:w="80" w:type="dxa"/>
+              <w:left w:w="80" w:type="dxa"/>
+              <w:bottom w:w="80" w:type="dxa"/>
+              <w:right w:w="80" w:type="dxa"/>
             </w:tcMar>
             <w:tcBorders>
               <w:top w:val="single" w:sz="18" w:space="0" w:color="000000"/>
@@ -4065,7 +4248,7 @@
           <w:p>
             <w:pPr>
               <w:widowControl/>
-              <w:spacing w:before="40" w:after="40" w:line="240" w:lineRule="auto"/>
+              <w:spacing w:before="60" w:after="60" w:lineRule="auto" w:line="276"/>
               <w:ind w:firstLine="0"/>
               <w:jc w:val="left"/>
             </w:pPr>
@@ -4085,11 +4268,12 @@
         <w:tc>
           <w:tcPr>
             <w:tcW w:type="dxa" w:w="850"/>
+            <w:vAlign w:val="center"/>
             <w:tcMar>
-              <w:top w:w="60" w:type="dxa"/>
-              <w:left w:w="60" w:type="dxa"/>
-              <w:bottom w:w="60" w:type="dxa"/>
-              <w:right w:w="60" w:type="dxa"/>
+              <w:top w:w="80" w:type="dxa"/>
+              <w:left w:w="80" w:type="dxa"/>
+              <w:bottom w:w="80" w:type="dxa"/>
+              <w:right w:w="80" w:type="dxa"/>
             </w:tcMar>
             <w:tcBorders>
               <w:top w:val="single" w:sz="18" w:space="0" w:color="000000"/>
@@ -4101,7 +4285,7 @@
           <w:p>
             <w:pPr>
               <w:widowControl/>
-              <w:spacing w:before="40" w:after="40" w:line="240" w:lineRule="auto"/>
+              <w:spacing w:before="60" w:after="60" w:lineRule="auto" w:line="276"/>
               <w:ind w:firstLine="0"/>
               <w:jc w:val="center"/>
             </w:pPr>
@@ -4120,12 +4304,13 @@
         </w:tc>
         <w:tc>
           <w:tcPr>
-            <w:tcW w:type="dxa" w:w="1531"/>
+            <w:tcW w:type="dxa" w:w="1247"/>
+            <w:vAlign w:val="center"/>
             <w:tcMar>
-              <w:top w:w="60" w:type="dxa"/>
-              <w:left w:w="60" w:type="dxa"/>
-              <w:bottom w:w="60" w:type="dxa"/>
-              <w:right w:w="60" w:type="dxa"/>
+              <w:top w:w="80" w:type="dxa"/>
+              <w:left w:w="80" w:type="dxa"/>
+              <w:bottom w:w="80" w:type="dxa"/>
+              <w:right w:w="80" w:type="dxa"/>
             </w:tcMar>
             <w:tcBorders>
               <w:top w:val="single" w:sz="18" w:space="0" w:color="000000"/>
@@ -4137,7 +4322,7 @@
           <w:p>
             <w:pPr>
               <w:widowControl/>
-              <w:spacing w:before="40" w:after="40" w:line="240" w:lineRule="auto"/>
+              <w:spacing w:before="60" w:after="60" w:lineRule="auto" w:line="276"/>
               <w:ind w:firstLine="0"/>
               <w:jc w:val="left"/>
             </w:pPr>
@@ -4161,12 +4346,13 @@
         </w:trPr>
         <w:tc>
           <w:tcPr>
-            <w:tcW w:type="dxa" w:w="1984"/>
+            <w:tcW w:type="dxa" w:w="1644"/>
+            <w:vAlign w:val="center"/>
             <w:tcMar>
-              <w:top w:w="60" w:type="dxa"/>
-              <w:left w:w="60" w:type="dxa"/>
-              <w:bottom w:w="60" w:type="dxa"/>
-              <w:right w:w="60" w:type="dxa"/>
+              <w:top w:w="80" w:type="dxa"/>
+              <w:left w:w="80" w:type="dxa"/>
+              <w:bottom w:w="80" w:type="dxa"/>
+              <w:right w:w="80" w:type="dxa"/>
             </w:tcMar>
             <w:tcBorders>
               <w:top w:val="nil" w:sz="0" w:space="0" w:color="auto"/>
@@ -4178,7 +4364,7 @@
           <w:p>
             <w:pPr>
               <w:widowControl/>
-              <w:spacing w:before="40" w:after="40" w:line="240" w:lineRule="auto"/>
+              <w:spacing w:before="60" w:after="60" w:lineRule="auto" w:line="276"/>
               <w:ind w:firstLine="0"/>
               <w:jc w:val="left"/>
             </w:pPr>
@@ -4197,12 +4383,13 @@
         </w:tc>
         <w:tc>
           <w:tcPr>
-            <w:tcW w:type="dxa" w:w="1417"/>
+            <w:tcW w:type="dxa" w:w="1304"/>
+            <w:vAlign w:val="center"/>
             <w:tcMar>
-              <w:top w:w="60" w:type="dxa"/>
-              <w:left w:w="60" w:type="dxa"/>
-              <w:bottom w:w="60" w:type="dxa"/>
-              <w:right w:w="60" w:type="dxa"/>
+              <w:top w:w="80" w:type="dxa"/>
+              <w:left w:w="80" w:type="dxa"/>
+              <w:bottom w:w="80" w:type="dxa"/>
+              <w:right w:w="80" w:type="dxa"/>
             </w:tcMar>
             <w:tcBorders>
               <w:top w:val="nil" w:sz="0" w:space="0" w:color="auto"/>
@@ -4214,7 +4401,7 @@
           <w:p>
             <w:pPr>
               <w:widowControl/>
-              <w:spacing w:before="40" w:after="40" w:line="240" w:lineRule="auto"/>
+              <w:spacing w:before="60" w:after="60" w:lineRule="auto" w:line="276"/>
               <w:ind w:firstLine="0"/>
               <w:jc w:val="left"/>
             </w:pPr>
@@ -4233,12 +4420,13 @@
         </w:tc>
         <w:tc>
           <w:tcPr>
-            <w:tcW w:type="dxa" w:w="1644"/>
+            <w:tcW w:type="dxa" w:w="1928"/>
+            <w:vAlign w:val="center"/>
             <w:tcMar>
-              <w:top w:w="60" w:type="dxa"/>
-              <w:left w:w="60" w:type="dxa"/>
-              <w:bottom w:w="60" w:type="dxa"/>
-              <w:right w:w="60" w:type="dxa"/>
+              <w:top w:w="80" w:type="dxa"/>
+              <w:left w:w="80" w:type="dxa"/>
+              <w:bottom w:w="80" w:type="dxa"/>
+              <w:right w:w="80" w:type="dxa"/>
             </w:tcMar>
             <w:tcBorders>
               <w:top w:val="nil" w:sz="0" w:space="0" w:color="auto"/>
@@ -4250,7 +4438,7 @@
           <w:p>
             <w:pPr>
               <w:widowControl/>
-              <w:spacing w:before="40" w:after="40" w:line="240" w:lineRule="auto"/>
+              <w:spacing w:before="60" w:after="60" w:lineRule="auto" w:line="276"/>
               <w:ind w:firstLine="0"/>
               <w:jc w:val="left"/>
             </w:pPr>
@@ -4269,12 +4457,13 @@
         </w:tc>
         <w:tc>
           <w:tcPr>
-            <w:tcW w:type="dxa" w:w="1531"/>
+            <w:tcW w:type="dxa" w:w="1984"/>
+            <w:vAlign w:val="center"/>
             <w:tcMar>
-              <w:top w:w="60" w:type="dxa"/>
-              <w:left w:w="60" w:type="dxa"/>
-              <w:bottom w:w="60" w:type="dxa"/>
-              <w:right w:w="60" w:type="dxa"/>
+              <w:top w:w="80" w:type="dxa"/>
+              <w:left w:w="80" w:type="dxa"/>
+              <w:bottom w:w="80" w:type="dxa"/>
+              <w:right w:w="80" w:type="dxa"/>
             </w:tcMar>
             <w:tcBorders>
               <w:top w:val="nil" w:sz="0" w:space="0" w:color="auto"/>
@@ -4286,7 +4475,7 @@
           <w:p>
             <w:pPr>
               <w:widowControl/>
-              <w:spacing w:before="40" w:after="40" w:line="240" w:lineRule="auto"/>
+              <w:spacing w:before="60" w:after="60" w:lineRule="auto" w:line="276"/>
               <w:ind w:firstLine="0"/>
               <w:jc w:val="left"/>
             </w:pPr>
@@ -4306,11 +4495,12 @@
         <w:tc>
           <w:tcPr>
             <w:tcW w:type="dxa" w:w="850"/>
+            <w:vAlign w:val="center"/>
             <w:tcMar>
-              <w:top w:w="60" w:type="dxa"/>
-              <w:left w:w="60" w:type="dxa"/>
-              <w:bottom w:w="60" w:type="dxa"/>
-              <w:right w:w="60" w:type="dxa"/>
+              <w:top w:w="80" w:type="dxa"/>
+              <w:left w:w="80" w:type="dxa"/>
+              <w:bottom w:w="80" w:type="dxa"/>
+              <w:right w:w="80" w:type="dxa"/>
             </w:tcMar>
             <w:tcBorders>
               <w:top w:val="nil" w:sz="0" w:space="0" w:color="auto"/>
@@ -4322,7 +4512,7 @@
           <w:p>
             <w:pPr>
               <w:widowControl/>
-              <w:spacing w:before="40" w:after="40" w:line="240" w:lineRule="auto"/>
+              <w:spacing w:before="60" w:after="60" w:lineRule="auto" w:line="276"/>
               <w:ind w:firstLine="0"/>
               <w:jc w:val="center"/>
             </w:pPr>
@@ -4341,12 +4531,13 @@
         </w:tc>
         <w:tc>
           <w:tcPr>
-            <w:tcW w:type="dxa" w:w="1531"/>
+            <w:tcW w:type="dxa" w:w="1247"/>
+            <w:vAlign w:val="center"/>
             <w:tcMar>
-              <w:top w:w="60" w:type="dxa"/>
-              <w:left w:w="60" w:type="dxa"/>
-              <w:bottom w:w="60" w:type="dxa"/>
-              <w:right w:w="60" w:type="dxa"/>
+              <w:top w:w="80" w:type="dxa"/>
+              <w:left w:w="80" w:type="dxa"/>
+              <w:bottom w:w="80" w:type="dxa"/>
+              <w:right w:w="80" w:type="dxa"/>
             </w:tcMar>
             <w:tcBorders>
               <w:top w:val="nil" w:sz="0" w:space="0" w:color="auto"/>
@@ -4358,7 +4549,7 @@
           <w:p>
             <w:pPr>
               <w:widowControl/>
-              <w:spacing w:before="40" w:after="40" w:line="240" w:lineRule="auto"/>
+              <w:spacing w:before="60" w:after="60" w:lineRule="auto" w:line="276"/>
               <w:ind w:firstLine="0"/>
               <w:jc w:val="left"/>
             </w:pPr>
@@ -4382,12 +4573,13 @@
         </w:trPr>
         <w:tc>
           <w:tcPr>
-            <w:tcW w:type="dxa" w:w="1984"/>
+            <w:tcW w:type="dxa" w:w="1644"/>
+            <w:vAlign w:val="center"/>
             <w:tcMar>
-              <w:top w:w="60" w:type="dxa"/>
-              <w:left w:w="60" w:type="dxa"/>
-              <w:bottom w:w="60" w:type="dxa"/>
-              <w:right w:w="60" w:type="dxa"/>
+              <w:top w:w="80" w:type="dxa"/>
+              <w:left w:w="80" w:type="dxa"/>
+              <w:bottom w:w="80" w:type="dxa"/>
+              <w:right w:w="80" w:type="dxa"/>
             </w:tcMar>
             <w:tcBorders>
               <w:top w:val="nil" w:sz="0" w:space="0" w:color="auto"/>
@@ -4399,7 +4591,7 @@
           <w:p>
             <w:pPr>
               <w:widowControl/>
-              <w:spacing w:before="40" w:after="40" w:line="240" w:lineRule="auto"/>
+              <w:spacing w:before="60" w:after="60" w:lineRule="auto" w:line="276"/>
               <w:ind w:firstLine="0"/>
               <w:jc w:val="left"/>
             </w:pPr>
@@ -4418,12 +4610,13 @@
         </w:tc>
         <w:tc>
           <w:tcPr>
-            <w:tcW w:type="dxa" w:w="1417"/>
+            <w:tcW w:type="dxa" w:w="1304"/>
+            <w:vAlign w:val="center"/>
             <w:tcMar>
-              <w:top w:w="60" w:type="dxa"/>
-              <w:left w:w="60" w:type="dxa"/>
-              <w:bottom w:w="60" w:type="dxa"/>
-              <w:right w:w="60" w:type="dxa"/>
+              <w:top w:w="80" w:type="dxa"/>
+              <w:left w:w="80" w:type="dxa"/>
+              <w:bottom w:w="80" w:type="dxa"/>
+              <w:right w:w="80" w:type="dxa"/>
             </w:tcMar>
             <w:tcBorders>
               <w:top w:val="nil" w:sz="0" w:space="0" w:color="auto"/>
@@ -4435,7 +4628,7 @@
           <w:p>
             <w:pPr>
               <w:widowControl/>
-              <w:spacing w:before="40" w:after="40" w:line="240" w:lineRule="auto"/>
+              <w:spacing w:before="60" w:after="60" w:lineRule="auto" w:line="276"/>
               <w:ind w:firstLine="0"/>
               <w:jc w:val="left"/>
             </w:pPr>
@@ -4454,12 +4647,13 @@
         </w:tc>
         <w:tc>
           <w:tcPr>
-            <w:tcW w:type="dxa" w:w="1644"/>
+            <w:tcW w:type="dxa" w:w="1928"/>
+            <w:vAlign w:val="center"/>
             <w:tcMar>
-              <w:top w:w="60" w:type="dxa"/>
-              <w:left w:w="60" w:type="dxa"/>
-              <w:bottom w:w="60" w:type="dxa"/>
-              <w:right w:w="60" w:type="dxa"/>
+              <w:top w:w="80" w:type="dxa"/>
+              <w:left w:w="80" w:type="dxa"/>
+              <w:bottom w:w="80" w:type="dxa"/>
+              <w:right w:w="80" w:type="dxa"/>
             </w:tcMar>
             <w:tcBorders>
               <w:top w:val="nil" w:sz="0" w:space="0" w:color="auto"/>
@@ -4471,7 +4665,7 @@
           <w:p>
             <w:pPr>
               <w:widowControl/>
-              <w:spacing w:before="40" w:after="40" w:line="240" w:lineRule="auto"/>
+              <w:spacing w:before="60" w:after="60" w:lineRule="auto" w:line="276"/>
               <w:ind w:firstLine="0"/>
               <w:jc w:val="left"/>
             </w:pPr>
@@ -4490,12 +4684,13 @@
         </w:tc>
         <w:tc>
           <w:tcPr>
-            <w:tcW w:type="dxa" w:w="1531"/>
+            <w:tcW w:type="dxa" w:w="1984"/>
+            <w:vAlign w:val="center"/>
             <w:tcMar>
-              <w:top w:w="60" w:type="dxa"/>
-              <w:left w:w="60" w:type="dxa"/>
-              <w:bottom w:w="60" w:type="dxa"/>
-              <w:right w:w="60" w:type="dxa"/>
+              <w:top w:w="80" w:type="dxa"/>
+              <w:left w:w="80" w:type="dxa"/>
+              <w:bottom w:w="80" w:type="dxa"/>
+              <w:right w:w="80" w:type="dxa"/>
             </w:tcMar>
             <w:tcBorders>
               <w:top w:val="nil" w:sz="0" w:space="0" w:color="auto"/>
@@ -4507,7 +4702,7 @@
           <w:p>
             <w:pPr>
               <w:widowControl/>
-              <w:spacing w:before="40" w:after="40" w:line="240" w:lineRule="auto"/>
+              <w:spacing w:before="60" w:after="60" w:lineRule="auto" w:line="276"/>
               <w:ind w:firstLine="0"/>
               <w:jc w:val="left"/>
             </w:pPr>
@@ -4527,11 +4722,12 @@
         <w:tc>
           <w:tcPr>
             <w:tcW w:type="dxa" w:w="850"/>
+            <w:vAlign w:val="center"/>
             <w:tcMar>
-              <w:top w:w="60" w:type="dxa"/>
-              <w:left w:w="60" w:type="dxa"/>
-              <w:bottom w:w="60" w:type="dxa"/>
-              <w:right w:w="60" w:type="dxa"/>
+              <w:top w:w="80" w:type="dxa"/>
+              <w:left w:w="80" w:type="dxa"/>
+              <w:bottom w:w="80" w:type="dxa"/>
+              <w:right w:w="80" w:type="dxa"/>
             </w:tcMar>
             <w:tcBorders>
               <w:top w:val="nil" w:sz="0" w:space="0" w:color="auto"/>
@@ -4543,7 +4739,7 @@
           <w:p>
             <w:pPr>
               <w:widowControl/>
-              <w:spacing w:before="40" w:after="40" w:line="240" w:lineRule="auto"/>
+              <w:spacing w:before="60" w:after="60" w:lineRule="auto" w:line="276"/>
               <w:ind w:firstLine="0"/>
               <w:jc w:val="center"/>
             </w:pPr>
@@ -4562,12 +4758,13 @@
         </w:tc>
         <w:tc>
           <w:tcPr>
-            <w:tcW w:type="dxa" w:w="1531"/>
+            <w:tcW w:type="dxa" w:w="1247"/>
+            <w:vAlign w:val="center"/>
             <w:tcMar>
-              <w:top w:w="60" w:type="dxa"/>
-              <w:left w:w="60" w:type="dxa"/>
-              <w:bottom w:w="60" w:type="dxa"/>
-              <w:right w:w="60" w:type="dxa"/>
+              <w:top w:w="80" w:type="dxa"/>
+              <w:left w:w="80" w:type="dxa"/>
+              <w:bottom w:w="80" w:type="dxa"/>
+              <w:right w:w="80" w:type="dxa"/>
             </w:tcMar>
             <w:tcBorders>
               <w:top w:val="nil" w:sz="0" w:space="0" w:color="auto"/>
@@ -4579,7 +4776,7 @@
           <w:p>
             <w:pPr>
               <w:widowControl/>
-              <w:spacing w:before="40" w:after="40" w:line="240" w:lineRule="auto"/>
+              <w:spacing w:before="60" w:after="60" w:lineRule="auto" w:line="276"/>
               <w:ind w:firstLine="0"/>
               <w:jc w:val="left"/>
             </w:pPr>
@@ -4603,12 +4800,13 @@
         </w:trPr>
         <w:tc>
           <w:tcPr>
-            <w:tcW w:type="dxa" w:w="1984"/>
+            <w:tcW w:type="dxa" w:w="1644"/>
+            <w:vAlign w:val="center"/>
             <w:tcMar>
-              <w:top w:w="60" w:type="dxa"/>
-              <w:left w:w="60" w:type="dxa"/>
-              <w:bottom w:w="60" w:type="dxa"/>
-              <w:right w:w="60" w:type="dxa"/>
+              <w:top w:w="80" w:type="dxa"/>
+              <w:left w:w="80" w:type="dxa"/>
+              <w:bottom w:w="80" w:type="dxa"/>
+              <w:right w:w="80" w:type="dxa"/>
             </w:tcMar>
             <w:tcBorders>
               <w:top w:val="nil" w:sz="0" w:space="0" w:color="auto"/>
@@ -4620,7 +4818,7 @@
           <w:p>
             <w:pPr>
               <w:widowControl/>
-              <w:spacing w:before="40" w:after="40" w:line="240" w:lineRule="auto"/>
+              <w:spacing w:before="60" w:after="60" w:lineRule="auto" w:line="276"/>
               <w:ind w:firstLine="0"/>
               <w:jc w:val="left"/>
             </w:pPr>
@@ -4639,12 +4837,13 @@
         </w:tc>
         <w:tc>
           <w:tcPr>
-            <w:tcW w:type="dxa" w:w="1417"/>
+            <w:tcW w:type="dxa" w:w="1304"/>
+            <w:vAlign w:val="center"/>
             <w:tcMar>
-              <w:top w:w="60" w:type="dxa"/>
-              <w:left w:w="60" w:type="dxa"/>
-              <w:bottom w:w="60" w:type="dxa"/>
-              <w:right w:w="60" w:type="dxa"/>
+              <w:top w:w="80" w:type="dxa"/>
+              <w:left w:w="80" w:type="dxa"/>
+              <w:bottom w:w="80" w:type="dxa"/>
+              <w:right w:w="80" w:type="dxa"/>
             </w:tcMar>
             <w:tcBorders>
               <w:top w:val="nil" w:sz="0" w:space="0" w:color="auto"/>
@@ -4656,7 +4855,7 @@
           <w:p>
             <w:pPr>
               <w:widowControl/>
-              <w:spacing w:before="40" w:after="40" w:line="240" w:lineRule="auto"/>
+              <w:spacing w:before="60" w:after="60" w:lineRule="auto" w:line="276"/>
               <w:ind w:firstLine="0"/>
               <w:jc w:val="left"/>
             </w:pPr>
@@ -4675,12 +4874,13 @@
         </w:tc>
         <w:tc>
           <w:tcPr>
-            <w:tcW w:type="dxa" w:w="1644"/>
+            <w:tcW w:type="dxa" w:w="1928"/>
+            <w:vAlign w:val="center"/>
             <w:tcMar>
-              <w:top w:w="60" w:type="dxa"/>
-              <w:left w:w="60" w:type="dxa"/>
-              <w:bottom w:w="60" w:type="dxa"/>
-              <w:right w:w="60" w:type="dxa"/>
+              <w:top w:w="80" w:type="dxa"/>
+              <w:left w:w="80" w:type="dxa"/>
+              <w:bottom w:w="80" w:type="dxa"/>
+              <w:right w:w="80" w:type="dxa"/>
             </w:tcMar>
             <w:tcBorders>
               <w:top w:val="nil" w:sz="0" w:space="0" w:color="auto"/>
@@ -4692,7 +4892,7 @@
           <w:p>
             <w:pPr>
               <w:widowControl/>
-              <w:spacing w:before="40" w:after="40" w:line="240" w:lineRule="auto"/>
+              <w:spacing w:before="60" w:after="60" w:lineRule="auto" w:line="276"/>
               <w:ind w:firstLine="0"/>
               <w:jc w:val="left"/>
             </w:pPr>
@@ -4711,12 +4911,13 @@
         </w:tc>
         <w:tc>
           <w:tcPr>
-            <w:tcW w:type="dxa" w:w="1531"/>
+            <w:tcW w:type="dxa" w:w="1984"/>
+            <w:vAlign w:val="center"/>
             <w:tcMar>
-              <w:top w:w="60" w:type="dxa"/>
-              <w:left w:w="60" w:type="dxa"/>
-              <w:bottom w:w="60" w:type="dxa"/>
-              <w:right w:w="60" w:type="dxa"/>
+              <w:top w:w="80" w:type="dxa"/>
+              <w:left w:w="80" w:type="dxa"/>
+              <w:bottom w:w="80" w:type="dxa"/>
+              <w:right w:w="80" w:type="dxa"/>
             </w:tcMar>
             <w:tcBorders>
               <w:top w:val="nil" w:sz="0" w:space="0" w:color="auto"/>
@@ -4728,7 +4929,7 @@
           <w:p>
             <w:pPr>
               <w:widowControl/>
-              <w:spacing w:before="40" w:after="40" w:line="240" w:lineRule="auto"/>
+              <w:spacing w:before="60" w:after="60" w:lineRule="auto" w:line="276"/>
               <w:ind w:firstLine="0"/>
               <w:jc w:val="left"/>
             </w:pPr>
@@ -4748,11 +4949,12 @@
         <w:tc>
           <w:tcPr>
             <w:tcW w:type="dxa" w:w="850"/>
+            <w:vAlign w:val="center"/>
             <w:tcMar>
-              <w:top w:w="60" w:type="dxa"/>
-              <w:left w:w="60" w:type="dxa"/>
-              <w:bottom w:w="60" w:type="dxa"/>
-              <w:right w:w="60" w:type="dxa"/>
+              <w:top w:w="80" w:type="dxa"/>
+              <w:left w:w="80" w:type="dxa"/>
+              <w:bottom w:w="80" w:type="dxa"/>
+              <w:right w:w="80" w:type="dxa"/>
             </w:tcMar>
             <w:tcBorders>
               <w:top w:val="nil" w:sz="0" w:space="0" w:color="auto"/>
@@ -4764,7 +4966,7 @@
           <w:p>
             <w:pPr>
               <w:widowControl/>
-              <w:spacing w:before="40" w:after="40" w:line="240" w:lineRule="auto"/>
+              <w:spacing w:before="60" w:after="60" w:lineRule="auto" w:line="276"/>
               <w:ind w:firstLine="0"/>
               <w:jc w:val="center"/>
             </w:pPr>
@@ -4783,12 +4985,13 @@
         </w:tc>
         <w:tc>
           <w:tcPr>
-            <w:tcW w:type="dxa" w:w="1531"/>
+            <w:tcW w:type="dxa" w:w="1247"/>
+            <w:vAlign w:val="center"/>
             <w:tcMar>
-              <w:top w:w="60" w:type="dxa"/>
-              <w:left w:w="60" w:type="dxa"/>
-              <w:bottom w:w="60" w:type="dxa"/>
-              <w:right w:w="60" w:type="dxa"/>
+              <w:top w:w="80" w:type="dxa"/>
+              <w:left w:w="80" w:type="dxa"/>
+              <w:bottom w:w="80" w:type="dxa"/>
+              <w:right w:w="80" w:type="dxa"/>
             </w:tcMar>
             <w:tcBorders>
               <w:top w:val="nil" w:sz="0" w:space="0" w:color="auto"/>
@@ -4800,7 +5003,7 @@
           <w:p>
             <w:pPr>
               <w:widowControl/>
-              <w:spacing w:before="40" w:after="40" w:line="240" w:lineRule="auto"/>
+              <w:spacing w:before="60" w:after="60" w:lineRule="auto" w:line="276"/>
               <w:ind w:firstLine="0"/>
               <w:jc w:val="left"/>
             </w:pPr>
@@ -4822,7 +5025,7 @@
     <w:p>
       <w:pPr>
         <w:widowControl/>
-        <w:spacing w:before="0" w:after="160" w:line="240" w:lineRule="auto"/>
+        <w:spacing w:before="0" w:after="240" w:line="240" w:lineRule="auto"/>
         <w:ind w:firstLine="0"/>
         <w:jc w:val="both"/>
       </w:pPr>
@@ -4871,7 +5074,7 @@
         <w:pStyle w:val="Heading2"/>
         <w:keepNext/>
         <w:widowControl/>
-        <w:spacing w:before="240" w:after="120" w:line="240" w:lineRule="auto"/>
+        <w:spacing w:before="320" w:after="160" w:line="240" w:lineRule="auto"/>
         <w:ind w:firstLine="0"/>
         <w:jc w:val="left"/>
       </w:pPr>
@@ -4927,7 +5130,7 @@
         <w:pStyle w:val="Heading2"/>
         <w:keepNext/>
         <w:widowControl/>
-        <w:spacing w:before="240" w:after="120" w:line="240" w:lineRule="auto"/>
+        <w:spacing w:before="320" w:after="160" w:line="240" w:lineRule="auto"/>
         <w:ind w:firstLine="0"/>
         <w:jc w:val="left"/>
       </w:pPr>
@@ -4986,7 +5189,7 @@
         <w:pStyle w:val="Heading2"/>
         <w:keepNext/>
         <w:widowControl/>
-        <w:spacing w:before="240" w:after="120" w:line="240" w:lineRule="auto"/>
+        <w:spacing w:before="320" w:after="160" w:line="240" w:lineRule="auto"/>
         <w:ind w:firstLine="0"/>
         <w:jc w:val="left"/>
       </w:pPr>
@@ -5087,7 +5290,7 @@
         <w:pStyle w:val="Heading2"/>
         <w:keepNext/>
         <w:widowControl/>
-        <w:spacing w:before="240" w:after="120" w:line="240" w:lineRule="auto"/>
+        <w:spacing w:before="320" w:after="160" w:line="240" w:lineRule="auto"/>
         <w:ind w:firstLine="0"/>
         <w:jc w:val="left"/>
       </w:pPr>
@@ -5141,7 +5344,7 @@
     <w:p>
       <w:pPr>
         <w:widowControl/>
-        <w:spacing w:before="120" w:after="120" w:lineRule="auto" w:line="276"/>
+        <w:spacing w:before="160" w:after="160" w:lineRule="auto" w:line="276"/>
         <w:ind w:firstLine="0"/>
         <w:jc w:val="center"/>
       </w:pPr>
@@ -5177,7 +5380,7 @@
     <w:p>
       <w:pPr>
         <w:widowControl/>
-        <w:spacing w:before="120" w:after="120" w:lineRule="auto" w:line="276"/>
+        <w:spacing w:before="160" w:after="160" w:lineRule="auto" w:line="276"/>
         <w:ind w:firstLine="0"/>
         <w:jc w:val="center"/>
       </w:pPr>
@@ -5213,7 +5416,7 @@
     <w:p>
       <w:pPr>
         <w:widowControl/>
-        <w:spacing w:before="120" w:after="120" w:lineRule="auto" w:line="276"/>
+        <w:spacing w:before="160" w:after="160" w:lineRule="auto" w:line="276"/>
         <w:ind w:firstLine="0"/>
         <w:jc w:val="center"/>
       </w:pPr>
@@ -5233,7 +5436,7 @@
         <w:pStyle w:val="Heading2"/>
         <w:keepNext/>
         <w:widowControl/>
-        <w:spacing w:before="240" w:after="120" w:line="240" w:lineRule="auto"/>
+        <w:spacing w:before="320" w:after="160" w:line="240" w:lineRule="auto"/>
         <w:ind w:firstLine="0"/>
         <w:jc w:val="left"/>
       </w:pPr>
@@ -5272,7 +5475,7 @@
         <w:keepNext/>
         <w:pageBreakBefore/>
         <w:widowControl/>
-        <w:spacing w:before="0" w:after="240" w:line="240" w:lineRule="auto"/>
+        <w:spacing w:before="0" w:after="120" w:line="240" w:lineRule="auto"/>
         <w:ind w:firstLine="0"/>
         <w:jc w:val="center"/>
       </w:pPr>
@@ -5292,7 +5495,7 @@
         <w:pStyle w:val="Heading1"/>
         <w:keepNext/>
         <w:widowControl/>
-        <w:spacing w:before="0" w:after="240" w:line="240" w:lineRule="auto"/>
+        <w:spacing w:before="0" w:after="320" w:line="240" w:lineRule="auto"/>
         <w:ind w:firstLine="0"/>
         <w:jc w:val="center"/>
       </w:pPr>
@@ -5330,7 +5533,7 @@
         <w:pStyle w:val="Heading2"/>
         <w:keepNext/>
         <w:widowControl/>
-        <w:spacing w:before="240" w:after="120" w:line="240" w:lineRule="auto"/>
+        <w:spacing w:before="320" w:after="160" w:line="240" w:lineRule="auto"/>
         <w:ind w:firstLine="0"/>
         <w:jc w:val="left"/>
       </w:pPr>
@@ -5367,7 +5570,7 @@
       <w:pPr>
         <w:keepNext/>
         <w:widowControl/>
-        <w:spacing w:before="200" w:after="120" w:lineRule="auto" w:line="276"/>
+        <w:spacing w:before="280" w:after="160" w:lineRule="auto" w:line="276"/>
         <w:ind w:firstLine="0"/>
         <w:jc w:val="left"/>
       </w:pPr>
@@ -5411,15 +5614,17 @@
       <w:tr>
         <w:trPr>
           <w:cantSplit/>
+          <w:tblHeader/>
         </w:trPr>
         <w:tc>
           <w:tcPr>
-            <w:tcW w:type="dxa" w:w="2268"/>
+            <w:tcW w:type="dxa" w:w="2381"/>
+            <w:vAlign w:val="center"/>
             <w:tcMar>
-              <w:top w:w="60" w:type="dxa"/>
-              <w:left w:w="60" w:type="dxa"/>
-              <w:bottom w:w="60" w:type="dxa"/>
-              <w:right w:w="60" w:type="dxa"/>
+              <w:top w:w="100" w:type="dxa"/>
+              <w:left w:w="100" w:type="dxa"/>
+              <w:bottom w:w="100" w:type="dxa"/>
+              <w:right w:w="100" w:type="dxa"/>
             </w:tcMar>
             <w:tcBorders>
               <w:top w:val="single" w:sz="18" w:space="0" w:color="000000"/>
@@ -5431,7 +5636,7 @@
           <w:p>
             <w:pPr>
               <w:widowControl/>
-              <w:spacing w:before="40" w:after="40" w:line="240" w:lineRule="auto"/>
+              <w:spacing w:before="60" w:after="60" w:lineRule="auto" w:line="276"/>
               <w:ind w:firstLine="0"/>
               <w:jc w:val="left"/>
             </w:pPr>
@@ -5442,7 +5647,7 @@
                 <w:b/>
                 <w:i w:val="0"/>
                 <w:color w:val="000000"/>
-                <w:sz w:val="20"/>
+                <w:sz w:val="21"/>
               </w:rPr>
               <w:t>Composite resin</w:t>
             </w:r>
@@ -5450,12 +5655,13 @@
         </w:tc>
         <w:tc>
           <w:tcPr>
-            <w:tcW w:type="dxa" w:w="1757"/>
+            <w:tcW w:type="dxa" w:w="1701"/>
+            <w:vAlign w:val="center"/>
             <w:tcMar>
-              <w:top w:w="60" w:type="dxa"/>
-              <w:left w:w="60" w:type="dxa"/>
-              <w:bottom w:w="60" w:type="dxa"/>
-              <w:right w:w="60" w:type="dxa"/>
+              <w:top w:w="100" w:type="dxa"/>
+              <w:left w:w="100" w:type="dxa"/>
+              <w:bottom w:w="100" w:type="dxa"/>
+              <w:right w:w="100" w:type="dxa"/>
             </w:tcMar>
             <w:tcBorders>
               <w:top w:val="single" w:sz="18" w:space="0" w:color="000000"/>
@@ -5467,7 +5673,7 @@
           <w:p>
             <w:pPr>
               <w:widowControl/>
-              <w:spacing w:before="40" w:after="40" w:line="240" w:lineRule="auto"/>
+              <w:spacing w:before="60" w:after="60" w:lineRule="auto" w:line="276"/>
               <w:ind w:firstLine="0"/>
               <w:jc w:val="center"/>
             </w:pPr>
@@ -5478,7 +5684,7 @@
                 <w:b/>
                 <w:i w:val="0"/>
                 <w:color w:val="000000"/>
-                <w:sz w:val="20"/>
+                <w:sz w:val="21"/>
               </w:rPr>
               <w:t>Weight before (g)</w:t>
             </w:r>
@@ -5486,7 +5692,7 @@
           <w:p>
             <w:pPr>
               <w:widowControl/>
-              <w:spacing w:before="40" w:after="40" w:line="240" w:lineRule="auto"/>
+              <w:spacing w:before="60" w:after="60" w:lineRule="auto" w:line="276"/>
               <w:ind w:firstLine="0"/>
               <w:jc w:val="center"/>
             </w:pPr>
@@ -5496,7 +5702,7 @@
                 <w:b/>
                 <w:i w:val="0"/>
                 <w:color w:val="000000"/>
-                <w:sz w:val="20"/>
+                <w:sz w:val="21"/>
               </w:rPr>
               <w:t>Mean ± SD</w:t>
             </w:r>
@@ -5504,12 +5710,13 @@
         </w:tc>
         <w:tc>
           <w:tcPr>
-            <w:tcW w:type="dxa" w:w="1757"/>
+            <w:tcW w:type="dxa" w:w="1701"/>
+            <w:vAlign w:val="center"/>
             <w:tcMar>
-              <w:top w:w="60" w:type="dxa"/>
-              <w:left w:w="60" w:type="dxa"/>
-              <w:bottom w:w="60" w:type="dxa"/>
-              <w:right w:w="60" w:type="dxa"/>
+              <w:top w:w="100" w:type="dxa"/>
+              <w:left w:w="100" w:type="dxa"/>
+              <w:bottom w:w="100" w:type="dxa"/>
+              <w:right w:w="100" w:type="dxa"/>
             </w:tcMar>
             <w:tcBorders>
               <w:top w:val="single" w:sz="18" w:space="0" w:color="000000"/>
@@ -5521,7 +5728,7 @@
           <w:p>
             <w:pPr>
               <w:widowControl/>
-              <w:spacing w:before="40" w:after="40" w:line="240" w:lineRule="auto"/>
+              <w:spacing w:before="60" w:after="60" w:lineRule="auto" w:line="276"/>
               <w:ind w:firstLine="0"/>
               <w:jc w:val="center"/>
             </w:pPr>
@@ -5532,7 +5739,7 @@
                 <w:b/>
                 <w:i w:val="0"/>
                 <w:color w:val="000000"/>
-                <w:sz w:val="20"/>
+                <w:sz w:val="21"/>
               </w:rPr>
               <w:t>Weight after (g)</w:t>
             </w:r>
@@ -5540,7 +5747,7 @@
           <w:p>
             <w:pPr>
               <w:widowControl/>
-              <w:spacing w:before="40" w:after="40" w:line="240" w:lineRule="auto"/>
+              <w:spacing w:before="60" w:after="60" w:lineRule="auto" w:line="276"/>
               <w:ind w:firstLine="0"/>
               <w:jc w:val="center"/>
             </w:pPr>
@@ -5550,7 +5757,7 @@
                 <w:b/>
                 <w:i w:val="0"/>
                 <w:color w:val="000000"/>
-                <w:sz w:val="20"/>
+                <w:sz w:val="21"/>
               </w:rPr>
               <w:t>Mean ± SD</w:t>
             </w:r>
@@ -5558,12 +5765,13 @@
         </w:tc>
         <w:tc>
           <w:tcPr>
-            <w:tcW w:type="dxa" w:w="1757"/>
+            <w:tcW w:type="dxa" w:w="1701"/>
+            <w:vAlign w:val="center"/>
             <w:tcMar>
-              <w:top w:w="60" w:type="dxa"/>
-              <w:left w:w="60" w:type="dxa"/>
-              <w:bottom w:w="60" w:type="dxa"/>
-              <w:right w:w="60" w:type="dxa"/>
+              <w:top w:w="100" w:type="dxa"/>
+              <w:left w:w="100" w:type="dxa"/>
+              <w:bottom w:w="100" w:type="dxa"/>
+              <w:right w:w="100" w:type="dxa"/>
             </w:tcMar>
             <w:tcBorders>
               <w:top w:val="single" w:sz="18" w:space="0" w:color="000000"/>
@@ -5575,7 +5783,7 @@
           <w:p>
             <w:pPr>
               <w:widowControl/>
-              <w:spacing w:before="40" w:after="40" w:line="240" w:lineRule="auto"/>
+              <w:spacing w:before="60" w:after="60" w:lineRule="auto" w:line="276"/>
               <w:ind w:firstLine="0"/>
               <w:jc w:val="center"/>
             </w:pPr>
@@ -5586,7 +5794,7 @@
                 <w:b/>
                 <w:i w:val="0"/>
                 <w:color w:val="000000"/>
-                <w:sz w:val="20"/>
+                <w:sz w:val="21"/>
               </w:rPr>
               <w:t>Weight loss (%)</w:t>
             </w:r>
@@ -5594,7 +5802,7 @@
           <w:p>
             <w:pPr>
               <w:widowControl/>
-              <w:spacing w:before="40" w:after="40" w:line="240" w:lineRule="auto"/>
+              <w:spacing w:before="60" w:after="60" w:lineRule="auto" w:line="276"/>
               <w:ind w:firstLine="0"/>
               <w:jc w:val="center"/>
             </w:pPr>
@@ -5604,7 +5812,7 @@
                 <w:b/>
                 <w:i w:val="0"/>
                 <w:color w:val="000000"/>
-                <w:sz w:val="20"/>
+                <w:sz w:val="21"/>
               </w:rPr>
               <w:t>Mean ± SD</w:t>
             </w:r>
@@ -5612,12 +5820,13 @@
         </w:tc>
         <w:tc>
           <w:tcPr>
-            <w:tcW w:type="dxa" w:w="1417"/>
+            <w:tcW w:type="dxa" w:w="1474"/>
+            <w:vAlign w:val="center"/>
             <w:tcMar>
-              <w:top w:w="60" w:type="dxa"/>
-              <w:left w:w="60" w:type="dxa"/>
-              <w:bottom w:w="60" w:type="dxa"/>
-              <w:right w:w="60" w:type="dxa"/>
+              <w:top w:w="100" w:type="dxa"/>
+              <w:left w:w="100" w:type="dxa"/>
+              <w:bottom w:w="100" w:type="dxa"/>
+              <w:right w:w="100" w:type="dxa"/>
             </w:tcMar>
             <w:tcBorders>
               <w:top w:val="single" w:sz="18" w:space="0" w:color="000000"/>
@@ -5629,7 +5838,7 @@
           <w:p>
             <w:pPr>
               <w:widowControl/>
-              <w:spacing w:before="40" w:after="40" w:line="240" w:lineRule="auto"/>
+              <w:spacing w:before="60" w:after="60" w:lineRule="auto" w:line="276"/>
               <w:ind w:firstLine="0"/>
               <w:jc w:val="center"/>
             </w:pPr>
@@ -5640,7 +5849,7 @@
                 <w:b/>
                 <w:i w:val="0"/>
                 <w:color w:val="000000"/>
-                <w:sz w:val="20"/>
+                <w:sz w:val="21"/>
               </w:rPr>
               <w:t>p-value</w:t>
             </w:r>
@@ -5653,12 +5862,13 @@
         </w:trPr>
         <w:tc>
           <w:tcPr>
-            <w:tcW w:type="dxa" w:w="2268"/>
+            <w:tcW w:type="dxa" w:w="2381"/>
+            <w:vAlign w:val="center"/>
             <w:tcMar>
-              <w:top w:w="60" w:type="dxa"/>
-              <w:left w:w="60" w:type="dxa"/>
-              <w:bottom w:w="60" w:type="dxa"/>
-              <w:right w:w="60" w:type="dxa"/>
+              <w:top w:w="100" w:type="dxa"/>
+              <w:left w:w="100" w:type="dxa"/>
+              <w:bottom w:w="100" w:type="dxa"/>
+              <w:right w:w="100" w:type="dxa"/>
             </w:tcMar>
             <w:tcBorders>
               <w:top w:val="nil" w:sz="0" w:space="0" w:color="auto"/>
@@ -5670,7 +5880,7 @@
           <w:p>
             <w:pPr>
               <w:widowControl/>
-              <w:spacing w:before="40" w:after="40" w:line="240" w:lineRule="auto"/>
+              <w:spacing w:before="60" w:after="60" w:lineRule="auto" w:line="276"/>
               <w:ind w:firstLine="0"/>
               <w:jc w:val="left"/>
             </w:pPr>
@@ -5681,7 +5891,7 @@
                 <w:b w:val="0"/>
                 <w:i w:val="0"/>
                 <w:color w:val="000000"/>
-                <w:sz w:val="20"/>
+                <w:sz w:val="21"/>
               </w:rPr>
               <w:t>Beautifil Flow Plus X F00</w:t>
             </w:r>
@@ -5689,12 +5899,13 @@
         </w:tc>
         <w:tc>
           <w:tcPr>
-            <w:tcW w:type="dxa" w:w="1757"/>
+            <w:tcW w:type="dxa" w:w="1701"/>
+            <w:vAlign w:val="center"/>
             <w:tcMar>
-              <w:top w:w="60" w:type="dxa"/>
-              <w:left w:w="60" w:type="dxa"/>
-              <w:bottom w:w="60" w:type="dxa"/>
-              <w:right w:w="60" w:type="dxa"/>
+              <w:top w:w="100" w:type="dxa"/>
+              <w:left w:w="100" w:type="dxa"/>
+              <w:bottom w:w="100" w:type="dxa"/>
+              <w:right w:w="100" w:type="dxa"/>
             </w:tcMar>
             <w:tcBorders>
               <w:top w:val="nil" w:sz="0" w:space="0" w:color="auto"/>
@@ -5706,7 +5917,7 @@
           <w:p>
             <w:pPr>
               <w:widowControl/>
-              <w:spacing w:before="40" w:after="40" w:line="240" w:lineRule="auto"/>
+              <w:spacing w:before="60" w:after="60" w:lineRule="auto" w:line="276"/>
               <w:ind w:firstLine="0"/>
               <w:jc w:val="center"/>
             </w:pPr>
@@ -5717,7 +5928,7 @@
                 <w:b w:val="0"/>
                 <w:i w:val="0"/>
                 <w:color w:val="000000"/>
-                <w:sz w:val="20"/>
+                <w:sz w:val="21"/>
               </w:rPr>
               <w:t>0.1602 ± 0.0074</w:t>
             </w:r>
@@ -5725,12 +5936,13 @@
         </w:tc>
         <w:tc>
           <w:tcPr>
-            <w:tcW w:type="dxa" w:w="1757"/>
+            <w:tcW w:type="dxa" w:w="1701"/>
+            <w:vAlign w:val="center"/>
             <w:tcMar>
-              <w:top w:w="60" w:type="dxa"/>
-              <w:left w:w="60" w:type="dxa"/>
-              <w:bottom w:w="60" w:type="dxa"/>
-              <w:right w:w="60" w:type="dxa"/>
+              <w:top w:w="100" w:type="dxa"/>
+              <w:left w:w="100" w:type="dxa"/>
+              <w:bottom w:w="100" w:type="dxa"/>
+              <w:right w:w="100" w:type="dxa"/>
             </w:tcMar>
             <w:tcBorders>
               <w:top w:val="nil" w:sz="0" w:space="0" w:color="auto"/>
@@ -5742,7 +5954,7 @@
           <w:p>
             <w:pPr>
               <w:widowControl/>
-              <w:spacing w:before="40" w:after="40" w:line="240" w:lineRule="auto"/>
+              <w:spacing w:before="60" w:after="60" w:lineRule="auto" w:line="276"/>
               <w:ind w:firstLine="0"/>
               <w:jc w:val="center"/>
             </w:pPr>
@@ -5753,7 +5965,7 @@
                 <w:b w:val="0"/>
                 <w:i w:val="0"/>
                 <w:color w:val="000000"/>
-                <w:sz w:val="20"/>
+                <w:sz w:val="21"/>
               </w:rPr>
               <w:t>0.1576 ± 0.0031</w:t>
             </w:r>
@@ -5761,12 +5973,13 @@
         </w:tc>
         <w:tc>
           <w:tcPr>
-            <w:tcW w:type="dxa" w:w="1757"/>
+            <w:tcW w:type="dxa" w:w="1701"/>
+            <w:vAlign w:val="center"/>
             <w:tcMar>
-              <w:top w:w="60" w:type="dxa"/>
-              <w:left w:w="60" w:type="dxa"/>
-              <w:bottom w:w="60" w:type="dxa"/>
-              <w:right w:w="60" w:type="dxa"/>
+              <w:top w:w="100" w:type="dxa"/>
+              <w:left w:w="100" w:type="dxa"/>
+              <w:bottom w:w="100" w:type="dxa"/>
+              <w:right w:w="100" w:type="dxa"/>
             </w:tcMar>
             <w:tcBorders>
               <w:top w:val="nil" w:sz="0" w:space="0" w:color="auto"/>
@@ -5778,7 +5991,7 @@
           <w:p>
             <w:pPr>
               <w:widowControl/>
-              <w:spacing w:before="40" w:after="40" w:line="240" w:lineRule="auto"/>
+              <w:spacing w:before="60" w:after="60" w:lineRule="auto" w:line="276"/>
               <w:ind w:firstLine="0"/>
               <w:jc w:val="center"/>
             </w:pPr>
@@ -5789,7 +6002,7 @@
                 <w:b w:val="0"/>
                 <w:i w:val="0"/>
                 <w:color w:val="000000"/>
-                <w:sz w:val="20"/>
+                <w:sz w:val="21"/>
               </w:rPr>
               <w:t>1.49 ± 3.14</w:t>
             </w:r>
@@ -5797,12 +6010,13 @@
         </w:tc>
         <w:tc>
           <w:tcPr>
-            <w:tcW w:type="dxa" w:w="1417"/>
+            <w:tcW w:type="dxa" w:w="1474"/>
+            <w:vAlign w:val="center"/>
             <w:tcMar>
-              <w:top w:w="60" w:type="dxa"/>
-              <w:left w:w="60" w:type="dxa"/>
-              <w:bottom w:w="60" w:type="dxa"/>
-              <w:right w:w="60" w:type="dxa"/>
+              <w:top w:w="100" w:type="dxa"/>
+              <w:left w:w="100" w:type="dxa"/>
+              <w:bottom w:w="100" w:type="dxa"/>
+              <w:right w:w="100" w:type="dxa"/>
             </w:tcMar>
             <w:vMerge w:val="restart"/>
             <w:tcBorders>
@@ -5812,16 +6026,16 @@
               <w:right w:val="nil" w:sz="0" w:space="0" w:color="auto"/>
             </w:tcBorders>
             <w:tcMar>
-              <w:top w:w="60" w:type="dxa"/>
-              <w:left w:w="60" w:type="dxa"/>
-              <w:bottom w:w="60" w:type="dxa"/>
-              <w:right w:w="60" w:type="dxa"/>
+              <w:top w:w="100" w:type="dxa"/>
+              <w:left w:w="100" w:type="dxa"/>
+              <w:bottom w:w="100" w:type="dxa"/>
+              <w:right w:w="100" w:type="dxa"/>
             </w:tcMar>
           </w:tcPr>
           <w:p>
             <w:pPr>
               <w:widowControl/>
-              <w:spacing w:before="40" w:after="40" w:line="240" w:lineRule="auto"/>
+              <w:spacing w:before="60" w:after="60" w:lineRule="auto" w:line="276"/>
               <w:ind w:firstLine="0"/>
               <w:jc w:val="center"/>
             </w:pPr>
@@ -5832,7 +6046,7 @@
                 <w:b w:val="0"/>
                 <w:i w:val="0"/>
                 <w:color w:val="000000"/>
-                <w:sz w:val="20"/>
+                <w:sz w:val="21"/>
               </w:rPr>
               <w:t>0.329†</w:t>
             </w:r>
@@ -5845,12 +6059,13 @@
         </w:trPr>
         <w:tc>
           <w:tcPr>
-            <w:tcW w:type="dxa" w:w="2268"/>
+            <w:tcW w:type="dxa" w:w="2381"/>
+            <w:vAlign w:val="center"/>
             <w:tcMar>
-              <w:top w:w="60" w:type="dxa"/>
-              <w:left w:w="60" w:type="dxa"/>
-              <w:bottom w:w="60" w:type="dxa"/>
-              <w:right w:w="60" w:type="dxa"/>
+              <w:top w:w="100" w:type="dxa"/>
+              <w:left w:w="100" w:type="dxa"/>
+              <w:bottom w:w="100" w:type="dxa"/>
+              <w:right w:w="100" w:type="dxa"/>
             </w:tcMar>
             <w:tcBorders>
               <w:top w:val="nil" w:sz="0" w:space="0" w:color="auto"/>
@@ -5862,7 +6077,7 @@
           <w:p>
             <w:pPr>
               <w:widowControl/>
-              <w:spacing w:before="40" w:after="40" w:line="240" w:lineRule="auto"/>
+              <w:spacing w:before="60" w:after="60" w:lineRule="auto" w:line="276"/>
               <w:ind w:firstLine="0"/>
               <w:jc w:val="left"/>
             </w:pPr>
@@ -5873,7 +6088,7 @@
                 <w:b w:val="0"/>
                 <w:i w:val="0"/>
                 <w:color w:val="000000"/>
-                <w:sz w:val="20"/>
+                <w:sz w:val="21"/>
               </w:rPr>
               <w:t>G-ænial Universal Injectable</w:t>
             </w:r>
@@ -5881,12 +6096,13 @@
         </w:tc>
         <w:tc>
           <w:tcPr>
-            <w:tcW w:type="dxa" w:w="1757"/>
+            <w:tcW w:type="dxa" w:w="1701"/>
+            <w:vAlign w:val="center"/>
             <w:tcMar>
-              <w:top w:w="60" w:type="dxa"/>
-              <w:left w:w="60" w:type="dxa"/>
-              <w:bottom w:w="60" w:type="dxa"/>
-              <w:right w:w="60" w:type="dxa"/>
+              <w:top w:w="100" w:type="dxa"/>
+              <w:left w:w="100" w:type="dxa"/>
+              <w:bottom w:w="100" w:type="dxa"/>
+              <w:right w:w="100" w:type="dxa"/>
             </w:tcMar>
             <w:tcBorders>
               <w:top w:val="nil" w:sz="0" w:space="0" w:color="auto"/>
@@ -5898,7 +6114,7 @@
           <w:p>
             <w:pPr>
               <w:widowControl/>
-              <w:spacing w:before="40" w:after="40" w:line="240" w:lineRule="auto"/>
+              <w:spacing w:before="60" w:after="60" w:lineRule="auto" w:line="276"/>
               <w:ind w:firstLine="0"/>
               <w:jc w:val="center"/>
             </w:pPr>
@@ -5909,7 +6125,7 @@
                 <w:b w:val="0"/>
                 <w:i w:val="0"/>
                 <w:color w:val="000000"/>
-                <w:sz w:val="20"/>
+                <w:sz w:val="21"/>
               </w:rPr>
               <w:t>0.1630 ± 0.0102</w:t>
             </w:r>
@@ -5917,12 +6133,13 @@
         </w:tc>
         <w:tc>
           <w:tcPr>
-            <w:tcW w:type="dxa" w:w="1757"/>
+            <w:tcW w:type="dxa" w:w="1701"/>
+            <w:vAlign w:val="center"/>
             <w:tcMar>
-              <w:top w:w="60" w:type="dxa"/>
-              <w:left w:w="60" w:type="dxa"/>
-              <w:bottom w:w="60" w:type="dxa"/>
-              <w:right w:w="60" w:type="dxa"/>
+              <w:top w:w="100" w:type="dxa"/>
+              <w:left w:w="100" w:type="dxa"/>
+              <w:bottom w:w="100" w:type="dxa"/>
+              <w:right w:w="100" w:type="dxa"/>
             </w:tcMar>
             <w:tcBorders>
               <w:top w:val="nil" w:sz="0" w:space="0" w:color="auto"/>
@@ -5934,7 +6151,7 @@
           <w:p>
             <w:pPr>
               <w:widowControl/>
-              <w:spacing w:before="40" w:after="40" w:line="240" w:lineRule="auto"/>
+              <w:spacing w:before="60" w:after="60" w:lineRule="auto" w:line="276"/>
               <w:ind w:firstLine="0"/>
               <w:jc w:val="center"/>
             </w:pPr>
@@ -5945,7 +6162,7 @@
                 <w:b w:val="0"/>
                 <w:i w:val="0"/>
                 <w:color w:val="000000"/>
-                <w:sz w:val="20"/>
+                <w:sz w:val="21"/>
               </w:rPr>
               <w:t>0.1619 ± 0.0106</w:t>
             </w:r>
@@ -5953,12 +6170,13 @@
         </w:tc>
         <w:tc>
           <w:tcPr>
-            <w:tcW w:type="dxa" w:w="1757"/>
+            <w:tcW w:type="dxa" w:w="1701"/>
+            <w:vAlign w:val="center"/>
             <w:tcMar>
-              <w:top w:w="60" w:type="dxa"/>
-              <w:left w:w="60" w:type="dxa"/>
-              <w:bottom w:w="60" w:type="dxa"/>
-              <w:right w:w="60" w:type="dxa"/>
+              <w:top w:w="100" w:type="dxa"/>
+              <w:left w:w="100" w:type="dxa"/>
+              <w:bottom w:w="100" w:type="dxa"/>
+              <w:right w:w="100" w:type="dxa"/>
             </w:tcMar>
             <w:tcBorders>
               <w:top w:val="nil" w:sz="0" w:space="0" w:color="auto"/>
@@ -5970,7 +6188,7 @@
           <w:p>
             <w:pPr>
               <w:widowControl/>
-              <w:spacing w:before="40" w:after="40" w:line="240" w:lineRule="auto"/>
+              <w:spacing w:before="60" w:after="60" w:lineRule="auto" w:line="276"/>
               <w:ind w:firstLine="0"/>
               <w:jc w:val="center"/>
             </w:pPr>
@@ -5981,7 +6199,7 @@
                 <w:b w:val="0"/>
                 <w:i w:val="0"/>
                 <w:color w:val="000000"/>
-                <w:sz w:val="20"/>
+                <w:sz w:val="21"/>
               </w:rPr>
               <w:t>0.65 ± 0.37</w:t>
             </w:r>
@@ -5989,12 +6207,13 @@
         </w:tc>
         <w:tc>
           <w:tcPr>
-            <w:tcW w:type="dxa" w:w="1417"/>
+            <w:tcW w:type="dxa" w:w="1474"/>
+            <w:vAlign w:val="center"/>
             <w:tcMar>
-              <w:top w:w="60" w:type="dxa"/>
-              <w:left w:w="60" w:type="dxa"/>
-              <w:bottom w:w="60" w:type="dxa"/>
-              <w:right w:w="60" w:type="dxa"/>
+              <w:top w:w="100" w:type="dxa"/>
+              <w:left w:w="100" w:type="dxa"/>
+              <w:bottom w:w="100" w:type="dxa"/>
+              <w:right w:w="100" w:type="dxa"/>
             </w:tcMar>
             <w:vMerge/>
             <w:tcBorders>
@@ -6013,12 +6232,13 @@
         </w:trPr>
         <w:tc>
           <w:tcPr>
-            <w:tcW w:type="dxa" w:w="2268"/>
+            <w:tcW w:type="dxa" w:w="2381"/>
+            <w:vAlign w:val="center"/>
             <w:tcMar>
-              <w:top w:w="60" w:type="dxa"/>
-              <w:left w:w="60" w:type="dxa"/>
-              <w:bottom w:w="60" w:type="dxa"/>
-              <w:right w:w="60" w:type="dxa"/>
+              <w:top w:w="100" w:type="dxa"/>
+              <w:left w:w="100" w:type="dxa"/>
+              <w:bottom w:w="100" w:type="dxa"/>
+              <w:right w:w="100" w:type="dxa"/>
             </w:tcMar>
             <w:tcBorders>
               <w:top w:val="nil" w:sz="0" w:space="0" w:color="auto"/>
@@ -6030,7 +6250,7 @@
           <w:p>
             <w:pPr>
               <w:widowControl/>
-              <w:spacing w:before="40" w:after="40" w:line="240" w:lineRule="auto"/>
+              <w:spacing w:before="60" w:after="60" w:lineRule="auto" w:line="276"/>
               <w:ind w:firstLine="0"/>
               <w:jc w:val="left"/>
             </w:pPr>
@@ -6041,7 +6261,7 @@
                 <w:b w:val="0"/>
                 <w:i w:val="0"/>
                 <w:color w:val="000000"/>
-                <w:sz w:val="20"/>
+                <w:sz w:val="21"/>
               </w:rPr>
               <w:t>Beautifil II LS</w:t>
             </w:r>
@@ -6049,12 +6269,13 @@
         </w:tc>
         <w:tc>
           <w:tcPr>
-            <w:tcW w:type="dxa" w:w="1757"/>
+            <w:tcW w:type="dxa" w:w="1701"/>
+            <w:vAlign w:val="center"/>
             <w:tcMar>
-              <w:top w:w="60" w:type="dxa"/>
-              <w:left w:w="60" w:type="dxa"/>
-              <w:bottom w:w="60" w:type="dxa"/>
-              <w:right w:w="60" w:type="dxa"/>
+              <w:top w:w="100" w:type="dxa"/>
+              <w:left w:w="100" w:type="dxa"/>
+              <w:bottom w:w="100" w:type="dxa"/>
+              <w:right w:w="100" w:type="dxa"/>
             </w:tcMar>
             <w:tcBorders>
               <w:top w:val="nil" w:sz="0" w:space="0" w:color="auto"/>
@@ -6066,7 +6287,7 @@
           <w:p>
             <w:pPr>
               <w:widowControl/>
-              <w:spacing w:before="40" w:after="40" w:line="240" w:lineRule="auto"/>
+              <w:spacing w:before="60" w:after="60" w:lineRule="auto" w:line="276"/>
               <w:ind w:firstLine="0"/>
               <w:jc w:val="center"/>
             </w:pPr>
@@ -6077,7 +6298,7 @@
                 <w:b w:val="0"/>
                 <w:i w:val="0"/>
                 <w:color w:val="000000"/>
-                <w:sz w:val="20"/>
+                <w:sz w:val="21"/>
               </w:rPr>
               <w:t>0.2313 ± 0.0154</w:t>
             </w:r>
@@ -6085,12 +6306,13 @@
         </w:tc>
         <w:tc>
           <w:tcPr>
-            <w:tcW w:type="dxa" w:w="1757"/>
+            <w:tcW w:type="dxa" w:w="1701"/>
+            <w:vAlign w:val="center"/>
             <w:tcMar>
-              <w:top w:w="60" w:type="dxa"/>
-              <w:left w:w="60" w:type="dxa"/>
-              <w:bottom w:w="60" w:type="dxa"/>
-              <w:right w:w="60" w:type="dxa"/>
+              <w:top w:w="100" w:type="dxa"/>
+              <w:left w:w="100" w:type="dxa"/>
+              <w:bottom w:w="100" w:type="dxa"/>
+              <w:right w:w="100" w:type="dxa"/>
             </w:tcMar>
             <w:tcBorders>
               <w:top w:val="nil" w:sz="0" w:space="0" w:color="auto"/>
@@ -6102,7 +6324,7 @@
           <w:p>
             <w:pPr>
               <w:widowControl/>
-              <w:spacing w:before="40" w:after="40" w:line="240" w:lineRule="auto"/>
+              <w:spacing w:before="60" w:after="60" w:lineRule="auto" w:line="276"/>
               <w:ind w:firstLine="0"/>
               <w:jc w:val="center"/>
             </w:pPr>
@@ -6113,7 +6335,7 @@
                 <w:b w:val="0"/>
                 <w:i w:val="0"/>
                 <w:color w:val="000000"/>
-                <w:sz w:val="20"/>
+                <w:sz w:val="21"/>
               </w:rPr>
               <w:t>0.2303 ± 0.0156</w:t>
             </w:r>
@@ -6121,12 +6343,13 @@
         </w:tc>
         <w:tc>
           <w:tcPr>
-            <w:tcW w:type="dxa" w:w="1757"/>
+            <w:tcW w:type="dxa" w:w="1701"/>
+            <w:vAlign w:val="center"/>
             <w:tcMar>
-              <w:top w:w="60" w:type="dxa"/>
-              <w:left w:w="60" w:type="dxa"/>
-              <w:bottom w:w="60" w:type="dxa"/>
-              <w:right w:w="60" w:type="dxa"/>
+              <w:top w:w="100" w:type="dxa"/>
+              <w:left w:w="100" w:type="dxa"/>
+              <w:bottom w:w="100" w:type="dxa"/>
+              <w:right w:w="100" w:type="dxa"/>
             </w:tcMar>
             <w:tcBorders>
               <w:top w:val="nil" w:sz="0" w:space="0" w:color="auto"/>
@@ -6138,7 +6361,7 @@
           <w:p>
             <w:pPr>
               <w:widowControl/>
-              <w:spacing w:before="40" w:after="40" w:line="240" w:lineRule="auto"/>
+              <w:spacing w:before="60" w:after="60" w:lineRule="auto" w:line="276"/>
               <w:ind w:firstLine="0"/>
               <w:jc w:val="center"/>
             </w:pPr>
@@ -6149,7 +6372,7 @@
                 <w:b w:val="0"/>
                 <w:i w:val="0"/>
                 <w:color w:val="000000"/>
-                <w:sz w:val="20"/>
+                <w:sz w:val="21"/>
               </w:rPr>
               <w:t>0.41 ± 0.25</w:t>
             </w:r>
@@ -6157,12 +6380,13 @@
         </w:tc>
         <w:tc>
           <w:tcPr>
-            <w:tcW w:type="dxa" w:w="1417"/>
+            <w:tcW w:type="dxa" w:w="1474"/>
+            <w:vAlign w:val="center"/>
             <w:tcMar>
-              <w:top w:w="60" w:type="dxa"/>
-              <w:left w:w="60" w:type="dxa"/>
-              <w:bottom w:w="60" w:type="dxa"/>
-              <w:right w:w="60" w:type="dxa"/>
+              <w:top w:w="100" w:type="dxa"/>
+              <w:left w:w="100" w:type="dxa"/>
+              <w:bottom w:w="100" w:type="dxa"/>
+              <w:right w:w="100" w:type="dxa"/>
             </w:tcMar>
             <w:vMerge/>
             <w:tcBorders>
@@ -6179,7 +6403,7 @@
     <w:p>
       <w:pPr>
         <w:widowControl/>
-        <w:spacing w:before="0" w:after="160" w:line="240" w:lineRule="auto"/>
+        <w:spacing w:before="0" w:after="240" w:line="240" w:lineRule="auto"/>
         <w:ind w:firstLine="0"/>
         <w:jc w:val="both"/>
       </w:pPr>
@@ -6187,7 +6411,7 @@
     <w:p>
       <w:pPr>
         <w:widowControl/>
-        <w:spacing w:before="40" w:after="120" w:line="240" w:lineRule="auto"/>
+        <w:spacing w:before="80" w:after="200" w:lineRule="auto" w:line="276"/>
         <w:ind w:firstLine="0"/>
         <w:jc w:val="both"/>
       </w:pPr>
@@ -6205,14 +6429,14 @@
     <w:p>
       <w:pPr>
         <w:widowControl/>
-        <w:spacing w:before="160" w:after="120" w:line="240" w:lineRule="auto"/>
+        <w:spacing w:before="200" w:after="160" w:line="240" w:lineRule="auto"/>
         <w:ind w:firstLine="0"/>
         <w:jc w:val="center"/>
       </w:pPr>
       <w:r>
         <w:drawing>
           <wp:inline xmlns:a="http://schemas.openxmlformats.org/drawingml/2006/main" xmlns:pic="http://schemas.openxmlformats.org/drawingml/2006/picture">
-            <wp:extent cx="5120640" cy="3565072"/>
+            <wp:extent cx="4937760" cy="3437748"/>
             <wp:docPr id="1" name="Picture 1"/>
             <wp:cNvGraphicFramePr>
               <a:graphicFrameLocks noChangeAspect="1"/>
@@ -6233,7 +6457,7 @@
                   <pic:spPr>
                     <a:xfrm>
                       <a:off x="0" y="0"/>
-                      <a:ext cx="5120640" cy="3565072"/>
+                      <a:ext cx="4937760" cy="3437748"/>
                     </a:xfrm>
                     <a:prstGeom prst="rect"/>
                   </pic:spPr>
@@ -6248,7 +6472,7 @@
       <w:pPr>
         <w:keepNext/>
         <w:widowControl/>
-        <w:spacing w:before="200" w:after="120" w:lineRule="auto" w:line="276"/>
+        <w:spacing w:before="280" w:after="160" w:lineRule="auto" w:line="276"/>
         <w:ind w:firstLine="0"/>
         <w:jc w:val="left"/>
       </w:pPr>
@@ -6331,7 +6555,7 @@
       <w:pPr>
         <w:keepNext/>
         <w:widowControl/>
-        <w:spacing w:before="200" w:after="120" w:lineRule="auto" w:line="276"/>
+        <w:spacing w:before="280" w:after="160" w:lineRule="auto" w:line="276"/>
         <w:ind w:firstLine="0"/>
         <w:jc w:val="left"/>
       </w:pPr>
@@ -6373,15 +6597,17 @@
       <w:tr>
         <w:trPr>
           <w:cantSplit/>
+          <w:tblHeader/>
         </w:trPr>
         <w:tc>
           <w:tcPr>
             <w:tcW w:type="dxa" w:w="3515"/>
+            <w:vAlign w:val="center"/>
             <w:tcMar>
-              <w:top w:w="60" w:type="dxa"/>
-              <w:left w:w="60" w:type="dxa"/>
-              <w:bottom w:w="60" w:type="dxa"/>
-              <w:right w:w="60" w:type="dxa"/>
+              <w:top w:w="100" w:type="dxa"/>
+              <w:left w:w="100" w:type="dxa"/>
+              <w:bottom w:w="100" w:type="dxa"/>
+              <w:right w:w="100" w:type="dxa"/>
             </w:tcMar>
             <w:tcBorders>
               <w:top w:val="single" w:sz="18" w:space="0" w:color="000000"/>
@@ -6393,7 +6619,7 @@
           <w:p>
             <w:pPr>
               <w:widowControl/>
-              <w:spacing w:before="40" w:after="40" w:line="240" w:lineRule="auto"/>
+              <w:spacing w:before="60" w:after="60" w:lineRule="auto" w:line="276"/>
               <w:ind w:firstLine="0"/>
               <w:jc w:val="left"/>
             </w:pPr>
@@ -6404,7 +6630,7 @@
                 <w:b/>
                 <w:i w:val="0"/>
                 <w:color w:val="000000"/>
-                <w:sz w:val="20"/>
+                <w:sz w:val="21"/>
               </w:rPr>
               <w:t>Composite resin</w:t>
             </w:r>
@@ -6413,11 +6639,12 @@
         <w:tc>
           <w:tcPr>
             <w:tcW w:type="dxa" w:w="3061"/>
+            <w:vAlign w:val="center"/>
             <w:tcMar>
-              <w:top w:w="60" w:type="dxa"/>
-              <w:left w:w="60" w:type="dxa"/>
-              <w:bottom w:w="60" w:type="dxa"/>
-              <w:right w:w="60" w:type="dxa"/>
+              <w:top w:w="100" w:type="dxa"/>
+              <w:left w:w="100" w:type="dxa"/>
+              <w:bottom w:w="100" w:type="dxa"/>
+              <w:right w:w="100" w:type="dxa"/>
             </w:tcMar>
             <w:tcBorders>
               <w:top w:val="single" w:sz="18" w:space="0" w:color="000000"/>
@@ -6429,7 +6656,7 @@
           <w:p>
             <w:pPr>
               <w:widowControl/>
-              <w:spacing w:before="40" w:after="40" w:line="240" w:lineRule="auto"/>
+              <w:spacing w:before="60" w:after="60" w:lineRule="auto" w:line="276"/>
               <w:ind w:firstLine="0"/>
               <w:jc w:val="center"/>
             </w:pPr>
@@ -6440,7 +6667,7 @@
                 <w:b/>
                 <w:i w:val="0"/>
                 <w:color w:val="000000"/>
-                <w:sz w:val="20"/>
+                <w:sz w:val="21"/>
               </w:rPr>
               <w:t>Absolute weight loss (mg)</w:t>
             </w:r>
@@ -6448,7 +6675,7 @@
           <w:p>
             <w:pPr>
               <w:widowControl/>
-              <w:spacing w:before="40" w:after="40" w:line="240" w:lineRule="auto"/>
+              <w:spacing w:before="60" w:after="60" w:lineRule="auto" w:line="276"/>
               <w:ind w:firstLine="0"/>
               <w:jc w:val="center"/>
             </w:pPr>
@@ -6458,7 +6685,7 @@
                 <w:b/>
                 <w:i w:val="0"/>
                 <w:color w:val="000000"/>
-                <w:sz w:val="20"/>
+                <w:sz w:val="21"/>
               </w:rPr>
               <w:t>Mean ± SD</w:t>
             </w:r>
@@ -6467,11 +6694,12 @@
         <w:tc>
           <w:tcPr>
             <w:tcW w:type="dxa" w:w="2381"/>
+            <w:vAlign w:val="center"/>
             <w:tcMar>
-              <w:top w:w="60" w:type="dxa"/>
-              <w:left w:w="60" w:type="dxa"/>
-              <w:bottom w:w="60" w:type="dxa"/>
-              <w:right w:w="60" w:type="dxa"/>
+              <w:top w:w="100" w:type="dxa"/>
+              <w:left w:w="100" w:type="dxa"/>
+              <w:bottom w:w="100" w:type="dxa"/>
+              <w:right w:w="100" w:type="dxa"/>
             </w:tcMar>
             <w:tcBorders>
               <w:top w:val="single" w:sz="18" w:space="0" w:color="000000"/>
@@ -6483,7 +6711,7 @@
           <w:p>
             <w:pPr>
               <w:widowControl/>
-              <w:spacing w:before="40" w:after="40" w:line="240" w:lineRule="auto"/>
+              <w:spacing w:before="60" w:after="60" w:lineRule="auto" w:line="276"/>
               <w:ind w:firstLine="0"/>
               <w:jc w:val="center"/>
             </w:pPr>
@@ -6494,7 +6722,7 @@
                 <w:b/>
                 <w:i w:val="0"/>
                 <w:color w:val="000000"/>
-                <w:sz w:val="20"/>
+                <w:sz w:val="21"/>
               </w:rPr>
               <w:t>Range (mg)</w:t>
             </w:r>
@@ -6508,11 +6736,12 @@
         <w:tc>
           <w:tcPr>
             <w:tcW w:type="dxa" w:w="3515"/>
+            <w:vAlign w:val="center"/>
             <w:tcMar>
-              <w:top w:w="60" w:type="dxa"/>
-              <w:left w:w="60" w:type="dxa"/>
-              <w:bottom w:w="60" w:type="dxa"/>
-              <w:right w:w="60" w:type="dxa"/>
+              <w:top w:w="100" w:type="dxa"/>
+              <w:left w:w="100" w:type="dxa"/>
+              <w:bottom w:w="100" w:type="dxa"/>
+              <w:right w:w="100" w:type="dxa"/>
             </w:tcMar>
             <w:tcBorders>
               <w:top w:val="nil" w:sz="0" w:space="0" w:color="auto"/>
@@ -6524,7 +6753,7 @@
           <w:p>
             <w:pPr>
               <w:widowControl/>
-              <w:spacing w:before="40" w:after="40" w:line="240" w:lineRule="auto"/>
+              <w:spacing w:before="60" w:after="60" w:lineRule="auto" w:line="276"/>
               <w:ind w:firstLine="0"/>
               <w:jc w:val="left"/>
             </w:pPr>
@@ -6535,7 +6764,7 @@
                 <w:b w:val="0"/>
                 <w:i w:val="0"/>
                 <w:color w:val="000000"/>
-                <w:sz w:val="20"/>
+                <w:sz w:val="21"/>
               </w:rPr>
               <w:t>Beautifil Flow Plus X F00</w:t>
             </w:r>
@@ -6544,11 +6773,12 @@
         <w:tc>
           <w:tcPr>
             <w:tcW w:type="dxa" w:w="3061"/>
+            <w:vAlign w:val="center"/>
             <w:tcMar>
-              <w:top w:w="60" w:type="dxa"/>
-              <w:left w:w="60" w:type="dxa"/>
-              <w:bottom w:w="60" w:type="dxa"/>
-              <w:right w:w="60" w:type="dxa"/>
+              <w:top w:w="100" w:type="dxa"/>
+              <w:left w:w="100" w:type="dxa"/>
+              <w:bottom w:w="100" w:type="dxa"/>
+              <w:right w:w="100" w:type="dxa"/>
             </w:tcMar>
             <w:tcBorders>
               <w:top w:val="nil" w:sz="0" w:space="0" w:color="auto"/>
@@ -6560,7 +6790,7 @@
           <w:p>
             <w:pPr>
               <w:widowControl/>
-              <w:spacing w:before="40" w:after="40" w:line="240" w:lineRule="auto"/>
+              <w:spacing w:before="60" w:after="60" w:lineRule="auto" w:line="276"/>
               <w:ind w:firstLine="0"/>
               <w:jc w:val="center"/>
             </w:pPr>
@@ -6571,7 +6801,7 @@
                 <w:b w:val="0"/>
                 <w:i w:val="0"/>
                 <w:color w:val="000000"/>
-                <w:sz w:val="20"/>
+                <w:sz w:val="21"/>
               </w:rPr>
               <w:t>2.58 ± 5.91</w:t>
             </w:r>
@@ -6580,11 +6810,12 @@
         <w:tc>
           <w:tcPr>
             <w:tcW w:type="dxa" w:w="2381"/>
+            <w:vAlign w:val="center"/>
             <w:tcMar>
-              <w:top w:w="60" w:type="dxa"/>
-              <w:left w:w="60" w:type="dxa"/>
-              <w:bottom w:w="60" w:type="dxa"/>
-              <w:right w:w="60" w:type="dxa"/>
+              <w:top w:w="100" w:type="dxa"/>
+              <w:left w:w="100" w:type="dxa"/>
+              <w:bottom w:w="100" w:type="dxa"/>
+              <w:right w:w="100" w:type="dxa"/>
             </w:tcMar>
             <w:tcBorders>
               <w:top w:val="nil" w:sz="0" w:space="0" w:color="auto"/>
@@ -6596,7 +6827,7 @@
           <w:p>
             <w:pPr>
               <w:widowControl/>
-              <w:spacing w:before="40" w:after="40" w:line="240" w:lineRule="auto"/>
+              <w:spacing w:before="60" w:after="60" w:lineRule="auto" w:line="276"/>
               <w:ind w:firstLine="0"/>
               <w:jc w:val="center"/>
             </w:pPr>
@@ -6607,7 +6838,7 @@
                 <w:b w:val="0"/>
                 <w:i w:val="0"/>
                 <w:color w:val="000000"/>
-                <w:sz w:val="20"/>
+                <w:sz w:val="21"/>
               </w:rPr>
               <w:t>0.2 – 20.7</w:t>
             </w:r>
@@ -6621,11 +6852,12 @@
         <w:tc>
           <w:tcPr>
             <w:tcW w:type="dxa" w:w="3515"/>
+            <w:vAlign w:val="center"/>
             <w:tcMar>
-              <w:top w:w="60" w:type="dxa"/>
-              <w:left w:w="60" w:type="dxa"/>
-              <w:bottom w:w="60" w:type="dxa"/>
-              <w:right w:w="60" w:type="dxa"/>
+              <w:top w:w="100" w:type="dxa"/>
+              <w:left w:w="100" w:type="dxa"/>
+              <w:bottom w:w="100" w:type="dxa"/>
+              <w:right w:w="100" w:type="dxa"/>
             </w:tcMar>
             <w:tcBorders>
               <w:top w:val="nil" w:sz="0" w:space="0" w:color="auto"/>
@@ -6637,7 +6869,7 @@
           <w:p>
             <w:pPr>
               <w:widowControl/>
-              <w:spacing w:before="40" w:after="40" w:line="240" w:lineRule="auto"/>
+              <w:spacing w:before="60" w:after="60" w:lineRule="auto" w:line="276"/>
               <w:ind w:firstLine="0"/>
               <w:jc w:val="left"/>
             </w:pPr>
@@ -6648,7 +6880,7 @@
                 <w:b w:val="0"/>
                 <w:i w:val="0"/>
                 <w:color w:val="000000"/>
-                <w:sz w:val="20"/>
+                <w:sz w:val="21"/>
               </w:rPr>
               <w:t>G-ænial Universal Injectable</w:t>
             </w:r>
@@ -6657,11 +6889,12 @@
         <w:tc>
           <w:tcPr>
             <w:tcW w:type="dxa" w:w="3061"/>
+            <w:vAlign w:val="center"/>
             <w:tcMar>
-              <w:top w:w="60" w:type="dxa"/>
-              <w:left w:w="60" w:type="dxa"/>
-              <w:bottom w:w="60" w:type="dxa"/>
-              <w:right w:w="60" w:type="dxa"/>
+              <w:top w:w="100" w:type="dxa"/>
+              <w:left w:w="100" w:type="dxa"/>
+              <w:bottom w:w="100" w:type="dxa"/>
+              <w:right w:w="100" w:type="dxa"/>
             </w:tcMar>
             <w:tcBorders>
               <w:top w:val="nil" w:sz="0" w:space="0" w:color="auto"/>
@@ -6673,7 +6906,7 @@
           <w:p>
             <w:pPr>
               <w:widowControl/>
-              <w:spacing w:before="40" w:after="40" w:line="240" w:lineRule="auto"/>
+              <w:spacing w:before="60" w:after="60" w:lineRule="auto" w:line="276"/>
               <w:ind w:firstLine="0"/>
               <w:jc w:val="center"/>
             </w:pPr>
@@ -6684,7 +6917,7 @@
                 <w:b w:val="0"/>
                 <w:i w:val="0"/>
                 <w:color w:val="000000"/>
-                <w:sz w:val="20"/>
+                <w:sz w:val="21"/>
               </w:rPr>
               <w:t>1.07 ± 0.62</w:t>
             </w:r>
@@ -6693,11 +6926,12 @@
         <w:tc>
           <w:tcPr>
             <w:tcW w:type="dxa" w:w="2381"/>
+            <w:vAlign w:val="center"/>
             <w:tcMar>
-              <w:top w:w="60" w:type="dxa"/>
-              <w:left w:w="60" w:type="dxa"/>
-              <w:bottom w:w="60" w:type="dxa"/>
-              <w:right w:w="60" w:type="dxa"/>
+              <w:top w:w="100" w:type="dxa"/>
+              <w:left w:w="100" w:type="dxa"/>
+              <w:bottom w:w="100" w:type="dxa"/>
+              <w:right w:w="100" w:type="dxa"/>
             </w:tcMar>
             <w:tcBorders>
               <w:top w:val="nil" w:sz="0" w:space="0" w:color="auto"/>
@@ -6709,7 +6943,7 @@
           <w:p>
             <w:pPr>
               <w:widowControl/>
-              <w:spacing w:before="40" w:after="40" w:line="240" w:lineRule="auto"/>
+              <w:spacing w:before="60" w:after="60" w:lineRule="auto" w:line="276"/>
               <w:ind w:firstLine="0"/>
               <w:jc w:val="center"/>
             </w:pPr>
@@ -6720,7 +6954,7 @@
                 <w:b w:val="0"/>
                 <w:i w:val="0"/>
                 <w:color w:val="000000"/>
-                <w:sz w:val="20"/>
+                <w:sz w:val="21"/>
               </w:rPr>
               <w:t>0.2 – 1.9</w:t>
             </w:r>
@@ -6734,11 +6968,12 @@
         <w:tc>
           <w:tcPr>
             <w:tcW w:type="dxa" w:w="3515"/>
+            <w:vAlign w:val="center"/>
             <w:tcMar>
-              <w:top w:w="60" w:type="dxa"/>
-              <w:left w:w="60" w:type="dxa"/>
-              <w:bottom w:w="60" w:type="dxa"/>
-              <w:right w:w="60" w:type="dxa"/>
+              <w:top w:w="100" w:type="dxa"/>
+              <w:left w:w="100" w:type="dxa"/>
+              <w:bottom w:w="100" w:type="dxa"/>
+              <w:right w:w="100" w:type="dxa"/>
             </w:tcMar>
             <w:tcBorders>
               <w:top w:val="nil" w:sz="0" w:space="0" w:color="auto"/>
@@ -6750,7 +6985,7 @@
           <w:p>
             <w:pPr>
               <w:widowControl/>
-              <w:spacing w:before="40" w:after="40" w:line="240" w:lineRule="auto"/>
+              <w:spacing w:before="60" w:after="60" w:lineRule="auto" w:line="276"/>
               <w:ind w:firstLine="0"/>
               <w:jc w:val="left"/>
             </w:pPr>
@@ -6761,7 +6996,7 @@
                 <w:b w:val="0"/>
                 <w:i w:val="0"/>
                 <w:color w:val="000000"/>
-                <w:sz w:val="20"/>
+                <w:sz w:val="21"/>
               </w:rPr>
               <w:t>Beautifil II LS</w:t>
             </w:r>
@@ -6770,11 +7005,12 @@
         <w:tc>
           <w:tcPr>
             <w:tcW w:type="dxa" w:w="3061"/>
+            <w:vAlign w:val="center"/>
             <w:tcMar>
-              <w:top w:w="60" w:type="dxa"/>
-              <w:left w:w="60" w:type="dxa"/>
-              <w:bottom w:w="60" w:type="dxa"/>
-              <w:right w:w="60" w:type="dxa"/>
+              <w:top w:w="100" w:type="dxa"/>
+              <w:left w:w="100" w:type="dxa"/>
+              <w:bottom w:w="100" w:type="dxa"/>
+              <w:right w:w="100" w:type="dxa"/>
             </w:tcMar>
             <w:tcBorders>
               <w:top w:val="nil" w:sz="0" w:space="0" w:color="auto"/>
@@ -6786,7 +7022,7 @@
           <w:p>
             <w:pPr>
               <w:widowControl/>
-              <w:spacing w:before="40" w:after="40" w:line="240" w:lineRule="auto"/>
+              <w:spacing w:before="60" w:after="60" w:lineRule="auto" w:line="276"/>
               <w:ind w:firstLine="0"/>
               <w:jc w:val="center"/>
             </w:pPr>
@@ -6797,7 +7033,7 @@
                 <w:b w:val="0"/>
                 <w:i w:val="0"/>
                 <w:color w:val="000000"/>
-                <w:sz w:val="20"/>
+                <w:sz w:val="21"/>
               </w:rPr>
               <w:t>0.95 ± 0.58</w:t>
             </w:r>
@@ -6806,11 +7042,12 @@
         <w:tc>
           <w:tcPr>
             <w:tcW w:type="dxa" w:w="2381"/>
+            <w:vAlign w:val="center"/>
             <w:tcMar>
-              <w:top w:w="60" w:type="dxa"/>
-              <w:left w:w="60" w:type="dxa"/>
-              <w:bottom w:w="60" w:type="dxa"/>
-              <w:right w:w="60" w:type="dxa"/>
+              <w:top w:w="100" w:type="dxa"/>
+              <w:left w:w="100" w:type="dxa"/>
+              <w:bottom w:w="100" w:type="dxa"/>
+              <w:right w:w="100" w:type="dxa"/>
             </w:tcMar>
             <w:tcBorders>
               <w:top w:val="nil" w:sz="0" w:space="0" w:color="auto"/>
@@ -6822,7 +7059,7 @@
           <w:p>
             <w:pPr>
               <w:widowControl/>
-              <w:spacing w:before="40" w:after="40" w:line="240" w:lineRule="auto"/>
+              <w:spacing w:before="60" w:after="60" w:lineRule="auto" w:line="276"/>
               <w:ind w:firstLine="0"/>
               <w:jc w:val="center"/>
             </w:pPr>
@@ -6833,7 +7070,7 @@
                 <w:b w:val="0"/>
                 <w:i w:val="0"/>
                 <w:color w:val="000000"/>
-                <w:sz w:val="20"/>
+                <w:sz w:val="21"/>
               </w:rPr>
               <w:t>0.1 – 1.8</w:t>
             </w:r>
@@ -6844,7 +7081,7 @@
     <w:p>
       <w:pPr>
         <w:widowControl/>
-        <w:spacing w:before="0" w:after="160" w:line="240" w:lineRule="auto"/>
+        <w:spacing w:before="0" w:after="240" w:line="240" w:lineRule="auto"/>
         <w:ind w:firstLine="0"/>
         <w:jc w:val="both"/>
       </w:pPr>
@@ -6852,7 +7089,7 @@
     <w:p>
       <w:pPr>
         <w:widowControl/>
-        <w:spacing w:before="40" w:after="120" w:line="240" w:lineRule="auto"/>
+        <w:spacing w:before="80" w:after="200" w:lineRule="auto" w:line="276"/>
         <w:ind w:firstLine="0"/>
         <w:jc w:val="both"/>
       </w:pPr>
@@ -6890,7 +7127,7 @@
         <w:pStyle w:val="Heading2"/>
         <w:keepNext/>
         <w:widowControl/>
-        <w:spacing w:before="240" w:after="120" w:line="240" w:lineRule="auto"/>
+        <w:spacing w:before="320" w:after="160" w:line="240" w:lineRule="auto"/>
         <w:ind w:firstLine="0"/>
         <w:jc w:val="left"/>
       </w:pPr>
@@ -6927,7 +7164,7 @@
       <w:pPr>
         <w:keepNext/>
         <w:widowControl/>
-        <w:spacing w:before="200" w:after="120" w:lineRule="auto" w:line="276"/>
+        <w:spacing w:before="280" w:after="160" w:lineRule="auto" w:line="276"/>
         <w:ind w:firstLine="0"/>
         <w:jc w:val="left"/>
       </w:pPr>
@@ -6971,15 +7208,17 @@
       <w:tr>
         <w:trPr>
           <w:cantSplit/>
+          <w:tblHeader/>
         </w:trPr>
         <w:tc>
           <w:tcPr>
-            <w:tcW w:type="dxa" w:w="2268"/>
+            <w:tcW w:type="dxa" w:w="2381"/>
+            <w:vAlign w:val="center"/>
             <w:tcMar>
-              <w:top w:w="60" w:type="dxa"/>
-              <w:left w:w="60" w:type="dxa"/>
-              <w:bottom w:w="60" w:type="dxa"/>
-              <w:right w:w="60" w:type="dxa"/>
+              <w:top w:w="100" w:type="dxa"/>
+              <w:left w:w="100" w:type="dxa"/>
+              <w:bottom w:w="100" w:type="dxa"/>
+              <w:right w:w="100" w:type="dxa"/>
             </w:tcMar>
             <w:tcBorders>
               <w:top w:val="single" w:sz="18" w:space="0" w:color="000000"/>
@@ -6991,7 +7230,7 @@
           <w:p>
             <w:pPr>
               <w:widowControl/>
-              <w:spacing w:before="40" w:after="40" w:line="240" w:lineRule="auto"/>
+              <w:spacing w:before="60" w:after="60" w:lineRule="auto" w:line="276"/>
               <w:ind w:firstLine="0"/>
               <w:jc w:val="left"/>
             </w:pPr>
@@ -7002,7 +7241,7 @@
                 <w:b/>
                 <w:i w:val="0"/>
                 <w:color w:val="000000"/>
-                <w:sz w:val="20"/>
+                <w:sz w:val="21"/>
               </w:rPr>
               <w:t>Composite resin</w:t>
             </w:r>
@@ -7010,12 +7249,13 @@
         </w:tc>
         <w:tc>
           <w:tcPr>
-            <w:tcW w:type="dxa" w:w="1757"/>
+            <w:tcW w:type="dxa" w:w="1701"/>
+            <w:vAlign w:val="center"/>
             <w:tcMar>
-              <w:top w:w="60" w:type="dxa"/>
-              <w:left w:w="60" w:type="dxa"/>
-              <w:bottom w:w="60" w:type="dxa"/>
-              <w:right w:w="60" w:type="dxa"/>
+              <w:top w:w="100" w:type="dxa"/>
+              <w:left w:w="100" w:type="dxa"/>
+              <w:bottom w:w="100" w:type="dxa"/>
+              <w:right w:w="100" w:type="dxa"/>
             </w:tcMar>
             <w:tcBorders>
               <w:top w:val="single" w:sz="18" w:space="0" w:color="000000"/>
@@ -7027,7 +7267,7 @@
           <w:p>
             <w:pPr>
               <w:widowControl/>
-              <w:spacing w:before="40" w:after="40" w:line="240" w:lineRule="auto"/>
+              <w:spacing w:before="60" w:after="60" w:lineRule="auto" w:line="276"/>
               <w:ind w:firstLine="0"/>
               <w:jc w:val="center"/>
             </w:pPr>
@@ -7038,7 +7278,7 @@
                 <w:b/>
                 <w:i w:val="0"/>
                 <w:color w:val="000000"/>
-                <w:sz w:val="20"/>
+                <w:sz w:val="21"/>
               </w:rPr>
               <w:t>Ra before (µm)</w:t>
             </w:r>
@@ -7046,7 +7286,7 @@
           <w:p>
             <w:pPr>
               <w:widowControl/>
-              <w:spacing w:before="40" w:after="40" w:line="240" w:lineRule="auto"/>
+              <w:spacing w:before="60" w:after="60" w:lineRule="auto" w:line="276"/>
               <w:ind w:firstLine="0"/>
               <w:jc w:val="center"/>
             </w:pPr>
@@ -7056,7 +7296,7 @@
                 <w:b/>
                 <w:i w:val="0"/>
                 <w:color w:val="000000"/>
-                <w:sz w:val="20"/>
+                <w:sz w:val="21"/>
               </w:rPr>
               <w:t>Mean ± SD</w:t>
             </w:r>
@@ -7064,12 +7304,13 @@
         </w:tc>
         <w:tc>
           <w:tcPr>
-            <w:tcW w:type="dxa" w:w="1757"/>
+            <w:tcW w:type="dxa" w:w="1701"/>
+            <w:vAlign w:val="center"/>
             <w:tcMar>
-              <w:top w:w="60" w:type="dxa"/>
-              <w:left w:w="60" w:type="dxa"/>
-              <w:bottom w:w="60" w:type="dxa"/>
-              <w:right w:w="60" w:type="dxa"/>
+              <w:top w:w="100" w:type="dxa"/>
+              <w:left w:w="100" w:type="dxa"/>
+              <w:bottom w:w="100" w:type="dxa"/>
+              <w:right w:w="100" w:type="dxa"/>
             </w:tcMar>
             <w:tcBorders>
               <w:top w:val="single" w:sz="18" w:space="0" w:color="000000"/>
@@ -7081,7 +7322,7 @@
           <w:p>
             <w:pPr>
               <w:widowControl/>
-              <w:spacing w:before="40" w:after="40" w:line="240" w:lineRule="auto"/>
+              <w:spacing w:before="60" w:after="60" w:lineRule="auto" w:line="276"/>
               <w:ind w:firstLine="0"/>
               <w:jc w:val="center"/>
             </w:pPr>
@@ -7092,7 +7333,7 @@
                 <w:b/>
                 <w:i w:val="0"/>
                 <w:color w:val="000000"/>
-                <w:sz w:val="20"/>
+                <w:sz w:val="21"/>
               </w:rPr>
               <w:t>Ra after (µm)</w:t>
             </w:r>
@@ -7100,7 +7341,7 @@
           <w:p>
             <w:pPr>
               <w:widowControl/>
-              <w:spacing w:before="40" w:after="40" w:line="240" w:lineRule="auto"/>
+              <w:spacing w:before="60" w:after="60" w:lineRule="auto" w:line="276"/>
               <w:ind w:firstLine="0"/>
               <w:jc w:val="center"/>
             </w:pPr>
@@ -7110,7 +7351,7 @@
                 <w:b/>
                 <w:i w:val="0"/>
                 <w:color w:val="000000"/>
-                <w:sz w:val="20"/>
+                <w:sz w:val="21"/>
               </w:rPr>
               <w:t>Mean ± SD</w:t>
             </w:r>
@@ -7118,12 +7359,13 @@
         </w:tc>
         <w:tc>
           <w:tcPr>
-            <w:tcW w:type="dxa" w:w="1757"/>
+            <w:tcW w:type="dxa" w:w="1701"/>
+            <w:vAlign w:val="center"/>
             <w:tcMar>
-              <w:top w:w="60" w:type="dxa"/>
-              <w:left w:w="60" w:type="dxa"/>
-              <w:bottom w:w="60" w:type="dxa"/>
-              <w:right w:w="60" w:type="dxa"/>
+              <w:top w:w="100" w:type="dxa"/>
+              <w:left w:w="100" w:type="dxa"/>
+              <w:bottom w:w="100" w:type="dxa"/>
+              <w:right w:w="100" w:type="dxa"/>
             </w:tcMar>
             <w:tcBorders>
               <w:top w:val="single" w:sz="18" w:space="0" w:color="000000"/>
@@ -7135,7 +7377,7 @@
           <w:p>
             <w:pPr>
               <w:widowControl/>
-              <w:spacing w:before="40" w:after="40" w:line="240" w:lineRule="auto"/>
+              <w:spacing w:before="60" w:after="60" w:lineRule="auto" w:line="276"/>
               <w:ind w:firstLine="0"/>
               <w:jc w:val="center"/>
             </w:pPr>
@@ -7146,7 +7388,7 @@
                 <w:b/>
                 <w:i w:val="0"/>
                 <w:color w:val="000000"/>
-                <w:sz w:val="20"/>
+                <w:sz w:val="21"/>
               </w:rPr>
               <w:t>ΔRa (µm)</w:t>
             </w:r>
@@ -7154,7 +7396,7 @@
           <w:p>
             <w:pPr>
               <w:widowControl/>
-              <w:spacing w:before="40" w:after="40" w:line="240" w:lineRule="auto"/>
+              <w:spacing w:before="60" w:after="60" w:lineRule="auto" w:line="276"/>
               <w:ind w:firstLine="0"/>
               <w:jc w:val="center"/>
             </w:pPr>
@@ -7164,7 +7406,7 @@
                 <w:b/>
                 <w:i w:val="0"/>
                 <w:color w:val="000000"/>
-                <w:sz w:val="20"/>
+                <w:sz w:val="21"/>
               </w:rPr>
               <w:t>Mean ± SD</w:t>
             </w:r>
@@ -7172,12 +7414,13 @@
         </w:tc>
         <w:tc>
           <w:tcPr>
-            <w:tcW w:type="dxa" w:w="1417"/>
+            <w:tcW w:type="dxa" w:w="1474"/>
+            <w:vAlign w:val="center"/>
             <w:tcMar>
-              <w:top w:w="60" w:type="dxa"/>
-              <w:left w:w="60" w:type="dxa"/>
-              <w:bottom w:w="60" w:type="dxa"/>
-              <w:right w:w="60" w:type="dxa"/>
+              <w:top w:w="100" w:type="dxa"/>
+              <w:left w:w="100" w:type="dxa"/>
+              <w:bottom w:w="100" w:type="dxa"/>
+              <w:right w:w="100" w:type="dxa"/>
             </w:tcMar>
             <w:tcBorders>
               <w:top w:val="single" w:sz="18" w:space="0" w:color="000000"/>
@@ -7189,7 +7432,7 @@
           <w:p>
             <w:pPr>
               <w:widowControl/>
-              <w:spacing w:before="40" w:after="40" w:line="240" w:lineRule="auto"/>
+              <w:spacing w:before="60" w:after="60" w:lineRule="auto" w:line="276"/>
               <w:ind w:firstLine="0"/>
               <w:jc w:val="center"/>
             </w:pPr>
@@ -7200,7 +7443,7 @@
                 <w:b/>
                 <w:i w:val="0"/>
                 <w:color w:val="000000"/>
-                <w:sz w:val="20"/>
+                <w:sz w:val="21"/>
               </w:rPr>
               <w:t>p-value</w:t>
             </w:r>
@@ -7213,12 +7456,13 @@
         </w:trPr>
         <w:tc>
           <w:tcPr>
-            <w:tcW w:type="dxa" w:w="2268"/>
+            <w:tcW w:type="dxa" w:w="2381"/>
+            <w:vAlign w:val="center"/>
             <w:tcMar>
-              <w:top w:w="60" w:type="dxa"/>
-              <w:left w:w="60" w:type="dxa"/>
-              <w:bottom w:w="60" w:type="dxa"/>
-              <w:right w:w="60" w:type="dxa"/>
+              <w:top w:w="100" w:type="dxa"/>
+              <w:left w:w="100" w:type="dxa"/>
+              <w:bottom w:w="100" w:type="dxa"/>
+              <w:right w:w="100" w:type="dxa"/>
             </w:tcMar>
             <w:tcBorders>
               <w:top w:val="nil" w:sz="0" w:space="0" w:color="auto"/>
@@ -7230,7 +7474,7 @@
           <w:p>
             <w:pPr>
               <w:widowControl/>
-              <w:spacing w:before="40" w:after="40" w:line="240" w:lineRule="auto"/>
+              <w:spacing w:before="60" w:after="60" w:lineRule="auto" w:line="276"/>
               <w:ind w:firstLine="0"/>
               <w:jc w:val="left"/>
             </w:pPr>
@@ -7241,7 +7485,7 @@
                 <w:b w:val="0"/>
                 <w:i w:val="0"/>
                 <w:color w:val="000000"/>
-                <w:sz w:val="20"/>
+                <w:sz w:val="21"/>
               </w:rPr>
               <w:t>Beautifil Flow Plus X F00</w:t>
             </w:r>
@@ -7249,12 +7493,13 @@
         </w:tc>
         <w:tc>
           <w:tcPr>
-            <w:tcW w:type="dxa" w:w="1757"/>
+            <w:tcW w:type="dxa" w:w="1701"/>
+            <w:vAlign w:val="center"/>
             <w:tcMar>
-              <w:top w:w="60" w:type="dxa"/>
-              <w:left w:w="60" w:type="dxa"/>
-              <w:bottom w:w="60" w:type="dxa"/>
-              <w:right w:w="60" w:type="dxa"/>
+              <w:top w:w="100" w:type="dxa"/>
+              <w:left w:w="100" w:type="dxa"/>
+              <w:bottom w:w="100" w:type="dxa"/>
+              <w:right w:w="100" w:type="dxa"/>
             </w:tcMar>
             <w:tcBorders>
               <w:top w:val="nil" w:sz="0" w:space="0" w:color="auto"/>
@@ -7266,7 +7511,7 @@
           <w:p>
             <w:pPr>
               <w:widowControl/>
-              <w:spacing w:before="40" w:after="40" w:line="240" w:lineRule="auto"/>
+              <w:spacing w:before="60" w:after="60" w:lineRule="auto" w:line="276"/>
               <w:ind w:firstLine="0"/>
               <w:jc w:val="center"/>
             </w:pPr>
@@ -7277,7 +7522,7 @@
                 <w:b w:val="0"/>
                 <w:i w:val="0"/>
                 <w:color w:val="000000"/>
-                <w:sz w:val="20"/>
+                <w:sz w:val="21"/>
               </w:rPr>
               <w:t>0.038 ± 0.011</w:t>
             </w:r>
@@ -7285,12 +7530,13 @@
         </w:tc>
         <w:tc>
           <w:tcPr>
-            <w:tcW w:type="dxa" w:w="1757"/>
+            <w:tcW w:type="dxa" w:w="1701"/>
+            <w:vAlign w:val="center"/>
             <w:tcMar>
-              <w:top w:w="60" w:type="dxa"/>
-              <w:left w:w="60" w:type="dxa"/>
-              <w:bottom w:w="60" w:type="dxa"/>
-              <w:right w:w="60" w:type="dxa"/>
+              <w:top w:w="100" w:type="dxa"/>
+              <w:left w:w="100" w:type="dxa"/>
+              <w:bottom w:w="100" w:type="dxa"/>
+              <w:right w:w="100" w:type="dxa"/>
             </w:tcMar>
             <w:tcBorders>
               <w:top w:val="nil" w:sz="0" w:space="0" w:color="auto"/>
@@ -7302,7 +7548,7 @@
           <w:p>
             <w:pPr>
               <w:widowControl/>
-              <w:spacing w:before="40" w:after="40" w:line="240" w:lineRule="auto"/>
+              <w:spacing w:before="60" w:after="60" w:lineRule="auto" w:line="276"/>
               <w:ind w:firstLine="0"/>
               <w:jc w:val="center"/>
             </w:pPr>
@@ -7313,7 +7559,7 @@
                 <w:b w:val="0"/>
                 <w:i w:val="0"/>
                 <w:color w:val="000000"/>
-                <w:sz w:val="20"/>
+                <w:sz w:val="21"/>
               </w:rPr>
               <w:t>0.104 ± 0.017</w:t>
             </w:r>
@@ -7321,12 +7567,13 @@
         </w:tc>
         <w:tc>
           <w:tcPr>
-            <w:tcW w:type="dxa" w:w="1757"/>
+            <w:tcW w:type="dxa" w:w="1701"/>
+            <w:vAlign w:val="center"/>
             <w:tcMar>
-              <w:top w:w="60" w:type="dxa"/>
-              <w:left w:w="60" w:type="dxa"/>
-              <w:bottom w:w="60" w:type="dxa"/>
-              <w:right w:w="60" w:type="dxa"/>
+              <w:top w:w="100" w:type="dxa"/>
+              <w:left w:w="100" w:type="dxa"/>
+              <w:bottom w:w="100" w:type="dxa"/>
+              <w:right w:w="100" w:type="dxa"/>
             </w:tcMar>
             <w:tcBorders>
               <w:top w:val="nil" w:sz="0" w:space="0" w:color="auto"/>
@@ -7338,7 +7585,7 @@
           <w:p>
             <w:pPr>
               <w:widowControl/>
-              <w:spacing w:before="40" w:after="40" w:line="240" w:lineRule="auto"/>
+              <w:spacing w:before="60" w:after="60" w:lineRule="auto" w:line="276"/>
               <w:ind w:firstLine="0"/>
               <w:jc w:val="center"/>
             </w:pPr>
@@ -7349,7 +7596,7 @@
                 <w:b w:val="0"/>
                 <w:i w:val="0"/>
                 <w:color w:val="000000"/>
-                <w:sz w:val="20"/>
+                <w:sz w:val="21"/>
               </w:rPr>
               <w:t>0.066 ± 0.021</w:t>
             </w:r>
@@ -7357,12 +7604,13 @@
         </w:tc>
         <w:tc>
           <w:tcPr>
-            <w:tcW w:type="dxa" w:w="1417"/>
+            <w:tcW w:type="dxa" w:w="1474"/>
+            <w:vAlign w:val="center"/>
             <w:tcMar>
-              <w:top w:w="60" w:type="dxa"/>
-              <w:left w:w="60" w:type="dxa"/>
-              <w:bottom w:w="60" w:type="dxa"/>
-              <w:right w:w="60" w:type="dxa"/>
+              <w:top w:w="100" w:type="dxa"/>
+              <w:left w:w="100" w:type="dxa"/>
+              <w:bottom w:w="100" w:type="dxa"/>
+              <w:right w:w="100" w:type="dxa"/>
             </w:tcMar>
             <w:vMerge w:val="restart"/>
             <w:tcBorders>
@@ -7372,16 +7620,16 @@
               <w:right w:val="nil" w:sz="0" w:space="0" w:color="auto"/>
             </w:tcBorders>
             <w:tcMar>
-              <w:top w:w="60" w:type="dxa"/>
-              <w:left w:w="60" w:type="dxa"/>
-              <w:bottom w:w="60" w:type="dxa"/>
-              <w:right w:w="60" w:type="dxa"/>
+              <w:top w:w="100" w:type="dxa"/>
+              <w:left w:w="100" w:type="dxa"/>
+              <w:bottom w:w="100" w:type="dxa"/>
+              <w:right w:w="100" w:type="dxa"/>
             </w:tcMar>
           </w:tcPr>
           <w:p>
             <w:pPr>
               <w:widowControl/>
-              <w:spacing w:before="40" w:after="40" w:line="240" w:lineRule="auto"/>
+              <w:spacing w:before="60" w:after="60" w:lineRule="auto" w:line="276"/>
               <w:ind w:firstLine="0"/>
               <w:jc w:val="center"/>
             </w:pPr>
@@ -7392,7 +7640,7 @@
                 <w:b w:val="0"/>
                 <w:i w:val="0"/>
                 <w:color w:val="000000"/>
-                <w:sz w:val="20"/>
+                <w:sz w:val="21"/>
               </w:rPr>
               <w:t>&lt; 0.001‡</w:t>
             </w:r>
@@ -7405,12 +7653,13 @@
         </w:trPr>
         <w:tc>
           <w:tcPr>
-            <w:tcW w:type="dxa" w:w="2268"/>
+            <w:tcW w:type="dxa" w:w="2381"/>
+            <w:vAlign w:val="center"/>
             <w:tcMar>
-              <w:top w:w="60" w:type="dxa"/>
-              <w:left w:w="60" w:type="dxa"/>
-              <w:bottom w:w="60" w:type="dxa"/>
-              <w:right w:w="60" w:type="dxa"/>
+              <w:top w:w="100" w:type="dxa"/>
+              <w:left w:w="100" w:type="dxa"/>
+              <w:bottom w:w="100" w:type="dxa"/>
+              <w:right w:w="100" w:type="dxa"/>
             </w:tcMar>
             <w:tcBorders>
               <w:top w:val="nil" w:sz="0" w:space="0" w:color="auto"/>
@@ -7422,7 +7671,7 @@
           <w:p>
             <w:pPr>
               <w:widowControl/>
-              <w:spacing w:before="40" w:after="40" w:line="240" w:lineRule="auto"/>
+              <w:spacing w:before="60" w:after="60" w:lineRule="auto" w:line="276"/>
               <w:ind w:firstLine="0"/>
               <w:jc w:val="left"/>
             </w:pPr>
@@ -7433,7 +7682,7 @@
                 <w:b w:val="0"/>
                 <w:i w:val="0"/>
                 <w:color w:val="000000"/>
-                <w:sz w:val="20"/>
+                <w:sz w:val="21"/>
               </w:rPr>
               <w:t>G-ænial Universal Injectable</w:t>
             </w:r>
@@ -7441,12 +7690,13 @@
         </w:tc>
         <w:tc>
           <w:tcPr>
-            <w:tcW w:type="dxa" w:w="1757"/>
+            <w:tcW w:type="dxa" w:w="1701"/>
+            <w:vAlign w:val="center"/>
             <w:tcMar>
-              <w:top w:w="60" w:type="dxa"/>
-              <w:left w:w="60" w:type="dxa"/>
-              <w:bottom w:w="60" w:type="dxa"/>
-              <w:right w:w="60" w:type="dxa"/>
+              <w:top w:w="100" w:type="dxa"/>
+              <w:left w:w="100" w:type="dxa"/>
+              <w:bottom w:w="100" w:type="dxa"/>
+              <w:right w:w="100" w:type="dxa"/>
             </w:tcMar>
             <w:tcBorders>
               <w:top w:val="nil" w:sz="0" w:space="0" w:color="auto"/>
@@ -7458,7 +7708,7 @@
           <w:p>
             <w:pPr>
               <w:widowControl/>
-              <w:spacing w:before="40" w:after="40" w:line="240" w:lineRule="auto"/>
+              <w:spacing w:before="60" w:after="60" w:lineRule="auto" w:line="276"/>
               <w:ind w:firstLine="0"/>
               <w:jc w:val="center"/>
             </w:pPr>
@@ -7469,7 +7719,7 @@
                 <w:b w:val="0"/>
                 <w:i w:val="0"/>
                 <w:color w:val="000000"/>
-                <w:sz w:val="20"/>
+                <w:sz w:val="21"/>
               </w:rPr>
               <w:t>0.054 ± 0.010</w:t>
             </w:r>
@@ -7477,12 +7727,13 @@
         </w:tc>
         <w:tc>
           <w:tcPr>
-            <w:tcW w:type="dxa" w:w="1757"/>
+            <w:tcW w:type="dxa" w:w="1701"/>
+            <w:vAlign w:val="center"/>
             <w:tcMar>
-              <w:top w:w="60" w:type="dxa"/>
-              <w:left w:w="60" w:type="dxa"/>
-              <w:bottom w:w="60" w:type="dxa"/>
-              <w:right w:w="60" w:type="dxa"/>
+              <w:top w:w="100" w:type="dxa"/>
+              <w:left w:w="100" w:type="dxa"/>
+              <w:bottom w:w="100" w:type="dxa"/>
+              <w:right w:w="100" w:type="dxa"/>
             </w:tcMar>
             <w:tcBorders>
               <w:top w:val="nil" w:sz="0" w:space="0" w:color="auto"/>
@@ -7494,7 +7745,7 @@
           <w:p>
             <w:pPr>
               <w:widowControl/>
-              <w:spacing w:before="40" w:after="40" w:line="240" w:lineRule="auto"/>
+              <w:spacing w:before="60" w:after="60" w:lineRule="auto" w:line="276"/>
               <w:ind w:firstLine="0"/>
               <w:jc w:val="center"/>
             </w:pPr>
@@ -7505,7 +7756,7 @@
                 <w:b w:val="0"/>
                 <w:i w:val="0"/>
                 <w:color w:val="000000"/>
-                <w:sz w:val="20"/>
+                <w:sz w:val="21"/>
               </w:rPr>
               <w:t>0.100 ± 0.023</w:t>
             </w:r>
@@ -7513,12 +7764,13 @@
         </w:tc>
         <w:tc>
           <w:tcPr>
-            <w:tcW w:type="dxa" w:w="1757"/>
+            <w:tcW w:type="dxa" w:w="1701"/>
+            <w:vAlign w:val="center"/>
             <w:tcMar>
-              <w:top w:w="60" w:type="dxa"/>
-              <w:left w:w="60" w:type="dxa"/>
-              <w:bottom w:w="60" w:type="dxa"/>
-              <w:right w:w="60" w:type="dxa"/>
+              <w:top w:w="100" w:type="dxa"/>
+              <w:left w:w="100" w:type="dxa"/>
+              <w:bottom w:w="100" w:type="dxa"/>
+              <w:right w:w="100" w:type="dxa"/>
             </w:tcMar>
             <w:tcBorders>
               <w:top w:val="nil" w:sz="0" w:space="0" w:color="auto"/>
@@ -7530,7 +7782,7 @@
           <w:p>
             <w:pPr>
               <w:widowControl/>
-              <w:spacing w:before="40" w:after="40" w:line="240" w:lineRule="auto"/>
+              <w:spacing w:before="60" w:after="60" w:lineRule="auto" w:line="276"/>
               <w:ind w:firstLine="0"/>
               <w:jc w:val="center"/>
             </w:pPr>
@@ -7541,7 +7793,7 @@
                 <w:b w:val="0"/>
                 <w:i w:val="0"/>
                 <w:color w:val="000000"/>
-                <w:sz w:val="20"/>
+                <w:sz w:val="21"/>
               </w:rPr>
               <w:t>0.046 ± 0.023</w:t>
             </w:r>
@@ -7549,12 +7801,13 @@
         </w:tc>
         <w:tc>
           <w:tcPr>
-            <w:tcW w:type="dxa" w:w="1417"/>
+            <w:tcW w:type="dxa" w:w="1474"/>
+            <w:vAlign w:val="center"/>
             <w:tcMar>
-              <w:top w:w="60" w:type="dxa"/>
-              <w:left w:w="60" w:type="dxa"/>
-              <w:bottom w:w="60" w:type="dxa"/>
-              <w:right w:w="60" w:type="dxa"/>
+              <w:top w:w="100" w:type="dxa"/>
+              <w:left w:w="100" w:type="dxa"/>
+              <w:bottom w:w="100" w:type="dxa"/>
+              <w:right w:w="100" w:type="dxa"/>
             </w:tcMar>
             <w:vMerge/>
             <w:tcBorders>
@@ -7573,12 +7826,13 @@
         </w:trPr>
         <w:tc>
           <w:tcPr>
-            <w:tcW w:type="dxa" w:w="2268"/>
+            <w:tcW w:type="dxa" w:w="2381"/>
+            <w:vAlign w:val="center"/>
             <w:tcMar>
-              <w:top w:w="60" w:type="dxa"/>
-              <w:left w:w="60" w:type="dxa"/>
-              <w:bottom w:w="60" w:type="dxa"/>
-              <w:right w:w="60" w:type="dxa"/>
+              <w:top w:w="100" w:type="dxa"/>
+              <w:left w:w="100" w:type="dxa"/>
+              <w:bottom w:w="100" w:type="dxa"/>
+              <w:right w:w="100" w:type="dxa"/>
             </w:tcMar>
             <w:tcBorders>
               <w:top w:val="nil" w:sz="0" w:space="0" w:color="auto"/>
@@ -7590,7 +7844,7 @@
           <w:p>
             <w:pPr>
               <w:widowControl/>
-              <w:spacing w:before="40" w:after="40" w:line="240" w:lineRule="auto"/>
+              <w:spacing w:before="60" w:after="60" w:lineRule="auto" w:line="276"/>
               <w:ind w:firstLine="0"/>
               <w:jc w:val="left"/>
             </w:pPr>
@@ -7601,7 +7855,7 @@
                 <w:b w:val="0"/>
                 <w:i w:val="0"/>
                 <w:color w:val="000000"/>
-                <w:sz w:val="20"/>
+                <w:sz w:val="21"/>
               </w:rPr>
               <w:t>Beautifil II LS</w:t>
             </w:r>
@@ -7609,12 +7863,13 @@
         </w:tc>
         <w:tc>
           <w:tcPr>
-            <w:tcW w:type="dxa" w:w="1757"/>
+            <w:tcW w:type="dxa" w:w="1701"/>
+            <w:vAlign w:val="center"/>
             <w:tcMar>
-              <w:top w:w="60" w:type="dxa"/>
-              <w:left w:w="60" w:type="dxa"/>
-              <w:bottom w:w="60" w:type="dxa"/>
-              <w:right w:w="60" w:type="dxa"/>
+              <w:top w:w="100" w:type="dxa"/>
+              <w:left w:w="100" w:type="dxa"/>
+              <w:bottom w:w="100" w:type="dxa"/>
+              <w:right w:w="100" w:type="dxa"/>
             </w:tcMar>
             <w:tcBorders>
               <w:top w:val="nil" w:sz="0" w:space="0" w:color="auto"/>
@@ -7626,7 +7881,7 @@
           <w:p>
             <w:pPr>
               <w:widowControl/>
-              <w:spacing w:before="40" w:after="40" w:line="240" w:lineRule="auto"/>
+              <w:spacing w:before="60" w:after="60" w:lineRule="auto" w:line="276"/>
               <w:ind w:firstLine="0"/>
               <w:jc w:val="center"/>
             </w:pPr>
@@ -7637,7 +7892,7 @@
                 <w:b w:val="0"/>
                 <w:i w:val="0"/>
                 <w:color w:val="000000"/>
-                <w:sz w:val="20"/>
+                <w:sz w:val="21"/>
               </w:rPr>
               <w:t>0.119 ± 0.054</w:t>
             </w:r>
@@ -7645,12 +7900,13 @@
         </w:tc>
         <w:tc>
           <w:tcPr>
-            <w:tcW w:type="dxa" w:w="1757"/>
+            <w:tcW w:type="dxa" w:w="1701"/>
+            <w:vAlign w:val="center"/>
             <w:tcMar>
-              <w:top w:w="60" w:type="dxa"/>
-              <w:left w:w="60" w:type="dxa"/>
-              <w:bottom w:w="60" w:type="dxa"/>
-              <w:right w:w="60" w:type="dxa"/>
+              <w:top w:w="100" w:type="dxa"/>
+              <w:left w:w="100" w:type="dxa"/>
+              <w:bottom w:w="100" w:type="dxa"/>
+              <w:right w:w="100" w:type="dxa"/>
             </w:tcMar>
             <w:tcBorders>
               <w:top w:val="nil" w:sz="0" w:space="0" w:color="auto"/>
@@ -7662,7 +7918,7 @@
           <w:p>
             <w:pPr>
               <w:widowControl/>
-              <w:spacing w:before="40" w:after="40" w:line="240" w:lineRule="auto"/>
+              <w:spacing w:before="60" w:after="60" w:lineRule="auto" w:line="276"/>
               <w:ind w:firstLine="0"/>
               <w:jc w:val="center"/>
             </w:pPr>
@@ -7673,7 +7929,7 @@
                 <w:b w:val="0"/>
                 <w:i w:val="0"/>
                 <w:color w:val="000000"/>
-                <w:sz w:val="20"/>
+                <w:sz w:val="21"/>
               </w:rPr>
               <w:t>0.194 ± 0.050</w:t>
             </w:r>
@@ -7681,12 +7937,13 @@
         </w:tc>
         <w:tc>
           <w:tcPr>
-            <w:tcW w:type="dxa" w:w="1757"/>
+            <w:tcW w:type="dxa" w:w="1701"/>
+            <w:vAlign w:val="center"/>
             <w:tcMar>
-              <w:top w:w="60" w:type="dxa"/>
-              <w:left w:w="60" w:type="dxa"/>
-              <w:bottom w:w="60" w:type="dxa"/>
-              <w:right w:w="60" w:type="dxa"/>
+              <w:top w:w="100" w:type="dxa"/>
+              <w:left w:w="100" w:type="dxa"/>
+              <w:bottom w:w="100" w:type="dxa"/>
+              <w:right w:w="100" w:type="dxa"/>
             </w:tcMar>
             <w:tcBorders>
               <w:top w:val="nil" w:sz="0" w:space="0" w:color="auto"/>
@@ -7698,7 +7955,7 @@
           <w:p>
             <w:pPr>
               <w:widowControl/>
-              <w:spacing w:before="40" w:after="40" w:line="240" w:lineRule="auto"/>
+              <w:spacing w:before="60" w:after="60" w:lineRule="auto" w:line="276"/>
               <w:ind w:firstLine="0"/>
               <w:jc w:val="center"/>
             </w:pPr>
@@ -7709,7 +7966,7 @@
                 <w:b w:val="0"/>
                 <w:i w:val="0"/>
                 <w:color w:val="000000"/>
-                <w:sz w:val="20"/>
+                <w:sz w:val="21"/>
               </w:rPr>
               <w:t>0.075 ± 0.066</w:t>
             </w:r>
@@ -7717,12 +7974,13 @@
         </w:tc>
         <w:tc>
           <w:tcPr>
-            <w:tcW w:type="dxa" w:w="1417"/>
+            <w:tcW w:type="dxa" w:w="1474"/>
+            <w:vAlign w:val="center"/>
             <w:tcMar>
-              <w:top w:w="60" w:type="dxa"/>
-              <w:left w:w="60" w:type="dxa"/>
-              <w:bottom w:w="60" w:type="dxa"/>
-              <w:right w:w="60" w:type="dxa"/>
+              <w:top w:w="100" w:type="dxa"/>
+              <w:left w:w="100" w:type="dxa"/>
+              <w:bottom w:w="100" w:type="dxa"/>
+              <w:right w:w="100" w:type="dxa"/>
             </w:tcMar>
             <w:vMerge/>
             <w:tcBorders>
@@ -7739,7 +7997,7 @@
     <w:p>
       <w:pPr>
         <w:widowControl/>
-        <w:spacing w:before="0" w:after="160" w:line="240" w:lineRule="auto"/>
+        <w:spacing w:before="0" w:after="240" w:line="240" w:lineRule="auto"/>
         <w:ind w:firstLine="0"/>
         <w:jc w:val="both"/>
       </w:pPr>
@@ -7747,7 +8005,7 @@
     <w:p>
       <w:pPr>
         <w:widowControl/>
-        <w:spacing w:before="40" w:after="120" w:line="240" w:lineRule="auto"/>
+        <w:spacing w:before="80" w:after="200" w:lineRule="auto" w:line="276"/>
         <w:ind w:firstLine="0"/>
         <w:jc w:val="both"/>
       </w:pPr>
@@ -7765,14 +8023,14 @@
     <w:p>
       <w:pPr>
         <w:widowControl/>
-        <w:spacing w:before="160" w:after="120" w:line="240" w:lineRule="auto"/>
+        <w:spacing w:before="200" w:after="160" w:line="240" w:lineRule="auto"/>
         <w:ind w:firstLine="0"/>
         <w:jc w:val="center"/>
       </w:pPr>
       <w:r>
         <w:drawing>
           <wp:inline xmlns:a="http://schemas.openxmlformats.org/drawingml/2006/main" xmlns:pic="http://schemas.openxmlformats.org/drawingml/2006/picture">
-            <wp:extent cx="5120640" cy="3224199"/>
+            <wp:extent cx="4937760" cy="3109049"/>
             <wp:docPr id="2" name="Picture 2"/>
             <wp:cNvGraphicFramePr>
               <a:graphicFrameLocks noChangeAspect="1"/>
@@ -7793,7 +8051,7 @@
                   <pic:spPr>
                     <a:xfrm>
                       <a:off x="0" y="0"/>
-                      <a:ext cx="5120640" cy="3224199"/>
+                      <a:ext cx="4937760" cy="3109049"/>
                     </a:xfrm>
                     <a:prstGeom prst="rect"/>
                   </pic:spPr>
@@ -7808,7 +8066,7 @@
       <w:pPr>
         <w:keepNext/>
         <w:widowControl/>
-        <w:spacing w:before="200" w:after="120" w:lineRule="auto" w:line="276"/>
+        <w:spacing w:before="280" w:after="160" w:lineRule="auto" w:line="276"/>
         <w:ind w:firstLine="0"/>
         <w:jc w:val="left"/>
       </w:pPr>
@@ -7872,14 +8130,14 @@
     <w:p>
       <w:pPr>
         <w:widowControl/>
-        <w:spacing w:before="160" w:after="120" w:line="240" w:lineRule="auto"/>
+        <w:spacing w:before="200" w:after="160" w:line="240" w:lineRule="auto"/>
         <w:ind w:firstLine="0"/>
         <w:jc w:val="center"/>
       </w:pPr>
       <w:r>
         <w:drawing>
           <wp:inline xmlns:a="http://schemas.openxmlformats.org/drawingml/2006/main" xmlns:pic="http://schemas.openxmlformats.org/drawingml/2006/picture">
-            <wp:extent cx="5120640" cy="3382542"/>
+            <wp:extent cx="4937760" cy="3261737"/>
             <wp:docPr id="3" name="Picture 3"/>
             <wp:cNvGraphicFramePr>
               <a:graphicFrameLocks noChangeAspect="1"/>
@@ -7900,7 +8158,7 @@
                   <pic:spPr>
                     <a:xfrm>
                       <a:off x="0" y="0"/>
-                      <a:ext cx="5120640" cy="3382542"/>
+                      <a:ext cx="4937760" cy="3261737"/>
                     </a:xfrm>
                     <a:prstGeom prst="rect"/>
                   </pic:spPr>
@@ -7915,7 +8173,7 @@
       <w:pPr>
         <w:keepNext/>
         <w:widowControl/>
-        <w:spacing w:before="200" w:after="120" w:lineRule="auto" w:line="276"/>
+        <w:spacing w:before="280" w:after="160" w:lineRule="auto" w:line="276"/>
         <w:ind w:firstLine="0"/>
         <w:jc w:val="left"/>
       </w:pPr>
@@ -8023,7 +8281,7 @@
         <w:pStyle w:val="Heading2"/>
         <w:keepNext/>
         <w:widowControl/>
-        <w:spacing w:before="240" w:after="120" w:line="240" w:lineRule="auto"/>
+        <w:spacing w:before="320" w:after="160" w:line="240" w:lineRule="auto"/>
         <w:ind w:firstLine="0"/>
         <w:jc w:val="left"/>
       </w:pPr>
@@ -8062,7 +8320,7 @@
         <w:keepNext/>
         <w:pageBreakBefore/>
         <w:widowControl/>
-        <w:spacing w:before="0" w:after="240" w:line="240" w:lineRule="auto"/>
+        <w:spacing w:before="0" w:after="120" w:line="240" w:lineRule="auto"/>
         <w:ind w:firstLine="0"/>
         <w:jc w:val="center"/>
       </w:pPr>
@@ -8082,7 +8340,7 @@
         <w:pStyle w:val="Heading1"/>
         <w:keepNext/>
         <w:widowControl/>
-        <w:spacing w:before="0" w:after="240" w:line="240" w:lineRule="auto"/>
+        <w:spacing w:before="0" w:after="320" w:line="240" w:lineRule="auto"/>
         <w:ind w:firstLine="0"/>
         <w:jc w:val="center"/>
       </w:pPr>
@@ -8120,7 +8378,7 @@
         <w:pStyle w:val="Heading2"/>
         <w:keepNext/>
         <w:widowControl/>
-        <w:spacing w:before="240" w:after="120" w:line="240" w:lineRule="auto"/>
+        <w:spacing w:before="320" w:after="160" w:line="240" w:lineRule="auto"/>
         <w:ind w:firstLine="0"/>
         <w:jc w:val="left"/>
       </w:pPr>
@@ -8254,7 +8512,7 @@
         <w:pStyle w:val="Heading2"/>
         <w:keepNext/>
         <w:widowControl/>
-        <w:spacing w:before="240" w:after="120" w:line="240" w:lineRule="auto"/>
+        <w:spacing w:before="320" w:after="160" w:line="240" w:lineRule="auto"/>
         <w:ind w:firstLine="0"/>
         <w:jc w:val="left"/>
       </w:pPr>
@@ -8493,7 +8751,7 @@
         <w:pStyle w:val="Heading2"/>
         <w:keepNext/>
         <w:widowControl/>
-        <w:spacing w:before="240" w:after="120" w:line="240" w:lineRule="auto"/>
+        <w:spacing w:before="320" w:after="160" w:line="240" w:lineRule="auto"/>
         <w:ind w:firstLine="0"/>
         <w:jc w:val="left"/>
       </w:pPr>
@@ -8630,7 +8888,7 @@
         <w:pStyle w:val="Heading2"/>
         <w:keepNext/>
         <w:widowControl/>
-        <w:spacing w:before="240" w:after="120" w:line="240" w:lineRule="auto"/>
+        <w:spacing w:before="320" w:after="160" w:line="240" w:lineRule="auto"/>
         <w:ind w:firstLine="0"/>
         <w:jc w:val="left"/>
       </w:pPr>
@@ -8710,7 +8968,7 @@
         <w:pStyle w:val="Heading2"/>
         <w:keepNext/>
         <w:widowControl/>
-        <w:spacing w:before="240" w:after="120" w:line="240" w:lineRule="auto"/>
+        <w:spacing w:before="320" w:after="160" w:line="240" w:lineRule="auto"/>
         <w:ind w:firstLine="0"/>
         <w:jc w:val="left"/>
       </w:pPr>
@@ -8811,7 +9069,7 @@
         <w:pStyle w:val="Heading2"/>
         <w:keepNext/>
         <w:widowControl/>
-        <w:spacing w:before="240" w:after="120" w:line="240" w:lineRule="auto"/>
+        <w:spacing w:before="320" w:after="160" w:line="240" w:lineRule="auto"/>
         <w:ind w:firstLine="0"/>
         <w:jc w:val="left"/>
       </w:pPr>
@@ -8850,7 +9108,7 @@
         <w:keepNext/>
         <w:pageBreakBefore/>
         <w:widowControl/>
-        <w:spacing w:before="0" w:after="240" w:line="240" w:lineRule="auto"/>
+        <w:spacing w:before="0" w:after="120" w:line="240" w:lineRule="auto"/>
         <w:ind w:firstLine="0"/>
         <w:jc w:val="center"/>
       </w:pPr>
@@ -8870,7 +9128,7 @@
         <w:pStyle w:val="Heading1"/>
         <w:keepNext/>
         <w:widowControl/>
-        <w:spacing w:before="0" w:after="240" w:line="240" w:lineRule="auto"/>
+        <w:spacing w:before="0" w:after="320" w:line="240" w:lineRule="auto"/>
         <w:ind w:firstLine="0"/>
         <w:jc w:val="center"/>
       </w:pPr>
@@ -8890,7 +9148,7 @@
         <w:pStyle w:val="Heading2"/>
         <w:keepNext/>
         <w:widowControl/>
-        <w:spacing w:before="240" w:after="120" w:line="240" w:lineRule="auto"/>
+        <w:spacing w:before="320" w:after="160" w:line="240" w:lineRule="auto"/>
         <w:ind w:firstLine="0"/>
         <w:jc w:val="left"/>
       </w:pPr>
@@ -9036,7 +9294,7 @@
         <w:pStyle w:val="Heading2"/>
         <w:keepNext/>
         <w:widowControl/>
-        <w:spacing w:before="240" w:after="120" w:line="240" w:lineRule="auto"/>
+        <w:spacing w:before="320" w:after="160" w:line="240" w:lineRule="auto"/>
         <w:ind w:firstLine="0"/>
         <w:jc w:val="left"/>
       </w:pPr>
@@ -9141,7 +9399,7 @@
         <w:keepNext/>
         <w:pageBreakBefore/>
         <w:widowControl/>
-        <w:spacing w:before="0" w:after="240" w:line="240" w:lineRule="auto"/>
+        <w:spacing w:before="0" w:after="120" w:line="240" w:lineRule="auto"/>
         <w:ind w:firstLine="0"/>
         <w:jc w:val="center"/>
       </w:pPr>
@@ -9161,7 +9419,7 @@
         <w:pStyle w:val="Heading1"/>
         <w:keepNext/>
         <w:widowControl/>
-        <w:spacing w:before="0" w:after="240" w:line="240" w:lineRule="auto"/>
+        <w:spacing w:before="0" w:after="320" w:line="240" w:lineRule="auto"/>
         <w:ind w:firstLine="0"/>
         <w:jc w:val="center"/>
       </w:pPr>
@@ -10104,7 +10362,7 @@
       <w:headerReference w:type="default" r:id="rId11"/>
       <w:footerReference w:type="default" r:id="rId12"/>
       <w:pgSz w:w="11906" w:h="16838"/>
-      <w:pgMar w:top="1814" w:right="1247" w:bottom="1701" w:left="1701" w:header="340" w:footer="283" w:gutter="0"/>
+      <w:pgMar w:top="1446" w:right="1247" w:bottom="1304" w:left="1701" w:header="170" w:footer="159" w:gutter="0"/>
       <w:cols w:space="720"/>
       <w:docGrid w:linePitch="360"/>
     </w:sectPr>
@@ -10117,7 +10375,7 @@
   <w:p>
     <w:pPr>
       <w:pStyle w:val="Footer"/>
-      <w:spacing w:before="40" w:after="0" w:line="240" w:lineRule="auto"/>
+      <w:spacing w:before="0" w:after="0" w:line="240" w:lineRule="auto"/>
       <w:ind w:firstLine="0"/>
       <w:jc w:val="center"/>
       <w:pBdr>
@@ -10171,7 +10429,7 @@
   </w:p>
   <w:p>
     <w:pPr>
-      <w:spacing w:before="40" w:after="0" w:line="240" w:lineRule="auto"/>
+      <w:spacing w:before="60" w:after="0" w:line="240" w:lineRule="auto"/>
       <w:ind w:firstLine="0"/>
       <w:jc w:val="center"/>
     </w:pPr>
@@ -10196,7 +10454,7 @@
   <w:p>
     <w:pPr>
       <w:pStyle w:val="Footer"/>
-      <w:spacing w:before="40" w:after="0" w:line="240" w:lineRule="auto"/>
+      <w:spacing w:before="0" w:after="0" w:line="240" w:lineRule="auto"/>
       <w:ind w:firstLine="0"/>
       <w:jc w:val="center"/>
       <w:pBdr>
@@ -10250,7 +10508,7 @@
   </w:p>
   <w:p>
     <w:pPr>
-      <w:spacing w:before="40" w:after="0" w:line="240" w:lineRule="auto"/>
+      <w:spacing w:before="60" w:after="0" w:line="240" w:lineRule="auto"/>
       <w:ind w:firstLine="0"/>
       <w:jc w:val="center"/>
     </w:pPr>
@@ -10275,17 +10533,14 @@
   <w:p>
     <w:pPr>
       <w:pStyle w:val="Header"/>
-      <w:spacing w:before="0" w:after="40" w:line="240" w:lineRule="auto"/>
+      <w:spacing w:before="0" w:after="0" w:line="240" w:lineRule="auto"/>
       <w:ind w:firstLine="0"/>
       <w:jc w:val="center"/>
-      <w:pBdr>
-        <w:bottom w:val="single" w:sz="12" w:space="4" w:color="000000"/>
-      </w:pBdr>
     </w:pPr>
     <w:r>
       <w:drawing>
         <wp:inline xmlns:a="http://schemas.openxmlformats.org/drawingml/2006/main" xmlns:pic="http://schemas.openxmlformats.org/drawingml/2006/picture">
-          <wp:extent cx="5472000" cy="729600"/>
+          <wp:extent cx="4968000" cy="662400"/>
           <wp:docPr id="1" name="Picture 1"/>
           <wp:cNvGraphicFramePr>
             <a:graphicFrameLocks noChangeAspect="1"/>
@@ -10306,7 +10561,7 @@
                 <pic:spPr>
                   <a:xfrm>
                     <a:off x="0" y="0"/>
-                    <a:ext cx="5472000" cy="729600"/>
+                    <a:ext cx="4968000" cy="662400"/>
                   </a:xfrm>
                   <a:prstGeom prst="rect"/>
                 </pic:spPr>
@@ -10325,17 +10580,14 @@
   <w:p>
     <w:pPr>
       <w:pStyle w:val="Header"/>
-      <w:spacing w:before="0" w:after="40" w:line="240" w:lineRule="auto"/>
+      <w:spacing w:before="0" w:after="0" w:line="240" w:lineRule="auto"/>
       <w:ind w:firstLine="0"/>
       <w:jc w:val="center"/>
-      <w:pBdr>
-        <w:bottom w:val="single" w:sz="12" w:space="4" w:color="000000"/>
-      </w:pBdr>
     </w:pPr>
     <w:r>
       <w:drawing>
         <wp:inline xmlns:a="http://schemas.openxmlformats.org/drawingml/2006/main" xmlns:pic="http://schemas.openxmlformats.org/drawingml/2006/picture">
-          <wp:extent cx="5472000" cy="729600"/>
+          <wp:extent cx="4968000" cy="662400"/>
           <wp:docPr id="1" name="Picture 1"/>
           <wp:cNvGraphicFramePr>
             <a:graphicFrameLocks noChangeAspect="1"/>
@@ -10356,7 +10608,7 @@
                 <pic:spPr>
                   <a:xfrm>
                     <a:off x="0" y="0"/>
-                    <a:ext cx="5472000" cy="729600"/>
+                    <a:ext cx="4968000" cy="662400"/>
                   </a:xfrm>
                   <a:prstGeom prst="rect"/>
                 </pic:spPr>
@@ -10800,7 +11052,7 @@
     <w:pPr>
       <w:keepNext/>
       <w:keepLines/>
-      <w:spacing w:before="0" w:after="240" w:line="240" w:lineRule="auto"/>
+      <w:spacing w:before="0" w:after="280" w:line="240" w:lineRule="auto"/>
       <w:ind w:firstLine="0"/>
       <w:jc w:val="center"/>
       <w:outlineLvl w:val="0"/>
@@ -10813,6 +11065,7 @@
       <w:color w:val="000000"/>
       <w:sz w:val="32"/>
       <w:szCs w:val="28"/>
+      <w:u w:val="none"/>
     </w:rPr>
   </w:style>
   <w:style w:type="paragraph" w:styleId="Heading2">
@@ -10827,7 +11080,7 @@
     <w:pPr>
       <w:keepNext/>
       <w:keepLines/>
-      <w:spacing w:before="240" w:after="120" w:line="240" w:lineRule="auto"/>
+      <w:spacing w:before="320" w:after="160" w:line="240" w:lineRule="auto"/>
       <w:ind w:firstLine="0"/>
       <w:jc w:val="left"/>
       <w:outlineLvl w:val="1"/>
@@ -10840,6 +11093,7 @@
       <w:color w:val="000000"/>
       <w:sz w:val="26"/>
       <w:szCs w:val="26"/>
+      <w:u w:val="none"/>
     </w:rPr>
   </w:style>
   <w:style w:type="paragraph" w:styleId="Heading3">

</xml_diff>

<commit_message>
Open out the complete thesis so Word and PDF are not cramped
Keep the full thesis (cover through Chapter 7) with the protocol cover, header and footer on every page, and more space between cover blocks so the finalized files are not bunched.

Co-authored-by: Ahmed El Gamry <ahmed733676-droid@users.noreply.github.com>
</commit_message>
<xml_diff>
--- a/Thesis_Complete.docx
+++ b/Thesis_Complete.docx
@@ -5,7 +5,7 @@
     <w:p>
       <w:pPr>
         <w:widowControl/>
-        <w:spacing w:before="0" w:after="0" w:lineRule="auto" w:line="276"/>
+        <w:spacing w:before="0" w:after="0" w:lineRule="auto" w:line="312"/>
         <w:ind w:firstLine="0"/>
         <w:jc w:val="left"/>
       </w:pPr>
@@ -24,7 +24,7 @@
     <w:p>
       <w:pPr>
         <w:widowControl/>
-        <w:spacing w:before="0" w:after="0" w:lineRule="auto" w:line="276"/>
+        <w:spacing w:before="0" w:after="0" w:lineRule="auto" w:line="312"/>
         <w:ind w:firstLine="0"/>
         <w:jc w:val="left"/>
       </w:pPr>
@@ -43,7 +43,7 @@
     <w:p>
       <w:pPr>
         <w:widowControl/>
-        <w:spacing w:before="0" w:after="0" w:lineRule="auto" w:line="276"/>
+        <w:spacing w:before="0" w:after="0" w:lineRule="auto" w:line="312"/>
         <w:ind w:firstLine="0"/>
         <w:jc w:val="left"/>
       </w:pPr>
@@ -62,7 +62,7 @@
     <w:p>
       <w:pPr>
         <w:widowControl/>
-        <w:spacing w:before="0" w:after="280" w:lineRule="auto" w:line="276"/>
+        <w:spacing w:before="0" w:after="400" w:lineRule="auto" w:line="312"/>
         <w:ind w:firstLine="0"/>
         <w:jc w:val="left"/>
       </w:pPr>
@@ -81,7 +81,7 @@
     <w:p>
       <w:pPr>
         <w:widowControl/>
-        <w:spacing w:before="160" w:after="0" w:lineRule="auto" w:line="276"/>
+        <w:spacing w:before="200" w:after="0" w:lineRule="auto" w:line="312"/>
         <w:ind w:firstLine="0"/>
         <w:jc w:val="center"/>
       </w:pPr>
@@ -100,7 +100,7 @@
     <w:p>
       <w:pPr>
         <w:widowControl/>
-        <w:spacing w:before="0" w:after="0" w:lineRule="auto" w:line="276"/>
+        <w:spacing w:before="0" w:after="0" w:lineRule="auto" w:line="312"/>
         <w:ind w:firstLine="0"/>
         <w:jc w:val="center"/>
       </w:pPr>
@@ -119,7 +119,7 @@
     <w:p>
       <w:pPr>
         <w:widowControl/>
-        <w:spacing w:before="0" w:after="0" w:lineRule="auto" w:line="276"/>
+        <w:spacing w:before="0" w:after="0" w:lineRule="auto" w:line="312"/>
         <w:ind w:firstLine="0"/>
         <w:jc w:val="center"/>
       </w:pPr>
@@ -138,7 +138,7 @@
     <w:p>
       <w:pPr>
         <w:widowControl/>
-        <w:spacing w:before="0" w:after="280" w:lineRule="auto" w:line="276"/>
+        <w:spacing w:before="0" w:after="400" w:lineRule="auto" w:line="312"/>
         <w:ind w:firstLine="0"/>
         <w:jc w:val="center"/>
       </w:pPr>
@@ -157,7 +157,7 @@
     <w:p>
       <w:pPr>
         <w:widowControl/>
-        <w:spacing w:before="120" w:after="0" w:lineRule="auto" w:line="276"/>
+        <w:spacing w:before="160" w:after="0" w:lineRule="auto" w:line="312"/>
         <w:ind w:firstLine="0"/>
         <w:jc w:val="center"/>
       </w:pPr>
@@ -176,7 +176,7 @@
     <w:p>
       <w:pPr>
         <w:widowControl/>
-        <w:spacing w:before="0" w:after="280" w:lineRule="auto" w:line="276"/>
+        <w:spacing w:before="0" w:after="400" w:lineRule="auto" w:line="312"/>
         <w:ind w:firstLine="0"/>
         <w:jc w:val="center"/>
       </w:pPr>
@@ -195,7 +195,7 @@
     <w:p>
       <w:pPr>
         <w:widowControl/>
-        <w:spacing w:before="80" w:after="0" w:lineRule="auto" w:line="276"/>
+        <w:spacing w:before="120" w:after="0" w:lineRule="auto" w:line="312"/>
         <w:ind w:firstLine="0"/>
         <w:jc w:val="left"/>
       </w:pPr>
@@ -214,7 +214,7 @@
     <w:p>
       <w:pPr>
         <w:widowControl/>
-        <w:spacing w:before="80" w:after="0" w:lineRule="auto" w:line="276"/>
+        <w:spacing w:before="120" w:after="0" w:lineRule="auto" w:line="312"/>
         <w:ind w:firstLine="0"/>
         <w:jc w:val="center"/>
       </w:pPr>
@@ -233,7 +233,7 @@
     <w:p>
       <w:pPr>
         <w:widowControl/>
-        <w:spacing w:before="0" w:after="0" w:lineRule="auto" w:line="276"/>
+        <w:spacing w:before="0" w:after="0" w:lineRule="auto" w:line="312"/>
         <w:ind w:firstLine="0"/>
         <w:jc w:val="center"/>
       </w:pPr>
@@ -252,7 +252,7 @@
     <w:p>
       <w:pPr>
         <w:widowControl/>
-        <w:spacing w:before="0" w:after="240" w:lineRule="auto" w:line="276"/>
+        <w:spacing w:before="0" w:after="320" w:lineRule="auto" w:line="312"/>
         <w:ind w:firstLine="0"/>
         <w:jc w:val="center"/>
       </w:pPr>
@@ -271,7 +271,7 @@
     <w:p>
       <w:pPr>
         <w:widowControl/>
-        <w:spacing w:before="80" w:after="0" w:lineRule="auto" w:line="276"/>
+        <w:spacing w:before="120" w:after="0" w:lineRule="auto" w:line="312"/>
         <w:ind w:firstLine="0"/>
         <w:jc w:val="left"/>
       </w:pPr>
@@ -290,7 +290,7 @@
     <w:p>
       <w:pPr>
         <w:widowControl/>
-        <w:spacing w:before="80" w:after="240" w:lineRule="auto" w:line="276"/>
+        <w:spacing w:before="120" w:after="320" w:lineRule="auto" w:line="312"/>
         <w:ind w:firstLine="0"/>
         <w:jc w:val="center"/>
       </w:pPr>
@@ -309,7 +309,7 @@
     <w:p>
       <w:pPr>
         <w:widowControl/>
-        <w:spacing w:before="0" w:after="280" w:lineRule="auto" w:line="276"/>
+        <w:spacing w:before="0" w:after="400" w:lineRule="auto" w:line="312"/>
         <w:ind w:firstLine="0"/>
         <w:jc w:val="left"/>
       </w:pPr>
@@ -339,7 +339,7 @@
     <w:p>
       <w:pPr>
         <w:widowControl/>
-        <w:spacing w:before="120" w:after="160" w:lineRule="auto" w:line="276"/>
+        <w:spacing w:before="160" w:after="200" w:lineRule="auto" w:line="312"/>
         <w:ind w:firstLine="0"/>
         <w:jc w:val="center"/>
       </w:pPr>
@@ -358,7 +358,7 @@
     <w:p>
       <w:pPr>
         <w:widowControl/>
-        <w:spacing w:before="0" w:after="80" w:lineRule="auto" w:line="276"/>
+        <w:spacing w:before="0" w:after="160" w:lineRule="auto" w:line="312"/>
         <w:ind w:firstLine="0"/>
         <w:jc w:val="center"/>
       </w:pPr>
@@ -377,7 +377,7 @@
     <w:p>
       <w:pPr>
         <w:widowControl/>
-        <w:spacing w:before="0" w:after="0" w:lineRule="auto" w:line="276"/>
+        <w:spacing w:before="0" w:after="0" w:lineRule="auto" w:line="312"/>
         <w:ind w:firstLine="0"/>
         <w:jc w:val="center"/>
       </w:pPr>
@@ -399,7 +399,7 @@
           <w:headerReference w:type="default" r:id="rId9"/>
           <w:footerReference w:type="default" r:id="rId10"/>
           <w:pgSz w:w="11906" w:h="16838"/>
-          <w:pgMar w:top="1587" w:right="1247" w:bottom="1446" w:left="1701" w:header="170" w:footer="159" w:gutter="0"/>
+          <w:pgMar w:top="1644" w:right="1247" w:bottom="1502" w:left="1701" w:header="198" w:footer="181" w:gutter="0"/>
           <w:cols w:space="720"/>
           <w:docGrid w:linePitch="360"/>
         </w:sectPr>
@@ -429,7 +429,7 @@
     <w:p>
       <w:pPr>
         <w:widowControl/>
-        <w:spacing w:before="200" w:after="120" w:lineRule="auto" w:line="276"/>
+        <w:spacing w:before="240" w:after="160" w:lineRule="auto" w:line="288"/>
         <w:ind w:left="720" w:hanging="357"/>
         <w:jc w:val="both"/>
       </w:pPr>
@@ -459,7 +459,7 @@
     <w:p>
       <w:pPr>
         <w:widowControl/>
-        <w:spacing w:before="0" w:after="80" w:lineRule="auto" w:line="276"/>
+        <w:spacing w:before="0" w:after="120" w:lineRule="auto" w:line="288"/>
         <w:ind w:firstLine="0" w:left="720"/>
         <w:jc w:val="both"/>
       </w:pPr>
@@ -478,7 +478,7 @@
     <w:p>
       <w:pPr>
         <w:widowControl/>
-        <w:spacing w:before="0" w:after="80" w:lineRule="auto" w:line="276"/>
+        <w:spacing w:before="0" w:after="120" w:lineRule="auto" w:line="288"/>
         <w:ind w:firstLine="0" w:left="720"/>
         <w:jc w:val="both"/>
       </w:pPr>
@@ -497,7 +497,7 @@
     <w:p>
       <w:pPr>
         <w:widowControl/>
-        <w:spacing w:before="0" w:after="80" w:lineRule="auto" w:line="276"/>
+        <w:spacing w:before="0" w:after="120" w:lineRule="auto" w:line="288"/>
         <w:ind w:firstLine="0" w:left="720"/>
         <w:jc w:val="both"/>
       </w:pPr>
@@ -516,7 +516,7 @@
     <w:p>
       <w:pPr>
         <w:widowControl/>
-        <w:spacing w:before="0" w:after="80" w:lineRule="auto" w:line="276"/>
+        <w:spacing w:before="0" w:after="120" w:lineRule="auto" w:line="288"/>
         <w:ind w:firstLine="0" w:left="720"/>
         <w:jc w:val="both"/>
       </w:pPr>
@@ -535,7 +535,7 @@
     <w:p>
       <w:pPr>
         <w:widowControl/>
-        <w:spacing w:before="200" w:after="120" w:lineRule="auto" w:line="276"/>
+        <w:spacing w:before="240" w:after="160" w:lineRule="auto" w:line="288"/>
         <w:ind w:left="720" w:hanging="357"/>
         <w:jc w:val="both"/>
       </w:pPr>
@@ -565,7 +565,7 @@
     <w:p>
       <w:pPr>
         <w:widowControl/>
-        <w:spacing w:before="0" w:after="80" w:lineRule="auto" w:line="276"/>
+        <w:spacing w:before="0" w:after="120" w:lineRule="auto" w:line="288"/>
         <w:ind w:firstLine="0" w:left="720"/>
         <w:jc w:val="both"/>
       </w:pPr>
@@ -584,7 +584,7 @@
     <w:p>
       <w:pPr>
         <w:widowControl/>
-        <w:spacing w:before="0" w:after="80" w:lineRule="auto" w:line="276"/>
+        <w:spacing w:before="0" w:after="120" w:lineRule="auto" w:line="288"/>
         <w:ind w:firstLine="0" w:left="720"/>
         <w:jc w:val="both"/>
       </w:pPr>
@@ -603,7 +603,7 @@
     <w:p>
       <w:pPr>
         <w:widowControl/>
-        <w:spacing w:before="0" w:after="80" w:lineRule="auto" w:line="276"/>
+        <w:spacing w:before="0" w:after="120" w:lineRule="auto" w:line="288"/>
         <w:ind w:firstLine="0" w:left="720"/>
         <w:jc w:val="both"/>
       </w:pPr>
@@ -622,7 +622,7 @@
     <w:p>
       <w:pPr>
         <w:widowControl/>
-        <w:spacing w:before="0" w:after="80" w:lineRule="auto" w:line="276"/>
+        <w:spacing w:before="0" w:after="120" w:lineRule="auto" w:line="288"/>
         <w:ind w:firstLine="0" w:left="720"/>
         <w:jc w:val="both"/>
       </w:pPr>
@@ -1041,7 +1041,7 @@
           <w:szCs w:val="24"/>
         </w:rPr>
         <w:tab/>
-        <w:t>20</w:t>
+        <w:t>21</w:t>
       </w:r>
     </w:p>
     <w:p>
@@ -1075,7 +1075,7 @@
           <w:szCs w:val="24"/>
         </w:rPr>
         <w:tab/>
-        <w:t>25</w:t>
+        <w:t>26</w:t>
       </w:r>
     </w:p>
     <w:p>
@@ -1109,7 +1109,7 @@
           <w:szCs w:val="24"/>
         </w:rPr>
         <w:tab/>
-        <w:t>31</w:t>
+        <w:t>32</w:t>
       </w:r>
     </w:p>
     <w:p>
@@ -1143,7 +1143,7 @@
           <w:szCs w:val="24"/>
         </w:rPr>
         <w:tab/>
-        <w:t>37</w:t>
+        <w:t>38</w:t>
       </w:r>
     </w:p>
     <w:p>
@@ -1177,7 +1177,7 @@
           <w:szCs w:val="24"/>
         </w:rPr>
         <w:tab/>
-        <w:t>39</w:t>
+        <w:t>40</w:t>
       </w:r>
     </w:p>
     <w:p>
@@ -1270,7 +1270,7 @@
           <w:szCs w:val="24"/>
         </w:rPr>
         <w:tab/>
-        <w:t>21</w:t>
+        <w:t>22</w:t>
       </w:r>
     </w:p>
     <w:p>
@@ -1304,7 +1304,7 @@
           <w:szCs w:val="24"/>
         </w:rPr>
         <w:tab/>
-        <w:t>25</w:t>
+        <w:t>26</w:t>
       </w:r>
     </w:p>
     <w:p>
@@ -1338,7 +1338,7 @@
           <w:szCs w:val="24"/>
         </w:rPr>
         <w:tab/>
-        <w:t>27</w:t>
+        <w:t>28</w:t>
       </w:r>
     </w:p>
     <w:p>
@@ -1372,7 +1372,7 @@
           <w:szCs w:val="24"/>
         </w:rPr>
         <w:tab/>
-        <w:t>27</w:t>
+        <w:t>28</w:t>
       </w:r>
     </w:p>
     <w:p>
@@ -1465,7 +1465,7 @@
           <w:szCs w:val="24"/>
         </w:rPr>
         <w:tab/>
-        <w:t>26</w:t>
+        <w:t>27</w:t>
       </w:r>
     </w:p>
     <w:p>
@@ -1499,7 +1499,7 @@
           <w:szCs w:val="24"/>
         </w:rPr>
         <w:tab/>
-        <w:t>28</w:t>
+        <w:t>29</w:t>
       </w:r>
     </w:p>
     <w:p>
@@ -1533,7 +1533,7 @@
           <w:szCs w:val="24"/>
         </w:rPr>
         <w:tab/>
-        <w:t>29</w:t>
+        <w:t>30</w:t>
       </w:r>
     </w:p>
     <w:p>
@@ -1561,7 +1561,7 @@
     <w:p>
       <w:pPr>
         <w:widowControl/>
-        <w:spacing w:before="0" w:after="80" w:lineRule="auto" w:line="276"/>
+        <w:spacing w:before="0" w:after="120" w:lineRule="auto" w:line="288"/>
         <w:ind w:firstLine="0"/>
         <w:jc w:val="both"/>
       </w:pPr>
@@ -1580,7 +1580,7 @@
     <w:p>
       <w:pPr>
         <w:widowControl/>
-        <w:spacing w:before="0" w:after="80" w:lineRule="auto" w:line="276"/>
+        <w:spacing w:before="0" w:after="120" w:lineRule="auto" w:line="288"/>
         <w:ind w:firstLine="0"/>
         <w:jc w:val="both"/>
       </w:pPr>
@@ -1599,7 +1599,7 @@
     <w:p>
       <w:pPr>
         <w:widowControl/>
-        <w:spacing w:before="0" w:after="80" w:lineRule="auto" w:line="276"/>
+        <w:spacing w:before="0" w:after="120" w:lineRule="auto" w:line="288"/>
         <w:ind w:firstLine="0"/>
         <w:jc w:val="both"/>
       </w:pPr>
@@ -1618,7 +1618,7 @@
     <w:p>
       <w:pPr>
         <w:widowControl/>
-        <w:spacing w:before="0" w:after="80" w:lineRule="auto" w:line="276"/>
+        <w:spacing w:before="0" w:after="120" w:lineRule="auto" w:line="288"/>
         <w:ind w:firstLine="0"/>
         <w:jc w:val="both"/>
       </w:pPr>
@@ -1637,7 +1637,7 @@
     <w:p>
       <w:pPr>
         <w:widowControl/>
-        <w:spacing w:before="0" w:after="80" w:lineRule="auto" w:line="276"/>
+        <w:spacing w:before="0" w:after="120" w:lineRule="auto" w:line="288"/>
         <w:ind w:firstLine="0"/>
         <w:jc w:val="both"/>
       </w:pPr>
@@ -1656,7 +1656,7 @@
     <w:p>
       <w:pPr>
         <w:widowControl/>
-        <w:spacing w:before="0" w:after="80" w:lineRule="auto" w:line="276"/>
+        <w:spacing w:before="0" w:after="120" w:lineRule="auto" w:line="288"/>
         <w:ind w:firstLine="0"/>
         <w:jc w:val="both"/>
       </w:pPr>
@@ -1675,7 +1675,7 @@
     <w:p>
       <w:pPr>
         <w:widowControl/>
-        <w:spacing w:before="0" w:after="80" w:lineRule="auto" w:line="276"/>
+        <w:spacing w:before="0" w:after="120" w:lineRule="auto" w:line="288"/>
         <w:ind w:firstLine="0"/>
         <w:jc w:val="both"/>
       </w:pPr>
@@ -1694,7 +1694,7 @@
     <w:p>
       <w:pPr>
         <w:widowControl/>
-        <w:spacing w:before="0" w:after="80" w:lineRule="auto" w:line="276"/>
+        <w:spacing w:before="0" w:after="120" w:lineRule="auto" w:line="288"/>
         <w:ind w:firstLine="0"/>
         <w:jc w:val="both"/>
       </w:pPr>
@@ -1713,7 +1713,7 @@
     <w:p>
       <w:pPr>
         <w:widowControl/>
-        <w:spacing w:before="0" w:after="80" w:lineRule="auto" w:line="276"/>
+        <w:spacing w:before="0" w:after="120" w:lineRule="auto" w:line="288"/>
         <w:ind w:firstLine="0"/>
         <w:jc w:val="both"/>
       </w:pPr>
@@ -1732,7 +1732,7 @@
     <w:p>
       <w:pPr>
         <w:widowControl/>
-        <w:spacing w:before="0" w:after="80" w:lineRule="auto" w:line="276"/>
+        <w:spacing w:before="0" w:after="120" w:lineRule="auto" w:line="288"/>
         <w:ind w:firstLine="0"/>
         <w:jc w:val="both"/>
       </w:pPr>
@@ -10944,7 +10944,7 @@
       <w:headerReference w:type="default" r:id="rId11"/>
       <w:footerReference w:type="default" r:id="rId12"/>
       <w:pgSz w:w="11906" w:h="16838"/>
-      <w:pgMar w:top="1587" w:right="1247" w:bottom="1446" w:left="1701" w:header="170" w:footer="159" w:gutter="0"/>
+      <w:pgMar w:top="1644" w:right="1247" w:bottom="1502" w:left="1701" w:header="198" w:footer="181" w:gutter="0"/>
       <w:cols w:space="720"/>
       <w:docGrid w:linePitch="360"/>
     </w:sectPr>
@@ -11130,7 +11130,7 @@
     <w:r>
       <w:drawing>
         <wp:inline xmlns:a="http://schemas.openxmlformats.org/drawingml/2006/main" xmlns:pic="http://schemas.openxmlformats.org/drawingml/2006/picture">
-          <wp:extent cx="4968000" cy="662400"/>
+          <wp:extent cx="4896000" cy="652800"/>
           <wp:docPr id="1" name="Picture 1"/>
           <wp:cNvGraphicFramePr>
             <a:graphicFrameLocks noChangeAspect="1"/>
@@ -11151,7 +11151,7 @@
                 <pic:spPr>
                   <a:xfrm>
                     <a:off x="0" y="0"/>
-                    <a:ext cx="4968000" cy="662400"/>
+                    <a:ext cx="4896000" cy="652800"/>
                   </a:xfrm>
                   <a:prstGeom prst="rect"/>
                 </pic:spPr>
@@ -11177,7 +11177,7 @@
     <w:r>
       <w:drawing>
         <wp:inline xmlns:a="http://schemas.openxmlformats.org/drawingml/2006/main" xmlns:pic="http://schemas.openxmlformats.org/drawingml/2006/picture">
-          <wp:extent cx="4968000" cy="662400"/>
+          <wp:extent cx="4896000" cy="652800"/>
           <wp:docPr id="1" name="Picture 1"/>
           <wp:cNvGraphicFramePr>
             <a:graphicFrameLocks noChangeAspect="1"/>
@@ -11198,7 +11198,7 @@
                 <pic:spPr>
                   <a:xfrm>
                     <a:off x="0" y="0"/>
-                    <a:ext cx="4968000" cy="662400"/>
+                    <a:ext cx="4896000" cy="652800"/>
                   </a:xfrm>
                   <a:prstGeom prst="rect"/>
                 </pic:spPr>

</xml_diff>

<commit_message>
Review fonts, alignment and open lists and tables
Set contents, table and figure lists to 12 pt with more line space, set result tables to 12 pt so values are not squeezed, and keep Times New Roman with justified body text. The complete thesis stays one document.

Co-authored-by: Ahmed El Gamry <ahmed733676-droid@users.noreply.github.com>
</commit_message>
<xml_diff>
--- a/Thesis_Complete.docx
+++ b/Thesis_Complete.docx
@@ -399,7 +399,7 @@
           <w:headerReference w:type="default" r:id="rId9"/>
           <w:footerReference w:type="default" r:id="rId10"/>
           <w:pgSz w:w="11906" w:h="16838"/>
-          <w:pgMar w:top="1644" w:right="1247" w:bottom="1502" w:left="1701" w:header="198" w:footer="181" w:gutter="0"/>
+          <w:pgMar w:top="1587" w:right="1247" w:bottom="1446" w:left="1701" w:header="170" w:footer="159" w:gutter="0"/>
           <w:cols w:space="720"/>
           <w:docGrid w:linePitch="360"/>
         </w:sectPr>
@@ -529,7 +529,7 @@
           <w:sz w:val="24"/>
           <w:szCs w:val="24"/>
         </w:rPr>
-        <w:t>Guidance of paper/thesis writing</w:t>
+        <w:t>Guidance of paper/thesis writing.</w:t>
       </w:r>
     </w:p>
     <w:p>
@@ -578,7 +578,7 @@
           <w:sz w:val="24"/>
           <w:szCs w:val="24"/>
         </w:rPr>
-        <w:t>Supervision of the clinical/experimental procedures</w:t>
+        <w:t>Supervision of the clinical/experimental procedures.</w:t>
       </w:r>
     </w:p>
     <w:p>
@@ -635,7 +635,7 @@
           <w:sz w:val="24"/>
           <w:szCs w:val="24"/>
         </w:rPr>
-        <w:t>Revising the thesis and/or manuscript</w:t>
+        <w:t>Revising the thesis and/or manuscript.</w:t>
       </w:r>
     </w:p>
     <w:p>
@@ -704,7 +704,7 @@
     <w:p>
       <w:pPr>
         <w:widowControl/>
-        <w:spacing w:before="200" w:after="160" w:lineRule="auto" w:line="276"/>
+        <w:spacing w:before="240" w:after="200" w:lineRule="auto" w:line="360"/>
         <w:ind w:firstLine="0"/>
         <w:jc w:val="left"/>
         <w:tabs>
@@ -741,7 +741,7 @@
     <w:p>
       <w:pPr>
         <w:widowControl/>
-        <w:spacing w:before="80" w:after="80" w:lineRule="auto" w:line="276"/>
+        <w:spacing w:before="160" w:after="160" w:lineRule="auto" w:line="360"/>
         <w:ind w:firstLine="0"/>
         <w:jc w:val="left"/>
         <w:tabs>
@@ -775,7 +775,7 @@
     <w:p>
       <w:pPr>
         <w:widowControl/>
-        <w:spacing w:before="80" w:after="80" w:lineRule="auto" w:line="276"/>
+        <w:spacing w:before="160" w:after="160" w:lineRule="auto" w:line="360"/>
         <w:ind w:firstLine="0"/>
         <w:jc w:val="left"/>
         <w:tabs>
@@ -809,7 +809,7 @@
     <w:p>
       <w:pPr>
         <w:widowControl/>
-        <w:spacing w:before="80" w:after="80" w:lineRule="auto" w:line="276"/>
+        <w:spacing w:before="160" w:after="160" w:lineRule="auto" w:line="360"/>
         <w:ind w:firstLine="0"/>
         <w:jc w:val="left"/>
         <w:tabs>
@@ -843,7 +843,7 @@
     <w:p>
       <w:pPr>
         <w:widowControl/>
-        <w:spacing w:before="80" w:after="80" w:lineRule="auto" w:line="276"/>
+        <w:spacing w:before="160" w:after="160" w:lineRule="auto" w:line="360"/>
         <w:ind w:firstLine="0"/>
         <w:jc w:val="left"/>
         <w:tabs>
@@ -877,7 +877,7 @@
     <w:p>
       <w:pPr>
         <w:widowControl/>
-        <w:spacing w:before="80" w:after="80" w:lineRule="auto" w:line="276"/>
+        <w:spacing w:before="160" w:after="160" w:lineRule="auto" w:line="360"/>
         <w:ind w:firstLine="0"/>
         <w:jc w:val="left"/>
         <w:tabs>
@@ -911,7 +911,7 @@
     <w:p>
       <w:pPr>
         <w:widowControl/>
-        <w:spacing w:before="80" w:after="80" w:lineRule="auto" w:line="276"/>
+        <w:spacing w:before="160" w:after="160" w:lineRule="auto" w:line="360"/>
         <w:ind w:firstLine="0"/>
         <w:jc w:val="left"/>
         <w:tabs>
@@ -945,7 +945,7 @@
     <w:p>
       <w:pPr>
         <w:widowControl/>
-        <w:spacing w:before="80" w:after="80" w:lineRule="auto" w:line="276"/>
+        <w:spacing w:before="160" w:after="160" w:lineRule="auto" w:line="360"/>
         <w:ind w:firstLine="0"/>
         <w:jc w:val="left"/>
         <w:tabs>
@@ -979,7 +979,7 @@
     <w:p>
       <w:pPr>
         <w:widowControl/>
-        <w:spacing w:before="80" w:after="80" w:lineRule="auto" w:line="276"/>
+        <w:spacing w:before="160" w:after="160" w:lineRule="auto" w:line="360"/>
         <w:ind w:firstLine="0"/>
         <w:jc w:val="left"/>
         <w:tabs>
@@ -1013,7 +1013,7 @@
     <w:p>
       <w:pPr>
         <w:widowControl/>
-        <w:spacing w:before="80" w:after="80" w:lineRule="auto" w:line="276"/>
+        <w:spacing w:before="160" w:after="160" w:lineRule="auto" w:line="360"/>
         <w:ind w:firstLine="0"/>
         <w:jc w:val="left"/>
         <w:tabs>
@@ -1041,13 +1041,13 @@
           <w:szCs w:val="24"/>
         </w:rPr>
         <w:tab/>
-        <w:t>21</w:t>
+        <w:t>20</w:t>
       </w:r>
     </w:p>
     <w:p>
       <w:pPr>
         <w:widowControl/>
-        <w:spacing w:before="80" w:after="80" w:lineRule="auto" w:line="276"/>
+        <w:spacing w:before="160" w:after="160" w:lineRule="auto" w:line="360"/>
         <w:ind w:firstLine="0"/>
         <w:jc w:val="left"/>
         <w:tabs>
@@ -1075,13 +1075,13 @@
           <w:szCs w:val="24"/>
         </w:rPr>
         <w:tab/>
-        <w:t>26</w:t>
+        <w:t>25</w:t>
       </w:r>
     </w:p>
     <w:p>
       <w:pPr>
         <w:widowControl/>
-        <w:spacing w:before="80" w:after="80" w:lineRule="auto" w:line="276"/>
+        <w:spacing w:before="160" w:after="160" w:lineRule="auto" w:line="360"/>
         <w:ind w:firstLine="0"/>
         <w:jc w:val="left"/>
         <w:tabs>
@@ -1109,13 +1109,13 @@
           <w:szCs w:val="24"/>
         </w:rPr>
         <w:tab/>
-        <w:t>32</w:t>
+        <w:t>31</w:t>
       </w:r>
     </w:p>
     <w:p>
       <w:pPr>
         <w:widowControl/>
-        <w:spacing w:before="80" w:after="80" w:lineRule="auto" w:line="276"/>
+        <w:spacing w:before="160" w:after="160" w:lineRule="auto" w:line="360"/>
         <w:ind w:firstLine="0"/>
         <w:jc w:val="left"/>
         <w:tabs>
@@ -1143,13 +1143,13 @@
           <w:szCs w:val="24"/>
         </w:rPr>
         <w:tab/>
-        <w:t>38</w:t>
+        <w:t>37</w:t>
       </w:r>
     </w:p>
     <w:p>
       <w:pPr>
         <w:widowControl/>
-        <w:spacing w:before="80" w:after="80" w:lineRule="auto" w:line="276"/>
+        <w:spacing w:before="160" w:after="160" w:lineRule="auto" w:line="360"/>
         <w:ind w:firstLine="0"/>
         <w:jc w:val="left"/>
         <w:tabs>
@@ -1177,7 +1177,7 @@
           <w:szCs w:val="24"/>
         </w:rPr>
         <w:tab/>
-        <w:t>40</w:t>
+        <w:t>39</w:t>
       </w:r>
     </w:p>
     <w:p>
@@ -1205,7 +1205,7 @@
     <w:p>
       <w:pPr>
         <w:widowControl/>
-        <w:spacing w:before="200" w:after="160" w:lineRule="auto" w:line="276"/>
+        <w:spacing w:before="240" w:after="200" w:lineRule="auto" w:line="360"/>
         <w:ind w:firstLine="0"/>
         <w:jc w:val="left"/>
         <w:tabs>
@@ -1242,7 +1242,7 @@
     <w:p>
       <w:pPr>
         <w:widowControl/>
-        <w:spacing w:before="120" w:after="120" w:lineRule="auto" w:line="276"/>
+        <w:spacing w:before="160" w:after="160" w:lineRule="auto" w:line="360"/>
         <w:ind w:firstLine="0"/>
         <w:jc w:val="left"/>
         <w:tabs>
@@ -1270,13 +1270,13 @@
           <w:szCs w:val="24"/>
         </w:rPr>
         <w:tab/>
-        <w:t>22</w:t>
+        <w:t>21</w:t>
       </w:r>
     </w:p>
     <w:p>
       <w:pPr>
         <w:widowControl/>
-        <w:spacing w:before="120" w:after="120" w:lineRule="auto" w:line="276"/>
+        <w:spacing w:before="160" w:after="160" w:lineRule="auto" w:line="360"/>
         <w:ind w:firstLine="0"/>
         <w:jc w:val="left"/>
         <w:tabs>
@@ -1304,13 +1304,13 @@
           <w:szCs w:val="24"/>
         </w:rPr>
         <w:tab/>
-        <w:t>26</w:t>
+        <w:t>25</w:t>
       </w:r>
     </w:p>
     <w:p>
       <w:pPr>
         <w:widowControl/>
-        <w:spacing w:before="120" w:after="120" w:lineRule="auto" w:line="276"/>
+        <w:spacing w:before="160" w:after="160" w:lineRule="auto" w:line="360"/>
         <w:ind w:firstLine="0"/>
         <w:jc w:val="left"/>
         <w:tabs>
@@ -1338,13 +1338,13 @@
           <w:szCs w:val="24"/>
         </w:rPr>
         <w:tab/>
-        <w:t>28</w:t>
+        <w:t>27</w:t>
       </w:r>
     </w:p>
     <w:p>
       <w:pPr>
         <w:widowControl/>
-        <w:spacing w:before="120" w:after="120" w:lineRule="auto" w:line="276"/>
+        <w:spacing w:before="160" w:after="160" w:lineRule="auto" w:line="360"/>
         <w:ind w:firstLine="0"/>
         <w:jc w:val="left"/>
         <w:tabs>
@@ -1372,7 +1372,7 @@
           <w:szCs w:val="24"/>
         </w:rPr>
         <w:tab/>
-        <w:t>28</w:t>
+        <w:t>27</w:t>
       </w:r>
     </w:p>
     <w:p>
@@ -1400,7 +1400,7 @@
     <w:p>
       <w:pPr>
         <w:widowControl/>
-        <w:spacing w:before="200" w:after="160" w:lineRule="auto" w:line="276"/>
+        <w:spacing w:before="240" w:after="200" w:lineRule="auto" w:line="360"/>
         <w:ind w:firstLine="0"/>
         <w:jc w:val="left"/>
         <w:tabs>
@@ -1437,7 +1437,7 @@
     <w:p>
       <w:pPr>
         <w:widowControl/>
-        <w:spacing w:before="120" w:after="120" w:lineRule="auto" w:line="276"/>
+        <w:spacing w:before="160" w:after="160" w:lineRule="auto" w:line="360"/>
         <w:ind w:firstLine="0"/>
         <w:jc w:val="left"/>
         <w:tabs>
@@ -1465,13 +1465,13 @@
           <w:szCs w:val="24"/>
         </w:rPr>
         <w:tab/>
-        <w:t>27</w:t>
+        <w:t>26</w:t>
       </w:r>
     </w:p>
     <w:p>
       <w:pPr>
         <w:widowControl/>
-        <w:spacing w:before="120" w:after="120" w:lineRule="auto" w:line="276"/>
+        <w:spacing w:before="160" w:after="160" w:lineRule="auto" w:line="360"/>
         <w:ind w:firstLine="0"/>
         <w:jc w:val="left"/>
         <w:tabs>
@@ -1499,13 +1499,13 @@
           <w:szCs w:val="24"/>
         </w:rPr>
         <w:tab/>
-        <w:t>29</w:t>
+        <w:t>28</w:t>
       </w:r>
     </w:p>
     <w:p>
       <w:pPr>
         <w:widowControl/>
-        <w:spacing w:before="120" w:after="120" w:lineRule="auto" w:line="276"/>
+        <w:spacing w:before="160" w:after="160" w:lineRule="auto" w:line="360"/>
         <w:ind w:firstLine="0"/>
         <w:jc w:val="left"/>
         <w:tabs>
@@ -1533,7 +1533,7 @@
           <w:szCs w:val="24"/>
         </w:rPr>
         <w:tab/>
-        <w:t>30</w:t>
+        <w:t>29</w:t>
       </w:r>
     </w:p>
     <w:p>
@@ -1561,8 +1561,8 @@
     <w:p>
       <w:pPr>
         <w:widowControl/>
-        <w:spacing w:before="0" w:after="120" w:lineRule="auto" w:line="288"/>
-        <w:ind w:firstLine="0"/>
+        <w:spacing w:before="0" w:after="0" w:line="480" w:lineRule="auto"/>
+        <w:ind w:firstLine="720"/>
         <w:jc w:val="both"/>
       </w:pPr>
       <w:r>
@@ -1580,8 +1580,8 @@
     <w:p>
       <w:pPr>
         <w:widowControl/>
-        <w:spacing w:before="0" w:after="120" w:lineRule="auto" w:line="288"/>
-        <w:ind w:firstLine="0"/>
+        <w:spacing w:before="0" w:after="0" w:line="480" w:lineRule="auto"/>
+        <w:ind w:firstLine="720"/>
         <w:jc w:val="both"/>
       </w:pPr>
       <w:r>
@@ -1599,8 +1599,8 @@
     <w:p>
       <w:pPr>
         <w:widowControl/>
-        <w:spacing w:before="0" w:after="120" w:lineRule="auto" w:line="288"/>
-        <w:ind w:firstLine="0"/>
+        <w:spacing w:before="0" w:after="0" w:line="480" w:lineRule="auto"/>
+        <w:ind w:firstLine="720"/>
         <w:jc w:val="both"/>
       </w:pPr>
       <w:r>
@@ -1618,8 +1618,8 @@
     <w:p>
       <w:pPr>
         <w:widowControl/>
-        <w:spacing w:before="0" w:after="120" w:lineRule="auto" w:line="288"/>
-        <w:ind w:firstLine="0"/>
+        <w:spacing w:before="0" w:after="0" w:line="480" w:lineRule="auto"/>
+        <w:ind w:firstLine="720"/>
         <w:jc w:val="both"/>
       </w:pPr>
       <w:r>
@@ -1637,8 +1637,8 @@
     <w:p>
       <w:pPr>
         <w:widowControl/>
-        <w:spacing w:before="0" w:after="120" w:lineRule="auto" w:line="288"/>
-        <w:ind w:firstLine="0"/>
+        <w:spacing w:before="0" w:after="0" w:line="480" w:lineRule="auto"/>
+        <w:ind w:firstLine="720"/>
         <w:jc w:val="both"/>
       </w:pPr>
       <w:r>
@@ -1656,8 +1656,8 @@
     <w:p>
       <w:pPr>
         <w:widowControl/>
-        <w:spacing w:before="0" w:after="120" w:lineRule="auto" w:line="288"/>
-        <w:ind w:firstLine="0"/>
+        <w:spacing w:before="0" w:after="0" w:line="480" w:lineRule="auto"/>
+        <w:ind w:firstLine="720"/>
         <w:jc w:val="both"/>
       </w:pPr>
       <w:r>
@@ -1675,8 +1675,8 @@
     <w:p>
       <w:pPr>
         <w:widowControl/>
-        <w:spacing w:before="0" w:after="120" w:lineRule="auto" w:line="288"/>
-        <w:ind w:firstLine="0"/>
+        <w:spacing w:before="0" w:after="0" w:line="480" w:lineRule="auto"/>
+        <w:ind w:firstLine="720"/>
         <w:jc w:val="both"/>
       </w:pPr>
       <w:r>
@@ -1694,8 +1694,8 @@
     <w:p>
       <w:pPr>
         <w:widowControl/>
-        <w:spacing w:before="0" w:after="120" w:lineRule="auto" w:line="288"/>
-        <w:ind w:firstLine="0"/>
+        <w:spacing w:before="0" w:after="0" w:line="480" w:lineRule="auto"/>
+        <w:ind w:firstLine="720"/>
         <w:jc w:val="both"/>
       </w:pPr>
       <w:r>
@@ -1713,8 +1713,8 @@
     <w:p>
       <w:pPr>
         <w:widowControl/>
-        <w:spacing w:before="0" w:after="120" w:lineRule="auto" w:line="288"/>
-        <w:ind w:firstLine="0"/>
+        <w:spacing w:before="0" w:after="0" w:line="480" w:lineRule="auto"/>
+        <w:ind w:firstLine="720"/>
         <w:jc w:val="both"/>
       </w:pPr>
       <w:r>
@@ -1732,8 +1732,8 @@
     <w:p>
       <w:pPr>
         <w:widowControl/>
-        <w:spacing w:before="0" w:after="120" w:lineRule="auto" w:line="288"/>
-        <w:ind w:firstLine="0"/>
+        <w:spacing w:before="0" w:after="0" w:line="480" w:lineRule="auto"/>
+        <w:ind w:firstLine="720"/>
         <w:jc w:val="both"/>
       </w:pPr>
       <w:r>
@@ -4363,7 +4363,7 @@
       <w:pPr>
         <w:keepNext/>
         <w:widowControl/>
-        <w:spacing w:before="280" w:after="160" w:lineRule="auto" w:line="276"/>
+        <w:spacing w:before="320" w:after="200" w:lineRule="auto" w:line="276"/>
         <w:ind w:firstLine="0"/>
         <w:jc w:val="left"/>
       </w:pPr>
@@ -4417,10 +4417,10 @@
             <w:tcW w:type="dxa" w:w="1644"/>
             <w:vAlign w:val="center"/>
             <w:tcMar>
-              <w:top w:w="80" w:type="dxa"/>
-              <w:left w:w="80" w:type="dxa"/>
-              <w:bottom w:w="80" w:type="dxa"/>
-              <w:right w:w="80" w:type="dxa"/>
+              <w:top w:w="100" w:type="dxa"/>
+              <w:left w:w="100" w:type="dxa"/>
+              <w:bottom w:w="100" w:type="dxa"/>
+              <w:right w:w="100" w:type="dxa"/>
             </w:tcMar>
             <w:tcBorders>
               <w:top w:val="single" w:sz="18" w:space="0" w:color="000000"/>
@@ -4432,7 +4432,7 @@
           <w:p>
             <w:pPr>
               <w:widowControl/>
-              <w:spacing w:before="60" w:after="60" w:lineRule="auto" w:line="276"/>
+              <w:spacing w:before="80" w:after="80" w:lineRule="auto" w:line="276"/>
               <w:ind w:firstLine="0"/>
               <w:jc w:val="left"/>
             </w:pPr>
@@ -4443,8 +4443,8 @@
                 <w:b/>
                 <w:i w:val="0"/>
                 <w:color w:val="000000"/>
-                <w:sz w:val="20"/>
-                <w:szCs w:val="20"/>
+                <w:sz w:val="24"/>
+                <w:szCs w:val="24"/>
               </w:rPr>
               <w:t>Composite</w:t>
             </w:r>
@@ -4455,10 +4455,10 @@
             <w:tcW w:type="dxa" w:w="1304"/>
             <w:vAlign w:val="center"/>
             <w:tcMar>
-              <w:top w:w="80" w:type="dxa"/>
-              <w:left w:w="80" w:type="dxa"/>
-              <w:bottom w:w="80" w:type="dxa"/>
-              <w:right w:w="80" w:type="dxa"/>
+              <w:top w:w="100" w:type="dxa"/>
+              <w:left w:w="100" w:type="dxa"/>
+              <w:bottom w:w="100" w:type="dxa"/>
+              <w:right w:w="100" w:type="dxa"/>
             </w:tcMar>
             <w:tcBorders>
               <w:top w:val="single" w:sz="18" w:space="0" w:color="000000"/>
@@ -4470,7 +4470,7 @@
           <w:p>
             <w:pPr>
               <w:widowControl/>
-              <w:spacing w:before="60" w:after="60" w:lineRule="auto" w:line="276"/>
+              <w:spacing w:before="80" w:after="80" w:lineRule="auto" w:line="276"/>
               <w:ind w:firstLine="0"/>
               <w:jc w:val="left"/>
             </w:pPr>
@@ -4481,8 +4481,8 @@
                 <w:b/>
                 <w:i w:val="0"/>
                 <w:color w:val="000000"/>
-                <w:sz w:val="20"/>
-                <w:szCs w:val="20"/>
+                <w:sz w:val="24"/>
+                <w:szCs w:val="24"/>
               </w:rPr>
               <w:t>Type</w:t>
             </w:r>
@@ -4493,10 +4493,10 @@
             <w:tcW w:type="dxa" w:w="1928"/>
             <w:vAlign w:val="center"/>
             <w:tcMar>
-              <w:top w:w="80" w:type="dxa"/>
-              <w:left w:w="80" w:type="dxa"/>
-              <w:bottom w:w="80" w:type="dxa"/>
-              <w:right w:w="80" w:type="dxa"/>
+              <w:top w:w="100" w:type="dxa"/>
+              <w:left w:w="100" w:type="dxa"/>
+              <w:bottom w:w="100" w:type="dxa"/>
+              <w:right w:w="100" w:type="dxa"/>
             </w:tcMar>
             <w:tcBorders>
               <w:top w:val="single" w:sz="18" w:space="0" w:color="000000"/>
@@ -4508,7 +4508,7 @@
           <w:p>
             <w:pPr>
               <w:widowControl/>
-              <w:spacing w:before="60" w:after="60" w:lineRule="auto" w:line="276"/>
+              <w:spacing w:before="80" w:after="80" w:lineRule="auto" w:line="276"/>
               <w:ind w:firstLine="0"/>
               <w:jc w:val="left"/>
             </w:pPr>
@@ -4519,8 +4519,8 @@
                 <w:b/>
                 <w:i w:val="0"/>
                 <w:color w:val="000000"/>
-                <w:sz w:val="20"/>
-                <w:szCs w:val="20"/>
+                <w:sz w:val="24"/>
+                <w:szCs w:val="24"/>
               </w:rPr>
               <w:t>Matrix</w:t>
             </w:r>
@@ -4531,10 +4531,10 @@
             <w:tcW w:type="dxa" w:w="1984"/>
             <w:vAlign w:val="center"/>
             <w:tcMar>
-              <w:top w:w="80" w:type="dxa"/>
-              <w:left w:w="80" w:type="dxa"/>
-              <w:bottom w:w="80" w:type="dxa"/>
-              <w:right w:w="80" w:type="dxa"/>
+              <w:top w:w="100" w:type="dxa"/>
+              <w:left w:w="100" w:type="dxa"/>
+              <w:bottom w:w="100" w:type="dxa"/>
+              <w:right w:w="100" w:type="dxa"/>
             </w:tcMar>
             <w:tcBorders>
               <w:top w:val="single" w:sz="18" w:space="0" w:color="000000"/>
@@ -4546,7 +4546,7 @@
           <w:p>
             <w:pPr>
               <w:widowControl/>
-              <w:spacing w:before="60" w:after="60" w:lineRule="auto" w:line="276"/>
+              <w:spacing w:before="80" w:after="80" w:lineRule="auto" w:line="276"/>
               <w:ind w:firstLine="0"/>
               <w:jc w:val="left"/>
             </w:pPr>
@@ -4557,8 +4557,8 @@
                 <w:b/>
                 <w:i w:val="0"/>
                 <w:color w:val="000000"/>
-                <w:sz w:val="20"/>
-                <w:szCs w:val="20"/>
+                <w:sz w:val="24"/>
+                <w:szCs w:val="24"/>
               </w:rPr>
               <w:t>Filler</w:t>
             </w:r>
@@ -4569,10 +4569,10 @@
             <w:tcW w:type="dxa" w:w="850"/>
             <w:vAlign w:val="center"/>
             <w:tcMar>
-              <w:top w:w="80" w:type="dxa"/>
-              <w:left w:w="80" w:type="dxa"/>
-              <w:bottom w:w="80" w:type="dxa"/>
-              <w:right w:w="80" w:type="dxa"/>
+              <w:top w:w="100" w:type="dxa"/>
+              <w:left w:w="100" w:type="dxa"/>
+              <w:bottom w:w="100" w:type="dxa"/>
+              <w:right w:w="100" w:type="dxa"/>
             </w:tcMar>
             <w:tcBorders>
               <w:top w:val="single" w:sz="18" w:space="0" w:color="000000"/>
@@ -4584,7 +4584,7 @@
           <w:p>
             <w:pPr>
               <w:widowControl/>
-              <w:spacing w:before="60" w:after="60" w:lineRule="auto" w:line="276"/>
+              <w:spacing w:before="80" w:after="80" w:lineRule="auto" w:line="276"/>
               <w:ind w:firstLine="0"/>
               <w:jc w:val="center"/>
             </w:pPr>
@@ -4595,8 +4595,8 @@
                 <w:b/>
                 <w:i w:val="0"/>
                 <w:color w:val="000000"/>
-                <w:sz w:val="20"/>
-                <w:szCs w:val="20"/>
+                <w:sz w:val="24"/>
+                <w:szCs w:val="24"/>
               </w:rPr>
               <w:t>Load</w:t>
             </w:r>
@@ -4607,10 +4607,10 @@
             <w:tcW w:type="dxa" w:w="1247"/>
             <w:vAlign w:val="center"/>
             <w:tcMar>
-              <w:top w:w="80" w:type="dxa"/>
-              <w:left w:w="80" w:type="dxa"/>
-              <w:bottom w:w="80" w:type="dxa"/>
-              <w:right w:w="80" w:type="dxa"/>
+              <w:top w:w="100" w:type="dxa"/>
+              <w:left w:w="100" w:type="dxa"/>
+              <w:bottom w:w="100" w:type="dxa"/>
+              <w:right w:w="100" w:type="dxa"/>
             </w:tcMar>
             <w:tcBorders>
               <w:top w:val="single" w:sz="18" w:space="0" w:color="000000"/>
@@ -4622,7 +4622,7 @@
           <w:p>
             <w:pPr>
               <w:widowControl/>
-              <w:spacing w:before="60" w:after="60" w:lineRule="auto" w:line="276"/>
+              <w:spacing w:before="80" w:after="80" w:lineRule="auto" w:line="276"/>
               <w:ind w:firstLine="0"/>
               <w:jc w:val="left"/>
             </w:pPr>
@@ -4633,8 +4633,8 @@
                 <w:b/>
                 <w:i w:val="0"/>
                 <w:color w:val="000000"/>
-                <w:sz w:val="20"/>
-                <w:szCs w:val="20"/>
+                <w:sz w:val="24"/>
+                <w:szCs w:val="24"/>
               </w:rPr>
               <w:t>Manufacturer</w:t>
             </w:r>
@@ -4650,10 +4650,10 @@
             <w:tcW w:type="dxa" w:w="1644"/>
             <w:vAlign w:val="center"/>
             <w:tcMar>
-              <w:top w:w="80" w:type="dxa"/>
-              <w:left w:w="80" w:type="dxa"/>
-              <w:bottom w:w="80" w:type="dxa"/>
-              <w:right w:w="80" w:type="dxa"/>
+              <w:top w:w="100" w:type="dxa"/>
+              <w:left w:w="100" w:type="dxa"/>
+              <w:bottom w:w="100" w:type="dxa"/>
+              <w:right w:w="100" w:type="dxa"/>
             </w:tcMar>
             <w:tcBorders>
               <w:top w:val="nil" w:sz="0" w:space="0" w:color="auto"/>
@@ -4665,7 +4665,7 @@
           <w:p>
             <w:pPr>
               <w:widowControl/>
-              <w:spacing w:before="60" w:after="60" w:lineRule="auto" w:line="276"/>
+              <w:spacing w:before="80" w:after="80" w:lineRule="auto" w:line="276"/>
               <w:ind w:firstLine="0"/>
               <w:jc w:val="left"/>
             </w:pPr>
@@ -4676,8 +4676,8 @@
                 <w:b w:val="0"/>
                 <w:i w:val="0"/>
                 <w:color w:val="000000"/>
-                <w:sz w:val="20"/>
-                <w:szCs w:val="20"/>
+                <w:sz w:val="24"/>
+                <w:szCs w:val="24"/>
               </w:rPr>
               <w:t>G-ænial Universal Injectable (A2)</w:t>
             </w:r>
@@ -4688,10 +4688,10 @@
             <w:tcW w:type="dxa" w:w="1304"/>
             <w:vAlign w:val="center"/>
             <w:tcMar>
-              <w:top w:w="80" w:type="dxa"/>
-              <w:left w:w="80" w:type="dxa"/>
-              <w:bottom w:w="80" w:type="dxa"/>
-              <w:right w:w="80" w:type="dxa"/>
+              <w:top w:w="100" w:type="dxa"/>
+              <w:left w:w="100" w:type="dxa"/>
+              <w:bottom w:w="100" w:type="dxa"/>
+              <w:right w:w="100" w:type="dxa"/>
             </w:tcMar>
             <w:tcBorders>
               <w:top w:val="nil" w:sz="0" w:space="0" w:color="auto"/>
@@ -4703,7 +4703,7 @@
           <w:p>
             <w:pPr>
               <w:widowControl/>
-              <w:spacing w:before="60" w:after="60" w:lineRule="auto" w:line="276"/>
+              <w:spacing w:before="80" w:after="80" w:lineRule="auto" w:line="276"/>
               <w:ind w:firstLine="0"/>
               <w:jc w:val="left"/>
             </w:pPr>
@@ -4714,8 +4714,8 @@
                 <w:b w:val="0"/>
                 <w:i w:val="0"/>
                 <w:color w:val="000000"/>
-                <w:sz w:val="20"/>
-                <w:szCs w:val="20"/>
+                <w:sz w:val="24"/>
+                <w:szCs w:val="24"/>
               </w:rPr>
               <w:t>Nanohybrid injectable</w:t>
             </w:r>
@@ -4726,10 +4726,10 @@
             <w:tcW w:type="dxa" w:w="1928"/>
             <w:vAlign w:val="center"/>
             <w:tcMar>
-              <w:top w:w="80" w:type="dxa"/>
-              <w:left w:w="80" w:type="dxa"/>
-              <w:bottom w:w="80" w:type="dxa"/>
-              <w:right w:w="80" w:type="dxa"/>
+              <w:top w:w="100" w:type="dxa"/>
+              <w:left w:w="100" w:type="dxa"/>
+              <w:bottom w:w="100" w:type="dxa"/>
+              <w:right w:w="100" w:type="dxa"/>
             </w:tcMar>
             <w:tcBorders>
               <w:top w:val="nil" w:sz="0" w:space="0" w:color="auto"/>
@@ -4741,7 +4741,7 @@
           <w:p>
             <w:pPr>
               <w:widowControl/>
-              <w:spacing w:before="60" w:after="60" w:lineRule="auto" w:line="276"/>
+              <w:spacing w:before="80" w:after="80" w:lineRule="auto" w:line="276"/>
               <w:ind w:firstLine="0"/>
               <w:jc w:val="left"/>
             </w:pPr>
@@ -4752,8 +4752,8 @@
                 <w:b w:val="0"/>
                 <w:i w:val="0"/>
                 <w:color w:val="000000"/>
-                <w:sz w:val="20"/>
-                <w:szCs w:val="20"/>
+                <w:sz w:val="24"/>
+                <w:szCs w:val="24"/>
               </w:rPr>
               <w:t>Dimethacrylate monomers</w:t>
             </w:r>
@@ -4764,10 +4764,10 @@
             <w:tcW w:type="dxa" w:w="1984"/>
             <w:vAlign w:val="center"/>
             <w:tcMar>
-              <w:top w:w="80" w:type="dxa"/>
-              <w:left w:w="80" w:type="dxa"/>
-              <w:bottom w:w="80" w:type="dxa"/>
-              <w:right w:w="80" w:type="dxa"/>
+              <w:top w:w="100" w:type="dxa"/>
+              <w:left w:w="100" w:type="dxa"/>
+              <w:bottom w:w="100" w:type="dxa"/>
+              <w:right w:w="100" w:type="dxa"/>
             </w:tcMar>
             <w:tcBorders>
               <w:top w:val="nil" w:sz="0" w:space="0" w:color="auto"/>
@@ -4779,7 +4779,7 @@
           <w:p>
             <w:pPr>
               <w:widowControl/>
-              <w:spacing w:before="60" w:after="60" w:lineRule="auto" w:line="276"/>
+              <w:spacing w:before="80" w:after="80" w:lineRule="auto" w:line="276"/>
               <w:ind w:firstLine="0"/>
               <w:jc w:val="left"/>
             </w:pPr>
@@ -4790,8 +4790,8 @@
                 <w:b w:val="0"/>
                 <w:i w:val="0"/>
                 <w:color w:val="000000"/>
-                <w:sz w:val="20"/>
-                <w:szCs w:val="20"/>
+                <w:sz w:val="24"/>
+                <w:szCs w:val="24"/>
               </w:rPr>
               <w:t>Barium glass, silica</w:t>
             </w:r>
@@ -4802,10 +4802,10 @@
             <w:tcW w:type="dxa" w:w="850"/>
             <w:vAlign w:val="center"/>
             <w:tcMar>
-              <w:top w:w="80" w:type="dxa"/>
-              <w:left w:w="80" w:type="dxa"/>
-              <w:bottom w:w="80" w:type="dxa"/>
-              <w:right w:w="80" w:type="dxa"/>
+              <w:top w:w="100" w:type="dxa"/>
+              <w:left w:w="100" w:type="dxa"/>
+              <w:bottom w:w="100" w:type="dxa"/>
+              <w:right w:w="100" w:type="dxa"/>
             </w:tcMar>
             <w:tcBorders>
               <w:top w:val="nil" w:sz="0" w:space="0" w:color="auto"/>
@@ -4817,7 +4817,7 @@
           <w:p>
             <w:pPr>
               <w:widowControl/>
-              <w:spacing w:before="60" w:after="60" w:lineRule="auto" w:line="276"/>
+              <w:spacing w:before="80" w:after="80" w:lineRule="auto" w:line="276"/>
               <w:ind w:firstLine="0"/>
               <w:jc w:val="center"/>
             </w:pPr>
@@ -4828,8 +4828,8 @@
                 <w:b w:val="0"/>
                 <w:i w:val="0"/>
                 <w:color w:val="000000"/>
-                <w:sz w:val="20"/>
-                <w:szCs w:val="20"/>
+                <w:sz w:val="24"/>
+                <w:szCs w:val="24"/>
               </w:rPr>
               <w:t>50 vol%</w:t>
             </w:r>
@@ -4840,10 +4840,10 @@
             <w:tcW w:type="dxa" w:w="1247"/>
             <w:vAlign w:val="center"/>
             <w:tcMar>
-              <w:top w:w="80" w:type="dxa"/>
-              <w:left w:w="80" w:type="dxa"/>
-              <w:bottom w:w="80" w:type="dxa"/>
-              <w:right w:w="80" w:type="dxa"/>
+              <w:top w:w="100" w:type="dxa"/>
+              <w:left w:w="100" w:type="dxa"/>
+              <w:bottom w:w="100" w:type="dxa"/>
+              <w:right w:w="100" w:type="dxa"/>
             </w:tcMar>
             <w:tcBorders>
               <w:top w:val="nil" w:sz="0" w:space="0" w:color="auto"/>
@@ -4855,7 +4855,7 @@
           <w:p>
             <w:pPr>
               <w:widowControl/>
-              <w:spacing w:before="60" w:after="60" w:lineRule="auto" w:line="276"/>
+              <w:spacing w:before="80" w:after="80" w:lineRule="auto" w:line="276"/>
               <w:ind w:firstLine="0"/>
               <w:jc w:val="left"/>
             </w:pPr>
@@ -4866,8 +4866,8 @@
                 <w:b w:val="0"/>
                 <w:i w:val="0"/>
                 <w:color w:val="000000"/>
-                <w:sz w:val="20"/>
-                <w:szCs w:val="20"/>
+                <w:sz w:val="24"/>
+                <w:szCs w:val="24"/>
               </w:rPr>
               <w:t>GC, Tokyo</w:t>
             </w:r>
@@ -4883,10 +4883,10 @@
             <w:tcW w:type="dxa" w:w="1644"/>
             <w:vAlign w:val="center"/>
             <w:tcMar>
-              <w:top w:w="80" w:type="dxa"/>
-              <w:left w:w="80" w:type="dxa"/>
-              <w:bottom w:w="80" w:type="dxa"/>
-              <w:right w:w="80" w:type="dxa"/>
+              <w:top w:w="100" w:type="dxa"/>
+              <w:left w:w="100" w:type="dxa"/>
+              <w:bottom w:w="100" w:type="dxa"/>
+              <w:right w:w="100" w:type="dxa"/>
             </w:tcMar>
             <w:tcBorders>
               <w:top w:val="nil" w:sz="0" w:space="0" w:color="auto"/>
@@ -4898,7 +4898,7 @@
           <w:p>
             <w:pPr>
               <w:widowControl/>
-              <w:spacing w:before="60" w:after="60" w:lineRule="auto" w:line="276"/>
+              <w:spacing w:before="80" w:after="80" w:lineRule="auto" w:line="276"/>
               <w:ind w:firstLine="0"/>
               <w:jc w:val="left"/>
             </w:pPr>
@@ -4909,8 +4909,8 @@
                 <w:b w:val="0"/>
                 <w:i w:val="0"/>
                 <w:color w:val="000000"/>
-                <w:sz w:val="20"/>
-                <w:szCs w:val="20"/>
+                <w:sz w:val="24"/>
+                <w:szCs w:val="24"/>
               </w:rPr>
               <w:t>Beautifil Flow Plus X F00 (A2)</w:t>
             </w:r>
@@ -4921,10 +4921,10 @@
             <w:tcW w:type="dxa" w:w="1304"/>
             <w:vAlign w:val="center"/>
             <w:tcMar>
-              <w:top w:w="80" w:type="dxa"/>
-              <w:left w:w="80" w:type="dxa"/>
-              <w:bottom w:w="80" w:type="dxa"/>
-              <w:right w:w="80" w:type="dxa"/>
+              <w:top w:w="100" w:type="dxa"/>
+              <w:left w:w="100" w:type="dxa"/>
+              <w:bottom w:w="100" w:type="dxa"/>
+              <w:right w:w="100" w:type="dxa"/>
             </w:tcMar>
             <w:tcBorders>
               <w:top w:val="nil" w:sz="0" w:space="0" w:color="auto"/>
@@ -4936,7 +4936,7 @@
           <w:p>
             <w:pPr>
               <w:widowControl/>
-              <w:spacing w:before="60" w:after="60" w:lineRule="auto" w:line="276"/>
+              <w:spacing w:before="80" w:after="80" w:lineRule="auto" w:line="276"/>
               <w:ind w:firstLine="0"/>
               <w:jc w:val="left"/>
             </w:pPr>
@@ -4947,8 +4947,8 @@
                 <w:b w:val="0"/>
                 <w:i w:val="0"/>
                 <w:color w:val="000000"/>
-                <w:sz w:val="20"/>
-                <w:szCs w:val="20"/>
+                <w:sz w:val="24"/>
+                <w:szCs w:val="24"/>
               </w:rPr>
               <w:t>Nanohybrid injectable giomer</w:t>
             </w:r>
@@ -4959,10 +4959,10 @@
             <w:tcW w:type="dxa" w:w="1928"/>
             <w:vAlign w:val="center"/>
             <w:tcMar>
-              <w:top w:w="80" w:type="dxa"/>
-              <w:left w:w="80" w:type="dxa"/>
-              <w:bottom w:w="80" w:type="dxa"/>
-              <w:right w:w="80" w:type="dxa"/>
+              <w:top w:w="100" w:type="dxa"/>
+              <w:left w:w="100" w:type="dxa"/>
+              <w:bottom w:w="100" w:type="dxa"/>
+              <w:right w:w="100" w:type="dxa"/>
             </w:tcMar>
             <w:tcBorders>
               <w:top w:val="nil" w:sz="0" w:space="0" w:color="auto"/>
@@ -4974,7 +4974,7 @@
           <w:p>
             <w:pPr>
               <w:widowControl/>
-              <w:spacing w:before="60" w:after="60" w:lineRule="auto" w:line="276"/>
+              <w:spacing w:before="80" w:after="80" w:lineRule="auto" w:line="276"/>
               <w:ind w:firstLine="0"/>
               <w:jc w:val="left"/>
             </w:pPr>
@@ -4985,8 +4985,8 @@
                 <w:b w:val="0"/>
                 <w:i w:val="0"/>
                 <w:color w:val="000000"/>
-                <w:sz w:val="20"/>
-                <w:szCs w:val="20"/>
+                <w:sz w:val="24"/>
+                <w:szCs w:val="24"/>
               </w:rPr>
               <w:t>Bis-GMA, TEGDMA</w:t>
             </w:r>
@@ -4997,10 +4997,10 @@
             <w:tcW w:type="dxa" w:w="1984"/>
             <w:vAlign w:val="center"/>
             <w:tcMar>
-              <w:top w:w="80" w:type="dxa"/>
-              <w:left w:w="80" w:type="dxa"/>
-              <w:bottom w:w="80" w:type="dxa"/>
-              <w:right w:w="80" w:type="dxa"/>
+              <w:top w:w="100" w:type="dxa"/>
+              <w:left w:w="100" w:type="dxa"/>
+              <w:bottom w:w="100" w:type="dxa"/>
+              <w:right w:w="100" w:type="dxa"/>
             </w:tcMar>
             <w:tcBorders>
               <w:top w:val="nil" w:sz="0" w:space="0" w:color="auto"/>
@@ -5012,7 +5012,7 @@
           <w:p>
             <w:pPr>
               <w:widowControl/>
-              <w:spacing w:before="60" w:after="60" w:lineRule="auto" w:line="276"/>
+              <w:spacing w:before="80" w:after="80" w:lineRule="auto" w:line="276"/>
               <w:ind w:firstLine="0"/>
               <w:jc w:val="left"/>
             </w:pPr>
@@ -5023,8 +5023,8 @@
                 <w:b w:val="0"/>
                 <w:i w:val="0"/>
                 <w:color w:val="000000"/>
-                <w:sz w:val="20"/>
-                <w:szCs w:val="20"/>
+                <w:sz w:val="24"/>
+                <w:szCs w:val="24"/>
               </w:rPr>
               <w:t>Multifunctional glass and S-PRG filler</w:t>
             </w:r>
@@ -5035,10 +5035,10 @@
             <w:tcW w:type="dxa" w:w="850"/>
             <w:vAlign w:val="center"/>
             <w:tcMar>
-              <w:top w:w="80" w:type="dxa"/>
-              <w:left w:w="80" w:type="dxa"/>
-              <w:bottom w:w="80" w:type="dxa"/>
-              <w:right w:w="80" w:type="dxa"/>
+              <w:top w:w="100" w:type="dxa"/>
+              <w:left w:w="100" w:type="dxa"/>
+              <w:bottom w:w="100" w:type="dxa"/>
+              <w:right w:w="100" w:type="dxa"/>
             </w:tcMar>
             <w:tcBorders>
               <w:top w:val="nil" w:sz="0" w:space="0" w:color="auto"/>
@@ -5050,7 +5050,7 @@
           <w:p>
             <w:pPr>
               <w:widowControl/>
-              <w:spacing w:before="60" w:after="60" w:lineRule="auto" w:line="276"/>
+              <w:spacing w:before="80" w:after="80" w:lineRule="auto" w:line="276"/>
               <w:ind w:firstLine="0"/>
               <w:jc w:val="center"/>
             </w:pPr>
@@ -5061,8 +5061,8 @@
                 <w:b w:val="0"/>
                 <w:i w:val="0"/>
                 <w:color w:val="000000"/>
-                <w:sz w:val="20"/>
-                <w:szCs w:val="20"/>
+                <w:sz w:val="24"/>
+                <w:szCs w:val="24"/>
               </w:rPr>
               <w:t>47 vol%</w:t>
             </w:r>
@@ -5073,10 +5073,10 @@
             <w:tcW w:type="dxa" w:w="1247"/>
             <w:vAlign w:val="center"/>
             <w:tcMar>
-              <w:top w:w="80" w:type="dxa"/>
-              <w:left w:w="80" w:type="dxa"/>
-              <w:bottom w:w="80" w:type="dxa"/>
-              <w:right w:w="80" w:type="dxa"/>
+              <w:top w:w="100" w:type="dxa"/>
+              <w:left w:w="100" w:type="dxa"/>
+              <w:bottom w:w="100" w:type="dxa"/>
+              <w:right w:w="100" w:type="dxa"/>
             </w:tcMar>
             <w:tcBorders>
               <w:top w:val="nil" w:sz="0" w:space="0" w:color="auto"/>
@@ -5088,7 +5088,7 @@
           <w:p>
             <w:pPr>
               <w:widowControl/>
-              <w:spacing w:before="60" w:after="60" w:lineRule="auto" w:line="276"/>
+              <w:spacing w:before="80" w:after="80" w:lineRule="auto" w:line="276"/>
               <w:ind w:firstLine="0"/>
               <w:jc w:val="left"/>
             </w:pPr>
@@ -5099,8 +5099,8 @@
                 <w:b w:val="0"/>
                 <w:i w:val="0"/>
                 <w:color w:val="000000"/>
-                <w:sz w:val="20"/>
-                <w:szCs w:val="20"/>
+                <w:sz w:val="24"/>
+                <w:szCs w:val="24"/>
               </w:rPr>
               <w:t>Shofu, Kyoto</w:t>
             </w:r>
@@ -5116,10 +5116,10 @@
             <w:tcW w:type="dxa" w:w="1644"/>
             <w:vAlign w:val="center"/>
             <w:tcMar>
-              <w:top w:w="80" w:type="dxa"/>
-              <w:left w:w="80" w:type="dxa"/>
-              <w:bottom w:w="80" w:type="dxa"/>
-              <w:right w:w="80" w:type="dxa"/>
+              <w:top w:w="100" w:type="dxa"/>
+              <w:left w:w="100" w:type="dxa"/>
+              <w:bottom w:w="100" w:type="dxa"/>
+              <w:right w:w="100" w:type="dxa"/>
             </w:tcMar>
             <w:tcBorders>
               <w:top w:val="nil" w:sz="0" w:space="0" w:color="auto"/>
@@ -5131,7 +5131,7 @@
           <w:p>
             <w:pPr>
               <w:widowControl/>
-              <w:spacing w:before="60" w:after="60" w:lineRule="auto" w:line="276"/>
+              <w:spacing w:before="80" w:after="80" w:lineRule="auto" w:line="276"/>
               <w:ind w:firstLine="0"/>
               <w:jc w:val="left"/>
             </w:pPr>
@@ -5142,8 +5142,8 @@
                 <w:b w:val="0"/>
                 <w:i w:val="0"/>
                 <w:color w:val="000000"/>
-                <w:sz w:val="20"/>
-                <w:szCs w:val="20"/>
+                <w:sz w:val="24"/>
+                <w:szCs w:val="24"/>
               </w:rPr>
               <w:t>Beautifil II LS (A2)</w:t>
             </w:r>
@@ -5154,10 +5154,10 @@
             <w:tcW w:type="dxa" w:w="1304"/>
             <w:vAlign w:val="center"/>
             <w:tcMar>
-              <w:top w:w="80" w:type="dxa"/>
-              <w:left w:w="80" w:type="dxa"/>
-              <w:bottom w:w="80" w:type="dxa"/>
-              <w:right w:w="80" w:type="dxa"/>
+              <w:top w:w="100" w:type="dxa"/>
+              <w:left w:w="100" w:type="dxa"/>
+              <w:bottom w:w="100" w:type="dxa"/>
+              <w:right w:w="100" w:type="dxa"/>
             </w:tcMar>
             <w:tcBorders>
               <w:top w:val="nil" w:sz="0" w:space="0" w:color="auto"/>
@@ -5169,7 +5169,7 @@
           <w:p>
             <w:pPr>
               <w:widowControl/>
-              <w:spacing w:before="60" w:after="60" w:lineRule="auto" w:line="276"/>
+              <w:spacing w:before="80" w:after="80" w:lineRule="auto" w:line="276"/>
               <w:ind w:firstLine="0"/>
               <w:jc w:val="left"/>
             </w:pPr>
@@ -5180,8 +5180,8 @@
                 <w:b w:val="0"/>
                 <w:i w:val="0"/>
                 <w:color w:val="000000"/>
-                <w:sz w:val="20"/>
-                <w:szCs w:val="20"/>
+                <w:sz w:val="24"/>
+                <w:szCs w:val="24"/>
               </w:rPr>
               <w:t>Nanohybrid conventional giomer</w:t>
             </w:r>
@@ -5192,10 +5192,10 @@
             <w:tcW w:type="dxa" w:w="1928"/>
             <w:vAlign w:val="center"/>
             <w:tcMar>
-              <w:top w:w="80" w:type="dxa"/>
-              <w:left w:w="80" w:type="dxa"/>
-              <w:bottom w:w="80" w:type="dxa"/>
-              <w:right w:w="80" w:type="dxa"/>
+              <w:top w:w="100" w:type="dxa"/>
+              <w:left w:w="100" w:type="dxa"/>
+              <w:bottom w:w="100" w:type="dxa"/>
+              <w:right w:w="100" w:type="dxa"/>
             </w:tcMar>
             <w:tcBorders>
               <w:top w:val="nil" w:sz="0" w:space="0" w:color="auto"/>
@@ -5207,7 +5207,7 @@
           <w:p>
             <w:pPr>
               <w:widowControl/>
-              <w:spacing w:before="60" w:after="60" w:lineRule="auto" w:line="276"/>
+              <w:spacing w:before="80" w:after="80" w:lineRule="auto" w:line="276"/>
               <w:ind w:firstLine="0"/>
               <w:jc w:val="left"/>
             </w:pPr>
@@ -5218,8 +5218,8 @@
                 <w:b w:val="0"/>
                 <w:i w:val="0"/>
                 <w:color w:val="000000"/>
-                <w:sz w:val="20"/>
-                <w:szCs w:val="20"/>
+                <w:sz w:val="24"/>
+                <w:szCs w:val="24"/>
               </w:rPr>
               <w:t>Bis-GMA, UDMA, Bis-EMA, PEGMA, TEGDMA</w:t>
             </w:r>
@@ -5230,10 +5230,10 @@
             <w:tcW w:type="dxa" w:w="1984"/>
             <w:vAlign w:val="center"/>
             <w:tcMar>
-              <w:top w:w="80" w:type="dxa"/>
-              <w:left w:w="80" w:type="dxa"/>
-              <w:bottom w:w="80" w:type="dxa"/>
-              <w:right w:w="80" w:type="dxa"/>
+              <w:top w:w="100" w:type="dxa"/>
+              <w:left w:w="100" w:type="dxa"/>
+              <w:bottom w:w="100" w:type="dxa"/>
+              <w:right w:w="100" w:type="dxa"/>
             </w:tcMar>
             <w:tcBorders>
               <w:top w:val="nil" w:sz="0" w:space="0" w:color="auto"/>
@@ -5245,7 +5245,7 @@
           <w:p>
             <w:pPr>
               <w:widowControl/>
-              <w:spacing w:before="60" w:after="60" w:lineRule="auto" w:line="276"/>
+              <w:spacing w:before="80" w:after="80" w:lineRule="auto" w:line="276"/>
               <w:ind w:firstLine="0"/>
               <w:jc w:val="left"/>
             </w:pPr>
@@ -5256,8 +5256,8 @@
                 <w:b w:val="0"/>
                 <w:i w:val="0"/>
                 <w:color w:val="000000"/>
-                <w:sz w:val="20"/>
-                <w:szCs w:val="20"/>
+                <w:sz w:val="24"/>
+                <w:szCs w:val="24"/>
               </w:rPr>
               <w:t>Multifunctional glass and S-PRG filler</w:t>
             </w:r>
@@ -5268,10 +5268,10 @@
             <w:tcW w:type="dxa" w:w="850"/>
             <w:vAlign w:val="center"/>
             <w:tcMar>
-              <w:top w:w="80" w:type="dxa"/>
-              <w:left w:w="80" w:type="dxa"/>
-              <w:bottom w:w="80" w:type="dxa"/>
-              <w:right w:w="80" w:type="dxa"/>
+              <w:top w:w="100" w:type="dxa"/>
+              <w:left w:w="100" w:type="dxa"/>
+              <w:bottom w:w="100" w:type="dxa"/>
+              <w:right w:w="100" w:type="dxa"/>
             </w:tcMar>
             <w:tcBorders>
               <w:top w:val="nil" w:sz="0" w:space="0" w:color="auto"/>
@@ -5283,7 +5283,7 @@
           <w:p>
             <w:pPr>
               <w:widowControl/>
-              <w:spacing w:before="60" w:after="60" w:lineRule="auto" w:line="276"/>
+              <w:spacing w:before="80" w:after="80" w:lineRule="auto" w:line="276"/>
               <w:ind w:firstLine="0"/>
               <w:jc w:val="center"/>
             </w:pPr>
@@ -5294,8 +5294,8 @@
                 <w:b w:val="0"/>
                 <w:i w:val="0"/>
                 <w:color w:val="000000"/>
-                <w:sz w:val="20"/>
-                <w:szCs w:val="20"/>
+                <w:sz w:val="24"/>
+                <w:szCs w:val="24"/>
               </w:rPr>
               <w:t>68 vol%</w:t>
             </w:r>
@@ -5306,10 +5306,10 @@
             <w:tcW w:type="dxa" w:w="1247"/>
             <w:vAlign w:val="center"/>
             <w:tcMar>
-              <w:top w:w="80" w:type="dxa"/>
-              <w:left w:w="80" w:type="dxa"/>
-              <w:bottom w:w="80" w:type="dxa"/>
-              <w:right w:w="80" w:type="dxa"/>
+              <w:top w:w="100" w:type="dxa"/>
+              <w:left w:w="100" w:type="dxa"/>
+              <w:bottom w:w="100" w:type="dxa"/>
+              <w:right w:w="100" w:type="dxa"/>
             </w:tcMar>
             <w:tcBorders>
               <w:top w:val="nil" w:sz="0" w:space="0" w:color="auto"/>
@@ -5321,7 +5321,7 @@
           <w:p>
             <w:pPr>
               <w:widowControl/>
-              <w:spacing w:before="60" w:after="60" w:lineRule="auto" w:line="276"/>
+              <w:spacing w:before="80" w:after="80" w:lineRule="auto" w:line="276"/>
               <w:ind w:firstLine="0"/>
               <w:jc w:val="left"/>
             </w:pPr>
@@ -5332,8 +5332,8 @@
                 <w:b w:val="0"/>
                 <w:i w:val="0"/>
                 <w:color w:val="000000"/>
-                <w:sz w:val="20"/>
-                <w:szCs w:val="20"/>
+                <w:sz w:val="24"/>
+                <w:szCs w:val="24"/>
               </w:rPr>
               <w:t>Shofu, Kyoto</w:t>
             </w:r>
@@ -5922,7 +5922,7 @@
       <w:pPr>
         <w:keepNext/>
         <w:widowControl/>
-        <w:spacing w:before="280" w:after="160" w:lineRule="auto" w:line="276"/>
+        <w:spacing w:before="320" w:after="200" w:lineRule="auto" w:line="276"/>
         <w:ind w:firstLine="0"/>
         <w:jc w:val="left"/>
       </w:pPr>
@@ -5972,13 +5972,13 @@
         </w:trPr>
         <w:tc>
           <w:tcPr>
-            <w:tcW w:type="dxa" w:w="2381"/>
+            <w:tcW w:type="dxa" w:w="1984"/>
             <w:vAlign w:val="center"/>
             <w:tcMar>
-              <w:top w:w="100" w:type="dxa"/>
-              <w:left w:w="100" w:type="dxa"/>
-              <w:bottom w:w="100" w:type="dxa"/>
-              <w:right w:w="100" w:type="dxa"/>
+              <w:top w:w="120" w:type="dxa"/>
+              <w:left w:w="120" w:type="dxa"/>
+              <w:bottom w:w="120" w:type="dxa"/>
+              <w:right w:w="120" w:type="dxa"/>
             </w:tcMar>
             <w:tcBorders>
               <w:top w:val="single" w:sz="18" w:space="0" w:color="000000"/>
@@ -5990,7 +5990,7 @@
           <w:p>
             <w:pPr>
               <w:widowControl/>
-              <w:spacing w:before="60" w:after="60" w:lineRule="auto" w:line="276"/>
+              <w:spacing w:before="80" w:after="80" w:lineRule="auto" w:line="276"/>
               <w:ind w:firstLine="0"/>
               <w:jc w:val="left"/>
             </w:pPr>
@@ -6001,8 +6001,8 @@
                 <w:b/>
                 <w:i w:val="0"/>
                 <w:color w:val="000000"/>
-                <w:sz w:val="20"/>
-                <w:szCs w:val="20"/>
+                <w:sz w:val="24"/>
+                <w:szCs w:val="24"/>
               </w:rPr>
               <w:t>Composite resin</w:t>
             </w:r>
@@ -6010,13 +6010,13 @@
         </w:tc>
         <w:tc>
           <w:tcPr>
-            <w:tcW w:type="dxa" w:w="1701"/>
+            <w:tcW w:type="dxa" w:w="1871"/>
             <w:vAlign w:val="center"/>
             <w:tcMar>
-              <w:top w:w="100" w:type="dxa"/>
-              <w:left w:w="100" w:type="dxa"/>
-              <w:bottom w:w="100" w:type="dxa"/>
-              <w:right w:w="100" w:type="dxa"/>
+              <w:top w:w="120" w:type="dxa"/>
+              <w:left w:w="120" w:type="dxa"/>
+              <w:bottom w:w="120" w:type="dxa"/>
+              <w:right w:w="120" w:type="dxa"/>
             </w:tcMar>
             <w:tcBorders>
               <w:top w:val="single" w:sz="18" w:space="0" w:color="000000"/>
@@ -6028,7 +6028,7 @@
           <w:p>
             <w:pPr>
               <w:widowControl/>
-              <w:spacing w:before="60" w:after="60" w:lineRule="auto" w:line="276"/>
+              <w:spacing w:before="80" w:after="80" w:lineRule="auto" w:line="276"/>
               <w:ind w:firstLine="0"/>
               <w:jc w:val="center"/>
             </w:pPr>
@@ -6039,8 +6039,8 @@
                 <w:b/>
                 <w:i w:val="0"/>
                 <w:color w:val="000000"/>
-                <w:sz w:val="20"/>
-                <w:szCs w:val="20"/>
+                <w:sz w:val="24"/>
+                <w:szCs w:val="24"/>
               </w:rPr>
               <w:t>Weight before (g)</w:t>
             </w:r>
@@ -6048,7 +6048,7 @@
           <w:p>
             <w:pPr>
               <w:widowControl/>
-              <w:spacing w:before="60" w:after="60" w:lineRule="auto" w:line="276"/>
+              <w:spacing w:before="80" w:after="80" w:lineRule="auto" w:line="276"/>
               <w:ind w:firstLine="0"/>
               <w:jc w:val="center"/>
             </w:pPr>
@@ -6058,8 +6058,8 @@
                 <w:b/>
                 <w:i w:val="0"/>
                 <w:color w:val="000000"/>
-                <w:sz w:val="20"/>
-                <w:szCs w:val="20"/>
+                <w:sz w:val="24"/>
+                <w:szCs w:val="24"/>
               </w:rPr>
               <w:t>Mean ± SD</w:t>
             </w:r>
@@ -6067,13 +6067,13 @@
         </w:tc>
         <w:tc>
           <w:tcPr>
-            <w:tcW w:type="dxa" w:w="1701"/>
+            <w:tcW w:type="dxa" w:w="1871"/>
             <w:vAlign w:val="center"/>
             <w:tcMar>
-              <w:top w:w="100" w:type="dxa"/>
-              <w:left w:w="100" w:type="dxa"/>
-              <w:bottom w:w="100" w:type="dxa"/>
-              <w:right w:w="100" w:type="dxa"/>
+              <w:top w:w="120" w:type="dxa"/>
+              <w:left w:w="120" w:type="dxa"/>
+              <w:bottom w:w="120" w:type="dxa"/>
+              <w:right w:w="120" w:type="dxa"/>
             </w:tcMar>
             <w:tcBorders>
               <w:top w:val="single" w:sz="18" w:space="0" w:color="000000"/>
@@ -6085,7 +6085,7 @@
           <w:p>
             <w:pPr>
               <w:widowControl/>
-              <w:spacing w:before="60" w:after="60" w:lineRule="auto" w:line="276"/>
+              <w:spacing w:before="80" w:after="80" w:lineRule="auto" w:line="276"/>
               <w:ind w:firstLine="0"/>
               <w:jc w:val="center"/>
             </w:pPr>
@@ -6096,8 +6096,8 @@
                 <w:b/>
                 <w:i w:val="0"/>
                 <w:color w:val="000000"/>
-                <w:sz w:val="20"/>
-                <w:szCs w:val="20"/>
+                <w:sz w:val="24"/>
+                <w:szCs w:val="24"/>
               </w:rPr>
               <w:t>Weight after (g)</w:t>
             </w:r>
@@ -6105,7 +6105,7 @@
           <w:p>
             <w:pPr>
               <w:widowControl/>
-              <w:spacing w:before="60" w:after="60" w:lineRule="auto" w:line="276"/>
+              <w:spacing w:before="80" w:after="80" w:lineRule="auto" w:line="276"/>
               <w:ind w:firstLine="0"/>
               <w:jc w:val="center"/>
             </w:pPr>
@@ -6115,8 +6115,8 @@
                 <w:b/>
                 <w:i w:val="0"/>
                 <w:color w:val="000000"/>
-                <w:sz w:val="20"/>
-                <w:szCs w:val="20"/>
+                <w:sz w:val="24"/>
+                <w:szCs w:val="24"/>
               </w:rPr>
               <w:t>Mean ± SD</w:t>
             </w:r>
@@ -6124,13 +6124,13 @@
         </w:tc>
         <w:tc>
           <w:tcPr>
-            <w:tcW w:type="dxa" w:w="1701"/>
+            <w:tcW w:type="dxa" w:w="1871"/>
             <w:vAlign w:val="center"/>
             <w:tcMar>
-              <w:top w:w="100" w:type="dxa"/>
-              <w:left w:w="100" w:type="dxa"/>
-              <w:bottom w:w="100" w:type="dxa"/>
-              <w:right w:w="100" w:type="dxa"/>
+              <w:top w:w="120" w:type="dxa"/>
+              <w:left w:w="120" w:type="dxa"/>
+              <w:bottom w:w="120" w:type="dxa"/>
+              <w:right w:w="120" w:type="dxa"/>
             </w:tcMar>
             <w:tcBorders>
               <w:top w:val="single" w:sz="18" w:space="0" w:color="000000"/>
@@ -6142,7 +6142,7 @@
           <w:p>
             <w:pPr>
               <w:widowControl/>
-              <w:spacing w:before="60" w:after="60" w:lineRule="auto" w:line="276"/>
+              <w:spacing w:before="80" w:after="80" w:lineRule="auto" w:line="276"/>
               <w:ind w:firstLine="0"/>
               <w:jc w:val="center"/>
             </w:pPr>
@@ -6153,8 +6153,8 @@
                 <w:b/>
                 <w:i w:val="0"/>
                 <w:color w:val="000000"/>
-                <w:sz w:val="20"/>
-                <w:szCs w:val="20"/>
+                <w:sz w:val="24"/>
+                <w:szCs w:val="24"/>
               </w:rPr>
               <w:t>Weight loss (%)</w:t>
             </w:r>
@@ -6162,7 +6162,7 @@
           <w:p>
             <w:pPr>
               <w:widowControl/>
-              <w:spacing w:before="60" w:after="60" w:lineRule="auto" w:line="276"/>
+              <w:spacing w:before="80" w:after="80" w:lineRule="auto" w:line="276"/>
               <w:ind w:firstLine="0"/>
               <w:jc w:val="center"/>
             </w:pPr>
@@ -6172,8 +6172,8 @@
                 <w:b/>
                 <w:i w:val="0"/>
                 <w:color w:val="000000"/>
-                <w:sz w:val="20"/>
-                <w:szCs w:val="20"/>
+                <w:sz w:val="24"/>
+                <w:szCs w:val="24"/>
               </w:rPr>
               <w:t>Mean ± SD</w:t>
             </w:r>
@@ -6181,13 +6181,13 @@
         </w:tc>
         <w:tc>
           <w:tcPr>
-            <w:tcW w:type="dxa" w:w="1474"/>
+            <w:tcW w:type="dxa" w:w="1361"/>
             <w:vAlign w:val="center"/>
             <w:tcMar>
-              <w:top w:w="100" w:type="dxa"/>
-              <w:left w:w="100" w:type="dxa"/>
-              <w:bottom w:w="100" w:type="dxa"/>
-              <w:right w:w="100" w:type="dxa"/>
+              <w:top w:w="120" w:type="dxa"/>
+              <w:left w:w="120" w:type="dxa"/>
+              <w:bottom w:w="120" w:type="dxa"/>
+              <w:right w:w="120" w:type="dxa"/>
             </w:tcMar>
             <w:tcBorders>
               <w:top w:val="single" w:sz="18" w:space="0" w:color="000000"/>
@@ -6199,7 +6199,7 @@
           <w:p>
             <w:pPr>
               <w:widowControl/>
-              <w:spacing w:before="60" w:after="60" w:lineRule="auto" w:line="276"/>
+              <w:spacing w:before="80" w:after="80" w:lineRule="auto" w:line="276"/>
               <w:ind w:firstLine="0"/>
               <w:jc w:val="center"/>
             </w:pPr>
@@ -6210,8 +6210,8 @@
                 <w:b/>
                 <w:i w:val="0"/>
                 <w:color w:val="000000"/>
-                <w:sz w:val="20"/>
-                <w:szCs w:val="20"/>
+                <w:sz w:val="24"/>
+                <w:szCs w:val="24"/>
               </w:rPr>
               <w:t>p-value</w:t>
             </w:r>
@@ -6224,13 +6224,13 @@
         </w:trPr>
         <w:tc>
           <w:tcPr>
-            <w:tcW w:type="dxa" w:w="2381"/>
+            <w:tcW w:type="dxa" w:w="1984"/>
             <w:vAlign w:val="center"/>
             <w:tcMar>
-              <w:top w:w="100" w:type="dxa"/>
-              <w:left w:w="100" w:type="dxa"/>
-              <w:bottom w:w="100" w:type="dxa"/>
-              <w:right w:w="100" w:type="dxa"/>
+              <w:top w:w="120" w:type="dxa"/>
+              <w:left w:w="120" w:type="dxa"/>
+              <w:bottom w:w="120" w:type="dxa"/>
+              <w:right w:w="120" w:type="dxa"/>
             </w:tcMar>
             <w:tcBorders>
               <w:top w:val="nil" w:sz="0" w:space="0" w:color="auto"/>
@@ -6242,7 +6242,7 @@
           <w:p>
             <w:pPr>
               <w:widowControl/>
-              <w:spacing w:before="60" w:after="60" w:lineRule="auto" w:line="276"/>
+              <w:spacing w:before="80" w:after="80" w:lineRule="auto" w:line="276"/>
               <w:ind w:firstLine="0"/>
               <w:jc w:val="left"/>
             </w:pPr>
@@ -6253,8 +6253,8 @@
                 <w:b w:val="0"/>
                 <w:i w:val="0"/>
                 <w:color w:val="000000"/>
-                <w:sz w:val="20"/>
-                <w:szCs w:val="20"/>
+                <w:sz w:val="24"/>
+                <w:szCs w:val="24"/>
               </w:rPr>
               <w:t>Beautifil Flow Plus X F00</w:t>
             </w:r>
@@ -6262,13 +6262,13 @@
         </w:tc>
         <w:tc>
           <w:tcPr>
-            <w:tcW w:type="dxa" w:w="1701"/>
+            <w:tcW w:type="dxa" w:w="1871"/>
             <w:vAlign w:val="center"/>
             <w:tcMar>
-              <w:top w:w="100" w:type="dxa"/>
-              <w:left w:w="100" w:type="dxa"/>
-              <w:bottom w:w="100" w:type="dxa"/>
-              <w:right w:w="100" w:type="dxa"/>
+              <w:top w:w="120" w:type="dxa"/>
+              <w:left w:w="120" w:type="dxa"/>
+              <w:bottom w:w="120" w:type="dxa"/>
+              <w:right w:w="120" w:type="dxa"/>
             </w:tcMar>
             <w:tcBorders>
               <w:top w:val="nil" w:sz="0" w:space="0" w:color="auto"/>
@@ -6280,7 +6280,7 @@
           <w:p>
             <w:pPr>
               <w:widowControl/>
-              <w:spacing w:before="60" w:after="60" w:lineRule="auto" w:line="276"/>
+              <w:spacing w:before="80" w:after="80" w:lineRule="auto" w:line="276"/>
               <w:ind w:firstLine="0"/>
               <w:jc w:val="center"/>
             </w:pPr>
@@ -6291,8 +6291,8 @@
                 <w:b w:val="0"/>
                 <w:i w:val="0"/>
                 <w:color w:val="000000"/>
-                <w:sz w:val="20"/>
-                <w:szCs w:val="20"/>
+                <w:sz w:val="24"/>
+                <w:szCs w:val="24"/>
               </w:rPr>
               <w:t>0.1602 ± 0.0074</w:t>
             </w:r>
@@ -6300,13 +6300,13 @@
         </w:tc>
         <w:tc>
           <w:tcPr>
-            <w:tcW w:type="dxa" w:w="1701"/>
+            <w:tcW w:type="dxa" w:w="1871"/>
             <w:vAlign w:val="center"/>
             <w:tcMar>
-              <w:top w:w="100" w:type="dxa"/>
-              <w:left w:w="100" w:type="dxa"/>
-              <w:bottom w:w="100" w:type="dxa"/>
-              <w:right w:w="100" w:type="dxa"/>
+              <w:top w:w="120" w:type="dxa"/>
+              <w:left w:w="120" w:type="dxa"/>
+              <w:bottom w:w="120" w:type="dxa"/>
+              <w:right w:w="120" w:type="dxa"/>
             </w:tcMar>
             <w:tcBorders>
               <w:top w:val="nil" w:sz="0" w:space="0" w:color="auto"/>
@@ -6318,7 +6318,7 @@
           <w:p>
             <w:pPr>
               <w:widowControl/>
-              <w:spacing w:before="60" w:after="60" w:lineRule="auto" w:line="276"/>
+              <w:spacing w:before="80" w:after="80" w:lineRule="auto" w:line="276"/>
               <w:ind w:firstLine="0"/>
               <w:jc w:val="center"/>
             </w:pPr>
@@ -6329,8 +6329,8 @@
                 <w:b w:val="0"/>
                 <w:i w:val="0"/>
                 <w:color w:val="000000"/>
-                <w:sz w:val="20"/>
-                <w:szCs w:val="20"/>
+                <w:sz w:val="24"/>
+                <w:szCs w:val="24"/>
               </w:rPr>
               <w:t>0.1576 ± 0.0031</w:t>
             </w:r>
@@ -6338,13 +6338,13 @@
         </w:tc>
         <w:tc>
           <w:tcPr>
-            <w:tcW w:type="dxa" w:w="1701"/>
+            <w:tcW w:type="dxa" w:w="1871"/>
             <w:vAlign w:val="center"/>
             <w:tcMar>
-              <w:top w:w="100" w:type="dxa"/>
-              <w:left w:w="100" w:type="dxa"/>
-              <w:bottom w:w="100" w:type="dxa"/>
-              <w:right w:w="100" w:type="dxa"/>
+              <w:top w:w="120" w:type="dxa"/>
+              <w:left w:w="120" w:type="dxa"/>
+              <w:bottom w:w="120" w:type="dxa"/>
+              <w:right w:w="120" w:type="dxa"/>
             </w:tcMar>
             <w:tcBorders>
               <w:top w:val="nil" w:sz="0" w:space="0" w:color="auto"/>
@@ -6356,7 +6356,7 @@
           <w:p>
             <w:pPr>
               <w:widowControl/>
-              <w:spacing w:before="60" w:after="60" w:lineRule="auto" w:line="276"/>
+              <w:spacing w:before="80" w:after="80" w:lineRule="auto" w:line="276"/>
               <w:ind w:firstLine="0"/>
               <w:jc w:val="center"/>
             </w:pPr>
@@ -6367,8 +6367,8 @@
                 <w:b w:val="0"/>
                 <w:i w:val="0"/>
                 <w:color w:val="000000"/>
-                <w:sz w:val="20"/>
-                <w:szCs w:val="20"/>
+                <w:sz w:val="24"/>
+                <w:szCs w:val="24"/>
               </w:rPr>
               <w:t>1.49 ± 3.14</w:t>
             </w:r>
@@ -6376,13 +6376,13 @@
         </w:tc>
         <w:tc>
           <w:tcPr>
-            <w:tcW w:type="dxa" w:w="1474"/>
+            <w:tcW w:type="dxa" w:w="1361"/>
             <w:vAlign w:val="center"/>
             <w:tcMar>
-              <w:top w:w="100" w:type="dxa"/>
-              <w:left w:w="100" w:type="dxa"/>
-              <w:bottom w:w="100" w:type="dxa"/>
-              <w:right w:w="100" w:type="dxa"/>
+              <w:top w:w="120" w:type="dxa"/>
+              <w:left w:w="120" w:type="dxa"/>
+              <w:bottom w:w="120" w:type="dxa"/>
+              <w:right w:w="120" w:type="dxa"/>
             </w:tcMar>
             <w:vMerge w:val="restart"/>
             <w:tcBorders>
@@ -6392,16 +6392,16 @@
               <w:right w:val="nil" w:sz="0" w:space="0" w:color="auto"/>
             </w:tcBorders>
             <w:tcMar>
-              <w:top w:w="100" w:type="dxa"/>
-              <w:left w:w="100" w:type="dxa"/>
-              <w:bottom w:w="100" w:type="dxa"/>
-              <w:right w:w="100" w:type="dxa"/>
+              <w:top w:w="120" w:type="dxa"/>
+              <w:left w:w="120" w:type="dxa"/>
+              <w:bottom w:w="120" w:type="dxa"/>
+              <w:right w:w="120" w:type="dxa"/>
             </w:tcMar>
           </w:tcPr>
           <w:p>
             <w:pPr>
               <w:widowControl/>
-              <w:spacing w:before="60" w:after="60" w:lineRule="auto" w:line="276"/>
+              <w:spacing w:before="80" w:after="80" w:lineRule="auto" w:line="276"/>
               <w:ind w:firstLine="0"/>
               <w:jc w:val="center"/>
             </w:pPr>
@@ -6412,8 +6412,8 @@
                 <w:b w:val="0"/>
                 <w:i w:val="0"/>
                 <w:color w:val="000000"/>
-                <w:sz w:val="20"/>
-                <w:szCs w:val="20"/>
+                <w:sz w:val="24"/>
+                <w:szCs w:val="24"/>
               </w:rPr>
               <w:t>0.329†</w:t>
             </w:r>
@@ -6426,13 +6426,13 @@
         </w:trPr>
         <w:tc>
           <w:tcPr>
-            <w:tcW w:type="dxa" w:w="2381"/>
+            <w:tcW w:type="dxa" w:w="1984"/>
             <w:vAlign w:val="center"/>
             <w:tcMar>
-              <w:top w:w="100" w:type="dxa"/>
-              <w:left w:w="100" w:type="dxa"/>
-              <w:bottom w:w="100" w:type="dxa"/>
-              <w:right w:w="100" w:type="dxa"/>
+              <w:top w:w="120" w:type="dxa"/>
+              <w:left w:w="120" w:type="dxa"/>
+              <w:bottom w:w="120" w:type="dxa"/>
+              <w:right w:w="120" w:type="dxa"/>
             </w:tcMar>
             <w:tcBorders>
               <w:top w:val="nil" w:sz="0" w:space="0" w:color="auto"/>
@@ -6444,7 +6444,7 @@
           <w:p>
             <w:pPr>
               <w:widowControl/>
-              <w:spacing w:before="60" w:after="60" w:lineRule="auto" w:line="276"/>
+              <w:spacing w:before="80" w:after="80" w:lineRule="auto" w:line="276"/>
               <w:ind w:firstLine="0"/>
               <w:jc w:val="left"/>
             </w:pPr>
@@ -6455,8 +6455,8 @@
                 <w:b w:val="0"/>
                 <w:i w:val="0"/>
                 <w:color w:val="000000"/>
-                <w:sz w:val="20"/>
-                <w:szCs w:val="20"/>
+                <w:sz w:val="24"/>
+                <w:szCs w:val="24"/>
               </w:rPr>
               <w:t>G-ænial Universal Injectable</w:t>
             </w:r>
@@ -6464,13 +6464,13 @@
         </w:tc>
         <w:tc>
           <w:tcPr>
-            <w:tcW w:type="dxa" w:w="1701"/>
+            <w:tcW w:type="dxa" w:w="1871"/>
             <w:vAlign w:val="center"/>
             <w:tcMar>
-              <w:top w:w="100" w:type="dxa"/>
-              <w:left w:w="100" w:type="dxa"/>
-              <w:bottom w:w="100" w:type="dxa"/>
-              <w:right w:w="100" w:type="dxa"/>
+              <w:top w:w="120" w:type="dxa"/>
+              <w:left w:w="120" w:type="dxa"/>
+              <w:bottom w:w="120" w:type="dxa"/>
+              <w:right w:w="120" w:type="dxa"/>
             </w:tcMar>
             <w:tcBorders>
               <w:top w:val="nil" w:sz="0" w:space="0" w:color="auto"/>
@@ -6482,7 +6482,7 @@
           <w:p>
             <w:pPr>
               <w:widowControl/>
-              <w:spacing w:before="60" w:after="60" w:lineRule="auto" w:line="276"/>
+              <w:spacing w:before="80" w:after="80" w:lineRule="auto" w:line="276"/>
               <w:ind w:firstLine="0"/>
               <w:jc w:val="center"/>
             </w:pPr>
@@ -6493,8 +6493,8 @@
                 <w:b w:val="0"/>
                 <w:i w:val="0"/>
                 <w:color w:val="000000"/>
-                <w:sz w:val="20"/>
-                <w:szCs w:val="20"/>
+                <w:sz w:val="24"/>
+                <w:szCs w:val="24"/>
               </w:rPr>
               <w:t>0.1630 ± 0.0102</w:t>
             </w:r>
@@ -6502,13 +6502,13 @@
         </w:tc>
         <w:tc>
           <w:tcPr>
-            <w:tcW w:type="dxa" w:w="1701"/>
+            <w:tcW w:type="dxa" w:w="1871"/>
             <w:vAlign w:val="center"/>
             <w:tcMar>
-              <w:top w:w="100" w:type="dxa"/>
-              <w:left w:w="100" w:type="dxa"/>
-              <w:bottom w:w="100" w:type="dxa"/>
-              <w:right w:w="100" w:type="dxa"/>
+              <w:top w:w="120" w:type="dxa"/>
+              <w:left w:w="120" w:type="dxa"/>
+              <w:bottom w:w="120" w:type="dxa"/>
+              <w:right w:w="120" w:type="dxa"/>
             </w:tcMar>
             <w:tcBorders>
               <w:top w:val="nil" w:sz="0" w:space="0" w:color="auto"/>
@@ -6520,7 +6520,7 @@
           <w:p>
             <w:pPr>
               <w:widowControl/>
-              <w:spacing w:before="60" w:after="60" w:lineRule="auto" w:line="276"/>
+              <w:spacing w:before="80" w:after="80" w:lineRule="auto" w:line="276"/>
               <w:ind w:firstLine="0"/>
               <w:jc w:val="center"/>
             </w:pPr>
@@ -6531,8 +6531,8 @@
                 <w:b w:val="0"/>
                 <w:i w:val="0"/>
                 <w:color w:val="000000"/>
-                <w:sz w:val="20"/>
-                <w:szCs w:val="20"/>
+                <w:sz w:val="24"/>
+                <w:szCs w:val="24"/>
               </w:rPr>
               <w:t>0.1619 ± 0.0106</w:t>
             </w:r>
@@ -6540,13 +6540,13 @@
         </w:tc>
         <w:tc>
           <w:tcPr>
-            <w:tcW w:type="dxa" w:w="1701"/>
+            <w:tcW w:type="dxa" w:w="1871"/>
             <w:vAlign w:val="center"/>
             <w:tcMar>
-              <w:top w:w="100" w:type="dxa"/>
-              <w:left w:w="100" w:type="dxa"/>
-              <w:bottom w:w="100" w:type="dxa"/>
-              <w:right w:w="100" w:type="dxa"/>
+              <w:top w:w="120" w:type="dxa"/>
+              <w:left w:w="120" w:type="dxa"/>
+              <w:bottom w:w="120" w:type="dxa"/>
+              <w:right w:w="120" w:type="dxa"/>
             </w:tcMar>
             <w:tcBorders>
               <w:top w:val="nil" w:sz="0" w:space="0" w:color="auto"/>
@@ -6558,7 +6558,7 @@
           <w:p>
             <w:pPr>
               <w:widowControl/>
-              <w:spacing w:before="60" w:after="60" w:lineRule="auto" w:line="276"/>
+              <w:spacing w:before="80" w:after="80" w:lineRule="auto" w:line="276"/>
               <w:ind w:firstLine="0"/>
               <w:jc w:val="center"/>
             </w:pPr>
@@ -6569,8 +6569,8 @@
                 <w:b w:val="0"/>
                 <w:i w:val="0"/>
                 <w:color w:val="000000"/>
-                <w:sz w:val="20"/>
-                <w:szCs w:val="20"/>
+                <w:sz w:val="24"/>
+                <w:szCs w:val="24"/>
               </w:rPr>
               <w:t>0.65 ± 0.37</w:t>
             </w:r>
@@ -6578,13 +6578,13 @@
         </w:tc>
         <w:tc>
           <w:tcPr>
-            <w:tcW w:type="dxa" w:w="1474"/>
+            <w:tcW w:type="dxa" w:w="1361"/>
             <w:vAlign w:val="center"/>
             <w:tcMar>
-              <w:top w:w="100" w:type="dxa"/>
-              <w:left w:w="100" w:type="dxa"/>
-              <w:bottom w:w="100" w:type="dxa"/>
-              <w:right w:w="100" w:type="dxa"/>
+              <w:top w:w="120" w:type="dxa"/>
+              <w:left w:w="120" w:type="dxa"/>
+              <w:bottom w:w="120" w:type="dxa"/>
+              <w:right w:w="120" w:type="dxa"/>
             </w:tcMar>
             <w:vMerge/>
             <w:tcBorders>
@@ -6603,13 +6603,13 @@
         </w:trPr>
         <w:tc>
           <w:tcPr>
-            <w:tcW w:type="dxa" w:w="2381"/>
+            <w:tcW w:type="dxa" w:w="1984"/>
             <w:vAlign w:val="center"/>
             <w:tcMar>
-              <w:top w:w="100" w:type="dxa"/>
-              <w:left w:w="100" w:type="dxa"/>
-              <w:bottom w:w="100" w:type="dxa"/>
-              <w:right w:w="100" w:type="dxa"/>
+              <w:top w:w="120" w:type="dxa"/>
+              <w:left w:w="120" w:type="dxa"/>
+              <w:bottom w:w="120" w:type="dxa"/>
+              <w:right w:w="120" w:type="dxa"/>
             </w:tcMar>
             <w:tcBorders>
               <w:top w:val="nil" w:sz="0" w:space="0" w:color="auto"/>
@@ -6621,7 +6621,7 @@
           <w:p>
             <w:pPr>
               <w:widowControl/>
-              <w:spacing w:before="60" w:after="60" w:lineRule="auto" w:line="276"/>
+              <w:spacing w:before="80" w:after="80" w:lineRule="auto" w:line="276"/>
               <w:ind w:firstLine="0"/>
               <w:jc w:val="left"/>
             </w:pPr>
@@ -6632,8 +6632,8 @@
                 <w:b w:val="0"/>
                 <w:i w:val="0"/>
                 <w:color w:val="000000"/>
-                <w:sz w:val="20"/>
-                <w:szCs w:val="20"/>
+                <w:sz w:val="24"/>
+                <w:szCs w:val="24"/>
               </w:rPr>
               <w:t>Beautifil II LS</w:t>
             </w:r>
@@ -6641,13 +6641,13 @@
         </w:tc>
         <w:tc>
           <w:tcPr>
-            <w:tcW w:type="dxa" w:w="1701"/>
+            <w:tcW w:type="dxa" w:w="1871"/>
             <w:vAlign w:val="center"/>
             <w:tcMar>
-              <w:top w:w="100" w:type="dxa"/>
-              <w:left w:w="100" w:type="dxa"/>
-              <w:bottom w:w="100" w:type="dxa"/>
-              <w:right w:w="100" w:type="dxa"/>
+              <w:top w:w="120" w:type="dxa"/>
+              <w:left w:w="120" w:type="dxa"/>
+              <w:bottom w:w="120" w:type="dxa"/>
+              <w:right w:w="120" w:type="dxa"/>
             </w:tcMar>
             <w:tcBorders>
               <w:top w:val="nil" w:sz="0" w:space="0" w:color="auto"/>
@@ -6659,7 +6659,7 @@
           <w:p>
             <w:pPr>
               <w:widowControl/>
-              <w:spacing w:before="60" w:after="60" w:lineRule="auto" w:line="276"/>
+              <w:spacing w:before="80" w:after="80" w:lineRule="auto" w:line="276"/>
               <w:ind w:firstLine="0"/>
               <w:jc w:val="center"/>
             </w:pPr>
@@ -6670,8 +6670,8 @@
                 <w:b w:val="0"/>
                 <w:i w:val="0"/>
                 <w:color w:val="000000"/>
-                <w:sz w:val="20"/>
-                <w:szCs w:val="20"/>
+                <w:sz w:val="24"/>
+                <w:szCs w:val="24"/>
               </w:rPr>
               <w:t>0.2313 ± 0.0154</w:t>
             </w:r>
@@ -6679,13 +6679,13 @@
         </w:tc>
         <w:tc>
           <w:tcPr>
-            <w:tcW w:type="dxa" w:w="1701"/>
+            <w:tcW w:type="dxa" w:w="1871"/>
             <w:vAlign w:val="center"/>
             <w:tcMar>
-              <w:top w:w="100" w:type="dxa"/>
-              <w:left w:w="100" w:type="dxa"/>
-              <w:bottom w:w="100" w:type="dxa"/>
-              <w:right w:w="100" w:type="dxa"/>
+              <w:top w:w="120" w:type="dxa"/>
+              <w:left w:w="120" w:type="dxa"/>
+              <w:bottom w:w="120" w:type="dxa"/>
+              <w:right w:w="120" w:type="dxa"/>
             </w:tcMar>
             <w:tcBorders>
               <w:top w:val="nil" w:sz="0" w:space="0" w:color="auto"/>
@@ -6697,7 +6697,7 @@
           <w:p>
             <w:pPr>
               <w:widowControl/>
-              <w:spacing w:before="60" w:after="60" w:lineRule="auto" w:line="276"/>
+              <w:spacing w:before="80" w:after="80" w:lineRule="auto" w:line="276"/>
               <w:ind w:firstLine="0"/>
               <w:jc w:val="center"/>
             </w:pPr>
@@ -6708,8 +6708,8 @@
                 <w:b w:val="0"/>
                 <w:i w:val="0"/>
                 <w:color w:val="000000"/>
-                <w:sz w:val="20"/>
-                <w:szCs w:val="20"/>
+                <w:sz w:val="24"/>
+                <w:szCs w:val="24"/>
               </w:rPr>
               <w:t>0.2303 ± 0.0156</w:t>
             </w:r>
@@ -6717,13 +6717,13 @@
         </w:tc>
         <w:tc>
           <w:tcPr>
-            <w:tcW w:type="dxa" w:w="1701"/>
+            <w:tcW w:type="dxa" w:w="1871"/>
             <w:vAlign w:val="center"/>
             <w:tcMar>
-              <w:top w:w="100" w:type="dxa"/>
-              <w:left w:w="100" w:type="dxa"/>
-              <w:bottom w:w="100" w:type="dxa"/>
-              <w:right w:w="100" w:type="dxa"/>
+              <w:top w:w="120" w:type="dxa"/>
+              <w:left w:w="120" w:type="dxa"/>
+              <w:bottom w:w="120" w:type="dxa"/>
+              <w:right w:w="120" w:type="dxa"/>
             </w:tcMar>
             <w:tcBorders>
               <w:top w:val="nil" w:sz="0" w:space="0" w:color="auto"/>
@@ -6735,7 +6735,7 @@
           <w:p>
             <w:pPr>
               <w:widowControl/>
-              <w:spacing w:before="60" w:after="60" w:lineRule="auto" w:line="276"/>
+              <w:spacing w:before="80" w:after="80" w:lineRule="auto" w:line="276"/>
               <w:ind w:firstLine="0"/>
               <w:jc w:val="center"/>
             </w:pPr>
@@ -6746,8 +6746,8 @@
                 <w:b w:val="0"/>
                 <w:i w:val="0"/>
                 <w:color w:val="000000"/>
-                <w:sz w:val="20"/>
-                <w:szCs w:val="20"/>
+                <w:sz w:val="24"/>
+                <w:szCs w:val="24"/>
               </w:rPr>
               <w:t>0.41 ± 0.25</w:t>
             </w:r>
@@ -6755,13 +6755,13 @@
         </w:tc>
         <w:tc>
           <w:tcPr>
-            <w:tcW w:type="dxa" w:w="1474"/>
+            <w:tcW w:type="dxa" w:w="1361"/>
             <w:vAlign w:val="center"/>
             <w:tcMar>
-              <w:top w:w="100" w:type="dxa"/>
-              <w:left w:w="100" w:type="dxa"/>
-              <w:bottom w:w="100" w:type="dxa"/>
-              <w:right w:w="100" w:type="dxa"/>
+              <w:top w:w="120" w:type="dxa"/>
+              <w:left w:w="120" w:type="dxa"/>
+              <w:bottom w:w="120" w:type="dxa"/>
+              <w:right w:w="120" w:type="dxa"/>
             </w:tcMar>
             <w:vMerge/>
             <w:tcBorders>
@@ -6848,7 +6848,7 @@
       <w:pPr>
         <w:keepNext/>
         <w:widowControl/>
-        <w:spacing w:before="280" w:after="160" w:lineRule="auto" w:line="276"/>
+        <w:spacing w:before="320" w:after="200" w:lineRule="auto" w:line="276"/>
         <w:ind w:firstLine="0"/>
         <w:jc w:val="left"/>
       </w:pPr>
@@ -6936,7 +6936,7 @@
       <w:pPr>
         <w:keepNext/>
         <w:widowControl/>
-        <w:spacing w:before="280" w:after="160" w:lineRule="auto" w:line="276"/>
+        <w:spacing w:before="320" w:after="200" w:lineRule="auto" w:line="276"/>
         <w:ind w:firstLine="0"/>
         <w:jc w:val="left"/>
       </w:pPr>
@@ -6984,13 +6984,13 @@
         </w:trPr>
         <w:tc>
           <w:tcPr>
-            <w:tcW w:type="dxa" w:w="3515"/>
+            <w:tcW w:type="dxa" w:w="3402"/>
             <w:vAlign w:val="center"/>
             <w:tcMar>
-              <w:top w:w="100" w:type="dxa"/>
-              <w:left w:w="100" w:type="dxa"/>
-              <w:bottom w:w="100" w:type="dxa"/>
-              <w:right w:w="100" w:type="dxa"/>
+              <w:top w:w="120" w:type="dxa"/>
+              <w:left w:w="120" w:type="dxa"/>
+              <w:bottom w:w="120" w:type="dxa"/>
+              <w:right w:w="120" w:type="dxa"/>
             </w:tcMar>
             <w:tcBorders>
               <w:top w:val="single" w:sz="18" w:space="0" w:color="000000"/>
@@ -7002,7 +7002,7 @@
           <w:p>
             <w:pPr>
               <w:widowControl/>
-              <w:spacing w:before="60" w:after="60" w:lineRule="auto" w:line="276"/>
+              <w:spacing w:before="80" w:after="80" w:lineRule="auto" w:line="276"/>
               <w:ind w:firstLine="0"/>
               <w:jc w:val="left"/>
             </w:pPr>
@@ -7013,8 +7013,8 @@
                 <w:b/>
                 <w:i w:val="0"/>
                 <w:color w:val="000000"/>
-                <w:sz w:val="20"/>
-                <w:szCs w:val="20"/>
+                <w:sz w:val="24"/>
+                <w:szCs w:val="24"/>
               </w:rPr>
               <w:t>Composite resin</w:t>
             </w:r>
@@ -7022,13 +7022,13 @@
         </w:tc>
         <w:tc>
           <w:tcPr>
-            <w:tcW w:type="dxa" w:w="3061"/>
+            <w:tcW w:type="dxa" w:w="3288"/>
             <w:vAlign w:val="center"/>
             <w:tcMar>
-              <w:top w:w="100" w:type="dxa"/>
-              <w:left w:w="100" w:type="dxa"/>
-              <w:bottom w:w="100" w:type="dxa"/>
-              <w:right w:w="100" w:type="dxa"/>
+              <w:top w:w="120" w:type="dxa"/>
+              <w:left w:w="120" w:type="dxa"/>
+              <w:bottom w:w="120" w:type="dxa"/>
+              <w:right w:w="120" w:type="dxa"/>
             </w:tcMar>
             <w:tcBorders>
               <w:top w:val="single" w:sz="18" w:space="0" w:color="000000"/>
@@ -7040,7 +7040,7 @@
           <w:p>
             <w:pPr>
               <w:widowControl/>
-              <w:spacing w:before="60" w:after="60" w:lineRule="auto" w:line="276"/>
+              <w:spacing w:before="80" w:after="80" w:lineRule="auto" w:line="276"/>
               <w:ind w:firstLine="0"/>
               <w:jc w:val="center"/>
             </w:pPr>
@@ -7051,8 +7051,8 @@
                 <w:b/>
                 <w:i w:val="0"/>
                 <w:color w:val="000000"/>
-                <w:sz w:val="20"/>
-                <w:szCs w:val="20"/>
+                <w:sz w:val="24"/>
+                <w:szCs w:val="24"/>
               </w:rPr>
               <w:t>Absolute weight loss (mg)</w:t>
             </w:r>
@@ -7060,7 +7060,7 @@
           <w:p>
             <w:pPr>
               <w:widowControl/>
-              <w:spacing w:before="60" w:after="60" w:lineRule="auto" w:line="276"/>
+              <w:spacing w:before="80" w:after="80" w:lineRule="auto" w:line="276"/>
               <w:ind w:firstLine="0"/>
               <w:jc w:val="center"/>
             </w:pPr>
@@ -7070,8 +7070,8 @@
                 <w:b/>
                 <w:i w:val="0"/>
                 <w:color w:val="000000"/>
-                <w:sz w:val="20"/>
-                <w:szCs w:val="20"/>
+                <w:sz w:val="24"/>
+                <w:szCs w:val="24"/>
               </w:rPr>
               <w:t>Mean ± SD</w:t>
             </w:r>
@@ -7079,13 +7079,13 @@
         </w:tc>
         <w:tc>
           <w:tcPr>
-            <w:tcW w:type="dxa" w:w="2381"/>
+            <w:tcW w:type="dxa" w:w="2268"/>
             <w:vAlign w:val="center"/>
             <w:tcMar>
-              <w:top w:w="100" w:type="dxa"/>
-              <w:left w:w="100" w:type="dxa"/>
-              <w:bottom w:w="100" w:type="dxa"/>
-              <w:right w:w="100" w:type="dxa"/>
+              <w:top w:w="120" w:type="dxa"/>
+              <w:left w:w="120" w:type="dxa"/>
+              <w:bottom w:w="120" w:type="dxa"/>
+              <w:right w:w="120" w:type="dxa"/>
             </w:tcMar>
             <w:tcBorders>
               <w:top w:val="single" w:sz="18" w:space="0" w:color="000000"/>
@@ -7097,7 +7097,7 @@
           <w:p>
             <w:pPr>
               <w:widowControl/>
-              <w:spacing w:before="60" w:after="60" w:lineRule="auto" w:line="276"/>
+              <w:spacing w:before="80" w:after="80" w:lineRule="auto" w:line="276"/>
               <w:ind w:firstLine="0"/>
               <w:jc w:val="center"/>
             </w:pPr>
@@ -7108,8 +7108,8 @@
                 <w:b/>
                 <w:i w:val="0"/>
                 <w:color w:val="000000"/>
-                <w:sz w:val="20"/>
-                <w:szCs w:val="20"/>
+                <w:sz w:val="24"/>
+                <w:szCs w:val="24"/>
               </w:rPr>
               <w:t>Range (mg)</w:t>
             </w:r>
@@ -7122,13 +7122,13 @@
         </w:trPr>
         <w:tc>
           <w:tcPr>
-            <w:tcW w:type="dxa" w:w="3515"/>
+            <w:tcW w:type="dxa" w:w="3402"/>
             <w:vAlign w:val="center"/>
             <w:tcMar>
-              <w:top w:w="100" w:type="dxa"/>
-              <w:left w:w="100" w:type="dxa"/>
-              <w:bottom w:w="100" w:type="dxa"/>
-              <w:right w:w="100" w:type="dxa"/>
+              <w:top w:w="120" w:type="dxa"/>
+              <w:left w:w="120" w:type="dxa"/>
+              <w:bottom w:w="120" w:type="dxa"/>
+              <w:right w:w="120" w:type="dxa"/>
             </w:tcMar>
             <w:tcBorders>
               <w:top w:val="nil" w:sz="0" w:space="0" w:color="auto"/>
@@ -7140,7 +7140,7 @@
           <w:p>
             <w:pPr>
               <w:widowControl/>
-              <w:spacing w:before="60" w:after="60" w:lineRule="auto" w:line="276"/>
+              <w:spacing w:before="80" w:after="80" w:lineRule="auto" w:line="276"/>
               <w:ind w:firstLine="0"/>
               <w:jc w:val="left"/>
             </w:pPr>
@@ -7151,8 +7151,8 @@
                 <w:b w:val="0"/>
                 <w:i w:val="0"/>
                 <w:color w:val="000000"/>
-                <w:sz w:val="20"/>
-                <w:szCs w:val="20"/>
+                <w:sz w:val="24"/>
+                <w:szCs w:val="24"/>
               </w:rPr>
               <w:t>Beautifil Flow Plus X F00</w:t>
             </w:r>
@@ -7160,13 +7160,13 @@
         </w:tc>
         <w:tc>
           <w:tcPr>
-            <w:tcW w:type="dxa" w:w="3061"/>
+            <w:tcW w:type="dxa" w:w="3288"/>
             <w:vAlign w:val="center"/>
             <w:tcMar>
-              <w:top w:w="100" w:type="dxa"/>
-              <w:left w:w="100" w:type="dxa"/>
-              <w:bottom w:w="100" w:type="dxa"/>
-              <w:right w:w="100" w:type="dxa"/>
+              <w:top w:w="120" w:type="dxa"/>
+              <w:left w:w="120" w:type="dxa"/>
+              <w:bottom w:w="120" w:type="dxa"/>
+              <w:right w:w="120" w:type="dxa"/>
             </w:tcMar>
             <w:tcBorders>
               <w:top w:val="nil" w:sz="0" w:space="0" w:color="auto"/>
@@ -7178,7 +7178,7 @@
           <w:p>
             <w:pPr>
               <w:widowControl/>
-              <w:spacing w:before="60" w:after="60" w:lineRule="auto" w:line="276"/>
+              <w:spacing w:before="80" w:after="80" w:lineRule="auto" w:line="276"/>
               <w:ind w:firstLine="0"/>
               <w:jc w:val="center"/>
             </w:pPr>
@@ -7189,8 +7189,8 @@
                 <w:b w:val="0"/>
                 <w:i w:val="0"/>
                 <w:color w:val="000000"/>
-                <w:sz w:val="20"/>
-                <w:szCs w:val="20"/>
+                <w:sz w:val="24"/>
+                <w:szCs w:val="24"/>
               </w:rPr>
               <w:t>2.58 ± 5.91</w:t>
             </w:r>
@@ -7198,13 +7198,13 @@
         </w:tc>
         <w:tc>
           <w:tcPr>
-            <w:tcW w:type="dxa" w:w="2381"/>
+            <w:tcW w:type="dxa" w:w="2268"/>
             <w:vAlign w:val="center"/>
             <w:tcMar>
-              <w:top w:w="100" w:type="dxa"/>
-              <w:left w:w="100" w:type="dxa"/>
-              <w:bottom w:w="100" w:type="dxa"/>
-              <w:right w:w="100" w:type="dxa"/>
+              <w:top w:w="120" w:type="dxa"/>
+              <w:left w:w="120" w:type="dxa"/>
+              <w:bottom w:w="120" w:type="dxa"/>
+              <w:right w:w="120" w:type="dxa"/>
             </w:tcMar>
             <w:tcBorders>
               <w:top w:val="nil" w:sz="0" w:space="0" w:color="auto"/>
@@ -7216,7 +7216,7 @@
           <w:p>
             <w:pPr>
               <w:widowControl/>
-              <w:spacing w:before="60" w:after="60" w:lineRule="auto" w:line="276"/>
+              <w:spacing w:before="80" w:after="80" w:lineRule="auto" w:line="276"/>
               <w:ind w:firstLine="0"/>
               <w:jc w:val="center"/>
             </w:pPr>
@@ -7227,8 +7227,8 @@
                 <w:b w:val="0"/>
                 <w:i w:val="0"/>
                 <w:color w:val="000000"/>
-                <w:sz w:val="20"/>
-                <w:szCs w:val="20"/>
+                <w:sz w:val="24"/>
+                <w:szCs w:val="24"/>
               </w:rPr>
               <w:t>0.2 – 20.7</w:t>
             </w:r>
@@ -7241,13 +7241,13 @@
         </w:trPr>
         <w:tc>
           <w:tcPr>
-            <w:tcW w:type="dxa" w:w="3515"/>
+            <w:tcW w:type="dxa" w:w="3402"/>
             <w:vAlign w:val="center"/>
             <w:tcMar>
-              <w:top w:w="100" w:type="dxa"/>
-              <w:left w:w="100" w:type="dxa"/>
-              <w:bottom w:w="100" w:type="dxa"/>
-              <w:right w:w="100" w:type="dxa"/>
+              <w:top w:w="120" w:type="dxa"/>
+              <w:left w:w="120" w:type="dxa"/>
+              <w:bottom w:w="120" w:type="dxa"/>
+              <w:right w:w="120" w:type="dxa"/>
             </w:tcMar>
             <w:tcBorders>
               <w:top w:val="nil" w:sz="0" w:space="0" w:color="auto"/>
@@ -7259,7 +7259,7 @@
           <w:p>
             <w:pPr>
               <w:widowControl/>
-              <w:spacing w:before="60" w:after="60" w:lineRule="auto" w:line="276"/>
+              <w:spacing w:before="80" w:after="80" w:lineRule="auto" w:line="276"/>
               <w:ind w:firstLine="0"/>
               <w:jc w:val="left"/>
             </w:pPr>
@@ -7270,8 +7270,8 @@
                 <w:b w:val="0"/>
                 <w:i w:val="0"/>
                 <w:color w:val="000000"/>
-                <w:sz w:val="20"/>
-                <w:szCs w:val="20"/>
+                <w:sz w:val="24"/>
+                <w:szCs w:val="24"/>
               </w:rPr>
               <w:t>G-ænial Universal Injectable</w:t>
             </w:r>
@@ -7279,13 +7279,13 @@
         </w:tc>
         <w:tc>
           <w:tcPr>
-            <w:tcW w:type="dxa" w:w="3061"/>
+            <w:tcW w:type="dxa" w:w="3288"/>
             <w:vAlign w:val="center"/>
             <w:tcMar>
-              <w:top w:w="100" w:type="dxa"/>
-              <w:left w:w="100" w:type="dxa"/>
-              <w:bottom w:w="100" w:type="dxa"/>
-              <w:right w:w="100" w:type="dxa"/>
+              <w:top w:w="120" w:type="dxa"/>
+              <w:left w:w="120" w:type="dxa"/>
+              <w:bottom w:w="120" w:type="dxa"/>
+              <w:right w:w="120" w:type="dxa"/>
             </w:tcMar>
             <w:tcBorders>
               <w:top w:val="nil" w:sz="0" w:space="0" w:color="auto"/>
@@ -7297,7 +7297,7 @@
           <w:p>
             <w:pPr>
               <w:widowControl/>
-              <w:spacing w:before="60" w:after="60" w:lineRule="auto" w:line="276"/>
+              <w:spacing w:before="80" w:after="80" w:lineRule="auto" w:line="276"/>
               <w:ind w:firstLine="0"/>
               <w:jc w:val="center"/>
             </w:pPr>
@@ -7308,8 +7308,8 @@
                 <w:b w:val="0"/>
                 <w:i w:val="0"/>
                 <w:color w:val="000000"/>
-                <w:sz w:val="20"/>
-                <w:szCs w:val="20"/>
+                <w:sz w:val="24"/>
+                <w:szCs w:val="24"/>
               </w:rPr>
               <w:t>1.07 ± 0.62</w:t>
             </w:r>
@@ -7317,13 +7317,13 @@
         </w:tc>
         <w:tc>
           <w:tcPr>
-            <w:tcW w:type="dxa" w:w="2381"/>
+            <w:tcW w:type="dxa" w:w="2268"/>
             <w:vAlign w:val="center"/>
             <w:tcMar>
-              <w:top w:w="100" w:type="dxa"/>
-              <w:left w:w="100" w:type="dxa"/>
-              <w:bottom w:w="100" w:type="dxa"/>
-              <w:right w:w="100" w:type="dxa"/>
+              <w:top w:w="120" w:type="dxa"/>
+              <w:left w:w="120" w:type="dxa"/>
+              <w:bottom w:w="120" w:type="dxa"/>
+              <w:right w:w="120" w:type="dxa"/>
             </w:tcMar>
             <w:tcBorders>
               <w:top w:val="nil" w:sz="0" w:space="0" w:color="auto"/>
@@ -7335,7 +7335,7 @@
           <w:p>
             <w:pPr>
               <w:widowControl/>
-              <w:spacing w:before="60" w:after="60" w:lineRule="auto" w:line="276"/>
+              <w:spacing w:before="80" w:after="80" w:lineRule="auto" w:line="276"/>
               <w:ind w:firstLine="0"/>
               <w:jc w:val="center"/>
             </w:pPr>
@@ -7346,8 +7346,8 @@
                 <w:b w:val="0"/>
                 <w:i w:val="0"/>
                 <w:color w:val="000000"/>
-                <w:sz w:val="20"/>
-                <w:szCs w:val="20"/>
+                <w:sz w:val="24"/>
+                <w:szCs w:val="24"/>
               </w:rPr>
               <w:t>0.2 – 1.9</w:t>
             </w:r>
@@ -7360,13 +7360,13 @@
         </w:trPr>
         <w:tc>
           <w:tcPr>
-            <w:tcW w:type="dxa" w:w="3515"/>
+            <w:tcW w:type="dxa" w:w="3402"/>
             <w:vAlign w:val="center"/>
             <w:tcMar>
-              <w:top w:w="100" w:type="dxa"/>
-              <w:left w:w="100" w:type="dxa"/>
-              <w:bottom w:w="100" w:type="dxa"/>
-              <w:right w:w="100" w:type="dxa"/>
+              <w:top w:w="120" w:type="dxa"/>
+              <w:left w:w="120" w:type="dxa"/>
+              <w:bottom w:w="120" w:type="dxa"/>
+              <w:right w:w="120" w:type="dxa"/>
             </w:tcMar>
             <w:tcBorders>
               <w:top w:val="nil" w:sz="0" w:space="0" w:color="auto"/>
@@ -7378,7 +7378,7 @@
           <w:p>
             <w:pPr>
               <w:widowControl/>
-              <w:spacing w:before="60" w:after="60" w:lineRule="auto" w:line="276"/>
+              <w:spacing w:before="80" w:after="80" w:lineRule="auto" w:line="276"/>
               <w:ind w:firstLine="0"/>
               <w:jc w:val="left"/>
             </w:pPr>
@@ -7389,8 +7389,8 @@
                 <w:b w:val="0"/>
                 <w:i w:val="0"/>
                 <w:color w:val="000000"/>
-                <w:sz w:val="20"/>
-                <w:szCs w:val="20"/>
+                <w:sz w:val="24"/>
+                <w:szCs w:val="24"/>
               </w:rPr>
               <w:t>Beautifil II LS</w:t>
             </w:r>
@@ -7398,13 +7398,13 @@
         </w:tc>
         <w:tc>
           <w:tcPr>
-            <w:tcW w:type="dxa" w:w="3061"/>
+            <w:tcW w:type="dxa" w:w="3288"/>
             <w:vAlign w:val="center"/>
             <w:tcMar>
-              <w:top w:w="100" w:type="dxa"/>
-              <w:left w:w="100" w:type="dxa"/>
-              <w:bottom w:w="100" w:type="dxa"/>
-              <w:right w:w="100" w:type="dxa"/>
+              <w:top w:w="120" w:type="dxa"/>
+              <w:left w:w="120" w:type="dxa"/>
+              <w:bottom w:w="120" w:type="dxa"/>
+              <w:right w:w="120" w:type="dxa"/>
             </w:tcMar>
             <w:tcBorders>
               <w:top w:val="nil" w:sz="0" w:space="0" w:color="auto"/>
@@ -7416,7 +7416,7 @@
           <w:p>
             <w:pPr>
               <w:widowControl/>
-              <w:spacing w:before="60" w:after="60" w:lineRule="auto" w:line="276"/>
+              <w:spacing w:before="80" w:after="80" w:lineRule="auto" w:line="276"/>
               <w:ind w:firstLine="0"/>
               <w:jc w:val="center"/>
             </w:pPr>
@@ -7427,8 +7427,8 @@
                 <w:b w:val="0"/>
                 <w:i w:val="0"/>
                 <w:color w:val="000000"/>
-                <w:sz w:val="20"/>
-                <w:szCs w:val="20"/>
+                <w:sz w:val="24"/>
+                <w:szCs w:val="24"/>
               </w:rPr>
               <w:t>0.95 ± 0.58</w:t>
             </w:r>
@@ -7436,13 +7436,13 @@
         </w:tc>
         <w:tc>
           <w:tcPr>
-            <w:tcW w:type="dxa" w:w="2381"/>
+            <w:tcW w:type="dxa" w:w="2268"/>
             <w:vAlign w:val="center"/>
             <w:tcMar>
-              <w:top w:w="100" w:type="dxa"/>
-              <w:left w:w="100" w:type="dxa"/>
-              <w:bottom w:w="100" w:type="dxa"/>
-              <w:right w:w="100" w:type="dxa"/>
+              <w:top w:w="120" w:type="dxa"/>
+              <w:left w:w="120" w:type="dxa"/>
+              <w:bottom w:w="120" w:type="dxa"/>
+              <w:right w:w="120" w:type="dxa"/>
             </w:tcMar>
             <w:tcBorders>
               <w:top w:val="nil" w:sz="0" w:space="0" w:color="auto"/>
@@ -7454,7 +7454,7 @@
           <w:p>
             <w:pPr>
               <w:widowControl/>
-              <w:spacing w:before="60" w:after="60" w:lineRule="auto" w:line="276"/>
+              <w:spacing w:before="80" w:after="80" w:lineRule="auto" w:line="276"/>
               <w:ind w:firstLine="0"/>
               <w:jc w:val="center"/>
             </w:pPr>
@@ -7465,8 +7465,8 @@
                 <w:b w:val="0"/>
                 <w:i w:val="0"/>
                 <w:color w:val="000000"/>
-                <w:sz w:val="20"/>
-                <w:szCs w:val="20"/>
+                <w:sz w:val="24"/>
+                <w:szCs w:val="24"/>
               </w:rPr>
               <w:t>0.1 – 1.8</w:t>
             </w:r>
@@ -7564,7 +7564,7 @@
       <w:pPr>
         <w:keepNext/>
         <w:widowControl/>
-        <w:spacing w:before="280" w:after="160" w:lineRule="auto" w:line="276"/>
+        <w:spacing w:before="320" w:after="200" w:lineRule="auto" w:line="276"/>
         <w:ind w:firstLine="0"/>
         <w:jc w:val="left"/>
       </w:pPr>
@@ -7614,13 +7614,13 @@
         </w:trPr>
         <w:tc>
           <w:tcPr>
-            <w:tcW w:type="dxa" w:w="2381"/>
+            <w:tcW w:type="dxa" w:w="1984"/>
             <w:vAlign w:val="center"/>
             <w:tcMar>
-              <w:top w:w="100" w:type="dxa"/>
-              <w:left w:w="100" w:type="dxa"/>
-              <w:bottom w:w="100" w:type="dxa"/>
-              <w:right w:w="100" w:type="dxa"/>
+              <w:top w:w="120" w:type="dxa"/>
+              <w:left w:w="120" w:type="dxa"/>
+              <w:bottom w:w="120" w:type="dxa"/>
+              <w:right w:w="120" w:type="dxa"/>
             </w:tcMar>
             <w:tcBorders>
               <w:top w:val="single" w:sz="18" w:space="0" w:color="000000"/>
@@ -7632,7 +7632,7 @@
           <w:p>
             <w:pPr>
               <w:widowControl/>
-              <w:spacing w:before="60" w:after="60" w:lineRule="auto" w:line="276"/>
+              <w:spacing w:before="80" w:after="80" w:lineRule="auto" w:line="276"/>
               <w:ind w:firstLine="0"/>
               <w:jc w:val="left"/>
             </w:pPr>
@@ -7643,8 +7643,8 @@
                 <w:b/>
                 <w:i w:val="0"/>
                 <w:color w:val="000000"/>
-                <w:sz w:val="20"/>
-                <w:szCs w:val="20"/>
+                <w:sz w:val="24"/>
+                <w:szCs w:val="24"/>
               </w:rPr>
               <w:t>Composite resin</w:t>
             </w:r>
@@ -7652,13 +7652,13 @@
         </w:tc>
         <w:tc>
           <w:tcPr>
-            <w:tcW w:type="dxa" w:w="1701"/>
+            <w:tcW w:type="dxa" w:w="1871"/>
             <w:vAlign w:val="center"/>
             <w:tcMar>
-              <w:top w:w="100" w:type="dxa"/>
-              <w:left w:w="100" w:type="dxa"/>
-              <w:bottom w:w="100" w:type="dxa"/>
-              <w:right w:w="100" w:type="dxa"/>
+              <w:top w:w="120" w:type="dxa"/>
+              <w:left w:w="120" w:type="dxa"/>
+              <w:bottom w:w="120" w:type="dxa"/>
+              <w:right w:w="120" w:type="dxa"/>
             </w:tcMar>
             <w:tcBorders>
               <w:top w:val="single" w:sz="18" w:space="0" w:color="000000"/>
@@ -7670,7 +7670,7 @@
           <w:p>
             <w:pPr>
               <w:widowControl/>
-              <w:spacing w:before="60" w:after="60" w:lineRule="auto" w:line="276"/>
+              <w:spacing w:before="80" w:after="80" w:lineRule="auto" w:line="276"/>
               <w:ind w:firstLine="0"/>
               <w:jc w:val="center"/>
             </w:pPr>
@@ -7681,8 +7681,8 @@
                 <w:b/>
                 <w:i w:val="0"/>
                 <w:color w:val="000000"/>
-                <w:sz w:val="20"/>
-                <w:szCs w:val="20"/>
+                <w:sz w:val="24"/>
+                <w:szCs w:val="24"/>
               </w:rPr>
               <w:t>Ra before (µm)</w:t>
             </w:r>
@@ -7690,7 +7690,7 @@
           <w:p>
             <w:pPr>
               <w:widowControl/>
-              <w:spacing w:before="60" w:after="60" w:lineRule="auto" w:line="276"/>
+              <w:spacing w:before="80" w:after="80" w:lineRule="auto" w:line="276"/>
               <w:ind w:firstLine="0"/>
               <w:jc w:val="center"/>
             </w:pPr>
@@ -7700,8 +7700,8 @@
                 <w:b/>
                 <w:i w:val="0"/>
                 <w:color w:val="000000"/>
-                <w:sz w:val="20"/>
-                <w:szCs w:val="20"/>
+                <w:sz w:val="24"/>
+                <w:szCs w:val="24"/>
               </w:rPr>
               <w:t>Mean ± SD</w:t>
             </w:r>
@@ -7709,13 +7709,13 @@
         </w:tc>
         <w:tc>
           <w:tcPr>
-            <w:tcW w:type="dxa" w:w="1701"/>
+            <w:tcW w:type="dxa" w:w="1871"/>
             <w:vAlign w:val="center"/>
             <w:tcMar>
-              <w:top w:w="100" w:type="dxa"/>
-              <w:left w:w="100" w:type="dxa"/>
-              <w:bottom w:w="100" w:type="dxa"/>
-              <w:right w:w="100" w:type="dxa"/>
+              <w:top w:w="120" w:type="dxa"/>
+              <w:left w:w="120" w:type="dxa"/>
+              <w:bottom w:w="120" w:type="dxa"/>
+              <w:right w:w="120" w:type="dxa"/>
             </w:tcMar>
             <w:tcBorders>
               <w:top w:val="single" w:sz="18" w:space="0" w:color="000000"/>
@@ -7727,7 +7727,7 @@
           <w:p>
             <w:pPr>
               <w:widowControl/>
-              <w:spacing w:before="60" w:after="60" w:lineRule="auto" w:line="276"/>
+              <w:spacing w:before="80" w:after="80" w:lineRule="auto" w:line="276"/>
               <w:ind w:firstLine="0"/>
               <w:jc w:val="center"/>
             </w:pPr>
@@ -7738,8 +7738,8 @@
                 <w:b/>
                 <w:i w:val="0"/>
                 <w:color w:val="000000"/>
-                <w:sz w:val="20"/>
-                <w:szCs w:val="20"/>
+                <w:sz w:val="24"/>
+                <w:szCs w:val="24"/>
               </w:rPr>
               <w:t>Ra after (µm)</w:t>
             </w:r>
@@ -7747,7 +7747,7 @@
           <w:p>
             <w:pPr>
               <w:widowControl/>
-              <w:spacing w:before="60" w:after="60" w:lineRule="auto" w:line="276"/>
+              <w:spacing w:before="80" w:after="80" w:lineRule="auto" w:line="276"/>
               <w:ind w:firstLine="0"/>
               <w:jc w:val="center"/>
             </w:pPr>
@@ -7757,8 +7757,8 @@
                 <w:b/>
                 <w:i w:val="0"/>
                 <w:color w:val="000000"/>
-                <w:sz w:val="20"/>
-                <w:szCs w:val="20"/>
+                <w:sz w:val="24"/>
+                <w:szCs w:val="24"/>
               </w:rPr>
               <w:t>Mean ± SD</w:t>
             </w:r>
@@ -7766,13 +7766,13 @@
         </w:tc>
         <w:tc>
           <w:tcPr>
-            <w:tcW w:type="dxa" w:w="1701"/>
+            <w:tcW w:type="dxa" w:w="1871"/>
             <w:vAlign w:val="center"/>
             <w:tcMar>
-              <w:top w:w="100" w:type="dxa"/>
-              <w:left w:w="100" w:type="dxa"/>
-              <w:bottom w:w="100" w:type="dxa"/>
-              <w:right w:w="100" w:type="dxa"/>
+              <w:top w:w="120" w:type="dxa"/>
+              <w:left w:w="120" w:type="dxa"/>
+              <w:bottom w:w="120" w:type="dxa"/>
+              <w:right w:w="120" w:type="dxa"/>
             </w:tcMar>
             <w:tcBorders>
               <w:top w:val="single" w:sz="18" w:space="0" w:color="000000"/>
@@ -7784,7 +7784,7 @@
           <w:p>
             <w:pPr>
               <w:widowControl/>
-              <w:spacing w:before="60" w:after="60" w:lineRule="auto" w:line="276"/>
+              <w:spacing w:before="80" w:after="80" w:lineRule="auto" w:line="276"/>
               <w:ind w:firstLine="0"/>
               <w:jc w:val="center"/>
             </w:pPr>
@@ -7795,8 +7795,8 @@
                 <w:b/>
                 <w:i w:val="0"/>
                 <w:color w:val="000000"/>
-                <w:sz w:val="20"/>
-                <w:szCs w:val="20"/>
+                <w:sz w:val="24"/>
+                <w:szCs w:val="24"/>
               </w:rPr>
               <w:t>ΔRa (µm)</w:t>
             </w:r>
@@ -7804,7 +7804,7 @@
           <w:p>
             <w:pPr>
               <w:widowControl/>
-              <w:spacing w:before="60" w:after="60" w:lineRule="auto" w:line="276"/>
+              <w:spacing w:before="80" w:after="80" w:lineRule="auto" w:line="276"/>
               <w:ind w:firstLine="0"/>
               <w:jc w:val="center"/>
             </w:pPr>
@@ -7814,8 +7814,8 @@
                 <w:b/>
                 <w:i w:val="0"/>
                 <w:color w:val="000000"/>
-                <w:sz w:val="20"/>
-                <w:szCs w:val="20"/>
+                <w:sz w:val="24"/>
+                <w:szCs w:val="24"/>
               </w:rPr>
               <w:t>Mean ± SD</w:t>
             </w:r>
@@ -7823,13 +7823,13 @@
         </w:tc>
         <w:tc>
           <w:tcPr>
-            <w:tcW w:type="dxa" w:w="1474"/>
+            <w:tcW w:type="dxa" w:w="1361"/>
             <w:vAlign w:val="center"/>
             <w:tcMar>
-              <w:top w:w="100" w:type="dxa"/>
-              <w:left w:w="100" w:type="dxa"/>
-              <w:bottom w:w="100" w:type="dxa"/>
-              <w:right w:w="100" w:type="dxa"/>
+              <w:top w:w="120" w:type="dxa"/>
+              <w:left w:w="120" w:type="dxa"/>
+              <w:bottom w:w="120" w:type="dxa"/>
+              <w:right w:w="120" w:type="dxa"/>
             </w:tcMar>
             <w:tcBorders>
               <w:top w:val="single" w:sz="18" w:space="0" w:color="000000"/>
@@ -7841,7 +7841,7 @@
           <w:p>
             <w:pPr>
               <w:widowControl/>
-              <w:spacing w:before="60" w:after="60" w:lineRule="auto" w:line="276"/>
+              <w:spacing w:before="80" w:after="80" w:lineRule="auto" w:line="276"/>
               <w:ind w:firstLine="0"/>
               <w:jc w:val="center"/>
             </w:pPr>
@@ -7852,8 +7852,8 @@
                 <w:b/>
                 <w:i w:val="0"/>
                 <w:color w:val="000000"/>
-                <w:sz w:val="20"/>
-                <w:szCs w:val="20"/>
+                <w:sz w:val="24"/>
+                <w:szCs w:val="24"/>
               </w:rPr>
               <w:t>p-value</w:t>
             </w:r>
@@ -7866,13 +7866,13 @@
         </w:trPr>
         <w:tc>
           <w:tcPr>
-            <w:tcW w:type="dxa" w:w="2381"/>
+            <w:tcW w:type="dxa" w:w="1984"/>
             <w:vAlign w:val="center"/>
             <w:tcMar>
-              <w:top w:w="100" w:type="dxa"/>
-              <w:left w:w="100" w:type="dxa"/>
-              <w:bottom w:w="100" w:type="dxa"/>
-              <w:right w:w="100" w:type="dxa"/>
+              <w:top w:w="120" w:type="dxa"/>
+              <w:left w:w="120" w:type="dxa"/>
+              <w:bottom w:w="120" w:type="dxa"/>
+              <w:right w:w="120" w:type="dxa"/>
             </w:tcMar>
             <w:tcBorders>
               <w:top w:val="nil" w:sz="0" w:space="0" w:color="auto"/>
@@ -7884,7 +7884,7 @@
           <w:p>
             <w:pPr>
               <w:widowControl/>
-              <w:spacing w:before="60" w:after="60" w:lineRule="auto" w:line="276"/>
+              <w:spacing w:before="80" w:after="80" w:lineRule="auto" w:line="276"/>
               <w:ind w:firstLine="0"/>
               <w:jc w:val="left"/>
             </w:pPr>
@@ -7895,8 +7895,8 @@
                 <w:b w:val="0"/>
                 <w:i w:val="0"/>
                 <w:color w:val="000000"/>
-                <w:sz w:val="20"/>
-                <w:szCs w:val="20"/>
+                <w:sz w:val="24"/>
+                <w:szCs w:val="24"/>
               </w:rPr>
               <w:t>Beautifil Flow Plus X F00</w:t>
             </w:r>
@@ -7904,13 +7904,13 @@
         </w:tc>
         <w:tc>
           <w:tcPr>
-            <w:tcW w:type="dxa" w:w="1701"/>
+            <w:tcW w:type="dxa" w:w="1871"/>
             <w:vAlign w:val="center"/>
             <w:tcMar>
-              <w:top w:w="100" w:type="dxa"/>
-              <w:left w:w="100" w:type="dxa"/>
-              <w:bottom w:w="100" w:type="dxa"/>
-              <w:right w:w="100" w:type="dxa"/>
+              <w:top w:w="120" w:type="dxa"/>
+              <w:left w:w="120" w:type="dxa"/>
+              <w:bottom w:w="120" w:type="dxa"/>
+              <w:right w:w="120" w:type="dxa"/>
             </w:tcMar>
             <w:tcBorders>
               <w:top w:val="nil" w:sz="0" w:space="0" w:color="auto"/>
@@ -7922,7 +7922,7 @@
           <w:p>
             <w:pPr>
               <w:widowControl/>
-              <w:spacing w:before="60" w:after="60" w:lineRule="auto" w:line="276"/>
+              <w:spacing w:before="80" w:after="80" w:lineRule="auto" w:line="276"/>
               <w:ind w:firstLine="0"/>
               <w:jc w:val="center"/>
             </w:pPr>
@@ -7933,8 +7933,8 @@
                 <w:b w:val="0"/>
                 <w:i w:val="0"/>
                 <w:color w:val="000000"/>
-                <w:sz w:val="20"/>
-                <w:szCs w:val="20"/>
+                <w:sz w:val="24"/>
+                <w:szCs w:val="24"/>
               </w:rPr>
               <w:t>0.038 ± 0.011</w:t>
             </w:r>
@@ -7942,13 +7942,13 @@
         </w:tc>
         <w:tc>
           <w:tcPr>
-            <w:tcW w:type="dxa" w:w="1701"/>
+            <w:tcW w:type="dxa" w:w="1871"/>
             <w:vAlign w:val="center"/>
             <w:tcMar>
-              <w:top w:w="100" w:type="dxa"/>
-              <w:left w:w="100" w:type="dxa"/>
-              <w:bottom w:w="100" w:type="dxa"/>
-              <w:right w:w="100" w:type="dxa"/>
+              <w:top w:w="120" w:type="dxa"/>
+              <w:left w:w="120" w:type="dxa"/>
+              <w:bottom w:w="120" w:type="dxa"/>
+              <w:right w:w="120" w:type="dxa"/>
             </w:tcMar>
             <w:tcBorders>
               <w:top w:val="nil" w:sz="0" w:space="0" w:color="auto"/>
@@ -7960,7 +7960,7 @@
           <w:p>
             <w:pPr>
               <w:widowControl/>
-              <w:spacing w:before="60" w:after="60" w:lineRule="auto" w:line="276"/>
+              <w:spacing w:before="80" w:after="80" w:lineRule="auto" w:line="276"/>
               <w:ind w:firstLine="0"/>
               <w:jc w:val="center"/>
             </w:pPr>
@@ -7971,8 +7971,8 @@
                 <w:b w:val="0"/>
                 <w:i w:val="0"/>
                 <w:color w:val="000000"/>
-                <w:sz w:val="20"/>
-                <w:szCs w:val="20"/>
+                <w:sz w:val="24"/>
+                <w:szCs w:val="24"/>
               </w:rPr>
               <w:t>0.104 ± 0.017</w:t>
             </w:r>
@@ -7980,13 +7980,13 @@
         </w:tc>
         <w:tc>
           <w:tcPr>
-            <w:tcW w:type="dxa" w:w="1701"/>
+            <w:tcW w:type="dxa" w:w="1871"/>
             <w:vAlign w:val="center"/>
             <w:tcMar>
-              <w:top w:w="100" w:type="dxa"/>
-              <w:left w:w="100" w:type="dxa"/>
-              <w:bottom w:w="100" w:type="dxa"/>
-              <w:right w:w="100" w:type="dxa"/>
+              <w:top w:w="120" w:type="dxa"/>
+              <w:left w:w="120" w:type="dxa"/>
+              <w:bottom w:w="120" w:type="dxa"/>
+              <w:right w:w="120" w:type="dxa"/>
             </w:tcMar>
             <w:tcBorders>
               <w:top w:val="nil" w:sz="0" w:space="0" w:color="auto"/>
@@ -7998,7 +7998,7 @@
           <w:p>
             <w:pPr>
               <w:widowControl/>
-              <w:spacing w:before="60" w:after="60" w:lineRule="auto" w:line="276"/>
+              <w:spacing w:before="80" w:after="80" w:lineRule="auto" w:line="276"/>
               <w:ind w:firstLine="0"/>
               <w:jc w:val="center"/>
             </w:pPr>
@@ -8009,8 +8009,8 @@
                 <w:b w:val="0"/>
                 <w:i w:val="0"/>
                 <w:color w:val="000000"/>
-                <w:sz w:val="20"/>
-                <w:szCs w:val="20"/>
+                <w:sz w:val="24"/>
+                <w:szCs w:val="24"/>
               </w:rPr>
               <w:t>0.066 ± 0.021</w:t>
             </w:r>
@@ -8018,13 +8018,13 @@
         </w:tc>
         <w:tc>
           <w:tcPr>
-            <w:tcW w:type="dxa" w:w="1474"/>
+            <w:tcW w:type="dxa" w:w="1361"/>
             <w:vAlign w:val="center"/>
             <w:tcMar>
-              <w:top w:w="100" w:type="dxa"/>
-              <w:left w:w="100" w:type="dxa"/>
-              <w:bottom w:w="100" w:type="dxa"/>
-              <w:right w:w="100" w:type="dxa"/>
+              <w:top w:w="120" w:type="dxa"/>
+              <w:left w:w="120" w:type="dxa"/>
+              <w:bottom w:w="120" w:type="dxa"/>
+              <w:right w:w="120" w:type="dxa"/>
             </w:tcMar>
             <w:vMerge w:val="restart"/>
             <w:tcBorders>
@@ -8034,16 +8034,16 @@
               <w:right w:val="nil" w:sz="0" w:space="0" w:color="auto"/>
             </w:tcBorders>
             <w:tcMar>
-              <w:top w:w="100" w:type="dxa"/>
-              <w:left w:w="100" w:type="dxa"/>
-              <w:bottom w:w="100" w:type="dxa"/>
-              <w:right w:w="100" w:type="dxa"/>
+              <w:top w:w="120" w:type="dxa"/>
+              <w:left w:w="120" w:type="dxa"/>
+              <w:bottom w:w="120" w:type="dxa"/>
+              <w:right w:w="120" w:type="dxa"/>
             </w:tcMar>
           </w:tcPr>
           <w:p>
             <w:pPr>
               <w:widowControl/>
-              <w:spacing w:before="60" w:after="60" w:lineRule="auto" w:line="276"/>
+              <w:spacing w:before="80" w:after="80" w:lineRule="auto" w:line="276"/>
               <w:ind w:firstLine="0"/>
               <w:jc w:val="center"/>
             </w:pPr>
@@ -8054,8 +8054,8 @@
                 <w:b w:val="0"/>
                 <w:i w:val="0"/>
                 <w:color w:val="000000"/>
-                <w:sz w:val="20"/>
-                <w:szCs w:val="20"/>
+                <w:sz w:val="24"/>
+                <w:szCs w:val="24"/>
               </w:rPr>
               <w:t>&lt; 0.001‡</w:t>
             </w:r>
@@ -8068,13 +8068,13 @@
         </w:trPr>
         <w:tc>
           <w:tcPr>
-            <w:tcW w:type="dxa" w:w="2381"/>
+            <w:tcW w:type="dxa" w:w="1984"/>
             <w:vAlign w:val="center"/>
             <w:tcMar>
-              <w:top w:w="100" w:type="dxa"/>
-              <w:left w:w="100" w:type="dxa"/>
-              <w:bottom w:w="100" w:type="dxa"/>
-              <w:right w:w="100" w:type="dxa"/>
+              <w:top w:w="120" w:type="dxa"/>
+              <w:left w:w="120" w:type="dxa"/>
+              <w:bottom w:w="120" w:type="dxa"/>
+              <w:right w:w="120" w:type="dxa"/>
             </w:tcMar>
             <w:tcBorders>
               <w:top w:val="nil" w:sz="0" w:space="0" w:color="auto"/>
@@ -8086,7 +8086,7 @@
           <w:p>
             <w:pPr>
               <w:widowControl/>
-              <w:spacing w:before="60" w:after="60" w:lineRule="auto" w:line="276"/>
+              <w:spacing w:before="80" w:after="80" w:lineRule="auto" w:line="276"/>
               <w:ind w:firstLine="0"/>
               <w:jc w:val="left"/>
             </w:pPr>
@@ -8097,8 +8097,8 @@
                 <w:b w:val="0"/>
                 <w:i w:val="0"/>
                 <w:color w:val="000000"/>
-                <w:sz w:val="20"/>
-                <w:szCs w:val="20"/>
+                <w:sz w:val="24"/>
+                <w:szCs w:val="24"/>
               </w:rPr>
               <w:t>G-ænial Universal Injectable</w:t>
             </w:r>
@@ -8106,13 +8106,13 @@
         </w:tc>
         <w:tc>
           <w:tcPr>
-            <w:tcW w:type="dxa" w:w="1701"/>
+            <w:tcW w:type="dxa" w:w="1871"/>
             <w:vAlign w:val="center"/>
             <w:tcMar>
-              <w:top w:w="100" w:type="dxa"/>
-              <w:left w:w="100" w:type="dxa"/>
-              <w:bottom w:w="100" w:type="dxa"/>
-              <w:right w:w="100" w:type="dxa"/>
+              <w:top w:w="120" w:type="dxa"/>
+              <w:left w:w="120" w:type="dxa"/>
+              <w:bottom w:w="120" w:type="dxa"/>
+              <w:right w:w="120" w:type="dxa"/>
             </w:tcMar>
             <w:tcBorders>
               <w:top w:val="nil" w:sz="0" w:space="0" w:color="auto"/>
@@ -8124,7 +8124,7 @@
           <w:p>
             <w:pPr>
               <w:widowControl/>
-              <w:spacing w:before="60" w:after="60" w:lineRule="auto" w:line="276"/>
+              <w:spacing w:before="80" w:after="80" w:lineRule="auto" w:line="276"/>
               <w:ind w:firstLine="0"/>
               <w:jc w:val="center"/>
             </w:pPr>
@@ -8135,8 +8135,8 @@
                 <w:b w:val="0"/>
                 <w:i w:val="0"/>
                 <w:color w:val="000000"/>
-                <w:sz w:val="20"/>
-                <w:szCs w:val="20"/>
+                <w:sz w:val="24"/>
+                <w:szCs w:val="24"/>
               </w:rPr>
               <w:t>0.054 ± 0.010</w:t>
             </w:r>
@@ -8144,13 +8144,13 @@
         </w:tc>
         <w:tc>
           <w:tcPr>
-            <w:tcW w:type="dxa" w:w="1701"/>
+            <w:tcW w:type="dxa" w:w="1871"/>
             <w:vAlign w:val="center"/>
             <w:tcMar>
-              <w:top w:w="100" w:type="dxa"/>
-              <w:left w:w="100" w:type="dxa"/>
-              <w:bottom w:w="100" w:type="dxa"/>
-              <w:right w:w="100" w:type="dxa"/>
+              <w:top w:w="120" w:type="dxa"/>
+              <w:left w:w="120" w:type="dxa"/>
+              <w:bottom w:w="120" w:type="dxa"/>
+              <w:right w:w="120" w:type="dxa"/>
             </w:tcMar>
             <w:tcBorders>
               <w:top w:val="nil" w:sz="0" w:space="0" w:color="auto"/>
@@ -8162,7 +8162,7 @@
           <w:p>
             <w:pPr>
               <w:widowControl/>
-              <w:spacing w:before="60" w:after="60" w:lineRule="auto" w:line="276"/>
+              <w:spacing w:before="80" w:after="80" w:lineRule="auto" w:line="276"/>
               <w:ind w:firstLine="0"/>
               <w:jc w:val="center"/>
             </w:pPr>
@@ -8173,8 +8173,8 @@
                 <w:b w:val="0"/>
                 <w:i w:val="0"/>
                 <w:color w:val="000000"/>
-                <w:sz w:val="20"/>
-                <w:szCs w:val="20"/>
+                <w:sz w:val="24"/>
+                <w:szCs w:val="24"/>
               </w:rPr>
               <w:t>0.100 ± 0.023</w:t>
             </w:r>
@@ -8182,13 +8182,13 @@
         </w:tc>
         <w:tc>
           <w:tcPr>
-            <w:tcW w:type="dxa" w:w="1701"/>
+            <w:tcW w:type="dxa" w:w="1871"/>
             <w:vAlign w:val="center"/>
             <w:tcMar>
-              <w:top w:w="100" w:type="dxa"/>
-              <w:left w:w="100" w:type="dxa"/>
-              <w:bottom w:w="100" w:type="dxa"/>
-              <w:right w:w="100" w:type="dxa"/>
+              <w:top w:w="120" w:type="dxa"/>
+              <w:left w:w="120" w:type="dxa"/>
+              <w:bottom w:w="120" w:type="dxa"/>
+              <w:right w:w="120" w:type="dxa"/>
             </w:tcMar>
             <w:tcBorders>
               <w:top w:val="nil" w:sz="0" w:space="0" w:color="auto"/>
@@ -8200,7 +8200,7 @@
           <w:p>
             <w:pPr>
               <w:widowControl/>
-              <w:spacing w:before="60" w:after="60" w:lineRule="auto" w:line="276"/>
+              <w:spacing w:before="80" w:after="80" w:lineRule="auto" w:line="276"/>
               <w:ind w:firstLine="0"/>
               <w:jc w:val="center"/>
             </w:pPr>
@@ -8211,8 +8211,8 @@
                 <w:b w:val="0"/>
                 <w:i w:val="0"/>
                 <w:color w:val="000000"/>
-                <w:sz w:val="20"/>
-                <w:szCs w:val="20"/>
+                <w:sz w:val="24"/>
+                <w:szCs w:val="24"/>
               </w:rPr>
               <w:t>0.046 ± 0.023</w:t>
             </w:r>
@@ -8220,13 +8220,13 @@
         </w:tc>
         <w:tc>
           <w:tcPr>
-            <w:tcW w:type="dxa" w:w="1474"/>
+            <w:tcW w:type="dxa" w:w="1361"/>
             <w:vAlign w:val="center"/>
             <w:tcMar>
-              <w:top w:w="100" w:type="dxa"/>
-              <w:left w:w="100" w:type="dxa"/>
-              <w:bottom w:w="100" w:type="dxa"/>
-              <w:right w:w="100" w:type="dxa"/>
+              <w:top w:w="120" w:type="dxa"/>
+              <w:left w:w="120" w:type="dxa"/>
+              <w:bottom w:w="120" w:type="dxa"/>
+              <w:right w:w="120" w:type="dxa"/>
             </w:tcMar>
             <w:vMerge/>
             <w:tcBorders>
@@ -8245,13 +8245,13 @@
         </w:trPr>
         <w:tc>
           <w:tcPr>
-            <w:tcW w:type="dxa" w:w="2381"/>
+            <w:tcW w:type="dxa" w:w="1984"/>
             <w:vAlign w:val="center"/>
             <w:tcMar>
-              <w:top w:w="100" w:type="dxa"/>
-              <w:left w:w="100" w:type="dxa"/>
-              <w:bottom w:w="100" w:type="dxa"/>
-              <w:right w:w="100" w:type="dxa"/>
+              <w:top w:w="120" w:type="dxa"/>
+              <w:left w:w="120" w:type="dxa"/>
+              <w:bottom w:w="120" w:type="dxa"/>
+              <w:right w:w="120" w:type="dxa"/>
             </w:tcMar>
             <w:tcBorders>
               <w:top w:val="nil" w:sz="0" w:space="0" w:color="auto"/>
@@ -8263,7 +8263,7 @@
           <w:p>
             <w:pPr>
               <w:widowControl/>
-              <w:spacing w:before="60" w:after="60" w:lineRule="auto" w:line="276"/>
+              <w:spacing w:before="80" w:after="80" w:lineRule="auto" w:line="276"/>
               <w:ind w:firstLine="0"/>
               <w:jc w:val="left"/>
             </w:pPr>
@@ -8274,8 +8274,8 @@
                 <w:b w:val="0"/>
                 <w:i w:val="0"/>
                 <w:color w:val="000000"/>
-                <w:sz w:val="20"/>
-                <w:szCs w:val="20"/>
+                <w:sz w:val="24"/>
+                <w:szCs w:val="24"/>
               </w:rPr>
               <w:t>Beautifil II LS</w:t>
             </w:r>
@@ -8283,13 +8283,13 @@
         </w:tc>
         <w:tc>
           <w:tcPr>
-            <w:tcW w:type="dxa" w:w="1701"/>
+            <w:tcW w:type="dxa" w:w="1871"/>
             <w:vAlign w:val="center"/>
             <w:tcMar>
-              <w:top w:w="100" w:type="dxa"/>
-              <w:left w:w="100" w:type="dxa"/>
-              <w:bottom w:w="100" w:type="dxa"/>
-              <w:right w:w="100" w:type="dxa"/>
+              <w:top w:w="120" w:type="dxa"/>
+              <w:left w:w="120" w:type="dxa"/>
+              <w:bottom w:w="120" w:type="dxa"/>
+              <w:right w:w="120" w:type="dxa"/>
             </w:tcMar>
             <w:tcBorders>
               <w:top w:val="nil" w:sz="0" w:space="0" w:color="auto"/>
@@ -8301,7 +8301,7 @@
           <w:p>
             <w:pPr>
               <w:widowControl/>
-              <w:spacing w:before="60" w:after="60" w:lineRule="auto" w:line="276"/>
+              <w:spacing w:before="80" w:after="80" w:lineRule="auto" w:line="276"/>
               <w:ind w:firstLine="0"/>
               <w:jc w:val="center"/>
             </w:pPr>
@@ -8312,8 +8312,8 @@
                 <w:b w:val="0"/>
                 <w:i w:val="0"/>
                 <w:color w:val="000000"/>
-                <w:sz w:val="20"/>
-                <w:szCs w:val="20"/>
+                <w:sz w:val="24"/>
+                <w:szCs w:val="24"/>
               </w:rPr>
               <w:t>0.119 ± 0.054</w:t>
             </w:r>
@@ -8321,13 +8321,13 @@
         </w:tc>
         <w:tc>
           <w:tcPr>
-            <w:tcW w:type="dxa" w:w="1701"/>
+            <w:tcW w:type="dxa" w:w="1871"/>
             <w:vAlign w:val="center"/>
             <w:tcMar>
-              <w:top w:w="100" w:type="dxa"/>
-              <w:left w:w="100" w:type="dxa"/>
-              <w:bottom w:w="100" w:type="dxa"/>
-              <w:right w:w="100" w:type="dxa"/>
+              <w:top w:w="120" w:type="dxa"/>
+              <w:left w:w="120" w:type="dxa"/>
+              <w:bottom w:w="120" w:type="dxa"/>
+              <w:right w:w="120" w:type="dxa"/>
             </w:tcMar>
             <w:tcBorders>
               <w:top w:val="nil" w:sz="0" w:space="0" w:color="auto"/>
@@ -8339,7 +8339,7 @@
           <w:p>
             <w:pPr>
               <w:widowControl/>
-              <w:spacing w:before="60" w:after="60" w:lineRule="auto" w:line="276"/>
+              <w:spacing w:before="80" w:after="80" w:lineRule="auto" w:line="276"/>
               <w:ind w:firstLine="0"/>
               <w:jc w:val="center"/>
             </w:pPr>
@@ -8350,8 +8350,8 @@
                 <w:b w:val="0"/>
                 <w:i w:val="0"/>
                 <w:color w:val="000000"/>
-                <w:sz w:val="20"/>
-                <w:szCs w:val="20"/>
+                <w:sz w:val="24"/>
+                <w:szCs w:val="24"/>
               </w:rPr>
               <w:t>0.194 ± 0.050</w:t>
             </w:r>
@@ -8359,13 +8359,13 @@
         </w:tc>
         <w:tc>
           <w:tcPr>
-            <w:tcW w:type="dxa" w:w="1701"/>
+            <w:tcW w:type="dxa" w:w="1871"/>
             <w:vAlign w:val="center"/>
             <w:tcMar>
-              <w:top w:w="100" w:type="dxa"/>
-              <w:left w:w="100" w:type="dxa"/>
-              <w:bottom w:w="100" w:type="dxa"/>
-              <w:right w:w="100" w:type="dxa"/>
+              <w:top w:w="120" w:type="dxa"/>
+              <w:left w:w="120" w:type="dxa"/>
+              <w:bottom w:w="120" w:type="dxa"/>
+              <w:right w:w="120" w:type="dxa"/>
             </w:tcMar>
             <w:tcBorders>
               <w:top w:val="nil" w:sz="0" w:space="0" w:color="auto"/>
@@ -8377,7 +8377,7 @@
           <w:p>
             <w:pPr>
               <w:widowControl/>
-              <w:spacing w:before="60" w:after="60" w:lineRule="auto" w:line="276"/>
+              <w:spacing w:before="80" w:after="80" w:lineRule="auto" w:line="276"/>
               <w:ind w:firstLine="0"/>
               <w:jc w:val="center"/>
             </w:pPr>
@@ -8388,8 +8388,8 @@
                 <w:b w:val="0"/>
                 <w:i w:val="0"/>
                 <w:color w:val="000000"/>
-                <w:sz w:val="20"/>
-                <w:szCs w:val="20"/>
+                <w:sz w:val="24"/>
+                <w:szCs w:val="24"/>
               </w:rPr>
               <w:t>0.075 ± 0.066</w:t>
             </w:r>
@@ -8397,13 +8397,13 @@
         </w:tc>
         <w:tc>
           <w:tcPr>
-            <w:tcW w:type="dxa" w:w="1474"/>
+            <w:tcW w:type="dxa" w:w="1361"/>
             <w:vAlign w:val="center"/>
             <w:tcMar>
-              <w:top w:w="100" w:type="dxa"/>
-              <w:left w:w="100" w:type="dxa"/>
-              <w:bottom w:w="100" w:type="dxa"/>
-              <w:right w:w="100" w:type="dxa"/>
+              <w:top w:w="120" w:type="dxa"/>
+              <w:left w:w="120" w:type="dxa"/>
+              <w:bottom w:w="120" w:type="dxa"/>
+              <w:right w:w="120" w:type="dxa"/>
             </w:tcMar>
             <w:vMerge/>
             <w:tcBorders>
@@ -8490,7 +8490,7 @@
       <w:pPr>
         <w:keepNext/>
         <w:widowControl/>
-        <w:spacing w:before="280" w:after="160" w:lineRule="auto" w:line="276"/>
+        <w:spacing w:before="320" w:after="200" w:lineRule="auto" w:line="276"/>
         <w:ind w:firstLine="0"/>
         <w:jc w:val="left"/>
       </w:pPr>
@@ -8601,7 +8601,7 @@
       <w:pPr>
         <w:keepNext/>
         <w:widowControl/>
-        <w:spacing w:before="280" w:after="160" w:lineRule="auto" w:line="276"/>
+        <w:spacing w:before="320" w:after="200" w:lineRule="auto" w:line="276"/>
         <w:ind w:firstLine="0"/>
         <w:jc w:val="left"/>
       </w:pPr>
@@ -10944,7 +10944,7 @@
       <w:headerReference w:type="default" r:id="rId11"/>
       <w:footerReference w:type="default" r:id="rId12"/>
       <w:pgSz w:w="11906" w:h="16838"/>
-      <w:pgMar w:top="1644" w:right="1247" w:bottom="1502" w:left="1701" w:header="198" w:footer="181" w:gutter="0"/>
+      <w:pgMar w:top="1587" w:right="1247" w:bottom="1446" w:left="1701" w:header="170" w:footer="159" w:gutter="0"/>
       <w:cols w:space="720"/>
       <w:docGrid w:linePitch="360"/>
     </w:sectPr>

</xml_diff>

<commit_message>
Slim the Word header and footer so they no longer eat the page
Keep a real header and footer on every page, but make the banner a thin strip and the footer one contact line plus the page number so the body is not letterboxed.

Co-authored-by: Ahmed El Gamry <ahmed733676-droid@users.noreply.github.com>
</commit_message>
<xml_diff>
--- a/Thesis_Complete.docx
+++ b/Thesis_Complete.docx
@@ -399,7 +399,7 @@
           <w:headerReference w:type="default" r:id="rId9"/>
           <w:footerReference w:type="default" r:id="rId10"/>
           <w:pgSz w:w="11906" w:h="16838"/>
-          <w:pgMar w:top="1587" w:right="1247" w:bottom="1446" w:left="1701" w:header="170" w:footer="159" w:gutter="0"/>
+          <w:pgMar w:top="1049" w:right="1247" w:bottom="964" w:left="1701" w:header="113" w:footer="102" w:gutter="0"/>
           <w:cols w:space="720"/>
           <w:docGrid w:linePitch="360"/>
         </w:sectPr>
@@ -973,7 +973,7 @@
           <w:szCs w:val="24"/>
         </w:rPr>
         <w:tab/>
-        <w:t>10</w:t>
+        <w:t>9</w:t>
       </w:r>
     </w:p>
     <w:p>
@@ -1007,7 +1007,7 @@
           <w:szCs w:val="24"/>
         </w:rPr>
         <w:tab/>
-        <w:t>13</w:t>
+        <w:t>12</w:t>
       </w:r>
     </w:p>
     <w:p>
@@ -1041,7 +1041,7 @@
           <w:szCs w:val="24"/>
         </w:rPr>
         <w:tab/>
-        <w:t>20</w:t>
+        <w:t>19</w:t>
       </w:r>
     </w:p>
     <w:p>
@@ -1075,7 +1075,7 @@
           <w:szCs w:val="24"/>
         </w:rPr>
         <w:tab/>
-        <w:t>25</w:t>
+        <w:t>24</w:t>
       </w:r>
     </w:p>
     <w:p>
@@ -1109,7 +1109,7 @@
           <w:szCs w:val="24"/>
         </w:rPr>
         <w:tab/>
-        <w:t>31</w:t>
+        <w:t>30</w:t>
       </w:r>
     </w:p>
     <w:p>
@@ -1143,7 +1143,7 @@
           <w:szCs w:val="24"/>
         </w:rPr>
         <w:tab/>
-        <w:t>37</w:t>
+        <w:t>36</w:t>
       </w:r>
     </w:p>
     <w:p>
@@ -1177,7 +1177,7 @@
           <w:szCs w:val="24"/>
         </w:rPr>
         <w:tab/>
-        <w:t>39</w:t>
+        <w:t>38</w:t>
       </w:r>
     </w:p>
     <w:p>
@@ -1270,7 +1270,7 @@
           <w:szCs w:val="24"/>
         </w:rPr>
         <w:tab/>
-        <w:t>21</w:t>
+        <w:t>20</w:t>
       </w:r>
     </w:p>
     <w:p>
@@ -1304,7 +1304,7 @@
           <w:szCs w:val="24"/>
         </w:rPr>
         <w:tab/>
-        <w:t>25</w:t>
+        <w:t>24</w:t>
       </w:r>
     </w:p>
     <w:p>
@@ -1338,7 +1338,7 @@
           <w:szCs w:val="24"/>
         </w:rPr>
         <w:tab/>
-        <w:t>27</w:t>
+        <w:t>26</w:t>
       </w:r>
     </w:p>
     <w:p>
@@ -1372,7 +1372,7 @@
           <w:szCs w:val="24"/>
         </w:rPr>
         <w:tab/>
-        <w:t>27</w:t>
+        <w:t>26</w:t>
       </w:r>
     </w:p>
     <w:p>
@@ -1465,7 +1465,7 @@
           <w:szCs w:val="24"/>
         </w:rPr>
         <w:tab/>
-        <w:t>26</w:t>
+        <w:t>25</w:t>
       </w:r>
     </w:p>
     <w:p>
@@ -1499,7 +1499,7 @@
           <w:szCs w:val="24"/>
         </w:rPr>
         <w:tab/>
-        <w:t>28</w:t>
+        <w:t>27</w:t>
       </w:r>
     </w:p>
     <w:p>
@@ -1533,7 +1533,7 @@
           <w:szCs w:val="24"/>
         </w:rPr>
         <w:tab/>
-        <w:t>29</w:t>
+        <w:t>28</w:t>
       </w:r>
     </w:p>
     <w:p>
@@ -10944,7 +10944,7 @@
       <w:headerReference w:type="default" r:id="rId11"/>
       <w:footerReference w:type="default" r:id="rId12"/>
       <w:pgSz w:w="11906" w:h="16838"/>
-      <w:pgMar w:top="1587" w:right="1247" w:bottom="1446" w:left="1701" w:header="170" w:footer="159" w:gutter="0"/>
+      <w:pgMar w:top="1049" w:right="1247" w:bottom="964" w:left="1701" w:header="113" w:footer="102" w:gutter="0"/>
       <w:cols w:space="720"/>
       <w:docGrid w:linePitch="360"/>
     </w:sectPr>
@@ -10973,48 +10973,12 @@
         <w:sz w:val="16"/>
         <w:szCs w:val="16"/>
       </w:rPr>
-      <w:t>Address: P.O. Box 37, Sidi Gaber, Canal El Mahmoudia Street, Smouha, Alexandria, Egypt</w:t>
+      <w:t>Faculty of Dentistry, Pharos University in Alexandria  ·  Canal El Mahmoudia Street, Smouha  ·  +(203) 38 77 026  ·  Dentistry@pua.edu.eg</w:t>
     </w:r>
   </w:p>
   <w:p>
     <w:pPr>
-      <w:spacing w:before="0" w:after="0" w:line="240" w:lineRule="auto"/>
-      <w:ind w:firstLine="0"/>
-      <w:jc w:val="center"/>
-    </w:pPr>
-    <w:r>
-      <w:rPr>
-        <w:rFonts w:ascii="Times New Roman" w:hAnsi="Times New Roman" w:cs="Noto Naskh Arabic" w:eastAsia="Times New Roman"/>
-        <w:b w:val="0"/>
-        <w:i w:val="0"/>
-        <w:color w:val="000000"/>
-        <w:sz w:val="16"/>
-        <w:szCs w:val="16"/>
-      </w:rPr>
-      <w:t>العنوان: صندوق بريد ٣٧ سيدي جابر – شارع قناة المحمودية – سموحة – الإسكندرية – مصر</w:t>
-    </w:r>
-  </w:p>
-  <w:p>
-    <w:pPr>
-      <w:spacing w:before="0" w:after="0" w:line="240" w:lineRule="auto"/>
-      <w:ind w:firstLine="0"/>
-      <w:jc w:val="center"/>
-    </w:pPr>
-    <w:r>
-      <w:rPr>
-        <w:rFonts w:ascii="Times New Roman" w:hAnsi="Times New Roman" w:cs="Times New Roman" w:eastAsia="Times New Roman"/>
-        <w:b w:val="0"/>
-        <w:i w:val="0"/>
-        <w:color w:val="000000"/>
-        <w:sz w:val="16"/>
-        <w:szCs w:val="16"/>
-      </w:rPr>
-      <w:t>Phone: +(203) 38 77 026    Fax: +(203) 383 0249    E-mail: Dentistry@pua.edu.eg    www.pua.edu.eg</w:t>
-    </w:r>
-  </w:p>
-  <w:p>
-    <w:pPr>
-      <w:spacing w:before="60" w:after="0" w:line="240" w:lineRule="auto"/>
+      <w:spacing w:before="40" w:after="0" w:line="240" w:lineRule="auto"/>
       <w:ind w:firstLine="0"/>
       <w:jc w:val="center"/>
     </w:pPr>
@@ -11056,48 +11020,12 @@
         <w:sz w:val="16"/>
         <w:szCs w:val="16"/>
       </w:rPr>
-      <w:t>Address: P.O. Box 37, Sidi Gaber, Canal El Mahmoudia Street, Smouha, Alexandria, Egypt</w:t>
+      <w:t>Faculty of Dentistry, Pharos University in Alexandria  ·  Canal El Mahmoudia Street, Smouha  ·  +(203) 38 77 026  ·  Dentistry@pua.edu.eg</w:t>
     </w:r>
   </w:p>
   <w:p>
     <w:pPr>
-      <w:spacing w:before="0" w:after="0" w:line="240" w:lineRule="auto"/>
-      <w:ind w:firstLine="0"/>
-      <w:jc w:val="center"/>
-    </w:pPr>
-    <w:r>
-      <w:rPr>
-        <w:rFonts w:ascii="Times New Roman" w:hAnsi="Times New Roman" w:cs="Noto Naskh Arabic" w:eastAsia="Times New Roman"/>
-        <w:b w:val="0"/>
-        <w:i w:val="0"/>
-        <w:color w:val="000000"/>
-        <w:sz w:val="16"/>
-        <w:szCs w:val="16"/>
-      </w:rPr>
-      <w:t>العنوان: صندوق بريد ٣٧ سيدي جابر – شارع قناة المحمودية – سموحة – الإسكندرية – مصر</w:t>
-    </w:r>
-  </w:p>
-  <w:p>
-    <w:pPr>
-      <w:spacing w:before="0" w:after="0" w:line="240" w:lineRule="auto"/>
-      <w:ind w:firstLine="0"/>
-      <w:jc w:val="center"/>
-    </w:pPr>
-    <w:r>
-      <w:rPr>
-        <w:rFonts w:ascii="Times New Roman" w:hAnsi="Times New Roman" w:cs="Times New Roman" w:eastAsia="Times New Roman"/>
-        <w:b w:val="0"/>
-        <w:i w:val="0"/>
-        <w:color w:val="000000"/>
-        <w:sz w:val="16"/>
-        <w:szCs w:val="16"/>
-      </w:rPr>
-      <w:t>Phone: +(203) 38 77 026    Fax: +(203) 383 0249    E-mail: Dentistry@pua.edu.eg    www.pua.edu.eg</w:t>
-    </w:r>
-  </w:p>
-  <w:p>
-    <w:pPr>
-      <w:spacing w:before="60" w:after="0" w:line="240" w:lineRule="auto"/>
+      <w:spacing w:before="40" w:after="0" w:line="240" w:lineRule="auto"/>
       <w:ind w:firstLine="0"/>
       <w:jc w:val="center"/>
     </w:pPr>
@@ -11130,7 +11058,7 @@
     <w:r>
       <w:drawing>
         <wp:inline xmlns:a="http://schemas.openxmlformats.org/drawingml/2006/main" xmlns:pic="http://schemas.openxmlformats.org/drawingml/2006/picture">
-          <wp:extent cx="4896000" cy="652800"/>
+          <wp:extent cx="3510000" cy="468000"/>
           <wp:docPr id="1" name="Picture 1"/>
           <wp:cNvGraphicFramePr>
             <a:graphicFrameLocks noChangeAspect="1"/>
@@ -11151,7 +11079,7 @@
                 <pic:spPr>
                   <a:xfrm>
                     <a:off x="0" y="0"/>
-                    <a:ext cx="4896000" cy="652800"/>
+                    <a:ext cx="3510000" cy="468000"/>
                   </a:xfrm>
                   <a:prstGeom prst="rect"/>
                 </pic:spPr>
@@ -11177,7 +11105,7 @@
     <w:r>
       <w:drawing>
         <wp:inline xmlns:a="http://schemas.openxmlformats.org/drawingml/2006/main" xmlns:pic="http://schemas.openxmlformats.org/drawingml/2006/picture">
-          <wp:extent cx="4896000" cy="652800"/>
+          <wp:extent cx="3510000" cy="468000"/>
           <wp:docPr id="1" name="Picture 1"/>
           <wp:cNvGraphicFramePr>
             <a:graphicFrameLocks noChangeAspect="1"/>
@@ -11198,7 +11126,7 @@
                 <pic:spPr>
                   <a:xfrm>
                     <a:off x="0" y="0"/>
-                    <a:ext cx="4896000" cy="652800"/>
+                    <a:ext cx="3510000" cy="468000"/>
                   </a:xfrm>
                   <a:prstGeom prst="rect"/>
                 </pic:spPr>

</xml_diff>

<commit_message>
Open space under front-matter headings and the candidate name
Put a clear gap after Role of Supervisors, Acknowledgements, Contents, the lists, and between the candidate name and the English title so those blocks are not tight in Word or PDF.

Co-authored-by: Ahmed El Gamry <ahmed733676-droid@users.noreply.github.com>
</commit_message>
<xml_diff>
--- a/Thesis_Complete.docx
+++ b/Thesis_Complete.docx
@@ -157,7 +157,7 @@
     <w:p>
       <w:pPr>
         <w:widowControl/>
-        <w:spacing w:before="160" w:after="0" w:lineRule="auto" w:line="312"/>
+        <w:spacing w:before="160" w:after="240" w:lineRule="auto" w:line="312"/>
         <w:ind w:firstLine="0"/>
         <w:jc w:val="center"/>
       </w:pPr>
@@ -176,7 +176,7 @@
     <w:p>
       <w:pPr>
         <w:widowControl/>
-        <w:spacing w:before="0" w:after="400" w:lineRule="auto" w:line="312"/>
+        <w:spacing w:before="0" w:after="720" w:lineRule="auto" w:line="312"/>
         <w:ind w:firstLine="0"/>
         <w:jc w:val="center"/>
       </w:pPr>
@@ -195,7 +195,7 @@
     <w:p>
       <w:pPr>
         <w:widowControl/>
-        <w:spacing w:before="120" w:after="0" w:lineRule="auto" w:line="312"/>
+        <w:spacing w:before="280" w:after="200" w:lineRule="auto" w:line="312"/>
         <w:ind w:firstLine="0"/>
         <w:jc w:val="left"/>
       </w:pPr>
@@ -214,7 +214,7 @@
     <w:p>
       <w:pPr>
         <w:widowControl/>
-        <w:spacing w:before="120" w:after="0" w:lineRule="auto" w:line="312"/>
+        <w:spacing w:before="240" w:after="0" w:lineRule="auto" w:line="312"/>
         <w:ind w:firstLine="0"/>
         <w:jc w:val="center"/>
       </w:pPr>
@@ -271,7 +271,7 @@
     <w:p>
       <w:pPr>
         <w:widowControl/>
-        <w:spacing w:before="120" w:after="0" w:lineRule="auto" w:line="312"/>
+        <w:spacing w:before="240" w:after="160" w:lineRule="auto" w:line="312"/>
         <w:ind w:firstLine="0"/>
         <w:jc w:val="left"/>
       </w:pPr>
@@ -290,7 +290,7 @@
     <w:p>
       <w:pPr>
         <w:widowControl/>
-        <w:spacing w:before="120" w:after="320" w:lineRule="auto" w:line="312"/>
+        <w:spacing w:before="200" w:after="320" w:lineRule="auto" w:line="312"/>
         <w:ind w:firstLine="0"/>
         <w:jc w:val="center"/>
       </w:pPr>
@@ -339,7 +339,7 @@
     <w:p>
       <w:pPr>
         <w:widowControl/>
-        <w:spacing w:before="160" w:after="200" w:lineRule="auto" w:line="312"/>
+        <w:spacing w:before="200" w:after="320" w:lineRule="auto" w:line="312"/>
         <w:ind w:firstLine="0"/>
         <w:jc w:val="center"/>
       </w:pPr>
@@ -410,7 +410,7 @@
         <w:pStyle w:val="Heading1"/>
         <w:keepNext/>
         <w:widowControl/>
-        <w:spacing w:before="0" w:after="320" w:line="240" w:lineRule="auto"/>
+        <w:spacing w:before="240" w:after="840" w:line="240" w:lineRule="auto"/>
         <w:ind w:firstLine="0"/>
         <w:jc w:val="center"/>
       </w:pPr>
@@ -429,7 +429,7 @@
     <w:p>
       <w:pPr>
         <w:widowControl/>
-        <w:spacing w:before="240" w:after="160" w:lineRule="auto" w:line="288"/>
+        <w:spacing w:before="120" w:after="160" w:lineRule="auto" w:line="312"/>
         <w:ind w:left="720" w:hanging="357"/>
         <w:jc w:val="both"/>
       </w:pPr>
@@ -459,7 +459,7 @@
     <w:p>
       <w:pPr>
         <w:widowControl/>
-        <w:spacing w:before="0" w:after="120" w:lineRule="auto" w:line="288"/>
+        <w:spacing w:before="40" w:after="120" w:lineRule="auto" w:line="312"/>
         <w:ind w:firstLine="0" w:left="720"/>
         <w:jc w:val="both"/>
       </w:pPr>
@@ -478,7 +478,7 @@
     <w:p>
       <w:pPr>
         <w:widowControl/>
-        <w:spacing w:before="0" w:after="120" w:lineRule="auto" w:line="288"/>
+        <w:spacing w:before="40" w:after="120" w:lineRule="auto" w:line="312"/>
         <w:ind w:firstLine="0" w:left="720"/>
         <w:jc w:val="both"/>
       </w:pPr>
@@ -497,7 +497,7 @@
     <w:p>
       <w:pPr>
         <w:widowControl/>
-        <w:spacing w:before="0" w:after="120" w:lineRule="auto" w:line="288"/>
+        <w:spacing w:before="40" w:after="120" w:lineRule="auto" w:line="312"/>
         <w:ind w:firstLine="0" w:left="720"/>
         <w:jc w:val="both"/>
       </w:pPr>
@@ -516,7 +516,7 @@
     <w:p>
       <w:pPr>
         <w:widowControl/>
-        <w:spacing w:before="0" w:after="120" w:lineRule="auto" w:line="288"/>
+        <w:spacing w:before="40" w:after="120" w:lineRule="auto" w:line="312"/>
         <w:ind w:firstLine="0" w:left="720"/>
         <w:jc w:val="both"/>
       </w:pPr>
@@ -535,7 +535,7 @@
     <w:p>
       <w:pPr>
         <w:widowControl/>
-        <w:spacing w:before="240" w:after="160" w:lineRule="auto" w:line="288"/>
+        <w:spacing w:before="120" w:after="160" w:lineRule="auto" w:line="312"/>
         <w:ind w:left="720" w:hanging="357"/>
         <w:jc w:val="both"/>
       </w:pPr>
@@ -565,7 +565,7 @@
     <w:p>
       <w:pPr>
         <w:widowControl/>
-        <w:spacing w:before="0" w:after="120" w:lineRule="auto" w:line="288"/>
+        <w:spacing w:before="40" w:after="120" w:lineRule="auto" w:line="312"/>
         <w:ind w:firstLine="0" w:left="720"/>
         <w:jc w:val="both"/>
       </w:pPr>
@@ -584,7 +584,7 @@
     <w:p>
       <w:pPr>
         <w:widowControl/>
-        <w:spacing w:before="0" w:after="120" w:lineRule="auto" w:line="288"/>
+        <w:spacing w:before="40" w:after="120" w:lineRule="auto" w:line="312"/>
         <w:ind w:firstLine="0" w:left="720"/>
         <w:jc w:val="both"/>
       </w:pPr>
@@ -603,7 +603,7 @@
     <w:p>
       <w:pPr>
         <w:widowControl/>
-        <w:spacing w:before="0" w:after="120" w:lineRule="auto" w:line="288"/>
+        <w:spacing w:before="40" w:after="120" w:lineRule="auto" w:line="312"/>
         <w:ind w:firstLine="0" w:left="720"/>
         <w:jc w:val="both"/>
       </w:pPr>
@@ -622,7 +622,7 @@
     <w:p>
       <w:pPr>
         <w:widowControl/>
-        <w:spacing w:before="0" w:after="120" w:lineRule="auto" w:line="288"/>
+        <w:spacing w:before="40" w:after="120" w:lineRule="auto" w:line="312"/>
         <w:ind w:firstLine="0" w:left="720"/>
         <w:jc w:val="both"/>
       </w:pPr>
@@ -644,7 +644,7 @@
         <w:keepNext/>
         <w:pageBreakBefore/>
         <w:widowControl/>
-        <w:spacing w:before="0" w:after="320" w:line="240" w:lineRule="auto"/>
+        <w:spacing w:before="240" w:after="840" w:line="240" w:lineRule="auto"/>
         <w:ind w:firstLine="0"/>
         <w:jc w:val="center"/>
       </w:pPr>
@@ -685,7 +685,7 @@
         <w:keepNext/>
         <w:pageBreakBefore/>
         <w:widowControl/>
-        <w:spacing w:before="0" w:after="320" w:line="240" w:lineRule="auto"/>
+        <w:spacing w:before="240" w:after="840" w:line="240" w:lineRule="auto"/>
         <w:ind w:firstLine="0"/>
         <w:jc w:val="center"/>
       </w:pPr>
@@ -973,7 +973,7 @@
           <w:szCs w:val="24"/>
         </w:rPr>
         <w:tab/>
-        <w:t>9</w:t>
+        <w:t>10</w:t>
       </w:r>
     </w:p>
     <w:p>
@@ -1007,7 +1007,7 @@
           <w:szCs w:val="24"/>
         </w:rPr>
         <w:tab/>
-        <w:t>12</w:t>
+        <w:t>13</w:t>
       </w:r>
     </w:p>
     <w:p>
@@ -1041,7 +1041,7 @@
           <w:szCs w:val="24"/>
         </w:rPr>
         <w:tab/>
-        <w:t>19</w:t>
+        <w:t>20</w:t>
       </w:r>
     </w:p>
     <w:p>
@@ -1075,7 +1075,7 @@
           <w:szCs w:val="24"/>
         </w:rPr>
         <w:tab/>
-        <w:t>24</w:t>
+        <w:t>25</w:t>
       </w:r>
     </w:p>
     <w:p>
@@ -1109,7 +1109,7 @@
           <w:szCs w:val="24"/>
         </w:rPr>
         <w:tab/>
-        <w:t>30</w:t>
+        <w:t>31</w:t>
       </w:r>
     </w:p>
     <w:p>
@@ -1143,7 +1143,7 @@
           <w:szCs w:val="24"/>
         </w:rPr>
         <w:tab/>
-        <w:t>36</w:t>
+        <w:t>37</w:t>
       </w:r>
     </w:p>
     <w:p>
@@ -1177,7 +1177,7 @@
           <w:szCs w:val="24"/>
         </w:rPr>
         <w:tab/>
-        <w:t>38</w:t>
+        <w:t>39</w:t>
       </w:r>
     </w:p>
     <w:p>
@@ -1186,7 +1186,7 @@
         <w:keepNext/>
         <w:pageBreakBefore/>
         <w:widowControl/>
-        <w:spacing w:before="0" w:after="320" w:line="240" w:lineRule="auto"/>
+        <w:spacing w:before="240" w:after="840" w:line="240" w:lineRule="auto"/>
         <w:ind w:firstLine="0"/>
         <w:jc w:val="center"/>
       </w:pPr>
@@ -1270,7 +1270,7 @@
           <w:szCs w:val="24"/>
         </w:rPr>
         <w:tab/>
-        <w:t>20</w:t>
+        <w:t>21</w:t>
       </w:r>
     </w:p>
     <w:p>
@@ -1304,7 +1304,7 @@
           <w:szCs w:val="24"/>
         </w:rPr>
         <w:tab/>
-        <w:t>24</w:t>
+        <w:t>25</w:t>
       </w:r>
     </w:p>
     <w:p>
@@ -1338,7 +1338,7 @@
           <w:szCs w:val="24"/>
         </w:rPr>
         <w:tab/>
-        <w:t>26</w:t>
+        <w:t>27</w:t>
       </w:r>
     </w:p>
     <w:p>
@@ -1372,7 +1372,7 @@
           <w:szCs w:val="24"/>
         </w:rPr>
         <w:tab/>
-        <w:t>26</w:t>
+        <w:t>27</w:t>
       </w:r>
     </w:p>
     <w:p>
@@ -1381,7 +1381,7 @@
         <w:keepNext/>
         <w:pageBreakBefore/>
         <w:widowControl/>
-        <w:spacing w:before="0" w:after="320" w:line="240" w:lineRule="auto"/>
+        <w:spacing w:before="240" w:after="840" w:line="240" w:lineRule="auto"/>
         <w:ind w:firstLine="0"/>
         <w:jc w:val="center"/>
       </w:pPr>
@@ -1465,7 +1465,7 @@
           <w:szCs w:val="24"/>
         </w:rPr>
         <w:tab/>
-        <w:t>25</w:t>
+        <w:t>26</w:t>
       </w:r>
     </w:p>
     <w:p>
@@ -1499,7 +1499,7 @@
           <w:szCs w:val="24"/>
         </w:rPr>
         <w:tab/>
-        <w:t>27</w:t>
+        <w:t>28</w:t>
       </w:r>
     </w:p>
     <w:p>
@@ -1533,7 +1533,7 @@
           <w:szCs w:val="24"/>
         </w:rPr>
         <w:tab/>
-        <w:t>28</w:t>
+        <w:t>29</w:t>
       </w:r>
     </w:p>
     <w:p>
@@ -1542,7 +1542,7 @@
         <w:keepNext/>
         <w:pageBreakBefore/>
         <w:widowControl/>
-        <w:spacing w:before="0" w:after="320" w:line="240" w:lineRule="auto"/>
+        <w:spacing w:before="240" w:after="840" w:line="240" w:lineRule="auto"/>
         <w:ind w:firstLine="0"/>
         <w:jc w:val="center"/>
       </w:pPr>
@@ -1754,7 +1754,7 @@
         <w:keepNext/>
         <w:pageBreakBefore/>
         <w:widowControl/>
-        <w:spacing w:before="0" w:after="320" w:line="240" w:lineRule="auto"/>
+        <w:spacing w:before="240" w:after="840" w:line="240" w:lineRule="auto"/>
         <w:ind w:firstLine="0"/>
         <w:jc w:val="center"/>
       </w:pPr>
@@ -1956,7 +1956,7 @@
         <w:keepNext/>
         <w:pageBreakBefore/>
         <w:widowControl/>
-        <w:spacing w:before="0" w:after="120" w:line="240" w:lineRule="auto"/>
+        <w:spacing w:before="240" w:after="200" w:line="240" w:lineRule="auto"/>
         <w:ind w:firstLine="0"/>
         <w:jc w:val="center"/>
       </w:pPr>
@@ -1977,7 +1977,7 @@
         <w:pStyle w:val="Heading1"/>
         <w:keepNext/>
         <w:widowControl/>
-        <w:spacing w:before="0" w:after="320" w:line="240" w:lineRule="auto"/>
+        <w:spacing w:before="240" w:after="840" w:line="240" w:lineRule="auto"/>
         <w:ind w:firstLine="0"/>
         <w:jc w:val="center"/>
       </w:pPr>
@@ -2474,7 +2474,7 @@
         <w:keepNext/>
         <w:pageBreakBefore/>
         <w:widowControl/>
-        <w:spacing w:before="0" w:after="120" w:line="240" w:lineRule="auto"/>
+        <w:spacing w:before="240" w:after="200" w:line="240" w:lineRule="auto"/>
         <w:ind w:firstLine="0"/>
         <w:jc w:val="center"/>
       </w:pPr>
@@ -2495,7 +2495,7 @@
         <w:pStyle w:val="Heading1"/>
         <w:keepNext/>
         <w:widowControl/>
-        <w:spacing w:before="0" w:after="320" w:line="240" w:lineRule="auto"/>
+        <w:spacing w:before="240" w:after="840" w:line="240" w:lineRule="auto"/>
         <w:ind w:firstLine="0"/>
         <w:jc w:val="center"/>
       </w:pPr>
@@ -4010,7 +4010,7 @@
         <w:keepNext/>
         <w:pageBreakBefore/>
         <w:widowControl/>
-        <w:spacing w:before="0" w:after="120" w:line="240" w:lineRule="auto"/>
+        <w:spacing w:before="240" w:after="200" w:line="240" w:lineRule="auto"/>
         <w:ind w:firstLine="0"/>
         <w:jc w:val="center"/>
       </w:pPr>
@@ -4031,7 +4031,7 @@
         <w:pStyle w:val="Heading1"/>
         <w:keepNext/>
         <w:widowControl/>
-        <w:spacing w:before="0" w:after="320" w:line="240" w:lineRule="auto"/>
+        <w:spacing w:before="240" w:after="840" w:line="240" w:lineRule="auto"/>
         <w:ind w:firstLine="0"/>
         <w:jc w:val="center"/>
       </w:pPr>
@@ -5822,7 +5822,7 @@
         <w:keepNext/>
         <w:pageBreakBefore/>
         <w:widowControl/>
-        <w:spacing w:before="0" w:after="120" w:line="240" w:lineRule="auto"/>
+        <w:spacing w:before="240" w:after="200" w:line="240" w:lineRule="auto"/>
         <w:ind w:firstLine="0"/>
         <w:jc w:val="center"/>
       </w:pPr>
@@ -5843,7 +5843,7 @@
         <w:pStyle w:val="Heading1"/>
         <w:keepNext/>
         <w:widowControl/>
-        <w:spacing w:before="0" w:after="320" w:line="240" w:lineRule="auto"/>
+        <w:spacing w:before="240" w:after="840" w:line="240" w:lineRule="auto"/>
         <w:ind w:firstLine="0"/>
         <w:jc w:val="center"/>
       </w:pPr>
@@ -8758,7 +8758,7 @@
         <w:keepNext/>
         <w:pageBreakBefore/>
         <w:widowControl/>
-        <w:spacing w:before="0" w:after="120" w:line="240" w:lineRule="auto"/>
+        <w:spacing w:before="240" w:after="200" w:line="240" w:lineRule="auto"/>
         <w:ind w:firstLine="0"/>
         <w:jc w:val="center"/>
       </w:pPr>
@@ -8779,7 +8779,7 @@
         <w:pStyle w:val="Heading1"/>
         <w:keepNext/>
         <w:widowControl/>
-        <w:spacing w:before="0" w:after="320" w:line="240" w:lineRule="auto"/>
+        <w:spacing w:before="240" w:after="840" w:line="240" w:lineRule="auto"/>
         <w:ind w:firstLine="0"/>
         <w:jc w:val="center"/>
       </w:pPr>
@@ -9603,7 +9603,7 @@
         <w:keepNext/>
         <w:pageBreakBefore/>
         <w:widowControl/>
-        <w:spacing w:before="0" w:after="120" w:line="240" w:lineRule="auto"/>
+        <w:spacing w:before="240" w:after="200" w:line="240" w:lineRule="auto"/>
         <w:ind w:firstLine="0"/>
         <w:jc w:val="center"/>
       </w:pPr>
@@ -9624,7 +9624,7 @@
         <w:pStyle w:val="Heading1"/>
         <w:keepNext/>
         <w:widowControl/>
-        <w:spacing w:before="0" w:after="320" w:line="240" w:lineRule="auto"/>
+        <w:spacing w:before="240" w:after="840" w:line="240" w:lineRule="auto"/>
         <w:ind w:firstLine="0"/>
         <w:jc w:val="center"/>
       </w:pPr>
@@ -9911,7 +9911,7 @@
         <w:keepNext/>
         <w:pageBreakBefore/>
         <w:widowControl/>
-        <w:spacing w:before="0" w:after="120" w:line="240" w:lineRule="auto"/>
+        <w:spacing w:before="240" w:after="200" w:line="240" w:lineRule="auto"/>
         <w:ind w:firstLine="0"/>
         <w:jc w:val="center"/>
       </w:pPr>
@@ -9932,7 +9932,7 @@
         <w:pStyle w:val="Heading1"/>
         <w:keepNext/>
         <w:widowControl/>
-        <w:spacing w:before="0" w:after="320" w:line="240" w:lineRule="auto"/>
+        <w:spacing w:before="240" w:after="840" w:line="240" w:lineRule="auto"/>
         <w:ind w:firstLine="0"/>
         <w:jc w:val="center"/>
       </w:pPr>
@@ -11571,7 +11571,7 @@
     <w:pPr>
       <w:keepNext/>
       <w:keepLines/>
-      <w:spacing w:before="0" w:after="280" w:line="240" w:lineRule="auto"/>
+      <w:spacing w:before="0" w:after="560" w:line="240" w:lineRule="auto"/>
       <w:ind w:firstLine="0"/>
       <w:jc w:val="center"/>
       <w:outlineLvl w:val="0"/>
@@ -11599,7 +11599,7 @@
     <w:pPr>
       <w:keepNext/>
       <w:keepLines/>
-      <w:spacing w:before="320" w:after="160" w:line="240" w:lineRule="auto"/>
+      <w:spacing w:before="320" w:after="200" w:line="240" w:lineRule="auto"/>
       <w:ind w:firstLine="0"/>
       <w:jc w:val="left"/>
       <w:outlineLvl w:val="1"/>

</xml_diff>

<commit_message>
Add modest space after titles and headings in Word and PDF
Keep the existing page architecture and tables; only open a little air
after chapter titles, the Introduction, and section headings.

Co-authored-by: Ahmed El Gamry <ahmed733676-droid@users.noreply.github.com>
</commit_message>
<xml_diff>
--- a/Thesis_Complete.docx
+++ b/Thesis_Complete.docx
@@ -403,7 +403,7 @@
         <w:pStyle w:val="Heading1"/>
         <w:keepNext/>
         <w:widowControl/>
-        <w:spacing w:before="240" w:after="840" w:line="240" w:lineRule="auto"/>
+        <w:spacing w:before="360" w:after="1120" w:line="240" w:lineRule="auto"/>
         <w:ind w:firstLine="0"/>
         <w:jc w:val="center"/>
       </w:pPr>
@@ -637,7 +637,7 @@
         <w:keepNext/>
         <w:pageBreakBefore/>
         <w:widowControl/>
-        <w:spacing w:before="240" w:after="840" w:line="240" w:lineRule="auto"/>
+        <w:spacing w:before="360" w:after="1120" w:line="240" w:lineRule="auto"/>
         <w:ind w:firstLine="0"/>
         <w:jc w:val="center"/>
       </w:pPr>
@@ -678,7 +678,7 @@
         <w:keepNext/>
         <w:pageBreakBefore/>
         <w:widowControl/>
-        <w:spacing w:before="240" w:after="840" w:line="240" w:lineRule="auto"/>
+        <w:spacing w:before="360" w:after="1120" w:line="240" w:lineRule="auto"/>
         <w:ind w:firstLine="0"/>
         <w:jc w:val="center"/>
       </w:pPr>
@@ -1068,7 +1068,7 @@
           <w:szCs w:val="24"/>
         </w:rPr>
         <w:tab/>
-        <w:t>24</w:t>
+        <w:t>25</w:t>
       </w:r>
     </w:p>
     <w:p>
@@ -1102,7 +1102,7 @@
           <w:szCs w:val="24"/>
         </w:rPr>
         <w:tab/>
-        <w:t>29</w:t>
+        <w:t>30</w:t>
       </w:r>
     </w:p>
     <w:p>
@@ -1136,7 +1136,7 @@
           <w:szCs w:val="24"/>
         </w:rPr>
         <w:tab/>
-        <w:t>35</w:t>
+        <w:t>36</w:t>
       </w:r>
     </w:p>
     <w:p>
@@ -1170,7 +1170,7 @@
           <w:szCs w:val="24"/>
         </w:rPr>
         <w:tab/>
-        <w:t>37</w:t>
+        <w:t>38</w:t>
       </w:r>
     </w:p>
     <w:p>
@@ -1179,7 +1179,7 @@
         <w:keepNext/>
         <w:pageBreakBefore/>
         <w:widowControl/>
-        <w:spacing w:before="240" w:after="840" w:line="240" w:lineRule="auto"/>
+        <w:spacing w:before="360" w:after="1120" w:line="240" w:lineRule="auto"/>
         <w:ind w:firstLine="0"/>
         <w:jc w:val="center"/>
       </w:pPr>
@@ -1297,7 +1297,7 @@
           <w:szCs w:val="24"/>
         </w:rPr>
         <w:tab/>
-        <w:t>24</w:t>
+        <w:t>25</w:t>
       </w:r>
     </w:p>
     <w:p>
@@ -1331,7 +1331,7 @@
           <w:szCs w:val="24"/>
         </w:rPr>
         <w:tab/>
-        <w:t>26</w:t>
+        <w:t>27</w:t>
       </w:r>
     </w:p>
     <w:p>
@@ -1365,7 +1365,7 @@
           <w:szCs w:val="24"/>
         </w:rPr>
         <w:tab/>
-        <w:t>26</w:t>
+        <w:t>27</w:t>
       </w:r>
     </w:p>
     <w:p>
@@ -1374,7 +1374,7 @@
         <w:keepNext/>
         <w:pageBreakBefore/>
         <w:widowControl/>
-        <w:spacing w:before="240" w:after="840" w:line="240" w:lineRule="auto"/>
+        <w:spacing w:before="360" w:after="1120" w:line="240" w:lineRule="auto"/>
         <w:ind w:firstLine="0"/>
         <w:jc w:val="center"/>
       </w:pPr>
@@ -1458,7 +1458,7 @@
           <w:szCs w:val="24"/>
         </w:rPr>
         <w:tab/>
-        <w:t>25</w:t>
+        <w:t>26</w:t>
       </w:r>
     </w:p>
     <w:p>
@@ -1492,7 +1492,7 @@
           <w:szCs w:val="24"/>
         </w:rPr>
         <w:tab/>
-        <w:t>27</w:t>
+        <w:t>28</w:t>
       </w:r>
     </w:p>
     <w:p>
@@ -1526,7 +1526,7 @@
           <w:szCs w:val="24"/>
         </w:rPr>
         <w:tab/>
-        <w:t>28</w:t>
+        <w:t>29</w:t>
       </w:r>
     </w:p>
     <w:p>
@@ -1535,7 +1535,7 @@
         <w:keepNext/>
         <w:pageBreakBefore/>
         <w:widowControl/>
-        <w:spacing w:before="240" w:after="840" w:line="240" w:lineRule="auto"/>
+        <w:spacing w:before="360" w:after="1120" w:line="240" w:lineRule="auto"/>
         <w:ind w:firstLine="0"/>
         <w:jc w:val="center"/>
       </w:pPr>
@@ -2513,7 +2513,7 @@
         <w:keepNext/>
         <w:pageBreakBefore/>
         <w:widowControl/>
-        <w:spacing w:before="240" w:after="840" w:line="240" w:lineRule="auto"/>
+        <w:spacing w:before="360" w:after="1120" w:line="240" w:lineRule="auto"/>
         <w:ind w:firstLine="0"/>
         <w:jc w:val="center"/>
       </w:pPr>
@@ -2715,7 +2715,7 @@
         <w:keepNext/>
         <w:pageBreakBefore/>
         <w:widowControl/>
-        <w:spacing w:before="240" w:after="200" w:line="240" w:lineRule="auto"/>
+        <w:spacing w:before="360" w:after="240" w:line="240" w:lineRule="auto"/>
         <w:ind w:firstLine="0"/>
         <w:jc w:val="center"/>
       </w:pPr>
@@ -2736,7 +2736,7 @@
         <w:pStyle w:val="Heading1"/>
         <w:keepNext/>
         <w:widowControl/>
-        <w:spacing w:before="240" w:after="840" w:line="240" w:lineRule="auto"/>
+        <w:spacing w:before="360" w:after="1280" w:line="240" w:lineRule="auto"/>
         <w:ind w:firstLine="0"/>
         <w:jc w:val="center"/>
       </w:pPr>
@@ -3055,7 +3055,7 @@
         <w:pStyle w:val="Heading2"/>
         <w:keepNext/>
         <w:widowControl/>
-        <w:spacing w:before="320" w:after="160" w:line="240" w:lineRule="auto"/>
+        <w:spacing w:before="440" w:after="280" w:line="240" w:lineRule="auto"/>
         <w:ind w:firstLine="0"/>
         <w:jc w:val="left"/>
       </w:pPr>
@@ -3095,7 +3095,7 @@
         <w:pStyle w:val="Heading2"/>
         <w:keepNext/>
         <w:widowControl/>
-        <w:spacing w:before="320" w:after="160" w:line="240" w:lineRule="auto"/>
+        <w:spacing w:before="440" w:after="280" w:line="240" w:lineRule="auto"/>
         <w:ind w:firstLine="0"/>
         <w:jc w:val="left"/>
       </w:pPr>
@@ -3173,7 +3173,7 @@
         <w:pStyle w:val="Heading2"/>
         <w:keepNext/>
         <w:widowControl/>
-        <w:spacing w:before="320" w:after="160" w:line="240" w:lineRule="auto"/>
+        <w:spacing w:before="440" w:after="280" w:line="240" w:lineRule="auto"/>
         <w:ind w:firstLine="0"/>
         <w:jc w:val="left"/>
       </w:pPr>
@@ -3233,7 +3233,7 @@
         <w:keepNext/>
         <w:pageBreakBefore/>
         <w:widowControl/>
-        <w:spacing w:before="240" w:after="200" w:line="240" w:lineRule="auto"/>
+        <w:spacing w:before="360" w:after="240" w:line="240" w:lineRule="auto"/>
         <w:ind w:firstLine="0"/>
         <w:jc w:val="center"/>
       </w:pPr>
@@ -3254,7 +3254,7 @@
         <w:pStyle w:val="Heading1"/>
         <w:keepNext/>
         <w:widowControl/>
-        <w:spacing w:before="240" w:after="840" w:line="240" w:lineRule="auto"/>
+        <w:spacing w:before="360" w:after="1120" w:line="240" w:lineRule="auto"/>
         <w:ind w:firstLine="0"/>
         <w:jc w:val="center"/>
       </w:pPr>
@@ -3275,7 +3275,7 @@
         <w:pStyle w:val="Heading2"/>
         <w:keepNext/>
         <w:widowControl/>
-        <w:spacing w:before="320" w:after="160" w:line="240" w:lineRule="auto"/>
+        <w:spacing w:before="440" w:after="280" w:line="240" w:lineRule="auto"/>
         <w:ind w:firstLine="0"/>
         <w:jc w:val="left"/>
       </w:pPr>
@@ -3736,7 +3736,7 @@
         <w:pStyle w:val="Heading2"/>
         <w:keepNext/>
         <w:widowControl/>
-        <w:spacing w:before="320" w:after="160" w:line="240" w:lineRule="auto"/>
+        <w:spacing w:before="440" w:after="280" w:line="240" w:lineRule="auto"/>
         <w:ind w:firstLine="0"/>
         <w:jc w:val="left"/>
       </w:pPr>
@@ -4082,7 +4082,7 @@
         <w:pStyle w:val="Heading2"/>
         <w:keepNext/>
         <w:widowControl/>
-        <w:spacing w:before="320" w:after="160" w:line="240" w:lineRule="auto"/>
+        <w:spacing w:before="440" w:after="280" w:line="240" w:lineRule="auto"/>
         <w:ind w:firstLine="0"/>
         <w:jc w:val="left"/>
       </w:pPr>
@@ -4424,7 +4424,7 @@
         <w:pStyle w:val="Heading2"/>
         <w:keepNext/>
         <w:widowControl/>
-        <w:spacing w:before="320" w:after="160" w:line="240" w:lineRule="auto"/>
+        <w:spacing w:before="440" w:after="280" w:line="240" w:lineRule="auto"/>
         <w:ind w:firstLine="0"/>
         <w:jc w:val="left"/>
       </w:pPr>
@@ -4682,7 +4682,7 @@
         <w:pStyle w:val="Heading2"/>
         <w:keepNext/>
         <w:widowControl/>
-        <w:spacing w:before="320" w:after="160" w:line="240" w:lineRule="auto"/>
+        <w:spacing w:before="440" w:after="280" w:line="240" w:lineRule="auto"/>
         <w:ind w:firstLine="0"/>
         <w:jc w:val="left"/>
       </w:pPr>
@@ -4769,7 +4769,7 @@
         <w:keepNext/>
         <w:pageBreakBefore/>
         <w:widowControl/>
-        <w:spacing w:before="240" w:after="200" w:line="240" w:lineRule="auto"/>
+        <w:spacing w:before="360" w:after="240" w:line="240" w:lineRule="auto"/>
         <w:ind w:firstLine="0"/>
         <w:jc w:val="center"/>
       </w:pPr>
@@ -4790,7 +4790,7 @@
         <w:pStyle w:val="Heading1"/>
         <w:keepNext/>
         <w:widowControl/>
-        <w:spacing w:before="240" w:after="840" w:line="240" w:lineRule="auto"/>
+        <w:spacing w:before="360" w:after="1120" w:line="240" w:lineRule="auto"/>
         <w:ind w:firstLine="0"/>
         <w:jc w:val="center"/>
       </w:pPr>
@@ -4811,7 +4811,7 @@
         <w:pStyle w:val="Heading2"/>
         <w:keepNext/>
         <w:widowControl/>
-        <w:spacing w:before="320" w:after="160" w:line="240" w:lineRule="auto"/>
+        <w:spacing w:before="440" w:after="280" w:line="240" w:lineRule="auto"/>
         <w:ind w:firstLine="0"/>
         <w:jc w:val="left"/>
       </w:pPr>
@@ -4969,7 +4969,7 @@
         <w:pStyle w:val="Heading2"/>
         <w:keepNext/>
         <w:widowControl/>
-        <w:spacing w:before="320" w:after="160" w:line="240" w:lineRule="auto"/>
+        <w:spacing w:before="440" w:after="280" w:line="240" w:lineRule="auto"/>
         <w:ind w:firstLine="0"/>
         <w:jc w:val="left"/>
       </w:pPr>
@@ -6204,7 +6204,7 @@
         <w:pStyle w:val="Heading2"/>
         <w:keepNext/>
         <w:widowControl/>
-        <w:spacing w:before="320" w:after="160" w:line="240" w:lineRule="auto"/>
+        <w:spacing w:before="440" w:after="280" w:line="240" w:lineRule="auto"/>
         <w:ind w:firstLine="0"/>
         <w:jc w:val="left"/>
       </w:pPr>
@@ -6263,7 +6263,7 @@
         <w:pStyle w:val="Heading2"/>
         <w:keepNext/>
         <w:widowControl/>
-        <w:spacing w:before="320" w:after="160" w:line="240" w:lineRule="auto"/>
+        <w:spacing w:before="440" w:after="280" w:line="240" w:lineRule="auto"/>
         <w:ind w:firstLine="0"/>
         <w:jc w:val="left"/>
       </w:pPr>
@@ -6326,7 +6326,7 @@
         <w:pStyle w:val="Heading2"/>
         <w:keepNext/>
         <w:widowControl/>
-        <w:spacing w:before="320" w:after="160" w:line="240" w:lineRule="auto"/>
+        <w:spacing w:before="440" w:after="280" w:line="240" w:lineRule="auto"/>
         <w:ind w:firstLine="0"/>
         <w:jc w:val="left"/>
       </w:pPr>
@@ -6435,7 +6435,7 @@
         <w:pStyle w:val="Heading2"/>
         <w:keepNext/>
         <w:widowControl/>
-        <w:spacing w:before="320" w:after="160" w:line="240" w:lineRule="auto"/>
+        <w:spacing w:before="440" w:after="280" w:line="240" w:lineRule="auto"/>
         <w:ind w:firstLine="0"/>
         <w:jc w:val="left"/>
       </w:pPr>
@@ -6589,7 +6589,7 @@
         <w:pStyle w:val="Heading2"/>
         <w:keepNext/>
         <w:widowControl/>
-        <w:spacing w:before="320" w:after="160" w:line="240" w:lineRule="auto"/>
+        <w:spacing w:before="440" w:after="280" w:line="240" w:lineRule="auto"/>
         <w:ind w:firstLine="0"/>
         <w:jc w:val="left"/>
       </w:pPr>
@@ -6630,7 +6630,7 @@
         <w:keepNext/>
         <w:pageBreakBefore/>
         <w:widowControl/>
-        <w:spacing w:before="240" w:after="200" w:line="240" w:lineRule="auto"/>
+        <w:spacing w:before="360" w:after="240" w:line="240" w:lineRule="auto"/>
         <w:ind w:firstLine="0"/>
         <w:jc w:val="center"/>
       </w:pPr>
@@ -6651,7 +6651,7 @@
         <w:pStyle w:val="Heading1"/>
         <w:keepNext/>
         <w:widowControl/>
-        <w:spacing w:before="240" w:after="840" w:line="240" w:lineRule="auto"/>
+        <w:spacing w:before="360" w:after="1120" w:line="240" w:lineRule="auto"/>
         <w:ind w:firstLine="0"/>
         <w:jc w:val="center"/>
       </w:pPr>
@@ -6691,7 +6691,7 @@
         <w:pStyle w:val="Heading2"/>
         <w:keepNext/>
         <w:widowControl/>
-        <w:spacing w:before="320" w:after="160" w:line="240" w:lineRule="auto"/>
+        <w:spacing w:before="440" w:after="280" w:line="240" w:lineRule="auto"/>
         <w:ind w:firstLine="0"/>
         <w:jc w:val="left"/>
       </w:pPr>
@@ -8413,7 +8413,7 @@
         <w:pStyle w:val="Heading2"/>
         <w:keepNext/>
         <w:widowControl/>
-        <w:spacing w:before="320" w:after="160" w:line="240" w:lineRule="auto"/>
+        <w:spacing w:before="440" w:after="280" w:line="240" w:lineRule="auto"/>
         <w:ind w:firstLine="0"/>
         <w:jc w:val="left"/>
       </w:pPr>
@@ -9656,7 +9656,7 @@
         <w:pStyle w:val="Heading2"/>
         <w:keepNext/>
         <w:widowControl/>
-        <w:spacing w:before="320" w:after="160" w:line="240" w:lineRule="auto"/>
+        <w:spacing w:before="440" w:after="280" w:line="240" w:lineRule="auto"/>
         <w:ind w:firstLine="0"/>
         <w:jc w:val="left"/>
       </w:pPr>
@@ -9697,7 +9697,7 @@
         <w:keepNext/>
         <w:pageBreakBefore/>
         <w:widowControl/>
-        <w:spacing w:before="240" w:after="200" w:line="240" w:lineRule="auto"/>
+        <w:spacing w:before="360" w:after="240" w:line="240" w:lineRule="auto"/>
         <w:ind w:firstLine="0"/>
         <w:jc w:val="center"/>
       </w:pPr>
@@ -9718,7 +9718,7 @@
         <w:pStyle w:val="Heading1"/>
         <w:keepNext/>
         <w:widowControl/>
-        <w:spacing w:before="240" w:after="840" w:line="240" w:lineRule="auto"/>
+        <w:spacing w:before="360" w:after="1120" w:line="240" w:lineRule="auto"/>
         <w:ind w:firstLine="0"/>
         <w:jc w:val="center"/>
       </w:pPr>
@@ -9758,7 +9758,7 @@
         <w:pStyle w:val="Heading2"/>
         <w:keepNext/>
         <w:widowControl/>
-        <w:spacing w:before="320" w:after="160" w:line="240" w:lineRule="auto"/>
+        <w:spacing w:before="440" w:after="280" w:line="240" w:lineRule="auto"/>
         <w:ind w:firstLine="0"/>
         <w:jc w:val="left"/>
       </w:pPr>
@@ -9901,7 +9901,7 @@
         <w:pStyle w:val="Heading2"/>
         <w:keepNext/>
         <w:widowControl/>
-        <w:spacing w:before="320" w:after="160" w:line="240" w:lineRule="auto"/>
+        <w:spacing w:before="440" w:after="280" w:line="240" w:lineRule="auto"/>
         <w:ind w:firstLine="0"/>
         <w:jc w:val="left"/>
       </w:pPr>
@@ -10159,7 +10159,7 @@
         <w:pStyle w:val="Heading2"/>
         <w:keepNext/>
         <w:widowControl/>
-        <w:spacing w:before="320" w:after="160" w:line="240" w:lineRule="auto"/>
+        <w:spacing w:before="440" w:after="280" w:line="240" w:lineRule="auto"/>
         <w:ind w:firstLine="0"/>
         <w:jc w:val="left"/>
       </w:pPr>
@@ -10306,7 +10306,7 @@
         <w:pStyle w:val="Heading2"/>
         <w:keepNext/>
         <w:widowControl/>
-        <w:spacing w:before="320" w:after="160" w:line="240" w:lineRule="auto"/>
+        <w:spacing w:before="440" w:after="280" w:line="240" w:lineRule="auto"/>
         <w:ind w:firstLine="0"/>
         <w:jc w:val="left"/>
       </w:pPr>
@@ -10392,7 +10392,7 @@
         <w:pStyle w:val="Heading2"/>
         <w:keepNext/>
         <w:widowControl/>
-        <w:spacing w:before="320" w:after="160" w:line="240" w:lineRule="auto"/>
+        <w:spacing w:before="440" w:after="280" w:line="240" w:lineRule="auto"/>
         <w:ind w:firstLine="0"/>
         <w:jc w:val="left"/>
       </w:pPr>
@@ -10501,7 +10501,7 @@
         <w:pStyle w:val="Heading2"/>
         <w:keepNext/>
         <w:widowControl/>
-        <w:spacing w:before="320" w:after="160" w:line="240" w:lineRule="auto"/>
+        <w:spacing w:before="440" w:after="280" w:line="240" w:lineRule="auto"/>
         <w:ind w:firstLine="0"/>
         <w:jc w:val="left"/>
       </w:pPr>
@@ -10542,7 +10542,7 @@
         <w:keepNext/>
         <w:pageBreakBefore/>
         <w:widowControl/>
-        <w:spacing w:before="240" w:after="200" w:line="240" w:lineRule="auto"/>
+        <w:spacing w:before="360" w:after="240" w:line="240" w:lineRule="auto"/>
         <w:ind w:firstLine="0"/>
         <w:jc w:val="center"/>
       </w:pPr>
@@ -10563,7 +10563,7 @@
         <w:pStyle w:val="Heading1"/>
         <w:keepNext/>
         <w:widowControl/>
-        <w:spacing w:before="240" w:after="840" w:line="240" w:lineRule="auto"/>
+        <w:spacing w:before="360" w:after="1120" w:line="240" w:lineRule="auto"/>
         <w:ind w:firstLine="0"/>
         <w:jc w:val="center"/>
       </w:pPr>
@@ -10584,7 +10584,7 @@
         <w:pStyle w:val="Heading2"/>
         <w:keepNext/>
         <w:widowControl/>
-        <w:spacing w:before="320" w:after="160" w:line="240" w:lineRule="auto"/>
+        <w:spacing w:before="440" w:after="280" w:line="240" w:lineRule="auto"/>
         <w:ind w:firstLine="0"/>
         <w:jc w:val="left"/>
       </w:pPr>
@@ -10738,7 +10738,7 @@
         <w:pStyle w:val="Heading2"/>
         <w:keepNext/>
         <w:widowControl/>
-        <w:spacing w:before="320" w:after="160" w:line="240" w:lineRule="auto"/>
+        <w:spacing w:before="440" w:after="280" w:line="240" w:lineRule="auto"/>
         <w:ind w:firstLine="0"/>
         <w:jc w:val="left"/>
       </w:pPr>
@@ -10850,7 +10850,7 @@
         <w:keepNext/>
         <w:pageBreakBefore/>
         <w:widowControl/>
-        <w:spacing w:before="240" w:after="200" w:line="240" w:lineRule="auto"/>
+        <w:spacing w:before="360" w:after="240" w:line="240" w:lineRule="auto"/>
         <w:ind w:firstLine="0"/>
         <w:jc w:val="center"/>
       </w:pPr>
@@ -10871,7 +10871,7 @@
         <w:pStyle w:val="Heading1"/>
         <w:keepNext/>
         <w:widowControl/>
-        <w:spacing w:before="240" w:after="840" w:line="240" w:lineRule="auto"/>
+        <w:spacing w:before="360" w:after="1120" w:line="240" w:lineRule="auto"/>
         <w:ind w:firstLine="0"/>
         <w:jc w:val="center"/>
       </w:pPr>
@@ -12416,7 +12416,7 @@
     <w:pPr>
       <w:keepNext/>
       <w:keepLines/>
-      <w:spacing w:before="240" w:after="840" w:line="240" w:lineRule="auto"/>
+      <w:spacing w:before="360" w:after="1120" w:line="240" w:lineRule="auto"/>
       <w:ind w:firstLine="0"/>
       <w:jc w:val="center"/>
       <w:outlineLvl w:val="0"/>
@@ -12444,7 +12444,7 @@
     <w:pPr>
       <w:keepNext/>
       <w:keepLines/>
-      <w:spacing w:before="320" w:after="200" w:line="240" w:lineRule="auto"/>
+      <w:spacing w:before="440" w:after="280" w:line="240" w:lineRule="auto"/>
       <w:ind w:firstLine="0"/>
       <w:jc w:val="left"/>
       <w:outlineLvl w:val="1"/>

</xml_diff>

<commit_message>
Rebuild Word and PDF with the organized abbreviations table
The list of abbreviations is now a two-column table with a header row
and even, aligned entries.

Co-authored-by: Ahmed El Gamry <ahmed733676-droid@users.noreply.github.com>
</commit_message>
<xml_diff>
--- a/Thesis_Complete.docx
+++ b/Thesis_Complete.docx
@@ -1559,29 +1559,32 @@
         <w:tblLayout w:type="fixed"/>
       </w:tblPr>
       <w:tblGrid>
-        <w:gridCol w:w="2494"/>
-        <w:gridCol w:w="6463"/>
+        <w:gridCol w:w="2154"/>
+        <w:gridCol w:w="6804"/>
       </w:tblGrid>
       <w:tr>
         <w:trPr>
           <w:cantSplit/>
           <w:tblHeader/>
+          <w:trHeight w:val="340" w:hRule="atLeast"/>
         </w:trPr>
         <w:tc>
           <w:tcPr>
-            <w:tcW w:type="dxa" w:w="2494"/>
-            <w:tcW w:w="2494" w:type="dxa"/>
+            <w:tcW w:type="dxa" w:w="2154"/>
+            <w:tcW w:w="2154" w:type="dxa"/>
+            <w:noWrap/>
             <w:vAlign w:val="center"/>
             <w:tcMar>
-              <w:top w:w="70" w:type="dxa"/>
-              <w:left w:w="70" w:type="dxa"/>
-              <w:bottom w:w="70" w:type="dxa"/>
-              <w:right w:w="70" w:type="dxa"/>
+              <w:top w:w="80" w:type="dxa"/>
+              <w:left w:w="80" w:type="dxa"/>
+              <w:bottom w:w="80" w:type="dxa"/>
+              <w:right w:w="80" w:type="dxa"/>
             </w:tcMar>
+            <w:shd w:val="clear" w:color="auto" w:fill="E7E6E6"/>
             <w:tcBorders>
               <w:top w:val="single" w:sz="18" w:space="0" w:color="000000"/>
               <w:left w:val="nil" w:sz="0" w:space="0" w:color="auto"/>
-              <w:bottom w:val="single" w:sz="8" w:space="0" w:color="000000"/>
+              <w:bottom w:val="single" w:sz="12" w:space="0" w:color="000000"/>
               <w:right w:val="nil" w:sz="0" w:space="0" w:color="auto"/>
             </w:tcBorders>
           </w:tcPr>
@@ -1600,8 +1603,8 @@
                 <w:b/>
                 <w:i w:val="0"/>
                 <w:color w:val="000000"/>
-                <w:sz w:val="22"/>
-                <w:szCs w:val="22"/>
+                <w:sz w:val="24"/>
+                <w:szCs w:val="24"/>
               </w:rPr>
               <w:t>Abbreviation</w:t>
             </w:r>
@@ -1609,19 +1612,20 @@
         </w:tc>
         <w:tc>
           <w:tcPr>
-            <w:tcW w:type="dxa" w:w="6463"/>
-            <w:tcW w:w="6463" w:type="dxa"/>
+            <w:tcW w:type="dxa" w:w="6803"/>
+            <w:tcW w:w="6804" w:type="dxa"/>
             <w:vAlign w:val="center"/>
             <w:tcMar>
-              <w:top w:w="70" w:type="dxa"/>
-              <w:left w:w="70" w:type="dxa"/>
-              <w:bottom w:w="70" w:type="dxa"/>
-              <w:right w:w="70" w:type="dxa"/>
+              <w:top w:w="80" w:type="dxa"/>
+              <w:left w:w="80" w:type="dxa"/>
+              <w:bottom w:w="80" w:type="dxa"/>
+              <w:right w:w="80" w:type="dxa"/>
             </w:tcMar>
+            <w:shd w:val="clear" w:color="auto" w:fill="E7E6E6"/>
             <w:tcBorders>
               <w:top w:val="single" w:sz="18" w:space="0" w:color="000000"/>
               <w:left w:val="nil" w:sz="0" w:space="0" w:color="auto"/>
-              <w:bottom w:val="single" w:sz="8" w:space="0" w:color="000000"/>
+              <w:bottom w:val="single" w:sz="12" w:space="0" w:color="000000"/>
               <w:right w:val="nil" w:sz="0" w:space="0" w:color="auto"/>
             </w:tcBorders>
           </w:tcPr>
@@ -1640,8 +1644,8 @@
                 <w:b/>
                 <w:i w:val="0"/>
                 <w:color w:val="000000"/>
-                <w:sz w:val="22"/>
-                <w:szCs w:val="22"/>
+                <w:sz w:val="24"/>
+                <w:szCs w:val="24"/>
               </w:rPr>
               <w:t>Meaning</w:t>
             </w:r>
@@ -1651,22 +1655,24 @@
       <w:tr>
         <w:trPr>
           <w:cantSplit/>
+          <w:trHeight w:val="320" w:hRule="atLeast"/>
         </w:trPr>
         <w:tc>
           <w:tcPr>
-            <w:tcW w:type="dxa" w:w="2494"/>
-            <w:tcW w:w="2494" w:type="dxa"/>
+            <w:tcW w:type="dxa" w:w="2154"/>
+            <w:tcW w:w="2154" w:type="dxa"/>
+            <w:noWrap/>
             <w:vAlign w:val="center"/>
             <w:tcMar>
-              <w:top w:w="70" w:type="dxa"/>
-              <w:left w:w="70" w:type="dxa"/>
-              <w:bottom w:w="70" w:type="dxa"/>
-              <w:right w:w="70" w:type="dxa"/>
+              <w:top w:w="80" w:type="dxa"/>
+              <w:left w:w="80" w:type="dxa"/>
+              <w:bottom w:w="80" w:type="dxa"/>
+              <w:right w:w="80" w:type="dxa"/>
             </w:tcMar>
             <w:tcBorders>
               <w:top w:val="nil" w:sz="0" w:space="0" w:color="auto"/>
               <w:left w:val="nil" w:sz="0" w:space="0" w:color="auto"/>
-              <w:bottom w:val="nil" w:sz="0" w:space="0" w:color="auto"/>
+              <w:bottom w:val="single" w:sz="4" w:space="0" w:color="000000"/>
               <w:right w:val="nil" w:sz="0" w:space="0" w:color="auto"/>
             </w:tcBorders>
           </w:tcPr>
@@ -1685,8 +1691,8 @@
                 <w:b/>
                 <w:i w:val="0"/>
                 <w:color w:val="000000"/>
-                <w:sz w:val="22"/>
-                <w:szCs w:val="22"/>
+                <w:sz w:val="24"/>
+                <w:szCs w:val="24"/>
               </w:rPr>
               <w:t>ANOVA</w:t>
             </w:r>
@@ -1694,19 +1700,19 @@
         </w:tc>
         <w:tc>
           <w:tcPr>
-            <w:tcW w:type="dxa" w:w="6463"/>
-            <w:tcW w:w="6463" w:type="dxa"/>
+            <w:tcW w:type="dxa" w:w="6803"/>
+            <w:tcW w:w="6804" w:type="dxa"/>
             <w:vAlign w:val="center"/>
             <w:tcMar>
-              <w:top w:w="70" w:type="dxa"/>
-              <w:left w:w="70" w:type="dxa"/>
-              <w:bottom w:w="70" w:type="dxa"/>
-              <w:right w:w="70" w:type="dxa"/>
+              <w:top w:w="80" w:type="dxa"/>
+              <w:left w:w="80" w:type="dxa"/>
+              <w:bottom w:w="80" w:type="dxa"/>
+              <w:right w:w="80" w:type="dxa"/>
             </w:tcMar>
             <w:tcBorders>
               <w:top w:val="nil" w:sz="0" w:space="0" w:color="auto"/>
               <w:left w:val="nil" w:sz="0" w:space="0" w:color="auto"/>
-              <w:bottom w:val="nil" w:sz="0" w:space="0" w:color="auto"/>
+              <w:bottom w:val="single" w:sz="4" w:space="0" w:color="000000"/>
               <w:right w:val="nil" w:sz="0" w:space="0" w:color="auto"/>
             </w:tcBorders>
           </w:tcPr>
@@ -1725,8 +1731,8 @@
                 <w:b w:val="0"/>
                 <w:i w:val="0"/>
                 <w:color w:val="000000"/>
-                <w:sz w:val="22"/>
-                <w:szCs w:val="22"/>
+                <w:sz w:val="24"/>
+                <w:szCs w:val="24"/>
               </w:rPr>
               <w:t>analysis of variance</w:t>
             </w:r>
@@ -1736,22 +1742,24 @@
       <w:tr>
         <w:trPr>
           <w:cantSplit/>
+          <w:trHeight w:val="320" w:hRule="atLeast"/>
         </w:trPr>
         <w:tc>
           <w:tcPr>
-            <w:tcW w:type="dxa" w:w="2494"/>
-            <w:tcW w:w="2494" w:type="dxa"/>
+            <w:tcW w:type="dxa" w:w="2154"/>
+            <w:tcW w:w="2154" w:type="dxa"/>
+            <w:noWrap/>
             <w:vAlign w:val="center"/>
             <w:tcMar>
-              <w:top w:w="70" w:type="dxa"/>
-              <w:left w:w="70" w:type="dxa"/>
-              <w:bottom w:w="70" w:type="dxa"/>
-              <w:right w:w="70" w:type="dxa"/>
+              <w:top w:w="80" w:type="dxa"/>
+              <w:left w:w="80" w:type="dxa"/>
+              <w:bottom w:w="80" w:type="dxa"/>
+              <w:right w:w="80" w:type="dxa"/>
             </w:tcMar>
             <w:tcBorders>
               <w:top w:val="nil" w:sz="0" w:space="0" w:color="auto"/>
               <w:left w:val="nil" w:sz="0" w:space="0" w:color="auto"/>
-              <w:bottom w:val="nil" w:sz="0" w:space="0" w:color="auto"/>
+              <w:bottom w:val="single" w:sz="4" w:space="0" w:color="000000"/>
               <w:right w:val="nil" w:sz="0" w:space="0" w:color="auto"/>
             </w:tcBorders>
           </w:tcPr>
@@ -1770,8 +1778,8 @@
                 <w:b/>
                 <w:i w:val="0"/>
                 <w:color w:val="000000"/>
-                <w:sz w:val="22"/>
-                <w:szCs w:val="22"/>
+                <w:sz w:val="24"/>
+                <w:szCs w:val="24"/>
               </w:rPr>
               <w:t>CAD/CAM</w:t>
             </w:r>
@@ -1779,19 +1787,19 @@
         </w:tc>
         <w:tc>
           <w:tcPr>
-            <w:tcW w:type="dxa" w:w="6463"/>
-            <w:tcW w:w="6463" w:type="dxa"/>
+            <w:tcW w:type="dxa" w:w="6803"/>
+            <w:tcW w:w="6804" w:type="dxa"/>
             <w:vAlign w:val="center"/>
             <w:tcMar>
-              <w:top w:w="70" w:type="dxa"/>
-              <w:left w:w="70" w:type="dxa"/>
-              <w:bottom w:w="70" w:type="dxa"/>
-              <w:right w:w="70" w:type="dxa"/>
+              <w:top w:w="80" w:type="dxa"/>
+              <w:left w:w="80" w:type="dxa"/>
+              <w:bottom w:w="80" w:type="dxa"/>
+              <w:right w:w="80" w:type="dxa"/>
             </w:tcMar>
             <w:tcBorders>
               <w:top w:val="nil" w:sz="0" w:space="0" w:color="auto"/>
               <w:left w:val="nil" w:sz="0" w:space="0" w:color="auto"/>
-              <w:bottom w:val="nil" w:sz="0" w:space="0" w:color="auto"/>
+              <w:bottom w:val="single" w:sz="4" w:space="0" w:color="000000"/>
               <w:right w:val="nil" w:sz="0" w:space="0" w:color="auto"/>
             </w:tcBorders>
           </w:tcPr>
@@ -1810,8 +1818,8 @@
                 <w:b w:val="0"/>
                 <w:i w:val="0"/>
                 <w:color w:val="000000"/>
-                <w:sz w:val="22"/>
-                <w:szCs w:val="22"/>
+                <w:sz w:val="24"/>
+                <w:szCs w:val="24"/>
               </w:rPr>
               <w:t>computer-aided design / computer-aided manufacture</w:t>
             </w:r>
@@ -1821,22 +1829,24 @@
       <w:tr>
         <w:trPr>
           <w:cantSplit/>
+          <w:trHeight w:val="320" w:hRule="atLeast"/>
         </w:trPr>
         <w:tc>
           <w:tcPr>
-            <w:tcW w:type="dxa" w:w="2494"/>
-            <w:tcW w:w="2494" w:type="dxa"/>
+            <w:tcW w:type="dxa" w:w="2154"/>
+            <w:tcW w:w="2154" w:type="dxa"/>
+            <w:noWrap/>
             <w:vAlign w:val="center"/>
             <w:tcMar>
-              <w:top w:w="70" w:type="dxa"/>
-              <w:left w:w="70" w:type="dxa"/>
-              <w:bottom w:w="70" w:type="dxa"/>
-              <w:right w:w="70" w:type="dxa"/>
+              <w:top w:w="80" w:type="dxa"/>
+              <w:left w:w="80" w:type="dxa"/>
+              <w:bottom w:w="80" w:type="dxa"/>
+              <w:right w:w="80" w:type="dxa"/>
             </w:tcMar>
             <w:tcBorders>
               <w:top w:val="nil" w:sz="0" w:space="0" w:color="auto"/>
               <w:left w:val="nil" w:sz="0" w:space="0" w:color="auto"/>
-              <w:bottom w:val="nil" w:sz="0" w:space="0" w:color="auto"/>
+              <w:bottom w:val="single" w:sz="4" w:space="0" w:color="000000"/>
               <w:right w:val="nil" w:sz="0" w:space="0" w:color="auto"/>
             </w:tcBorders>
           </w:tcPr>
@@ -1855,8 +1865,8 @@
                 <w:b/>
                 <w:i w:val="0"/>
                 <w:color w:val="000000"/>
-                <w:sz w:val="22"/>
-                <w:szCs w:val="22"/>
+                <w:sz w:val="24"/>
+                <w:szCs w:val="24"/>
               </w:rPr>
               <w:t>ISO</w:t>
             </w:r>
@@ -1864,19 +1874,19 @@
         </w:tc>
         <w:tc>
           <w:tcPr>
-            <w:tcW w:type="dxa" w:w="6463"/>
-            <w:tcW w:w="6463" w:type="dxa"/>
+            <w:tcW w:type="dxa" w:w="6803"/>
+            <w:tcW w:w="6804" w:type="dxa"/>
             <w:vAlign w:val="center"/>
             <w:tcMar>
-              <w:top w:w="70" w:type="dxa"/>
-              <w:left w:w="70" w:type="dxa"/>
-              <w:bottom w:w="70" w:type="dxa"/>
-              <w:right w:w="70" w:type="dxa"/>
+              <w:top w:w="80" w:type="dxa"/>
+              <w:left w:w="80" w:type="dxa"/>
+              <w:bottom w:w="80" w:type="dxa"/>
+              <w:right w:w="80" w:type="dxa"/>
             </w:tcMar>
             <w:tcBorders>
               <w:top w:val="nil" w:sz="0" w:space="0" w:color="auto"/>
               <w:left w:val="nil" w:sz="0" w:space="0" w:color="auto"/>
-              <w:bottom w:val="nil" w:sz="0" w:space="0" w:color="auto"/>
+              <w:bottom w:val="single" w:sz="4" w:space="0" w:color="000000"/>
               <w:right w:val="nil" w:sz="0" w:space="0" w:color="auto"/>
             </w:tcBorders>
           </w:tcPr>
@@ -1895,8 +1905,8 @@
                 <w:b w:val="0"/>
                 <w:i w:val="0"/>
                 <w:color w:val="000000"/>
-                <w:sz w:val="22"/>
-                <w:szCs w:val="22"/>
+                <w:sz w:val="24"/>
+                <w:szCs w:val="24"/>
               </w:rPr>
               <w:t>International Organization for Standardization</w:t>
             </w:r>
@@ -1906,22 +1916,24 @@
       <w:tr>
         <w:trPr>
           <w:cantSplit/>
+          <w:trHeight w:val="320" w:hRule="atLeast"/>
         </w:trPr>
         <w:tc>
           <w:tcPr>
-            <w:tcW w:type="dxa" w:w="2494"/>
-            <w:tcW w:w="2494" w:type="dxa"/>
+            <w:tcW w:type="dxa" w:w="2154"/>
+            <w:tcW w:w="2154" w:type="dxa"/>
+            <w:noWrap/>
             <w:vAlign w:val="center"/>
             <w:tcMar>
-              <w:top w:w="70" w:type="dxa"/>
-              <w:left w:w="70" w:type="dxa"/>
-              <w:bottom w:w="70" w:type="dxa"/>
-              <w:right w:w="70" w:type="dxa"/>
+              <w:top w:w="80" w:type="dxa"/>
+              <w:left w:w="80" w:type="dxa"/>
+              <w:bottom w:w="80" w:type="dxa"/>
+              <w:right w:w="80" w:type="dxa"/>
             </w:tcMar>
             <w:tcBorders>
               <w:top w:val="nil" w:sz="0" w:space="0" w:color="auto"/>
               <w:left w:val="nil" w:sz="0" w:space="0" w:color="auto"/>
-              <w:bottom w:val="nil" w:sz="0" w:space="0" w:color="auto"/>
+              <w:bottom w:val="single" w:sz="4" w:space="0" w:color="000000"/>
               <w:right w:val="nil" w:sz="0" w:space="0" w:color="auto"/>
             </w:tcBorders>
           </w:tcPr>
@@ -1940,8 +1952,8 @@
                 <w:b/>
                 <w:i w:val="0"/>
                 <w:color w:val="000000"/>
-                <w:sz w:val="22"/>
-                <w:szCs w:val="22"/>
+                <w:sz w:val="24"/>
+                <w:szCs w:val="24"/>
               </w:rPr>
               <w:t>LED</w:t>
             </w:r>
@@ -1949,19 +1961,19 @@
         </w:tc>
         <w:tc>
           <w:tcPr>
-            <w:tcW w:type="dxa" w:w="6463"/>
-            <w:tcW w:w="6463" w:type="dxa"/>
+            <w:tcW w:type="dxa" w:w="6803"/>
+            <w:tcW w:w="6804" w:type="dxa"/>
             <w:vAlign w:val="center"/>
             <w:tcMar>
-              <w:top w:w="70" w:type="dxa"/>
-              <w:left w:w="70" w:type="dxa"/>
-              <w:bottom w:w="70" w:type="dxa"/>
-              <w:right w:w="70" w:type="dxa"/>
+              <w:top w:w="80" w:type="dxa"/>
+              <w:left w:w="80" w:type="dxa"/>
+              <w:bottom w:w="80" w:type="dxa"/>
+              <w:right w:w="80" w:type="dxa"/>
             </w:tcMar>
             <w:tcBorders>
               <w:top w:val="nil" w:sz="0" w:space="0" w:color="auto"/>
               <w:left w:val="nil" w:sz="0" w:space="0" w:color="auto"/>
-              <w:bottom w:val="nil" w:sz="0" w:space="0" w:color="auto"/>
+              <w:bottom w:val="single" w:sz="4" w:space="0" w:color="000000"/>
               <w:right w:val="nil" w:sz="0" w:space="0" w:color="auto"/>
             </w:tcBorders>
           </w:tcPr>
@@ -1980,8 +1992,8 @@
                 <w:b w:val="0"/>
                 <w:i w:val="0"/>
                 <w:color w:val="000000"/>
-                <w:sz w:val="22"/>
-                <w:szCs w:val="22"/>
+                <w:sz w:val="24"/>
+                <w:szCs w:val="24"/>
               </w:rPr>
               <w:t>light-emitting diode</w:t>
             </w:r>
@@ -1991,22 +2003,24 @@
       <w:tr>
         <w:trPr>
           <w:cantSplit/>
+          <w:trHeight w:val="320" w:hRule="atLeast"/>
         </w:trPr>
         <w:tc>
           <w:tcPr>
-            <w:tcW w:type="dxa" w:w="2494"/>
-            <w:tcW w:w="2494" w:type="dxa"/>
+            <w:tcW w:type="dxa" w:w="2154"/>
+            <w:tcW w:w="2154" w:type="dxa"/>
+            <w:noWrap/>
             <w:vAlign w:val="center"/>
             <w:tcMar>
-              <w:top w:w="70" w:type="dxa"/>
-              <w:left w:w="70" w:type="dxa"/>
-              <w:bottom w:w="70" w:type="dxa"/>
-              <w:right w:w="70" w:type="dxa"/>
+              <w:top w:w="80" w:type="dxa"/>
+              <w:left w:w="80" w:type="dxa"/>
+              <w:bottom w:w="80" w:type="dxa"/>
+              <w:right w:w="80" w:type="dxa"/>
             </w:tcMar>
             <w:tcBorders>
               <w:top w:val="nil" w:sz="0" w:space="0" w:color="auto"/>
               <w:left w:val="nil" w:sz="0" w:space="0" w:color="auto"/>
-              <w:bottom w:val="nil" w:sz="0" w:space="0" w:color="auto"/>
+              <w:bottom w:val="single" w:sz="4" w:space="0" w:color="000000"/>
               <w:right w:val="nil" w:sz="0" w:space="0" w:color="auto"/>
             </w:tcBorders>
           </w:tcPr>
@@ -2025,8 +2039,8 @@
                 <w:b/>
                 <w:i w:val="0"/>
                 <w:color w:val="000000"/>
-                <w:sz w:val="22"/>
-                <w:szCs w:val="22"/>
+                <w:sz w:val="24"/>
+                <w:szCs w:val="24"/>
               </w:rPr>
               <w:t>Ra</w:t>
             </w:r>
@@ -2034,19 +2048,19 @@
         </w:tc>
         <w:tc>
           <w:tcPr>
-            <w:tcW w:type="dxa" w:w="6463"/>
-            <w:tcW w:w="6463" w:type="dxa"/>
+            <w:tcW w:type="dxa" w:w="6803"/>
+            <w:tcW w:w="6804" w:type="dxa"/>
             <w:vAlign w:val="center"/>
             <w:tcMar>
-              <w:top w:w="70" w:type="dxa"/>
-              <w:left w:w="70" w:type="dxa"/>
-              <w:bottom w:w="70" w:type="dxa"/>
-              <w:right w:w="70" w:type="dxa"/>
+              <w:top w:w="80" w:type="dxa"/>
+              <w:left w:w="80" w:type="dxa"/>
+              <w:bottom w:w="80" w:type="dxa"/>
+              <w:right w:w="80" w:type="dxa"/>
             </w:tcMar>
             <w:tcBorders>
               <w:top w:val="nil" w:sz="0" w:space="0" w:color="auto"/>
               <w:left w:val="nil" w:sz="0" w:space="0" w:color="auto"/>
-              <w:bottom w:val="nil" w:sz="0" w:space="0" w:color="auto"/>
+              <w:bottom w:val="single" w:sz="4" w:space="0" w:color="000000"/>
               <w:right w:val="nil" w:sz="0" w:space="0" w:color="auto"/>
             </w:tcBorders>
           </w:tcPr>
@@ -2065,8 +2079,8 @@
                 <w:b w:val="0"/>
                 <w:i w:val="0"/>
                 <w:color w:val="000000"/>
-                <w:sz w:val="22"/>
-                <w:szCs w:val="22"/>
+                <w:sz w:val="24"/>
+                <w:szCs w:val="24"/>
               </w:rPr>
               <w:t>arithmetic mean roughness</w:t>
             </w:r>
@@ -2076,22 +2090,24 @@
       <w:tr>
         <w:trPr>
           <w:cantSplit/>
+          <w:trHeight w:val="320" w:hRule="atLeast"/>
         </w:trPr>
         <w:tc>
           <w:tcPr>
-            <w:tcW w:type="dxa" w:w="2494"/>
-            <w:tcW w:w="2494" w:type="dxa"/>
+            <w:tcW w:type="dxa" w:w="2154"/>
+            <w:tcW w:w="2154" w:type="dxa"/>
+            <w:noWrap/>
             <w:vAlign w:val="center"/>
             <w:tcMar>
-              <w:top w:w="70" w:type="dxa"/>
-              <w:left w:w="70" w:type="dxa"/>
-              <w:bottom w:w="70" w:type="dxa"/>
-              <w:right w:w="70" w:type="dxa"/>
+              <w:top w:w="80" w:type="dxa"/>
+              <w:left w:w="80" w:type="dxa"/>
+              <w:bottom w:w="80" w:type="dxa"/>
+              <w:right w:w="80" w:type="dxa"/>
             </w:tcMar>
             <w:tcBorders>
               <w:top w:val="nil" w:sz="0" w:space="0" w:color="auto"/>
               <w:left w:val="nil" w:sz="0" w:space="0" w:color="auto"/>
-              <w:bottom w:val="nil" w:sz="0" w:space="0" w:color="auto"/>
+              <w:bottom w:val="single" w:sz="4" w:space="0" w:color="000000"/>
               <w:right w:val="nil" w:sz="0" w:space="0" w:color="auto"/>
             </w:tcBorders>
           </w:tcPr>
@@ -2110,8 +2126,8 @@
                 <w:b/>
                 <w:i w:val="0"/>
                 <w:color w:val="000000"/>
-                <w:sz w:val="22"/>
-                <w:szCs w:val="22"/>
+                <w:sz w:val="24"/>
+                <w:szCs w:val="24"/>
               </w:rPr>
               <w:t>RDA</w:t>
             </w:r>
@@ -2119,19 +2135,19 @@
         </w:tc>
         <w:tc>
           <w:tcPr>
-            <w:tcW w:type="dxa" w:w="6463"/>
-            <w:tcW w:w="6463" w:type="dxa"/>
+            <w:tcW w:type="dxa" w:w="6803"/>
+            <w:tcW w:w="6804" w:type="dxa"/>
             <w:vAlign w:val="center"/>
             <w:tcMar>
-              <w:top w:w="70" w:type="dxa"/>
-              <w:left w:w="70" w:type="dxa"/>
-              <w:bottom w:w="70" w:type="dxa"/>
-              <w:right w:w="70" w:type="dxa"/>
+              <w:top w:w="80" w:type="dxa"/>
+              <w:left w:w="80" w:type="dxa"/>
+              <w:bottom w:w="80" w:type="dxa"/>
+              <w:right w:w="80" w:type="dxa"/>
             </w:tcMar>
             <w:tcBorders>
               <w:top w:val="nil" w:sz="0" w:space="0" w:color="auto"/>
               <w:left w:val="nil" w:sz="0" w:space="0" w:color="auto"/>
-              <w:bottom w:val="nil" w:sz="0" w:space="0" w:color="auto"/>
+              <w:bottom w:val="single" w:sz="4" w:space="0" w:color="000000"/>
               <w:right w:val="nil" w:sz="0" w:space="0" w:color="auto"/>
             </w:tcBorders>
           </w:tcPr>
@@ -2150,8 +2166,8 @@
                 <w:b w:val="0"/>
                 <w:i w:val="0"/>
                 <w:color w:val="000000"/>
-                <w:sz w:val="22"/>
-                <w:szCs w:val="22"/>
+                <w:sz w:val="24"/>
+                <w:szCs w:val="24"/>
               </w:rPr>
               <w:t>relative dentine abrasivity</w:t>
             </w:r>
@@ -2161,22 +2177,24 @@
       <w:tr>
         <w:trPr>
           <w:cantSplit/>
+          <w:trHeight w:val="320" w:hRule="atLeast"/>
         </w:trPr>
         <w:tc>
           <w:tcPr>
-            <w:tcW w:type="dxa" w:w="2494"/>
-            <w:tcW w:w="2494" w:type="dxa"/>
+            <w:tcW w:type="dxa" w:w="2154"/>
+            <w:tcW w:w="2154" w:type="dxa"/>
+            <w:noWrap/>
             <w:vAlign w:val="center"/>
             <w:tcMar>
-              <w:top w:w="70" w:type="dxa"/>
-              <w:left w:w="70" w:type="dxa"/>
-              <w:bottom w:w="70" w:type="dxa"/>
-              <w:right w:w="70" w:type="dxa"/>
+              <w:top w:w="80" w:type="dxa"/>
+              <w:left w:w="80" w:type="dxa"/>
+              <w:bottom w:w="80" w:type="dxa"/>
+              <w:right w:w="80" w:type="dxa"/>
             </w:tcMar>
             <w:tcBorders>
               <w:top w:val="nil" w:sz="0" w:space="0" w:color="auto"/>
               <w:left w:val="nil" w:sz="0" w:space="0" w:color="auto"/>
-              <w:bottom w:val="nil" w:sz="0" w:space="0" w:color="auto"/>
+              <w:bottom w:val="single" w:sz="4" w:space="0" w:color="000000"/>
               <w:right w:val="nil" w:sz="0" w:space="0" w:color="auto"/>
             </w:tcBorders>
           </w:tcPr>
@@ -2195,8 +2213,8 @@
                 <w:b/>
                 <w:i w:val="0"/>
                 <w:color w:val="000000"/>
-                <w:sz w:val="22"/>
-                <w:szCs w:val="22"/>
+                <w:sz w:val="24"/>
+                <w:szCs w:val="24"/>
               </w:rPr>
               <w:t>SD</w:t>
             </w:r>
@@ -2204,19 +2222,19 @@
         </w:tc>
         <w:tc>
           <w:tcPr>
-            <w:tcW w:type="dxa" w:w="6463"/>
-            <w:tcW w:w="6463" w:type="dxa"/>
+            <w:tcW w:type="dxa" w:w="6803"/>
+            <w:tcW w:w="6804" w:type="dxa"/>
             <w:vAlign w:val="center"/>
             <w:tcMar>
-              <w:top w:w="70" w:type="dxa"/>
-              <w:left w:w="70" w:type="dxa"/>
-              <w:bottom w:w="70" w:type="dxa"/>
-              <w:right w:w="70" w:type="dxa"/>
+              <w:top w:w="80" w:type="dxa"/>
+              <w:left w:w="80" w:type="dxa"/>
+              <w:bottom w:w="80" w:type="dxa"/>
+              <w:right w:w="80" w:type="dxa"/>
             </w:tcMar>
             <w:tcBorders>
               <w:top w:val="nil" w:sz="0" w:space="0" w:color="auto"/>
               <w:left w:val="nil" w:sz="0" w:space="0" w:color="auto"/>
-              <w:bottom w:val="nil" w:sz="0" w:space="0" w:color="auto"/>
+              <w:bottom w:val="single" w:sz="4" w:space="0" w:color="000000"/>
               <w:right w:val="nil" w:sz="0" w:space="0" w:color="auto"/>
             </w:tcBorders>
           </w:tcPr>
@@ -2235,8 +2253,8 @@
                 <w:b w:val="0"/>
                 <w:i w:val="0"/>
                 <w:color w:val="000000"/>
-                <w:sz w:val="22"/>
-                <w:szCs w:val="22"/>
+                <w:sz w:val="24"/>
+                <w:szCs w:val="24"/>
               </w:rPr>
               <w:t>standard deviation</w:t>
             </w:r>
@@ -2246,22 +2264,24 @@
       <w:tr>
         <w:trPr>
           <w:cantSplit/>
+          <w:trHeight w:val="320" w:hRule="atLeast"/>
         </w:trPr>
         <w:tc>
           <w:tcPr>
-            <w:tcW w:type="dxa" w:w="2494"/>
-            <w:tcW w:w="2494" w:type="dxa"/>
+            <w:tcW w:type="dxa" w:w="2154"/>
+            <w:tcW w:w="2154" w:type="dxa"/>
+            <w:noWrap/>
             <w:vAlign w:val="center"/>
             <w:tcMar>
-              <w:top w:w="70" w:type="dxa"/>
-              <w:left w:w="70" w:type="dxa"/>
-              <w:bottom w:w="70" w:type="dxa"/>
-              <w:right w:w="70" w:type="dxa"/>
+              <w:top w:w="80" w:type="dxa"/>
+              <w:left w:w="80" w:type="dxa"/>
+              <w:bottom w:w="80" w:type="dxa"/>
+              <w:right w:w="80" w:type="dxa"/>
             </w:tcMar>
             <w:tcBorders>
               <w:top w:val="nil" w:sz="0" w:space="0" w:color="auto"/>
               <w:left w:val="nil" w:sz="0" w:space="0" w:color="auto"/>
-              <w:bottom w:val="nil" w:sz="0" w:space="0" w:color="auto"/>
+              <w:bottom w:val="single" w:sz="4" w:space="0" w:color="000000"/>
               <w:right w:val="nil" w:sz="0" w:space="0" w:color="auto"/>
             </w:tcBorders>
           </w:tcPr>
@@ -2280,8 +2300,8 @@
                 <w:b/>
                 <w:i w:val="0"/>
                 <w:color w:val="000000"/>
-                <w:sz w:val="22"/>
-                <w:szCs w:val="22"/>
+                <w:sz w:val="24"/>
+                <w:szCs w:val="24"/>
               </w:rPr>
               <w:t>S-PRG</w:t>
             </w:r>
@@ -2289,19 +2309,19 @@
         </w:tc>
         <w:tc>
           <w:tcPr>
-            <w:tcW w:type="dxa" w:w="6463"/>
-            <w:tcW w:w="6463" w:type="dxa"/>
+            <w:tcW w:type="dxa" w:w="6803"/>
+            <w:tcW w:w="6804" w:type="dxa"/>
             <w:vAlign w:val="center"/>
             <w:tcMar>
-              <w:top w:w="70" w:type="dxa"/>
-              <w:left w:w="70" w:type="dxa"/>
-              <w:bottom w:w="70" w:type="dxa"/>
-              <w:right w:w="70" w:type="dxa"/>
+              <w:top w:w="80" w:type="dxa"/>
+              <w:left w:w="80" w:type="dxa"/>
+              <w:bottom w:w="80" w:type="dxa"/>
+              <w:right w:w="80" w:type="dxa"/>
             </w:tcMar>
             <w:tcBorders>
               <w:top w:val="nil" w:sz="0" w:space="0" w:color="auto"/>
               <w:left w:val="nil" w:sz="0" w:space="0" w:color="auto"/>
-              <w:bottom w:val="nil" w:sz="0" w:space="0" w:color="auto"/>
+              <w:bottom w:val="single" w:sz="4" w:space="0" w:color="000000"/>
               <w:right w:val="nil" w:sz="0" w:space="0" w:color="auto"/>
             </w:tcBorders>
           </w:tcPr>
@@ -2320,8 +2340,8 @@
                 <w:b w:val="0"/>
                 <w:i w:val="0"/>
                 <w:color w:val="000000"/>
-                <w:sz w:val="22"/>
-                <w:szCs w:val="22"/>
+                <w:sz w:val="24"/>
+                <w:szCs w:val="24"/>
               </w:rPr>
               <w:t>surface pre-reacted glass-ionomer</w:t>
             </w:r>
@@ -2331,22 +2351,24 @@
       <w:tr>
         <w:trPr>
           <w:cantSplit/>
+          <w:trHeight w:val="320" w:hRule="atLeast"/>
         </w:trPr>
         <w:tc>
           <w:tcPr>
-            <w:tcW w:type="dxa" w:w="2494"/>
-            <w:tcW w:w="2494" w:type="dxa"/>
+            <w:tcW w:type="dxa" w:w="2154"/>
+            <w:tcW w:w="2154" w:type="dxa"/>
+            <w:noWrap/>
             <w:vAlign w:val="center"/>
             <w:tcMar>
-              <w:top w:w="70" w:type="dxa"/>
-              <w:left w:w="70" w:type="dxa"/>
-              <w:bottom w:w="70" w:type="dxa"/>
-              <w:right w:w="70" w:type="dxa"/>
+              <w:top w:w="80" w:type="dxa"/>
+              <w:left w:w="80" w:type="dxa"/>
+              <w:bottom w:w="80" w:type="dxa"/>
+              <w:right w:w="80" w:type="dxa"/>
             </w:tcMar>
             <w:tcBorders>
               <w:top w:val="nil" w:sz="0" w:space="0" w:color="auto"/>
               <w:left w:val="nil" w:sz="0" w:space="0" w:color="auto"/>
-              <w:bottom w:val="nil" w:sz="0" w:space="0" w:color="auto"/>
+              <w:bottom w:val="single" w:sz="4" w:space="0" w:color="000000"/>
               <w:right w:val="nil" w:sz="0" w:space="0" w:color="auto"/>
             </w:tcBorders>
           </w:tcPr>
@@ -2365,8 +2387,8 @@
                 <w:b/>
                 <w:i w:val="0"/>
                 <w:color w:val="000000"/>
-                <w:sz w:val="22"/>
-                <w:szCs w:val="22"/>
+                <w:sz w:val="24"/>
+                <w:szCs w:val="24"/>
               </w:rPr>
               <w:t>vol%</w:t>
             </w:r>
@@ -2374,19 +2396,19 @@
         </w:tc>
         <w:tc>
           <w:tcPr>
-            <w:tcW w:type="dxa" w:w="6463"/>
-            <w:tcW w:w="6463" w:type="dxa"/>
+            <w:tcW w:type="dxa" w:w="6803"/>
+            <w:tcW w:w="6804" w:type="dxa"/>
             <w:vAlign w:val="center"/>
             <w:tcMar>
-              <w:top w:w="70" w:type="dxa"/>
-              <w:left w:w="70" w:type="dxa"/>
-              <w:bottom w:w="70" w:type="dxa"/>
-              <w:right w:w="70" w:type="dxa"/>
+              <w:top w:w="80" w:type="dxa"/>
+              <w:left w:w="80" w:type="dxa"/>
+              <w:bottom w:w="80" w:type="dxa"/>
+              <w:right w:w="80" w:type="dxa"/>
             </w:tcMar>
             <w:tcBorders>
               <w:top w:val="nil" w:sz="0" w:space="0" w:color="auto"/>
               <w:left w:val="nil" w:sz="0" w:space="0" w:color="auto"/>
-              <w:bottom w:val="nil" w:sz="0" w:space="0" w:color="auto"/>
+              <w:bottom w:val="single" w:sz="4" w:space="0" w:color="000000"/>
               <w:right w:val="nil" w:sz="0" w:space="0" w:color="auto"/>
             </w:tcBorders>
           </w:tcPr>
@@ -2405,8 +2427,8 @@
                 <w:b w:val="0"/>
                 <w:i w:val="0"/>
                 <w:color w:val="000000"/>
-                <w:sz w:val="22"/>
-                <w:szCs w:val="22"/>
+                <w:sz w:val="24"/>
+                <w:szCs w:val="24"/>
               </w:rPr>
               <w:t>percentage by volume</w:t>
             </w:r>
@@ -2416,17 +2438,19 @@
       <w:tr>
         <w:trPr>
           <w:cantSplit/>
+          <w:trHeight w:val="320" w:hRule="atLeast"/>
         </w:trPr>
         <w:tc>
           <w:tcPr>
-            <w:tcW w:type="dxa" w:w="2494"/>
-            <w:tcW w:w="2494" w:type="dxa"/>
+            <w:tcW w:type="dxa" w:w="2154"/>
+            <w:tcW w:w="2154" w:type="dxa"/>
+            <w:noWrap/>
             <w:vAlign w:val="center"/>
             <w:tcMar>
-              <w:top w:w="70" w:type="dxa"/>
-              <w:left w:w="70" w:type="dxa"/>
-              <w:bottom w:w="70" w:type="dxa"/>
-              <w:right w:w="70" w:type="dxa"/>
+              <w:top w:w="80" w:type="dxa"/>
+              <w:left w:w="80" w:type="dxa"/>
+              <w:bottom w:w="80" w:type="dxa"/>
+              <w:right w:w="80" w:type="dxa"/>
             </w:tcMar>
             <w:tcBorders>
               <w:top w:val="nil" w:sz="0" w:space="0" w:color="auto"/>
@@ -2450,8 +2474,8 @@
                 <w:b/>
                 <w:i w:val="0"/>
                 <w:color w:val="000000"/>
-                <w:sz w:val="22"/>
-                <w:szCs w:val="22"/>
+                <w:sz w:val="24"/>
+                <w:szCs w:val="24"/>
               </w:rPr>
               <w:t>ΔRa</w:t>
             </w:r>
@@ -2459,14 +2483,14 @@
         </w:tc>
         <w:tc>
           <w:tcPr>
-            <w:tcW w:type="dxa" w:w="6463"/>
-            <w:tcW w:w="6463" w:type="dxa"/>
+            <w:tcW w:type="dxa" w:w="6803"/>
+            <w:tcW w:w="6804" w:type="dxa"/>
             <w:vAlign w:val="center"/>
             <w:tcMar>
-              <w:top w:w="70" w:type="dxa"/>
-              <w:left w:w="70" w:type="dxa"/>
-              <w:bottom w:w="70" w:type="dxa"/>
-              <w:right w:w="70" w:type="dxa"/>
+              <w:top w:w="80" w:type="dxa"/>
+              <w:left w:w="80" w:type="dxa"/>
+              <w:bottom w:w="80" w:type="dxa"/>
+              <w:right w:w="80" w:type="dxa"/>
             </w:tcMar>
             <w:tcBorders>
               <w:top w:val="nil" w:sz="0" w:space="0" w:color="auto"/>
@@ -2490,8 +2514,8 @@
                 <w:b w:val="0"/>
                 <w:i w:val="0"/>
                 <w:color w:val="000000"/>
-                <w:sz w:val="22"/>
-                <w:szCs w:val="22"/>
+                <w:sz w:val="24"/>
+                <w:szCs w:val="24"/>
               </w:rPr>
               <w:t>change in Ra (after − before)</w:t>
             </w:r>
@@ -7209,12 +7233,6 @@
             <w:tcW w:type="dxa" w:w="1361"/>
             <w:tcW w:w="1360" w:type="dxa"/>
             <w:vAlign w:val="center"/>
-            <w:tcMar>
-              <w:top w:w="50" w:type="dxa"/>
-              <w:left w:w="50" w:type="dxa"/>
-              <w:bottom w:w="50" w:type="dxa"/>
-              <w:right w:w="50" w:type="dxa"/>
-            </w:tcMar>
             <w:vMerge w:val="restart"/>
             <w:noWrap/>
             <w:tcBorders>
@@ -8931,12 +8949,6 @@
             <w:tcW w:type="dxa" w:w="1361"/>
             <w:tcW w:w="1360" w:type="dxa"/>
             <w:vAlign w:val="center"/>
-            <w:tcMar>
-              <w:top w:w="50" w:type="dxa"/>
-              <w:left w:w="50" w:type="dxa"/>
-              <w:bottom w:w="50" w:type="dxa"/>
-              <w:right w:w="50" w:type="dxa"/>
-            </w:tcMar>
             <w:vMerge w:val="restart"/>
             <w:noWrap/>
             <w:tcBorders>
@@ -11942,7 +11954,6 @@
 <w:hdr xmlns:m="http://schemas.openxmlformats.org/officeDocument/2006/math" xmlns:mc="http://schemas.openxmlformats.org/markup-compatibility/2006" xmlns:mo="http://schemas.microsoft.com/office/mac/office/2008/main" xmlns:mv="urn:schemas-microsoft-com:mac:vml" xmlns:o="urn:schemas-microsoft-com:office:office" xmlns:r="http://schemas.openxmlformats.org/officeDocument/2006/relationships" xmlns:v="urn:schemas-microsoft-com:vml" xmlns:w10="urn:schemas-microsoft-com:office:word" xmlns:w14="http://schemas.microsoft.com/office/word/2010/wordml" xmlns:w="http://schemas.openxmlformats.org/wordprocessingml/2006/main" xmlns:wne="http://schemas.microsoft.com/office/word/2006/wordml" xmlns:wp14="http://schemas.microsoft.com/office/word/2010/wordprocessingDrawing" xmlns:wp="http://schemas.openxmlformats.org/drawingml/2006/wordprocessingDrawing" xmlns:wpc="http://schemas.microsoft.com/office/word/2010/wordprocessingCanvas" xmlns:wpg="http://schemas.microsoft.com/office/word/2010/wordprocessingGroup" xmlns:wpi="http://schemas.microsoft.com/office/word/2010/wordprocessingInk" xmlns:wps="http://schemas.microsoft.com/office/word/2010/wordprocessingShape" mc:Ignorable="w14 wp14">
   <w:p>
     <w:pPr>
-      <w:pStyle w:val="Header"/>
       <w:spacing w:before="0" w:after="0" w:lineRule="exact" w:line="737"/>
       <w:ind w:firstLine="0"/>
       <w:jc w:val="center"/>

</xml_diff>

<commit_message>
Rebuild Word and PDF with more space after headings
Keep the existing architecture and tables; only the gaps after titles,
Introduction and section headings are larger.

Co-authored-by: Ahmed El Gamry <ahmed733676-droid@users.noreply.github.com>
</commit_message>
<xml_diff>
--- a/Thesis_Complete.docx
+++ b/Thesis_Complete.docx
@@ -403,7 +403,7 @@
         <w:pStyle w:val="Heading1"/>
         <w:keepNext/>
         <w:widowControl/>
-        <w:spacing w:before="360" w:after="1120" w:line="240" w:lineRule="auto"/>
+        <w:spacing w:before="360" w:after="1440" w:line="240" w:lineRule="auto"/>
         <w:ind w:firstLine="0"/>
         <w:jc w:val="center"/>
       </w:pPr>
@@ -418,6 +418,15 @@
         </w:rPr>
         <w:t>ROLE OF SUPERVISORS</w:t>
       </w:r>
+    </w:p>
+    <w:p>
+      <w:pPr>
+        <w:keepNext/>
+        <w:widowControl/>
+        <w:spacing w:before="0" w:after="120" w:line="240" w:lineRule="auto"/>
+        <w:ind w:firstLine="0"/>
+        <w:jc w:val="both"/>
+      </w:pPr>
     </w:p>
     <w:p>
       <w:pPr>
@@ -637,7 +646,7 @@
         <w:keepNext/>
         <w:pageBreakBefore/>
         <w:widowControl/>
-        <w:spacing w:before="360" w:after="1120" w:line="240" w:lineRule="auto"/>
+        <w:spacing w:before="360" w:after="1440" w:line="240" w:lineRule="auto"/>
         <w:ind w:firstLine="0"/>
         <w:jc w:val="center"/>
       </w:pPr>
@@ -652,6 +661,15 @@
         </w:rPr>
         <w:t>ACKNOWLEDGEMENTS</w:t>
       </w:r>
+    </w:p>
+    <w:p>
+      <w:pPr>
+        <w:keepNext/>
+        <w:widowControl/>
+        <w:spacing w:before="0" w:after="120" w:line="240" w:lineRule="auto"/>
+        <w:ind w:firstLine="0"/>
+        <w:jc w:val="both"/>
+      </w:pPr>
     </w:p>
     <w:p>
       <w:pPr>
@@ -678,7 +696,7 @@
         <w:keepNext/>
         <w:pageBreakBefore/>
         <w:widowControl/>
-        <w:spacing w:before="360" w:after="1120" w:line="240" w:lineRule="auto"/>
+        <w:spacing w:before="360" w:after="1440" w:line="240" w:lineRule="auto"/>
         <w:ind w:firstLine="0"/>
         <w:jc w:val="center"/>
       </w:pPr>
@@ -693,6 +711,15 @@
         </w:rPr>
         <w:t>CONTENTS</w:t>
       </w:r>
+    </w:p>
+    <w:p>
+      <w:pPr>
+        <w:keepNext/>
+        <w:widowControl/>
+        <w:spacing w:before="0" w:after="120" w:line="240" w:lineRule="auto"/>
+        <w:ind w:firstLine="0"/>
+        <w:jc w:val="both"/>
+      </w:pPr>
     </w:p>
     <w:p>
       <w:pPr>
@@ -1179,7 +1206,7 @@
         <w:keepNext/>
         <w:pageBreakBefore/>
         <w:widowControl/>
-        <w:spacing w:before="360" w:after="1120" w:line="240" w:lineRule="auto"/>
+        <w:spacing w:before="360" w:after="1440" w:line="240" w:lineRule="auto"/>
         <w:ind w:firstLine="0"/>
         <w:jc w:val="center"/>
       </w:pPr>
@@ -1194,6 +1221,15 @@
         </w:rPr>
         <w:t>LIST OF TABLES</w:t>
       </w:r>
+    </w:p>
+    <w:p>
+      <w:pPr>
+        <w:keepNext/>
+        <w:widowControl/>
+        <w:spacing w:before="0" w:after="120" w:line="240" w:lineRule="auto"/>
+        <w:ind w:firstLine="0"/>
+        <w:jc w:val="both"/>
+      </w:pPr>
     </w:p>
     <w:p>
       <w:pPr>
@@ -1374,7 +1410,7 @@
         <w:keepNext/>
         <w:pageBreakBefore/>
         <w:widowControl/>
-        <w:spacing w:before="360" w:after="1120" w:line="240" w:lineRule="auto"/>
+        <w:spacing w:before="360" w:after="1440" w:line="240" w:lineRule="auto"/>
         <w:ind w:firstLine="0"/>
         <w:jc w:val="center"/>
       </w:pPr>
@@ -1389,6 +1425,15 @@
         </w:rPr>
         <w:t>LIST OF FIGURES</w:t>
       </w:r>
+    </w:p>
+    <w:p>
+      <w:pPr>
+        <w:keepNext/>
+        <w:widowControl/>
+        <w:spacing w:before="0" w:after="120" w:line="240" w:lineRule="auto"/>
+        <w:ind w:firstLine="0"/>
+        <w:jc w:val="both"/>
+      </w:pPr>
     </w:p>
     <w:p>
       <w:pPr>
@@ -1535,7 +1580,7 @@
         <w:keepNext/>
         <w:pageBreakBefore/>
         <w:widowControl/>
-        <w:spacing w:before="360" w:after="1120" w:line="240" w:lineRule="auto"/>
+        <w:spacing w:before="360" w:after="1440" w:line="240" w:lineRule="auto"/>
         <w:ind w:firstLine="0"/>
         <w:jc w:val="center"/>
       </w:pPr>
@@ -1550,6 +1595,15 @@
         </w:rPr>
         <w:t>LIST OF ABBREVIATIONS</w:t>
       </w:r>
+    </w:p>
+    <w:p>
+      <w:pPr>
+        <w:keepNext/>
+        <w:widowControl/>
+        <w:spacing w:before="0" w:after="120" w:line="240" w:lineRule="auto"/>
+        <w:ind w:firstLine="0"/>
+        <w:jc w:val="both"/>
+      </w:pPr>
     </w:p>
     <w:tbl>
       <w:tblPr>
@@ -2537,7 +2591,7 @@
         <w:keepNext/>
         <w:pageBreakBefore/>
         <w:widowControl/>
-        <w:spacing w:before="360" w:after="1120" w:line="240" w:lineRule="auto"/>
+        <w:spacing w:before="360" w:after="1680" w:line="240" w:lineRule="auto"/>
         <w:ind w:firstLine="0"/>
         <w:jc w:val="center"/>
       </w:pPr>
@@ -2552,6 +2606,15 @@
         </w:rPr>
         <w:t>ABSTRACT</w:t>
       </w:r>
+    </w:p>
+    <w:p>
+      <w:pPr>
+        <w:keepNext/>
+        <w:widowControl/>
+        <w:spacing w:before="0" w:after="120" w:line="240" w:lineRule="auto"/>
+        <w:ind w:firstLine="0"/>
+        <w:jc w:val="both"/>
+      </w:pPr>
     </w:p>
     <w:p>
       <w:pPr>
@@ -2739,7 +2802,7 @@
         <w:keepNext/>
         <w:pageBreakBefore/>
         <w:widowControl/>
-        <w:spacing w:before="360" w:after="240" w:line="240" w:lineRule="auto"/>
+        <w:spacing w:before="360" w:after="280" w:line="240" w:lineRule="auto"/>
         <w:ind w:firstLine="0"/>
         <w:jc w:val="center"/>
       </w:pPr>
@@ -2760,7 +2823,7 @@
         <w:pStyle w:val="Heading1"/>
         <w:keepNext/>
         <w:widowControl/>
-        <w:spacing w:before="360" w:after="1280" w:line="240" w:lineRule="auto"/>
+        <w:spacing w:before="360" w:after="1680" w:line="240" w:lineRule="auto"/>
         <w:ind w:firstLine="0"/>
         <w:jc w:val="center"/>
       </w:pPr>
@@ -2775,6 +2838,15 @@
         </w:rPr>
         <w:t>INTRODUCTION</w:t>
       </w:r>
+    </w:p>
+    <w:p>
+      <w:pPr>
+        <w:keepNext/>
+        <w:widowControl/>
+        <w:spacing w:before="0" w:after="120" w:line="240" w:lineRule="auto"/>
+        <w:ind w:firstLine="0"/>
+        <w:jc w:val="both"/>
+      </w:pPr>
     </w:p>
     <w:p>
       <w:pPr>
@@ -3079,7 +3151,7 @@
         <w:pStyle w:val="Heading2"/>
         <w:keepNext/>
         <w:widowControl/>
-        <w:spacing w:before="440" w:after="280" w:line="240" w:lineRule="auto"/>
+        <w:spacing w:before="560" w:after="400" w:line="240" w:lineRule="auto"/>
         <w:ind w:firstLine="0"/>
         <w:jc w:val="left"/>
       </w:pPr>
@@ -3119,7 +3191,7 @@
         <w:pStyle w:val="Heading2"/>
         <w:keepNext/>
         <w:widowControl/>
-        <w:spacing w:before="440" w:after="280" w:line="240" w:lineRule="auto"/>
+        <w:spacing w:before="560" w:after="400" w:line="240" w:lineRule="auto"/>
         <w:ind w:firstLine="0"/>
         <w:jc w:val="left"/>
       </w:pPr>
@@ -3197,7 +3269,7 @@
         <w:pStyle w:val="Heading2"/>
         <w:keepNext/>
         <w:widowControl/>
-        <w:spacing w:before="440" w:after="280" w:line="240" w:lineRule="auto"/>
+        <w:spacing w:before="560" w:after="400" w:line="240" w:lineRule="auto"/>
         <w:ind w:firstLine="0"/>
         <w:jc w:val="left"/>
       </w:pPr>
@@ -3257,7 +3329,7 @@
         <w:keepNext/>
         <w:pageBreakBefore/>
         <w:widowControl/>
-        <w:spacing w:before="360" w:after="240" w:line="240" w:lineRule="auto"/>
+        <w:spacing w:before="360" w:after="280" w:line="240" w:lineRule="auto"/>
         <w:ind w:firstLine="0"/>
         <w:jc w:val="center"/>
       </w:pPr>
@@ -3278,7 +3350,7 @@
         <w:pStyle w:val="Heading1"/>
         <w:keepNext/>
         <w:widowControl/>
-        <w:spacing w:before="360" w:after="1120" w:line="240" w:lineRule="auto"/>
+        <w:spacing w:before="360" w:after="1440" w:line="240" w:lineRule="auto"/>
         <w:ind w:firstLine="0"/>
         <w:jc w:val="center"/>
       </w:pPr>
@@ -3293,13 +3365,22 @@
         </w:rPr>
         <w:t>REVIEW OF LITERATURE</w:t>
       </w:r>
+    </w:p>
+    <w:p>
+      <w:pPr>
+        <w:keepNext/>
+        <w:widowControl/>
+        <w:spacing w:before="0" w:after="120" w:line="240" w:lineRule="auto"/>
+        <w:ind w:firstLine="0"/>
+        <w:jc w:val="both"/>
+      </w:pPr>
     </w:p>
     <w:p>
       <w:pPr>
         <w:pStyle w:val="Heading2"/>
         <w:keepNext/>
         <w:widowControl/>
-        <w:spacing w:before="440" w:after="280" w:line="240" w:lineRule="auto"/>
+        <w:spacing w:before="560" w:after="400" w:line="240" w:lineRule="auto"/>
         <w:ind w:firstLine="0"/>
         <w:jc w:val="left"/>
       </w:pPr>
@@ -3760,7 +3841,7 @@
         <w:pStyle w:val="Heading2"/>
         <w:keepNext/>
         <w:widowControl/>
-        <w:spacing w:before="440" w:after="280" w:line="240" w:lineRule="auto"/>
+        <w:spacing w:before="560" w:after="400" w:line="240" w:lineRule="auto"/>
         <w:ind w:firstLine="0"/>
         <w:jc w:val="left"/>
       </w:pPr>
@@ -4106,7 +4187,7 @@
         <w:pStyle w:val="Heading2"/>
         <w:keepNext/>
         <w:widowControl/>
-        <w:spacing w:before="440" w:after="280" w:line="240" w:lineRule="auto"/>
+        <w:spacing w:before="560" w:after="400" w:line="240" w:lineRule="auto"/>
         <w:ind w:firstLine="0"/>
         <w:jc w:val="left"/>
       </w:pPr>
@@ -4448,7 +4529,7 @@
         <w:pStyle w:val="Heading2"/>
         <w:keepNext/>
         <w:widowControl/>
-        <w:spacing w:before="440" w:after="280" w:line="240" w:lineRule="auto"/>
+        <w:spacing w:before="560" w:after="400" w:line="240" w:lineRule="auto"/>
         <w:ind w:firstLine="0"/>
         <w:jc w:val="left"/>
       </w:pPr>
@@ -4706,7 +4787,7 @@
         <w:pStyle w:val="Heading2"/>
         <w:keepNext/>
         <w:widowControl/>
-        <w:spacing w:before="440" w:after="280" w:line="240" w:lineRule="auto"/>
+        <w:spacing w:before="560" w:after="400" w:line="240" w:lineRule="auto"/>
         <w:ind w:firstLine="0"/>
         <w:jc w:val="left"/>
       </w:pPr>
@@ -4793,7 +4874,7 @@
         <w:keepNext/>
         <w:pageBreakBefore/>
         <w:widowControl/>
-        <w:spacing w:before="360" w:after="240" w:line="240" w:lineRule="auto"/>
+        <w:spacing w:before="360" w:after="280" w:line="240" w:lineRule="auto"/>
         <w:ind w:firstLine="0"/>
         <w:jc w:val="center"/>
       </w:pPr>
@@ -4814,7 +4895,7 @@
         <w:pStyle w:val="Heading1"/>
         <w:keepNext/>
         <w:widowControl/>
-        <w:spacing w:before="360" w:after="1120" w:line="240" w:lineRule="auto"/>
+        <w:spacing w:before="360" w:after="1440" w:line="240" w:lineRule="auto"/>
         <w:ind w:firstLine="0"/>
         <w:jc w:val="center"/>
       </w:pPr>
@@ -4829,13 +4910,22 @@
         </w:rPr>
         <w:t>MATERIALS AND METHODS</w:t>
       </w:r>
+    </w:p>
+    <w:p>
+      <w:pPr>
+        <w:keepNext/>
+        <w:widowControl/>
+        <w:spacing w:before="0" w:after="120" w:line="240" w:lineRule="auto"/>
+        <w:ind w:firstLine="0"/>
+        <w:jc w:val="both"/>
+      </w:pPr>
     </w:p>
     <w:p>
       <w:pPr>
         <w:pStyle w:val="Heading2"/>
         <w:keepNext/>
         <w:widowControl/>
-        <w:spacing w:before="440" w:after="280" w:line="240" w:lineRule="auto"/>
+        <w:spacing w:before="560" w:after="400" w:line="240" w:lineRule="auto"/>
         <w:ind w:firstLine="0"/>
         <w:jc w:val="left"/>
       </w:pPr>
@@ -4993,7 +5083,7 @@
         <w:pStyle w:val="Heading2"/>
         <w:keepNext/>
         <w:widowControl/>
-        <w:spacing w:before="440" w:after="280" w:line="240" w:lineRule="auto"/>
+        <w:spacing w:before="560" w:after="400" w:line="240" w:lineRule="auto"/>
         <w:ind w:firstLine="0"/>
         <w:jc w:val="left"/>
       </w:pPr>
@@ -6228,7 +6318,7 @@
         <w:pStyle w:val="Heading2"/>
         <w:keepNext/>
         <w:widowControl/>
-        <w:spacing w:before="440" w:after="280" w:line="240" w:lineRule="auto"/>
+        <w:spacing w:before="560" w:after="400" w:line="240" w:lineRule="auto"/>
         <w:ind w:firstLine="0"/>
         <w:jc w:val="left"/>
       </w:pPr>
@@ -6287,7 +6377,7 @@
         <w:pStyle w:val="Heading2"/>
         <w:keepNext/>
         <w:widowControl/>
-        <w:spacing w:before="440" w:after="280" w:line="240" w:lineRule="auto"/>
+        <w:spacing w:before="560" w:after="400" w:line="240" w:lineRule="auto"/>
         <w:ind w:firstLine="0"/>
         <w:jc w:val="left"/>
       </w:pPr>
@@ -6350,7 +6440,7 @@
         <w:pStyle w:val="Heading2"/>
         <w:keepNext/>
         <w:widowControl/>
-        <w:spacing w:before="440" w:after="280" w:line="240" w:lineRule="auto"/>
+        <w:spacing w:before="560" w:after="400" w:line="240" w:lineRule="auto"/>
         <w:ind w:firstLine="0"/>
         <w:jc w:val="left"/>
       </w:pPr>
@@ -6459,7 +6549,7 @@
         <w:pStyle w:val="Heading2"/>
         <w:keepNext/>
         <w:widowControl/>
-        <w:spacing w:before="440" w:after="280" w:line="240" w:lineRule="auto"/>
+        <w:spacing w:before="560" w:after="400" w:line="240" w:lineRule="auto"/>
         <w:ind w:firstLine="0"/>
         <w:jc w:val="left"/>
       </w:pPr>
@@ -6613,7 +6703,7 @@
         <w:pStyle w:val="Heading2"/>
         <w:keepNext/>
         <w:widowControl/>
-        <w:spacing w:before="440" w:after="280" w:line="240" w:lineRule="auto"/>
+        <w:spacing w:before="560" w:after="400" w:line="240" w:lineRule="auto"/>
         <w:ind w:firstLine="0"/>
         <w:jc w:val="left"/>
       </w:pPr>
@@ -6654,7 +6744,7 @@
         <w:keepNext/>
         <w:pageBreakBefore/>
         <w:widowControl/>
-        <w:spacing w:before="360" w:after="240" w:line="240" w:lineRule="auto"/>
+        <w:spacing w:before="360" w:after="280" w:line="240" w:lineRule="auto"/>
         <w:ind w:firstLine="0"/>
         <w:jc w:val="center"/>
       </w:pPr>
@@ -6675,7 +6765,7 @@
         <w:pStyle w:val="Heading1"/>
         <w:keepNext/>
         <w:widowControl/>
-        <w:spacing w:before="360" w:after="1120" w:line="240" w:lineRule="auto"/>
+        <w:spacing w:before="360" w:after="1440" w:line="240" w:lineRule="auto"/>
         <w:ind w:firstLine="0"/>
         <w:jc w:val="center"/>
       </w:pPr>
@@ -6690,6 +6780,15 @@
         </w:rPr>
         <w:t>RESULTS</w:t>
       </w:r>
+    </w:p>
+    <w:p>
+      <w:pPr>
+        <w:keepNext/>
+        <w:widowControl/>
+        <w:spacing w:before="0" w:after="120" w:line="240" w:lineRule="auto"/>
+        <w:ind w:firstLine="0"/>
+        <w:jc w:val="both"/>
+      </w:pPr>
     </w:p>
     <w:p>
       <w:pPr>
@@ -6715,7 +6814,7 @@
         <w:pStyle w:val="Heading2"/>
         <w:keepNext/>
         <w:widowControl/>
-        <w:spacing w:before="440" w:after="280" w:line="240" w:lineRule="auto"/>
+        <w:spacing w:before="560" w:after="400" w:line="240" w:lineRule="auto"/>
         <w:ind w:firstLine="0"/>
         <w:jc w:val="left"/>
       </w:pPr>
@@ -8431,7 +8530,7 @@
         <w:pStyle w:val="Heading2"/>
         <w:keepNext/>
         <w:widowControl/>
-        <w:spacing w:before="440" w:after="280" w:line="240" w:lineRule="auto"/>
+        <w:spacing w:before="560" w:after="400" w:line="240" w:lineRule="auto"/>
         <w:ind w:firstLine="0"/>
         <w:jc w:val="left"/>
       </w:pPr>
@@ -9668,7 +9767,7 @@
         <w:pStyle w:val="Heading2"/>
         <w:keepNext/>
         <w:widowControl/>
-        <w:spacing w:before="440" w:after="280" w:line="240" w:lineRule="auto"/>
+        <w:spacing w:before="560" w:after="400" w:line="240" w:lineRule="auto"/>
         <w:ind w:firstLine="0"/>
         <w:jc w:val="left"/>
       </w:pPr>
@@ -9709,7 +9808,7 @@
         <w:keepNext/>
         <w:pageBreakBefore/>
         <w:widowControl/>
-        <w:spacing w:before="360" w:after="240" w:line="240" w:lineRule="auto"/>
+        <w:spacing w:before="360" w:after="280" w:line="240" w:lineRule="auto"/>
         <w:ind w:firstLine="0"/>
         <w:jc w:val="center"/>
       </w:pPr>
@@ -9730,7 +9829,7 @@
         <w:pStyle w:val="Heading1"/>
         <w:keepNext/>
         <w:widowControl/>
-        <w:spacing w:before="360" w:after="1120" w:line="240" w:lineRule="auto"/>
+        <w:spacing w:before="360" w:after="1440" w:line="240" w:lineRule="auto"/>
         <w:ind w:firstLine="0"/>
         <w:jc w:val="center"/>
       </w:pPr>
@@ -9745,6 +9844,15 @@
         </w:rPr>
         <w:t>DISCUSSION</w:t>
       </w:r>
+    </w:p>
+    <w:p>
+      <w:pPr>
+        <w:keepNext/>
+        <w:widowControl/>
+        <w:spacing w:before="0" w:after="120" w:line="240" w:lineRule="auto"/>
+        <w:ind w:firstLine="0"/>
+        <w:jc w:val="both"/>
+      </w:pPr>
     </w:p>
     <w:p>
       <w:pPr>
@@ -9770,7 +9878,7 @@
         <w:pStyle w:val="Heading2"/>
         <w:keepNext/>
         <w:widowControl/>
-        <w:spacing w:before="440" w:after="280" w:line="240" w:lineRule="auto"/>
+        <w:spacing w:before="560" w:after="400" w:line="240" w:lineRule="auto"/>
         <w:ind w:firstLine="0"/>
         <w:jc w:val="left"/>
       </w:pPr>
@@ -9913,7 +10021,7 @@
         <w:pStyle w:val="Heading2"/>
         <w:keepNext/>
         <w:widowControl/>
-        <w:spacing w:before="440" w:after="280" w:line="240" w:lineRule="auto"/>
+        <w:spacing w:before="560" w:after="400" w:line="240" w:lineRule="auto"/>
         <w:ind w:firstLine="0"/>
         <w:jc w:val="left"/>
       </w:pPr>
@@ -10171,7 +10279,7 @@
         <w:pStyle w:val="Heading2"/>
         <w:keepNext/>
         <w:widowControl/>
-        <w:spacing w:before="440" w:after="280" w:line="240" w:lineRule="auto"/>
+        <w:spacing w:before="560" w:after="400" w:line="240" w:lineRule="auto"/>
         <w:ind w:firstLine="0"/>
         <w:jc w:val="left"/>
       </w:pPr>
@@ -10318,7 +10426,7 @@
         <w:pStyle w:val="Heading2"/>
         <w:keepNext/>
         <w:widowControl/>
-        <w:spacing w:before="440" w:after="280" w:line="240" w:lineRule="auto"/>
+        <w:spacing w:before="560" w:after="400" w:line="240" w:lineRule="auto"/>
         <w:ind w:firstLine="0"/>
         <w:jc w:val="left"/>
       </w:pPr>
@@ -10404,7 +10512,7 @@
         <w:pStyle w:val="Heading2"/>
         <w:keepNext/>
         <w:widowControl/>
-        <w:spacing w:before="440" w:after="280" w:line="240" w:lineRule="auto"/>
+        <w:spacing w:before="560" w:after="400" w:line="240" w:lineRule="auto"/>
         <w:ind w:firstLine="0"/>
         <w:jc w:val="left"/>
       </w:pPr>
@@ -10513,7 +10621,7 @@
         <w:pStyle w:val="Heading2"/>
         <w:keepNext/>
         <w:widowControl/>
-        <w:spacing w:before="440" w:after="280" w:line="240" w:lineRule="auto"/>
+        <w:spacing w:before="560" w:after="400" w:line="240" w:lineRule="auto"/>
         <w:ind w:firstLine="0"/>
         <w:jc w:val="left"/>
       </w:pPr>
@@ -10554,7 +10662,7 @@
         <w:keepNext/>
         <w:pageBreakBefore/>
         <w:widowControl/>
-        <w:spacing w:before="360" w:after="240" w:line="240" w:lineRule="auto"/>
+        <w:spacing w:before="360" w:after="280" w:line="240" w:lineRule="auto"/>
         <w:ind w:firstLine="0"/>
         <w:jc w:val="center"/>
       </w:pPr>
@@ -10575,7 +10683,7 @@
         <w:pStyle w:val="Heading1"/>
         <w:keepNext/>
         <w:widowControl/>
-        <w:spacing w:before="360" w:after="1120" w:line="240" w:lineRule="auto"/>
+        <w:spacing w:before="360" w:after="1440" w:line="240" w:lineRule="auto"/>
         <w:ind w:firstLine="0"/>
         <w:jc w:val="center"/>
       </w:pPr>
@@ -10590,13 +10698,22 @@
         </w:rPr>
         <w:t>CONCLUSIONS AND RECOMMENDATIONS</w:t>
       </w:r>
+    </w:p>
+    <w:p>
+      <w:pPr>
+        <w:keepNext/>
+        <w:widowControl/>
+        <w:spacing w:before="0" w:after="120" w:line="240" w:lineRule="auto"/>
+        <w:ind w:firstLine="0"/>
+        <w:jc w:val="both"/>
+      </w:pPr>
     </w:p>
     <w:p>
       <w:pPr>
         <w:pStyle w:val="Heading2"/>
         <w:keepNext/>
         <w:widowControl/>
-        <w:spacing w:before="440" w:after="280" w:line="240" w:lineRule="auto"/>
+        <w:spacing w:before="560" w:after="400" w:line="240" w:lineRule="auto"/>
         <w:ind w:firstLine="0"/>
         <w:jc w:val="left"/>
       </w:pPr>
@@ -10750,7 +10867,7 @@
         <w:pStyle w:val="Heading2"/>
         <w:keepNext/>
         <w:widowControl/>
-        <w:spacing w:before="440" w:after="280" w:line="240" w:lineRule="auto"/>
+        <w:spacing w:before="560" w:after="400" w:line="240" w:lineRule="auto"/>
         <w:ind w:firstLine="0"/>
         <w:jc w:val="left"/>
       </w:pPr>
@@ -10862,7 +10979,7 @@
         <w:keepNext/>
         <w:pageBreakBefore/>
         <w:widowControl/>
-        <w:spacing w:before="360" w:after="240" w:line="240" w:lineRule="auto"/>
+        <w:spacing w:before="360" w:after="280" w:line="240" w:lineRule="auto"/>
         <w:ind w:firstLine="0"/>
         <w:jc w:val="center"/>
       </w:pPr>
@@ -10883,7 +11000,7 @@
         <w:pStyle w:val="Heading1"/>
         <w:keepNext/>
         <w:widowControl/>
-        <w:spacing w:before="360" w:after="1120" w:line="240" w:lineRule="auto"/>
+        <w:spacing w:before="360" w:after="1440" w:line="240" w:lineRule="auto"/>
         <w:ind w:firstLine="0"/>
         <w:jc w:val="center"/>
       </w:pPr>
@@ -10898,6 +11015,15 @@
         </w:rPr>
         <w:t>REFERENCES</w:t>
       </w:r>
+    </w:p>
+    <w:p>
+      <w:pPr>
+        <w:keepNext/>
+        <w:widowControl/>
+        <w:spacing w:before="0" w:after="120" w:line="240" w:lineRule="auto"/>
+        <w:ind w:firstLine="0"/>
+        <w:jc w:val="both"/>
+      </w:pPr>
     </w:p>
     <w:p>
       <w:pPr>
@@ -12427,7 +12553,7 @@
     <w:pPr>
       <w:keepNext/>
       <w:keepLines/>
-      <w:spacing w:before="360" w:after="1120" w:line="240" w:lineRule="auto"/>
+      <w:spacing w:before="360" w:after="1440" w:line="240" w:lineRule="auto"/>
       <w:ind w:firstLine="0"/>
       <w:jc w:val="center"/>
       <w:outlineLvl w:val="0"/>
@@ -12455,7 +12581,7 @@
     <w:pPr>
       <w:keepNext/>
       <w:keepLines/>
-      <w:spacing w:before="440" w:after="280" w:line="240" w:lineRule="auto"/>
+      <w:spacing w:before="560" w:after="400" w:line="240" w:lineRule="auto"/>
       <w:ind w:firstLine="0"/>
       <w:jc w:val="left"/>
       <w:outlineLvl w:val="1"/>

</xml_diff>

<commit_message>
Rebuild Word with a single page-top header banner
Word now keeps one PUA banner on every page, matching the PDF, and
does not wrap a second logo on the first page.

Co-authored-by: Ahmed El Gamry <ahmed733676-droid@users.noreply.github.com>
</commit_message>
<xml_diff>
--- a/Thesis_Complete.docx
+++ b/Thesis_Complete.docx
@@ -12037,6 +12037,7 @@
       <w:spacing w:before="0" w:after="0" w:line="240" w:lineRule="auto"/>
       <w:ind w:firstLine="0"/>
       <w:jc w:val="center"/>
+      <w:snapToGrid w:val="0"/>
       <w:pBdr>
         <w:top w:val="single" w:sz="12" w:space="4" w:color="000000"/>
       </w:pBdr>
@@ -12080,19 +12081,30 @@
 <w:hdr xmlns:m="http://schemas.openxmlformats.org/officeDocument/2006/math" xmlns:mc="http://schemas.openxmlformats.org/markup-compatibility/2006" xmlns:mo="http://schemas.microsoft.com/office/mac/office/2008/main" xmlns:mv="urn:schemas-microsoft-com:mac:vml" xmlns:o="urn:schemas-microsoft-com:office:office" xmlns:r="http://schemas.openxmlformats.org/officeDocument/2006/relationships" xmlns:v="urn:schemas-microsoft-com:vml" xmlns:w10="urn:schemas-microsoft-com:office:word" xmlns:w14="http://schemas.microsoft.com/office/word/2010/wordml" xmlns:w="http://schemas.openxmlformats.org/wordprocessingml/2006/main" xmlns:wne="http://schemas.microsoft.com/office/word/2006/wordml" xmlns:wp14="http://schemas.microsoft.com/office/word/2010/wordprocessingDrawing" xmlns:wp="http://schemas.openxmlformats.org/drawingml/2006/wordprocessingDrawing" xmlns:wpc="http://schemas.microsoft.com/office/word/2010/wordprocessingCanvas" xmlns:wpg="http://schemas.microsoft.com/office/word/2010/wordprocessingGroup" xmlns:wpi="http://schemas.microsoft.com/office/word/2010/wordprocessingInk" xmlns:wps="http://schemas.microsoft.com/office/word/2010/wordprocessingShape" mc:Ignorable="w14 wp14">
   <w:p>
     <w:pPr>
-      <w:spacing w:before="0" w:after="0" w:lineRule="exact" w:line="737"/>
+      <w:pStyle w:val="Header"/>
+      <w:spacing w:before="0" w:after="0" w:lineRule="exact" w:line="120"/>
       <w:ind w:firstLine="0"/>
       <w:jc w:val="center"/>
+      <w:snapToGrid w:val="0"/>
     </w:pPr>
     <w:r>
       <w:drawing>
-        <wp:inline xmlns:a="http://schemas.openxmlformats.org/drawingml/2006/main" xmlns:pic="http://schemas.openxmlformats.org/drawingml/2006/picture">
+        <wp:anchor distT="0" distB="0" distL="0" distR="0" simplePos="0" relativeHeight="251658240" behindDoc="0" locked="1" layoutInCell="1" allowOverlap="1">
+          <wp:simplePos x="0" y="0"/>
+          <wp:positionH relativeFrom="page">
+            <wp:align>center</wp:align>
+          </wp:positionH>
+          <wp:positionV relativeFrom="page">
+            <wp:posOffset>43200</wp:posOffset>
+          </wp:positionV>
           <wp:extent cx="3510000" cy="468000"/>
+          <wp:effectExtent l="0" t="0" r="0" b="0"/>
+          <wp:wrapNone/>
           <wp:docPr id="1" name="Picture 1"/>
-          <wp:cNvGraphicFramePr>
+          <wp:cNvGraphicFramePr xmlns:a="http://schemas.openxmlformats.org/drawingml/2006/main">
             <a:graphicFrameLocks noChangeAspect="1"/>
           </wp:cNvGraphicFramePr>
-          <a:graphic>
+          <a:graphic xmlns:a="http://schemas.openxmlformats.org/drawingml/2006/main" xmlns:pic="http://schemas.openxmlformats.org/drawingml/2006/picture">
             <a:graphicData uri="http://schemas.openxmlformats.org/drawingml/2006/picture">
               <pic:pic>
                 <pic:nvPicPr>
@@ -12115,7 +12127,7 @@
               </pic:pic>
             </a:graphicData>
           </a:graphic>
-        </wp:inline>
+        </wp:anchor>
       </w:drawing>
     </w:r>
   </w:p>
@@ -12500,7 +12512,6 @@
   </w:style>
   <w:style w:type="paragraph" w:styleId="Header">
     <w:name w:val="header"/>
-    <w:basedOn w:val="Normal"/>
     <w:link w:val="HeaderChar"/>
     <w:uiPriority w:val="99"/>
     <w:unhideWhenUsed/>
@@ -12510,8 +12521,15 @@
         <w:tab w:val="center" w:pos="4680"/>
         <w:tab w:val="right" w:pos="9360"/>
       </w:tabs>
-      <w:spacing w:after="0" w:line="240" w:lineRule="auto"/>
+      <w:spacing w:after="0" w:line="240" w:lineRule="auto" w:before="0"/>
+      <w:ind w:firstLine="0"/>
+      <w:jc w:val="center"/>
     </w:pPr>
+    <w:rPr>
+      <w:rFonts w:ascii="Times New Roman" w:hAnsi="Times New Roman"/>
+      <w:color w:val="000000"/>
+      <w:sz w:val="16"/>
+    </w:rPr>
   </w:style>
   <w:style w:type="character" w:customStyle="1" w:styleId="HeaderChar">
     <w:name w:val="Header Char"/>
@@ -12522,7 +12540,6 @@
   </w:style>
   <w:style w:type="paragraph" w:styleId="Footer">
     <w:name w:val="footer"/>
-    <w:basedOn w:val="Normal"/>
     <w:link w:val="FooterChar"/>
     <w:uiPriority w:val="99"/>
     <w:unhideWhenUsed/>
@@ -12532,8 +12549,15 @@
         <w:tab w:val="center" w:pos="4680"/>
         <w:tab w:val="right" w:pos="9360"/>
       </w:tabs>
-      <w:spacing w:after="0" w:line="240" w:lineRule="auto"/>
+      <w:spacing w:after="0" w:line="240" w:lineRule="auto" w:before="0"/>
+      <w:ind w:firstLine="0"/>
+      <w:jc w:val="center"/>
     </w:pPr>
+    <w:rPr>
+      <w:rFonts w:ascii="Times New Roman" w:hAnsi="Times New Roman"/>
+      <w:color w:val="000000"/>
+      <w:sz w:val="16"/>
+    </w:rPr>
   </w:style>
   <w:style w:type="character" w:customStyle="1" w:styleId="FooterChar">
     <w:name w:val="Footer Char"/>

</xml_diff>